<commit_message>
Updated comment and documentation
</commit_message>
<xml_diff>
--- a/docs/Development.docx
+++ b/docs/Development.docx
@@ -470,7 +470,6 @@
       <w:r>
         <w:t xml:space="preserve"> </w:t>
       </w:r>
-      <w:proofErr w:type="spellStart"/>
       <w:r>
         <w:rPr>
           <w:b/>
@@ -480,7 +479,6 @@
         </w:rPr>
         <w:t>beebasm</w:t>
       </w:r>
-      <w:proofErr w:type="spellEnd"/>
       <w:r>
         <w:t>, an excellent assembler th</w:t>
       </w:r>
@@ -490,7 +488,6 @@
       <w:r>
         <w:t xml:space="preserve">I could use on Windows to produce an SSD, which I could then run in </w:t>
       </w:r>
-      <w:proofErr w:type="spellStart"/>
       <w:r>
         <w:rPr>
           <w:b/>
@@ -501,7 +498,6 @@
         <w:lastRenderedPageBreak/>
         <w:t>beebem</w:t>
       </w:r>
-      <w:proofErr w:type="spellEnd"/>
       <w:r>
         <w:t>, an emulator</w:t>
       </w:r>
@@ -603,7 +599,6 @@
       <w:r>
         <w:t xml:space="preserve">After looking at some examples that were installed with </w:t>
       </w:r>
-      <w:proofErr w:type="spellStart"/>
       <w:r>
         <w:rPr>
           <w:b/>
@@ -622,7 +617,6 @@
         </w:rPr>
         <w:t>asm</w:t>
       </w:r>
-      <w:proofErr w:type="spellEnd"/>
       <w:r>
         <w:t xml:space="preserve">, I </w:t>
       </w:r>
@@ -757,7 +751,6 @@
       <w:r>
         <w:t xml:space="preserve">The prototype was based on one of the </w:t>
       </w:r>
-      <w:proofErr w:type="spellStart"/>
       <w:r>
         <w:rPr>
           <w:b/>
@@ -767,7 +760,6 @@
         </w:rPr>
         <w:t>beebasm</w:t>
       </w:r>
-      <w:proofErr w:type="spellEnd"/>
       <w:r>
         <w:t xml:space="preserve"> </w:t>
       </w:r>
@@ -1105,14 +1097,27 @@
       <w:r>
         <w:t xml:space="preserve">Figure </w:t>
       </w:r>
-      <w:fldSimple w:instr=" SEQ Figure \* ARABIC ">
-        <w:r>
-          <w:rPr>
-            <w:noProof/>
-          </w:rPr>
-          <w:t>1</w:t>
-        </w:r>
-      </w:fldSimple>
+      <w:r>
+        <w:fldChar w:fldCharType="begin"/>
+      </w:r>
+      <w:r>
+        <w:instrText xml:space="preserve"> SEQ Figure \* ARABIC </w:instrText>
+      </w:r>
+      <w:r>
+        <w:fldChar w:fldCharType="separate"/>
+      </w:r>
+      <w:r>
+        <w:rPr>
+          <w:noProof/>
+        </w:rPr>
+        <w:t>1</w:t>
+      </w:r>
+      <w:r>
+        <w:rPr>
+          <w:noProof/>
+        </w:rPr>
+        <w:fldChar w:fldCharType="end"/>
+      </w:r>
     </w:p>
     <w:p>
       <w:r>
@@ -2361,7 +2366,6 @@
       <w:r>
         <w:t xml:space="preserve"> and </w:t>
       </w:r>
-      <w:proofErr w:type="spellStart"/>
       <w:r>
         <w:rPr>
           <w:b/>
@@ -2380,7 +2384,6 @@
         </w:rPr>
         <w:t>lekAnimate</w:t>
       </w:r>
-      <w:proofErr w:type="spellEnd"/>
       <w:r>
         <w:t xml:space="preserve"> </w:t>
       </w:r>
@@ -2667,14 +2670,27 @@
       <w:r>
         <w:t xml:space="preserve">Figure </w:t>
       </w:r>
-      <w:fldSimple w:instr=" SEQ Figure \* ARABIC ">
-        <w:r>
-          <w:rPr>
-            <w:noProof/>
-          </w:rPr>
-          <w:t>2</w:t>
-        </w:r>
-      </w:fldSimple>
+      <w:r>
+        <w:fldChar w:fldCharType="begin"/>
+      </w:r>
+      <w:r>
+        <w:instrText xml:space="preserve"> SEQ Figure \* ARABIC </w:instrText>
+      </w:r>
+      <w:r>
+        <w:fldChar w:fldCharType="separate"/>
+      </w:r>
+      <w:r>
+        <w:rPr>
+          <w:noProof/>
+        </w:rPr>
+        <w:t>2</w:t>
+      </w:r>
+      <w:r>
+        <w:rPr>
+          <w:noProof/>
+        </w:rPr>
+        <w:fldChar w:fldCharType="end"/>
+      </w:r>
     </w:p>
     <w:p>
       <w:r>
@@ -2704,7 +2720,6 @@
       <w:r>
         <w:t xml:space="preserve"> using the </w:t>
       </w:r>
-      <w:proofErr w:type="spellStart"/>
       <w:r>
         <w:rPr>
           <w:b/>
@@ -2719,15 +2734,7 @@
           <w:b/>
           <w:bCs/>
         </w:rPr>
-        <w:t>’s</w:t>
-      </w:r>
-      <w:proofErr w:type="spellEnd"/>
-      <w:r>
-        <w:rPr>
-          <w:b/>
-          <w:bCs/>
-        </w:rPr>
-        <w:t xml:space="preserve"> </w:t>
+        <w:t xml:space="preserve">’s </w:t>
       </w:r>
       <w:r>
         <w:rPr>
@@ -4381,7 +4388,6 @@
           <w:bCs/>
         </w:rPr>
       </w:pPr>
-      <w:proofErr w:type="spellStart"/>
       <w:r>
         <w:rPr>
           <w:b/>
@@ -4389,7 +4395,6 @@
         </w:rPr>
         <w:t>objectXLo</w:t>
       </w:r>
-      <w:proofErr w:type="spellEnd"/>
       <w:r>
         <w:rPr>
           <w:b/>
@@ -4397,7 +4402,6 @@
         </w:rPr>
         <w:t xml:space="preserve"> &amp; </w:t>
       </w:r>
-      <w:proofErr w:type="spellStart"/>
       <w:r>
         <w:rPr>
           <w:b/>
@@ -4405,7 +4409,6 @@
         </w:rPr>
         <w:t>objectXHi</w:t>
       </w:r>
-      <w:proofErr w:type="spellEnd"/>
       <w:r>
         <w:rPr>
           <w:b/>
@@ -4438,38 +4441,27 @@
           <w:bCs/>
         </w:rPr>
       </w:pPr>
-      <w:proofErr w:type="spellStart"/>
       <w:r>
         <w:rPr>
           <w:b/>
           <w:bCs/>
         </w:rPr>
-        <w:t>objectYLo</w:t>
-      </w:r>
-      <w:proofErr w:type="spellEnd"/>
+        <w:t xml:space="preserve">objectYLo </w:t>
+      </w:r>
       <w:r>
         <w:rPr>
           <w:b/>
           <w:bCs/>
         </w:rPr>
-        <w:t xml:space="preserve"> </w:t>
+        <w:t xml:space="preserve">&amp; </w:t>
       </w:r>
       <w:r>
         <w:rPr>
           <w:b/>
           <w:bCs/>
         </w:rPr>
-        <w:t xml:space="preserve">&amp; </w:t>
-      </w:r>
-      <w:proofErr w:type="spellStart"/>
-      <w:r>
-        <w:rPr>
-          <w:b/>
-          <w:bCs/>
-        </w:rPr>
         <w:t>objectYHi</w:t>
       </w:r>
-      <w:proofErr w:type="spellEnd"/>
       <w:r>
         <w:rPr>
           <w:b/>
@@ -4505,31 +4497,13 @@
           <w:bCs/>
         </w:rPr>
       </w:pPr>
-      <w:proofErr w:type="spellStart"/>
       <w:r>
         <w:rPr>
           <w:b/>
           <w:bCs/>
         </w:rPr>
-        <w:t>objectWidth</w:t>
-      </w:r>
-      <w:proofErr w:type="spellEnd"/>
-      <w:r>
-        <w:rPr>
-          <w:b/>
-          <w:bCs/>
-        </w:rPr>
-        <w:t xml:space="preserve"> &amp; </w:t>
-      </w:r>
-      <w:proofErr w:type="spellStart"/>
-      <w:r>
-        <w:rPr>
-          <w:b/>
-          <w:bCs/>
-        </w:rPr>
-        <w:t>objectHeight</w:t>
-      </w:r>
-      <w:proofErr w:type="spellEnd"/>
+        <w:t>objectWidth &amp; objectHeight</w:t>
+      </w:r>
       <w:r>
         <w:rPr>
           <w:b/>
@@ -4556,7 +4530,6 @@
           <w:bCs/>
         </w:rPr>
       </w:pPr>
-      <w:proofErr w:type="spellStart"/>
       <w:r>
         <w:rPr>
           <w:b/>
@@ -4564,7 +4537,6 @@
         </w:rPr>
         <w:t>objectAnimation</w:t>
       </w:r>
-      <w:proofErr w:type="spellEnd"/>
       <w:r>
         <w:rPr>
           <w:b/>
@@ -4597,7 +4569,6 @@
           <w:bCs/>
         </w:rPr>
       </w:pPr>
-      <w:proofErr w:type="spellStart"/>
       <w:r>
         <w:rPr>
           <w:b/>
@@ -4605,7 +4576,6 @@
         </w:rPr>
         <w:t>objectState</w:t>
       </w:r>
-      <w:proofErr w:type="spellEnd"/>
       <w:r>
         <w:rPr>
           <w:b/>
@@ -4697,7 +4667,6 @@
           <w:bCs/>
         </w:rPr>
       </w:pPr>
-      <w:proofErr w:type="spellStart"/>
       <w:r>
         <w:rPr>
           <w:b/>
@@ -4705,7 +4674,6 @@
         </w:rPr>
         <w:t>objectSpriteIndex</w:t>
       </w:r>
-      <w:proofErr w:type="spellEnd"/>
       <w:r>
         <w:rPr>
           <w:b/>
@@ -4740,31 +4708,13 @@
           <w:numId w:val="8"/>
         </w:numPr>
       </w:pPr>
-      <w:proofErr w:type="spellStart"/>
       <w:r>
         <w:rPr>
           <w:b/>
           <w:bCs/>
         </w:rPr>
-        <w:t>objectFrameCallbackLo</w:t>
-      </w:r>
-      <w:proofErr w:type="spellEnd"/>
-      <w:r>
-        <w:rPr>
-          <w:b/>
-          <w:bCs/>
-        </w:rPr>
-        <w:t xml:space="preserve"> &amp; </w:t>
-      </w:r>
-      <w:proofErr w:type="spellStart"/>
-      <w:r>
-        <w:rPr>
-          <w:b/>
-          <w:bCs/>
-        </w:rPr>
-        <w:t>objectFrameCallbackHi</w:t>
-      </w:r>
-      <w:proofErr w:type="spellEnd"/>
+        <w:t>objectFrameCallbackLo &amp; objectFrameCallbackHi</w:t>
+      </w:r>
       <w:r>
         <w:rPr>
           <w:b/>
@@ -4812,7 +4762,6 @@
           <w:bCs/>
         </w:rPr>
       </w:pPr>
-      <w:proofErr w:type="spellStart"/>
       <w:r>
         <w:rPr>
           <w:b/>
@@ -4820,7 +4769,6 @@
         </w:rPr>
         <w:t>objectFrameCounter</w:t>
       </w:r>
-      <w:proofErr w:type="spellEnd"/>
       <w:r>
         <w:rPr>
           <w:b/>
@@ -6117,7 +6065,6 @@
       <w:r>
         <w:t xml:space="preserve">setting </w:t>
       </w:r>
-      <w:proofErr w:type="spellStart"/>
       <w:r>
         <w:rPr>
           <w:i/>
@@ -6139,7 +6086,6 @@
         </w:rPr>
         <w:t>Addr</w:t>
       </w:r>
-      <w:proofErr w:type="spellEnd"/>
       <w:r>
         <w:t xml:space="preserve"> </w:t>
       </w:r>
@@ -6239,7 +6185,6 @@
       <w:r>
         <w:t xml:space="preserve">in the low nibble of </w:t>
       </w:r>
-      <w:proofErr w:type="spellStart"/>
       <w:r>
         <w:rPr>
           <w:i/>
@@ -6247,7 +6192,6 @@
         </w:rPr>
         <w:t>objectState</w:t>
       </w:r>
-      <w:proofErr w:type="spellEnd"/>
       <w:r>
         <w:t xml:space="preserve"> array</w:t>
       </w:r>
@@ -6332,11 +6276,9 @@
       <w:r>
         <w:t>‘</w:t>
       </w:r>
-      <w:proofErr w:type="spellStart"/>
       <w:r>
         <w:t>Gamebar</w:t>
       </w:r>
-      <w:proofErr w:type="spellEnd"/>
       <w:r>
         <w:t>’</w:t>
       </w:r>
@@ -6354,11 +6296,9 @@
       <w:r>
         <w:t xml:space="preserve">and show this information in a </w:t>
       </w:r>
-      <w:proofErr w:type="spellStart"/>
       <w:r>
         <w:t>gamebar</w:t>
       </w:r>
-      <w:proofErr w:type="spellEnd"/>
       <w:r>
         <w:t>, located at the top right of the screen.</w:t>
       </w:r>
@@ -6502,7 +6442,6 @@
       <w:r>
         <w:t xml:space="preserve"> </w:t>
       </w:r>
-      <w:proofErr w:type="spellStart"/>
       <w:r>
         <w:rPr>
           <w:i/>
@@ -6510,7 +6449,6 @@
         </w:rPr>
         <w:t>clearTile</w:t>
       </w:r>
-      <w:proofErr w:type="spellEnd"/>
       <w:r>
         <w:t xml:space="preserve"> </w:t>
       </w:r>
@@ -6525,7 +6463,6 @@
       <w:r>
         <w:t xml:space="preserve">The </w:t>
       </w:r>
-      <w:proofErr w:type="spellStart"/>
       <w:r>
         <w:rPr>
           <w:i/>
@@ -6533,7 +6470,6 @@
         </w:rPr>
         <w:t>clearTile</w:t>
       </w:r>
-      <w:proofErr w:type="spellEnd"/>
       <w:r>
         <w:t xml:space="preserve"> </w:t>
       </w:r>
@@ -6581,24 +6517,14 @@
       <w:r>
         <w:t xml:space="preserve"> </w:t>
       </w:r>
-      <w:proofErr w:type="spellStart"/>
       <w:r>
         <w:t>gamebar</w:t>
       </w:r>
-      <w:proofErr w:type="spellEnd"/>
       <w:r>
         <w:t>.</w:t>
       </w:r>
       <w:r>
-        <w:t xml:space="preserve">  As before, I created a </w:t>
-      </w:r>
-      <w:proofErr w:type="spellStart"/>
-      <w:r>
-        <w:t>gamebar</w:t>
-      </w:r>
-      <w:proofErr w:type="spellEnd"/>
-      <w:r>
-        <w:t xml:space="preserve"> sprite using </w:t>
+        <w:t xml:space="preserve">  As before, I created a gamebar sprite using </w:t>
       </w:r>
       <w:r>
         <w:rPr>
@@ -6660,15 +6586,7 @@
         <w:t>rote</w:t>
       </w:r>
       <w:r>
-        <w:t xml:space="preserve"> code to render the </w:t>
-      </w:r>
-      <w:proofErr w:type="spellStart"/>
-      <w:r>
-        <w:t>gamebar</w:t>
-      </w:r>
-      <w:proofErr w:type="spellEnd"/>
-      <w:r>
-        <w:t xml:space="preserve">, </w:t>
+        <w:t xml:space="preserve"> code to render the gamebar, </w:t>
       </w:r>
       <w:r>
         <w:t>which show</w:t>
@@ -6692,15 +6610,7 @@
         <w:t xml:space="preserve">.  </w:t>
       </w:r>
       <w:r>
-        <w:t xml:space="preserve">To </w:t>
-      </w:r>
-      <w:proofErr w:type="spellStart"/>
-      <w:r>
-        <w:t>gamebar</w:t>
-      </w:r>
-      <w:proofErr w:type="spellEnd"/>
-      <w:r>
-        <w:t xml:space="preserve"> </w:t>
+        <w:t xml:space="preserve">To gamebar </w:t>
       </w:r>
       <w:r>
         <w:t xml:space="preserve">is </w:t>
@@ -6735,15 +6645,7 @@
         <w:t>re</w:t>
       </w:r>
       <w:r>
-        <w:t xml:space="preserve">draw the </w:t>
-      </w:r>
-      <w:proofErr w:type="spellStart"/>
-      <w:r>
-        <w:t>gamebar</w:t>
-      </w:r>
-      <w:proofErr w:type="spellEnd"/>
-      <w:r>
-        <w:t xml:space="preserve"> and </w:t>
+        <w:t xml:space="preserve">draw the gamebar and </w:t>
       </w:r>
       <w:r>
         <w:t xml:space="preserve">draw </w:t>
@@ -6763,15 +6665,7 @@
     </w:p>
     <w:p>
       <w:r>
-        <w:t xml:space="preserve">I later revisited the </w:t>
-      </w:r>
-      <w:proofErr w:type="spellStart"/>
-      <w:r>
-        <w:t>gamebar</w:t>
-      </w:r>
-      <w:proofErr w:type="spellEnd"/>
-      <w:r>
-        <w:t xml:space="preserve"> adding </w:t>
+        <w:t xml:space="preserve">I later revisited the gamebar adding </w:t>
       </w:r>
       <w:r>
         <w:t xml:space="preserve">code to show the </w:t>
@@ -7227,15 +7121,7 @@
         <w:t>the elevator stops.</w:t>
       </w:r>
       <w:r>
-        <w:t xml:space="preserve">  The </w:t>
-      </w:r>
-      <w:proofErr w:type="spellStart"/>
-      <w:r>
-        <w:t>objectFrameCount</w:t>
-      </w:r>
-      <w:proofErr w:type="spellEnd"/>
-      <w:r>
-        <w:t xml:space="preserve"> is repurposed for this.</w:t>
+        <w:t xml:space="preserve">  The objectFrameCount is repurposed for this.</w:t>
       </w:r>
     </w:p>
     <w:p>
@@ -7247,15 +7133,7 @@
         </w:numPr>
       </w:pPr>
       <w:r>
-        <w:t xml:space="preserve">Mark K9 and the elevator game objects as both ascending or descending by populating their respective </w:t>
-      </w:r>
-      <w:proofErr w:type="spellStart"/>
-      <w:r>
-        <w:t>objectState’s</w:t>
-      </w:r>
-      <w:proofErr w:type="spellEnd"/>
-      <w:r>
-        <w:t xml:space="preserve"> </w:t>
+        <w:t xml:space="preserve">Mark K9 and the elevator game objects as both ascending or descending by populating their respective objectState’s </w:t>
       </w:r>
       <w:r>
         <w:rPr>
@@ -7642,7 +7520,6 @@
       <w:r>
         <w:t xml:space="preserve">stored in </w:t>
       </w:r>
-      <w:proofErr w:type="spellStart"/>
       <w:r>
         <w:rPr>
           <w:i/>
@@ -7651,7 +7528,6 @@
         </w:rPr>
         <w:t>objectFrameCounter</w:t>
       </w:r>
-      <w:proofErr w:type="spellEnd"/>
       <w:r>
         <w:t xml:space="preserve"> variable</w:t>
       </w:r>
@@ -7815,7 +7691,6 @@
       <w:r>
         <w:t xml:space="preserve">checking the erase-above and erase-below </w:t>
       </w:r>
-      <w:proofErr w:type="spellStart"/>
       <w:r>
         <w:rPr>
           <w:i/>
@@ -7830,7 +7705,6 @@
         </w:rPr>
         <w:t>’s</w:t>
       </w:r>
-      <w:proofErr w:type="spellEnd"/>
       <w:r>
         <w:t xml:space="preserve"> render flags</w:t>
       </w:r>
@@ -8431,7 +8305,6 @@
       <w:r>
         <w:t xml:space="preserve">A zero-page </w:t>
       </w:r>
-      <w:proofErr w:type="spellStart"/>
       <w:r>
         <w:rPr>
           <w:i/>
@@ -8439,7 +8312,6 @@
         </w:rPr>
         <w:t>laserFrameCount</w:t>
       </w:r>
-      <w:proofErr w:type="spellEnd"/>
       <w:r>
         <w:t xml:space="preserve"> variable was introduced which controls laser rendering.  </w:t>
       </w:r>
@@ -8467,7 +8339,6 @@
       <w:r>
         <w:t xml:space="preserve">sets </w:t>
       </w:r>
-      <w:proofErr w:type="spellStart"/>
       <w:r>
         <w:rPr>
           <w:i/>
@@ -8475,7 +8346,6 @@
         </w:rPr>
         <w:t>laserFrameCount</w:t>
       </w:r>
-      <w:proofErr w:type="spellEnd"/>
       <w:r>
         <w:rPr>
           <w:i/>
@@ -8492,7 +8362,6 @@
       <w:r>
         <w:t xml:space="preserve">and </w:t>
       </w:r>
-      <w:proofErr w:type="spellStart"/>
       <w:r>
         <w:rPr>
           <w:i/>
@@ -8500,7 +8369,6 @@
         </w:rPr>
         <w:t>laserFrameCount</w:t>
       </w:r>
-      <w:proofErr w:type="spellEnd"/>
       <w:r>
         <w:rPr>
           <w:i/>
@@ -8551,7 +8419,6 @@
       <w:r>
         <w:t xml:space="preserve">the </w:t>
       </w:r>
-      <w:proofErr w:type="spellStart"/>
       <w:r>
         <w:rPr>
           <w:i/>
@@ -8559,7 +8426,6 @@
         </w:rPr>
         <w:t>objectState</w:t>
       </w:r>
-      <w:proofErr w:type="spellEnd"/>
       <w:r>
         <w:t xml:space="preserve"> variable</w:t>
       </w:r>
@@ -8664,7 +8530,6 @@
       <w:r>
         <w:t xml:space="preserve"> above. This is the fourth render flag in the high nibble of the </w:t>
       </w:r>
-      <w:proofErr w:type="spellStart"/>
       <w:r>
         <w:rPr>
           <w:i/>
@@ -8672,7 +8537,6 @@
         </w:rPr>
         <w:t>objectState</w:t>
       </w:r>
-      <w:proofErr w:type="spellEnd"/>
       <w:r>
         <w:t xml:space="preserve"> variable.</w:t>
       </w:r>
@@ -8795,7 +8659,6 @@
       <w:r>
         <w:t xml:space="preserve"> </w:t>
       </w:r>
-      <w:proofErr w:type="spellStart"/>
       <w:r>
         <w:rPr>
           <w:i/>
@@ -8803,7 +8666,6 @@
         </w:rPr>
         <w:t>debugTileGridFlags</w:t>
       </w:r>
-      <w:proofErr w:type="spellEnd"/>
       <w:r>
         <w:t xml:space="preserve"> routine that rendered a little box </w:t>
       </w:r>
@@ -8861,15 +8723,7 @@
         <w:t xml:space="preserve">  T</w:t>
       </w:r>
       <w:r>
-        <w:t xml:space="preserve">he </w:t>
-      </w:r>
-      <w:proofErr w:type="spellStart"/>
-      <w:r>
-        <w:t>gamebar</w:t>
-      </w:r>
-      <w:proofErr w:type="spellEnd"/>
-      <w:r>
-        <w:t xml:space="preserve"> </w:t>
+        <w:t xml:space="preserve">he gamebar </w:t>
       </w:r>
       <w:r>
         <w:t xml:space="preserve">is not shown then the </w:t>
@@ -8895,7 +8749,6 @@
       <w:r>
         <w:t xml:space="preserve">to allow </w:t>
       </w:r>
-      <w:proofErr w:type="spellStart"/>
       <w:r>
         <w:rPr>
           <w:i/>
@@ -8903,7 +8756,6 @@
         </w:rPr>
         <w:t>debugTileGridFlags</w:t>
       </w:r>
-      <w:proofErr w:type="spellEnd"/>
       <w:r>
         <w:rPr>
           <w:i/>
@@ -8998,14 +8850,27 @@
       <w:r>
         <w:t xml:space="preserve">Figure </w:t>
       </w:r>
-      <w:fldSimple w:instr=" SEQ Figure \* ARABIC ">
-        <w:r>
-          <w:rPr>
-            <w:noProof/>
-          </w:rPr>
-          <w:t>3</w:t>
-        </w:r>
-      </w:fldSimple>
+      <w:r>
+        <w:fldChar w:fldCharType="begin"/>
+      </w:r>
+      <w:r>
+        <w:instrText xml:space="preserve"> SEQ Figure \* ARABIC </w:instrText>
+      </w:r>
+      <w:r>
+        <w:fldChar w:fldCharType="separate"/>
+      </w:r>
+      <w:r>
+        <w:rPr>
+          <w:noProof/>
+        </w:rPr>
+        <w:t>3</w:t>
+      </w:r>
+      <w:r>
+        <w:rPr>
+          <w:noProof/>
+        </w:rPr>
+        <w:fldChar w:fldCharType="end"/>
+      </w:r>
     </w:p>
     <w:p>
       <w:pPr>
@@ -10183,7 +10048,6 @@
       <w:r>
         <w:t xml:space="preserve">replaced </w:t>
       </w:r>
-      <w:proofErr w:type="spellStart"/>
       <w:r>
         <w:rPr>
           <w:i/>
@@ -10191,11 +10055,9 @@
         </w:rPr>
         <w:t>objectWidth</w:t>
       </w:r>
-      <w:proofErr w:type="spellEnd"/>
       <w:r>
         <w:t xml:space="preserve"> and </w:t>
       </w:r>
-      <w:proofErr w:type="spellStart"/>
       <w:r>
         <w:rPr>
           <w:i/>
@@ -10203,7 +10065,6 @@
         </w:rPr>
         <w:t>objectHeight</w:t>
       </w:r>
-      <w:proofErr w:type="spellEnd"/>
       <w:r>
         <w:t xml:space="preserve"> game object arrays with a function</w:t>
       </w:r>
@@ -10239,7 +10100,6 @@
       <w:r>
         <w:t xml:space="preserve">, and </w:t>
       </w:r>
-      <w:proofErr w:type="spellStart"/>
       <w:r>
         <w:rPr>
           <w:i/>
@@ -10247,11 +10107,9 @@
         </w:rPr>
         <w:t>widthMinusOne</w:t>
       </w:r>
-      <w:proofErr w:type="spellEnd"/>
       <w:r>
         <w:t xml:space="preserve"> and </w:t>
       </w:r>
-      <w:proofErr w:type="spellStart"/>
       <w:r>
         <w:rPr>
           <w:i/>
@@ -10259,7 +10117,6 @@
         </w:rPr>
         <w:t>heightMinisOne</w:t>
       </w:r>
-      <w:proofErr w:type="spellEnd"/>
       <w:r>
         <w:t>.</w:t>
       </w:r>
@@ -10308,15 +10165,7 @@
         <w:t xml:space="preserve"> I </w:t>
       </w:r>
       <w:r>
-        <w:t xml:space="preserve">stored the object type in the </w:t>
-      </w:r>
-      <w:proofErr w:type="spellStart"/>
-      <w:r>
-        <w:t>objectAnimation</w:t>
-      </w:r>
-      <w:proofErr w:type="spellEnd"/>
-      <w:r>
-        <w:t xml:space="preserve"> game object array, </w:t>
+        <w:t xml:space="preserve">stored the object type in the objectAnimation game object array, </w:t>
       </w:r>
       <w:r>
         <w:t xml:space="preserve">shifting up the other values, and </w:t>
@@ -10334,13 +10183,8 @@
         <w:t xml:space="preserve">array </w:t>
       </w:r>
       <w:r>
-        <w:t xml:space="preserve">to </w:t>
-      </w:r>
-      <w:proofErr w:type="spellStart"/>
-      <w:r>
-        <w:t>objectType</w:t>
-      </w:r>
-      <w:proofErr w:type="spellEnd"/>
+        <w:t>to objectType</w:t>
+      </w:r>
       <w:r>
         <w:t>.</w:t>
       </w:r>
@@ -10929,7 +10773,6 @@
       <w:r>
         <w:t xml:space="preserve">I then wrote a </w:t>
       </w:r>
-      <w:proofErr w:type="spellStart"/>
       <w:r>
         <w:rPr>
           <w:i/>
@@ -10937,7 +10780,6 @@
         </w:rPr>
         <w:t>loadLevel</w:t>
       </w:r>
-      <w:proofErr w:type="spellEnd"/>
       <w:r>
         <w:t xml:space="preserve"> </w:t>
       </w:r>
@@ -10968,7 +10810,6 @@
       <w:r>
         <w:t xml:space="preserve">the loaded </w:t>
       </w:r>
-      <w:proofErr w:type="spellStart"/>
       <w:r>
         <w:rPr>
           <w:i/>
@@ -10976,7 +10817,6 @@
         </w:rPr>
         <w:t>initializeLevel</w:t>
       </w:r>
-      <w:proofErr w:type="spellEnd"/>
       <w:r>
         <w:t xml:space="preserve"> </w:t>
       </w:r>
@@ -10989,7 +10829,6 @@
       <w:r>
         <w:t xml:space="preserve">  A </w:t>
       </w:r>
-      <w:proofErr w:type="spellStart"/>
       <w:r>
         <w:rPr>
           <w:i/>
@@ -10997,7 +10836,6 @@
         </w:rPr>
         <w:t>showLevel</w:t>
       </w:r>
-      <w:proofErr w:type="spellEnd"/>
       <w:r>
         <w:t xml:space="preserve"> routine </w:t>
       </w:r>
@@ -11039,7 +10877,6 @@
       <w:r>
         <w:t xml:space="preserve">MOS </w:t>
       </w:r>
-      <w:proofErr w:type="spellStart"/>
       <w:r>
         <w:rPr>
           <w:b/>
@@ -11047,7 +10884,6 @@
         </w:rPr>
         <w:t>osfile</w:t>
       </w:r>
-      <w:proofErr w:type="spellEnd"/>
       <w:r>
         <w:t xml:space="preserve"> routine</w:t>
       </w:r>
@@ -11074,7 +10910,6 @@
       <w:r>
         <w:t xml:space="preserve">calling the </w:t>
       </w:r>
-      <w:proofErr w:type="spellStart"/>
       <w:r>
         <w:rPr>
           <w:b/>
@@ -11082,7 +10917,6 @@
         </w:rPr>
         <w:t>osfile</w:t>
       </w:r>
-      <w:proofErr w:type="spellEnd"/>
       <w:r>
         <w:t xml:space="preserve"> routine</w:t>
       </w:r>
@@ -11239,7 +11073,6 @@
       <w:r>
         <w:t xml:space="preserve">and the pages cleared before the </w:t>
       </w:r>
-      <w:proofErr w:type="spellStart"/>
       <w:r>
         <w:rPr>
           <w:b/>
@@ -11247,7 +11080,6 @@
         </w:rPr>
         <w:t>osfile</w:t>
       </w:r>
-      <w:proofErr w:type="spellEnd"/>
       <w:r>
         <w:t xml:space="preserve"> function is called.  The </w:t>
       </w:r>
@@ -11269,7 +11101,6 @@
       <w:r>
         <w:t xml:space="preserve">n ASSERT is used to ensure that the </w:t>
       </w:r>
-      <w:proofErr w:type="spellStart"/>
       <w:r>
         <w:rPr>
           <w:i/>
@@ -11277,7 +11108,6 @@
         </w:rPr>
         <w:t>loadLevel</w:t>
       </w:r>
-      <w:proofErr w:type="spellEnd"/>
       <w:r>
         <w:t xml:space="preserve"> </w:t>
       </w:r>
@@ -11318,7 +11148,6 @@
       <w:r>
         <w:t xml:space="preserve"> a level, and a ‘R’ key handler was implemented to call the </w:t>
       </w:r>
-      <w:proofErr w:type="spellStart"/>
       <w:r>
         <w:rPr>
           <w:i/>
@@ -11326,14 +11155,12 @@
         </w:rPr>
         <w:t>loadLevel</w:t>
       </w:r>
-      <w:proofErr w:type="spellEnd"/>
       <w:r>
         <w:t xml:space="preserve"> </w:t>
       </w:r>
       <w:r>
         <w:t xml:space="preserve">routine indirectly through a </w:t>
       </w:r>
-      <w:proofErr w:type="spellStart"/>
       <w:r>
         <w:rPr>
           <w:i/>
@@ -11341,7 +11168,6 @@
         </w:rPr>
         <w:t>reloadLevel</w:t>
       </w:r>
-      <w:proofErr w:type="spellEnd"/>
       <w:r>
         <w:t xml:space="preserve"> routine.</w:t>
       </w:r>
@@ -11868,7 +11694,6 @@
       <w:r>
         <w:t xml:space="preserve"> action became </w:t>
       </w:r>
-      <w:proofErr w:type="spellStart"/>
       <w:r>
         <w:rPr>
           <w:b/>
@@ -11878,11 +11703,9 @@
         </w:rPr>
         <w:t>PursueLeft</w:t>
       </w:r>
-      <w:proofErr w:type="spellEnd"/>
       <w:r>
         <w:t xml:space="preserve">, </w:t>
       </w:r>
-      <w:proofErr w:type="spellStart"/>
       <w:r>
         <w:rPr>
           <w:b/>
@@ -11892,11 +11715,9 @@
         </w:rPr>
         <w:t>PursueRight</w:t>
       </w:r>
-      <w:proofErr w:type="spellEnd"/>
       <w:r>
         <w:t xml:space="preserve">, </w:t>
       </w:r>
-      <w:proofErr w:type="spellStart"/>
       <w:r>
         <w:rPr>
           <w:b/>
@@ -11906,14 +11727,12 @@
         </w:rPr>
         <w:t>PursueUp</w:t>
       </w:r>
-      <w:proofErr w:type="spellEnd"/>
       <w:r>
         <w:t xml:space="preserve">, </w:t>
       </w:r>
       <w:r>
         <w:t xml:space="preserve">or </w:t>
       </w:r>
-      <w:proofErr w:type="spellStart"/>
       <w:r>
         <w:rPr>
           <w:b/>
@@ -11923,7 +11742,6 @@
         </w:rPr>
         <w:t>PursueDown</w:t>
       </w:r>
-      <w:proofErr w:type="spellEnd"/>
       <w:r>
         <w:t>.</w:t>
       </w:r>
@@ -11970,7 +11788,6 @@
         </w:rPr>
         <w:tab/>
       </w:r>
-      <w:proofErr w:type="spellStart"/>
       <w:r>
         <w:rPr>
           <w:b/>
@@ -11987,9 +11804,11 @@
           <w:i/>
           <w:iCs/>
         </w:rPr>
-        <w:t>Left</w:t>
-      </w:r>
-      <w:proofErr w:type="spellEnd"/>
+        <w:t xml:space="preserve">Left </w:t>
+      </w:r>
+      <w:r>
+        <w:t>and</w:t>
+      </w:r>
       <w:r>
         <w:rPr>
           <w:b/>
@@ -11997,10 +11816,7 @@
           <w:i/>
           <w:iCs/>
         </w:rPr>
-        <w:t xml:space="preserve"> </w:t>
-      </w:r>
-      <w:r>
-        <w:t>and</w:t>
+        <w:t xml:space="preserve"> PursueRight</w:t>
       </w:r>
       <w:r>
         <w:rPr>
@@ -12011,7 +11827,57 @@
         </w:rPr>
         <w:t xml:space="preserve"> </w:t>
       </w:r>
-      <w:proofErr w:type="spellStart"/>
+      <w:r>
+        <w:t xml:space="preserve"> – </w:t>
+      </w:r>
+      <w:r>
+        <w:t xml:space="preserve">Daleks </w:t>
+      </w:r>
+      <w:r>
+        <w:t>move quickly left or right</w:t>
+      </w:r>
+      <w:r>
+        <w:t>, or vice versa</w:t>
+      </w:r>
+      <w:r>
+        <w:t xml:space="preserve">. </w:t>
+      </w:r>
+      <w:r>
+        <w:t xml:space="preserve">If </w:t>
+      </w:r>
+      <w:r>
+        <w:t>a Dalek</w:t>
+      </w:r>
+      <w:r>
+        <w:t xml:space="preserve"> encounters a wall, the </w:t>
+      </w:r>
+      <w:r>
+        <w:t xml:space="preserve">Dalek </w:t>
+      </w:r>
+      <w:r>
+        <w:t>turns</w:t>
+      </w:r>
+      <w:r>
+        <w:t>,</w:t>
+      </w:r>
+      <w:r>
+        <w:t xml:space="preserve"> and the </w:t>
+      </w:r>
+      <w:r>
+        <w:t xml:space="preserve">action </w:t>
+      </w:r>
+      <w:r>
+        <w:t xml:space="preserve">is </w:t>
+      </w:r>
+      <w:r>
+        <w:t>change</w:t>
+      </w:r>
+      <w:r>
+        <w:t xml:space="preserve">d </w:t>
+      </w:r>
+      <w:r>
+        <w:t xml:space="preserve">to </w:t>
+      </w:r>
       <w:r>
         <w:rPr>
           <w:b/>
@@ -12019,9 +11885,11 @@
           <w:i/>
           <w:iCs/>
         </w:rPr>
-        <w:t>PursueRight</w:t>
-      </w:r>
-      <w:proofErr w:type="spellEnd"/>
+        <w:t>PursueUp</w:t>
+      </w:r>
+      <w:r>
+        <w:t xml:space="preserve"> or </w:t>
+      </w:r>
       <w:r>
         <w:rPr>
           <w:b/>
@@ -12029,60 +11897,16 @@
           <w:i/>
           <w:iCs/>
         </w:rPr>
-        <w:t xml:space="preserve"> </w:t>
-      </w:r>
-      <w:r>
-        <w:t xml:space="preserve"> – </w:t>
-      </w:r>
-      <w:r>
-        <w:t xml:space="preserve">Daleks </w:t>
-      </w:r>
-      <w:r>
-        <w:t>move quickly left or right</w:t>
-      </w:r>
-      <w:r>
-        <w:t>, or vice versa</w:t>
-      </w:r>
-      <w:r>
-        <w:t xml:space="preserve">. </w:t>
-      </w:r>
-      <w:r>
-        <w:t xml:space="preserve">If </w:t>
-      </w:r>
-      <w:r>
-        <w:t>a Dalek</w:t>
-      </w:r>
-      <w:r>
-        <w:t xml:space="preserve"> encounters a wall, the </w:t>
-      </w:r>
-      <w:r>
-        <w:t xml:space="preserve">Dalek </w:t>
-      </w:r>
-      <w:r>
-        <w:t>turns</w:t>
-      </w:r>
-      <w:r>
-        <w:t>,</w:t>
-      </w:r>
-      <w:r>
-        <w:t xml:space="preserve"> and the </w:t>
-      </w:r>
-      <w:r>
-        <w:t xml:space="preserve">action </w:t>
-      </w:r>
-      <w:r>
-        <w:t xml:space="preserve">is </w:t>
-      </w:r>
-      <w:r>
-        <w:t>change</w:t>
-      </w:r>
-      <w:r>
-        <w:t xml:space="preserve">d </w:t>
-      </w:r>
-      <w:r>
-        <w:t xml:space="preserve">to </w:t>
-      </w:r>
-      <w:proofErr w:type="spellStart"/>
+        <w:t>PursueDown</w:t>
+      </w:r>
+      <w:r>
+        <w:t>.</w:t>
+      </w:r>
+    </w:p>
+    <w:p>
+      <w:pPr>
+        <w:ind w:left="720"/>
+      </w:pPr>
       <w:r>
         <w:rPr>
           <w:b/>
@@ -12090,13 +11914,9 @@
           <w:i/>
           <w:iCs/>
         </w:rPr>
-        <w:t>PursueUp</w:t>
-      </w:r>
-      <w:proofErr w:type="spellEnd"/>
-      <w:r>
-        <w:t xml:space="preserve"> or </w:t>
-      </w:r>
-      <w:proofErr w:type="spellStart"/>
+        <w:lastRenderedPageBreak/>
+        <w:t>Pursue</w:t>
+      </w:r>
       <w:r>
         <w:rPr>
           <w:b/>
@@ -12104,18 +11924,11 @@
           <w:i/>
           <w:iCs/>
         </w:rPr>
-        <w:t>PursueDown</w:t>
-      </w:r>
-      <w:proofErr w:type="spellEnd"/>
-      <w:r>
-        <w:t>.</w:t>
-      </w:r>
-    </w:p>
-    <w:p>
-      <w:pPr>
-        <w:ind w:left="720"/>
-      </w:pPr>
-      <w:proofErr w:type="spellStart"/>
+        <w:t xml:space="preserve">Up </w:t>
+      </w:r>
+      <w:r>
+        <w:t>and</w:t>
+      </w:r>
       <w:r>
         <w:rPr>
           <w:b/>
@@ -12123,8 +11936,34 @@
           <w:i/>
           <w:iCs/>
         </w:rPr>
-        <w:lastRenderedPageBreak/>
-        <w:t>Pursue</w:t>
+        <w:t xml:space="preserve"> PursueDown </w:t>
+      </w:r>
+      <w:r>
+        <w:t xml:space="preserve"> – Daleks </w:t>
+      </w:r>
+      <w:r>
+        <w:t>move quickly left or right</w:t>
+      </w:r>
+      <w:r>
+        <w:t xml:space="preserve">, or vice versa, looking for an elevator to ride up or down. </w:t>
+      </w:r>
+      <w:r>
+        <w:t xml:space="preserve">If a Dalek encounters a wall, </w:t>
+      </w:r>
+      <w:r>
+        <w:t xml:space="preserve">the Dalek </w:t>
+      </w:r>
+      <w:r>
+        <w:t>turns,</w:t>
+      </w:r>
+      <w:r>
+        <w:t xml:space="preserve"> and the </w:t>
+      </w:r>
+      <w:r>
+        <w:t xml:space="preserve">action </w:t>
+      </w:r>
+      <w:r>
+        <w:t xml:space="preserve">is toggled between </w:t>
       </w:r>
       <w:r>
         <w:rPr>
@@ -12133,9 +11972,17 @@
           <w:i/>
           <w:iCs/>
         </w:rPr>
-        <w:t>Up</w:t>
-      </w:r>
-      <w:proofErr w:type="spellEnd"/>
+        <w:t>PursueUp</w:t>
+      </w:r>
+      <w:r>
+        <w:t xml:space="preserve"> </w:t>
+      </w:r>
+      <w:r>
+        <w:t>and</w:t>
+      </w:r>
+      <w:r>
+        <w:t xml:space="preserve"> </w:t>
+      </w:r>
       <w:r>
         <w:rPr>
           <w:b/>
@@ -12143,98 +11990,8 @@
           <w:i/>
           <w:iCs/>
         </w:rPr>
-        <w:t xml:space="preserve"> </w:t>
-      </w:r>
-      <w:r>
-        <w:t>and</w:t>
-      </w:r>
-      <w:r>
-        <w:rPr>
-          <w:b/>
-          <w:bCs/>
-          <w:i/>
-          <w:iCs/>
-        </w:rPr>
-        <w:t xml:space="preserve"> </w:t>
-      </w:r>
-      <w:proofErr w:type="spellStart"/>
-      <w:r>
-        <w:rPr>
-          <w:b/>
-          <w:bCs/>
-          <w:i/>
-          <w:iCs/>
-        </w:rPr>
         <w:t>PursueDown</w:t>
       </w:r>
-      <w:proofErr w:type="spellEnd"/>
-      <w:r>
-        <w:rPr>
-          <w:b/>
-          <w:bCs/>
-          <w:i/>
-          <w:iCs/>
-        </w:rPr>
-        <w:t xml:space="preserve"> </w:t>
-      </w:r>
-      <w:r>
-        <w:t xml:space="preserve"> – Daleks </w:t>
-      </w:r>
-      <w:r>
-        <w:t>move quickly left or right</w:t>
-      </w:r>
-      <w:r>
-        <w:t xml:space="preserve">, or vice versa, looking for an elevator to ride up or down. </w:t>
-      </w:r>
-      <w:r>
-        <w:t xml:space="preserve">If a Dalek encounters a wall, </w:t>
-      </w:r>
-      <w:r>
-        <w:t xml:space="preserve">the Dalek </w:t>
-      </w:r>
-      <w:r>
-        <w:t>turns,</w:t>
-      </w:r>
-      <w:r>
-        <w:t xml:space="preserve"> and the </w:t>
-      </w:r>
-      <w:r>
-        <w:t xml:space="preserve">action </w:t>
-      </w:r>
-      <w:r>
-        <w:t xml:space="preserve">is toggled between </w:t>
-      </w:r>
-      <w:proofErr w:type="spellStart"/>
-      <w:r>
-        <w:rPr>
-          <w:b/>
-          <w:bCs/>
-          <w:i/>
-          <w:iCs/>
-        </w:rPr>
-        <w:t>PursueUp</w:t>
-      </w:r>
-      <w:proofErr w:type="spellEnd"/>
-      <w:r>
-        <w:t xml:space="preserve"> </w:t>
-      </w:r>
-      <w:r>
-        <w:t>and</w:t>
-      </w:r>
-      <w:r>
-        <w:t xml:space="preserve"> </w:t>
-      </w:r>
-      <w:proofErr w:type="spellStart"/>
-      <w:r>
-        <w:rPr>
-          <w:b/>
-          <w:bCs/>
-          <w:i/>
-          <w:iCs/>
-        </w:rPr>
-        <w:t>PursueDown</w:t>
-      </w:r>
-      <w:proofErr w:type="spellEnd"/>
       <w:r>
         <w:rPr>
           <w:b/>
@@ -12363,7 +12120,6 @@
       <w:r>
         <w:t xml:space="preserve">set to </w:t>
       </w:r>
-      <w:proofErr w:type="spellStart"/>
       <w:r>
         <w:rPr>
           <w:b/>
@@ -12373,11 +12129,9 @@
         </w:rPr>
         <w:t>pursueLeft</w:t>
       </w:r>
-      <w:proofErr w:type="spellEnd"/>
       <w:r>
         <w:t xml:space="preserve"> or </w:t>
       </w:r>
-      <w:proofErr w:type="spellStart"/>
       <w:r>
         <w:rPr>
           <w:b/>
@@ -12396,7 +12150,6 @@
         </w:rPr>
         <w:t>ueRight</w:t>
       </w:r>
-      <w:proofErr w:type="spellEnd"/>
       <w:r>
         <w:t>.</w:t>
       </w:r>
@@ -12406,7 +12159,6 @@
       <w:r>
         <w:t xml:space="preserve">action is set to </w:t>
       </w:r>
-      <w:proofErr w:type="spellStart"/>
       <w:r>
         <w:rPr>
           <w:b/>
@@ -12425,11 +12177,9 @@
         </w:rPr>
         <w:t>Up</w:t>
       </w:r>
-      <w:proofErr w:type="spellEnd"/>
       <w:r>
         <w:t xml:space="preserve"> or </w:t>
       </w:r>
-      <w:proofErr w:type="spellStart"/>
       <w:r>
         <w:rPr>
           <w:b/>
@@ -12448,7 +12198,6 @@
         </w:rPr>
         <w:t>Down</w:t>
       </w:r>
-      <w:proofErr w:type="spellEnd"/>
       <w:r>
         <w:t>.</w:t>
       </w:r>
@@ -12745,7 +12494,6 @@
       <w:r>
         <w:t xml:space="preserve">, </w:t>
       </w:r>
-      <w:proofErr w:type="spellStart"/>
       <w:r>
         <w:rPr>
           <w:b/>
@@ -12755,7 +12503,6 @@
         </w:rPr>
         <w:t>pursueLeft</w:t>
       </w:r>
-      <w:proofErr w:type="spellEnd"/>
       <w:r>
         <w:rPr>
           <w:b/>
@@ -12777,7 +12524,6 @@
         </w:rPr>
         <w:t xml:space="preserve"> </w:t>
       </w:r>
-      <w:proofErr w:type="spellStart"/>
       <w:r>
         <w:rPr>
           <w:b/>
@@ -12794,9 +12540,11 @@
           <w:i/>
           <w:iCs/>
         </w:rPr>
-        <w:t>Right</w:t>
-      </w:r>
-      <w:proofErr w:type="spellEnd"/>
+        <w:t xml:space="preserve">Right </w:t>
+      </w:r>
+      <w:r>
+        <w:t>related</w:t>
+      </w:r>
       <w:r>
         <w:rPr>
           <w:b/>
@@ -12807,7 +12555,102 @@
         <w:t xml:space="preserve"> </w:t>
       </w:r>
       <w:r>
-        <w:t>related</w:t>
+        <w:t>rules</w:t>
+      </w:r>
+      <w:r>
+        <w:t>.</w:t>
+      </w:r>
+    </w:p>
+    <w:p>
+      <w:r>
+        <w:t xml:space="preserve">I </w:t>
+      </w:r>
+      <w:r>
+        <w:t xml:space="preserve">implemented </w:t>
+      </w:r>
+      <w:r>
+        <w:t xml:space="preserve">a </w:t>
+      </w:r>
+      <w:r>
+        <w:rPr>
+          <w:i/>
+          <w:iCs/>
+        </w:rPr>
+        <w:t>dalekAI</w:t>
+      </w:r>
+      <w:r>
+        <w:t xml:space="preserve"> function that </w:t>
+      </w:r>
+      <w:r>
+        <w:t xml:space="preserve">encapsulated the </w:t>
+      </w:r>
+      <w:r>
+        <w:t xml:space="preserve">common </w:t>
+      </w:r>
+      <w:r>
+        <w:t>behavioral rules</w:t>
+      </w:r>
+      <w:r>
+        <w:t xml:space="preserve">, </w:t>
+      </w:r>
+      <w:r>
+        <w:t xml:space="preserve">running these against </w:t>
+      </w:r>
+      <w:r>
+        <w:t xml:space="preserve">each </w:t>
+      </w:r>
+      <w:r>
+        <w:t>Dalek every 16 frames.</w:t>
+      </w:r>
+      <w:r>
+        <w:t xml:space="preserve">  </w:t>
+      </w:r>
+      <w:r>
+        <w:t xml:space="preserve">It’s invoked from the game loop. </w:t>
+      </w:r>
+    </w:p>
+    <w:p>
+      <w:r>
+        <w:t xml:space="preserve">The </w:t>
+      </w:r>
+      <w:r>
+        <w:t xml:space="preserve">routine checks </w:t>
+      </w:r>
+      <w:r>
+        <w:t xml:space="preserve">to see if K9 </w:t>
+      </w:r>
+      <w:r>
+        <w:t xml:space="preserve">is </w:t>
+      </w:r>
+      <w:r>
+        <w:t>in sight</w:t>
+      </w:r>
+      <w:r>
+        <w:t xml:space="preserve"> (using a helper routine)</w:t>
+      </w:r>
+      <w:r>
+        <w:t>,</w:t>
+      </w:r>
+      <w:r>
+        <w:t xml:space="preserve"> promot</w:t>
+      </w:r>
+      <w:r>
+        <w:t>ing</w:t>
+      </w:r>
+      <w:r>
+        <w:t xml:space="preserve"> </w:t>
+      </w:r>
+      <w:r>
+        <w:t xml:space="preserve">the  </w:t>
+      </w:r>
+      <w:r>
+        <w:t>Dalek’s</w:t>
+      </w:r>
+      <w:r>
+        <w:t xml:space="preserve"> </w:t>
+      </w:r>
+      <w:r>
+        <w:t xml:space="preserve">action to </w:t>
       </w:r>
       <w:r>
         <w:rPr>
@@ -12816,109 +12659,8 @@
           <w:i/>
           <w:iCs/>
         </w:rPr>
-        <w:t xml:space="preserve"> </w:t>
-      </w:r>
-      <w:r>
-        <w:t>rules</w:t>
-      </w:r>
-      <w:r>
-        <w:t>.</w:t>
-      </w:r>
-    </w:p>
-    <w:p>
-      <w:r>
-        <w:t xml:space="preserve">I </w:t>
-      </w:r>
-      <w:r>
-        <w:t xml:space="preserve">implemented </w:t>
-      </w:r>
-      <w:r>
-        <w:t xml:space="preserve">a </w:t>
-      </w:r>
-      <w:proofErr w:type="spellStart"/>
-      <w:r>
-        <w:rPr>
-          <w:i/>
-          <w:iCs/>
-        </w:rPr>
-        <w:t>dalekAI</w:t>
-      </w:r>
-      <w:proofErr w:type="spellEnd"/>
-      <w:r>
-        <w:t xml:space="preserve"> function that </w:t>
-      </w:r>
-      <w:r>
-        <w:t xml:space="preserve">encapsulated the </w:t>
-      </w:r>
-      <w:r>
-        <w:t xml:space="preserve">common </w:t>
-      </w:r>
-      <w:r>
-        <w:t>behavioral rules</w:t>
-      </w:r>
-      <w:r>
-        <w:t xml:space="preserve">, </w:t>
-      </w:r>
-      <w:r>
-        <w:t xml:space="preserve">running these against </w:t>
-      </w:r>
-      <w:r>
-        <w:t xml:space="preserve">each </w:t>
-      </w:r>
-      <w:r>
-        <w:t>Dalek every 16 frames.</w:t>
-      </w:r>
-      <w:r>
-        <w:t xml:space="preserve">  </w:t>
-      </w:r>
-      <w:r>
-        <w:t xml:space="preserve">It’s invoked from the game loop. </w:t>
-      </w:r>
-    </w:p>
-    <w:p>
-      <w:r>
-        <w:t xml:space="preserve">The </w:t>
-      </w:r>
-      <w:r>
-        <w:t xml:space="preserve">routine checks </w:t>
-      </w:r>
-      <w:r>
-        <w:t xml:space="preserve">to see if K9 </w:t>
-      </w:r>
-      <w:r>
-        <w:t xml:space="preserve">is </w:t>
-      </w:r>
-      <w:r>
-        <w:t>in sight</w:t>
-      </w:r>
-      <w:r>
-        <w:t xml:space="preserve"> (using a helper routine)</w:t>
-      </w:r>
-      <w:r>
-        <w:t>,</w:t>
-      </w:r>
-      <w:r>
-        <w:t xml:space="preserve"> promot</w:t>
-      </w:r>
-      <w:r>
-        <w:t>ing</w:t>
-      </w:r>
-      <w:r>
-        <w:t xml:space="preserve"> </w:t>
-      </w:r>
-      <w:r>
-        <w:t xml:space="preserve">the  </w:t>
-      </w:r>
-      <w:r>
-        <w:t>Dalek’s</w:t>
-      </w:r>
-      <w:r>
-        <w:t xml:space="preserve"> </w:t>
-      </w:r>
-      <w:r>
-        <w:t xml:space="preserve">action to </w:t>
-      </w:r>
-      <w:proofErr w:type="spellStart"/>
+        <w:t>PursueLeft</w:t>
+      </w:r>
       <w:r>
         <w:rPr>
           <w:b/>
@@ -12926,9 +12668,11 @@
           <w:i/>
           <w:iCs/>
         </w:rPr>
-        <w:t>PursueLeft</w:t>
-      </w:r>
-      <w:proofErr w:type="spellEnd"/>
+        <w:t xml:space="preserve"> </w:t>
+      </w:r>
+      <w:r>
+        <w:t>or</w:t>
+      </w:r>
       <w:r>
         <w:rPr>
           <w:b/>
@@ -12936,10 +12680,209 @@
           <w:i/>
           <w:iCs/>
         </w:rPr>
+        <w:t xml:space="preserve"> PursueRight</w:t>
+      </w:r>
+      <w:r>
+        <w:t xml:space="preserve"> if so.</w:t>
+      </w:r>
+      <w:r>
+        <w:t xml:space="preserve"> The function also </w:t>
+      </w:r>
+      <w:r>
+        <w:t>checks to see if K9 is within weapon’s range</w:t>
+      </w:r>
+      <w:r>
+        <w:t>, firing its weapon if it is.</w:t>
+      </w:r>
+    </w:p>
+    <w:p>
+      <w:r>
+        <w:t xml:space="preserve">I then updated </w:t>
+      </w:r>
+      <w:r>
+        <w:t xml:space="preserve">the </w:t>
+      </w:r>
+      <w:r>
+        <w:rPr>
+          <w:i/>
+          <w:iCs/>
+        </w:rPr>
+        <w:t>dalekAnimate</w:t>
+      </w:r>
+      <w:r>
+        <w:t xml:space="preserve"> and all the </w:t>
+      </w:r>
+      <w:r>
+        <w:t xml:space="preserve">Dalek </w:t>
+      </w:r>
+      <w:r>
+        <w:t xml:space="preserve">frame callback functions </w:t>
+      </w:r>
+      <w:r>
+        <w:t xml:space="preserve">to </w:t>
+      </w:r>
+      <w:r>
+        <w:t xml:space="preserve">amend their </w:t>
+      </w:r>
+      <w:r>
+        <w:t>behaviors</w:t>
+      </w:r>
+      <w:r>
+        <w:t xml:space="preserve"> based on </w:t>
+      </w:r>
+      <w:r>
+        <w:t xml:space="preserve">the </w:t>
+      </w:r>
+      <w:r>
+        <w:t>current action.</w:t>
+      </w:r>
+      <w:r>
+        <w:t xml:space="preserve">  The challenge was keeping the impact (increased code-size) to a </w:t>
+      </w:r>
+      <w:r>
+        <w:t>minimum</w:t>
+      </w:r>
+      <w:r>
+        <w:t>.</w:t>
+      </w:r>
+      <w:r>
+        <w:t xml:space="preserve"> A lot of time was spent refactoring these functio</w:t>
+      </w:r>
+      <w:r>
+        <w:t>ns to use as few code bytes as possible.</w:t>
+      </w:r>
+    </w:p>
+    <w:p>
+      <w:r>
+        <w:t>On</w:t>
+      </w:r>
+      <w:r>
+        <w:t>e</w:t>
+      </w:r>
+      <w:r>
+        <w:t xml:space="preserve"> notable challenge was how best to </w:t>
+      </w:r>
+      <w:r>
+        <w:t xml:space="preserve">show </w:t>
+      </w:r>
+      <w:r>
+        <w:t>damage being inflicted on K9.</w:t>
+      </w:r>
+      <w:r>
+        <w:t xml:space="preserve">  After brainstorming many ideas, I ended up implementing a simple </w:t>
+      </w:r>
+      <w:r>
+        <w:t>first-person</w:t>
+      </w:r>
+      <w:r>
         <w:t xml:space="preserve"> </w:t>
       </w:r>
       <w:r>
-        <w:t>or</w:t>
+        <w:t xml:space="preserve">effect where </w:t>
+      </w:r>
+      <w:r>
+        <w:t xml:space="preserve">the </w:t>
+      </w:r>
+      <w:r>
+        <w:lastRenderedPageBreak/>
+        <w:t xml:space="preserve">screen </w:t>
+      </w:r>
+      <w:r>
+        <w:t xml:space="preserve">is flashed </w:t>
+      </w:r>
+      <w:r>
+        <w:t>black</w:t>
+      </w:r>
+      <w:r>
+        <w:t>,</w:t>
+      </w:r>
+      <w:r>
+        <w:t xml:space="preserve"> </w:t>
+      </w:r>
+      <w:r>
+        <w:t>at a</w:t>
+      </w:r>
+      <w:r>
+        <w:t xml:space="preserve"> low frequence</w:t>
+      </w:r>
+      <w:r>
+        <w:t>,</w:t>
+      </w:r>
+      <w:r>
+        <w:t xml:space="preserve"> </w:t>
+      </w:r>
+      <w:r>
+        <w:t>and a</w:t>
+      </w:r>
+      <w:r>
+        <w:t>n obnoxious sound</w:t>
+      </w:r>
+      <w:r>
+        <w:t xml:space="preserve"> is </w:t>
+      </w:r>
+      <w:r>
+        <w:t>played</w:t>
+      </w:r>
+      <w:r>
+        <w:t>.</w:t>
+      </w:r>
+      <w:r>
+        <w:t xml:space="preserve">  The effect is quite </w:t>
+      </w:r>
+      <w:r>
+        <w:t>e</w:t>
+      </w:r>
+      <w:r>
+        <w:t>ffective</w:t>
+      </w:r>
+      <w:r>
+        <w:t>!</w:t>
+      </w:r>
+    </w:p>
+    <w:p>
+      <w:r>
+        <w:t xml:space="preserve">I also added a Mode 7 </w:t>
+      </w:r>
+      <w:r>
+        <w:t xml:space="preserve">incomplete level </w:t>
+      </w:r>
+      <w:r>
+        <w:t xml:space="preserve">screen, which </w:t>
+      </w:r>
+      <w:r>
+        <w:t>shows</w:t>
+      </w:r>
+      <w:r>
+        <w:t xml:space="preserve"> </w:t>
+      </w:r>
+      <w:r>
+        <w:t xml:space="preserve">if </w:t>
+      </w:r>
+      <w:r>
+        <w:t>K</w:t>
+      </w:r>
+      <w:r>
+        <w:t xml:space="preserve">9’s health </w:t>
+      </w:r>
+      <w:r>
+        <w:t xml:space="preserve">becomes </w:t>
+      </w:r>
+      <w:r>
+        <w:t>zero</w:t>
+      </w:r>
+      <w:r>
+        <w:t>.  Pressing space restarts the level.</w:t>
+      </w:r>
+    </w:p>
+    <w:p>
+      <w:r>
+        <w:t xml:space="preserve">I then turned to </w:t>
+      </w:r>
+      <w:r>
+        <w:t>implementing</w:t>
+      </w:r>
+      <w:r>
+        <w:t xml:space="preserve"> the </w:t>
       </w:r>
       <w:r>
         <w:rPr>
@@ -12948,9 +12891,11 @@
           <w:i/>
           <w:iCs/>
         </w:rPr>
-        <w:t xml:space="preserve"> </w:t>
-      </w:r>
-      <w:proofErr w:type="spellStart"/>
+        <w:t>PursueUp</w:t>
+      </w:r>
+      <w:r>
+        <w:t xml:space="preserve"> and </w:t>
+      </w:r>
       <w:r>
         <w:rPr>
           <w:b/>
@@ -12958,250 +12903,20 @@
           <w:i/>
           <w:iCs/>
         </w:rPr>
-        <w:t>PursueRight</w:t>
-      </w:r>
-      <w:proofErr w:type="spellEnd"/>
-      <w:r>
-        <w:t xml:space="preserve"> if so.</w:t>
-      </w:r>
-      <w:r>
-        <w:t xml:space="preserve"> The function also </w:t>
-      </w:r>
-      <w:r>
-        <w:t>checks to see if K9 is within weapon’s range</w:t>
-      </w:r>
-      <w:r>
-        <w:t>, firing its weapon if it is.</w:t>
-      </w:r>
-    </w:p>
-    <w:p>
-      <w:r>
-        <w:t xml:space="preserve">I then updated </w:t>
-      </w:r>
-      <w:r>
-        <w:t xml:space="preserve">the </w:t>
-      </w:r>
-      <w:proofErr w:type="spellStart"/>
-      <w:r>
-        <w:rPr>
-          <w:i/>
-          <w:iCs/>
-        </w:rPr>
-        <w:t>dalekAnimate</w:t>
-      </w:r>
-      <w:proofErr w:type="spellEnd"/>
-      <w:r>
-        <w:t xml:space="preserve"> and all the </w:t>
-      </w:r>
-      <w:r>
-        <w:t xml:space="preserve">Dalek </w:t>
-      </w:r>
-      <w:r>
-        <w:t xml:space="preserve">frame callback functions </w:t>
-      </w:r>
-      <w:r>
-        <w:t xml:space="preserve">to </w:t>
-      </w:r>
-      <w:r>
-        <w:t xml:space="preserve">amend their </w:t>
-      </w:r>
-      <w:r>
-        <w:t>behaviors</w:t>
-      </w:r>
-      <w:r>
-        <w:t xml:space="preserve"> based on </w:t>
-      </w:r>
-      <w:r>
-        <w:t xml:space="preserve">the </w:t>
-      </w:r>
-      <w:r>
-        <w:t>current action.</w:t>
-      </w:r>
-      <w:r>
-        <w:t xml:space="preserve">  The challenge was keeping the impact (increased code-size) to a </w:t>
-      </w:r>
-      <w:r>
-        <w:t>minimum</w:t>
+        <w:t>PursueDown</w:t>
+      </w:r>
+      <w:r>
+        <w:t xml:space="preserve"> behavior</w:t>
+      </w:r>
+      <w:r>
+        <w:t>al rule</w:t>
+      </w:r>
+      <w:r>
+        <w:t>s</w:t>
       </w:r>
       <w:r>
         <w:t>.</w:t>
       </w:r>
-      <w:r>
-        <w:t xml:space="preserve"> A lot of time was spent refactoring these functio</w:t>
-      </w:r>
-      <w:r>
-        <w:t>ns to use as few code bytes as possible.</w:t>
-      </w:r>
-    </w:p>
-    <w:p>
-      <w:r>
-        <w:t>On</w:t>
-      </w:r>
-      <w:r>
-        <w:t>e</w:t>
-      </w:r>
-      <w:r>
-        <w:t xml:space="preserve"> notable challenge was how best to </w:t>
-      </w:r>
-      <w:r>
-        <w:t xml:space="preserve">show </w:t>
-      </w:r>
-      <w:r>
-        <w:t>damage being inflicted on K9.</w:t>
-      </w:r>
-      <w:r>
-        <w:t xml:space="preserve">  After brainstorming many ideas, I ended up implementing a simple </w:t>
-      </w:r>
-      <w:r>
-        <w:t>first-person</w:t>
-      </w:r>
-      <w:r>
-        <w:t xml:space="preserve"> </w:t>
-      </w:r>
-      <w:r>
-        <w:t xml:space="preserve">effect where </w:t>
-      </w:r>
-      <w:r>
-        <w:t xml:space="preserve">the </w:t>
-      </w:r>
-      <w:r>
-        <w:lastRenderedPageBreak/>
-        <w:t xml:space="preserve">screen </w:t>
-      </w:r>
-      <w:r>
-        <w:t xml:space="preserve">is flashed </w:t>
-      </w:r>
-      <w:r>
-        <w:t>black</w:t>
-      </w:r>
-      <w:r>
-        <w:t>,</w:t>
-      </w:r>
-      <w:r>
-        <w:t xml:space="preserve"> </w:t>
-      </w:r>
-      <w:r>
-        <w:t>at a</w:t>
-      </w:r>
-      <w:r>
-        <w:t xml:space="preserve"> low frequence</w:t>
-      </w:r>
-      <w:r>
-        <w:t>,</w:t>
-      </w:r>
-      <w:r>
-        <w:t xml:space="preserve"> </w:t>
-      </w:r>
-      <w:r>
-        <w:t>and a</w:t>
-      </w:r>
-      <w:r>
-        <w:t>n obnoxious sound</w:t>
-      </w:r>
-      <w:r>
-        <w:t xml:space="preserve"> is </w:t>
-      </w:r>
-      <w:r>
-        <w:t>played</w:t>
-      </w:r>
-      <w:r>
-        <w:t>.</w:t>
-      </w:r>
-      <w:r>
-        <w:t xml:space="preserve">  The effect is quite </w:t>
-      </w:r>
-      <w:r>
-        <w:t>e</w:t>
-      </w:r>
-      <w:r>
-        <w:t>ffective</w:t>
-      </w:r>
-      <w:r>
-        <w:t>!</w:t>
-      </w:r>
-    </w:p>
-    <w:p>
-      <w:r>
-        <w:t xml:space="preserve">I also added a Mode 7 </w:t>
-      </w:r>
-      <w:r>
-        <w:t xml:space="preserve">incomplete level </w:t>
-      </w:r>
-      <w:r>
-        <w:t xml:space="preserve">screen, which </w:t>
-      </w:r>
-      <w:r>
-        <w:t>shows</w:t>
-      </w:r>
-      <w:r>
-        <w:t xml:space="preserve"> </w:t>
-      </w:r>
-      <w:r>
-        <w:t xml:space="preserve">if </w:t>
-      </w:r>
-      <w:r>
-        <w:t>K</w:t>
-      </w:r>
-      <w:r>
-        <w:t xml:space="preserve">9’s health </w:t>
-      </w:r>
-      <w:r>
-        <w:t xml:space="preserve">becomes </w:t>
-      </w:r>
-      <w:r>
-        <w:t>zero</w:t>
-      </w:r>
-      <w:r>
-        <w:t>.  Pressing space restarts the level.</w:t>
-      </w:r>
-    </w:p>
-    <w:p>
-      <w:r>
-        <w:t xml:space="preserve">I then turned to </w:t>
-      </w:r>
-      <w:r>
-        <w:t>implementing</w:t>
-      </w:r>
-      <w:r>
-        <w:t xml:space="preserve"> the </w:t>
-      </w:r>
-      <w:proofErr w:type="spellStart"/>
-      <w:r>
-        <w:rPr>
-          <w:b/>
-          <w:bCs/>
-          <w:i/>
-          <w:iCs/>
-        </w:rPr>
-        <w:t>PursueUp</w:t>
-      </w:r>
-      <w:proofErr w:type="spellEnd"/>
-      <w:r>
-        <w:t xml:space="preserve"> and </w:t>
-      </w:r>
-      <w:proofErr w:type="spellStart"/>
-      <w:r>
-        <w:rPr>
-          <w:b/>
-          <w:bCs/>
-          <w:i/>
-          <w:iCs/>
-        </w:rPr>
-        <w:t>PursueDown</w:t>
-      </w:r>
-      <w:proofErr w:type="spellEnd"/>
-      <w:r>
-        <w:t xml:space="preserve"> behavior</w:t>
-      </w:r>
-      <w:r>
-        <w:t>al rule</w:t>
-      </w:r>
-      <w:r>
-        <w:t>s</w:t>
-      </w:r>
-      <w:r>
-        <w:t>.</w:t>
-      </w:r>
     </w:p>
     <w:p>
       <w:r>
@@ -13222,7 +12937,6 @@
       <w:r>
         <w:t xml:space="preserve">e to support this.  Fortunately, the low nibble of the elevator’s </w:t>
       </w:r>
-      <w:proofErr w:type="spellStart"/>
       <w:r>
         <w:rPr>
           <w:i/>
@@ -13230,7 +12944,6 @@
         </w:rPr>
         <w:t>objectState</w:t>
       </w:r>
-      <w:proofErr w:type="spellEnd"/>
       <w:r>
         <w:t xml:space="preserve"> variable </w:t>
       </w:r>
@@ -13447,15 +13160,7 @@
         <w:t>Daleks in pursuit</w:t>
       </w:r>
       <w:r>
-        <w:t xml:space="preserve"> - When one or more Daleks are in pursuit of K9, a </w:t>
-      </w:r>
-      <w:proofErr w:type="spellStart"/>
-      <w:r>
-        <w:t>PacMan</w:t>
-      </w:r>
-      <w:proofErr w:type="spellEnd"/>
-      <w:r>
-        <w:t xml:space="preserve"> like sound effect plays, giving the player a sense of pressure.  The sound effect provide</w:t>
+        <w:t xml:space="preserve"> - When one or more Daleks are in pursuit of K9, a PacMan like sound effect plays, giving the player a sense of pressure.  The sound effect provide</w:t>
       </w:r>
       <w:r>
         <w:t>s</w:t>
@@ -13680,7 +13385,6 @@
       <w:r>
         <w:t xml:space="preserve">Channel 2 is used for the collect key/jewel, door locked, and K9 movement sound effects.  These sound effects are mutually exclusive except for the movement sound effect.  The game uses a </w:t>
       </w:r>
-      <w:proofErr w:type="spellStart"/>
       <w:r>
         <w:rPr>
           <w:i/>
@@ -13688,7 +13392,6 @@
         </w:rPr>
         <w:t>frameCount</w:t>
       </w:r>
-      <w:proofErr w:type="spellEnd"/>
       <w:r>
         <w:t xml:space="preserve"> based timer to inhibit playing the movement sound effect when the other sound effects are playing.</w:t>
       </w:r>
@@ -14128,14 +13831,27 @@
       <w:r>
         <w:t xml:space="preserve">Figure </w:t>
       </w:r>
-      <w:fldSimple w:instr=" SEQ Figure \* ARABIC ">
-        <w:r>
-          <w:rPr>
-            <w:noProof/>
-          </w:rPr>
-          <w:t>5</w:t>
-        </w:r>
-      </w:fldSimple>
+      <w:r>
+        <w:fldChar w:fldCharType="begin"/>
+      </w:r>
+      <w:r>
+        <w:instrText xml:space="preserve"> SEQ Figure \* ARABIC </w:instrText>
+      </w:r>
+      <w:r>
+        <w:fldChar w:fldCharType="separate"/>
+      </w:r>
+      <w:r>
+        <w:rPr>
+          <w:noProof/>
+        </w:rPr>
+        <w:t>5</w:t>
+      </w:r>
+      <w:r>
+        <w:rPr>
+          <w:noProof/>
+        </w:rPr>
+        <w:fldChar w:fldCharType="end"/>
+      </w:r>
     </w:p>
     <w:p>
       <w:r>
@@ -14268,14 +13984,27 @@
       <w:r>
         <w:t xml:space="preserve">Figure </w:t>
       </w:r>
-      <w:fldSimple w:instr=" SEQ Figure \* ARABIC ">
-        <w:r>
-          <w:rPr>
-            <w:noProof/>
-          </w:rPr>
-          <w:t>6</w:t>
-        </w:r>
-      </w:fldSimple>
+      <w:r>
+        <w:fldChar w:fldCharType="begin"/>
+      </w:r>
+      <w:r>
+        <w:instrText xml:space="preserve"> SEQ Figure \* ARABIC </w:instrText>
+      </w:r>
+      <w:r>
+        <w:fldChar w:fldCharType="separate"/>
+      </w:r>
+      <w:r>
+        <w:rPr>
+          <w:noProof/>
+        </w:rPr>
+        <w:t>6</w:t>
+      </w:r>
+      <w:r>
+        <w:rPr>
+          <w:noProof/>
+        </w:rPr>
+        <w:fldChar w:fldCharType="end"/>
+      </w:r>
     </w:p>
     <w:p>
       <w:r>
@@ -14287,7 +14016,6 @@
       <w:r>
         <w:t xml:space="preserve"> into the sprite data and let the </w:t>
       </w:r>
-      <w:proofErr w:type="spellStart"/>
       <w:r>
         <w:rPr>
           <w:i/>
@@ -14295,7 +14023,6 @@
         </w:rPr>
         <w:t>drawSprite</w:t>
       </w:r>
-      <w:proofErr w:type="spellEnd"/>
       <w:r>
         <w:t xml:space="preserve"> routine do all the work of putting the pixels on the screen, however this would result in the ‘</w:t>
       </w:r>
@@ -14718,7 +14445,6 @@
       <w:r>
         <w:t xml:space="preserve">from </w:t>
       </w:r>
-      <w:proofErr w:type="spellStart"/>
       <w:r>
         <w:rPr>
           <w:i/>
@@ -14726,11 +14452,9 @@
         </w:rPr>
         <w:t>drawObject</w:t>
       </w:r>
-      <w:proofErr w:type="spellEnd"/>
       <w:r>
         <w:t xml:space="preserve"> and </w:t>
       </w:r>
-      <w:proofErr w:type="spellStart"/>
       <w:r>
         <w:rPr>
           <w:i/>
@@ -14738,7 +14462,6 @@
         </w:rPr>
         <w:t>drawLaserOn</w:t>
       </w:r>
-      <w:proofErr w:type="spellEnd"/>
       <w:r>
         <w:rPr>
           <w:i/>
@@ -15709,14 +15432,27 @@
       <w:r>
         <w:t xml:space="preserve">Figure </w:t>
       </w:r>
-      <w:fldSimple w:instr=" SEQ Figure \* ARABIC ">
-        <w:r>
-          <w:rPr>
-            <w:noProof/>
-          </w:rPr>
-          <w:t>4</w:t>
-        </w:r>
-      </w:fldSimple>
+      <w:r>
+        <w:fldChar w:fldCharType="begin"/>
+      </w:r>
+      <w:r>
+        <w:instrText xml:space="preserve"> SEQ Figure \* ARABIC </w:instrText>
+      </w:r>
+      <w:r>
+        <w:fldChar w:fldCharType="separate"/>
+      </w:r>
+      <w:r>
+        <w:rPr>
+          <w:noProof/>
+        </w:rPr>
+        <w:t>4</w:t>
+      </w:r>
+      <w:r>
+        <w:rPr>
+          <w:noProof/>
+        </w:rPr>
+        <w:fldChar w:fldCharType="end"/>
+      </w:r>
     </w:p>
     <w:p>
       <w:r>
@@ -15881,7 +15617,6 @@
       <w:r>
         <w:t xml:space="preserve">The title functionality starts and stops playback by invoking the </w:t>
       </w:r>
-      <w:proofErr w:type="spellStart"/>
       <w:r>
         <w:rPr>
           <w:b/>
@@ -15891,11 +15626,9 @@
         </w:rPr>
         <w:t>playMusic</w:t>
       </w:r>
-      <w:proofErr w:type="spellEnd"/>
       <w:r>
         <w:t xml:space="preserve"> and </w:t>
       </w:r>
-      <w:proofErr w:type="spellStart"/>
       <w:r>
         <w:rPr>
           <w:b/>
@@ -15905,7 +15638,6 @@
         </w:rPr>
         <w:t>stopMusic</w:t>
       </w:r>
-      <w:proofErr w:type="spellEnd"/>
       <w:r>
         <w:t xml:space="preserve"> routines.  These routines start and stop the music, which is played in the </w:t>
       </w:r>
@@ -16387,28 +16119,20 @@
         <w:pStyle w:val="Heading2"/>
       </w:pPr>
       <w:r>
-        <w:rPr>
-          <w:i/>
-          <w:iCs/>
-        </w:rPr>
-        <w:t>“</w:t>
-      </w:r>
-      <w:r>
-        <w:rPr>
-          <w:i/>
-          <w:iCs/>
-        </w:rPr>
-        <w:t>Exterminate</w:t>
-      </w:r>
-      <w:r>
-        <w:rPr>
-          <w:i/>
-          <w:iCs/>
-        </w:rPr>
-        <w:t>”</w:t>
-      </w:r>
-      <w:r>
-        <w:t xml:space="preserve"> sound effect</w:t>
+        <w:t>Sample based</w:t>
+      </w:r>
+      <w:r>
+        <w:rPr>
+          <w:i/>
+          <w:iCs/>
+        </w:rPr>
+        <w:t xml:space="preserve"> </w:t>
+      </w:r>
+      <w:r>
+        <w:t>sound effect</w:t>
+      </w:r>
+      <w:r>
+        <w:t>s</w:t>
       </w:r>
     </w:p>
     <w:p>
@@ -16602,7 +16326,13 @@
         <w:t>20% impact on game performance</w:t>
       </w:r>
       <w:r>
-        <w:t>, which is not good.</w:t>
+        <w:t xml:space="preserve">, which is </w:t>
+      </w:r>
+      <w:r>
+        <w:t xml:space="preserve">clearly </w:t>
+      </w:r>
+      <w:r>
+        <w:t>not good.</w:t>
       </w:r>
     </w:p>
     <w:p>
@@ -16966,7 +16696,13 @@
         <w:t>press space to continue</w:t>
       </w:r>
       <w:r>
-        <w:t xml:space="preserve">" after the data </w:t>
+        <w:t xml:space="preserve">" after the </w:t>
+      </w:r>
+      <w:r>
+        <w:t xml:space="preserve">PCM </w:t>
+      </w:r>
+      <w:r>
+        <w:t xml:space="preserve">data </w:t>
       </w:r>
       <w:r>
         <w:t xml:space="preserve">completes </w:t>
@@ -17030,18 +16766,10 @@
         <w:t xml:space="preserve">is set </w:t>
       </w:r>
       <w:r>
-        <w:t>to silence.</w:t>
-      </w:r>
-      <w:r>
-        <w:t xml:space="preserve"> </w:t>
-      </w:r>
-      <w:r>
-        <w:t xml:space="preserve"> </w:t>
-      </w:r>
-    </w:p>
-    <w:p>
-      <w:r>
-        <w:t xml:space="preserve">The </w:t>
+        <w:t xml:space="preserve">to silence. </w:t>
+      </w:r>
+      <w:r>
+        <w:t xml:space="preserve"> The </w:t>
       </w:r>
       <w:r>
         <w:t xml:space="preserve">tone generator’s volume </w:t>
@@ -17076,7 +16804,10 @@
         <w:t xml:space="preserve">” sound was much better than I expected, and better still, the performance </w:t>
       </w:r>
       <w:r>
-        <w:t>impact was acceptable</w:t>
+        <w:t xml:space="preserve">impact was </w:t>
+      </w:r>
+      <w:r>
+        <w:t>not too bad</w:t>
       </w:r>
       <w:r>
         <w:t xml:space="preserve">.  </w:t>
@@ -17305,57 +17036,84 @@
           <w:b/>
           <w:bCs/>
         </w:rPr>
-        <w:t xml:space="preserve">LSR A : </w:t>
+        <w:t>LSR A : LSR A : LSR A : LSR A</w:t>
+      </w:r>
+      <w:r>
+        <w:t xml:space="preserve"> is </w:t>
+      </w:r>
+      <w:r>
+        <w:t>written</w:t>
+      </w:r>
+      <w:r>
+        <w:t xml:space="preserve"> </w:t>
+      </w:r>
+      <w:r>
+        <w:t xml:space="preserve">and used </w:t>
+      </w:r>
+      <w:r>
+        <w:t>to extract the high nibbles.</w:t>
+      </w:r>
+      <w:r>
+        <w:t xml:space="preserve">  </w:t>
       </w:r>
       <w:r>
         <w:rPr>
           <w:b/>
           <w:bCs/>
         </w:rPr>
-        <w:t>LSR A :</w:t>
+        <w:t xml:space="preserve">AND </w:t>
       </w:r>
       <w:r>
         <w:rPr>
           <w:b/>
           <w:bCs/>
         </w:rPr>
+        <w:t>#&amp;0F</w:t>
+      </w:r>
+      <w:r>
+        <w:t xml:space="preserve"> is repeated</w:t>
+      </w:r>
+      <w:r>
+        <w:t xml:space="preserve"> to fill </w:t>
+      </w:r>
+      <w:r>
+        <w:t xml:space="preserve">the </w:t>
+      </w:r>
+      <w:r>
+        <w:t>4 code bytes</w:t>
+      </w:r>
+      <w:r>
         <w:t xml:space="preserve"> </w:t>
+      </w:r>
+      <w:r>
+        <w:t xml:space="preserve">that </w:t>
       </w:r>
       <w:r>
         <w:rPr>
           <w:b/>
           <w:bCs/>
         </w:rPr>
-        <w:t>LSR A :</w:t>
+        <w:t>4 x</w:t>
+      </w:r>
+      <w:r>
+        <w:t xml:space="preserve"> </w:t>
       </w:r>
       <w:r>
         <w:rPr>
           <w:b/>
           <w:bCs/>
         </w:rPr>
-        <w:t xml:space="preserve"> </w:t>
+        <w:t>LSR A</w:t>
       </w:r>
       <w:r>
         <w:rPr>
           <w:b/>
           <w:bCs/>
         </w:rPr>
-        <w:t>LSR A</w:t>
-      </w:r>
-      <w:r>
-        <w:t xml:space="preserve"> is </w:t>
-      </w:r>
-      <w:r>
-        <w:t>written</w:t>
-      </w:r>
-      <w:r>
         <w:t xml:space="preserve"> </w:t>
       </w:r>
       <w:r>
-        <w:t xml:space="preserve">and used </w:t>
-      </w:r>
-      <w:r>
-        <w:t>to extract the high nibbles.</w:t>
+        <w:t>uses.</w:t>
       </w:r>
     </w:p>
     <w:p>
@@ -17386,16 +17144,35 @@
         <w:t xml:space="preserve">a </w:t>
       </w:r>
       <w:r>
+        <w:rPr>
+          <w:b/>
+          <w:bCs/>
+        </w:rPr>
         <w:t>start</w:t>
       </w:r>
       <w:r>
+        <w:rPr>
+          <w:b/>
+          <w:bCs/>
+        </w:rPr>
         <w:t>/</w:t>
       </w:r>
       <w:r>
-        <w:t xml:space="preserve"> end address</w:t>
-      </w:r>
-      <w:r>
-        <w:t xml:space="preserve"> table for </w:t>
+        <w:rPr>
+          <w:b/>
+          <w:bCs/>
+        </w:rPr>
+        <w:t>end address</w:t>
+      </w:r>
+      <w:r>
+        <w:rPr>
+          <w:b/>
+          <w:bCs/>
+        </w:rPr>
+        <w:t xml:space="preserve"> table</w:t>
+      </w:r>
+      <w:r>
+        <w:t xml:space="preserve"> for </w:t>
       </w:r>
       <w:r>
         <w:t xml:space="preserve">the encoded </w:t>
@@ -17407,7 +17184,13 @@
         <w:t>s</w:t>
       </w:r>
       <w:r>
-        <w:t>, which the runtime used to play the appropriate sample.</w:t>
+        <w:t>, which the runtime use</w:t>
+      </w:r>
+      <w:r>
+        <w:t>s</w:t>
+      </w:r>
+      <w:r>
+        <w:t xml:space="preserve"> to play the appropriate sample.</w:t>
       </w:r>
     </w:p>
     <w:p>
@@ -17449,7 +17232,20 @@
     </w:p>
     <w:p>
       <w:r>
-        <w:t xml:space="preserve">The first thing I did was to ensure that the routine first tests </w:t>
+        <w:t xml:space="preserve">The first thing I did was to ensure that the </w:t>
+      </w:r>
+      <w:r>
+        <w:rPr>
+          <w:b/>
+          <w:bCs/>
+        </w:rPr>
+        <w:t>User-VIA Timer1</w:t>
+      </w:r>
+      <w:r>
+        <w:t xml:space="preserve"> interrupt is active only when samples are played.  I then ensured that the </w:t>
+      </w:r>
+      <w:r>
+        <w:t xml:space="preserve">routine first tests </w:t>
       </w:r>
       <w:r>
         <w:t xml:space="preserve">for the 8KHz timer, only branching if the interrupt </w:t>
@@ -17461,10 +17257,16 @@
         <w:t xml:space="preserve">for something else.  Falling through a branch </w:t>
       </w:r>
       <w:r>
-        <w:t xml:space="preserve">takes less cycles than </w:t>
-      </w:r>
-      <w:r>
-        <w:t>branching.</w:t>
+        <w:t>takes</w:t>
+      </w:r>
+      <w:r>
+        <w:t xml:space="preserve"> one </w:t>
+      </w:r>
+      <w:r>
+        <w:t>less cycle</w:t>
+      </w:r>
+      <w:r>
+        <w:t xml:space="preserve"> than branching.</w:t>
       </w:r>
     </w:p>
     <w:p>
@@ -17480,6 +17282,21 @@
       <w:r>
         <w:t xml:space="preserve">  The average cost of these instructions is six cycles.</w:t>
       </w:r>
+      <w:r>
+        <w:t xml:space="preserve">  An additional two cycles are needed to set the </w:t>
+      </w:r>
+      <w:r>
+        <w:t xml:space="preserve">top four </w:t>
+      </w:r>
+      <w:r>
+        <w:t>SN76489</w:t>
+      </w:r>
+      <w:r>
+        <w:t xml:space="preserve"> </w:t>
+      </w:r>
+      <w:r>
+        <w:t>control bits.</w:t>
+      </w:r>
     </w:p>
     <w:p>
       <w:r>
@@ -17541,6 +17358,20 @@
           <w:iCs/>
         </w:rPr>
         <w:t>end of half</w:t>
+      </w:r>
+      <w:r>
+        <w:rPr>
+          <w:i/>
+          <w:iCs/>
+        </w:rPr>
+        <w:t xml:space="preserve"> </w:t>
+      </w:r>
+      <w:r>
+        <w:rPr>
+          <w:i/>
+          <w:iCs/>
+        </w:rPr>
+        <w:t>sample</w:t>
       </w:r>
       <w:r>
         <w:t>’ testing.  The tests are only performed at page boundar</w:t>
@@ -17684,11 +17515,9 @@
             <w:tcW w:w="3116" w:type="dxa"/>
           </w:tcPr>
           <w:p>
-            <w:proofErr w:type="spellStart"/>
             <w:r>
               <w:t>soundVector_beginPursuit</w:t>
             </w:r>
-            <w:proofErr w:type="spellEnd"/>
           </w:p>
         </w:tc>
         <w:tc>
@@ -17699,11 +17528,9 @@
             <w:pPr>
               <w:cnfStyle w:val="000000100000" w:firstRow="0" w:lastRow="0" w:firstColumn="0" w:lastColumn="0" w:oddVBand="0" w:evenVBand="0" w:oddHBand="1" w:evenHBand="0" w:firstRowFirstColumn="0" w:firstRowLastColumn="0" w:lastRowFirstColumn="0" w:lastRowLastColumn="0"/>
             </w:pPr>
-            <w:proofErr w:type="spellStart"/>
             <w:r>
               <w:t>soundEffect_pursuitOff</w:t>
             </w:r>
-            <w:proofErr w:type="spellEnd"/>
           </w:p>
         </w:tc>
         <w:tc>
@@ -17714,14 +17541,12 @@
             <w:pPr>
               <w:cnfStyle w:val="000000100000" w:firstRow="0" w:lastRow="0" w:firstColumn="0" w:lastColumn="0" w:oddVBand="0" w:evenVBand="0" w:oddHBand="1" w:evenHBand="0" w:firstRowFirstColumn="0" w:firstRowLastColumn="0" w:lastRowFirstColumn="0" w:lastRowLastColumn="0"/>
             </w:pPr>
-            <w:proofErr w:type="spellStart"/>
             <w:r>
               <w:t>sample_</w:t>
             </w:r>
             <w:r>
               <w:t>soundExterminate</w:t>
             </w:r>
-            <w:proofErr w:type="spellEnd"/>
           </w:p>
         </w:tc>
       </w:tr>
@@ -17732,17 +17557,9 @@
             <w:tcW w:w="3116" w:type="dxa"/>
           </w:tcPr>
           <w:p>
-            <w:proofErr w:type="spellStart"/>
             <w:r>
-              <w:t>soundVector_</w:t>
+              <w:t>soundVector_updatePursuit</w:t>
             </w:r>
-            <w:r>
-              <w:t>update</w:t>
-            </w:r>
-            <w:r>
-              <w:t>Pursuit</w:t>
-            </w:r>
-            <w:proofErr w:type="spellEnd"/>
           </w:p>
         </w:tc>
         <w:tc>
@@ -17756,6 +17573,9 @@
             <w:r>
               <w:t>RTS</w:t>
             </w:r>
+            <w:r>
+              <w:t xml:space="preserve"> (no sound effect)</w:t>
+            </w:r>
           </w:p>
         </w:tc>
         <w:tc>
@@ -17766,14 +17586,9 @@
             <w:pPr>
               <w:cnfStyle w:val="000000000000" w:firstRow="0" w:lastRow="0" w:firstColumn="0" w:lastColumn="0" w:oddVBand="0" w:evenVBand="0" w:oddHBand="0" w:evenHBand="0" w:firstRowFirstColumn="0" w:firstRowLastColumn="0" w:lastRowFirstColumn="0" w:lastRowLastColumn="0"/>
             </w:pPr>
-            <w:proofErr w:type="spellStart"/>
             <w:r>
-              <w:t>sample_</w:t>
+              <w:t>sample_updatePursuit</w:t>
             </w:r>
-            <w:r>
-              <w:t>updatePursuit</w:t>
-            </w:r>
-            <w:proofErr w:type="spellEnd"/>
           </w:p>
         </w:tc>
       </w:tr>
@@ -17787,17 +17602,9 @@
             <w:tcW w:w="3116" w:type="dxa"/>
           </w:tcPr>
           <w:p>
-            <w:proofErr w:type="spellStart"/>
             <w:r>
-              <w:t>soundVector_</w:t>
+              <w:t>soundVector_endPursuit</w:t>
             </w:r>
-            <w:r>
-              <w:t>end</w:t>
-            </w:r>
-            <w:r>
-              <w:t>Pursuit</w:t>
-            </w:r>
-            <w:proofErr w:type="spellEnd"/>
           </w:p>
         </w:tc>
         <w:tc>
@@ -17808,11 +17615,9 @@
             <w:pPr>
               <w:cnfStyle w:val="000000100000" w:firstRow="0" w:lastRow="0" w:firstColumn="0" w:lastColumn="0" w:oddVBand="0" w:evenVBand="0" w:oddHBand="1" w:evenHBand="0" w:firstRowFirstColumn="0" w:firstRowLastColumn="0" w:lastRowFirstColumn="0" w:lastRowLastColumn="0"/>
             </w:pPr>
-            <w:proofErr w:type="spellStart"/>
             <w:r>
               <w:t>soundEffect_pursuitOff</w:t>
             </w:r>
-            <w:proofErr w:type="spellEnd"/>
           </w:p>
         </w:tc>
         <w:tc>
@@ -17823,14 +17628,9 @@
             <w:pPr>
               <w:cnfStyle w:val="000000100000" w:firstRow="0" w:lastRow="0" w:firstColumn="0" w:lastColumn="0" w:oddVBand="0" w:evenVBand="0" w:oddHBand="1" w:evenHBand="0" w:firstRowFirstColumn="0" w:firstRowLastColumn="0" w:lastRowFirstColumn="0" w:lastRowLastColumn="0"/>
             </w:pPr>
-            <w:proofErr w:type="spellStart"/>
             <w:r>
-              <w:t>sample_</w:t>
+              <w:t>sample_stop</w:t>
             </w:r>
-            <w:r>
-              <w:t>stop</w:t>
-            </w:r>
-            <w:proofErr w:type="spellEnd"/>
           </w:p>
         </w:tc>
       </w:tr>
@@ -17841,14 +17641,9 @@
             <w:tcW w:w="3116" w:type="dxa"/>
           </w:tcPr>
           <w:p>
-            <w:proofErr w:type="spellStart"/>
             <w:r>
-              <w:t>soundVector_</w:t>
+              <w:t>soundVector_enemyLasered</w:t>
             </w:r>
-            <w:r>
-              <w:t>enemyLasered</w:t>
-            </w:r>
-            <w:proofErr w:type="spellEnd"/>
           </w:p>
         </w:tc>
         <w:tc>
@@ -17862,6 +17657,18 @@
             <w:r>
               <w:t>RTS</w:t>
             </w:r>
+            <w:r>
+              <w:t xml:space="preserve"> </w:t>
+            </w:r>
+            <w:r>
+              <w:t>(no sound</w:t>
+            </w:r>
+            <w:r>
+              <w:t xml:space="preserve"> </w:t>
+            </w:r>
+            <w:r>
+              <w:t>effect)</w:t>
+            </w:r>
           </w:p>
         </w:tc>
         <w:tc>
@@ -17872,11 +17679,9 @@
             <w:pPr>
               <w:cnfStyle w:val="000000000000" w:firstRow="0" w:lastRow="0" w:firstColumn="0" w:lastColumn="0" w:oddVBand="0" w:evenVBand="0" w:oddHBand="0" w:evenHBand="0" w:firstRowFirstColumn="0" w:firstRowLastColumn="0" w:lastRowFirstColumn="0" w:lastRowLastColumn="0"/>
             </w:pPr>
-            <w:proofErr w:type="spellStart"/>
             <w:r>
               <w:t>sample_soundGrown</w:t>
             </w:r>
-            <w:proofErr w:type="spellEnd"/>
           </w:p>
         </w:tc>
       </w:tr>
@@ -17890,14 +17695,9 @@
             <w:tcW w:w="3116" w:type="dxa"/>
           </w:tcPr>
           <w:p>
-            <w:proofErr w:type="spellStart"/>
             <w:r>
-              <w:t>soundVector_</w:t>
+              <w:t>soundVector_weaponFired</w:t>
             </w:r>
-            <w:r>
-              <w:t>weaponFired</w:t>
-            </w:r>
-            <w:proofErr w:type="spellEnd"/>
           </w:p>
         </w:tc>
         <w:tc>
@@ -17908,11 +17708,9 @@
             <w:pPr>
               <w:cnfStyle w:val="000000100000" w:firstRow="0" w:lastRow="0" w:firstColumn="0" w:lastColumn="0" w:oddVBand="0" w:evenVBand="0" w:oddHBand="1" w:evenHBand="0" w:firstRowFirstColumn="0" w:firstRowLastColumn="0" w:lastRowFirstColumn="0" w:lastRowLastColumn="0"/>
             </w:pPr>
-            <w:proofErr w:type="spellStart"/>
             <w:r>
               <w:t>soundEffect_pain</w:t>
             </w:r>
-            <w:proofErr w:type="spellEnd"/>
           </w:p>
         </w:tc>
         <w:tc>
@@ -17923,11 +17721,9 @@
             <w:pPr>
               <w:cnfStyle w:val="000000100000" w:firstRow="0" w:lastRow="0" w:firstColumn="0" w:lastColumn="0" w:oddVBand="0" w:evenVBand="0" w:oddHBand="1" w:evenHBand="0" w:firstRowFirstColumn="0" w:firstRowLastColumn="0" w:lastRowFirstColumn="0" w:lastRowLastColumn="0"/>
             </w:pPr>
-            <w:proofErr w:type="spellStart"/>
             <w:r>
               <w:t>sample_soundWeapon</w:t>
             </w:r>
-            <w:proofErr w:type="spellEnd"/>
           </w:p>
         </w:tc>
       </w:tr>
@@ -17961,11 +17757,11 @@
         <w:t>.</w:t>
       </w:r>
       <w:r>
-        <w:t xml:space="preserve">  This includes an alternative in-game interrupt routine which contains the sampling functionality. The routine jumps into the regular in-game interrupt routine to process other </w:t>
+        <w:t xml:space="preserve">  This includes an alternative in-game interrupt routine which contains the sampling </w:t>
       </w:r>
       <w:r>
         <w:lastRenderedPageBreak/>
-        <w:t>interrupts.  The routine is installed in place of the regular in-game routine when sideways RAM is detected.</w:t>
+        <w:t>functionality. The routine jumps into the regular in-game interrupt routine to process other interrupts.  The routine is installed in place of the regular in-game routine when sideways RAM is detected.</w:t>
       </w:r>
     </w:p>
     <w:p>
@@ -18014,22 +17810,19 @@
         <w:t xml:space="preserve">  A better option </w:t>
       </w:r>
       <w:r>
-        <w:t>would be</w:t>
-      </w:r>
-      <w:r>
-        <w:t xml:space="preserve"> to move a game </w:t>
+        <w:t>was</w:t>
+      </w:r>
+      <w:r>
+        <w:t xml:space="preserve"> </w:t>
+      </w:r>
+      <w:r>
+        <w:t xml:space="preserve">to move a game </w:t>
       </w:r>
       <w:r>
         <w:t xml:space="preserve">sprite </w:t>
       </w:r>
       <w:r>
-        <w:t xml:space="preserve">atlas to sideways RAM and load </w:t>
-      </w:r>
-      <w:r>
-        <w:t>sample.6502</w:t>
-      </w:r>
-      <w:r>
-        <w:t xml:space="preserve"> where the asset </w:t>
+        <w:t xml:space="preserve">atlas to sideways RAM and load sample.6502 where the asset </w:t>
       </w:r>
       <w:r>
         <w:t>previously</w:t>
@@ -18049,7 +17842,13 @@
     </w:p>
     <w:p>
       <w:r>
-        <w:t>The changes to affect this change were straightforward, though I did need to reduce the size of the pcm.dat file by 224 bytes.</w:t>
+        <w:t xml:space="preserve">The changes to affect this change were straightforward, though I did need to reduce the size of the pcm.dat file by </w:t>
+      </w:r>
+      <w:r>
+        <w:t xml:space="preserve">256 </w:t>
+      </w:r>
+      <w:r>
+        <w:t>bytes.</w:t>
       </w:r>
     </w:p>
     <w:p>
@@ -18057,6 +17856,527 @@
         <w:t>I also updated the level editor adding a setting which specifies whether sample sounds should be played or not.  One can imagine a level which does not contain Daleks.</w:t>
       </w:r>
     </w:p>
+    <w:p>
+      <w:pPr>
+        <w:pStyle w:val="Heading3"/>
+      </w:pPr>
+      <w:r>
+        <w:t xml:space="preserve">Adding </w:t>
+      </w:r>
+      <w:r>
+        <w:t xml:space="preserve">yet </w:t>
+      </w:r>
+      <w:r>
+        <w:t>more samples</w:t>
+      </w:r>
+    </w:p>
+    <w:p>
+      <w:r>
+        <w:t>After getting positive feedback on the sample sounds, I wanted to add more sound effects. I could leverage a second 16K of sideways RAM if available.</w:t>
+      </w:r>
+    </w:p>
+    <w:p>
+      <w:r>
+        <w:t xml:space="preserve">I </w:t>
+      </w:r>
+      <w:r>
+        <w:t xml:space="preserve">initially </w:t>
+      </w:r>
+      <w:r>
+        <w:t xml:space="preserve">tried to implement a TARDIS sound effect for entering and leaving levels by looping a sample and fading it out </w:t>
+      </w:r>
+      <w:r>
+        <w:t xml:space="preserve">using </w:t>
+      </w:r>
+      <w:r>
+        <w:t xml:space="preserve">an attenuation table. </w:t>
+      </w:r>
+      <w:r>
+        <w:t xml:space="preserve"> This </w:t>
+      </w:r>
+      <w:r>
+        <w:t xml:space="preserve">worked </w:t>
+      </w:r>
+      <w:r>
+        <w:t xml:space="preserve">reasonably well </w:t>
+      </w:r>
+      <w:r>
+        <w:t>in BeebEm</w:t>
+      </w:r>
+      <w:r>
+        <w:t xml:space="preserve">, though there was a </w:t>
+      </w:r>
+      <w:r>
+        <w:t>noticeabl</w:t>
+      </w:r>
+      <w:r>
+        <w:t xml:space="preserve">e </w:t>
+      </w:r>
+      <w:r>
+        <w:t>performance</w:t>
+      </w:r>
+      <w:r>
+        <w:t xml:space="preserve"> </w:t>
+      </w:r>
+      <w:r>
+        <w:t>hit.  Unfortunately, o</w:t>
+      </w:r>
+      <w:r>
+        <w:t xml:space="preserve">n the BBC Micro </w:t>
+      </w:r>
+      <w:r>
+        <w:t xml:space="preserve">an </w:t>
+      </w:r>
+      <w:r>
+        <w:t>audible hiss</w:t>
+      </w:r>
+      <w:r>
+        <w:t xml:space="preserve"> was present.</w:t>
+      </w:r>
+    </w:p>
+    <w:p>
+      <w:r>
+        <w:t>I tried several things to reduce the hiss, and had some success, but was not able to reduce</w:t>
+      </w:r>
+      <w:r>
+        <w:t xml:space="preserve"> it to an acceptable level.  I concluded it would be better to play different samples instead.</w:t>
+      </w:r>
+    </w:p>
+    <w:p>
+      <w:r>
+        <w:t xml:space="preserve">I found three good </w:t>
+      </w:r>
+      <w:r>
+        <w:t xml:space="preserve">MP3 </w:t>
+      </w:r>
+      <w:r>
+        <w:t>samples</w:t>
+      </w:r>
+      <w:r>
+        <w:t xml:space="preserve"> on the internet… </w:t>
+      </w:r>
+      <w:r>
+        <w:t xml:space="preserve"> </w:t>
+      </w:r>
+      <w:r>
+        <w:t xml:space="preserve">two of K9 saying </w:t>
+      </w:r>
+      <w:r>
+        <w:t>“</w:t>
+      </w:r>
+      <w:r>
+        <w:rPr>
+          <w:i/>
+          <w:iCs/>
+        </w:rPr>
+        <w:t>a</w:t>
+      </w:r>
+      <w:r>
+        <w:rPr>
+          <w:i/>
+          <w:iCs/>
+        </w:rPr>
+        <w:t>ffirmative</w:t>
+      </w:r>
+      <w:r>
+        <w:t xml:space="preserve">” </w:t>
+      </w:r>
+      <w:r>
+        <w:t>and “</w:t>
+      </w:r>
+      <w:r>
+        <w:rPr>
+          <w:i/>
+          <w:iCs/>
+        </w:rPr>
+        <w:t>insufficient data</w:t>
+      </w:r>
+      <w:r>
+        <w:t xml:space="preserve">”, and one of the TARDIS doors being opened.  The latter could be played when a level is completed.  </w:t>
+      </w:r>
+      <w:r>
+        <w:t xml:space="preserve">And </w:t>
+      </w:r>
+      <w:r>
+        <w:t xml:space="preserve">K9 could say </w:t>
+      </w:r>
+      <w:r>
+        <w:t>“</w:t>
+      </w:r>
+      <w:r>
+        <w:rPr>
+          <w:i/>
+          <w:iCs/>
+        </w:rPr>
+        <w:t>insufficient data</w:t>
+      </w:r>
+      <w:r>
+        <w:t>”</w:t>
+      </w:r>
+      <w:r>
+        <w:t xml:space="preserve"> at the start of a level and </w:t>
+      </w:r>
+      <w:r>
+        <w:t>“</w:t>
+      </w:r>
+      <w:r>
+        <w:rPr>
+          <w:i/>
+          <w:iCs/>
+        </w:rPr>
+        <w:t>affirmative</w:t>
+      </w:r>
+      <w:r>
+        <w:t>”</w:t>
+      </w:r>
+      <w:r>
+        <w:t xml:space="preserve"> after destroying a Dalek.</w:t>
+      </w:r>
+    </w:p>
+    <w:p>
+      <w:r>
+        <w:t xml:space="preserve">Audacity was used to convert the three MP3 files to 8/8k WAV files, and the WAV converter console app was </w:t>
+      </w:r>
+      <w:r>
+        <w:t>updated</w:t>
+      </w:r>
+      <w:r>
+        <w:t xml:space="preserve"> to convert and encode these</w:t>
+      </w:r>
+      <w:r>
+        <w:t xml:space="preserve"> files</w:t>
+      </w:r>
+      <w:r>
+        <w:t xml:space="preserve"> into a second </w:t>
+      </w:r>
+      <w:r>
+        <w:t>PCM</w:t>
+      </w:r>
+      <w:r>
+        <w:t xml:space="preserve"> </w:t>
+      </w:r>
+      <w:r>
+        <w:t xml:space="preserve">data </w:t>
+      </w:r>
+      <w:r>
+        <w:t>file</w:t>
+      </w:r>
+      <w:r>
+        <w:t xml:space="preserve"> which </w:t>
+      </w:r>
+      <w:r>
+        <w:t xml:space="preserve">was then </w:t>
+      </w:r>
+      <w:r>
+        <w:t xml:space="preserve">packaged in the </w:t>
+      </w:r>
+      <w:r>
+        <w:t xml:space="preserve">game </w:t>
+      </w:r>
+      <w:r>
+        <w:t xml:space="preserve">image </w:t>
+      </w:r>
+      <w:r>
+        <w:t>as five additional files.</w:t>
+      </w:r>
+    </w:p>
+    <w:p>
+      <w:r>
+        <w:t xml:space="preserve">The </w:t>
+      </w:r>
+      <w:r>
+        <w:t xml:space="preserve">game </w:t>
+      </w:r>
+      <w:r>
+        <w:t>startup code was then updated to load the second set of PCM data files</w:t>
+      </w:r>
+      <w:r>
+        <w:t xml:space="preserve"> into a</w:t>
+      </w:r>
+      <w:r>
+        <w:t xml:space="preserve"> second 16K of sideways RAM, if present.  A </w:t>
+      </w:r>
+      <w:r>
+        <w:t xml:space="preserve">secondary </w:t>
+      </w:r>
+      <w:r>
+        <w:t xml:space="preserve">set of </w:t>
+      </w:r>
+      <w:r>
+        <w:t>sound vectors</w:t>
+      </w:r>
+      <w:r>
+        <w:t xml:space="preserve"> were also </w:t>
+      </w:r>
+      <w:r>
+        <w:lastRenderedPageBreak/>
+        <w:t>introduced</w:t>
+      </w:r>
+      <w:r>
+        <w:t xml:space="preserve">, </w:t>
+      </w:r>
+      <w:r>
+        <w:t>as shown below</w:t>
+      </w:r>
+      <w:r>
+        <w:t>.</w:t>
+      </w:r>
+      <w:r>
+        <w:t xml:space="preserve">  The game code was updated to </w:t>
+      </w:r>
+      <w:r>
+        <w:t>use these new vectors</w:t>
+      </w:r>
+      <w:r>
+        <w:t>.</w:t>
+      </w:r>
+      <w:r>
+        <w:t xml:space="preserve"> </w:t>
+      </w:r>
+      <w:r>
+        <w:t>The sample code was also updated to play the new sounds</w:t>
+      </w:r>
+      <w:r>
+        <w:t>.</w:t>
+      </w:r>
+    </w:p>
+    <w:tbl>
+      <w:tblPr>
+        <w:tblStyle w:val="ListTable3-Accent1"/>
+        <w:tblW w:w="0" w:type="auto"/>
+        <w:tblLook w:val="04A0" w:firstRow="1" w:lastRow="0" w:firstColumn="1" w:lastColumn="0" w:noHBand="0" w:noVBand="1"/>
+      </w:tblPr>
+      <w:tblGrid>
+        <w:gridCol w:w="2586"/>
+        <w:gridCol w:w="3096"/>
+        <w:gridCol w:w="3668"/>
+      </w:tblGrid>
+      <w:tr>
+        <w:trPr>
+          <w:cnfStyle w:val="100000000000" w:firstRow="1" w:lastRow="0" w:firstColumn="0" w:lastColumn="0" w:oddVBand="0" w:evenVBand="0" w:oddHBand="0" w:evenHBand="0" w:firstRowFirstColumn="0" w:firstRowLastColumn="0" w:lastRowFirstColumn="0" w:lastRowLastColumn="0"/>
+        </w:trPr>
+        <w:tc>
+          <w:tcPr>
+            <w:cnfStyle w:val="001000000100" w:firstRow="0" w:lastRow="0" w:firstColumn="1" w:lastColumn="0" w:oddVBand="0" w:evenVBand="0" w:oddHBand="0" w:evenHBand="0" w:firstRowFirstColumn="1" w:firstRowLastColumn="0" w:lastRowFirstColumn="0" w:lastRowLastColumn="0"/>
+            <w:tcW w:w="2586" w:type="dxa"/>
+          </w:tcPr>
+          <w:p>
+            <w:pPr>
+              <w:rPr>
+                <w:b w:val="0"/>
+                <w:bCs w:val="0"/>
+              </w:rPr>
+            </w:pPr>
+            <w:r>
+              <w:rPr>
+                <w:b w:val="0"/>
+                <w:bCs w:val="0"/>
+              </w:rPr>
+              <w:t xml:space="preserve">Secondary </w:t>
+            </w:r>
+            <w:r>
+              <w:rPr>
+                <w:b w:val="0"/>
+                <w:bCs w:val="0"/>
+              </w:rPr>
+              <w:t>Vector</w:t>
+            </w:r>
+          </w:p>
+        </w:tc>
+        <w:tc>
+          <w:tcPr>
+            <w:tcW w:w="3096" w:type="dxa"/>
+          </w:tcPr>
+          <w:p>
+            <w:pPr>
+              <w:cnfStyle w:val="100000000000" w:firstRow="1" w:lastRow="0" w:firstColumn="0" w:lastColumn="0" w:oddVBand="0" w:evenVBand="0" w:oddHBand="0" w:evenHBand="0" w:firstRowFirstColumn="0" w:firstRowLastColumn="0" w:lastRowFirstColumn="0" w:lastRowLastColumn="0"/>
+              <w:rPr>
+                <w:b w:val="0"/>
+                <w:bCs w:val="0"/>
+              </w:rPr>
+            </w:pPr>
+            <w:r>
+              <w:rPr>
+                <w:b w:val="0"/>
+                <w:bCs w:val="0"/>
+              </w:rPr>
+              <w:t>Normal implementation</w:t>
+            </w:r>
+          </w:p>
+        </w:tc>
+        <w:tc>
+          <w:tcPr>
+            <w:tcW w:w="3668" w:type="dxa"/>
+          </w:tcPr>
+          <w:p>
+            <w:pPr>
+              <w:cnfStyle w:val="100000000000" w:firstRow="1" w:lastRow="0" w:firstColumn="0" w:lastColumn="0" w:oddVBand="0" w:evenVBand="0" w:oddHBand="0" w:evenHBand="0" w:firstRowFirstColumn="0" w:firstRowLastColumn="0" w:lastRowFirstColumn="0" w:lastRowLastColumn="0"/>
+              <w:rPr>
+                <w:b w:val="0"/>
+                <w:bCs w:val="0"/>
+              </w:rPr>
+            </w:pPr>
+            <w:r>
+              <w:rPr>
+                <w:b w:val="0"/>
+                <w:bCs w:val="0"/>
+              </w:rPr>
+              <w:t>Sample implementation</w:t>
+            </w:r>
+          </w:p>
+        </w:tc>
+      </w:tr>
+      <w:tr>
+        <w:trPr>
+          <w:cnfStyle w:val="000000100000" w:firstRow="0" w:lastRow="0" w:firstColumn="0" w:lastColumn="0" w:oddVBand="0" w:evenVBand="0" w:oddHBand="1" w:evenHBand="0" w:firstRowFirstColumn="0" w:firstRowLastColumn="0" w:lastRowFirstColumn="0" w:lastRowLastColumn="0"/>
+        </w:trPr>
+        <w:tc>
+          <w:tcPr>
+            <w:cnfStyle w:val="001000000000" w:firstRow="0" w:lastRow="0" w:firstColumn="1" w:lastColumn="0" w:oddVBand="0" w:evenVBand="0" w:oddHBand="0" w:evenHBand="0" w:firstRowFirstColumn="0" w:firstRowLastColumn="0" w:lastRowFirstColumn="0" w:lastRowLastColumn="0"/>
+            <w:tcW w:w="2586" w:type="dxa"/>
+          </w:tcPr>
+          <w:p>
+            <w:r>
+              <w:t>enemyDestroyed</w:t>
+            </w:r>
+          </w:p>
+        </w:tc>
+        <w:tc>
+          <w:tcPr>
+            <w:tcW w:w="3096" w:type="dxa"/>
+          </w:tcPr>
+          <w:p>
+            <w:pPr>
+              <w:cnfStyle w:val="000000100000" w:firstRow="0" w:lastRow="0" w:firstColumn="0" w:lastColumn="0" w:oddVBand="0" w:evenVBand="0" w:oddHBand="1" w:evenHBand="0" w:firstRowFirstColumn="0" w:firstRowLastColumn="0" w:lastRowFirstColumn="0" w:lastRowLastColumn="0"/>
+            </w:pPr>
+            <w:r>
+              <w:t>RTS</w:t>
+            </w:r>
+            <w:r>
+              <w:t xml:space="preserve"> </w:t>
+            </w:r>
+            <w:r>
+              <w:t>(no sound effect)</w:t>
+            </w:r>
+          </w:p>
+        </w:tc>
+        <w:tc>
+          <w:tcPr>
+            <w:tcW w:w="3668" w:type="dxa"/>
+          </w:tcPr>
+          <w:p>
+            <w:pPr>
+              <w:cnfStyle w:val="000000100000" w:firstRow="0" w:lastRow="0" w:firstColumn="0" w:lastColumn="0" w:oddVBand="0" w:evenVBand="0" w:oddHBand="1" w:evenHBand="0" w:firstRowFirstColumn="0" w:firstRowLastColumn="0" w:lastRowFirstColumn="0" w:lastRowLastColumn="0"/>
+            </w:pPr>
+            <w:r>
+              <w:t>sample_soundK9</w:t>
+            </w:r>
+            <w:r>
+              <w:t>Affirmative</w:t>
+            </w:r>
+          </w:p>
+        </w:tc>
+      </w:tr>
+      <w:tr>
+        <w:tc>
+          <w:tcPr>
+            <w:cnfStyle w:val="001000000000" w:firstRow="0" w:lastRow="0" w:firstColumn="1" w:lastColumn="0" w:oddVBand="0" w:evenVBand="0" w:oddHBand="0" w:evenHBand="0" w:firstRowFirstColumn="0" w:firstRowLastColumn="0" w:lastRowFirstColumn="0" w:lastRowLastColumn="0"/>
+            <w:tcW w:w="2586" w:type="dxa"/>
+          </w:tcPr>
+          <w:p>
+            <w:r>
+              <w:t>startLevel</w:t>
+            </w:r>
+          </w:p>
+        </w:tc>
+        <w:tc>
+          <w:tcPr>
+            <w:tcW w:w="3096" w:type="dxa"/>
+          </w:tcPr>
+          <w:p>
+            <w:pPr>
+              <w:cnfStyle w:val="000000000000" w:firstRow="0" w:lastRow="0" w:firstColumn="0" w:lastColumn="0" w:oddVBand="0" w:evenVBand="0" w:oddHBand="0" w:evenHBand="0" w:firstRowFirstColumn="0" w:firstRowLastColumn="0" w:lastRowFirstColumn="0" w:lastRowLastColumn="0"/>
+            </w:pPr>
+            <w:r>
+              <w:t>RTS</w:t>
+            </w:r>
+            <w:r>
+              <w:t xml:space="preserve"> </w:t>
+            </w:r>
+            <w:r>
+              <w:t>(no sound effect)</w:t>
+            </w:r>
+          </w:p>
+        </w:tc>
+        <w:tc>
+          <w:tcPr>
+            <w:tcW w:w="3668" w:type="dxa"/>
+          </w:tcPr>
+          <w:p>
+            <w:pPr>
+              <w:cnfStyle w:val="000000000000" w:firstRow="0" w:lastRow="0" w:firstColumn="0" w:lastColumn="0" w:oddVBand="0" w:evenVBand="0" w:oddHBand="0" w:evenHBand="0" w:firstRowFirstColumn="0" w:firstRowLastColumn="0" w:lastRowFirstColumn="0" w:lastRowLastColumn="0"/>
+            </w:pPr>
+            <w:r>
+              <w:t>sample_</w:t>
+            </w:r>
+            <w:r>
+              <w:t>soundK9</w:t>
+            </w:r>
+            <w:r>
+              <w:t>InsufficientData</w:t>
+            </w:r>
+          </w:p>
+        </w:tc>
+      </w:tr>
+      <w:tr>
+        <w:trPr>
+          <w:cnfStyle w:val="000000100000" w:firstRow="0" w:lastRow="0" w:firstColumn="0" w:lastColumn="0" w:oddVBand="0" w:evenVBand="0" w:oddHBand="1" w:evenHBand="0" w:firstRowFirstColumn="0" w:firstRowLastColumn="0" w:lastRowFirstColumn="0" w:lastRowLastColumn="0"/>
+        </w:trPr>
+        <w:tc>
+          <w:tcPr>
+            <w:cnfStyle w:val="001000000000" w:firstRow="0" w:lastRow="0" w:firstColumn="1" w:lastColumn="0" w:oddVBand="0" w:evenVBand="0" w:oddHBand="0" w:evenHBand="0" w:firstRowFirstColumn="0" w:firstRowLastColumn="0" w:lastRowFirstColumn="0" w:lastRowLastColumn="0"/>
+            <w:tcW w:w="2586" w:type="dxa"/>
+          </w:tcPr>
+          <w:p>
+            <w:r>
+              <w:t>completeLevel</w:t>
+            </w:r>
+          </w:p>
+        </w:tc>
+        <w:tc>
+          <w:tcPr>
+            <w:tcW w:w="3096" w:type="dxa"/>
+          </w:tcPr>
+          <w:p>
+            <w:pPr>
+              <w:cnfStyle w:val="000000100000" w:firstRow="0" w:lastRow="0" w:firstColumn="0" w:lastColumn="0" w:oddVBand="0" w:evenVBand="0" w:oddHBand="1" w:evenHBand="0" w:firstRowFirstColumn="0" w:firstRowLastColumn="0" w:lastRowFirstColumn="0" w:lastRowLastColumn="0"/>
+            </w:pPr>
+            <w:r>
+              <w:t>soundEffect_</w:t>
+            </w:r>
+            <w:r>
+              <w:t>levelComplete</w:t>
+            </w:r>
+          </w:p>
+        </w:tc>
+        <w:tc>
+          <w:tcPr>
+            <w:tcW w:w="3668" w:type="dxa"/>
+          </w:tcPr>
+          <w:p>
+            <w:pPr>
+              <w:cnfStyle w:val="000000100000" w:firstRow="0" w:lastRow="0" w:firstColumn="0" w:lastColumn="0" w:oddVBand="0" w:evenVBand="0" w:oddHBand="1" w:evenHBand="0" w:firstRowFirstColumn="0" w:firstRowLastColumn="0" w:lastRowFirstColumn="0" w:lastRowLastColumn="0"/>
+            </w:pPr>
+            <w:r>
+              <w:t>sample_</w:t>
+            </w:r>
+            <w:r>
+              <w:t>soundTardisDoor</w:t>
+            </w:r>
+          </w:p>
+        </w:tc>
+      </w:tr>
+    </w:tbl>
     <w:p>
       <w:pPr>
         <w:pStyle w:val="Heading1"/>
@@ -18308,7 +18628,6 @@
               <w:jc w:val="center"/>
             </w:pPr>
             <w:r>
-              <w:lastRenderedPageBreak/>
               <w:t>00</w:t>
             </w:r>
             <w:r>
@@ -18897,6 +19216,7 @@
               <w:jc w:val="center"/>
             </w:pPr>
             <w:r>
+              <w:lastRenderedPageBreak/>
               <w:t>0</w:t>
             </w:r>
             <w:r>
@@ -19324,6 +19644,9 @@
             <w:r>
               <w:t>Game sprite data</w:t>
             </w:r>
+            <w:r>
+              <w:t>*</w:t>
+            </w:r>
           </w:p>
         </w:tc>
         <w:tc>
@@ -19660,6 +19983,54 @@
       </w:r>
     </w:p>
     <w:p>
+      <w:pPr>
+        <w:pStyle w:val="ListParagraph"/>
+        <w:numPr>
+          <w:ilvl w:val="0"/>
+          <w:numId w:val="4"/>
+        </w:numPr>
+      </w:pPr>
+      <w:r>
+        <w:t>*</w:t>
+      </w:r>
+      <w:r>
+        <w:t xml:space="preserve">On machines with 16K+ of sideways RAM, sampling code (sample.6502) replaces the </w:t>
+      </w:r>
+      <w:r>
+        <w:rPr>
+          <w:b/>
+        </w:rPr>
+        <w:t>game-bar</w:t>
+      </w:r>
+      <w:r>
+        <w:t xml:space="preserve"> sprite atlas at &amp;2F60, </w:t>
+      </w:r>
+      <w:r>
+        <w:t xml:space="preserve">which is </w:t>
+      </w:r>
+      <w:r>
+        <w:t>reloca</w:t>
+      </w:r>
+      <w:r>
+        <w:t>ted to</w:t>
+      </w:r>
+      <w:r>
+        <w:t xml:space="preserve"> </w:t>
+      </w:r>
+      <w:r>
+        <w:t>&amp;BF20</w:t>
+      </w:r>
+      <w:r>
+        <w:t xml:space="preserve"> </w:t>
+      </w:r>
+      <w:r>
+        <w:t xml:space="preserve">in </w:t>
+      </w:r>
+      <w:r>
+        <w:t>sideways RAM.</w:t>
+      </w:r>
+    </w:p>
+    <w:p>
       <w:r>
         <w:t xml:space="preserve">The 16K </w:t>
       </w:r>
@@ -19695,7 +20066,6 @@
               <w:jc w:val="center"/>
             </w:pPr>
             <w:r>
-              <w:lastRenderedPageBreak/>
               <w:t>Address (hex)</w:t>
             </w:r>
           </w:p>
@@ -19987,7 +20357,10 @@
               <w:cnfStyle w:val="000000000000" w:firstRow="0" w:lastRow="0" w:firstColumn="0" w:lastColumn="0" w:oddVBand="0" w:evenVBand="0" w:oddHBand="0" w:evenHBand="0" w:firstRowFirstColumn="0" w:firstRowLastColumn="0" w:lastRowFirstColumn="0" w:lastRowLastColumn="0"/>
             </w:pPr>
             <w:r>
-              <w:t>Level coefficients</w:t>
+              <w:t xml:space="preserve">Level </w:t>
+            </w:r>
+            <w:r>
+              <w:t>settings</w:t>
             </w:r>
           </w:p>
         </w:tc>
@@ -20022,6 +20395,7 @@
               <w:jc w:val="center"/>
             </w:pPr>
             <w:r>
+              <w:lastRenderedPageBreak/>
               <w:t>40</w:t>
             </w:r>
             <w:r>
@@ -20164,7 +20538,7 @@
               <w:t>1</w:t>
             </w:r>
             <w:r>
-              <w:t>329</w:t>
+              <w:t>569</w:t>
             </w:r>
           </w:p>
         </w:tc>
@@ -20174,21 +20548,21 @@
           <w:tcPr>
             <w:cnfStyle w:val="001000000000" w:firstRow="0" w:lastRow="0" w:firstColumn="1" w:lastColumn="0" w:oddVBand="0" w:evenVBand="0" w:oddHBand="0" w:evenHBand="0" w:firstRowFirstColumn="0" w:firstRowLastColumn="0" w:lastRowFirstColumn="0" w:lastRowLastColumn="0"/>
             <w:tcW w:w="1345" w:type="dxa"/>
-            <w:shd w:val="clear" w:color="auto" w:fill="CAEDFB" w:themeFill="accent4" w:themeFillTint="33"/>
+            <w:shd w:val="clear" w:color="auto" w:fill="DAE9F7" w:themeFill="text2" w:themeFillTint="1A"/>
           </w:tcPr>
           <w:p>
             <w:pPr>
               <w:jc w:val="center"/>
             </w:pPr>
             <w:r>
-              <w:t>5418</w:t>
+              <w:t>5508</w:t>
             </w:r>
           </w:p>
         </w:tc>
         <w:tc>
           <w:tcPr>
             <w:tcW w:w="6570" w:type="dxa"/>
-            <w:shd w:val="clear" w:color="auto" w:fill="CAEDFB" w:themeFill="accent4" w:themeFillTint="33"/>
+            <w:shd w:val="clear" w:color="auto" w:fill="DAE9F7" w:themeFill="text2" w:themeFillTint="1A"/>
           </w:tcPr>
           <w:p>
             <w:pPr>
@@ -20202,7 +20576,7 @@
         <w:tc>
           <w:tcPr>
             <w:tcW w:w="1260" w:type="dxa"/>
-            <w:shd w:val="clear" w:color="auto" w:fill="CAEDFB" w:themeFill="accent4" w:themeFillTint="33"/>
+            <w:shd w:val="clear" w:color="auto" w:fill="DAE9F7" w:themeFill="text2" w:themeFillTint="1A"/>
           </w:tcPr>
           <w:p>
             <w:pPr>
@@ -20210,10 +20584,10 @@
               <w:cnfStyle w:val="000000000000" w:firstRow="0" w:lastRow="0" w:firstColumn="0" w:lastColumn="0" w:oddVBand="0" w:evenVBand="0" w:oddHBand="0" w:evenHBand="0" w:firstRowFirstColumn="0" w:firstRowLastColumn="0" w:lastRowFirstColumn="0" w:lastRowLastColumn="0"/>
             </w:pPr>
             <w:r>
-              <w:t>23</w:t>
+              <w:t>2</w:t>
             </w:r>
             <w:r>
-              <w:t>48</w:t>
+              <w:t>712</w:t>
             </w:r>
           </w:p>
         </w:tc>
@@ -20226,21 +20600,21 @@
           <w:tcPr>
             <w:cnfStyle w:val="001000000000" w:firstRow="0" w:lastRow="0" w:firstColumn="1" w:lastColumn="0" w:oddVBand="0" w:evenVBand="0" w:oddHBand="0" w:evenHBand="0" w:firstRowFirstColumn="0" w:firstRowLastColumn="0" w:lastRowFirstColumn="0" w:lastRowLastColumn="0"/>
             <w:tcW w:w="1345" w:type="dxa"/>
-            <w:shd w:val="clear" w:color="auto" w:fill="CAEDFB" w:themeFill="accent4" w:themeFillTint="33"/>
+            <w:shd w:val="clear" w:color="auto" w:fill="DAE9F7" w:themeFill="text2" w:themeFillTint="1A"/>
           </w:tcPr>
           <w:p>
             <w:pPr>
               <w:jc w:val="center"/>
             </w:pPr>
             <w:r>
-              <w:t>5D44</w:t>
+              <w:t>5FA0</w:t>
             </w:r>
           </w:p>
         </w:tc>
         <w:tc>
           <w:tcPr>
             <w:tcW w:w="6570" w:type="dxa"/>
-            <w:shd w:val="clear" w:color="auto" w:fill="CAEDFB" w:themeFill="accent4" w:themeFillTint="33"/>
+            <w:shd w:val="clear" w:color="auto" w:fill="DAE9F7" w:themeFill="text2" w:themeFillTint="1A"/>
           </w:tcPr>
           <w:p>
             <w:pPr>
@@ -20254,7 +20628,7 @@
         <w:tc>
           <w:tcPr>
             <w:tcW w:w="1260" w:type="dxa"/>
-            <w:shd w:val="clear" w:color="auto" w:fill="CAEDFB" w:themeFill="accent4" w:themeFillTint="33"/>
+            <w:shd w:val="clear" w:color="auto" w:fill="DAE9F7" w:themeFill="text2" w:themeFillTint="1A"/>
           </w:tcPr>
           <w:p>
             <w:pPr>
@@ -20268,7 +20642,7 @@
               <w:t>1</w:t>
             </w:r>
             <w:r>
-              <w:t>4</w:t>
+              <w:t>3</w:t>
             </w:r>
           </w:p>
         </w:tc>
@@ -20278,27 +20652,38 @@
           <w:tcPr>
             <w:cnfStyle w:val="001000000000" w:firstRow="0" w:lastRow="0" w:firstColumn="1" w:lastColumn="0" w:oddVBand="0" w:evenVBand="0" w:oddHBand="0" w:evenHBand="0" w:firstRowFirstColumn="0" w:firstRowLastColumn="0" w:lastRowFirstColumn="0" w:lastRowLastColumn="0"/>
             <w:tcW w:w="1345" w:type="dxa"/>
-            <w:shd w:val="clear" w:color="auto" w:fill="C1F0C7" w:themeFill="accent3" w:themeFillTint="33"/>
+            <w:shd w:val="clear" w:color="auto" w:fill="auto"/>
           </w:tcPr>
           <w:p>
             <w:pPr>
               <w:jc w:val="center"/>
             </w:pPr>
             <w:r>
-              <w:t>69D2</w:t>
+              <w:t>6C2</w:t>
+            </w:r>
+            <w:r>
+              <w:t>D</w:t>
             </w:r>
           </w:p>
         </w:tc>
         <w:tc>
           <w:tcPr>
             <w:tcW w:w="6570" w:type="dxa"/>
-            <w:shd w:val="clear" w:color="auto" w:fill="C1F0C7" w:themeFill="accent3" w:themeFillTint="33"/>
+            <w:shd w:val="clear" w:color="auto" w:fill="auto"/>
           </w:tcPr>
           <w:p>
             <w:pPr>
               <w:cnfStyle w:val="000000000000" w:firstRow="0" w:lastRow="0" w:firstColumn="0" w:lastColumn="0" w:oddVBand="0" w:evenVBand="0" w:oddHBand="0" w:evenHBand="0" w:firstRowFirstColumn="0" w:firstRowLastColumn="0" w:lastRowFirstColumn="0" w:lastRowLastColumn="0"/>
+              <w:rPr>
+                <w:i/>
+                <w:iCs/>
+              </w:rPr>
             </w:pPr>
             <w:r>
+              <w:rPr>
+                <w:i/>
+                <w:iCs/>
+              </w:rPr>
               <w:t>Unused memory</w:t>
             </w:r>
           </w:p>
@@ -20306,7 +20691,117 @@
         <w:tc>
           <w:tcPr>
             <w:tcW w:w="1260" w:type="dxa"/>
-            <w:shd w:val="clear" w:color="auto" w:fill="C1F0C7" w:themeFill="accent3" w:themeFillTint="33"/>
+            <w:shd w:val="clear" w:color="auto" w:fill="auto"/>
+          </w:tcPr>
+          <w:p>
+            <w:pPr>
+              <w:jc w:val="center"/>
+              <w:cnfStyle w:val="000000000000" w:firstRow="0" w:lastRow="0" w:firstColumn="0" w:lastColumn="0" w:oddVBand="0" w:evenVBand="0" w:oddHBand="0" w:evenHBand="0" w:firstRowFirstColumn="0" w:firstRowLastColumn="0" w:lastRowFirstColumn="0" w:lastRowLastColumn="0"/>
+              <w:rPr>
+                <w:color w:val="FFFFFF" w:themeColor="background1"/>
+              </w:rPr>
+            </w:pPr>
+            <w:r>
+              <w:t>313</w:t>
+            </w:r>
+          </w:p>
+        </w:tc>
+      </w:tr>
+      <w:tr>
+        <w:trPr>
+          <w:cnfStyle w:val="000000100000" w:firstRow="0" w:lastRow="0" w:firstColumn="0" w:lastColumn="0" w:oddVBand="0" w:evenVBand="0" w:oddHBand="1" w:evenHBand="0" w:firstRowFirstColumn="0" w:firstRowLastColumn="0" w:lastRowFirstColumn="0" w:lastRowLastColumn="0"/>
+        </w:trPr>
+        <w:tc>
+          <w:tcPr>
+            <w:cnfStyle w:val="001000000000" w:firstRow="0" w:lastRow="0" w:firstColumn="1" w:lastColumn="0" w:oddVBand="0" w:evenVBand="0" w:oddHBand="0" w:evenHBand="0" w:firstRowFirstColumn="0" w:firstRowLastColumn="0" w:lastRowFirstColumn="0" w:lastRowLastColumn="0"/>
+            <w:tcW w:w="1345" w:type="dxa"/>
+            <w:shd w:val="clear" w:color="auto" w:fill="DAE9F7" w:themeFill="text2" w:themeFillTint="1A"/>
+          </w:tcPr>
+          <w:p>
+            <w:pPr>
+              <w:jc w:val="center"/>
+            </w:pPr>
+            <w:r>
+              <w:t>6</w:t>
+            </w:r>
+            <w:r>
+              <w:t>D</w:t>
+            </w:r>
+            <w:r>
+              <w:t>66</w:t>
+            </w:r>
+          </w:p>
+        </w:tc>
+        <w:tc>
+          <w:tcPr>
+            <w:tcW w:w="6570" w:type="dxa"/>
+            <w:shd w:val="clear" w:color="auto" w:fill="DAE9F7" w:themeFill="text2" w:themeFillTint="1A"/>
+          </w:tcPr>
+          <w:p>
+            <w:pPr>
+              <w:cnfStyle w:val="000000100000" w:firstRow="0" w:lastRow="0" w:firstColumn="0" w:lastColumn="0" w:oddVBand="0" w:evenVBand="0" w:oddHBand="1" w:evenHBand="0" w:firstRowFirstColumn="0" w:firstRowLastColumn="0" w:lastRowFirstColumn="0" w:lastRowLastColumn="0"/>
+            </w:pPr>
+            <w:r>
+              <w:t>PCM load buffer (used to load PCM data to sideways RAM)</w:t>
+            </w:r>
+          </w:p>
+        </w:tc>
+        <w:tc>
+          <w:tcPr>
+            <w:tcW w:w="1260" w:type="dxa"/>
+            <w:shd w:val="clear" w:color="auto" w:fill="DAE9F7" w:themeFill="text2" w:themeFillTint="1A"/>
+          </w:tcPr>
+          <w:p>
+            <w:pPr>
+              <w:jc w:val="center"/>
+              <w:cnfStyle w:val="000000100000" w:firstRow="0" w:lastRow="0" w:firstColumn="0" w:lastColumn="0" w:oddVBand="0" w:evenVBand="0" w:oddHBand="1" w:evenHBand="0" w:firstRowFirstColumn="0" w:firstRowLastColumn="0" w:lastRowFirstColumn="0" w:lastRowLastColumn="0"/>
+            </w:pPr>
+            <w:r>
+              <w:t>3226</w:t>
+            </w:r>
+          </w:p>
+        </w:tc>
+      </w:tr>
+      <w:tr>
+        <w:tc>
+          <w:tcPr>
+            <w:cnfStyle w:val="001000000000" w:firstRow="0" w:lastRow="0" w:firstColumn="1" w:lastColumn="0" w:oddVBand="0" w:evenVBand="0" w:oddHBand="0" w:evenHBand="0" w:firstRowFirstColumn="0" w:firstRowLastColumn="0" w:lastRowFirstColumn="0" w:lastRowLastColumn="0"/>
+            <w:tcW w:w="1345" w:type="dxa"/>
+            <w:shd w:val="clear" w:color="auto" w:fill="F2CEED" w:themeFill="accent5" w:themeFillTint="33"/>
+          </w:tcPr>
+          <w:p>
+            <w:pPr>
+              <w:jc w:val="center"/>
+            </w:pPr>
+            <w:r>
+              <w:t>7A00</w:t>
+            </w:r>
+          </w:p>
+        </w:tc>
+        <w:tc>
+          <w:tcPr>
+            <w:tcW w:w="6570" w:type="dxa"/>
+            <w:shd w:val="clear" w:color="auto" w:fill="F2CEED" w:themeFill="accent5" w:themeFillTint="33"/>
+          </w:tcPr>
+          <w:p>
+            <w:pPr>
+              <w:cnfStyle w:val="000000000000" w:firstRow="0" w:lastRow="0" w:firstColumn="0" w:lastColumn="0" w:oddVBand="0" w:evenVBand="0" w:oddHBand="0" w:evenHBand="0" w:firstRowFirstColumn="0" w:firstRowLastColumn="0" w:lastRowFirstColumn="0" w:lastRowLastColumn="0"/>
+            </w:pPr>
+            <w:r>
+              <w:t>P</w:t>
+            </w:r>
+            <w:r>
+              <w:t>age backups</w:t>
+            </w:r>
+            <w:r>
+              <w:t xml:space="preserve"> (used during loading)</w:t>
+            </w:r>
+          </w:p>
+        </w:tc>
+        <w:tc>
+          <w:tcPr>
+            <w:tcW w:w="1260" w:type="dxa"/>
+            <w:shd w:val="clear" w:color="auto" w:fill="F2CEED" w:themeFill="accent5" w:themeFillTint="33"/>
           </w:tcPr>
           <w:p>
             <w:pPr>
@@ -20314,10 +20809,7 @@
               <w:cnfStyle w:val="000000000000" w:firstRow="0" w:lastRow="0" w:firstColumn="0" w:lastColumn="0" w:oddVBand="0" w:evenVBand="0" w:oddHBand="0" w:evenHBand="0" w:firstRowFirstColumn="0" w:firstRowLastColumn="0" w:lastRowFirstColumn="0" w:lastRowLastColumn="0"/>
             </w:pPr>
             <w:r>
-              <w:t>46</w:t>
-            </w:r>
-            <w:r>
-              <w:t>54</w:t>
+              <w:t>512</w:t>
             </w:r>
           </w:p>
         </w:tc>
@@ -20383,6 +20875,15 @@
       <w:r>
         <w:t>locations and populates the game object data structures from the metadata and object descriptors.</w:t>
       </w:r>
+      <w:r>
+        <w:t xml:space="preserve">  On machines with 16K+ of sideways RAM, the code also copies the 224-byte gamebar asset to </w:t>
+      </w:r>
+      <w:r>
+        <w:t>&amp;BF20</w:t>
+      </w:r>
+      <w:r>
+        <w:t>.</w:t>
+      </w:r>
     </w:p>
     <w:p>
       <w:r>
@@ -20433,6 +20934,44 @@
       <w:r>
         <w:t xml:space="preserve"> theme music.</w:t>
       </w:r>
+      <w:r>
+        <w:t xml:space="preserve"> </w:t>
+      </w:r>
+    </w:p>
+    <w:p>
+      <w:r>
+        <w:t xml:space="preserve">The light purple row shows where pages &amp;17 and &amp;18 are </w:t>
+      </w:r>
+      <w:r>
+        <w:t xml:space="preserve">backed up </w:t>
+      </w:r>
+      <w:r>
+        <w:t xml:space="preserve">to while </w:t>
+      </w:r>
+      <w:r>
+        <w:t>level</w:t>
+      </w:r>
+      <w:r>
+        <w:t>s</w:t>
+      </w:r>
+      <w:r>
+        <w:t xml:space="preserve"> and sample</w:t>
+      </w:r>
+      <w:r>
+        <w:t>s</w:t>
+      </w:r>
+      <w:r>
+        <w:t xml:space="preserve"> </w:t>
+      </w:r>
+      <w:r>
+        <w:t xml:space="preserve">are </w:t>
+      </w:r>
+      <w:r>
+        <w:t>load</w:t>
+      </w:r>
+      <w:r>
+        <w:t>ed.</w:t>
+      </w:r>
     </w:p>
     <w:p>
       <w:r>
@@ -20460,13 +20999,22 @@
         <w:t xml:space="preserve"> </w:t>
       </w:r>
       <w:r>
-        <w:t xml:space="preserve">7, so the data/code above &amp;4000 is not visible.  </w:t>
+        <w:t xml:space="preserve">7, so the data/code </w:t>
+      </w:r>
+      <w:r>
+        <w:t xml:space="preserve">below &amp;7C00 </w:t>
+      </w:r>
+      <w:r>
+        <w:t xml:space="preserve">is not visible.  </w:t>
       </w:r>
       <w:r>
         <w:t>D</w:t>
       </w:r>
       <w:r>
-        <w:t>uring level loading, the palette colors are set to black.</w:t>
+        <w:t>uring level loading, the palette colors are set to black</w:t>
+      </w:r>
+      <w:r>
+        <w:t xml:space="preserve"> to achieve the same result.</w:t>
       </w:r>
     </w:p>
     <w:p>
@@ -20619,7 +21167,6 @@
         </w:numPr>
       </w:pPr>
       <w:r>
-        <w:lastRenderedPageBreak/>
         <w:t xml:space="preserve">The use of an object </w:t>
       </w:r>
       <w:r>
@@ -20648,6 +21195,7 @@
         </w:numPr>
       </w:pPr>
       <w:r>
+        <w:lastRenderedPageBreak/>
         <w:t xml:space="preserve">Broad clipping is performed </w:t>
       </w:r>
       <w:r>
@@ -20946,7 +21494,6 @@
       <w:r>
         <w:t xml:space="preserve">Removed </w:t>
       </w:r>
-      <w:proofErr w:type="spellStart"/>
       <w:r>
         <w:rPr>
           <w:i/>
@@ -20954,11 +21501,9 @@
         </w:rPr>
         <w:t>objectWidth</w:t>
       </w:r>
-      <w:proofErr w:type="spellEnd"/>
       <w:r>
         <w:t xml:space="preserve"> &amp; </w:t>
       </w:r>
-      <w:proofErr w:type="spellStart"/>
       <w:r>
         <w:rPr>
           <w:i/>
@@ -20966,7 +21511,6 @@
         </w:rPr>
         <w:t>objectHeight</w:t>
       </w:r>
-      <w:proofErr w:type="spellEnd"/>
       <w:r>
         <w:t xml:space="preserve"> arrays</w:t>
       </w:r>
@@ -20996,7 +21540,6 @@
       <w:r>
         <w:t xml:space="preserve">, </w:t>
       </w:r>
-      <w:proofErr w:type="spellStart"/>
       <w:r>
         <w:rPr>
           <w:i/>
@@ -21004,14 +21547,12 @@
         </w:rPr>
         <w:t>widthMinusOne</w:t>
       </w:r>
-      <w:proofErr w:type="spellEnd"/>
       <w:r>
         <w:t xml:space="preserve">, </w:t>
       </w:r>
       <w:r>
         <w:t xml:space="preserve">and </w:t>
       </w:r>
-      <w:proofErr w:type="spellStart"/>
       <w:r>
         <w:rPr>
           <w:i/>
@@ -21019,7 +21560,6 @@
         </w:rPr>
         <w:t>heightMinusOne</w:t>
       </w:r>
-      <w:proofErr w:type="spellEnd"/>
       <w:r>
         <w:t xml:space="preserve">.  </w:t>
       </w:r>
@@ -21041,7 +21581,6 @@
       <w:r>
         <w:t xml:space="preserve"> which were previously subtracting one from </w:t>
       </w:r>
-      <w:proofErr w:type="spellStart"/>
       <w:r>
         <w:rPr>
           <w:i/>
@@ -21049,11 +21588,9 @@
         </w:rPr>
         <w:t>objectWidth</w:t>
       </w:r>
-      <w:proofErr w:type="spellEnd"/>
       <w:r>
         <w:t xml:space="preserve"> &amp; </w:t>
       </w:r>
-      <w:proofErr w:type="spellStart"/>
       <w:r>
         <w:rPr>
           <w:i/>
@@ -21075,7 +21612,6 @@
         </w:rPr>
         <w:t>ght</w:t>
       </w:r>
-      <w:proofErr w:type="spellEnd"/>
       <w:r>
         <w:t xml:space="preserve">.  </w:t>
       </w:r>
@@ -21091,7 +21627,6 @@
       <w:r>
         <w:t xml:space="preserve">Bit-packed </w:t>
       </w:r>
-      <w:proofErr w:type="spellStart"/>
       <w:r>
         <w:rPr>
           <w:i/>
@@ -21099,11 +21634,9 @@
         </w:rPr>
         <w:t>objectType</w:t>
       </w:r>
-      <w:proofErr w:type="spellEnd"/>
       <w:r>
         <w:t xml:space="preserve"> and </w:t>
       </w:r>
-      <w:proofErr w:type="spellStart"/>
       <w:r>
         <w:rPr>
           <w:i/>
@@ -21111,7 +21644,6 @@
         </w:rPr>
         <w:t>objectState</w:t>
       </w:r>
-      <w:proofErr w:type="spellEnd"/>
       <w:r>
         <w:t xml:space="preserve"> array</w:t>
       </w:r>
@@ -21206,7 +21738,6 @@
         </w:numPr>
       </w:pPr>
       <w:r>
-        <w:lastRenderedPageBreak/>
         <w:t xml:space="preserve">Factored out </w:t>
       </w:r>
       <w:r>
@@ -21243,6 +21774,7 @@
         </w:numPr>
       </w:pPr>
       <w:r>
+        <w:lastRenderedPageBreak/>
         <w:t>Only c</w:t>
       </w:r>
       <w:r>
@@ -21451,7 +21983,6 @@
       <w:r>
         <w:t xml:space="preserve">JMP </w:t>
       </w:r>
-      <w:proofErr w:type="spellStart"/>
       <w:r>
         <w:rPr>
           <w:i/>
@@ -21460,13 +21991,8 @@
         <w:t>xxx</w:t>
       </w:r>
       <w:r>
-        <w:t>x</w:t>
-      </w:r>
-      <w:proofErr w:type="spellEnd"/>
-      <w:r>
-        <w:t xml:space="preserve"> instead of JSR </w:t>
-      </w:r>
-      <w:proofErr w:type="spellStart"/>
+        <w:t xml:space="preserve">x instead of JSR </w:t>
+      </w:r>
       <w:r>
         <w:rPr>
           <w:i/>
@@ -21474,7 +22000,6 @@
         </w:rPr>
         <w:t>xxxx</w:t>
       </w:r>
-      <w:proofErr w:type="spellEnd"/>
       <w:r>
         <w:t xml:space="preserve">, </w:t>
       </w:r>
@@ -21638,7 +22163,6 @@
       <w:r>
         <w:t xml:space="preserve"> and </w:t>
       </w:r>
-      <w:proofErr w:type="spellStart"/>
       <w:r>
         <w:rPr>
           <w:i/>
@@ -21646,7 +22170,6 @@
         </w:rPr>
         <w:t>dalekAnimate</w:t>
       </w:r>
-      <w:proofErr w:type="spellEnd"/>
       <w:r>
         <w:t xml:space="preserve"> routines do this.</w:t>
       </w:r>
@@ -21671,7 +22194,6 @@
       <w:r>
         <w:t xml:space="preserve">  For example, the </w:t>
       </w:r>
-      <w:proofErr w:type="spellStart"/>
       <w:r>
         <w:rPr>
           <w:i/>
@@ -21700,11 +22222,9 @@
         </w:rPr>
         <w:t>lock</w:t>
       </w:r>
-      <w:proofErr w:type="spellEnd"/>
       <w:r>
         <w:t xml:space="preserve"> and </w:t>
       </w:r>
-      <w:proofErr w:type="spellStart"/>
       <w:r>
         <w:rPr>
           <w:i/>
@@ -21712,7 +22232,6 @@
         </w:rPr>
         <w:t>vduCommands</w:t>
       </w:r>
-      <w:proofErr w:type="spellEnd"/>
       <w:r>
         <w:t xml:space="preserve"> buffer</w:t>
       </w:r>
@@ -21731,7 +22250,6 @@
       <w:r>
         <w:t xml:space="preserve">with </w:t>
       </w:r>
-      <w:proofErr w:type="spellStart"/>
       <w:r>
         <w:rPr>
           <w:i/>
@@ -21739,7 +22257,6 @@
         </w:rPr>
         <w:t>vduCommands</w:t>
       </w:r>
-      <w:proofErr w:type="spellEnd"/>
       <w:r>
         <w:rPr>
           <w:i/>
@@ -21889,18 +22406,8 @@
           <w:sz w:val="18"/>
           <w:szCs w:val="18"/>
         </w:rPr>
-        <w:t xml:space="preserve"> </w:t>
-      </w:r>
-      <w:proofErr w:type="spellStart"/>
-      <w:r>
-        <w:rPr>
-          <w:rFonts w:ascii="Cascadia Code" w:hAnsi="Cascadia Code"/>
-          <w:sz w:val="18"/>
-          <w:szCs w:val="18"/>
-        </w:rPr>
-        <w:t>Bh</w:t>
-      </w:r>
-      <w:proofErr w:type="spellEnd"/>
+        <w:t xml:space="preserve"> Bh</w:t>
+      </w:r>
       <w:r>
         <w:rPr>
           <w:rFonts w:ascii="Cascadia Code" w:hAnsi="Cascadia Code"/>
@@ -22003,10 +22510,8 @@
     </w:p>
     <w:p>
       <w:r>
-        <w:lastRenderedPageBreak/>
         <w:t xml:space="preserve">Routines always define a new scope (a wonderful </w:t>
       </w:r>
-      <w:proofErr w:type="spellStart"/>
       <w:r>
         <w:rPr>
           <w:b/>
@@ -22016,13 +22521,13 @@
         </w:rPr>
         <w:t>beebasm</w:t>
       </w:r>
-      <w:proofErr w:type="spellEnd"/>
       <w:r>
         <w:t xml:space="preserve"> feature) to limit the scope of contained labels and local data. Nested scopes are not used.</w:t>
       </w:r>
     </w:p>
     <w:p>
       <w:r>
+        <w:lastRenderedPageBreak/>
         <w:t xml:space="preserve">Control flow </w:t>
       </w:r>
       <w:r>
@@ -22604,15 +23109,15 @@
     </w:p>
     <w:p>
       <w:r>
+        <w:t>If K9 dies, the current level is restated.  The user can also choose to restart the current level if they become stuck</w:t>
+      </w:r>
+      <w:r>
+        <w:t>, by pressing the ‘R’ key.</w:t>
+      </w:r>
+    </w:p>
+    <w:p>
+      <w:r>
         <w:lastRenderedPageBreak/>
-        <w:t>If K9 dies, the current level is restated.  The user can also choose to restart the current level if they become stuck</w:t>
-      </w:r>
-      <w:r>
-        <w:t>, by pressing the ‘R’ key.</w:t>
-      </w:r>
-    </w:p>
-    <w:p>
-      <w:r>
         <w:t>And unlike many 1980’s games, t</w:t>
       </w:r>
       <w:r>
@@ -22807,11 +23312,11 @@
         <w:t>Page grids</w:t>
       </w:r>
       <w:r>
-        <w:t xml:space="preserve">.  Early in the development of the game I came up with a level model that allowed for an arbitrary arrangement of pages.  From a data structure perspective, </w:t>
+        <w:t xml:space="preserve">.  Early in the development of the game I came up with a level model that allowed for an arbitrary arrangement of pages.  From a data structure perspective, the model was simple and provided for a wide range of interesting level topologies.  However, any code that traversed tiles had to deal with potential page boundaries.  </w:t>
       </w:r>
       <w:r>
         <w:lastRenderedPageBreak/>
-        <w:t xml:space="preserve">the model was simple and provided for a wide range of interesting level topologies.  However, any code that traversed tiles had to deal with potential page boundaries.  The mistake I made was not realizing that choosing such a data structure would require that I adopt an abstraction (function-based or macro-based) to traverse it, which was something I was </w:t>
+        <w:t xml:space="preserve">The mistake I made was not realizing that choosing such a data structure would require that I adopt an abstraction (function-based or macro-based) to traverse it, which was something I was </w:t>
       </w:r>
       <w:r>
         <w:t xml:space="preserve">not </w:t>
@@ -22865,15 +23370,7 @@
         <w:t xml:space="preserve"> </w:t>
       </w:r>
       <w:r>
-        <w:t xml:space="preserve">1 overlays, rendering the graphics and text directly over the gameplay screen.  To do this I needed to write custom </w:t>
-      </w:r>
-      <w:proofErr w:type="spellStart"/>
-      <w:r>
-        <w:t>drawText</w:t>
-      </w:r>
-      <w:proofErr w:type="spellEnd"/>
-      <w:r>
-        <w:t xml:space="preserve"> routines that used the MOS’s character definitions stored at &amp;8000.  Although this worked well, the draw code took up precious bytes and I was forced to</w:t>
+        <w:t>1 overlays, rendering the graphics and text directly over the gameplay screen.  To do this I needed to write custom drawText routines that used the MOS’s character definitions stored at &amp;8000.  Although this worked well, the draw code took up precious bytes and I was forced to</w:t>
       </w:r>
       <w:r>
         <w:t xml:space="preserve"> </w:t>
@@ -23110,6 +23607,7 @@
         <w:pStyle w:val="Heading2"/>
       </w:pPr>
       <w:r>
+        <w:lastRenderedPageBreak/>
         <w:t>Resources</w:t>
       </w:r>
     </w:p>
@@ -23167,16 +23665,8 @@
           <w:rPr>
             <w:rStyle w:val="Hyperlink"/>
           </w:rPr>
-          <w:t>mdfs.net/Docs/Comp/BBC/</w:t>
+          <w:t>mdfs.net/Docs/Comp/BBC/AllMem</w:t>
         </w:r>
-        <w:proofErr w:type="spellStart"/>
-        <w:r>
-          <w:rPr>
-            <w:rStyle w:val="Hyperlink"/>
-          </w:rPr>
-          <w:t>AllMem</w:t>
-        </w:r>
-        <w:proofErr w:type="spellEnd"/>
       </w:hyperlink>
     </w:p>
     <w:p>
@@ -23194,16 +23684,8 @@
           <w:rPr>
             <w:rStyle w:val="Hyperlink"/>
           </w:rPr>
-          <w:t>mdfs.net/Docs/Comp/BBC/Disk/</w:t>
+          <w:t>mdfs.net/Docs/Comp/BBC/Disk/DFSMem</w:t>
         </w:r>
-        <w:proofErr w:type="spellStart"/>
-        <w:r>
-          <w:rPr>
-            <w:rStyle w:val="Hyperlink"/>
-          </w:rPr>
-          <w:t>DFSMem</w:t>
-        </w:r>
-        <w:proofErr w:type="spellEnd"/>
       </w:hyperlink>
     </w:p>
     <w:p>
@@ -23241,7 +23723,7 @@
     <mc:AlternateContent>
       <mc:Choice Requires="v">
         <w:pict>
-          <v:shapetype w14:anchorId="58B89E59" id="_x0000_t75" coordsize="21600,21600" o:spt="75" o:preferrelative="t" path="m@4@5l@4@11@9@11@9@5xe" filled="f" stroked="f">
+          <v:shapetype w14:anchorId="1707C8C3" id="_x0000_t75" coordsize="21600,21600" o:spt="75" o:preferrelative="t" path="m@4@5l@4@11@9@11@9@5xe" filled="f" stroked="f">
             <v:stroke joinstyle="miter"/>
             <v:formulas>
               <v:f eqn="if lineDrawn pixelLineWidth 0"/>
@@ -23267,10 +23749,10 @@
       </mc:Choice>
       <mc:Fallback>
         <w:drawing>
-          <wp:inline distT="0" distB="0" distL="0" distR="0" wp14:anchorId="69007E5A" wp14:editId="52FC21DA">
+          <wp:inline distT="0" distB="0" distL="0" distR="0" wp14:anchorId="14996892" wp14:editId="5C4D77A3">
             <wp:extent cx="194650" cy="145988"/>
             <wp:effectExtent l="0" t="0" r="0" b="6985"/>
-            <wp:docPr id="168808257" name="Picture 1"/>
+            <wp:docPr id="727037417" name="Picture 1"/>
             <wp:cNvGraphicFramePr>
               <a:graphicFrameLocks xmlns:a="http://schemas.openxmlformats.org/drawingml/2006/main" noChangeAspect="1"/>
             </wp:cNvGraphicFramePr>
@@ -23308,17 +23790,17 @@
     <mc:AlternateContent>
       <mc:Choice Requires="v">
         <w:pict>
-          <v:shape w14:anchorId="48016A09" id="Picture 1" o:spid="_x0000_i1025" type="#_x0000_t75" style="width:15.7pt;height:11.75pt;visibility:visible;mso-wrap-style:square">
+          <v:shape w14:anchorId="18DB75E9" id="Picture 1" o:spid="_x0000_i1025" type="#_x0000_t75" style="width:15.7pt;height:11.75pt;visibility:visible;mso-wrap-style:square">
             <v:imagedata r:id="rId3" o:title=""/>
           </v:shape>
         </w:pict>
       </mc:Choice>
       <mc:Fallback>
         <w:drawing>
-          <wp:inline distT="0" distB="0" distL="0" distR="0" wp14:anchorId="2DAB9C43" wp14:editId="2B9677AE">
+          <wp:inline distT="0" distB="0" distL="0" distR="0" wp14:anchorId="22F396D0" wp14:editId="75ED60EE">
             <wp:extent cx="199177" cy="149383"/>
             <wp:effectExtent l="0" t="0" r="0" b="3175"/>
-            <wp:docPr id="178131054" name="Picture 1"/>
+            <wp:docPr id="1569381748" name="Picture 1"/>
             <wp:cNvGraphicFramePr>
               <a:graphicFrameLocks xmlns:a="http://schemas.openxmlformats.org/drawingml/2006/main" noChangeAspect="1"/>
             </wp:cNvGraphicFramePr>
@@ -24834,16 +25316,16 @@
     </w:lvl>
   </w:abstractNum>
   <w:abstractNum w:abstractNumId="14" w15:restartNumberingAfterBreak="0">
-    <w:nsid w:val="4A143613"/>
+    <w:nsid w:val="49143FB0"/>
     <w:multiLevelType w:val="hybridMultilevel"/>
-    <w:tmpl w:val="4FC80CA6"/>
+    <w:tmpl w:val="038EC8CE"/>
     <w:lvl w:ilvl="0" w:tplc="04090001">
       <w:start w:val="1"/>
       <w:numFmt w:val="bullet"/>
       <w:lvlText w:val=""/>
       <w:lvlJc w:val="left"/>
       <w:pPr>
-        <w:ind w:left="720" w:hanging="360"/>
+        <w:ind w:left="1440" w:hanging="360"/>
       </w:pPr>
       <w:rPr>
         <w:rFonts w:ascii="Symbol" w:hAnsi="Symbol" w:hint="default"/>
@@ -24855,7 +25337,7 @@
       <w:lvlText w:val="o"/>
       <w:lvlJc w:val="left"/>
       <w:pPr>
-        <w:ind w:left="1440" w:hanging="360"/>
+        <w:ind w:left="2160" w:hanging="360"/>
       </w:pPr>
       <w:rPr>
         <w:rFonts w:ascii="Courier New" w:hAnsi="Courier New" w:cs="Courier New" w:hint="default"/>
@@ -24867,7 +25349,7 @@
       <w:lvlText w:val=""/>
       <w:lvlJc w:val="left"/>
       <w:pPr>
-        <w:ind w:left="2160" w:hanging="360"/>
+        <w:ind w:left="2880" w:hanging="360"/>
       </w:pPr>
       <w:rPr>
         <w:rFonts w:ascii="Wingdings" w:hAnsi="Wingdings" w:hint="default"/>
@@ -24879,7 +25361,7 @@
       <w:lvlText w:val=""/>
       <w:lvlJc w:val="left"/>
       <w:pPr>
-        <w:ind w:left="2880" w:hanging="360"/>
+        <w:ind w:left="3600" w:hanging="360"/>
       </w:pPr>
       <w:rPr>
         <w:rFonts w:ascii="Symbol" w:hAnsi="Symbol" w:hint="default"/>
@@ -24891,7 +25373,7 @@
       <w:lvlText w:val="o"/>
       <w:lvlJc w:val="left"/>
       <w:pPr>
-        <w:ind w:left="3600" w:hanging="360"/>
+        <w:ind w:left="4320" w:hanging="360"/>
       </w:pPr>
       <w:rPr>
         <w:rFonts w:ascii="Courier New" w:hAnsi="Courier New" w:cs="Courier New" w:hint="default"/>
@@ -24903,7 +25385,7 @@
       <w:lvlText w:val=""/>
       <w:lvlJc w:val="left"/>
       <w:pPr>
-        <w:ind w:left="4320" w:hanging="360"/>
+        <w:ind w:left="5040" w:hanging="360"/>
       </w:pPr>
       <w:rPr>
         <w:rFonts w:ascii="Wingdings" w:hAnsi="Wingdings" w:hint="default"/>
@@ -24915,7 +25397,7 @@
       <w:lvlText w:val=""/>
       <w:lvlJc w:val="left"/>
       <w:pPr>
-        <w:ind w:left="5040" w:hanging="360"/>
+        <w:ind w:left="5760" w:hanging="360"/>
       </w:pPr>
       <w:rPr>
         <w:rFonts w:ascii="Symbol" w:hAnsi="Symbol" w:hint="default"/>
@@ -24927,7 +25409,7 @@
       <w:lvlText w:val="o"/>
       <w:lvlJc w:val="left"/>
       <w:pPr>
-        <w:ind w:left="5760" w:hanging="360"/>
+        <w:ind w:left="6480" w:hanging="360"/>
       </w:pPr>
       <w:rPr>
         <w:rFonts w:ascii="Courier New" w:hAnsi="Courier New" w:cs="Courier New" w:hint="default"/>
@@ -24939,7 +25421,7 @@
       <w:lvlText w:val=""/>
       <w:lvlJc w:val="left"/>
       <w:pPr>
-        <w:ind w:left="6480" w:hanging="360"/>
+        <w:ind w:left="7200" w:hanging="360"/>
       </w:pPr>
       <w:rPr>
         <w:rFonts w:ascii="Wingdings" w:hAnsi="Wingdings" w:hint="default"/>
@@ -24947,6 +25429,119 @@
     </w:lvl>
   </w:abstractNum>
   <w:abstractNum w:abstractNumId="15" w15:restartNumberingAfterBreak="0">
+    <w:nsid w:val="4A143613"/>
+    <w:multiLevelType w:val="hybridMultilevel"/>
+    <w:tmpl w:val="4FC80CA6"/>
+    <w:lvl w:ilvl="0" w:tplc="04090001">
+      <w:start w:val="1"/>
+      <w:numFmt w:val="bullet"/>
+      <w:lvlText w:val=""/>
+      <w:lvlJc w:val="left"/>
+      <w:pPr>
+        <w:ind w:left="720" w:hanging="360"/>
+      </w:pPr>
+      <w:rPr>
+        <w:rFonts w:ascii="Symbol" w:hAnsi="Symbol" w:hint="default"/>
+      </w:rPr>
+    </w:lvl>
+    <w:lvl w:ilvl="1" w:tplc="04090003" w:tentative="1">
+      <w:start w:val="1"/>
+      <w:numFmt w:val="bullet"/>
+      <w:lvlText w:val="o"/>
+      <w:lvlJc w:val="left"/>
+      <w:pPr>
+        <w:ind w:left="1440" w:hanging="360"/>
+      </w:pPr>
+      <w:rPr>
+        <w:rFonts w:ascii="Courier New" w:hAnsi="Courier New" w:cs="Courier New" w:hint="default"/>
+      </w:rPr>
+    </w:lvl>
+    <w:lvl w:ilvl="2" w:tplc="04090005" w:tentative="1">
+      <w:start w:val="1"/>
+      <w:numFmt w:val="bullet"/>
+      <w:lvlText w:val=""/>
+      <w:lvlJc w:val="left"/>
+      <w:pPr>
+        <w:ind w:left="2160" w:hanging="360"/>
+      </w:pPr>
+      <w:rPr>
+        <w:rFonts w:ascii="Wingdings" w:hAnsi="Wingdings" w:hint="default"/>
+      </w:rPr>
+    </w:lvl>
+    <w:lvl w:ilvl="3" w:tplc="04090001" w:tentative="1">
+      <w:start w:val="1"/>
+      <w:numFmt w:val="bullet"/>
+      <w:lvlText w:val=""/>
+      <w:lvlJc w:val="left"/>
+      <w:pPr>
+        <w:ind w:left="2880" w:hanging="360"/>
+      </w:pPr>
+      <w:rPr>
+        <w:rFonts w:ascii="Symbol" w:hAnsi="Symbol" w:hint="default"/>
+      </w:rPr>
+    </w:lvl>
+    <w:lvl w:ilvl="4" w:tplc="04090003" w:tentative="1">
+      <w:start w:val="1"/>
+      <w:numFmt w:val="bullet"/>
+      <w:lvlText w:val="o"/>
+      <w:lvlJc w:val="left"/>
+      <w:pPr>
+        <w:ind w:left="3600" w:hanging="360"/>
+      </w:pPr>
+      <w:rPr>
+        <w:rFonts w:ascii="Courier New" w:hAnsi="Courier New" w:cs="Courier New" w:hint="default"/>
+      </w:rPr>
+    </w:lvl>
+    <w:lvl w:ilvl="5" w:tplc="04090005" w:tentative="1">
+      <w:start w:val="1"/>
+      <w:numFmt w:val="bullet"/>
+      <w:lvlText w:val=""/>
+      <w:lvlJc w:val="left"/>
+      <w:pPr>
+        <w:ind w:left="4320" w:hanging="360"/>
+      </w:pPr>
+      <w:rPr>
+        <w:rFonts w:ascii="Wingdings" w:hAnsi="Wingdings" w:hint="default"/>
+      </w:rPr>
+    </w:lvl>
+    <w:lvl w:ilvl="6" w:tplc="04090001" w:tentative="1">
+      <w:start w:val="1"/>
+      <w:numFmt w:val="bullet"/>
+      <w:lvlText w:val=""/>
+      <w:lvlJc w:val="left"/>
+      <w:pPr>
+        <w:ind w:left="5040" w:hanging="360"/>
+      </w:pPr>
+      <w:rPr>
+        <w:rFonts w:ascii="Symbol" w:hAnsi="Symbol" w:hint="default"/>
+      </w:rPr>
+    </w:lvl>
+    <w:lvl w:ilvl="7" w:tplc="04090003" w:tentative="1">
+      <w:start w:val="1"/>
+      <w:numFmt w:val="bullet"/>
+      <w:lvlText w:val="o"/>
+      <w:lvlJc w:val="left"/>
+      <w:pPr>
+        <w:ind w:left="5760" w:hanging="360"/>
+      </w:pPr>
+      <w:rPr>
+        <w:rFonts w:ascii="Courier New" w:hAnsi="Courier New" w:cs="Courier New" w:hint="default"/>
+      </w:rPr>
+    </w:lvl>
+    <w:lvl w:ilvl="8" w:tplc="04090005" w:tentative="1">
+      <w:start w:val="1"/>
+      <w:numFmt w:val="bullet"/>
+      <w:lvlText w:val=""/>
+      <w:lvlJc w:val="left"/>
+      <w:pPr>
+        <w:ind w:left="6480" w:hanging="360"/>
+      </w:pPr>
+      <w:rPr>
+        <w:rFonts w:ascii="Wingdings" w:hAnsi="Wingdings" w:hint="default"/>
+      </w:rPr>
+    </w:lvl>
+  </w:abstractNum>
+  <w:abstractNum w:abstractNumId="16" w15:restartNumberingAfterBreak="0">
     <w:nsid w:val="4A6D7F7F"/>
     <w:multiLevelType w:val="hybridMultilevel"/>
     <w:tmpl w:val="28F0F6CA"/>
@@ -25058,7 +25653,7 @@
       </w:rPr>
     </w:lvl>
   </w:abstractNum>
-  <w:abstractNum w:abstractNumId="16" w15:restartNumberingAfterBreak="0">
+  <w:abstractNum w:abstractNumId="17" w15:restartNumberingAfterBreak="0">
     <w:nsid w:val="53052754"/>
     <w:multiLevelType w:val="hybridMultilevel"/>
     <w:tmpl w:val="980C9B5E"/>
@@ -25170,7 +25765,7 @@
       </w:rPr>
     </w:lvl>
   </w:abstractNum>
-  <w:abstractNum w:abstractNumId="17" w15:restartNumberingAfterBreak="0">
+  <w:abstractNum w:abstractNumId="18" w15:restartNumberingAfterBreak="0">
     <w:nsid w:val="57BB6A34"/>
     <w:multiLevelType w:val="hybridMultilevel"/>
     <w:tmpl w:val="CEB21378"/>
@@ -25259,7 +25854,7 @@
       </w:pPr>
     </w:lvl>
   </w:abstractNum>
-  <w:abstractNum w:abstractNumId="18" w15:restartNumberingAfterBreak="0">
+  <w:abstractNum w:abstractNumId="19" w15:restartNumberingAfterBreak="0">
     <w:nsid w:val="5E2E4816"/>
     <w:multiLevelType w:val="hybridMultilevel"/>
     <w:tmpl w:val="7D1ADD1C"/>
@@ -25372,7 +25967,7 @@
       </w:rPr>
     </w:lvl>
   </w:abstractNum>
-  <w:abstractNum w:abstractNumId="19" w15:restartNumberingAfterBreak="0">
+  <w:abstractNum w:abstractNumId="20" w15:restartNumberingAfterBreak="0">
     <w:nsid w:val="64C52750"/>
     <w:multiLevelType w:val="hybridMultilevel"/>
     <w:tmpl w:val="B860ABDA"/>
@@ -25485,7 +26080,7 @@
       </w:rPr>
     </w:lvl>
   </w:abstractNum>
-  <w:abstractNum w:abstractNumId="20" w15:restartNumberingAfterBreak="0">
+  <w:abstractNum w:abstractNumId="21" w15:restartNumberingAfterBreak="0">
     <w:nsid w:val="6FCE08F8"/>
     <w:multiLevelType w:val="hybridMultilevel"/>
     <w:tmpl w:val="865CEDCA"/>
@@ -25571,7 +26166,7 @@
       </w:pPr>
     </w:lvl>
   </w:abstractNum>
-  <w:abstractNum w:abstractNumId="21" w15:restartNumberingAfterBreak="0">
+  <w:abstractNum w:abstractNumId="22" w15:restartNumberingAfterBreak="0">
     <w:nsid w:val="719E0923"/>
     <w:multiLevelType w:val="hybridMultilevel"/>
     <w:tmpl w:val="22E86822"/>
@@ -25684,7 +26279,7 @@
       </w:rPr>
     </w:lvl>
   </w:abstractNum>
-  <w:abstractNum w:abstractNumId="22" w15:restartNumberingAfterBreak="0">
+  <w:abstractNum w:abstractNumId="23" w15:restartNumberingAfterBreak="0">
     <w:nsid w:val="71C023C8"/>
     <w:multiLevelType w:val="hybridMultilevel"/>
     <w:tmpl w:val="CAF47F62"/>
@@ -25797,7 +26392,7 @@
       </w:rPr>
     </w:lvl>
   </w:abstractNum>
-  <w:abstractNum w:abstractNumId="23" w15:restartNumberingAfterBreak="0">
+  <w:abstractNum w:abstractNumId="24" w15:restartNumberingAfterBreak="0">
     <w:nsid w:val="7525577B"/>
     <w:multiLevelType w:val="hybridMultilevel"/>
     <w:tmpl w:val="B830AF46"/>
@@ -25910,7 +26505,7 @@
       </w:rPr>
     </w:lvl>
   </w:abstractNum>
-  <w:abstractNum w:abstractNumId="24" w15:restartNumberingAfterBreak="0">
+  <w:abstractNum w:abstractNumId="25" w15:restartNumberingAfterBreak="0">
     <w:nsid w:val="7ACB2100"/>
     <w:multiLevelType w:val="hybridMultilevel"/>
     <w:tmpl w:val="6BEA828E"/>
@@ -26029,34 +26624,34 @@
     <w:abstractNumId w:val="4"/>
   </w:num>
   <w:num w:numId="3" w16cid:durableId="1186597203">
-    <w:abstractNumId w:val="16"/>
+    <w:abstractNumId w:val="17"/>
   </w:num>
   <w:num w:numId="4" w16cid:durableId="1038775837">
     <w:abstractNumId w:val="7"/>
   </w:num>
   <w:num w:numId="5" w16cid:durableId="471559901">
-    <w:abstractNumId w:val="17"/>
+    <w:abstractNumId w:val="18"/>
   </w:num>
   <w:num w:numId="6" w16cid:durableId="1294485144">
-    <w:abstractNumId w:val="20"/>
+    <w:abstractNumId w:val="21"/>
   </w:num>
   <w:num w:numId="7" w16cid:durableId="90247628">
-    <w:abstractNumId w:val="19"/>
+    <w:abstractNumId w:val="20"/>
   </w:num>
   <w:num w:numId="8" w16cid:durableId="1406299513">
     <w:abstractNumId w:val="5"/>
   </w:num>
   <w:num w:numId="9" w16cid:durableId="1465924744">
-    <w:abstractNumId w:val="24"/>
+    <w:abstractNumId w:val="25"/>
   </w:num>
   <w:num w:numId="10" w16cid:durableId="320810464">
     <w:abstractNumId w:val="13"/>
   </w:num>
   <w:num w:numId="11" w16cid:durableId="704719656">
-    <w:abstractNumId w:val="18"/>
+    <w:abstractNumId w:val="19"/>
   </w:num>
   <w:num w:numId="12" w16cid:durableId="1713075570">
-    <w:abstractNumId w:val="23"/>
+    <w:abstractNumId w:val="24"/>
   </w:num>
   <w:num w:numId="13" w16cid:durableId="1666863145">
     <w:abstractNumId w:val="2"/>
@@ -26065,7 +26660,7 @@
     <w:abstractNumId w:val="11"/>
   </w:num>
   <w:num w:numId="15" w16cid:durableId="1628273300">
-    <w:abstractNumId w:val="14"/>
+    <w:abstractNumId w:val="15"/>
   </w:num>
   <w:num w:numId="16" w16cid:durableId="1174422558">
     <w:abstractNumId w:val="0"/>
@@ -26074,7 +26669,7 @@
     <w:abstractNumId w:val="8"/>
   </w:num>
   <w:num w:numId="18" w16cid:durableId="465784155">
-    <w:abstractNumId w:val="15"/>
+    <w:abstractNumId w:val="16"/>
   </w:num>
   <w:num w:numId="19" w16cid:durableId="797146743">
     <w:abstractNumId w:val="12"/>
@@ -26083,10 +26678,10 @@
     <w:abstractNumId w:val="3"/>
   </w:num>
   <w:num w:numId="21" w16cid:durableId="1191802424">
-    <w:abstractNumId w:val="21"/>
+    <w:abstractNumId w:val="22"/>
   </w:num>
   <w:num w:numId="22" w16cid:durableId="925726924">
-    <w:abstractNumId w:val="22"/>
+    <w:abstractNumId w:val="23"/>
   </w:num>
   <w:num w:numId="23" w16cid:durableId="561335449">
     <w:abstractNumId w:val="10"/>
@@ -26096,6 +26691,9 @@
   </w:num>
   <w:num w:numId="25" w16cid:durableId="1115640707">
     <w:abstractNumId w:val="9"/>
+  </w:num>
+  <w:num w:numId="26" w16cid:durableId="598292735">
+    <w:abstractNumId w:val="14"/>
   </w:num>
 </w:numbering>
 </file>

</xml_diff>

<commit_message>
Updated the game complete experience to show a teletext based congrats screen and play the Doctor Who theme music.
</commit_message>
<xml_diff>
--- a/docs/Development.docx
+++ b/docs/Development.docx
@@ -470,7 +470,6 @@
       <w:r>
         <w:t xml:space="preserve"> </w:t>
       </w:r>
-      <w:proofErr w:type="spellStart"/>
       <w:r>
         <w:rPr>
           <w:b/>
@@ -480,7 +479,6 @@
         </w:rPr>
         <w:t>beebasm</w:t>
       </w:r>
-      <w:proofErr w:type="spellEnd"/>
       <w:r>
         <w:t>, an excellent assembler th</w:t>
       </w:r>
@@ -490,7 +488,6 @@
       <w:r>
         <w:t xml:space="preserve">I could use on Windows to produce an SSD, which I could then run in </w:t>
       </w:r>
-      <w:proofErr w:type="spellStart"/>
       <w:r>
         <w:rPr>
           <w:b/>
@@ -501,7 +498,6 @@
         <w:lastRenderedPageBreak/>
         <w:t>beebem</w:t>
       </w:r>
-      <w:proofErr w:type="spellEnd"/>
       <w:r>
         <w:t>, an emulator</w:t>
       </w:r>
@@ -603,7 +599,6 @@
       <w:r>
         <w:t xml:space="preserve">After looking at some examples that were installed with </w:t>
       </w:r>
-      <w:proofErr w:type="spellStart"/>
       <w:r>
         <w:rPr>
           <w:b/>
@@ -622,7 +617,6 @@
         </w:rPr>
         <w:t>asm</w:t>
       </w:r>
-      <w:proofErr w:type="spellEnd"/>
       <w:r>
         <w:t xml:space="preserve">, I </w:t>
       </w:r>
@@ -757,7 +751,6 @@
       <w:r>
         <w:t xml:space="preserve">The prototype was based on one of the </w:t>
       </w:r>
-      <w:proofErr w:type="spellStart"/>
       <w:r>
         <w:rPr>
           <w:b/>
@@ -767,7 +760,6 @@
         </w:rPr>
         <w:t>beebasm</w:t>
       </w:r>
-      <w:proofErr w:type="spellEnd"/>
       <w:r>
         <w:t xml:space="preserve"> </w:t>
       </w:r>
@@ -2361,7 +2353,6 @@
       <w:r>
         <w:t xml:space="preserve"> and </w:t>
       </w:r>
-      <w:proofErr w:type="spellStart"/>
       <w:r>
         <w:rPr>
           <w:b/>
@@ -2380,7 +2371,6 @@
         </w:rPr>
         <w:t>lekAnimate</w:t>
       </w:r>
-      <w:proofErr w:type="spellEnd"/>
       <w:r>
         <w:t xml:space="preserve"> </w:t>
       </w:r>
@@ -2704,7 +2694,6 @@
       <w:r>
         <w:t xml:space="preserve"> using the </w:t>
       </w:r>
-      <w:proofErr w:type="spellStart"/>
       <w:r>
         <w:rPr>
           <w:b/>
@@ -2719,15 +2708,7 @@
           <w:b/>
           <w:bCs/>
         </w:rPr>
-        <w:t>’s</w:t>
-      </w:r>
-      <w:proofErr w:type="spellEnd"/>
-      <w:r>
-        <w:rPr>
-          <w:b/>
-          <w:bCs/>
-        </w:rPr>
-        <w:t xml:space="preserve"> </w:t>
+        <w:t xml:space="preserve">’s </w:t>
       </w:r>
       <w:r>
         <w:rPr>
@@ -4381,7 +4362,6 @@
           <w:bCs/>
         </w:rPr>
       </w:pPr>
-      <w:proofErr w:type="spellStart"/>
       <w:r>
         <w:rPr>
           <w:b/>
@@ -4389,7 +4369,6 @@
         </w:rPr>
         <w:t>objectXLo</w:t>
       </w:r>
-      <w:proofErr w:type="spellEnd"/>
       <w:r>
         <w:rPr>
           <w:b/>
@@ -4397,7 +4376,6 @@
         </w:rPr>
         <w:t xml:space="preserve"> &amp; </w:t>
       </w:r>
-      <w:proofErr w:type="spellStart"/>
       <w:r>
         <w:rPr>
           <w:b/>
@@ -4405,7 +4383,6 @@
         </w:rPr>
         <w:t>objectXHi</w:t>
       </w:r>
-      <w:proofErr w:type="spellEnd"/>
       <w:r>
         <w:rPr>
           <w:b/>
@@ -4438,38 +4415,27 @@
           <w:bCs/>
         </w:rPr>
       </w:pPr>
-      <w:proofErr w:type="spellStart"/>
       <w:r>
         <w:rPr>
           <w:b/>
           <w:bCs/>
         </w:rPr>
-        <w:t>objectYLo</w:t>
-      </w:r>
-      <w:proofErr w:type="spellEnd"/>
+        <w:t xml:space="preserve">objectYLo </w:t>
+      </w:r>
       <w:r>
         <w:rPr>
           <w:b/>
           <w:bCs/>
         </w:rPr>
-        <w:t xml:space="preserve"> </w:t>
+        <w:t xml:space="preserve">&amp; </w:t>
       </w:r>
       <w:r>
         <w:rPr>
           <w:b/>
           <w:bCs/>
         </w:rPr>
-        <w:t xml:space="preserve">&amp; </w:t>
-      </w:r>
-      <w:proofErr w:type="spellStart"/>
-      <w:r>
-        <w:rPr>
-          <w:b/>
-          <w:bCs/>
-        </w:rPr>
         <w:t>objectYHi</w:t>
       </w:r>
-      <w:proofErr w:type="spellEnd"/>
       <w:r>
         <w:rPr>
           <w:b/>
@@ -4505,31 +4471,13 @@
           <w:bCs/>
         </w:rPr>
       </w:pPr>
-      <w:proofErr w:type="spellStart"/>
       <w:r>
         <w:rPr>
           <w:b/>
           <w:bCs/>
         </w:rPr>
-        <w:t>objectWidth</w:t>
-      </w:r>
-      <w:proofErr w:type="spellEnd"/>
-      <w:r>
-        <w:rPr>
-          <w:b/>
-          <w:bCs/>
-        </w:rPr>
-        <w:t xml:space="preserve"> &amp; </w:t>
-      </w:r>
-      <w:proofErr w:type="spellStart"/>
-      <w:r>
-        <w:rPr>
-          <w:b/>
-          <w:bCs/>
-        </w:rPr>
-        <w:t>objectHeight</w:t>
-      </w:r>
-      <w:proofErr w:type="spellEnd"/>
+        <w:t>objectWidth &amp; objectHeight</w:t>
+      </w:r>
       <w:r>
         <w:rPr>
           <w:b/>
@@ -4556,7 +4504,6 @@
           <w:bCs/>
         </w:rPr>
       </w:pPr>
-      <w:proofErr w:type="spellStart"/>
       <w:r>
         <w:rPr>
           <w:b/>
@@ -4564,7 +4511,6 @@
         </w:rPr>
         <w:t>objectAnimation</w:t>
       </w:r>
-      <w:proofErr w:type="spellEnd"/>
       <w:r>
         <w:rPr>
           <w:b/>
@@ -4597,7 +4543,6 @@
           <w:bCs/>
         </w:rPr>
       </w:pPr>
-      <w:proofErr w:type="spellStart"/>
       <w:r>
         <w:rPr>
           <w:b/>
@@ -4605,7 +4550,6 @@
         </w:rPr>
         <w:t>objectState</w:t>
       </w:r>
-      <w:proofErr w:type="spellEnd"/>
       <w:r>
         <w:rPr>
           <w:b/>
@@ -4697,7 +4641,6 @@
           <w:bCs/>
         </w:rPr>
       </w:pPr>
-      <w:proofErr w:type="spellStart"/>
       <w:r>
         <w:rPr>
           <w:b/>
@@ -4705,7 +4648,6 @@
         </w:rPr>
         <w:t>objectSpriteIndex</w:t>
       </w:r>
-      <w:proofErr w:type="spellEnd"/>
       <w:r>
         <w:rPr>
           <w:b/>
@@ -4740,31 +4682,13 @@
           <w:numId w:val="8"/>
         </w:numPr>
       </w:pPr>
-      <w:proofErr w:type="spellStart"/>
       <w:r>
         <w:rPr>
           <w:b/>
           <w:bCs/>
         </w:rPr>
-        <w:t>objectFrameCallbackLo</w:t>
-      </w:r>
-      <w:proofErr w:type="spellEnd"/>
-      <w:r>
-        <w:rPr>
-          <w:b/>
-          <w:bCs/>
-        </w:rPr>
-        <w:t xml:space="preserve"> &amp; </w:t>
-      </w:r>
-      <w:proofErr w:type="spellStart"/>
-      <w:r>
-        <w:rPr>
-          <w:b/>
-          <w:bCs/>
-        </w:rPr>
-        <w:t>objectFrameCallbackHi</w:t>
-      </w:r>
-      <w:proofErr w:type="spellEnd"/>
+        <w:t>objectFrameCallbackLo &amp; objectFrameCallbackHi</w:t>
+      </w:r>
       <w:r>
         <w:rPr>
           <w:b/>
@@ -4812,7 +4736,6 @@
           <w:bCs/>
         </w:rPr>
       </w:pPr>
-      <w:proofErr w:type="spellStart"/>
       <w:r>
         <w:rPr>
           <w:b/>
@@ -4820,7 +4743,6 @@
         </w:rPr>
         <w:t>objectFrameCounter</w:t>
       </w:r>
-      <w:proofErr w:type="spellEnd"/>
       <w:r>
         <w:rPr>
           <w:b/>
@@ -6117,7 +6039,6 @@
       <w:r>
         <w:t xml:space="preserve">setting </w:t>
       </w:r>
-      <w:proofErr w:type="spellStart"/>
       <w:r>
         <w:rPr>
           <w:i/>
@@ -6139,7 +6060,6 @@
         </w:rPr>
         <w:t>Addr</w:t>
       </w:r>
-      <w:proofErr w:type="spellEnd"/>
       <w:r>
         <w:t xml:space="preserve"> </w:t>
       </w:r>
@@ -6239,7 +6159,6 @@
       <w:r>
         <w:t xml:space="preserve">in the low nibble of </w:t>
       </w:r>
-      <w:proofErr w:type="spellStart"/>
       <w:r>
         <w:rPr>
           <w:i/>
@@ -6247,7 +6166,6 @@
         </w:rPr>
         <w:t>objectState</w:t>
       </w:r>
-      <w:proofErr w:type="spellEnd"/>
       <w:r>
         <w:t xml:space="preserve"> array</w:t>
       </w:r>
@@ -6332,11 +6250,9 @@
       <w:r>
         <w:t>‘</w:t>
       </w:r>
-      <w:proofErr w:type="spellStart"/>
       <w:r>
         <w:t>Gamebar</w:t>
       </w:r>
-      <w:proofErr w:type="spellEnd"/>
       <w:r>
         <w:t>’</w:t>
       </w:r>
@@ -6354,11 +6270,9 @@
       <w:r>
         <w:t xml:space="preserve">and show this information in a </w:t>
       </w:r>
-      <w:proofErr w:type="spellStart"/>
       <w:r>
         <w:t>gamebar</w:t>
       </w:r>
-      <w:proofErr w:type="spellEnd"/>
       <w:r>
         <w:t>, located at the top right of the screen.</w:t>
       </w:r>
@@ -6502,7 +6416,6 @@
       <w:r>
         <w:t xml:space="preserve"> </w:t>
       </w:r>
-      <w:proofErr w:type="spellStart"/>
       <w:r>
         <w:rPr>
           <w:i/>
@@ -6510,7 +6423,6 @@
         </w:rPr>
         <w:t>clearTile</w:t>
       </w:r>
-      <w:proofErr w:type="spellEnd"/>
       <w:r>
         <w:t xml:space="preserve"> </w:t>
       </w:r>
@@ -6525,7 +6437,6 @@
       <w:r>
         <w:t xml:space="preserve">The </w:t>
       </w:r>
-      <w:proofErr w:type="spellStart"/>
       <w:r>
         <w:rPr>
           <w:i/>
@@ -6533,7 +6444,6 @@
         </w:rPr>
         <w:t>clearTile</w:t>
       </w:r>
-      <w:proofErr w:type="spellEnd"/>
       <w:r>
         <w:t xml:space="preserve"> </w:t>
       </w:r>
@@ -6581,24 +6491,14 @@
       <w:r>
         <w:t xml:space="preserve"> </w:t>
       </w:r>
-      <w:proofErr w:type="spellStart"/>
       <w:r>
         <w:t>gamebar</w:t>
       </w:r>
-      <w:proofErr w:type="spellEnd"/>
       <w:r>
         <w:t>.</w:t>
       </w:r>
       <w:r>
-        <w:t xml:space="preserve">  As before, I created a </w:t>
-      </w:r>
-      <w:proofErr w:type="spellStart"/>
-      <w:r>
-        <w:t>gamebar</w:t>
-      </w:r>
-      <w:proofErr w:type="spellEnd"/>
-      <w:r>
-        <w:t xml:space="preserve"> sprite using </w:t>
+        <w:t xml:space="preserve">  As before, I created a gamebar sprite using </w:t>
       </w:r>
       <w:r>
         <w:rPr>
@@ -6660,15 +6560,7 @@
         <w:t>rote</w:t>
       </w:r>
       <w:r>
-        <w:t xml:space="preserve"> code to render the </w:t>
-      </w:r>
-      <w:proofErr w:type="spellStart"/>
-      <w:r>
-        <w:t>gamebar</w:t>
-      </w:r>
-      <w:proofErr w:type="spellEnd"/>
-      <w:r>
-        <w:t xml:space="preserve">, </w:t>
+        <w:t xml:space="preserve"> code to render the gamebar, </w:t>
       </w:r>
       <w:r>
         <w:t>which show</w:t>
@@ -6692,15 +6584,7 @@
         <w:t xml:space="preserve">.  </w:t>
       </w:r>
       <w:r>
-        <w:t xml:space="preserve">To </w:t>
-      </w:r>
-      <w:proofErr w:type="spellStart"/>
-      <w:r>
-        <w:t>gamebar</w:t>
-      </w:r>
-      <w:proofErr w:type="spellEnd"/>
-      <w:r>
-        <w:t xml:space="preserve"> </w:t>
+        <w:t xml:space="preserve">To gamebar </w:t>
       </w:r>
       <w:r>
         <w:t xml:space="preserve">is </w:t>
@@ -6735,15 +6619,7 @@
         <w:t>re</w:t>
       </w:r>
       <w:r>
-        <w:t xml:space="preserve">draw the </w:t>
-      </w:r>
-      <w:proofErr w:type="spellStart"/>
-      <w:r>
-        <w:t>gamebar</w:t>
-      </w:r>
-      <w:proofErr w:type="spellEnd"/>
-      <w:r>
-        <w:t xml:space="preserve"> and </w:t>
+        <w:t xml:space="preserve">draw the gamebar and </w:t>
       </w:r>
       <w:r>
         <w:t xml:space="preserve">draw </w:t>
@@ -6763,15 +6639,7 @@
     </w:p>
     <w:p>
       <w:r>
-        <w:t xml:space="preserve">I later revisited the </w:t>
-      </w:r>
-      <w:proofErr w:type="spellStart"/>
-      <w:r>
-        <w:t>gamebar</w:t>
-      </w:r>
-      <w:proofErr w:type="spellEnd"/>
-      <w:r>
-        <w:t xml:space="preserve"> adding </w:t>
+        <w:t xml:space="preserve">I later revisited the gamebar adding </w:t>
       </w:r>
       <w:r>
         <w:t xml:space="preserve">code to show the </w:t>
@@ -7227,15 +7095,7 @@
         <w:t>the elevator stops.</w:t>
       </w:r>
       <w:r>
-        <w:t xml:space="preserve">  The </w:t>
-      </w:r>
-      <w:proofErr w:type="spellStart"/>
-      <w:r>
-        <w:t>objectFrameCount</w:t>
-      </w:r>
-      <w:proofErr w:type="spellEnd"/>
-      <w:r>
-        <w:t xml:space="preserve"> is repurposed for this.</w:t>
+        <w:t xml:space="preserve">  The objectFrameCount is repurposed for this.</w:t>
       </w:r>
     </w:p>
     <w:p>
@@ -7247,15 +7107,7 @@
         </w:numPr>
       </w:pPr>
       <w:r>
-        <w:t xml:space="preserve">Mark K9 and the elevator game objects as both ascending or descending by populating their respective </w:t>
-      </w:r>
-      <w:proofErr w:type="spellStart"/>
-      <w:r>
-        <w:t>objectState’s</w:t>
-      </w:r>
-      <w:proofErr w:type="spellEnd"/>
-      <w:r>
-        <w:t xml:space="preserve"> </w:t>
+        <w:t xml:space="preserve">Mark K9 and the elevator game objects as both ascending or descending by populating their respective objectState’s </w:t>
       </w:r>
       <w:r>
         <w:rPr>
@@ -7642,7 +7494,6 @@
       <w:r>
         <w:t xml:space="preserve">stored in </w:t>
       </w:r>
-      <w:proofErr w:type="spellStart"/>
       <w:r>
         <w:rPr>
           <w:i/>
@@ -7651,7 +7502,6 @@
         </w:rPr>
         <w:t>objectFrameCounter</w:t>
       </w:r>
-      <w:proofErr w:type="spellEnd"/>
       <w:r>
         <w:t xml:space="preserve"> variable</w:t>
       </w:r>
@@ -7815,7 +7665,6 @@
       <w:r>
         <w:t xml:space="preserve">checking the erase-above and erase-below </w:t>
       </w:r>
-      <w:proofErr w:type="spellStart"/>
       <w:r>
         <w:rPr>
           <w:i/>
@@ -7830,7 +7679,6 @@
         </w:rPr>
         <w:t>’s</w:t>
       </w:r>
-      <w:proofErr w:type="spellEnd"/>
       <w:r>
         <w:t xml:space="preserve"> render flags</w:t>
       </w:r>
@@ -8431,7 +8279,6 @@
       <w:r>
         <w:t xml:space="preserve">A zero-page </w:t>
       </w:r>
-      <w:proofErr w:type="spellStart"/>
       <w:r>
         <w:rPr>
           <w:i/>
@@ -8439,7 +8286,6 @@
         </w:rPr>
         <w:t>laserFrameCount</w:t>
       </w:r>
-      <w:proofErr w:type="spellEnd"/>
       <w:r>
         <w:t xml:space="preserve"> variable was introduced which controls laser rendering.  </w:t>
       </w:r>
@@ -8467,7 +8313,6 @@
       <w:r>
         <w:t xml:space="preserve">sets </w:t>
       </w:r>
-      <w:proofErr w:type="spellStart"/>
       <w:r>
         <w:rPr>
           <w:i/>
@@ -8475,7 +8320,6 @@
         </w:rPr>
         <w:t>laserFrameCount</w:t>
       </w:r>
-      <w:proofErr w:type="spellEnd"/>
       <w:r>
         <w:rPr>
           <w:i/>
@@ -8492,7 +8336,6 @@
       <w:r>
         <w:t xml:space="preserve">and </w:t>
       </w:r>
-      <w:proofErr w:type="spellStart"/>
       <w:r>
         <w:rPr>
           <w:i/>
@@ -8500,7 +8343,6 @@
         </w:rPr>
         <w:t>laserFrameCount</w:t>
       </w:r>
-      <w:proofErr w:type="spellEnd"/>
       <w:r>
         <w:rPr>
           <w:i/>
@@ -8551,7 +8393,6 @@
       <w:r>
         <w:t xml:space="preserve">the </w:t>
       </w:r>
-      <w:proofErr w:type="spellStart"/>
       <w:r>
         <w:rPr>
           <w:i/>
@@ -8559,7 +8400,6 @@
         </w:rPr>
         <w:t>objectState</w:t>
       </w:r>
-      <w:proofErr w:type="spellEnd"/>
       <w:r>
         <w:t xml:space="preserve"> variable</w:t>
       </w:r>
@@ -8664,7 +8504,6 @@
       <w:r>
         <w:t xml:space="preserve"> above. This is the fourth render flag in the high nibble of the </w:t>
       </w:r>
-      <w:proofErr w:type="spellStart"/>
       <w:r>
         <w:rPr>
           <w:i/>
@@ -8672,7 +8511,6 @@
         </w:rPr>
         <w:t>objectState</w:t>
       </w:r>
-      <w:proofErr w:type="spellEnd"/>
       <w:r>
         <w:t xml:space="preserve"> variable.</w:t>
       </w:r>
@@ -8795,7 +8633,6 @@
       <w:r>
         <w:t xml:space="preserve"> </w:t>
       </w:r>
-      <w:proofErr w:type="spellStart"/>
       <w:r>
         <w:rPr>
           <w:i/>
@@ -8803,7 +8640,6 @@
         </w:rPr>
         <w:t>debugTileGridFlags</w:t>
       </w:r>
-      <w:proofErr w:type="spellEnd"/>
       <w:r>
         <w:t xml:space="preserve"> routine that rendered a little box </w:t>
       </w:r>
@@ -8861,15 +8697,7 @@
         <w:t xml:space="preserve">  T</w:t>
       </w:r>
       <w:r>
-        <w:t xml:space="preserve">he </w:t>
-      </w:r>
-      <w:proofErr w:type="spellStart"/>
-      <w:r>
-        <w:t>gamebar</w:t>
-      </w:r>
-      <w:proofErr w:type="spellEnd"/>
-      <w:r>
-        <w:t xml:space="preserve"> </w:t>
+        <w:t xml:space="preserve">he gamebar </w:t>
       </w:r>
       <w:r>
         <w:t xml:space="preserve">is not shown then the </w:t>
@@ -8895,7 +8723,6 @@
       <w:r>
         <w:t xml:space="preserve">to allow </w:t>
       </w:r>
-      <w:proofErr w:type="spellStart"/>
       <w:r>
         <w:rPr>
           <w:i/>
@@ -8903,7 +8730,6 @@
         </w:rPr>
         <w:t>debugTileGridFlags</w:t>
       </w:r>
-      <w:proofErr w:type="spellEnd"/>
       <w:r>
         <w:rPr>
           <w:i/>
@@ -10183,7 +10009,6 @@
       <w:r>
         <w:t xml:space="preserve">replaced </w:t>
       </w:r>
-      <w:proofErr w:type="spellStart"/>
       <w:r>
         <w:rPr>
           <w:i/>
@@ -10191,11 +10016,9 @@
         </w:rPr>
         <w:t>objectWidth</w:t>
       </w:r>
-      <w:proofErr w:type="spellEnd"/>
       <w:r>
         <w:t xml:space="preserve"> and </w:t>
       </w:r>
-      <w:proofErr w:type="spellStart"/>
       <w:r>
         <w:rPr>
           <w:i/>
@@ -10203,7 +10026,6 @@
         </w:rPr>
         <w:t>objectHeight</w:t>
       </w:r>
-      <w:proofErr w:type="spellEnd"/>
       <w:r>
         <w:t xml:space="preserve"> game object arrays with a function</w:t>
       </w:r>
@@ -10239,7 +10061,6 @@
       <w:r>
         <w:t xml:space="preserve">, and </w:t>
       </w:r>
-      <w:proofErr w:type="spellStart"/>
       <w:r>
         <w:rPr>
           <w:i/>
@@ -10247,11 +10068,9 @@
         </w:rPr>
         <w:t>widthMinusOne</w:t>
       </w:r>
-      <w:proofErr w:type="spellEnd"/>
       <w:r>
         <w:t xml:space="preserve"> and </w:t>
       </w:r>
-      <w:proofErr w:type="spellStart"/>
       <w:r>
         <w:rPr>
           <w:i/>
@@ -10259,7 +10078,6 @@
         </w:rPr>
         <w:t>heightMinisOne</w:t>
       </w:r>
-      <w:proofErr w:type="spellEnd"/>
       <w:r>
         <w:t>.</w:t>
       </w:r>
@@ -10308,15 +10126,7 @@
         <w:t xml:space="preserve"> I </w:t>
       </w:r>
       <w:r>
-        <w:t xml:space="preserve">stored the object type in the </w:t>
-      </w:r>
-      <w:proofErr w:type="spellStart"/>
-      <w:r>
-        <w:t>objectAnimation</w:t>
-      </w:r>
-      <w:proofErr w:type="spellEnd"/>
-      <w:r>
-        <w:t xml:space="preserve"> game object array, </w:t>
+        <w:t xml:space="preserve">stored the object type in the objectAnimation game object array, </w:t>
       </w:r>
       <w:r>
         <w:t xml:space="preserve">shifting up the other values, and </w:t>
@@ -10334,13 +10144,8 @@
         <w:t xml:space="preserve">array </w:t>
       </w:r>
       <w:r>
-        <w:t xml:space="preserve">to </w:t>
-      </w:r>
-      <w:proofErr w:type="spellStart"/>
-      <w:r>
-        <w:t>objectType</w:t>
-      </w:r>
-      <w:proofErr w:type="spellEnd"/>
+        <w:t>to objectType</w:t>
+      </w:r>
       <w:r>
         <w:t>.</w:t>
       </w:r>
@@ -10929,7 +10734,6 @@
       <w:r>
         <w:t xml:space="preserve">I then wrote a </w:t>
       </w:r>
-      <w:proofErr w:type="spellStart"/>
       <w:r>
         <w:rPr>
           <w:i/>
@@ -10937,7 +10741,6 @@
         </w:rPr>
         <w:t>loadLevel</w:t>
       </w:r>
-      <w:proofErr w:type="spellEnd"/>
       <w:r>
         <w:t xml:space="preserve"> </w:t>
       </w:r>
@@ -10968,7 +10771,6 @@
       <w:r>
         <w:t xml:space="preserve">the loaded </w:t>
       </w:r>
-      <w:proofErr w:type="spellStart"/>
       <w:r>
         <w:rPr>
           <w:i/>
@@ -10976,7 +10778,6 @@
         </w:rPr>
         <w:t>initializeLevel</w:t>
       </w:r>
-      <w:proofErr w:type="spellEnd"/>
       <w:r>
         <w:t xml:space="preserve"> </w:t>
       </w:r>
@@ -10989,7 +10790,6 @@
       <w:r>
         <w:t xml:space="preserve">  A </w:t>
       </w:r>
-      <w:proofErr w:type="spellStart"/>
       <w:r>
         <w:rPr>
           <w:i/>
@@ -10997,7 +10797,6 @@
         </w:rPr>
         <w:t>showLevel</w:t>
       </w:r>
-      <w:proofErr w:type="spellEnd"/>
       <w:r>
         <w:t xml:space="preserve"> routine </w:t>
       </w:r>
@@ -11186,7 +10985,6 @@
       <w:r>
         <w:t xml:space="preserve"> a level, and a ‘R’ key handler was implemented to call the </w:t>
       </w:r>
-      <w:proofErr w:type="spellStart"/>
       <w:r>
         <w:rPr>
           <w:i/>
@@ -11194,14 +10992,12 @@
         </w:rPr>
         <w:t>loadLevel</w:t>
       </w:r>
-      <w:proofErr w:type="spellEnd"/>
       <w:r>
         <w:t xml:space="preserve"> </w:t>
       </w:r>
       <w:r>
         <w:t xml:space="preserve">routine indirectly through a </w:t>
       </w:r>
-      <w:proofErr w:type="spellStart"/>
       <w:r>
         <w:rPr>
           <w:i/>
@@ -11209,7 +11005,6 @@
         </w:rPr>
         <w:t>reloadLevel</w:t>
       </w:r>
-      <w:proofErr w:type="spellEnd"/>
       <w:r>
         <w:t xml:space="preserve"> routine.</w:t>
       </w:r>
@@ -11736,7 +11531,6 @@
       <w:r>
         <w:t xml:space="preserve"> action became </w:t>
       </w:r>
-      <w:proofErr w:type="spellStart"/>
       <w:r>
         <w:rPr>
           <w:b/>
@@ -11746,11 +11540,9 @@
         </w:rPr>
         <w:t>PursueLeft</w:t>
       </w:r>
-      <w:proofErr w:type="spellEnd"/>
       <w:r>
         <w:t xml:space="preserve">, </w:t>
       </w:r>
-      <w:proofErr w:type="spellStart"/>
       <w:r>
         <w:rPr>
           <w:b/>
@@ -11760,11 +11552,9 @@
         </w:rPr>
         <w:t>PursueRight</w:t>
       </w:r>
-      <w:proofErr w:type="spellEnd"/>
       <w:r>
         <w:t xml:space="preserve">, </w:t>
       </w:r>
-      <w:proofErr w:type="spellStart"/>
       <w:r>
         <w:rPr>
           <w:b/>
@@ -11774,14 +11564,12 @@
         </w:rPr>
         <w:t>PursueUp</w:t>
       </w:r>
-      <w:proofErr w:type="spellEnd"/>
       <w:r>
         <w:t xml:space="preserve">, </w:t>
       </w:r>
       <w:r>
         <w:t xml:space="preserve">or </w:t>
       </w:r>
-      <w:proofErr w:type="spellStart"/>
       <w:r>
         <w:rPr>
           <w:b/>
@@ -11791,7 +11579,6 @@
         </w:rPr>
         <w:t>PursueDown</w:t>
       </w:r>
-      <w:proofErr w:type="spellEnd"/>
       <w:r>
         <w:t>.</w:t>
       </w:r>
@@ -11838,7 +11625,6 @@
         </w:rPr>
         <w:tab/>
       </w:r>
-      <w:proofErr w:type="spellStart"/>
       <w:r>
         <w:rPr>
           <w:b/>
@@ -11855,9 +11641,11 @@
           <w:i/>
           <w:iCs/>
         </w:rPr>
-        <w:t>Left</w:t>
-      </w:r>
-      <w:proofErr w:type="spellEnd"/>
+        <w:t xml:space="preserve">Left </w:t>
+      </w:r>
+      <w:r>
+        <w:t>and</w:t>
+      </w:r>
       <w:r>
         <w:rPr>
           <w:b/>
@@ -11865,10 +11653,7 @@
           <w:i/>
           <w:iCs/>
         </w:rPr>
-        <w:t xml:space="preserve"> </w:t>
-      </w:r>
-      <w:r>
-        <w:t>and</w:t>
+        <w:t xml:space="preserve"> PursueRight</w:t>
       </w:r>
       <w:r>
         <w:rPr>
@@ -11879,7 +11664,57 @@
         </w:rPr>
         <w:t xml:space="preserve"> </w:t>
       </w:r>
-      <w:proofErr w:type="spellStart"/>
+      <w:r>
+        <w:t xml:space="preserve"> – </w:t>
+      </w:r>
+      <w:r>
+        <w:t xml:space="preserve">Daleks </w:t>
+      </w:r>
+      <w:r>
+        <w:t>move quickly left or right</w:t>
+      </w:r>
+      <w:r>
+        <w:t>, or vice versa</w:t>
+      </w:r>
+      <w:r>
+        <w:t xml:space="preserve">. </w:t>
+      </w:r>
+      <w:r>
+        <w:t xml:space="preserve">If </w:t>
+      </w:r>
+      <w:r>
+        <w:t>a Dalek</w:t>
+      </w:r>
+      <w:r>
+        <w:t xml:space="preserve"> encounters a wall, the </w:t>
+      </w:r>
+      <w:r>
+        <w:t xml:space="preserve">Dalek </w:t>
+      </w:r>
+      <w:r>
+        <w:t>turns</w:t>
+      </w:r>
+      <w:r>
+        <w:t>,</w:t>
+      </w:r>
+      <w:r>
+        <w:t xml:space="preserve"> and the </w:t>
+      </w:r>
+      <w:r>
+        <w:t xml:space="preserve">action </w:t>
+      </w:r>
+      <w:r>
+        <w:t xml:space="preserve">is </w:t>
+      </w:r>
+      <w:r>
+        <w:t>change</w:t>
+      </w:r>
+      <w:r>
+        <w:t xml:space="preserve">d </w:t>
+      </w:r>
+      <w:r>
+        <w:t xml:space="preserve">to </w:t>
+      </w:r>
       <w:r>
         <w:rPr>
           <w:b/>
@@ -11887,9 +11722,11 @@
           <w:i/>
           <w:iCs/>
         </w:rPr>
-        <w:t>PursueRight</w:t>
-      </w:r>
-      <w:proofErr w:type="spellEnd"/>
+        <w:t>PursueUp</w:t>
+      </w:r>
+      <w:r>
+        <w:t xml:space="preserve"> or </w:t>
+      </w:r>
       <w:r>
         <w:rPr>
           <w:b/>
@@ -11897,60 +11734,16 @@
           <w:i/>
           <w:iCs/>
         </w:rPr>
-        <w:t xml:space="preserve"> </w:t>
-      </w:r>
-      <w:r>
-        <w:t xml:space="preserve"> – </w:t>
-      </w:r>
-      <w:r>
-        <w:t xml:space="preserve">Daleks </w:t>
-      </w:r>
-      <w:r>
-        <w:t>move quickly left or right</w:t>
-      </w:r>
-      <w:r>
-        <w:t>, or vice versa</w:t>
-      </w:r>
-      <w:r>
-        <w:t xml:space="preserve">. </w:t>
-      </w:r>
-      <w:r>
-        <w:t xml:space="preserve">If </w:t>
-      </w:r>
-      <w:r>
-        <w:t>a Dalek</w:t>
-      </w:r>
-      <w:r>
-        <w:t xml:space="preserve"> encounters a wall, the </w:t>
-      </w:r>
-      <w:r>
-        <w:t xml:space="preserve">Dalek </w:t>
-      </w:r>
-      <w:r>
-        <w:t>turns</w:t>
-      </w:r>
-      <w:r>
-        <w:t>,</w:t>
-      </w:r>
-      <w:r>
-        <w:t xml:space="preserve"> and the </w:t>
-      </w:r>
-      <w:r>
-        <w:t xml:space="preserve">action </w:t>
-      </w:r>
-      <w:r>
-        <w:t xml:space="preserve">is </w:t>
-      </w:r>
-      <w:r>
-        <w:t>change</w:t>
-      </w:r>
-      <w:r>
-        <w:t xml:space="preserve">d </w:t>
-      </w:r>
-      <w:r>
-        <w:t xml:space="preserve">to </w:t>
-      </w:r>
-      <w:proofErr w:type="spellStart"/>
+        <w:t>PursueDown</w:t>
+      </w:r>
+      <w:r>
+        <w:t>.</w:t>
+      </w:r>
+    </w:p>
+    <w:p>
+      <w:pPr>
+        <w:ind w:left="720"/>
+      </w:pPr>
       <w:r>
         <w:rPr>
           <w:b/>
@@ -11958,13 +11751,8 @@
           <w:i/>
           <w:iCs/>
         </w:rPr>
-        <w:t>PursueUp</w:t>
-      </w:r>
-      <w:proofErr w:type="spellEnd"/>
-      <w:r>
-        <w:t xml:space="preserve"> or </w:t>
-      </w:r>
-      <w:proofErr w:type="spellStart"/>
+        <w:t>Pursue</w:t>
+      </w:r>
       <w:r>
         <w:rPr>
           <w:b/>
@@ -11972,18 +11760,11 @@
           <w:i/>
           <w:iCs/>
         </w:rPr>
-        <w:t>PursueDown</w:t>
-      </w:r>
-      <w:proofErr w:type="spellEnd"/>
-      <w:r>
-        <w:t>.</w:t>
-      </w:r>
-    </w:p>
-    <w:p>
-      <w:pPr>
-        <w:ind w:left="720"/>
-      </w:pPr>
-      <w:proofErr w:type="spellStart"/>
+        <w:t xml:space="preserve">Up </w:t>
+      </w:r>
+      <w:r>
+        <w:t>and</w:t>
+      </w:r>
       <w:r>
         <w:rPr>
           <w:b/>
@@ -11991,7 +11772,34 @@
           <w:i/>
           <w:iCs/>
         </w:rPr>
-        <w:t>Pursue</w:t>
+        <w:t xml:space="preserve"> PursueDown </w:t>
+      </w:r>
+      <w:r>
+        <w:t xml:space="preserve"> – Daleks </w:t>
+      </w:r>
+      <w:r>
+        <w:t>move quickly left or right</w:t>
+      </w:r>
+      <w:r>
+        <w:t xml:space="preserve">, or vice versa, looking for an elevator to ride up or down. </w:t>
+      </w:r>
+      <w:r>
+        <w:t xml:space="preserve">If a Dalek encounters a wall, </w:t>
+      </w:r>
+      <w:r>
+        <w:t xml:space="preserve">the Dalek </w:t>
+      </w:r>
+      <w:r>
+        <w:t>turns,</w:t>
+      </w:r>
+      <w:r>
+        <w:t xml:space="preserve"> and the </w:t>
+      </w:r>
+      <w:r>
+        <w:t xml:space="preserve">action </w:t>
+      </w:r>
+      <w:r>
+        <w:t xml:space="preserve">is toggled between </w:t>
       </w:r>
       <w:r>
         <w:rPr>
@@ -12000,9 +11808,17 @@
           <w:i/>
           <w:iCs/>
         </w:rPr>
-        <w:t>Up</w:t>
-      </w:r>
-      <w:proofErr w:type="spellEnd"/>
+        <w:t>PursueUp</w:t>
+      </w:r>
+      <w:r>
+        <w:t xml:space="preserve"> </w:t>
+      </w:r>
+      <w:r>
+        <w:t>and</w:t>
+      </w:r>
+      <w:r>
+        <w:t xml:space="preserve"> </w:t>
+      </w:r>
       <w:r>
         <w:rPr>
           <w:b/>
@@ -12010,98 +11826,8 @@
           <w:i/>
           <w:iCs/>
         </w:rPr>
-        <w:t xml:space="preserve"> </w:t>
-      </w:r>
-      <w:r>
-        <w:t>and</w:t>
-      </w:r>
-      <w:r>
-        <w:rPr>
-          <w:b/>
-          <w:bCs/>
-          <w:i/>
-          <w:iCs/>
-        </w:rPr>
-        <w:t xml:space="preserve"> </w:t>
-      </w:r>
-      <w:proofErr w:type="spellStart"/>
-      <w:r>
-        <w:rPr>
-          <w:b/>
-          <w:bCs/>
-          <w:i/>
-          <w:iCs/>
-        </w:rPr>
         <w:t>PursueDown</w:t>
       </w:r>
-      <w:proofErr w:type="spellEnd"/>
-      <w:r>
-        <w:rPr>
-          <w:b/>
-          <w:bCs/>
-          <w:i/>
-          <w:iCs/>
-        </w:rPr>
-        <w:t xml:space="preserve"> </w:t>
-      </w:r>
-      <w:r>
-        <w:t xml:space="preserve"> – Daleks </w:t>
-      </w:r>
-      <w:r>
-        <w:t>move quickly left or right</w:t>
-      </w:r>
-      <w:r>
-        <w:t xml:space="preserve">, or vice versa, looking for an elevator to ride up or down. </w:t>
-      </w:r>
-      <w:r>
-        <w:t xml:space="preserve">If a Dalek encounters a wall, </w:t>
-      </w:r>
-      <w:r>
-        <w:t xml:space="preserve">the Dalek </w:t>
-      </w:r>
-      <w:r>
-        <w:t>turns,</w:t>
-      </w:r>
-      <w:r>
-        <w:t xml:space="preserve"> and the </w:t>
-      </w:r>
-      <w:r>
-        <w:t xml:space="preserve">action </w:t>
-      </w:r>
-      <w:r>
-        <w:t xml:space="preserve">is toggled between </w:t>
-      </w:r>
-      <w:proofErr w:type="spellStart"/>
-      <w:r>
-        <w:rPr>
-          <w:b/>
-          <w:bCs/>
-          <w:i/>
-          <w:iCs/>
-        </w:rPr>
-        <w:t>PursueUp</w:t>
-      </w:r>
-      <w:proofErr w:type="spellEnd"/>
-      <w:r>
-        <w:t xml:space="preserve"> </w:t>
-      </w:r>
-      <w:r>
-        <w:t>and</w:t>
-      </w:r>
-      <w:r>
-        <w:t xml:space="preserve"> </w:t>
-      </w:r>
-      <w:proofErr w:type="spellStart"/>
-      <w:r>
-        <w:rPr>
-          <w:b/>
-          <w:bCs/>
-          <w:i/>
-          <w:iCs/>
-        </w:rPr>
-        <w:t>PursueDown</w:t>
-      </w:r>
-      <w:proofErr w:type="spellEnd"/>
       <w:r>
         <w:rPr>
           <w:b/>
@@ -12231,7 +11957,6 @@
       <w:r>
         <w:t xml:space="preserve">set to </w:t>
       </w:r>
-      <w:proofErr w:type="spellStart"/>
       <w:r>
         <w:rPr>
           <w:b/>
@@ -12241,11 +11966,9 @@
         </w:rPr>
         <w:t>pursueLeft</w:t>
       </w:r>
-      <w:proofErr w:type="spellEnd"/>
       <w:r>
         <w:t xml:space="preserve"> or </w:t>
       </w:r>
-      <w:proofErr w:type="spellStart"/>
       <w:r>
         <w:rPr>
           <w:b/>
@@ -12264,7 +11987,6 @@
         </w:rPr>
         <w:t>ueRight</w:t>
       </w:r>
-      <w:proofErr w:type="spellEnd"/>
       <w:r>
         <w:t>.</w:t>
       </w:r>
@@ -12274,7 +11996,6 @@
       <w:r>
         <w:t xml:space="preserve">action is set to </w:t>
       </w:r>
-      <w:proofErr w:type="spellStart"/>
       <w:r>
         <w:rPr>
           <w:b/>
@@ -12293,11 +12014,9 @@
         </w:rPr>
         <w:t>Up</w:t>
       </w:r>
-      <w:proofErr w:type="spellEnd"/>
       <w:r>
         <w:t xml:space="preserve"> or </w:t>
       </w:r>
-      <w:proofErr w:type="spellStart"/>
       <w:r>
         <w:rPr>
           <w:b/>
@@ -12316,7 +12035,6 @@
         </w:rPr>
         <w:t>Down</w:t>
       </w:r>
-      <w:proofErr w:type="spellEnd"/>
       <w:r>
         <w:t>.</w:t>
       </w:r>
@@ -12613,7 +12331,6 @@
       <w:r>
         <w:t xml:space="preserve">, </w:t>
       </w:r>
-      <w:proofErr w:type="spellStart"/>
       <w:r>
         <w:rPr>
           <w:b/>
@@ -12623,7 +12340,6 @@
         </w:rPr>
         <w:t>pursueLeft</w:t>
       </w:r>
-      <w:proofErr w:type="spellEnd"/>
       <w:r>
         <w:rPr>
           <w:b/>
@@ -12645,7 +12361,6 @@
         </w:rPr>
         <w:t xml:space="preserve"> </w:t>
       </w:r>
-      <w:proofErr w:type="spellStart"/>
       <w:r>
         <w:rPr>
           <w:b/>
@@ -12662,9 +12377,11 @@
           <w:i/>
           <w:iCs/>
         </w:rPr>
-        <w:t>Right</w:t>
-      </w:r>
-      <w:proofErr w:type="spellEnd"/>
+        <w:t xml:space="preserve">Right </w:t>
+      </w:r>
+      <w:r>
+        <w:t>related</w:t>
+      </w:r>
       <w:r>
         <w:rPr>
           <w:b/>
@@ -12675,7 +12392,102 @@
         <w:t xml:space="preserve"> </w:t>
       </w:r>
       <w:r>
-        <w:t>related</w:t>
+        <w:t>rules</w:t>
+      </w:r>
+      <w:r>
+        <w:t>.</w:t>
+      </w:r>
+    </w:p>
+    <w:p>
+      <w:r>
+        <w:t xml:space="preserve">I </w:t>
+      </w:r>
+      <w:r>
+        <w:t xml:space="preserve">implemented </w:t>
+      </w:r>
+      <w:r>
+        <w:t xml:space="preserve">a </w:t>
+      </w:r>
+      <w:r>
+        <w:rPr>
+          <w:i/>
+          <w:iCs/>
+        </w:rPr>
+        <w:t>dalekAI</w:t>
+      </w:r>
+      <w:r>
+        <w:t xml:space="preserve"> function that </w:t>
+      </w:r>
+      <w:r>
+        <w:t xml:space="preserve">encapsulated the </w:t>
+      </w:r>
+      <w:r>
+        <w:t xml:space="preserve">common </w:t>
+      </w:r>
+      <w:r>
+        <w:t>behavioral rules</w:t>
+      </w:r>
+      <w:r>
+        <w:t xml:space="preserve">, </w:t>
+      </w:r>
+      <w:r>
+        <w:t xml:space="preserve">running these against </w:t>
+      </w:r>
+      <w:r>
+        <w:t xml:space="preserve">each </w:t>
+      </w:r>
+      <w:r>
+        <w:t>Dalek every 16 frames.</w:t>
+      </w:r>
+      <w:r>
+        <w:t xml:space="preserve">  </w:t>
+      </w:r>
+      <w:r>
+        <w:t xml:space="preserve">It’s invoked from the game loop. </w:t>
+      </w:r>
+    </w:p>
+    <w:p>
+      <w:r>
+        <w:t xml:space="preserve">The </w:t>
+      </w:r>
+      <w:r>
+        <w:t xml:space="preserve">routine checks </w:t>
+      </w:r>
+      <w:r>
+        <w:t xml:space="preserve">to see if K9 </w:t>
+      </w:r>
+      <w:r>
+        <w:t xml:space="preserve">is </w:t>
+      </w:r>
+      <w:r>
+        <w:t>in sight</w:t>
+      </w:r>
+      <w:r>
+        <w:t xml:space="preserve"> (using a helper routine)</w:t>
+      </w:r>
+      <w:r>
+        <w:t>,</w:t>
+      </w:r>
+      <w:r>
+        <w:t xml:space="preserve"> promot</w:t>
+      </w:r>
+      <w:r>
+        <w:t>ing</w:t>
+      </w:r>
+      <w:r>
+        <w:t xml:space="preserve"> </w:t>
+      </w:r>
+      <w:r>
+        <w:t xml:space="preserve">the  </w:t>
+      </w:r>
+      <w:r>
+        <w:t>Dalek’s</w:t>
+      </w:r>
+      <w:r>
+        <w:t xml:space="preserve"> </w:t>
+      </w:r>
+      <w:r>
+        <w:t xml:space="preserve">action to </w:t>
       </w:r>
       <w:r>
         <w:rPr>
@@ -12684,109 +12496,8 @@
           <w:i/>
           <w:iCs/>
         </w:rPr>
-        <w:t xml:space="preserve"> </w:t>
-      </w:r>
-      <w:r>
-        <w:t>rules</w:t>
-      </w:r>
-      <w:r>
-        <w:t>.</w:t>
-      </w:r>
-    </w:p>
-    <w:p>
-      <w:r>
-        <w:t xml:space="preserve">I </w:t>
-      </w:r>
-      <w:r>
-        <w:t xml:space="preserve">implemented </w:t>
-      </w:r>
-      <w:r>
-        <w:t xml:space="preserve">a </w:t>
-      </w:r>
-      <w:proofErr w:type="spellStart"/>
-      <w:r>
-        <w:rPr>
-          <w:i/>
-          <w:iCs/>
-        </w:rPr>
-        <w:t>dalekAI</w:t>
-      </w:r>
-      <w:proofErr w:type="spellEnd"/>
-      <w:r>
-        <w:t xml:space="preserve"> function that </w:t>
-      </w:r>
-      <w:r>
-        <w:t xml:space="preserve">encapsulated the </w:t>
-      </w:r>
-      <w:r>
-        <w:t xml:space="preserve">common </w:t>
-      </w:r>
-      <w:r>
-        <w:t>behavioral rules</w:t>
-      </w:r>
-      <w:r>
-        <w:t xml:space="preserve">, </w:t>
-      </w:r>
-      <w:r>
-        <w:t xml:space="preserve">running these against </w:t>
-      </w:r>
-      <w:r>
-        <w:t xml:space="preserve">each </w:t>
-      </w:r>
-      <w:r>
-        <w:t>Dalek every 16 frames.</w:t>
-      </w:r>
-      <w:r>
-        <w:t xml:space="preserve">  </w:t>
-      </w:r>
-      <w:r>
-        <w:t xml:space="preserve">It’s invoked from the game loop. </w:t>
-      </w:r>
-    </w:p>
-    <w:p>
-      <w:r>
-        <w:t xml:space="preserve">The </w:t>
-      </w:r>
-      <w:r>
-        <w:t xml:space="preserve">routine checks </w:t>
-      </w:r>
-      <w:r>
-        <w:t xml:space="preserve">to see if K9 </w:t>
-      </w:r>
-      <w:r>
-        <w:t xml:space="preserve">is </w:t>
-      </w:r>
-      <w:r>
-        <w:t>in sight</w:t>
-      </w:r>
-      <w:r>
-        <w:t xml:space="preserve"> (using a helper routine)</w:t>
-      </w:r>
-      <w:r>
-        <w:t>,</w:t>
-      </w:r>
-      <w:r>
-        <w:t xml:space="preserve"> promot</w:t>
-      </w:r>
-      <w:r>
-        <w:t>ing</w:t>
-      </w:r>
-      <w:r>
-        <w:t xml:space="preserve"> </w:t>
-      </w:r>
-      <w:r>
-        <w:t xml:space="preserve">the  </w:t>
-      </w:r>
-      <w:r>
-        <w:t>Dalek’s</w:t>
-      </w:r>
-      <w:r>
-        <w:t xml:space="preserve"> </w:t>
-      </w:r>
-      <w:r>
-        <w:t xml:space="preserve">action to </w:t>
-      </w:r>
-      <w:proofErr w:type="spellStart"/>
+        <w:t>PursueLeft</w:t>
+      </w:r>
       <w:r>
         <w:rPr>
           <w:b/>
@@ -12794,9 +12505,11 @@
           <w:i/>
           <w:iCs/>
         </w:rPr>
-        <w:t>PursueLeft</w:t>
-      </w:r>
-      <w:proofErr w:type="spellEnd"/>
+        <w:t xml:space="preserve"> </w:t>
+      </w:r>
+      <w:r>
+        <w:t>or</w:t>
+      </w:r>
       <w:r>
         <w:rPr>
           <w:b/>
@@ -12804,10 +12517,208 @@
           <w:i/>
           <w:iCs/>
         </w:rPr>
+        <w:t xml:space="preserve"> PursueRight</w:t>
+      </w:r>
+      <w:r>
+        <w:t xml:space="preserve"> if so.</w:t>
+      </w:r>
+      <w:r>
+        <w:t xml:space="preserve"> The function also </w:t>
+      </w:r>
+      <w:r>
+        <w:t>checks to see if K9 is within weapon’s range</w:t>
+      </w:r>
+      <w:r>
+        <w:t>, firing its weapon if it is.</w:t>
+      </w:r>
+    </w:p>
+    <w:p>
+      <w:r>
+        <w:t xml:space="preserve">I then updated </w:t>
+      </w:r>
+      <w:r>
+        <w:t xml:space="preserve">the </w:t>
+      </w:r>
+      <w:r>
+        <w:rPr>
+          <w:i/>
+          <w:iCs/>
+        </w:rPr>
+        <w:t>dalekAnimate</w:t>
+      </w:r>
+      <w:r>
+        <w:t xml:space="preserve"> and all the </w:t>
+      </w:r>
+      <w:r>
+        <w:t xml:space="preserve">Dalek </w:t>
+      </w:r>
+      <w:r>
+        <w:t xml:space="preserve">frame callback functions </w:t>
+      </w:r>
+      <w:r>
+        <w:t xml:space="preserve">to </w:t>
+      </w:r>
+      <w:r>
+        <w:t xml:space="preserve">amend their </w:t>
+      </w:r>
+      <w:r>
+        <w:t>behaviors</w:t>
+      </w:r>
+      <w:r>
+        <w:t xml:space="preserve"> based on </w:t>
+      </w:r>
+      <w:r>
+        <w:t xml:space="preserve">the </w:t>
+      </w:r>
+      <w:r>
+        <w:t>current action.</w:t>
+      </w:r>
+      <w:r>
+        <w:t xml:space="preserve">  The challenge was keeping the impact (increased code-size) to a </w:t>
+      </w:r>
+      <w:r>
+        <w:t>minimum</w:t>
+      </w:r>
+      <w:r>
+        <w:t>.</w:t>
+      </w:r>
+      <w:r>
+        <w:t xml:space="preserve"> A lot of time was spent refactoring these functio</w:t>
+      </w:r>
+      <w:r>
+        <w:t>ns to use as few code bytes as possible.</w:t>
+      </w:r>
+    </w:p>
+    <w:p>
+      <w:r>
+        <w:t>On</w:t>
+      </w:r>
+      <w:r>
+        <w:t>e</w:t>
+      </w:r>
+      <w:r>
+        <w:t xml:space="preserve"> notable challenge was how best to </w:t>
+      </w:r>
+      <w:r>
+        <w:t xml:space="preserve">show </w:t>
+      </w:r>
+      <w:r>
+        <w:t>damage being inflicted on K9.</w:t>
+      </w:r>
+      <w:r>
+        <w:t xml:space="preserve">  After brainstorming many ideas, I ended up implementing a simple </w:t>
+      </w:r>
+      <w:r>
+        <w:t>first-person</w:t>
+      </w:r>
+      <w:r>
         <w:t xml:space="preserve"> </w:t>
       </w:r>
       <w:r>
-        <w:t>or</w:t>
+        <w:t xml:space="preserve">effect where </w:t>
+      </w:r>
+      <w:r>
+        <w:t xml:space="preserve">the </w:t>
+      </w:r>
+      <w:r>
+        <w:t xml:space="preserve">screen </w:t>
+      </w:r>
+      <w:r>
+        <w:t xml:space="preserve">is flashed </w:t>
+      </w:r>
+      <w:r>
+        <w:t>black</w:t>
+      </w:r>
+      <w:r>
+        <w:t>,</w:t>
+      </w:r>
+      <w:r>
+        <w:t xml:space="preserve"> </w:t>
+      </w:r>
+      <w:r>
+        <w:t>at a</w:t>
+      </w:r>
+      <w:r>
+        <w:t xml:space="preserve"> low frequence</w:t>
+      </w:r>
+      <w:r>
+        <w:t>,</w:t>
+      </w:r>
+      <w:r>
+        <w:t xml:space="preserve"> </w:t>
+      </w:r>
+      <w:r>
+        <w:t>and a</w:t>
+      </w:r>
+      <w:r>
+        <w:t>n obnoxious sound</w:t>
+      </w:r>
+      <w:r>
+        <w:t xml:space="preserve"> is </w:t>
+      </w:r>
+      <w:r>
+        <w:t>played</w:t>
+      </w:r>
+      <w:r>
+        <w:t>.</w:t>
+      </w:r>
+      <w:r>
+        <w:t xml:space="preserve">  The effect is quite </w:t>
+      </w:r>
+      <w:r>
+        <w:t>e</w:t>
+      </w:r>
+      <w:r>
+        <w:t>ffective</w:t>
+      </w:r>
+      <w:r>
+        <w:t>!</w:t>
+      </w:r>
+    </w:p>
+    <w:p>
+      <w:r>
+        <w:t xml:space="preserve">I also added a Mode 7 </w:t>
+      </w:r>
+      <w:r>
+        <w:t xml:space="preserve">incomplete level </w:t>
+      </w:r>
+      <w:r>
+        <w:t xml:space="preserve">screen, which </w:t>
+      </w:r>
+      <w:r>
+        <w:t>shows</w:t>
+      </w:r>
+      <w:r>
+        <w:t xml:space="preserve"> </w:t>
+      </w:r>
+      <w:r>
+        <w:t xml:space="preserve">if </w:t>
+      </w:r>
+      <w:r>
+        <w:t>K</w:t>
+      </w:r>
+      <w:r>
+        <w:t xml:space="preserve">9’s health </w:t>
+      </w:r>
+      <w:r>
+        <w:t xml:space="preserve">becomes </w:t>
+      </w:r>
+      <w:r>
+        <w:t>zero</w:t>
+      </w:r>
+      <w:r>
+        <w:t>.  Pressing space restarts the level.</w:t>
+      </w:r>
+    </w:p>
+    <w:p>
+      <w:r>
+        <w:t xml:space="preserve">I then turned to </w:t>
+      </w:r>
+      <w:r>
+        <w:t>implementing</w:t>
+      </w:r>
+      <w:r>
+        <w:t xml:space="preserve"> the </w:t>
       </w:r>
       <w:r>
         <w:rPr>
@@ -12816,9 +12727,11 @@
           <w:i/>
           <w:iCs/>
         </w:rPr>
-        <w:t xml:space="preserve"> </w:t>
-      </w:r>
-      <w:proofErr w:type="spellStart"/>
+        <w:t>PursueUp</w:t>
+      </w:r>
+      <w:r>
+        <w:t xml:space="preserve"> and </w:t>
+      </w:r>
       <w:r>
         <w:rPr>
           <w:b/>
@@ -12826,249 +12739,20 @@
           <w:i/>
           <w:iCs/>
         </w:rPr>
-        <w:t>PursueRight</w:t>
-      </w:r>
-      <w:proofErr w:type="spellEnd"/>
-      <w:r>
-        <w:t xml:space="preserve"> if so.</w:t>
-      </w:r>
-      <w:r>
-        <w:t xml:space="preserve"> The function also </w:t>
-      </w:r>
-      <w:r>
-        <w:t>checks to see if K9 is within weapon’s range</w:t>
-      </w:r>
-      <w:r>
-        <w:t>, firing its weapon if it is.</w:t>
-      </w:r>
-    </w:p>
-    <w:p>
-      <w:r>
-        <w:t xml:space="preserve">I then updated </w:t>
-      </w:r>
-      <w:r>
-        <w:t xml:space="preserve">the </w:t>
-      </w:r>
-      <w:proofErr w:type="spellStart"/>
-      <w:r>
-        <w:rPr>
-          <w:i/>
-          <w:iCs/>
-        </w:rPr>
-        <w:t>dalekAnimate</w:t>
-      </w:r>
-      <w:proofErr w:type="spellEnd"/>
-      <w:r>
-        <w:t xml:space="preserve"> and all the </w:t>
-      </w:r>
-      <w:r>
-        <w:t xml:space="preserve">Dalek </w:t>
-      </w:r>
-      <w:r>
-        <w:t xml:space="preserve">frame callback functions </w:t>
-      </w:r>
-      <w:r>
-        <w:t xml:space="preserve">to </w:t>
-      </w:r>
-      <w:r>
-        <w:t xml:space="preserve">amend their </w:t>
-      </w:r>
-      <w:r>
-        <w:t>behaviors</w:t>
-      </w:r>
-      <w:r>
-        <w:t xml:space="preserve"> based on </w:t>
-      </w:r>
-      <w:r>
-        <w:t xml:space="preserve">the </w:t>
-      </w:r>
-      <w:r>
-        <w:t>current action.</w:t>
-      </w:r>
-      <w:r>
-        <w:t xml:space="preserve">  The challenge was keeping the impact (increased code-size) to a </w:t>
-      </w:r>
-      <w:r>
-        <w:t>minimum</w:t>
+        <w:t>PursueDown</w:t>
+      </w:r>
+      <w:r>
+        <w:t xml:space="preserve"> behavior</w:t>
+      </w:r>
+      <w:r>
+        <w:t>al rule</w:t>
+      </w:r>
+      <w:r>
+        <w:t>s</w:t>
       </w:r>
       <w:r>
         <w:t>.</w:t>
       </w:r>
-      <w:r>
-        <w:t xml:space="preserve"> A lot of time was spent refactoring these functio</w:t>
-      </w:r>
-      <w:r>
-        <w:t>ns to use as few code bytes as possible.</w:t>
-      </w:r>
-    </w:p>
-    <w:p>
-      <w:r>
-        <w:t>On</w:t>
-      </w:r>
-      <w:r>
-        <w:t>e</w:t>
-      </w:r>
-      <w:r>
-        <w:t xml:space="preserve"> notable challenge was how best to </w:t>
-      </w:r>
-      <w:r>
-        <w:t xml:space="preserve">show </w:t>
-      </w:r>
-      <w:r>
-        <w:t>damage being inflicted on K9.</w:t>
-      </w:r>
-      <w:r>
-        <w:t xml:space="preserve">  After brainstorming many ideas, I ended up implementing a simple </w:t>
-      </w:r>
-      <w:r>
-        <w:t>first-person</w:t>
-      </w:r>
-      <w:r>
-        <w:t xml:space="preserve"> </w:t>
-      </w:r>
-      <w:r>
-        <w:t xml:space="preserve">effect where </w:t>
-      </w:r>
-      <w:r>
-        <w:t xml:space="preserve">the </w:t>
-      </w:r>
-      <w:r>
-        <w:t xml:space="preserve">screen </w:t>
-      </w:r>
-      <w:r>
-        <w:t xml:space="preserve">is flashed </w:t>
-      </w:r>
-      <w:r>
-        <w:t>black</w:t>
-      </w:r>
-      <w:r>
-        <w:t>,</w:t>
-      </w:r>
-      <w:r>
-        <w:t xml:space="preserve"> </w:t>
-      </w:r>
-      <w:r>
-        <w:t>at a</w:t>
-      </w:r>
-      <w:r>
-        <w:t xml:space="preserve"> low frequence</w:t>
-      </w:r>
-      <w:r>
-        <w:t>,</w:t>
-      </w:r>
-      <w:r>
-        <w:t xml:space="preserve"> </w:t>
-      </w:r>
-      <w:r>
-        <w:t>and a</w:t>
-      </w:r>
-      <w:r>
-        <w:t>n obnoxious sound</w:t>
-      </w:r>
-      <w:r>
-        <w:t xml:space="preserve"> is </w:t>
-      </w:r>
-      <w:r>
-        <w:t>played</w:t>
-      </w:r>
-      <w:r>
-        <w:t>.</w:t>
-      </w:r>
-      <w:r>
-        <w:t xml:space="preserve">  The effect is quite </w:t>
-      </w:r>
-      <w:r>
-        <w:t>e</w:t>
-      </w:r>
-      <w:r>
-        <w:t>ffective</w:t>
-      </w:r>
-      <w:r>
-        <w:t>!</w:t>
-      </w:r>
-    </w:p>
-    <w:p>
-      <w:r>
-        <w:t xml:space="preserve">I also added a Mode 7 </w:t>
-      </w:r>
-      <w:r>
-        <w:t xml:space="preserve">incomplete level </w:t>
-      </w:r>
-      <w:r>
-        <w:t xml:space="preserve">screen, which </w:t>
-      </w:r>
-      <w:r>
-        <w:t>shows</w:t>
-      </w:r>
-      <w:r>
-        <w:t xml:space="preserve"> </w:t>
-      </w:r>
-      <w:r>
-        <w:t xml:space="preserve">if </w:t>
-      </w:r>
-      <w:r>
-        <w:t>K</w:t>
-      </w:r>
-      <w:r>
-        <w:t xml:space="preserve">9’s health </w:t>
-      </w:r>
-      <w:r>
-        <w:t xml:space="preserve">becomes </w:t>
-      </w:r>
-      <w:r>
-        <w:t>zero</w:t>
-      </w:r>
-      <w:r>
-        <w:t>.  Pressing space restarts the level.</w:t>
-      </w:r>
-    </w:p>
-    <w:p>
-      <w:r>
-        <w:t xml:space="preserve">I then turned to </w:t>
-      </w:r>
-      <w:r>
-        <w:t>implementing</w:t>
-      </w:r>
-      <w:r>
-        <w:t xml:space="preserve"> the </w:t>
-      </w:r>
-      <w:proofErr w:type="spellStart"/>
-      <w:r>
-        <w:rPr>
-          <w:b/>
-          <w:bCs/>
-          <w:i/>
-          <w:iCs/>
-        </w:rPr>
-        <w:t>PursueUp</w:t>
-      </w:r>
-      <w:proofErr w:type="spellEnd"/>
-      <w:r>
-        <w:t xml:space="preserve"> and </w:t>
-      </w:r>
-      <w:proofErr w:type="spellStart"/>
-      <w:r>
-        <w:rPr>
-          <w:b/>
-          <w:bCs/>
-          <w:i/>
-          <w:iCs/>
-        </w:rPr>
-        <w:t>PursueDown</w:t>
-      </w:r>
-      <w:proofErr w:type="spellEnd"/>
-      <w:r>
-        <w:t xml:space="preserve"> behavior</w:t>
-      </w:r>
-      <w:r>
-        <w:t>al rule</w:t>
-      </w:r>
-      <w:r>
-        <w:t>s</w:t>
-      </w:r>
-      <w:r>
-        <w:t>.</w:t>
-      </w:r>
     </w:p>
     <w:p>
       <w:r>
@@ -13089,7 +12773,6 @@
       <w:r>
         <w:t xml:space="preserve">e to support this.  Fortunately, the low nibble of the elevator’s </w:t>
       </w:r>
-      <w:proofErr w:type="spellStart"/>
       <w:r>
         <w:rPr>
           <w:i/>
@@ -13097,7 +12780,6 @@
         </w:rPr>
         <w:t>objectState</w:t>
       </w:r>
-      <w:proofErr w:type="spellEnd"/>
       <w:r>
         <w:t xml:space="preserve"> variable </w:t>
       </w:r>
@@ -13318,15 +13000,7 @@
         <w:t>Daleks in pursuit</w:t>
       </w:r>
       <w:r>
-        <w:t xml:space="preserve"> - When one or more Daleks are in pursuit of K9, a </w:t>
-      </w:r>
-      <w:proofErr w:type="spellStart"/>
-      <w:r>
-        <w:t>PacMan</w:t>
-      </w:r>
-      <w:proofErr w:type="spellEnd"/>
-      <w:r>
-        <w:t xml:space="preserve"> like sound effect plays, giving the player a sense of pressure.  The sound effect provide</w:t>
+        <w:t xml:space="preserve"> - When one or more Daleks are in pursuit of K9, a PacMan like sound effect plays, giving the player a sense of pressure.  The sound effect provide</w:t>
       </w:r>
       <w:r>
         <w:t>s</w:t>
@@ -13551,7 +13225,6 @@
       <w:r>
         <w:t xml:space="preserve">Channel 2 is used for the collect key/jewel, door locked, and K9 movement sound effects.  These sound effects are mutually exclusive except for the movement sound effect.  The game uses a </w:t>
       </w:r>
-      <w:proofErr w:type="spellStart"/>
       <w:r>
         <w:rPr>
           <w:i/>
@@ -13559,7 +13232,6 @@
         </w:rPr>
         <w:t>frameCount</w:t>
       </w:r>
-      <w:proofErr w:type="spellEnd"/>
       <w:r>
         <w:t xml:space="preserve"> based timer to inhibit playing the movement sound effect when the other sound effects are playing.</w:t>
       </w:r>
@@ -14158,7 +13830,6 @@
       <w:r>
         <w:t xml:space="preserve"> into the sprite data and let the </w:t>
       </w:r>
-      <w:proofErr w:type="spellStart"/>
       <w:r>
         <w:rPr>
           <w:i/>
@@ -14166,7 +13837,6 @@
         </w:rPr>
         <w:t>drawSprite</w:t>
       </w:r>
-      <w:proofErr w:type="spellEnd"/>
       <w:r>
         <w:t xml:space="preserve"> routine do all the work of putting the pixels on the screen, however this would result in the ‘</w:t>
       </w:r>
@@ -14589,7 +14259,6 @@
       <w:r>
         <w:t xml:space="preserve">from </w:t>
       </w:r>
-      <w:proofErr w:type="spellStart"/>
       <w:r>
         <w:rPr>
           <w:i/>
@@ -14597,11 +14266,9 @@
         </w:rPr>
         <w:t>drawObject</w:t>
       </w:r>
-      <w:proofErr w:type="spellEnd"/>
       <w:r>
         <w:t xml:space="preserve"> and </w:t>
       </w:r>
-      <w:proofErr w:type="spellStart"/>
       <w:r>
         <w:rPr>
           <w:i/>
@@ -14609,7 +14276,6 @@
         </w:rPr>
         <w:t>drawLaserOn</w:t>
       </w:r>
-      <w:proofErr w:type="spellEnd"/>
       <w:r>
         <w:rPr>
           <w:i/>
@@ -15752,7 +15418,6 @@
       <w:r>
         <w:t xml:space="preserve">The title functionality starts and stops playback by invoking the </w:t>
       </w:r>
-      <w:proofErr w:type="spellStart"/>
       <w:r>
         <w:rPr>
           <w:b/>
@@ -15762,11 +15427,9 @@
         </w:rPr>
         <w:t>playMusic</w:t>
       </w:r>
-      <w:proofErr w:type="spellEnd"/>
       <w:r>
         <w:t xml:space="preserve"> and </w:t>
       </w:r>
-      <w:proofErr w:type="spellStart"/>
       <w:r>
         <w:rPr>
           <w:b/>
@@ -15776,7 +15439,6 @@
         </w:rPr>
         <w:t>stopMusic</w:t>
       </w:r>
-      <w:proofErr w:type="spellEnd"/>
       <w:r>
         <w:t xml:space="preserve"> routines.  These routines start and stop the music, which is played in the </w:t>
       </w:r>
@@ -17643,11 +17305,9 @@
             <w:tcW w:w="3116" w:type="dxa"/>
           </w:tcPr>
           <w:p>
-            <w:proofErr w:type="spellStart"/>
             <w:r>
               <w:t>soundVector_beginPursuit</w:t>
             </w:r>
-            <w:proofErr w:type="spellEnd"/>
           </w:p>
         </w:tc>
         <w:tc>
@@ -17658,11 +17318,9 @@
             <w:pPr>
               <w:cnfStyle w:val="000000100000" w:firstRow="0" w:lastRow="0" w:firstColumn="0" w:lastColumn="0" w:oddVBand="0" w:evenVBand="0" w:oddHBand="1" w:evenHBand="0" w:firstRowFirstColumn="0" w:firstRowLastColumn="0" w:lastRowFirstColumn="0" w:lastRowLastColumn="0"/>
             </w:pPr>
-            <w:proofErr w:type="spellStart"/>
             <w:r>
               <w:t>soundEffect_pursuitOff</w:t>
             </w:r>
-            <w:proofErr w:type="spellEnd"/>
           </w:p>
         </w:tc>
         <w:tc>
@@ -17673,14 +17331,12 @@
             <w:pPr>
               <w:cnfStyle w:val="000000100000" w:firstRow="0" w:lastRow="0" w:firstColumn="0" w:lastColumn="0" w:oddVBand="0" w:evenVBand="0" w:oddHBand="1" w:evenHBand="0" w:firstRowFirstColumn="0" w:firstRowLastColumn="0" w:lastRowFirstColumn="0" w:lastRowLastColumn="0"/>
             </w:pPr>
-            <w:proofErr w:type="spellStart"/>
             <w:r>
               <w:t>sample_</w:t>
             </w:r>
             <w:r>
               <w:t>soundExterminate</w:t>
             </w:r>
-            <w:proofErr w:type="spellEnd"/>
           </w:p>
         </w:tc>
       </w:tr>
@@ -17691,11 +17347,9 @@
             <w:tcW w:w="3116" w:type="dxa"/>
           </w:tcPr>
           <w:p>
-            <w:proofErr w:type="spellStart"/>
             <w:r>
               <w:t>soundVector_updatePursuit</w:t>
             </w:r>
-            <w:proofErr w:type="spellEnd"/>
           </w:p>
         </w:tc>
         <w:tc>
@@ -17722,11 +17376,9 @@
             <w:pPr>
               <w:cnfStyle w:val="000000000000" w:firstRow="0" w:lastRow="0" w:firstColumn="0" w:lastColumn="0" w:oddVBand="0" w:evenVBand="0" w:oddHBand="0" w:evenHBand="0" w:firstRowFirstColumn="0" w:firstRowLastColumn="0" w:lastRowFirstColumn="0" w:lastRowLastColumn="0"/>
             </w:pPr>
-            <w:proofErr w:type="spellStart"/>
             <w:r>
               <w:t>sample_updatePursuit</w:t>
             </w:r>
-            <w:proofErr w:type="spellEnd"/>
           </w:p>
         </w:tc>
       </w:tr>
@@ -17740,11 +17392,9 @@
             <w:tcW w:w="3116" w:type="dxa"/>
           </w:tcPr>
           <w:p>
-            <w:proofErr w:type="spellStart"/>
             <w:r>
               <w:t>soundVector_endPursuit</w:t>
             </w:r>
-            <w:proofErr w:type="spellEnd"/>
           </w:p>
         </w:tc>
         <w:tc>
@@ -17755,11 +17405,9 @@
             <w:pPr>
               <w:cnfStyle w:val="000000100000" w:firstRow="0" w:lastRow="0" w:firstColumn="0" w:lastColumn="0" w:oddVBand="0" w:evenVBand="0" w:oddHBand="1" w:evenHBand="0" w:firstRowFirstColumn="0" w:firstRowLastColumn="0" w:lastRowFirstColumn="0" w:lastRowLastColumn="0"/>
             </w:pPr>
-            <w:proofErr w:type="spellStart"/>
             <w:r>
               <w:t>soundEffect_pursuitOff</w:t>
             </w:r>
-            <w:proofErr w:type="spellEnd"/>
           </w:p>
         </w:tc>
         <w:tc>
@@ -17770,11 +17418,9 @@
             <w:pPr>
               <w:cnfStyle w:val="000000100000" w:firstRow="0" w:lastRow="0" w:firstColumn="0" w:lastColumn="0" w:oddVBand="0" w:evenVBand="0" w:oddHBand="1" w:evenHBand="0" w:firstRowFirstColumn="0" w:firstRowLastColumn="0" w:lastRowFirstColumn="0" w:lastRowLastColumn="0"/>
             </w:pPr>
-            <w:proofErr w:type="spellStart"/>
             <w:r>
               <w:t>sample_stop</w:t>
             </w:r>
-            <w:proofErr w:type="spellEnd"/>
           </w:p>
         </w:tc>
       </w:tr>
@@ -17785,11 +17431,9 @@
             <w:tcW w:w="3116" w:type="dxa"/>
           </w:tcPr>
           <w:p>
-            <w:proofErr w:type="spellStart"/>
             <w:r>
               <w:t>soundVector_enemyLasered</w:t>
             </w:r>
-            <w:proofErr w:type="spellEnd"/>
           </w:p>
         </w:tc>
         <w:tc>
@@ -17816,11 +17460,9 @@
             <w:pPr>
               <w:cnfStyle w:val="000000000000" w:firstRow="0" w:lastRow="0" w:firstColumn="0" w:lastColumn="0" w:oddVBand="0" w:evenVBand="0" w:oddHBand="0" w:evenHBand="0" w:firstRowFirstColumn="0" w:firstRowLastColumn="0" w:lastRowFirstColumn="0" w:lastRowLastColumn="0"/>
             </w:pPr>
-            <w:proofErr w:type="spellStart"/>
             <w:r>
               <w:t>sample_soundGrown</w:t>
             </w:r>
-            <w:proofErr w:type="spellEnd"/>
           </w:p>
         </w:tc>
       </w:tr>
@@ -17834,11 +17476,9 @@
             <w:tcW w:w="3116" w:type="dxa"/>
           </w:tcPr>
           <w:p>
-            <w:proofErr w:type="spellStart"/>
             <w:r>
               <w:t>soundVector_weaponFired</w:t>
             </w:r>
-            <w:proofErr w:type="spellEnd"/>
           </w:p>
         </w:tc>
         <w:tc>
@@ -17849,11 +17489,9 @@
             <w:pPr>
               <w:cnfStyle w:val="000000100000" w:firstRow="0" w:lastRow="0" w:firstColumn="0" w:lastColumn="0" w:oddVBand="0" w:evenVBand="0" w:oddHBand="1" w:evenHBand="0" w:firstRowFirstColumn="0" w:firstRowLastColumn="0" w:lastRowFirstColumn="0" w:lastRowLastColumn="0"/>
             </w:pPr>
-            <w:proofErr w:type="spellStart"/>
             <w:r>
               <w:t>soundEffect_pain</w:t>
             </w:r>
-            <w:proofErr w:type="spellEnd"/>
           </w:p>
         </w:tc>
         <w:tc>
@@ -17864,11 +17502,9 @@
             <w:pPr>
               <w:cnfStyle w:val="000000100000" w:firstRow="0" w:lastRow="0" w:firstColumn="0" w:lastColumn="0" w:oddVBand="0" w:evenVBand="0" w:oddHBand="1" w:evenHBand="0" w:firstRowFirstColumn="0" w:firstRowLastColumn="0" w:lastRowFirstColumn="0" w:lastRowLastColumn="0"/>
             </w:pPr>
-            <w:proofErr w:type="spellStart"/>
             <w:r>
               <w:t>sample_soundWeapon</w:t>
             </w:r>
-            <w:proofErr w:type="spellEnd"/>
           </w:p>
         </w:tc>
       </w:tr>
@@ -18043,13 +17679,8 @@
         <w:t xml:space="preserve">reasonably well </w:t>
       </w:r>
       <w:r>
-        <w:t xml:space="preserve">in </w:t>
-      </w:r>
-      <w:proofErr w:type="spellStart"/>
-      <w:r>
-        <w:t>BeebEm</w:t>
-      </w:r>
-      <w:proofErr w:type="spellEnd"/>
+        <w:t>in BeebEm</w:t>
+      </w:r>
       <w:r>
         <w:t xml:space="preserve">, though there was a </w:t>
       </w:r>
@@ -18271,7 +17902,16 @@
         <w:t xml:space="preserve"> </w:t>
       </w:r>
       <w:r>
-        <w:t>The sample code was also updated to play the new sounds</w:t>
+        <w:t>The sample</w:t>
+      </w:r>
+      <w:r>
+        <w:t>.</w:t>
+      </w:r>
+      <w:r>
+        <w:t>6502</w:t>
+      </w:r>
+      <w:r>
+        <w:t xml:space="preserve"> code was also updated to play the new sounds</w:t>
       </w:r>
       <w:r>
         <w:t>.</w:t>
@@ -18373,11 +18013,9 @@
             <w:tcW w:w="2586" w:type="dxa"/>
           </w:tcPr>
           <w:p>
-            <w:proofErr w:type="spellStart"/>
             <w:r>
               <w:t>enemyDestroyed</w:t>
             </w:r>
-            <w:proofErr w:type="spellEnd"/>
           </w:p>
         </w:tc>
         <w:tc>
@@ -18417,11 +18055,9 @@
             <w:tcW w:w="2586" w:type="dxa"/>
           </w:tcPr>
           <w:p>
-            <w:proofErr w:type="spellStart"/>
             <w:r>
               <w:t>startLevel</w:t>
             </w:r>
-            <w:proofErr w:type="spellEnd"/>
           </w:p>
         </w:tc>
         <w:tc>
@@ -18467,11 +18103,9 @@
             <w:tcW w:w="2586" w:type="dxa"/>
           </w:tcPr>
           <w:p>
-            <w:proofErr w:type="spellStart"/>
             <w:r>
               <w:t>completeLevel</w:t>
             </w:r>
-            <w:proofErr w:type="spellEnd"/>
           </w:p>
         </w:tc>
         <w:tc>
@@ -18482,11 +18116,9 @@
             <w:pPr>
               <w:cnfStyle w:val="000000100000" w:firstRow="0" w:lastRow="0" w:firstColumn="0" w:lastColumn="0" w:oddVBand="0" w:evenVBand="0" w:oddHBand="1" w:evenHBand="0" w:firstRowFirstColumn="0" w:firstRowLastColumn="0" w:lastRowFirstColumn="0" w:lastRowLastColumn="0"/>
             </w:pPr>
-            <w:proofErr w:type="spellStart"/>
             <w:r>
               <w:t>soundEffect_levelComplete</w:t>
             </w:r>
-            <w:proofErr w:type="spellEnd"/>
           </w:p>
         </w:tc>
         <w:tc>
@@ -18497,14 +18129,12 @@
             <w:pPr>
               <w:cnfStyle w:val="000000100000" w:firstRow="0" w:lastRow="0" w:firstColumn="0" w:lastColumn="0" w:oddVBand="0" w:evenVBand="0" w:oddHBand="1" w:evenHBand="0" w:firstRowFirstColumn="0" w:firstRowLastColumn="0" w:lastRowFirstColumn="0" w:lastRowLastColumn="0"/>
             </w:pPr>
-            <w:proofErr w:type="spellStart"/>
             <w:r>
               <w:t>sample_</w:t>
             </w:r>
             <w:r>
               <w:t>soundTardisDoor</w:t>
             </w:r>
-            <w:proofErr w:type="spellEnd"/>
           </w:p>
         </w:tc>
       </w:tr>
@@ -20957,15 +20587,7 @@
         <w:t>locations and populates the game object data structures from the metadata and object descriptors.</w:t>
       </w:r>
       <w:r>
-        <w:t xml:space="preserve">  On machines with 16K+ of sideways RAM, the code also copies the 224-byte </w:t>
-      </w:r>
-      <w:proofErr w:type="spellStart"/>
-      <w:r>
-        <w:t>gamebar</w:t>
-      </w:r>
-      <w:proofErr w:type="spellEnd"/>
-      <w:r>
-        <w:t xml:space="preserve"> asset to </w:t>
+        <w:t xml:space="preserve">  On machines with 16K+ of sideways RAM, the code also copies the 224-byte gamebar asset to </w:t>
       </w:r>
       <w:r>
         <w:t>&amp;BF20</w:t>
@@ -21552,7 +21174,6 @@
       <w:r>
         <w:t xml:space="preserve">Removed </w:t>
       </w:r>
-      <w:proofErr w:type="spellStart"/>
       <w:r>
         <w:rPr>
           <w:i/>
@@ -21560,11 +21181,9 @@
         </w:rPr>
         <w:t>objectWidth</w:t>
       </w:r>
-      <w:proofErr w:type="spellEnd"/>
       <w:r>
         <w:t xml:space="preserve"> &amp; </w:t>
       </w:r>
-      <w:proofErr w:type="spellStart"/>
       <w:r>
         <w:rPr>
           <w:i/>
@@ -21572,7 +21191,6 @@
         </w:rPr>
         <w:t>objectHeight</w:t>
       </w:r>
-      <w:proofErr w:type="spellEnd"/>
       <w:r>
         <w:t xml:space="preserve"> arrays</w:t>
       </w:r>
@@ -21602,7 +21220,6 @@
       <w:r>
         <w:t xml:space="preserve">, </w:t>
       </w:r>
-      <w:proofErr w:type="spellStart"/>
       <w:r>
         <w:rPr>
           <w:i/>
@@ -21610,14 +21227,12 @@
         </w:rPr>
         <w:t>widthMinusOne</w:t>
       </w:r>
-      <w:proofErr w:type="spellEnd"/>
       <w:r>
         <w:t xml:space="preserve">, </w:t>
       </w:r>
       <w:r>
         <w:t xml:space="preserve">and </w:t>
       </w:r>
-      <w:proofErr w:type="spellStart"/>
       <w:r>
         <w:rPr>
           <w:i/>
@@ -21625,7 +21240,6 @@
         </w:rPr>
         <w:t>heightMinusOne</w:t>
       </w:r>
-      <w:proofErr w:type="spellEnd"/>
       <w:r>
         <w:t xml:space="preserve">.  </w:t>
       </w:r>
@@ -21647,7 +21261,6 @@
       <w:r>
         <w:t xml:space="preserve"> which were previously subtracting one from </w:t>
       </w:r>
-      <w:proofErr w:type="spellStart"/>
       <w:r>
         <w:rPr>
           <w:i/>
@@ -21655,11 +21268,9 @@
         </w:rPr>
         <w:t>objectWidth</w:t>
       </w:r>
-      <w:proofErr w:type="spellEnd"/>
       <w:r>
         <w:t xml:space="preserve"> &amp; </w:t>
       </w:r>
-      <w:proofErr w:type="spellStart"/>
       <w:r>
         <w:rPr>
           <w:i/>
@@ -21681,7 +21292,6 @@
         </w:rPr>
         <w:t>ght</w:t>
       </w:r>
-      <w:proofErr w:type="spellEnd"/>
       <w:r>
         <w:t xml:space="preserve">.  </w:t>
       </w:r>
@@ -21697,7 +21307,6 @@
       <w:r>
         <w:t xml:space="preserve">Bit-packed </w:t>
       </w:r>
-      <w:proofErr w:type="spellStart"/>
       <w:r>
         <w:rPr>
           <w:i/>
@@ -21705,11 +21314,9 @@
         </w:rPr>
         <w:t>objectType</w:t>
       </w:r>
-      <w:proofErr w:type="spellEnd"/>
       <w:r>
         <w:t xml:space="preserve"> and </w:t>
       </w:r>
-      <w:proofErr w:type="spellStart"/>
       <w:r>
         <w:rPr>
           <w:i/>
@@ -21717,7 +21324,6 @@
         </w:rPr>
         <w:t>objectState</w:t>
       </w:r>
-      <w:proofErr w:type="spellEnd"/>
       <w:r>
         <w:t xml:space="preserve"> array</w:t>
       </w:r>
@@ -22056,7 +21662,6 @@
       <w:r>
         <w:t xml:space="preserve">JMP </w:t>
       </w:r>
-      <w:proofErr w:type="spellStart"/>
       <w:r>
         <w:rPr>
           <w:i/>
@@ -22065,13 +21670,8 @@
         <w:t>xxx</w:t>
       </w:r>
       <w:r>
-        <w:t>x</w:t>
-      </w:r>
-      <w:proofErr w:type="spellEnd"/>
-      <w:r>
-        <w:t xml:space="preserve"> instead of JSR </w:t>
-      </w:r>
-      <w:proofErr w:type="spellStart"/>
+        <w:t xml:space="preserve">x instead of JSR </w:t>
+      </w:r>
       <w:r>
         <w:rPr>
           <w:i/>
@@ -22079,7 +21679,6 @@
         </w:rPr>
         <w:t>xxxx</w:t>
       </w:r>
-      <w:proofErr w:type="spellEnd"/>
       <w:r>
         <w:t xml:space="preserve">, </w:t>
       </w:r>
@@ -22244,7 +21843,6 @@
       <w:r>
         <w:t xml:space="preserve"> and </w:t>
       </w:r>
-      <w:proofErr w:type="spellStart"/>
       <w:r>
         <w:rPr>
           <w:i/>
@@ -22252,7 +21850,6 @@
         </w:rPr>
         <w:t>dalekAnimate</w:t>
       </w:r>
-      <w:proofErr w:type="spellEnd"/>
       <w:r>
         <w:t xml:space="preserve"> routines do this.</w:t>
       </w:r>
@@ -22277,7 +21874,6 @@
       <w:r>
         <w:t xml:space="preserve">  For example, the </w:t>
       </w:r>
-      <w:proofErr w:type="spellStart"/>
       <w:r>
         <w:rPr>
           <w:i/>
@@ -22306,11 +21902,9 @@
         </w:rPr>
         <w:t>lock</w:t>
       </w:r>
-      <w:proofErr w:type="spellEnd"/>
       <w:r>
         <w:t xml:space="preserve"> and </w:t>
       </w:r>
-      <w:proofErr w:type="spellStart"/>
       <w:r>
         <w:rPr>
           <w:i/>
@@ -22318,7 +21912,6 @@
         </w:rPr>
         <w:t>vduCommands</w:t>
       </w:r>
-      <w:proofErr w:type="spellEnd"/>
       <w:r>
         <w:t xml:space="preserve"> buffer</w:t>
       </w:r>
@@ -22337,7 +21930,6 @@
       <w:r>
         <w:t xml:space="preserve">with </w:t>
       </w:r>
-      <w:proofErr w:type="spellStart"/>
       <w:r>
         <w:rPr>
           <w:i/>
@@ -22345,7 +21937,6 @@
         </w:rPr>
         <w:t>vduCommands</w:t>
       </w:r>
-      <w:proofErr w:type="spellEnd"/>
       <w:r>
         <w:rPr>
           <w:i/>
@@ -22495,18 +22086,8 @@
           <w:sz w:val="18"/>
           <w:szCs w:val="18"/>
         </w:rPr>
-        <w:t xml:space="preserve"> </w:t>
-      </w:r>
-      <w:proofErr w:type="spellStart"/>
-      <w:r>
-        <w:rPr>
-          <w:rFonts w:ascii="Cascadia Code" w:hAnsi="Cascadia Code"/>
-          <w:sz w:val="18"/>
-          <w:szCs w:val="18"/>
-        </w:rPr>
-        <w:t>Bh</w:t>
-      </w:r>
-      <w:proofErr w:type="spellEnd"/>
+        <w:t xml:space="preserve"> Bh</w:t>
+      </w:r>
       <w:r>
         <w:rPr>
           <w:rFonts w:ascii="Cascadia Code" w:hAnsi="Cascadia Code"/>
@@ -22611,7 +22192,6 @@
       <w:r>
         <w:t xml:space="preserve">Routines always define a new scope (a wonderful </w:t>
       </w:r>
-      <w:proofErr w:type="spellStart"/>
       <w:r>
         <w:rPr>
           <w:b/>
@@ -22621,7 +22201,6 @@
         </w:rPr>
         <w:t>beebasm</w:t>
       </w:r>
-      <w:proofErr w:type="spellEnd"/>
       <w:r>
         <w:t xml:space="preserve"> feature) to limit the scope of contained labels and local data. Nested scopes are not used.</w:t>
       </w:r>
@@ -23467,15 +23046,7 @@
         <w:t xml:space="preserve"> </w:t>
       </w:r>
       <w:r>
-        <w:t xml:space="preserve">1 overlays, rendering the graphics and text directly over the gameplay screen.  To do this I needed to write custom </w:t>
-      </w:r>
-      <w:proofErr w:type="spellStart"/>
-      <w:r>
-        <w:t>drawText</w:t>
-      </w:r>
-      <w:proofErr w:type="spellEnd"/>
-      <w:r>
-        <w:t xml:space="preserve"> routines that used the MOS’s character definitions stored at &amp;8000.  Although this worked well, the draw code took up precious bytes and I was forced to</w:t>
+        <w:t>1 overlays, rendering the graphics and text directly over the gameplay screen.  To do this I needed to write custom drawText routines that used the MOS’s character definitions stored at &amp;8000.  Although this worked well, the draw code took up precious bytes and I was forced to</w:t>
       </w:r>
       <w:r>
         <w:t xml:space="preserve"> </w:t>
@@ -23773,16 +23344,8 @@
           <w:rPr>
             <w:rStyle w:val="Hyperlink"/>
           </w:rPr>
-          <w:t>mdfs.net/Docs/Comp/BBC/</w:t>
+          <w:t>mdfs.net/Docs/Comp/BBC/AllMem</w:t>
         </w:r>
-        <w:proofErr w:type="spellStart"/>
-        <w:r>
-          <w:rPr>
-            <w:rStyle w:val="Hyperlink"/>
-          </w:rPr>
-          <w:t>AllMem</w:t>
-        </w:r>
-        <w:proofErr w:type="spellEnd"/>
       </w:hyperlink>
     </w:p>
     <w:p>
@@ -23800,16 +23363,8 @@
           <w:rPr>
             <w:rStyle w:val="Hyperlink"/>
           </w:rPr>
-          <w:t>mdfs.net/Docs/Comp/BBC/Disk/</w:t>
+          <w:t>mdfs.net/Docs/Comp/BBC/Disk/DFSMem</w:t>
         </w:r>
-        <w:proofErr w:type="spellStart"/>
-        <w:r>
-          <w:rPr>
-            <w:rStyle w:val="Hyperlink"/>
-          </w:rPr>
-          <w:t>DFSMem</w:t>
-        </w:r>
-        <w:proofErr w:type="spellEnd"/>
       </w:hyperlink>
     </w:p>
     <w:p>
@@ -23847,7 +23402,7 @@
     <mc:AlternateContent>
       <mc:Choice Requires="v">
         <w:pict>
-          <v:shapetype w14:anchorId="091B403E" id="_x0000_t75" coordsize="21600,21600" o:spt="75" o:preferrelative="t" path="m@4@5l@4@11@9@11@9@5xe" filled="f" stroked="f">
+          <v:shapetype w14:anchorId="560CB565" id="_x0000_t75" coordsize="21600,21600" o:spt="75" o:preferrelative="t" path="m@4@5l@4@11@9@11@9@5xe" filled="f" stroked="f">
             <v:stroke joinstyle="miter"/>
             <v:formulas>
               <v:f eqn="if lineDrawn pixelLineWidth 0"/>
@@ -23873,10 +23428,10 @@
       </mc:Choice>
       <mc:Fallback>
         <w:drawing>
-          <wp:inline distT="0" distB="0" distL="0" distR="0" wp14:anchorId="1936EE20" wp14:editId="6B59FA45">
+          <wp:inline distT="0" distB="0" distL="0" distR="0" wp14:anchorId="4C73A38E" wp14:editId="0B566C49">
             <wp:extent cx="194650" cy="145988"/>
             <wp:effectExtent l="0" t="0" r="0" b="6985"/>
-            <wp:docPr id="229799421" name="Picture 1"/>
+            <wp:docPr id="405442093" name="Picture 1"/>
             <wp:cNvGraphicFramePr>
               <a:graphicFrameLocks xmlns:a="http://schemas.openxmlformats.org/drawingml/2006/main" noChangeAspect="1"/>
             </wp:cNvGraphicFramePr>
@@ -23914,17 +23469,17 @@
     <mc:AlternateContent>
       <mc:Choice Requires="v">
         <w:pict>
-          <v:shape w14:anchorId="10F762F0" id="Picture 1" o:spid="_x0000_i1025" type="#_x0000_t75" style="width:15.7pt;height:11.75pt;visibility:visible;mso-wrap-style:square">
+          <v:shape w14:anchorId="5F064C9F" id="Picture 1" o:spid="_x0000_i1025" type="#_x0000_t75" style="width:15.7pt;height:11.75pt;visibility:visible;mso-wrap-style:square">
             <v:imagedata r:id="rId3" o:title=""/>
           </v:shape>
         </w:pict>
       </mc:Choice>
       <mc:Fallback>
         <w:drawing>
-          <wp:inline distT="0" distB="0" distL="0" distR="0" wp14:anchorId="75E30F31" wp14:editId="22CABAD2">
+          <wp:inline distT="0" distB="0" distL="0" distR="0" wp14:anchorId="0D84E877" wp14:editId="3ED6DCB2">
             <wp:extent cx="199177" cy="149383"/>
             <wp:effectExtent l="0" t="0" r="0" b="3175"/>
-            <wp:docPr id="845719079" name="Picture 1"/>
+            <wp:docPr id="1817009755" name="Picture 1"/>
             <wp:cNvGraphicFramePr>
               <a:graphicFrameLocks xmlns:a="http://schemas.openxmlformats.org/drawingml/2006/main" noChangeAspect="1"/>
             </wp:cNvGraphicFramePr>

</xml_diff>

<commit_message>
Introduced crop transitions for entering and leaving a level.  The number of tiles was reduced from 32 to 30 to free up sufficient memory to implement the feature.
</commit_message>
<xml_diff>
--- a/docs/Development.docx
+++ b/docs/Development.docx
@@ -18154,10 +18154,7 @@
     </w:p>
     <w:p>
       <w:r>
-        <w:t>Another sugges</w:t>
-      </w:r>
-      <w:r>
-        <w:t xml:space="preserve">tion was to improve the </w:t>
+        <w:t xml:space="preserve">Another suggestion was to improve the </w:t>
       </w:r>
       <w:r>
         <w:t>‘</w:t>
@@ -18263,6 +18260,9 @@
         <w:jc w:val="center"/>
       </w:pPr>
       <w:r>
+        <w:rPr>
+          <w:noProof/>
+        </w:rPr>
         <w:drawing>
           <wp:inline distT="0" distB="0" distL="0" distR="0" wp14:anchorId="405D87CE" wp14:editId="342541F2">
             <wp:extent cx="2474844" cy="1979875"/>
@@ -18929,7 +18929,10 @@
               <w:t xml:space="preserve">and </w:t>
             </w:r>
             <w:r>
-              <w:t xml:space="preserve">level </w:t>
+              <w:t>black</w:t>
+            </w:r>
+            <w:r>
+              <w:t xml:space="preserve"> </w:t>
             </w:r>
             <w:r>
               <w:t>palette</w:t>
@@ -19598,7 +19601,14 @@
                 <w:b/>
                 <w:bCs/>
               </w:rPr>
-              <w:t>7680</w:t>
+              <w:t>7</w:t>
+            </w:r>
+            <w:r>
+              <w:rPr>
+                <w:b/>
+                <w:bCs/>
+              </w:rPr>
+              <w:t>792</w:t>
             </w:r>
           </w:p>
         </w:tc>
@@ -19621,7 +19631,7 @@
               <w:t>2</w:t>
             </w:r>
             <w:r>
-              <w:t>BA9</w:t>
+              <w:t>C10</w:t>
             </w:r>
           </w:p>
         </w:tc>
@@ -19634,7 +19644,13 @@
               <w:cnfStyle w:val="000000100000" w:firstRow="0" w:lastRow="0" w:firstColumn="0" w:lastColumn="0" w:oddVBand="0" w:evenVBand="0" w:oddHBand="1" w:evenHBand="0" w:firstRowFirstColumn="0" w:firstRowLastColumn="0" w:lastRowFirstColumn="0" w:lastRowLastColumn="0"/>
             </w:pPr>
             <w:r>
-              <w:t>Game sprite data</w:t>
+              <w:t xml:space="preserve">Game </w:t>
+            </w:r>
+            <w:r>
+              <w:t>s</w:t>
+            </w:r>
+            <w:r>
+              <w:t>prite data</w:t>
             </w:r>
             <w:r>
               <w:t>*</w:t>
@@ -19670,7 +19686,10 @@
               <w:jc w:val="center"/>
             </w:pPr>
             <w:r>
-              <w:t>3040</w:t>
+              <w:t>30</w:t>
+            </w:r>
+            <w:r>
+              <w:t>B0</w:t>
             </w:r>
           </w:p>
         </w:tc>
@@ -19681,6 +19700,56 @@
           <w:p>
             <w:pPr>
               <w:cnfStyle w:val="000000000000" w:firstRow="0" w:lastRow="0" w:firstColumn="0" w:lastColumn="0" w:oddVBand="0" w:evenVBand="0" w:oddHBand="0" w:evenHBand="0" w:firstRowFirstColumn="0" w:firstRowLastColumn="0" w:lastRowFirstColumn="0" w:lastRowLastColumn="0"/>
+            </w:pPr>
+            <w:r>
+              <w:t>Level palette</w:t>
+            </w:r>
+          </w:p>
+        </w:tc>
+        <w:tc>
+          <w:tcPr>
+            <w:tcW w:w="1277" w:type="dxa"/>
+          </w:tcPr>
+          <w:p>
+            <w:pPr>
+              <w:jc w:val="center"/>
+              <w:cnfStyle w:val="000000000000" w:firstRow="0" w:lastRow="0" w:firstColumn="0" w:lastColumn="0" w:oddVBand="0" w:evenVBand="0" w:oddHBand="0" w:evenHBand="0" w:firstRowFirstColumn="0" w:firstRowLastColumn="0" w:lastRowFirstColumn="0" w:lastRowLastColumn="0"/>
+            </w:pPr>
+            <w:r>
+              <w:t>16</w:t>
+            </w:r>
+          </w:p>
+        </w:tc>
+      </w:tr>
+      <w:tr>
+        <w:trPr>
+          <w:cnfStyle w:val="000000100000" w:firstRow="0" w:lastRow="0" w:firstColumn="0" w:lastColumn="0" w:oddVBand="0" w:evenVBand="0" w:oddHBand="1" w:evenHBand="0" w:firstRowFirstColumn="0" w:firstRowLastColumn="0" w:lastRowFirstColumn="0" w:lastRowLastColumn="0"/>
+          <w:trHeight w:val="250"/>
+        </w:trPr>
+        <w:tc>
+          <w:tcPr>
+            <w:cnfStyle w:val="001000000000" w:firstRow="0" w:lastRow="0" w:firstColumn="1" w:lastColumn="0" w:oddVBand="0" w:evenVBand="0" w:oddHBand="0" w:evenHBand="0" w:firstRowFirstColumn="0" w:firstRowLastColumn="0" w:lastRowFirstColumn="0" w:lastRowLastColumn="0"/>
+            <w:tcW w:w="1165" w:type="dxa"/>
+          </w:tcPr>
+          <w:p>
+            <w:pPr>
+              <w:jc w:val="center"/>
+            </w:pPr>
+            <w:r>
+              <w:t>30</w:t>
+            </w:r>
+            <w:r>
+              <w:t>C0</w:t>
+            </w:r>
+          </w:p>
+        </w:tc>
+        <w:tc>
+          <w:tcPr>
+            <w:tcW w:w="6660" w:type="dxa"/>
+          </w:tcPr>
+          <w:p>
+            <w:pPr>
+              <w:cnfStyle w:val="000000100000" w:firstRow="0" w:lastRow="0" w:firstColumn="0" w:lastColumn="0" w:oddVBand="0" w:evenVBand="0" w:oddHBand="1" w:evenHBand="0" w:firstRowFirstColumn="0" w:firstRowLastColumn="0" w:lastRowFirstColumn="0" w:lastRowLastColumn="0"/>
             </w:pPr>
             <w:r>
               <w:t>Level tiles</w:t>
@@ -19694,17 +19763,19 @@
           <w:p>
             <w:pPr>
               <w:jc w:val="center"/>
-              <w:cnfStyle w:val="000000000000" w:firstRow="0" w:lastRow="0" w:firstColumn="0" w:lastColumn="0" w:oddVBand="0" w:evenVBand="0" w:oddHBand="0" w:evenHBand="0" w:firstRowFirstColumn="0" w:firstRowLastColumn="0" w:lastRowFirstColumn="0" w:lastRowLastColumn="0"/>
+              <w:cnfStyle w:val="000000100000" w:firstRow="0" w:lastRow="0" w:firstColumn="0" w:lastColumn="0" w:oddVBand="0" w:evenVBand="0" w:oddHBand="1" w:evenHBand="0" w:firstRowFirstColumn="0" w:firstRowLastColumn="0" w:lastRowFirstColumn="0" w:lastRowLastColumn="0"/>
             </w:pPr>
             <w:r>
-              <w:t>1984</w:t>
+              <w:t>1</w:t>
+            </w:r>
+            <w:r>
+              <w:t>852</w:t>
             </w:r>
           </w:p>
         </w:tc>
       </w:tr>
       <w:tr>
         <w:trPr>
-          <w:cnfStyle w:val="000000100000" w:firstRow="0" w:lastRow="0" w:firstColumn="0" w:lastColumn="0" w:oddVBand="0" w:evenVBand="0" w:oddHBand="1" w:evenHBand="0" w:firstRowFirstColumn="0" w:firstRowLastColumn="0" w:lastRowFirstColumn="0" w:lastRowLastColumn="0"/>
           <w:trHeight w:val="250"/>
         </w:trPr>
         <w:tc>
@@ -19727,7 +19798,7 @@
           </w:tcPr>
           <w:p>
             <w:pPr>
-              <w:cnfStyle w:val="000000100000" w:firstRow="0" w:lastRow="0" w:firstColumn="0" w:lastColumn="0" w:oddVBand="0" w:evenVBand="0" w:oddHBand="1" w:evenHBand="0" w:firstRowFirstColumn="0" w:firstRowLastColumn="0" w:lastRowFirstColumn="0" w:lastRowLastColumn="0"/>
+              <w:cnfStyle w:val="000000000000" w:firstRow="0" w:lastRow="0" w:firstColumn="0" w:lastColumn="0" w:oddVBand="0" w:evenVBand="0" w:oddHBand="0" w:evenHBand="0" w:firstRowFirstColumn="0" w:firstRowLastColumn="0" w:lastRowFirstColumn="0" w:lastRowLastColumn="0"/>
             </w:pPr>
             <w:r>
               <w:t>Level tile grid</w:t>
@@ -19741,7 +19812,7 @@
           <w:p>
             <w:pPr>
               <w:jc w:val="center"/>
-              <w:cnfStyle w:val="000000100000" w:firstRow="0" w:lastRow="0" w:firstColumn="0" w:lastColumn="0" w:oddVBand="0" w:evenVBand="0" w:oddHBand="1" w:evenHBand="0" w:firstRowFirstColumn="0" w:firstRowLastColumn="0" w:lastRowFirstColumn="0" w:lastRowLastColumn="0"/>
+              <w:cnfStyle w:val="000000000000" w:firstRow="0" w:lastRow="0" w:firstColumn="0" w:lastColumn="0" w:oddVBand="0" w:evenVBand="0" w:oddHBand="0" w:evenHBand="0" w:firstRowFirstColumn="0" w:firstRowLastColumn="0" w:lastRowFirstColumn="0" w:lastRowLastColumn="0"/>
             </w:pPr>
             <w:r>
               <w:t>2048</w:t>
@@ -19751,6 +19822,7 @@
       </w:tr>
       <w:tr>
         <w:trPr>
+          <w:cnfStyle w:val="000000100000" w:firstRow="0" w:lastRow="0" w:firstColumn="0" w:lastColumn="0" w:oddVBand="0" w:evenVBand="0" w:oddHBand="1" w:evenHBand="0" w:firstRowFirstColumn="0" w:firstRowLastColumn="0" w:lastRowFirstColumn="0" w:lastRowLastColumn="0"/>
           <w:trHeight w:val="250"/>
         </w:trPr>
         <w:tc>
@@ -19775,7 +19847,7 @@
           </w:tcPr>
           <w:p>
             <w:pPr>
-              <w:cnfStyle w:val="000000000000" w:firstRow="0" w:lastRow="0" w:firstColumn="0" w:lastColumn="0" w:oddVBand="0" w:evenVBand="0" w:oddHBand="0" w:evenHBand="0" w:firstRowFirstColumn="0" w:firstRowLastColumn="0" w:lastRowFirstColumn="0" w:lastRowLastColumn="0"/>
+              <w:cnfStyle w:val="000000100000" w:firstRow="0" w:lastRow="0" w:firstColumn="0" w:lastColumn="0" w:oddVBand="0" w:evenVBand="0" w:oddHBand="1" w:evenHBand="0" w:firstRowFirstColumn="0" w:firstRowLastColumn="0" w:lastRowFirstColumn="0" w:lastRowLastColumn="0"/>
             </w:pPr>
             <w:r>
               <w:t>256x256 4-color screen</w:t>
@@ -19790,7 +19862,7 @@
           <w:p>
             <w:pPr>
               <w:jc w:val="center"/>
-              <w:cnfStyle w:val="000000000000" w:firstRow="0" w:lastRow="0" w:firstColumn="0" w:lastColumn="0" w:oddVBand="0" w:evenVBand="0" w:oddHBand="0" w:evenHBand="0" w:firstRowFirstColumn="0" w:firstRowLastColumn="0" w:lastRowFirstColumn="0" w:lastRowLastColumn="0"/>
+              <w:cnfStyle w:val="000000100000" w:firstRow="0" w:lastRow="0" w:firstColumn="0" w:lastColumn="0" w:oddVBand="0" w:evenVBand="0" w:oddHBand="1" w:evenHBand="0" w:firstRowFirstColumn="0" w:firstRowLastColumn="0" w:lastRowFirstColumn="0" w:lastRowLastColumn="0"/>
             </w:pPr>
             <w:r>
               <w:t>16384</w:t>
@@ -19899,7 +19971,14 @@
           <w:b/>
           <w:bCs/>
         </w:rPr>
-        <w:t>7680</w:t>
+        <w:t>7</w:t>
+      </w:r>
+      <w:r>
+        <w:rPr>
+          <w:b/>
+          <w:bCs/>
+        </w:rPr>
+        <w:t>792</w:t>
       </w:r>
       <w:r>
         <w:t xml:space="preserve"> bytes</w:t>
@@ -19996,7 +20075,13 @@
         <w:t>game-bar</w:t>
       </w:r>
       <w:r>
-        <w:t xml:space="preserve"> sprite atlas at &amp;2F60, </w:t>
+        <w:t xml:space="preserve"> sprite atlas at &amp;2F</w:t>
+      </w:r>
+      <w:r>
+        <w:t>D</w:t>
+      </w:r>
+      <w:r>
+        <w:t xml:space="preserve">0, </w:t>
       </w:r>
       <w:r>
         <w:t xml:space="preserve">which is </w:t>
@@ -20105,7 +20190,7 @@
               <w:jc w:val="center"/>
             </w:pPr>
             <w:r>
-              <w:t>3040</w:t>
+              <w:t>20B0</w:t>
             </w:r>
           </w:p>
         </w:tc>
@@ -20116,6 +20201,52 @@
           <w:p>
             <w:pPr>
               <w:cnfStyle w:val="000000100000" w:firstRow="0" w:lastRow="0" w:firstColumn="0" w:lastColumn="0" w:oddVBand="0" w:evenVBand="0" w:oddHBand="1" w:evenHBand="0" w:firstRowFirstColumn="0" w:firstRowLastColumn="0" w:lastRowFirstColumn="0" w:lastRowLastColumn="0"/>
+            </w:pPr>
+            <w:r>
+              <w:t>Level palette</w:t>
+            </w:r>
+          </w:p>
+        </w:tc>
+        <w:tc>
+          <w:tcPr>
+            <w:tcW w:w="1260" w:type="dxa"/>
+          </w:tcPr>
+          <w:p>
+            <w:pPr>
+              <w:jc w:val="center"/>
+              <w:cnfStyle w:val="000000100000" w:firstRow="0" w:lastRow="0" w:firstColumn="0" w:lastColumn="0" w:oddVBand="0" w:evenVBand="0" w:oddHBand="1" w:evenHBand="0" w:firstRowFirstColumn="0" w:firstRowLastColumn="0" w:lastRowFirstColumn="0" w:lastRowLastColumn="0"/>
+            </w:pPr>
+            <w:r>
+              <w:t>16</w:t>
+            </w:r>
+          </w:p>
+        </w:tc>
+      </w:tr>
+      <w:tr>
+        <w:tc>
+          <w:tcPr>
+            <w:cnfStyle w:val="001000000000" w:firstRow="0" w:lastRow="0" w:firstColumn="1" w:lastColumn="0" w:oddVBand="0" w:evenVBand="0" w:oddHBand="0" w:evenHBand="0" w:firstRowFirstColumn="0" w:firstRowLastColumn="0" w:lastRowFirstColumn="0" w:lastRowLastColumn="0"/>
+            <w:tcW w:w="1345" w:type="dxa"/>
+          </w:tcPr>
+          <w:p>
+            <w:pPr>
+              <w:jc w:val="center"/>
+            </w:pPr>
+            <w:r>
+              <w:t>30</w:t>
+            </w:r>
+            <w:r>
+              <w:t>C0</w:t>
+            </w:r>
+          </w:p>
+        </w:tc>
+        <w:tc>
+          <w:tcPr>
+            <w:tcW w:w="6570" w:type="dxa"/>
+          </w:tcPr>
+          <w:p>
+            <w:pPr>
+              <w:cnfStyle w:val="000000000000" w:firstRow="0" w:lastRow="0" w:firstColumn="0" w:lastColumn="0" w:oddVBand="0" w:evenVBand="0" w:oddHBand="0" w:evenHBand="0" w:firstRowFirstColumn="0" w:firstRowLastColumn="0" w:lastRowFirstColumn="0" w:lastRowLastColumn="0"/>
             </w:pPr>
             <w:r>
               <w:t>Level tiles</w:t>
@@ -20129,15 +20260,18 @@
           <w:p>
             <w:pPr>
               <w:jc w:val="center"/>
-              <w:cnfStyle w:val="000000100000" w:firstRow="0" w:lastRow="0" w:firstColumn="0" w:lastColumn="0" w:oddVBand="0" w:evenVBand="0" w:oddHBand="1" w:evenHBand="0" w:firstRowFirstColumn="0" w:firstRowLastColumn="0" w:lastRowFirstColumn="0" w:lastRowLastColumn="0"/>
+              <w:cnfStyle w:val="000000000000" w:firstRow="0" w:lastRow="0" w:firstColumn="0" w:lastColumn="0" w:oddVBand="0" w:evenVBand="0" w:oddHBand="0" w:evenHBand="0" w:firstRowFirstColumn="0" w:firstRowLastColumn="0" w:lastRowFirstColumn="0" w:lastRowLastColumn="0"/>
             </w:pPr>
             <w:r>
-              <w:t>1984</w:t>
+              <w:t>1856</w:t>
             </w:r>
           </w:p>
         </w:tc>
       </w:tr>
       <w:tr>
+        <w:trPr>
+          <w:cnfStyle w:val="000000100000" w:firstRow="0" w:lastRow="0" w:firstColumn="0" w:lastColumn="0" w:oddVBand="0" w:evenVBand="0" w:oddHBand="1" w:evenHBand="0" w:firstRowFirstColumn="0" w:firstRowLastColumn="0" w:lastRowFirstColumn="0" w:lastRowLastColumn="0"/>
+        </w:trPr>
         <w:tc>
           <w:tcPr>
             <w:cnfStyle w:val="001000000000" w:firstRow="0" w:lastRow="0" w:firstColumn="1" w:lastColumn="0" w:oddVBand="0" w:evenVBand="0" w:oddHBand="0" w:evenHBand="0" w:firstRowFirstColumn="0" w:firstRowLastColumn="0" w:lastRowFirstColumn="0" w:lastRowLastColumn="0"/>
@@ -20158,7 +20292,7 @@
           </w:tcPr>
           <w:p>
             <w:pPr>
-              <w:cnfStyle w:val="000000000000" w:firstRow="0" w:lastRow="0" w:firstColumn="0" w:lastColumn="0" w:oddVBand="0" w:evenVBand="0" w:oddHBand="0" w:evenHBand="0" w:firstRowFirstColumn="0" w:firstRowLastColumn="0" w:lastRowFirstColumn="0" w:lastRowLastColumn="0"/>
+              <w:cnfStyle w:val="000000100000" w:firstRow="0" w:lastRow="0" w:firstColumn="0" w:lastColumn="0" w:oddVBand="0" w:evenVBand="0" w:oddHBand="1" w:evenHBand="0" w:firstRowFirstColumn="0" w:firstRowLastColumn="0" w:lastRowFirstColumn="0" w:lastRowLastColumn="0"/>
             </w:pPr>
             <w:r>
               <w:t>Level tile grid</w:t>
@@ -20172,7 +20306,7 @@
           <w:p>
             <w:pPr>
               <w:jc w:val="center"/>
-              <w:cnfStyle w:val="000000000000" w:firstRow="0" w:lastRow="0" w:firstColumn="0" w:lastColumn="0" w:oddVBand="0" w:evenVBand="0" w:oddHBand="0" w:evenHBand="0" w:firstRowFirstColumn="0" w:firstRowLastColumn="0" w:lastRowFirstColumn="0" w:lastRowLastColumn="0"/>
+              <w:cnfStyle w:val="000000100000" w:firstRow="0" w:lastRow="0" w:firstColumn="0" w:lastColumn="0" w:oddVBand="0" w:evenVBand="0" w:oddHBand="1" w:evenHBand="0" w:firstRowFirstColumn="0" w:firstRowLastColumn="0" w:lastRowFirstColumn="0" w:lastRowLastColumn="0"/>
             </w:pPr>
             <w:r>
               <w:t>2048</w:t>
@@ -20181,9 +20315,6 @@
         </w:tc>
       </w:tr>
       <w:tr>
-        <w:trPr>
-          <w:cnfStyle w:val="000000100000" w:firstRow="0" w:lastRow="0" w:firstColumn="0" w:lastColumn="0" w:oddVBand="0" w:evenVBand="0" w:oddHBand="1" w:evenHBand="0" w:firstRowFirstColumn="0" w:firstRowLastColumn="0" w:lastRowFirstColumn="0" w:lastRowLastColumn="0"/>
-        </w:trPr>
         <w:tc>
           <w:tcPr>
             <w:cnfStyle w:val="001000000000" w:firstRow="0" w:lastRow="0" w:firstColumn="1" w:lastColumn="0" w:oddVBand="0" w:evenVBand="0" w:oddHBand="0" w:evenHBand="0" w:firstRowFirstColumn="0" w:firstRowLastColumn="0" w:lastRowFirstColumn="0" w:lastRowLastColumn="0"/>
@@ -20206,7 +20337,7 @@
           </w:tcPr>
           <w:p>
             <w:pPr>
-              <w:cnfStyle w:val="000000100000" w:firstRow="0" w:lastRow="0" w:firstColumn="0" w:lastColumn="0" w:oddVBand="0" w:evenVBand="0" w:oddHBand="1" w:evenHBand="0" w:firstRowFirstColumn="0" w:firstRowLastColumn="0" w:lastRowFirstColumn="0" w:lastRowLastColumn="0"/>
+              <w:cnfStyle w:val="000000000000" w:firstRow="0" w:lastRow="0" w:firstColumn="0" w:lastColumn="0" w:oddVBand="0" w:evenVBand="0" w:oddHBand="0" w:evenHBand="0" w:firstRowFirstColumn="0" w:firstRowLastColumn="0" w:lastRowFirstColumn="0" w:lastRowLastColumn="0"/>
             </w:pPr>
             <w:r>
               <w:t>Level extents</w:t>
@@ -20221,7 +20352,7 @@
           <w:p>
             <w:pPr>
               <w:jc w:val="center"/>
-              <w:cnfStyle w:val="000000100000" w:firstRow="0" w:lastRow="0" w:firstColumn="0" w:lastColumn="0" w:oddVBand="0" w:evenVBand="0" w:oddHBand="1" w:evenHBand="0" w:firstRowFirstColumn="0" w:firstRowLastColumn="0" w:lastRowFirstColumn="0" w:lastRowLastColumn="0"/>
+              <w:cnfStyle w:val="000000000000" w:firstRow="0" w:lastRow="0" w:firstColumn="0" w:lastColumn="0" w:oddVBand="0" w:evenVBand="0" w:oddHBand="0" w:evenHBand="0" w:firstRowFirstColumn="0" w:firstRowLastColumn="0" w:lastRowFirstColumn="0" w:lastRowLastColumn="0"/>
             </w:pPr>
             <w:r>
               <w:t>2</w:t>
@@ -20230,6 +20361,9 @@
         </w:tc>
       </w:tr>
       <w:tr>
+        <w:trPr>
+          <w:cnfStyle w:val="000000100000" w:firstRow="0" w:lastRow="0" w:firstColumn="0" w:lastColumn="0" w:oddVBand="0" w:evenVBand="0" w:oddHBand="1" w:evenHBand="0" w:firstRowFirstColumn="0" w:firstRowLastColumn="0" w:lastRowFirstColumn="0" w:lastRowLastColumn="0"/>
+        </w:trPr>
         <w:tc>
           <w:tcPr>
             <w:cnfStyle w:val="001000000000" w:firstRow="0" w:lastRow="0" w:firstColumn="1" w:lastColumn="0" w:oddVBand="0" w:evenVBand="0" w:oddHBand="0" w:evenHBand="0" w:firstRowFirstColumn="0" w:firstRowLastColumn="0" w:lastRowFirstColumn="0" w:lastRowLastColumn="0"/>
@@ -20252,7 +20386,7 @@
           </w:tcPr>
           <w:p>
             <w:pPr>
-              <w:cnfStyle w:val="000000000000" w:firstRow="0" w:lastRow="0" w:firstColumn="0" w:lastColumn="0" w:oddVBand="0" w:evenVBand="0" w:oddHBand="0" w:evenHBand="0" w:firstRowFirstColumn="0" w:firstRowLastColumn="0" w:lastRowFirstColumn="0" w:lastRowLastColumn="0"/>
+              <w:cnfStyle w:val="000000100000" w:firstRow="0" w:lastRow="0" w:firstColumn="0" w:lastColumn="0" w:oddVBand="0" w:evenVBand="0" w:oddHBand="1" w:evenHBand="0" w:firstRowFirstColumn="0" w:firstRowLastColumn="0" w:lastRowFirstColumn="0" w:lastRowLastColumn="0"/>
             </w:pPr>
             <w:r>
               <w:t>Level tile types</w:t>
@@ -20267,59 +20401,13 @@
           <w:p>
             <w:pPr>
               <w:jc w:val="center"/>
-              <w:cnfStyle w:val="000000000000" w:firstRow="0" w:lastRow="0" w:firstColumn="0" w:lastColumn="0" w:oddVBand="0" w:evenVBand="0" w:oddHBand="0" w:evenHBand="0" w:firstRowFirstColumn="0" w:firstRowLastColumn="0" w:lastRowFirstColumn="0" w:lastRowLastColumn="0"/>
-            </w:pPr>
-            <w:r>
-              <w:t>32</w:t>
-            </w:r>
-          </w:p>
-        </w:tc>
-      </w:tr>
-      <w:tr>
-        <w:trPr>
-          <w:cnfStyle w:val="000000100000" w:firstRow="0" w:lastRow="0" w:firstColumn="0" w:lastColumn="0" w:oddVBand="0" w:evenVBand="0" w:oddHBand="1" w:evenHBand="0" w:firstRowFirstColumn="0" w:firstRowLastColumn="0" w:lastRowFirstColumn="0" w:lastRowLastColumn="0"/>
-        </w:trPr>
-        <w:tc>
-          <w:tcPr>
-            <w:cnfStyle w:val="001000000000" w:firstRow="0" w:lastRow="0" w:firstColumn="1" w:lastColumn="0" w:oddVBand="0" w:evenVBand="0" w:oddHBand="0" w:evenHBand="0" w:firstRowFirstColumn="0" w:firstRowLastColumn="0" w:lastRowFirstColumn="0" w:lastRowLastColumn="0"/>
-            <w:tcW w:w="1345" w:type="dxa"/>
-            <w:shd w:val="clear" w:color="auto" w:fill="E8E8E8" w:themeFill="background2"/>
-          </w:tcPr>
-          <w:p>
-            <w:pPr>
-              <w:jc w:val="center"/>
-            </w:pPr>
-            <w:r>
-              <w:t>4022</w:t>
-            </w:r>
-          </w:p>
-        </w:tc>
-        <w:tc>
-          <w:tcPr>
-            <w:tcW w:w="6570" w:type="dxa"/>
-            <w:shd w:val="clear" w:color="auto" w:fill="E8E8E8" w:themeFill="background2"/>
-          </w:tcPr>
-          <w:p>
-            <w:pPr>
               <w:cnfStyle w:val="000000100000" w:firstRow="0" w:lastRow="0" w:firstColumn="0" w:lastColumn="0" w:oddVBand="0" w:evenVBand="0" w:oddHBand="1" w:evenHBand="0" w:firstRowFirstColumn="0" w:firstRowLastColumn="0" w:lastRowFirstColumn="0" w:lastRowLastColumn="0"/>
             </w:pPr>
             <w:r>
-              <w:t>Level palette</w:t>
+              <w:t>3</w:t>
             </w:r>
-          </w:p>
-        </w:tc>
-        <w:tc>
-          <w:tcPr>
-            <w:tcW w:w="1260" w:type="dxa"/>
-            <w:shd w:val="clear" w:color="auto" w:fill="E8E8E8" w:themeFill="background2"/>
-          </w:tcPr>
-          <w:p>
-            <w:pPr>
-              <w:jc w:val="center"/>
-              <w:cnfStyle w:val="000000100000" w:firstRow="0" w:lastRow="0" w:firstColumn="0" w:lastColumn="0" w:oddVBand="0" w:evenVBand="0" w:oddHBand="1" w:evenHBand="0" w:firstRowFirstColumn="0" w:firstRowLastColumn="0" w:lastRowFirstColumn="0" w:lastRowLastColumn="0"/>
-            </w:pPr>
             <w:r>
-              <w:t>16</w:t>
+              <w:t>0</w:t>
             </w:r>
           </w:p>
         </w:tc>
@@ -20336,7 +20424,10 @@
               <w:jc w:val="center"/>
             </w:pPr>
             <w:r>
-              <w:t>4032</w:t>
+              <w:t>40</w:t>
+            </w:r>
+            <w:r>
+              <w:t>20</w:t>
             </w:r>
           </w:p>
         </w:tc>
@@ -20350,10 +20441,7 @@
               <w:cnfStyle w:val="000000000000" w:firstRow="0" w:lastRow="0" w:firstColumn="0" w:lastColumn="0" w:oddVBand="0" w:evenVBand="0" w:oddHBand="0" w:evenHBand="0" w:firstRowFirstColumn="0" w:firstRowLastColumn="0" w:lastRowFirstColumn="0" w:lastRowLastColumn="0"/>
             </w:pPr>
             <w:r>
-              <w:t xml:space="preserve">Level </w:t>
-            </w:r>
-            <w:r>
-              <w:t>settings</w:t>
+              <w:t>Level settings</w:t>
             </w:r>
           </w:p>
         </w:tc>
@@ -20391,10 +20479,7 @@
               <w:t>40</w:t>
             </w:r>
             <w:r>
-              <w:t>3</w:t>
-            </w:r>
-            <w:r>
-              <w:t>7</w:t>
+              <w:t>25</w:t>
             </w:r>
           </w:p>
         </w:tc>
@@ -20440,13 +20525,7 @@
               <w:jc w:val="center"/>
             </w:pPr>
             <w:r>
-              <w:t>4</w:t>
-            </w:r>
-            <w:r>
-              <w:t>0C</w:t>
-            </w:r>
-            <w:r>
-              <w:t>7</w:t>
+              <w:t>40B5</w:t>
             </w:r>
           </w:p>
         </w:tc>
@@ -20475,10 +20554,7 @@
               <w:cnfStyle w:val="000000000000" w:firstRow="0" w:lastRow="0" w:firstColumn="0" w:lastColumn="0" w:oddVBand="0" w:evenVBand="0" w:oddHBand="0" w:evenHBand="0" w:firstRowFirstColumn="0" w:firstRowLastColumn="0" w:lastRowFirstColumn="0" w:lastRowLastColumn="0"/>
             </w:pPr>
             <w:r>
-              <w:t>36</w:t>
-            </w:r>
-            <w:r>
-              <w:t>16</w:t>
+              <w:t>3616</w:t>
             </w:r>
           </w:p>
         </w:tc>
@@ -20498,7 +20574,7 @@
               <w:jc w:val="center"/>
             </w:pPr>
             <w:r>
-              <w:t>4EE7</w:t>
+              <w:t>4ED5</w:t>
             </w:r>
           </w:p>
         </w:tc>
@@ -20527,10 +20603,7 @@
               <w:cnfStyle w:val="000000100000" w:firstRow="0" w:lastRow="0" w:firstColumn="0" w:lastColumn="0" w:oddVBand="0" w:evenVBand="0" w:oddHBand="1" w:evenHBand="0" w:firstRowFirstColumn="0" w:firstRowLastColumn="0" w:lastRowFirstColumn="0" w:lastRowLastColumn="0"/>
             </w:pPr>
             <w:r>
-              <w:t>1</w:t>
-            </w:r>
-            <w:r>
-              <w:t>569</w:t>
+              <w:t>1569</w:t>
             </w:r>
           </w:p>
         </w:tc>
@@ -20547,7 +20620,7 @@
               <w:jc w:val="center"/>
             </w:pPr>
             <w:r>
-              <w:t>5508</w:t>
+              <w:t>54F6</w:t>
             </w:r>
           </w:p>
         </w:tc>
@@ -20576,10 +20649,10 @@
               <w:cnfStyle w:val="000000000000" w:firstRow="0" w:lastRow="0" w:firstColumn="0" w:lastColumn="0" w:oddVBand="0" w:evenVBand="0" w:oddHBand="0" w:evenHBand="0" w:firstRowFirstColumn="0" w:firstRowLastColumn="0" w:lastRowFirstColumn="0" w:lastRowLastColumn="0"/>
             </w:pPr>
             <w:r>
-              <w:t>2</w:t>
+              <w:t>26</w:t>
             </w:r>
             <w:r>
-              <w:t>621</w:t>
+              <w:t>39</w:t>
             </w:r>
           </w:p>
         </w:tc>
@@ -20631,10 +20704,7 @@
               <w:t>32</w:t>
             </w:r>
             <w:r>
-              <w:t>1</w:t>
-            </w:r>
-            <w:r>
-              <w:t>3</w:t>
+              <w:t>16</w:t>
             </w:r>
           </w:p>
         </w:tc>
@@ -20658,7 +20728,7 @@
               <w:t>6BD</w:t>
             </w:r>
             <w:r>
-              <w:t>2</w:t>
+              <w:t>5</w:t>
             </w:r>
           </w:p>
         </w:tc>
@@ -20698,7 +20768,7 @@
               </w:rPr>
             </w:pPr>
             <w:r>
-              <w:t>916</w:t>
+              <w:t>659</w:t>
             </w:r>
           </w:p>
         </w:tc>
@@ -20711,7 +20781,7 @@
           <w:tcPr>
             <w:cnfStyle w:val="001000000000" w:firstRow="0" w:lastRow="0" w:firstColumn="1" w:lastColumn="0" w:oddVBand="0" w:evenVBand="0" w:oddHBand="0" w:evenHBand="0" w:firstRowFirstColumn="0" w:firstRowLastColumn="0" w:lastRowFirstColumn="0" w:lastRowLastColumn="0"/>
             <w:tcW w:w="1345" w:type="dxa"/>
-            <w:shd w:val="clear" w:color="auto" w:fill="DAE9F7" w:themeFill="text2" w:themeFillTint="1A"/>
+            <w:shd w:val="clear" w:color="auto" w:fill="E8E8E8" w:themeFill="background2"/>
           </w:tcPr>
           <w:p>
             <w:pPr>
@@ -20721,7 +20791,7 @@
               <w:t>6</w:t>
             </w:r>
             <w:r>
-              <w:t>F</w:t>
+              <w:t>E</w:t>
             </w:r>
             <w:r>
               <w:t>66</w:t>
@@ -20731,7 +20801,7 @@
         <w:tc>
           <w:tcPr>
             <w:tcW w:w="6570" w:type="dxa"/>
-            <w:shd w:val="clear" w:color="auto" w:fill="DAE9F7" w:themeFill="text2" w:themeFillTint="1A"/>
+            <w:shd w:val="clear" w:color="auto" w:fill="E8E8E8" w:themeFill="background2"/>
           </w:tcPr>
           <w:p>
             <w:pPr>
@@ -20745,7 +20815,7 @@
         <w:tc>
           <w:tcPr>
             <w:tcW w:w="1260" w:type="dxa"/>
-            <w:shd w:val="clear" w:color="auto" w:fill="DAE9F7" w:themeFill="text2" w:themeFillTint="1A"/>
+            <w:shd w:val="clear" w:color="auto" w:fill="E8E8E8" w:themeFill="background2"/>
           </w:tcPr>
           <w:p>
             <w:pPr>
@@ -20759,6 +20829,55 @@
         </w:tc>
       </w:tr>
       <w:tr>
+        <w:tc>
+          <w:tcPr>
+            <w:cnfStyle w:val="001000000000" w:firstRow="0" w:lastRow="0" w:firstColumn="1" w:lastColumn="0" w:oddVBand="0" w:evenVBand="0" w:oddHBand="0" w:evenHBand="0" w:firstRowFirstColumn="0" w:firstRowLastColumn="0" w:lastRowFirstColumn="0" w:lastRowLastColumn="0"/>
+            <w:tcW w:w="1345" w:type="dxa"/>
+            <w:shd w:val="clear" w:color="auto" w:fill="F2CEED" w:themeFill="accent5" w:themeFillTint="33"/>
+          </w:tcPr>
+          <w:p>
+            <w:pPr>
+              <w:jc w:val="center"/>
+            </w:pPr>
+            <w:r>
+              <w:t>7B00</w:t>
+            </w:r>
+          </w:p>
+        </w:tc>
+        <w:tc>
+          <w:tcPr>
+            <w:tcW w:w="6570" w:type="dxa"/>
+            <w:shd w:val="clear" w:color="auto" w:fill="F2CEED" w:themeFill="accent5" w:themeFillTint="33"/>
+          </w:tcPr>
+          <w:p>
+            <w:pPr>
+              <w:cnfStyle w:val="000000000000" w:firstRow="0" w:lastRow="0" w:firstColumn="0" w:lastColumn="0" w:oddVBand="0" w:evenVBand="0" w:oddHBand="0" w:evenHBand="0" w:firstRowFirstColumn="0" w:firstRowLastColumn="0" w:lastRowFirstColumn="0" w:lastRowLastColumn="0"/>
+            </w:pPr>
+            <w:r>
+              <w:t>Load level page backup</w:t>
+            </w:r>
+          </w:p>
+        </w:tc>
+        <w:tc>
+          <w:tcPr>
+            <w:tcW w:w="1260" w:type="dxa"/>
+            <w:shd w:val="clear" w:color="auto" w:fill="F2CEED" w:themeFill="accent5" w:themeFillTint="33"/>
+          </w:tcPr>
+          <w:p>
+            <w:pPr>
+              <w:jc w:val="center"/>
+              <w:cnfStyle w:val="000000000000" w:firstRow="0" w:lastRow="0" w:firstColumn="0" w:lastColumn="0" w:oddVBand="0" w:evenVBand="0" w:oddHBand="0" w:evenHBand="0" w:firstRowFirstColumn="0" w:firstRowLastColumn="0" w:lastRowFirstColumn="0" w:lastRowLastColumn="0"/>
+            </w:pPr>
+            <w:r>
+              <w:t>256</w:t>
+            </w:r>
+          </w:p>
+        </w:tc>
+      </w:tr>
+      <w:tr>
+        <w:trPr>
+          <w:cnfStyle w:val="000000100000" w:firstRow="0" w:lastRow="0" w:firstColumn="0" w:lastColumn="0" w:oddVBand="0" w:evenVBand="0" w:oddHBand="1" w:evenHBand="0" w:firstRowFirstColumn="0" w:firstRowLastColumn="0" w:lastRowFirstColumn="0" w:lastRowLastColumn="0"/>
+        </w:trPr>
         <w:tc>
           <w:tcPr>
             <w:cnfStyle w:val="001000000000" w:firstRow="0" w:lastRow="0" w:firstColumn="1" w:lastColumn="0" w:oddVBand="0" w:evenVBand="0" w:oddHBand="0" w:evenHBand="0" w:firstRowFirstColumn="0" w:firstRowLastColumn="0" w:lastRowFirstColumn="0" w:lastRowLastColumn="0"/>
@@ -20781,7 +20900,7 @@
           </w:tcPr>
           <w:p>
             <w:pPr>
-              <w:cnfStyle w:val="000000000000" w:firstRow="0" w:lastRow="0" w:firstColumn="0" w:lastColumn="0" w:oddVBand="0" w:evenVBand="0" w:oddHBand="0" w:evenHBand="0" w:firstRowFirstColumn="0" w:firstRowLastColumn="0" w:lastRowFirstColumn="0" w:lastRowLastColumn="0"/>
+              <w:cnfStyle w:val="000000100000" w:firstRow="0" w:lastRow="0" w:firstColumn="0" w:lastColumn="0" w:oddVBand="0" w:evenVBand="0" w:oddHBand="1" w:evenHBand="0" w:firstRowFirstColumn="0" w:firstRowLastColumn="0" w:lastRowFirstColumn="0" w:lastRowLastColumn="0"/>
             </w:pPr>
             <w:r>
               <w:t>Mode 7 screen</w:t>
@@ -20796,7 +20915,7 @@
           <w:p>
             <w:pPr>
               <w:jc w:val="center"/>
-              <w:cnfStyle w:val="000000000000" w:firstRow="0" w:lastRow="0" w:firstColumn="0" w:lastColumn="0" w:oddVBand="0" w:evenVBand="0" w:oddHBand="0" w:evenHBand="0" w:firstRowFirstColumn="0" w:firstRowLastColumn="0" w:lastRowFirstColumn="0" w:lastRowLastColumn="0"/>
+              <w:cnfStyle w:val="000000100000" w:firstRow="0" w:lastRow="0" w:firstColumn="0" w:lastColumn="0" w:oddVBand="0" w:evenVBand="0" w:oddHBand="1" w:evenHBand="0" w:firstRowFirstColumn="0" w:firstRowLastColumn="0" w:lastRowFirstColumn="0" w:lastRowLastColumn="0"/>
             </w:pPr>
             <w:r>
               <w:t>1024</w:t>
@@ -20881,6 +21000,23 @@
     </w:p>
     <w:p>
       <w:r>
+        <w:t xml:space="preserve">The light purple row shows a page backup buffer that is used to </w:t>
+      </w:r>
+      <w:r>
+        <w:t xml:space="preserve">save and </w:t>
+      </w:r>
+      <w:r>
+        <w:t xml:space="preserve">restore code </w:t>
+      </w:r>
+      <w:r>
+        <w:t xml:space="preserve">(in Page &amp;17) </w:t>
+      </w:r>
+      <w:r>
+        <w:t>that DFS overwrites.</w:t>
+      </w:r>
+    </w:p>
+    <w:p>
+      <w:r>
         <w:t>During startup the title screen</w:t>
       </w:r>
       <w:r>
@@ -20925,6 +21061,7 @@
     </w:p>
     <w:p>
       <w:r>
+        <w:lastRenderedPageBreak/>
         <w:t>The memory layout evolved during the development of the game, with allocation</w:t>
       </w:r>
       <w:r>
@@ -20968,7 +21105,6 @@
         </w:numPr>
       </w:pPr>
       <w:r>
-        <w:lastRenderedPageBreak/>
         <w:t>Unrolled</w:t>
       </w:r>
       <w:r>
@@ -21386,6 +21522,7 @@
         </w:numPr>
       </w:pPr>
       <w:r>
+        <w:lastRenderedPageBreak/>
         <w:t>Refactored program and level initialization, pushing as much code as possible out of the gameplay code area.</w:t>
       </w:r>
     </w:p>
@@ -21531,7 +21668,6 @@
         </w:numPr>
       </w:pPr>
       <w:r>
-        <w:lastRenderedPageBreak/>
         <w:t xml:space="preserve">Bit-packed </w:t>
       </w:r>
       <w:r>
@@ -22188,6 +22324,7 @@
         </w:rPr>
       </w:pPr>
       <w:r>
+        <w:lastRenderedPageBreak/>
         <w:t>16-bit unsigned number</w:t>
       </w:r>
       <w:r>
@@ -22388,7 +22525,6 @@
         <w:pStyle w:val="Heading2"/>
       </w:pPr>
       <w:r>
-        <w:lastRenderedPageBreak/>
         <w:t>Cod</w:t>
       </w:r>
       <w:r>
@@ -22928,6 +23064,7 @@
     </w:p>
     <w:p>
       <w:r>
+        <w:lastRenderedPageBreak/>
         <w:t>The following choices were made to make th</w:t>
       </w:r>
       <w:r>
@@ -23007,187 +23144,187 @@
         <w:t>.</w:t>
       </w:r>
       <w:r>
-        <w:t xml:space="preserve">  When K9’s health is low, the </w:t>
+        <w:t xml:space="preserve">  When K9’s health is low, the laser cannot be used and the health bar in the game bar changes color.  To reinforce low health, a </w:t>
+      </w:r>
+      <w:r>
+        <w:t>heart rate monitor beep is sounded every second or so.  This becomes a continuous tone if K9 dies.</w:t>
+      </w:r>
+    </w:p>
+    <w:p>
+      <w:r>
+        <w:t>If K9 dies, the current level is restated.  The user can also choose to restart the current level if they become stuck</w:t>
+      </w:r>
+      <w:r>
+        <w:t>, by pressing the ‘R’ key.</w:t>
+      </w:r>
+    </w:p>
+    <w:p>
+      <w:r>
+        <w:t>And unlike many 1980’s games, t</w:t>
+      </w:r>
+      <w:r>
+        <w:t xml:space="preserve">he player </w:t>
+      </w:r>
+      <w:r>
+        <w:t xml:space="preserve">direction </w:t>
+      </w:r>
+      <w:r>
+        <w:t xml:space="preserve">keys </w:t>
+      </w:r>
+      <w:r>
+        <w:t xml:space="preserve">are </w:t>
+      </w:r>
+      <w:r>
+        <w:t>W</w:t>
+      </w:r>
+      <w:r>
+        <w:t>ASD</w:t>
+      </w:r>
+      <w:r>
+        <w:t>.</w:t>
+      </w:r>
+    </w:p>
+    <w:p>
+      <w:r>
+        <w:t>Locked doors and keys are used to add a puzzle element to the game.</w:t>
+      </w:r>
+      <w:r>
+        <w:t xml:space="preserve">  Key</w:t>
+      </w:r>
+      <w:r>
+        <w:t>s</w:t>
+      </w:r>
+      <w:r>
+        <w:t xml:space="preserve"> can be collected and then used to </w:t>
+      </w:r>
+      <w:r>
+        <w:t xml:space="preserve">pass </w:t>
+      </w:r>
+      <w:r>
+        <w:t xml:space="preserve">through </w:t>
+      </w:r>
+      <w:r>
+        <w:t xml:space="preserve">locked </w:t>
+      </w:r>
+      <w:r>
+        <w:t xml:space="preserve">doors, </w:t>
+      </w:r>
+      <w:r>
+        <w:t>after which they are used.</w:t>
+      </w:r>
+      <w:r>
+        <w:t xml:space="preserve">  </w:t>
+      </w:r>
+      <w:r>
+        <w:t xml:space="preserve">Doors stay unlocked until a Darek uses them.  </w:t>
+      </w:r>
+      <w:r>
+        <w:t>Alternatively</w:t>
+      </w:r>
+      <w:r>
+        <w:t xml:space="preserve">, </w:t>
+      </w:r>
+      <w:r>
+        <w:t xml:space="preserve">K9 can follow a Dalek </w:t>
+      </w:r>
+      <w:r>
+        <w:t>through a door.</w:t>
+      </w:r>
+    </w:p>
+    <w:p>
+      <w:r>
+        <w:t>Other</w:t>
+      </w:r>
+      <w:r>
+        <w:t xml:space="preserve"> puzzle element</w:t>
+      </w:r>
+      <w:r>
+        <w:t>s</w:t>
+      </w:r>
+      <w:r>
+        <w:t xml:space="preserve"> of the game </w:t>
+      </w:r>
+      <w:r>
+        <w:t xml:space="preserve">include getting a Dalek to follow K9, and then hiding K9 behind a door, blocking a Dalek from using an elevator for a specific amount of time, </w:t>
+      </w:r>
+      <w:r>
+        <w:t>and using a Dalek to hide from another one.</w:t>
+      </w:r>
+    </w:p>
+    <w:p>
+      <w:r>
+        <w:t>To hold the attention of the player, each level can have its own palette and sprite definitions.</w:t>
+      </w:r>
+      <w:r>
+        <w:t xml:space="preserve">  The relative strength of jewels and Daleks can also be configured.</w:t>
+      </w:r>
+    </w:p>
+    <w:p>
+      <w:r>
+        <w:t xml:space="preserve">The above choices hopefully give the game a more modern feeling, where gameplay is more open, and the consequences of dying </w:t>
+      </w:r>
+      <w:r>
+        <w:t xml:space="preserve">less </w:t>
+      </w:r>
+      <w:r>
+        <w:t>severe.</w:t>
+      </w:r>
+      <w:r>
+        <w:t xml:space="preserve">  That said, there are no saved </w:t>
+      </w:r>
+      <w:r>
+        <w:t>checkpoints,</w:t>
+      </w:r>
+      <w:r>
+        <w:t xml:space="preserve"> </w:t>
+      </w:r>
+      <w:r>
+        <w:t xml:space="preserve">so the game </w:t>
+      </w:r>
+      <w:r>
+        <w:t>must</w:t>
+      </w:r>
+      <w:r>
+        <w:t xml:space="preserve"> be played from start to finish in one go (unless an emulator is used).</w:t>
+      </w:r>
+    </w:p>
+    <w:p>
+      <w:pPr>
+        <w:pStyle w:val="Heading2"/>
+      </w:pPr>
+      <w:r>
+        <w:t>Missteps</w:t>
+      </w:r>
+    </w:p>
+    <w:p>
+      <w:r>
+        <w:t>From reading this document, it may appear that every decision taken was a good one, and things were fully thought though before implementation began, and that coding was purely a typing exercise, and that development proceeded without detours or missteps.  This was not the case.</w:t>
+      </w:r>
+    </w:p>
+    <w:p>
+      <w:r>
+        <w:t xml:space="preserve">The reality is that developing code is an iterative process (at least for me) where I build out a spike of functionality, flush it out, build on it, rework it, and then refine it.  I then pursue another area of functionality in a similar manner occasionally going back to </w:t>
+      </w:r>
+      <w:r>
+        <w:t>revisit and rework early work</w:t>
+      </w:r>
+      <w:r>
+        <w:t>, while always trying to improve on what I have.  Sometimes, the code becomes complex or convoluted, and the path forward is less clear</w:t>
+      </w:r>
+      <w:r>
+        <w:t xml:space="preserve"> and </w:t>
+      </w:r>
+      <w:r>
+        <w:t xml:space="preserve">harder to pursue.  </w:t>
       </w:r>
       <w:r>
         <w:lastRenderedPageBreak/>
-        <w:t xml:space="preserve">laser cannot be used and the health bar in the game bar changes color.  To reinforce low health, a </w:t>
-      </w:r>
-      <w:r>
-        <w:t>heart rate monitor beep is sounded every second or so.  This becomes a continuous tone if K9 dies.</w:t>
-      </w:r>
-    </w:p>
-    <w:p>
-      <w:r>
-        <w:t>If K9 dies, the current level is restated.  The user can also choose to restart the current level if they become stuck</w:t>
-      </w:r>
-      <w:r>
-        <w:t>, by pressing the ‘R’ key.</w:t>
-      </w:r>
-    </w:p>
-    <w:p>
-      <w:r>
-        <w:t>And unlike many 1980’s games, t</w:t>
-      </w:r>
-      <w:r>
-        <w:t xml:space="preserve">he player </w:t>
-      </w:r>
-      <w:r>
-        <w:t xml:space="preserve">direction </w:t>
-      </w:r>
-      <w:r>
-        <w:t xml:space="preserve">keys </w:t>
-      </w:r>
-      <w:r>
-        <w:t xml:space="preserve">are </w:t>
-      </w:r>
-      <w:r>
-        <w:t>W</w:t>
-      </w:r>
-      <w:r>
-        <w:t>ASD</w:t>
-      </w:r>
-      <w:r>
-        <w:t>.</w:t>
-      </w:r>
-    </w:p>
-    <w:p>
-      <w:r>
-        <w:t>Locked doors and keys are used to add a puzzle element to the game.</w:t>
-      </w:r>
-      <w:r>
-        <w:t xml:space="preserve">  Key</w:t>
+        <w:t>This is normally an indication that there is something inherently wrong or missing with the approach, or underlying data structures, so one steps back and revisit</w:t>
       </w:r>
       <w:r>
         <w:t>s</w:t>
       </w:r>
       <w:r>
-        <w:t xml:space="preserve"> can be collected and then used to </w:t>
-      </w:r>
-      <w:r>
-        <w:t xml:space="preserve">pass </w:t>
-      </w:r>
-      <w:r>
-        <w:t xml:space="preserve">through </w:t>
-      </w:r>
-      <w:r>
-        <w:t xml:space="preserve">locked </w:t>
-      </w:r>
-      <w:r>
-        <w:t xml:space="preserve">doors, </w:t>
-      </w:r>
-      <w:r>
-        <w:t>after which they are used.</w:t>
-      </w:r>
-      <w:r>
-        <w:t xml:space="preserve">  </w:t>
-      </w:r>
-      <w:r>
-        <w:t xml:space="preserve">Doors stay unlocked until a Darek uses them.  </w:t>
-      </w:r>
-      <w:r>
-        <w:t>Alternatively</w:t>
-      </w:r>
-      <w:r>
-        <w:t xml:space="preserve">, </w:t>
-      </w:r>
-      <w:r>
-        <w:t xml:space="preserve">K9 can follow a Dalek </w:t>
-      </w:r>
-      <w:r>
-        <w:t>through a door.</w:t>
-      </w:r>
-    </w:p>
-    <w:p>
-      <w:r>
-        <w:t>Other</w:t>
-      </w:r>
-      <w:r>
-        <w:t xml:space="preserve"> puzzle element</w:t>
-      </w:r>
-      <w:r>
-        <w:t>s</w:t>
-      </w:r>
-      <w:r>
-        <w:t xml:space="preserve"> of the game </w:t>
-      </w:r>
-      <w:r>
-        <w:t xml:space="preserve">include getting a Dalek to follow K9, and then hiding K9 behind a door, blocking a Dalek from using an elevator for a specific amount of time, </w:t>
-      </w:r>
-      <w:r>
-        <w:t>and using a Dalek to hide from another one.</w:t>
-      </w:r>
-    </w:p>
-    <w:p>
-      <w:r>
-        <w:t>To hold the attention of the player, each level can have its own palette and sprite definitions.</w:t>
-      </w:r>
-      <w:r>
-        <w:t xml:space="preserve">  The relative strength of jewels and Daleks can also be configured.</w:t>
-      </w:r>
-    </w:p>
-    <w:p>
-      <w:r>
-        <w:t xml:space="preserve">The above choices hopefully give the game a more modern feeling, where gameplay is more open, and the consequences of dying </w:t>
-      </w:r>
-      <w:r>
-        <w:t xml:space="preserve">less </w:t>
-      </w:r>
-      <w:r>
-        <w:t>severe.</w:t>
-      </w:r>
-      <w:r>
-        <w:t xml:space="preserve">  That said, there are no saved </w:t>
-      </w:r>
-      <w:r>
-        <w:t>checkpoints,</w:t>
-      </w:r>
-      <w:r>
-        <w:t xml:space="preserve"> </w:t>
-      </w:r>
-      <w:r>
-        <w:t xml:space="preserve">so the game </w:t>
-      </w:r>
-      <w:r>
-        <w:t>must</w:t>
-      </w:r>
-      <w:r>
-        <w:t xml:space="preserve"> be played from start to finish in one go (unless an emulator is used).</w:t>
-      </w:r>
-    </w:p>
-    <w:p>
-      <w:pPr>
-        <w:pStyle w:val="Heading2"/>
-      </w:pPr>
-      <w:r>
-        <w:t>Missteps</w:t>
-      </w:r>
-    </w:p>
-    <w:p>
-      <w:r>
-        <w:t>From reading this document, it may appear that every decision taken was a good one, and things were fully thought though before implementation began, and that coding was purely a typing exercise, and that development proceeded without detours or missteps.  This was not the case.</w:t>
-      </w:r>
-    </w:p>
-    <w:p>
-      <w:r>
-        <w:t xml:space="preserve">The reality is that developing code is an iterative process (at least for me) where I build out a spike of functionality, flush it out, build on it, rework it, and then refine it.  I then pursue another area of functionality in a similar manner occasionally going back to </w:t>
-      </w:r>
-      <w:r>
-        <w:t>revisit and rework early work</w:t>
-      </w:r>
-      <w:r>
-        <w:t>, while always trying to improve on what I have.  Sometimes, the code becomes complex or convoluted, and the path forward is less clear</w:t>
-      </w:r>
-      <w:r>
-        <w:t xml:space="preserve"> and </w:t>
-      </w:r>
-      <w:r>
-        <w:t>harder to pursue.  This is normally an indication that there is something inherently wrong or missing with the approach, or underlying data structures, so one steps back and revisit</w:t>
-      </w:r>
-      <w:r>
-        <w:t>s</w:t>
-      </w:r>
-      <w:r>
         <w:t xml:space="preserve"> previous decisions and choices.  </w:t>
       </w:r>
       <w:r>
@@ -23202,7 +23339,6 @@
     </w:p>
     <w:p>
       <w:r>
-        <w:lastRenderedPageBreak/>
         <w:t>Here are a few examples of approaches taken that turned out not to be the best choices.  I include these as they may be of interest.</w:t>
       </w:r>
     </w:p>
@@ -23438,6 +23574,7 @@
           <w:b/>
           <w:bCs/>
         </w:rPr>
+        <w:lastRenderedPageBreak/>
         <w:t>Constants</w:t>
       </w:r>
       <w:r>
@@ -23477,11 +23614,7 @@
         <w:t xml:space="preserve"> </w:t>
       </w:r>
       <w:r>
-        <w:t xml:space="preserve">which was difficult </w:t>
-      </w:r>
-      <w:r>
-        <w:lastRenderedPageBreak/>
-        <w:t>to reproduce</w:t>
+        <w:t>which was difficult to reproduce</w:t>
       </w:r>
       <w:r>
         <w:t xml:space="preserve"> and diagnose</w:t>
@@ -23636,7 +23769,7 @@
     <mc:AlternateContent>
       <mc:Choice Requires="v">
         <w:pict>
-          <v:shapetype w14:anchorId="1789FDCE" id="_x0000_t75" coordsize="21600,21600" o:spt="75" o:preferrelative="t" path="m@4@5l@4@11@9@11@9@5xe" filled="f" stroked="f">
+          <v:shapetype w14:anchorId="545C8D75" id="_x0000_t75" coordsize="21600,21600" o:spt="75" o:preferrelative="t" path="m@4@5l@4@11@9@11@9@5xe" filled="f" stroked="f">
             <v:stroke joinstyle="miter"/>
             <v:formulas>
               <v:f eqn="if lineDrawn pixelLineWidth 0"/>
@@ -23662,10 +23795,10 @@
       </mc:Choice>
       <mc:Fallback>
         <w:drawing>
-          <wp:inline distT="0" distB="0" distL="0" distR="0" wp14:anchorId="35323913" wp14:editId="62C4621F">
+          <wp:inline distT="0" distB="0" distL="0" distR="0" wp14:anchorId="547C1A4B" wp14:editId="38098231">
             <wp:extent cx="194650" cy="145988"/>
             <wp:effectExtent l="0" t="0" r="0" b="6985"/>
-            <wp:docPr id="1793454136" name="Picture 1"/>
+            <wp:docPr id="9350732" name="Picture 1"/>
             <wp:cNvGraphicFramePr>
               <a:graphicFrameLocks xmlns:a="http://schemas.openxmlformats.org/drawingml/2006/main" noChangeAspect="1"/>
             </wp:cNvGraphicFramePr>
@@ -23703,17 +23836,17 @@
     <mc:AlternateContent>
       <mc:Choice Requires="v">
         <w:pict>
-          <v:shape w14:anchorId="356942AC" id="Picture 1" o:spid="_x0000_i1025" type="#_x0000_t75" style="width:15.7pt;height:11.75pt;visibility:visible;mso-wrap-style:square">
+          <v:shape w14:anchorId="59898ACF" id="Picture 1" o:spid="_x0000_i1025" type="#_x0000_t75" style="width:15.7pt;height:11.75pt;visibility:visible;mso-wrap-style:square">
             <v:imagedata r:id="rId3" o:title=""/>
           </v:shape>
         </w:pict>
       </mc:Choice>
       <mc:Fallback>
         <w:drawing>
-          <wp:inline distT="0" distB="0" distL="0" distR="0" wp14:anchorId="22F51F66" wp14:editId="30C24141">
+          <wp:inline distT="0" distB="0" distL="0" distR="0" wp14:anchorId="5FD46E8F" wp14:editId="73A25F34">
             <wp:extent cx="199177" cy="149383"/>
             <wp:effectExtent l="0" t="0" r="0" b="3175"/>
-            <wp:docPr id="664620130" name="Picture 1"/>
+            <wp:docPr id="953573011" name="Picture 1"/>
             <wp:cNvGraphicFramePr>
               <a:graphicFrameLocks xmlns:a="http://schemas.openxmlformats.org/drawingml/2006/main" noChangeAspect="1"/>
             </wp:cNvGraphicFramePr>

</xml_diff>

<commit_message>
Fixed regression where finale experience failed to load.  Also fixed a couple of typos
</commit_message>
<xml_diff>
--- a/docs/Development.docx
+++ b/docs/Development.docx
@@ -13958,13 +13958,16 @@
         <w:t xml:space="preserve"> </w:t>
       </w:r>
       <w:r>
-        <w:t>the game</w:t>
+        <w:t>it</w:t>
       </w:r>
       <w:r>
         <w:t>.</w:t>
       </w:r>
       <w:r>
-        <w:t xml:space="preserve">  This led to a number of great suggestions, which included:</w:t>
+        <w:t xml:space="preserve">  This led to a number of great suggestions, which included</w:t>
+      </w:r>
+      <w:r>
+        <w:t>:</w:t>
       </w:r>
     </w:p>
     <w:tbl>
@@ -14436,7 +14439,10 @@
     <w:p>
       <w:r>
         <w:lastRenderedPageBreak/>
-        <w:t>In addition to these</w:t>
+        <w:t xml:space="preserve">In addition to </w:t>
+      </w:r>
+      <w:r>
+        <w:t>this</w:t>
       </w:r>
       <w:r>
         <w:t>,</w:t>
@@ -19995,10 +20001,10 @@
           <w:noProof/>
         </w:rPr>
         <w:drawing>
-          <wp:inline distT="0" distB="0" distL="0" distR="0" wp14:anchorId="4EF7849E" wp14:editId="0352B58B">
-            <wp:extent cx="1709530" cy="1367624"/>
-            <wp:effectExtent l="38100" t="38100" r="100330" b="99695"/>
-            <wp:docPr id="672985593" name="Picture 1" descr="A screen shot of a computer screen&#10;&#10;AI-generated content may be incorrect."/>
+          <wp:inline distT="0" distB="0" distL="0" distR="0" wp14:anchorId="54AF830C" wp14:editId="36266F10">
+            <wp:extent cx="1709047" cy="1367238"/>
+            <wp:effectExtent l="38100" t="38100" r="100965" b="99695"/>
+            <wp:docPr id="435584078" name="Picture 1" descr="A screen shot of a computer screen&#10;&#10;AI-generated content may be incorrect."/>
             <wp:cNvGraphicFramePr>
               <a:graphicFrameLocks xmlns:a="http://schemas.openxmlformats.org/drawingml/2006/main" noChangeAspect="1"/>
             </wp:cNvGraphicFramePr>
@@ -20006,7 +20012,7 @@
               <a:graphicData uri="http://schemas.openxmlformats.org/drawingml/2006/picture">
                 <pic:pic xmlns:pic="http://schemas.openxmlformats.org/drawingml/2006/picture">
                   <pic:nvPicPr>
-                    <pic:cNvPr id="672985593" name="Picture 1" descr="A screen shot of a computer screen&#10;&#10;AI-generated content may be incorrect."/>
+                    <pic:cNvPr id="435584078" name="Picture 1" descr="A screen shot of a computer screen&#10;&#10;AI-generated content may be incorrect."/>
                     <pic:cNvPicPr/>
                   </pic:nvPicPr>
                   <pic:blipFill>
@@ -20018,7 +20024,7 @@
                   <pic:spPr>
                     <a:xfrm>
                       <a:off x="0" y="0"/>
-                      <a:ext cx="1728662" cy="1382929"/>
+                      <a:ext cx="1735154" cy="1388124"/>
                     </a:xfrm>
                     <a:prstGeom prst="rect">
                       <a:avLst/>
@@ -20048,10 +20054,10 @@
           <w:noProof/>
         </w:rPr>
         <w:drawing>
-          <wp:inline distT="0" distB="0" distL="0" distR="0" wp14:anchorId="12CEC597" wp14:editId="44212E38">
-            <wp:extent cx="1709530" cy="1367624"/>
-            <wp:effectExtent l="38100" t="38100" r="100330" b="99695"/>
-            <wp:docPr id="1857637904" name="Picture 1" descr="A screenshot of a computer screen&#10;&#10;AI-generated content may be incorrect."/>
+          <wp:inline distT="0" distB="0" distL="0" distR="0" wp14:anchorId="30D69C39" wp14:editId="7FAAB4B1">
+            <wp:extent cx="1703401" cy="1362721"/>
+            <wp:effectExtent l="38100" t="38100" r="87630" b="104140"/>
+            <wp:docPr id="1108487183" name="Picture 1" descr="A screenshot of a computer screen&#10;&#10;AI-generated content may be incorrect."/>
             <wp:cNvGraphicFramePr>
               <a:graphicFrameLocks xmlns:a="http://schemas.openxmlformats.org/drawingml/2006/main" noChangeAspect="1"/>
             </wp:cNvGraphicFramePr>
@@ -20059,7 +20065,7 @@
               <a:graphicData uri="http://schemas.openxmlformats.org/drawingml/2006/picture">
                 <pic:pic xmlns:pic="http://schemas.openxmlformats.org/drawingml/2006/picture">
                   <pic:nvPicPr>
-                    <pic:cNvPr id="1857637904" name="Picture 1" descr="A screenshot of a computer screen&#10;&#10;AI-generated content may be incorrect."/>
+                    <pic:cNvPr id="1108487183" name="Picture 1" descr="A screenshot of a computer screen&#10;&#10;AI-generated content may be incorrect."/>
                     <pic:cNvPicPr/>
                   </pic:nvPicPr>
                   <pic:blipFill>
@@ -20071,7 +20077,7 @@
                   <pic:spPr>
                     <a:xfrm>
                       <a:off x="0" y="0"/>
-                      <a:ext cx="1740278" cy="1392222"/>
+                      <a:ext cx="1735234" cy="1388188"/>
                     </a:xfrm>
                     <a:prstGeom prst="rect">
                       <a:avLst/>
@@ -26331,7 +26337,7 @@
     <mc:AlternateContent>
       <mc:Choice Requires="v">
         <w:pict>
-          <v:shapetype w14:anchorId="37E91537" id="_x0000_t75" coordsize="21600,21600" o:spt="75" o:preferrelative="t" path="m@4@5l@4@11@9@11@9@5xe" filled="f" stroked="f">
+          <v:shapetype w14:anchorId="5EAFB43C" id="_x0000_t75" coordsize="21600,21600" o:spt="75" o:preferrelative="t" path="m@4@5l@4@11@9@11@9@5xe" filled="f" stroked="f">
             <v:stroke joinstyle="miter"/>
             <v:formulas>
               <v:f eqn="if lineDrawn pixelLineWidth 0"/>
@@ -26357,10 +26363,10 @@
       </mc:Choice>
       <mc:Fallback>
         <w:drawing>
-          <wp:inline distT="0" distB="0" distL="0" distR="0" wp14:anchorId="449D284F" wp14:editId="5C20413B">
+          <wp:inline distT="0" distB="0" distL="0" distR="0" wp14:anchorId="4ABF6084" wp14:editId="2AE68132">
             <wp:extent cx="194650" cy="145988"/>
             <wp:effectExtent l="0" t="0" r="0" b="6985"/>
-            <wp:docPr id="495072904" name="Picture 1"/>
+            <wp:docPr id="813666847" name="Picture 1"/>
             <wp:cNvGraphicFramePr>
               <a:graphicFrameLocks xmlns:a="http://schemas.openxmlformats.org/drawingml/2006/main" noChangeAspect="1"/>
             </wp:cNvGraphicFramePr>
@@ -26398,17 +26404,17 @@
     <mc:AlternateContent>
       <mc:Choice Requires="v">
         <w:pict>
-          <v:shape w14:anchorId="443E727E" id="Picture 1" o:spid="_x0000_i1025" type="#_x0000_t75" style="width:15.7pt;height:11.75pt;visibility:visible;mso-wrap-style:square">
+          <v:shape w14:anchorId="01A59A9A" id="Picture 1" o:spid="_x0000_i1025" type="#_x0000_t75" style="width:15.7pt;height:11.75pt;visibility:visible;mso-wrap-style:square">
             <v:imagedata r:id="rId3" o:title=""/>
           </v:shape>
         </w:pict>
       </mc:Choice>
       <mc:Fallback>
         <w:drawing>
-          <wp:inline distT="0" distB="0" distL="0" distR="0" wp14:anchorId="5C7348CD" wp14:editId="4DBCCE8B">
+          <wp:inline distT="0" distB="0" distL="0" distR="0" wp14:anchorId="67F71B73" wp14:editId="0DE50523">
             <wp:extent cx="199177" cy="149383"/>
             <wp:effectExtent l="0" t="0" r="0" b="3175"/>
-            <wp:docPr id="672557219" name="Picture 1"/>
+            <wp:docPr id="445293949" name="Picture 1"/>
             <wp:cNvGraphicFramePr>
               <a:graphicFrameLocks xmlns:a="http://schemas.openxmlformats.org/drawingml/2006/main" noChangeAspect="1"/>
             </wp:cNvGraphicFramePr>

</xml_diff>

<commit_message>
Code size optimization: Moved mode 7 experiences out of gameplay, freeing up 361 bytes!
</commit_message>
<xml_diff>
--- a/docs/Development.docx
+++ b/docs/Development.docx
@@ -14613,7 +14613,7 @@
                 <w:b w:val="0"/>
                 <w:bCs w:val="0"/>
               </w:rPr>
-              <w:t>Use sideways RAM to sound ‘exterminate! exterminate!’ when Daleks are in pursuit</w:t>
+              <w:t>Develop more levels, featuring other types of enemies</w:t>
             </w:r>
           </w:p>
         </w:tc>
@@ -14625,43 +14625,6 @@
             <w:pPr>
               <w:jc w:val="center"/>
               <w:cnfStyle w:val="000000100000" w:firstRow="0" w:lastRow="0" w:firstColumn="0" w:lastColumn="0" w:oddVBand="0" w:evenVBand="0" w:oddHBand="1" w:evenHBand="0" w:firstRowFirstColumn="0" w:firstRowLastColumn="0" w:lastRowFirstColumn="0" w:lastRowLastColumn="0"/>
-            </w:pPr>
-            <w:r>
-              <w:t>Yes</w:t>
-            </w:r>
-          </w:p>
-        </w:tc>
-      </w:tr>
-      <w:tr>
-        <w:tc>
-          <w:tcPr>
-            <w:cnfStyle w:val="001000000000" w:firstRow="0" w:lastRow="0" w:firstColumn="1" w:lastColumn="0" w:oddVBand="0" w:evenVBand="0" w:oddHBand="0" w:evenHBand="0" w:firstRowFirstColumn="0" w:firstRowLastColumn="0" w:lastRowFirstColumn="0" w:lastRowLastColumn="0"/>
-            <w:tcW w:w="7660" w:type="dxa"/>
-          </w:tcPr>
-          <w:p>
-            <w:pPr>
-              <w:rPr>
-                <w:b w:val="0"/>
-                <w:bCs w:val="0"/>
-              </w:rPr>
-            </w:pPr>
-            <w:r>
-              <w:rPr>
-                <w:b w:val="0"/>
-                <w:bCs w:val="0"/>
-              </w:rPr>
-              <w:t>Develop more levels, featuring other types of enemies</w:t>
-            </w:r>
-          </w:p>
-        </w:tc>
-        <w:tc>
-          <w:tcPr>
-            <w:tcW w:w="1690" w:type="dxa"/>
-          </w:tcPr>
-          <w:p>
-            <w:pPr>
-              <w:jc w:val="center"/>
-              <w:cnfStyle w:val="000000000000" w:firstRow="0" w:lastRow="0" w:firstColumn="0" w:lastColumn="0" w:oddVBand="0" w:evenVBand="0" w:oddHBand="0" w:evenHBand="0" w:firstRowFirstColumn="0" w:firstRowLastColumn="0" w:lastRowFirstColumn="0" w:lastRowLastColumn="0"/>
             </w:pPr>
             <w:r>
               <w:t>No</w:t>
@@ -21061,6 +21024,28 @@
       </w:r>
     </w:p>
     <w:p>
+      <w:pPr>
+        <w:pStyle w:val="Heading3"/>
+      </w:pPr>
+      <w:r>
+        <w:t>Game play</w:t>
+      </w:r>
+    </w:p>
+    <w:p>
+      <w:r>
+        <w:t xml:space="preserve">During game play, the screen consumes </w:t>
+      </w:r>
+      <w:r>
+        <w:t>half of the available 32</w:t>
+      </w:r>
+      <w:r>
+        <w:t xml:space="preserve">K </w:t>
+      </w:r>
+      <w:r>
+        <w:t>RAM, leaving just 16K for all the game code and data, plus MOS and DFS.</w:t>
+      </w:r>
+    </w:p>
+    <w:p>
       <w:r>
         <w:t xml:space="preserve">The general approach I took was to use sub &amp;1100 areas of memory to hold static data (lookup tables &amp; sprite data), while repurposing as much memory as possible that MOS and DFS uses.  </w:t>
       </w:r>
@@ -22352,6 +22337,7 @@
               <w:jc w:val="center"/>
             </w:pPr>
             <w:r>
+              <w:lastRenderedPageBreak/>
               <w:t>3140</w:t>
             </w:r>
           </w:p>
@@ -22483,7 +22469,6 @@
     </w:tbl>
     <w:p>
       <w:r>
-        <w:lastRenderedPageBreak/>
         <w:br/>
         <w:t>Several things are worth noting:</w:t>
       </w:r>
@@ -22719,14 +22704,19 @@
       </w:r>
     </w:p>
     <w:p>
-      <w:r>
-        <w:t xml:space="preserve">The 16K </w:t>
-      </w:r>
-      <w:r>
-        <w:t xml:space="preserve">of </w:t>
-      </w:r>
-      <w:r>
-        <w:t>screen memory is repurposed during startup and level initialization.  The differences are highlighted below.</w:t>
+      <w:pPr>
+        <w:pStyle w:val="Heading3"/>
+      </w:pPr>
+      <w:r>
+        <w:t xml:space="preserve">Startup &amp; </w:t>
+      </w:r>
+      <w:r>
+        <w:t>Titles</w:t>
+      </w:r>
+    </w:p>
+    <w:p>
+      <w:r>
+        <w:t>During startup and titles, the 32K of available memory is allocated as follows:</w:t>
       </w:r>
     </w:p>
     <w:tbl>
@@ -22753,6 +22743,7 @@
             <w:pPr>
               <w:jc w:val="center"/>
             </w:pPr>
+            <w:bookmarkStart w:id="0" w:name="_Hlk199840468"/>
             <w:r>
               <w:t>Address (hex)</w:t>
             </w:r>
@@ -23031,10 +23022,7 @@
               <w:jc w:val="center"/>
             </w:pPr>
             <w:r>
-              <w:t>40</w:t>
-            </w:r>
-            <w:r>
-              <w:t>1E</w:t>
+              <w:t>401E</w:t>
             </w:r>
           </w:p>
         </w:tc>
@@ -23086,10 +23074,7 @@
               <w:t>40</w:t>
             </w:r>
             <w:r>
-              <w:t>2</w:t>
-            </w:r>
-            <w:r>
-              <w:t>3</w:t>
+              <w:t>23</w:t>
             </w:r>
           </w:p>
         </w:tc>
@@ -23118,10 +23103,7 @@
               <w:cnfStyle w:val="000000100000" w:firstRow="0" w:lastRow="0" w:firstColumn="0" w:lastColumn="0" w:oddVBand="0" w:evenVBand="0" w:oddHBand="1" w:evenHBand="0" w:firstRowFirstColumn="0" w:firstRowLastColumn="0" w:lastRowFirstColumn="0" w:lastRowLastColumn="0"/>
             </w:pPr>
             <w:r>
-              <w:t>1</w:t>
-            </w:r>
-            <w:r>
-              <w:t>92</w:t>
+              <w:t>192</w:t>
             </w:r>
           </w:p>
         </w:tc>
@@ -23141,10 +23123,7 @@
               <w:t>40</w:t>
             </w:r>
             <w:r>
-              <w:t>E</w:t>
-            </w:r>
-            <w:r>
-              <w:t>3</w:t>
+              <w:t>E3</w:t>
             </w:r>
           </w:p>
         </w:tc>
@@ -23398,13 +23377,7 @@
               <w:jc w:val="center"/>
             </w:pPr>
             <w:r>
-              <w:t>6</w:t>
-            </w:r>
-            <w:r>
-              <w:t>E</w:t>
-            </w:r>
-            <w:r>
-              <w:t>66</w:t>
+              <w:t>6E66</w:t>
             </w:r>
           </w:p>
         </w:tc>
@@ -23499,6 +23472,7 @@
               <w:jc w:val="center"/>
             </w:pPr>
             <w:r>
+              <w:lastRenderedPageBreak/>
               <w:t>7C00</w:t>
             </w:r>
           </w:p>
@@ -23533,27 +23507,285 @@
           </w:p>
         </w:tc>
       </w:tr>
+      <w:bookmarkEnd w:id="0"/>
     </w:tbl>
     <w:p/>
     <w:p>
       <w:r>
-        <w:lastRenderedPageBreak/>
-        <w:t xml:space="preserve">The white and gray rows show the layout after a level file is loaded, which includes level data, sprite data, and level initialization code.  The initialization code copies the loaded sprite data to their lower </w:t>
-      </w:r>
-      <w:r>
-        <w:t xml:space="preserve">memory </w:t>
-      </w:r>
-      <w:r>
-        <w:t>locations and populates the game object data structures from the metadata and object descriptors.</w:t>
-      </w:r>
-      <w:r>
-        <w:t xml:space="preserve">  On machines with 16K+ of sideways RAM, the code also copies the 224-byte </w:t>
-      </w:r>
-      <w:r>
-        <w:t>game bar</w:t>
-      </w:r>
-      <w:r>
-        <w:t xml:space="preserve"> asset to </w:t>
+        <w:t xml:space="preserve">The white and gray rows </w:t>
+      </w:r>
+      <w:r>
+        <w:t xml:space="preserve">match the memory </w:t>
+      </w:r>
+      <w:r>
+        <w:t>layout after a level file is loaded</w:t>
+      </w:r>
+      <w:r>
+        <w:t xml:space="preserve"> (see </w:t>
+      </w:r>
+      <w:r>
+        <w:t xml:space="preserve">Level Loading section </w:t>
+      </w:r>
+      <w:r>
+        <w:t>below)</w:t>
+      </w:r>
+      <w:r>
+        <w:t>.</w:t>
+      </w:r>
+    </w:p>
+    <w:p>
+      <w:r>
+        <w:t xml:space="preserve">The light blue row shows the game initialization </w:t>
+      </w:r>
+      <w:r>
+        <w:t xml:space="preserve">and music </w:t>
+      </w:r>
+      <w:r>
+        <w:t>data/</w:t>
+      </w:r>
+      <w:r>
+        <w:t xml:space="preserve">code which </w:t>
+      </w:r>
+      <w:r>
+        <w:t xml:space="preserve">is </w:t>
+      </w:r>
+      <w:r>
+        <w:t>run during startup to initialize the game</w:t>
+      </w:r>
+      <w:r>
+        <w:t xml:space="preserve">, </w:t>
+      </w:r>
+      <w:r>
+        <w:t>show</w:t>
+      </w:r>
+      <w:r>
+        <w:t xml:space="preserve"> </w:t>
+      </w:r>
+      <w:r>
+        <w:t xml:space="preserve">the </w:t>
+      </w:r>
+      <w:r>
+        <w:t>M</w:t>
+      </w:r>
+      <w:r>
+        <w:t>ode</w:t>
+      </w:r>
+      <w:r>
+        <w:t xml:space="preserve"> </w:t>
+      </w:r>
+      <w:r>
+        <w:t>7 title screen</w:t>
+      </w:r>
+      <w:r>
+        <w:t>s</w:t>
+      </w:r>
+      <w:r>
+        <w:t xml:space="preserve">, and play the </w:t>
+      </w:r>
+      <w:r>
+        <w:t>Doctor Who</w:t>
+      </w:r>
+      <w:r>
+        <w:t xml:space="preserve"> theme music.</w:t>
+      </w:r>
+      <w:r>
+        <w:t xml:space="preserve"> </w:t>
+      </w:r>
+    </w:p>
+    <w:p>
+      <w:r>
+        <w:t xml:space="preserve">The light purple row shows a page backup </w:t>
+      </w:r>
+      <w:r>
+        <w:t>region</w:t>
+      </w:r>
+      <w:r>
+        <w:t xml:space="preserve"> </w:t>
+      </w:r>
+      <w:r>
+        <w:t xml:space="preserve">used by the load functionality </w:t>
+      </w:r>
+      <w:r>
+        <w:t xml:space="preserve">to </w:t>
+      </w:r>
+      <w:r>
+        <w:t xml:space="preserve">save and </w:t>
+      </w:r>
+      <w:r>
+        <w:t xml:space="preserve">restore code </w:t>
+      </w:r>
+      <w:r>
+        <w:t>in Page &amp;17</w:t>
+      </w:r>
+      <w:r>
+        <w:t>,</w:t>
+      </w:r>
+      <w:r>
+        <w:t xml:space="preserve"> </w:t>
+      </w:r>
+      <w:r>
+        <w:t>that DFS overwrites.</w:t>
+      </w:r>
+    </w:p>
+    <w:p>
+      <w:r>
+        <w:t>During startup the title screen</w:t>
+      </w:r>
+      <w:r>
+        <w:t>s</w:t>
+      </w:r>
+      <w:r>
+        <w:t xml:space="preserve"> </w:t>
+      </w:r>
+      <w:r>
+        <w:t xml:space="preserve">are </w:t>
+      </w:r>
+      <w:r>
+        <w:t xml:space="preserve">displayed in </w:t>
+      </w:r>
+      <w:r>
+        <w:t>M</w:t>
+      </w:r>
+      <w:r>
+        <w:t>ode</w:t>
+      </w:r>
+      <w:r>
+        <w:t xml:space="preserve"> </w:t>
+      </w:r>
+      <w:r>
+        <w:t xml:space="preserve">7, so the data/code </w:t>
+      </w:r>
+      <w:r>
+        <w:t xml:space="preserve">below &amp;7C00 </w:t>
+      </w:r>
+      <w:r>
+        <w:t>is not visible.</w:t>
+      </w:r>
+    </w:p>
+    <w:p>
+      <w:r>
+        <w:t>The memory layout evolved during the development of the game, with allocation</w:t>
+      </w:r>
+      <w:r>
+        <w:t>s</w:t>
+      </w:r>
+      <w:r>
+        <w:t xml:space="preserve"> </w:t>
+      </w:r>
+      <w:r>
+        <w:t xml:space="preserve">moved </w:t>
+      </w:r>
+      <w:r>
+        <w:t>as needed.</w:t>
+      </w:r>
+    </w:p>
+    <w:p>
+      <w:pPr>
+        <w:pStyle w:val="Heading3"/>
+      </w:pPr>
+      <w:r>
+        <w:t xml:space="preserve">Level </w:t>
+      </w:r>
+      <w:r>
+        <w:t>loading</w:t>
+      </w:r>
+    </w:p>
+    <w:p>
+      <w:r>
+        <w:t xml:space="preserve">Levels are loaded from disc when one of the following </w:t>
+      </w:r>
+      <w:r>
+        <w:t>occurs</w:t>
+      </w:r>
+      <w:r>
+        <w:t>:</w:t>
+      </w:r>
+    </w:p>
+    <w:p>
+      <w:pPr>
+        <w:pStyle w:val="ListParagraph"/>
+        <w:numPr>
+          <w:ilvl w:val="0"/>
+          <w:numId w:val="4"/>
+        </w:numPr>
+      </w:pPr>
+      <w:r>
+        <w:t>The player presses the ‘R’ key to reload the current level.</w:t>
+      </w:r>
+    </w:p>
+    <w:p>
+      <w:pPr>
+        <w:pStyle w:val="ListParagraph"/>
+        <w:numPr>
+          <w:ilvl w:val="0"/>
+          <w:numId w:val="4"/>
+        </w:numPr>
+      </w:pPr>
+      <w:r>
+        <w:t>K9 reaches the TARDIS</w:t>
+      </w:r>
+      <w:r>
+        <w:t>, but not on the last level</w:t>
+      </w:r>
+      <w:r>
+        <w:t>.</w:t>
+      </w:r>
+    </w:p>
+    <w:p>
+      <w:pPr>
+        <w:pStyle w:val="ListParagraph"/>
+        <w:numPr>
+          <w:ilvl w:val="0"/>
+          <w:numId w:val="4"/>
+        </w:numPr>
+      </w:pPr>
+      <w:r>
+        <w:t>K9</w:t>
+      </w:r>
+      <w:r>
+        <w:t>’s</w:t>
+      </w:r>
+      <w:r>
+        <w:t xml:space="preserve"> battery </w:t>
+      </w:r>
+      <w:r>
+        <w:t>is depleted.</w:t>
+      </w:r>
+    </w:p>
+    <w:p>
+      <w:r>
+        <w:t>It should be noted that the level files include the experiences one sees when K9 completes a level or dies.</w:t>
+      </w:r>
+    </w:p>
+    <w:p>
+      <w:r>
+        <w:t>Level files</w:t>
+      </w:r>
+      <w:r>
+        <w:t xml:space="preserve"> </w:t>
+      </w:r>
+      <w:r>
+        <w:t>include level data, sprite data, level initialization code, and level experiences (‘</w:t>
+      </w:r>
+      <w:r>
+        <w:rPr>
+          <w:i/>
+          <w:iCs/>
+        </w:rPr>
+        <w:t>level complete</w:t>
+      </w:r>
+      <w:r>
+        <w:t>’ and ‘</w:t>
+      </w:r>
+      <w:r>
+        <w:rPr>
+          <w:i/>
+          <w:iCs/>
+        </w:rPr>
+        <w:t>K9 died</w:t>
+      </w:r>
+      <w:r>
+        <w:t xml:space="preserve">’).  The initialization code copies the loaded sprite data to their lower memory locations and populates the game object data structures from the metadata and object descriptors.  On machines with 16K+ of sideways RAM, the code also copies the 224-byte game bar asset to </w:t>
       </w:r>
       <w:r>
         <w:t>&amp;BF20</w:t>
@@ -23564,138 +23796,1051 @@
     </w:p>
     <w:p>
       <w:r>
-        <w:t xml:space="preserve">The light blue row shows the game initialization </w:t>
-      </w:r>
-      <w:r>
-        <w:t xml:space="preserve">and music </w:t>
-      </w:r>
-      <w:r>
-        <w:t>data/</w:t>
-      </w:r>
-      <w:r>
-        <w:t>code which runs only once, during startup to initialize the game</w:t>
+        <w:t xml:space="preserve">The memory layout </w:t>
+      </w:r>
+      <w:r>
+        <w:t xml:space="preserve">after a level </w:t>
+      </w:r>
+      <w:r>
+        <w:t xml:space="preserve">file </w:t>
+      </w:r>
+      <w:r>
+        <w:t xml:space="preserve">is loaded is </w:t>
+      </w:r>
+      <w:r>
+        <w:t>as follows:</w:t>
+      </w:r>
+    </w:p>
+    <w:tbl>
+      <w:tblPr>
+        <w:tblStyle w:val="ListTable3-Accent4"/>
+        <w:tblW w:w="0" w:type="auto"/>
+        <w:tblLook w:val="04A0" w:firstRow="1" w:lastRow="0" w:firstColumn="1" w:lastColumn="0" w:noHBand="0" w:noVBand="1"/>
+      </w:tblPr>
+      <w:tblGrid>
+        <w:gridCol w:w="1345"/>
+        <w:gridCol w:w="6570"/>
+        <w:gridCol w:w="1260"/>
+      </w:tblGrid>
+      <w:tr>
+        <w:trPr>
+          <w:cnfStyle w:val="100000000000" w:firstRow="1" w:lastRow="0" w:firstColumn="0" w:lastColumn="0" w:oddVBand="0" w:evenVBand="0" w:oddHBand="0" w:evenHBand="0" w:firstRowFirstColumn="0" w:firstRowLastColumn="0" w:lastRowFirstColumn="0" w:lastRowLastColumn="0"/>
+        </w:trPr>
+        <w:tc>
+          <w:tcPr>
+            <w:cnfStyle w:val="001000000100" w:firstRow="0" w:lastRow="0" w:firstColumn="1" w:lastColumn="0" w:oddVBand="0" w:evenVBand="0" w:oddHBand="0" w:evenHBand="0" w:firstRowFirstColumn="1" w:firstRowLastColumn="0" w:lastRowFirstColumn="0" w:lastRowLastColumn="0"/>
+            <w:tcW w:w="1345" w:type="dxa"/>
+          </w:tcPr>
+          <w:p>
+            <w:pPr>
+              <w:jc w:val="center"/>
+            </w:pPr>
+            <w:r>
+              <w:t>Address (hex)</w:t>
+            </w:r>
+          </w:p>
+        </w:tc>
+        <w:tc>
+          <w:tcPr>
+            <w:tcW w:w="6570" w:type="dxa"/>
+          </w:tcPr>
+          <w:p>
+            <w:pPr>
+              <w:cnfStyle w:val="100000000000" w:firstRow="1" w:lastRow="0" w:firstColumn="0" w:lastColumn="0" w:oddVBand="0" w:evenVBand="0" w:oddHBand="0" w:evenHBand="0" w:firstRowFirstColumn="0" w:firstRowLastColumn="0" w:lastRowFirstColumn="0" w:lastRowLastColumn="0"/>
+            </w:pPr>
+            <w:r>
+              <w:t>Allocation</w:t>
+            </w:r>
+          </w:p>
+        </w:tc>
+        <w:tc>
+          <w:tcPr>
+            <w:tcW w:w="1260" w:type="dxa"/>
+          </w:tcPr>
+          <w:p>
+            <w:pPr>
+              <w:jc w:val="center"/>
+              <w:cnfStyle w:val="100000000000" w:firstRow="1" w:lastRow="0" w:firstColumn="0" w:lastColumn="0" w:oddVBand="0" w:evenVBand="0" w:oddHBand="0" w:evenHBand="0" w:firstRowFirstColumn="0" w:firstRowLastColumn="0" w:lastRowFirstColumn="0" w:lastRowLastColumn="0"/>
+            </w:pPr>
+            <w:r>
+              <w:t>Size (bytes)</w:t>
+            </w:r>
+          </w:p>
+        </w:tc>
+      </w:tr>
+      <w:tr>
+        <w:trPr>
+          <w:cnfStyle w:val="000000100000" w:firstRow="0" w:lastRow="0" w:firstColumn="0" w:lastColumn="0" w:oddVBand="0" w:evenVBand="0" w:oddHBand="1" w:evenHBand="0" w:firstRowFirstColumn="0" w:firstRowLastColumn="0" w:lastRowFirstColumn="0" w:lastRowLastColumn="0"/>
+        </w:trPr>
+        <w:tc>
+          <w:tcPr>
+            <w:cnfStyle w:val="001000000000" w:firstRow="0" w:lastRow="0" w:firstColumn="1" w:lastColumn="0" w:oddVBand="0" w:evenVBand="0" w:oddHBand="0" w:evenHBand="0" w:firstRowFirstColumn="0" w:firstRowLastColumn="0" w:lastRowFirstColumn="0" w:lastRowLastColumn="0"/>
+            <w:tcW w:w="1345" w:type="dxa"/>
+          </w:tcPr>
+          <w:p>
+            <w:pPr>
+              <w:jc w:val="center"/>
+            </w:pPr>
+            <w:r>
+              <w:t>20B0</w:t>
+            </w:r>
+          </w:p>
+        </w:tc>
+        <w:tc>
+          <w:tcPr>
+            <w:tcW w:w="6570" w:type="dxa"/>
+          </w:tcPr>
+          <w:p>
+            <w:pPr>
+              <w:cnfStyle w:val="000000100000" w:firstRow="0" w:lastRow="0" w:firstColumn="0" w:lastColumn="0" w:oddVBand="0" w:evenVBand="0" w:oddHBand="1" w:evenHBand="0" w:firstRowFirstColumn="0" w:firstRowLastColumn="0" w:lastRowFirstColumn="0" w:lastRowLastColumn="0"/>
+            </w:pPr>
+            <w:r>
+              <w:t>Level palette</w:t>
+            </w:r>
+          </w:p>
+        </w:tc>
+        <w:tc>
+          <w:tcPr>
+            <w:tcW w:w="1260" w:type="dxa"/>
+          </w:tcPr>
+          <w:p>
+            <w:pPr>
+              <w:jc w:val="center"/>
+              <w:cnfStyle w:val="000000100000" w:firstRow="0" w:lastRow="0" w:firstColumn="0" w:lastColumn="0" w:oddVBand="0" w:evenVBand="0" w:oddHBand="1" w:evenHBand="0" w:firstRowFirstColumn="0" w:firstRowLastColumn="0" w:lastRowFirstColumn="0" w:lastRowLastColumn="0"/>
+            </w:pPr>
+            <w:r>
+              <w:t>16</w:t>
+            </w:r>
+          </w:p>
+        </w:tc>
+      </w:tr>
+      <w:tr>
+        <w:tc>
+          <w:tcPr>
+            <w:cnfStyle w:val="001000000000" w:firstRow="0" w:lastRow="0" w:firstColumn="1" w:lastColumn="0" w:oddVBand="0" w:evenVBand="0" w:oddHBand="0" w:evenHBand="0" w:firstRowFirstColumn="0" w:firstRowLastColumn="0" w:lastRowFirstColumn="0" w:lastRowLastColumn="0"/>
+            <w:tcW w:w="1345" w:type="dxa"/>
+          </w:tcPr>
+          <w:p>
+            <w:pPr>
+              <w:jc w:val="center"/>
+            </w:pPr>
+            <w:r>
+              <w:t>30</w:t>
+            </w:r>
+            <w:r>
+              <w:t>C0</w:t>
+            </w:r>
+          </w:p>
+        </w:tc>
+        <w:tc>
+          <w:tcPr>
+            <w:tcW w:w="6570" w:type="dxa"/>
+          </w:tcPr>
+          <w:p>
+            <w:pPr>
+              <w:cnfStyle w:val="000000000000" w:firstRow="0" w:lastRow="0" w:firstColumn="0" w:lastColumn="0" w:oddVBand="0" w:evenVBand="0" w:oddHBand="0" w:evenHBand="0" w:firstRowFirstColumn="0" w:firstRowLastColumn="0" w:lastRowFirstColumn="0" w:lastRowLastColumn="0"/>
+            </w:pPr>
+            <w:r>
+              <w:t>Level tiles</w:t>
+            </w:r>
+          </w:p>
+        </w:tc>
+        <w:tc>
+          <w:tcPr>
+            <w:tcW w:w="1260" w:type="dxa"/>
+          </w:tcPr>
+          <w:p>
+            <w:pPr>
+              <w:jc w:val="center"/>
+              <w:cnfStyle w:val="000000000000" w:firstRow="0" w:lastRow="0" w:firstColumn="0" w:lastColumn="0" w:oddVBand="0" w:evenVBand="0" w:oddHBand="0" w:evenHBand="0" w:firstRowFirstColumn="0" w:firstRowLastColumn="0" w:lastRowFirstColumn="0" w:lastRowLastColumn="0"/>
+            </w:pPr>
+            <w:r>
+              <w:t>1856</w:t>
+            </w:r>
+          </w:p>
+        </w:tc>
+      </w:tr>
+      <w:tr>
+        <w:trPr>
+          <w:cnfStyle w:val="000000100000" w:firstRow="0" w:lastRow="0" w:firstColumn="0" w:lastColumn="0" w:oddVBand="0" w:evenVBand="0" w:oddHBand="1" w:evenHBand="0" w:firstRowFirstColumn="0" w:firstRowLastColumn="0" w:lastRowFirstColumn="0" w:lastRowLastColumn="0"/>
+        </w:trPr>
+        <w:tc>
+          <w:tcPr>
+            <w:cnfStyle w:val="001000000000" w:firstRow="0" w:lastRow="0" w:firstColumn="1" w:lastColumn="0" w:oddVBand="0" w:evenVBand="0" w:oddHBand="0" w:evenHBand="0" w:firstRowFirstColumn="0" w:firstRowLastColumn="0" w:lastRowFirstColumn="0" w:lastRowLastColumn="0"/>
+            <w:tcW w:w="1345" w:type="dxa"/>
+          </w:tcPr>
+          <w:p>
+            <w:pPr>
+              <w:jc w:val="center"/>
+            </w:pPr>
+            <w:r>
+              <w:t>3800</w:t>
+            </w:r>
+          </w:p>
+        </w:tc>
+        <w:tc>
+          <w:tcPr>
+            <w:tcW w:w="6570" w:type="dxa"/>
+          </w:tcPr>
+          <w:p>
+            <w:pPr>
+              <w:cnfStyle w:val="000000100000" w:firstRow="0" w:lastRow="0" w:firstColumn="0" w:lastColumn="0" w:oddVBand="0" w:evenVBand="0" w:oddHBand="1" w:evenHBand="0" w:firstRowFirstColumn="0" w:firstRowLastColumn="0" w:lastRowFirstColumn="0" w:lastRowLastColumn="0"/>
+            </w:pPr>
+            <w:r>
+              <w:t>Level tile grid</w:t>
+            </w:r>
+          </w:p>
+        </w:tc>
+        <w:tc>
+          <w:tcPr>
+            <w:tcW w:w="1260" w:type="dxa"/>
+          </w:tcPr>
+          <w:p>
+            <w:pPr>
+              <w:jc w:val="center"/>
+              <w:cnfStyle w:val="000000100000" w:firstRow="0" w:lastRow="0" w:firstColumn="0" w:lastColumn="0" w:oddVBand="0" w:evenVBand="0" w:oddHBand="1" w:evenHBand="0" w:firstRowFirstColumn="0" w:firstRowLastColumn="0" w:lastRowFirstColumn="0" w:lastRowLastColumn="0"/>
+            </w:pPr>
+            <w:r>
+              <w:t>2048</w:t>
+            </w:r>
+          </w:p>
+        </w:tc>
+      </w:tr>
+      <w:tr>
+        <w:tc>
+          <w:tcPr>
+            <w:cnfStyle w:val="001000000000" w:firstRow="0" w:lastRow="0" w:firstColumn="1" w:lastColumn="0" w:oddVBand="0" w:evenVBand="0" w:oddHBand="0" w:evenHBand="0" w:firstRowFirstColumn="0" w:firstRowLastColumn="0" w:lastRowFirstColumn="0" w:lastRowLastColumn="0"/>
+            <w:tcW w:w="1345" w:type="dxa"/>
+            <w:shd w:val="clear" w:color="auto" w:fill="E8E8E8" w:themeFill="background2"/>
+          </w:tcPr>
+          <w:p>
+            <w:pPr>
+              <w:jc w:val="center"/>
+            </w:pPr>
+            <w:r>
+              <w:t>4000</w:t>
+            </w:r>
+          </w:p>
+        </w:tc>
+        <w:tc>
+          <w:tcPr>
+            <w:tcW w:w="6570" w:type="dxa"/>
+            <w:shd w:val="clear" w:color="auto" w:fill="E8E8E8" w:themeFill="background2"/>
+          </w:tcPr>
+          <w:p>
+            <w:pPr>
+              <w:cnfStyle w:val="000000000000" w:firstRow="0" w:lastRow="0" w:firstColumn="0" w:lastColumn="0" w:oddVBand="0" w:evenVBand="0" w:oddHBand="0" w:evenHBand="0" w:firstRowFirstColumn="0" w:firstRowLastColumn="0" w:lastRowFirstColumn="0" w:lastRowLastColumn="0"/>
+            </w:pPr>
+            <w:r>
+              <w:t>Level extents</w:t>
+            </w:r>
+          </w:p>
+        </w:tc>
+        <w:tc>
+          <w:tcPr>
+            <w:tcW w:w="1260" w:type="dxa"/>
+            <w:shd w:val="clear" w:color="auto" w:fill="E8E8E8" w:themeFill="background2"/>
+          </w:tcPr>
+          <w:p>
+            <w:pPr>
+              <w:jc w:val="center"/>
+              <w:cnfStyle w:val="000000000000" w:firstRow="0" w:lastRow="0" w:firstColumn="0" w:lastColumn="0" w:oddVBand="0" w:evenVBand="0" w:oddHBand="0" w:evenHBand="0" w:firstRowFirstColumn="0" w:firstRowLastColumn="0" w:lastRowFirstColumn="0" w:lastRowLastColumn="0"/>
+            </w:pPr>
+            <w:r>
+              <w:t>2</w:t>
+            </w:r>
+          </w:p>
+        </w:tc>
+      </w:tr>
+      <w:tr>
+        <w:trPr>
+          <w:cnfStyle w:val="000000100000" w:firstRow="0" w:lastRow="0" w:firstColumn="0" w:lastColumn="0" w:oddVBand="0" w:evenVBand="0" w:oddHBand="1" w:evenHBand="0" w:firstRowFirstColumn="0" w:firstRowLastColumn="0" w:lastRowFirstColumn="0" w:lastRowLastColumn="0"/>
+        </w:trPr>
+        <w:tc>
+          <w:tcPr>
+            <w:cnfStyle w:val="001000000000" w:firstRow="0" w:lastRow="0" w:firstColumn="1" w:lastColumn="0" w:oddVBand="0" w:evenVBand="0" w:oddHBand="0" w:evenHBand="0" w:firstRowFirstColumn="0" w:firstRowLastColumn="0" w:lastRowFirstColumn="0" w:lastRowLastColumn="0"/>
+            <w:tcW w:w="1345" w:type="dxa"/>
+            <w:shd w:val="clear" w:color="auto" w:fill="E8E8E8" w:themeFill="background2"/>
+          </w:tcPr>
+          <w:p>
+            <w:pPr>
+              <w:jc w:val="center"/>
+            </w:pPr>
+            <w:r>
+              <w:t>4002</w:t>
+            </w:r>
+          </w:p>
+        </w:tc>
+        <w:tc>
+          <w:tcPr>
+            <w:tcW w:w="6570" w:type="dxa"/>
+            <w:shd w:val="clear" w:color="auto" w:fill="E8E8E8" w:themeFill="background2"/>
+          </w:tcPr>
+          <w:p>
+            <w:pPr>
+              <w:cnfStyle w:val="000000100000" w:firstRow="0" w:lastRow="0" w:firstColumn="0" w:lastColumn="0" w:oddVBand="0" w:evenVBand="0" w:oddHBand="1" w:evenHBand="0" w:firstRowFirstColumn="0" w:firstRowLastColumn="0" w:lastRowFirstColumn="0" w:lastRowLastColumn="0"/>
+            </w:pPr>
+            <w:r>
+              <w:t>Level tile types</w:t>
+            </w:r>
+          </w:p>
+        </w:tc>
+        <w:tc>
+          <w:tcPr>
+            <w:tcW w:w="1260" w:type="dxa"/>
+            <w:shd w:val="clear" w:color="auto" w:fill="E8E8E8" w:themeFill="background2"/>
+          </w:tcPr>
+          <w:p>
+            <w:pPr>
+              <w:jc w:val="center"/>
+              <w:cnfStyle w:val="000000100000" w:firstRow="0" w:lastRow="0" w:firstColumn="0" w:lastColumn="0" w:oddVBand="0" w:evenVBand="0" w:oddHBand="1" w:evenHBand="0" w:firstRowFirstColumn="0" w:firstRowLastColumn="0" w:lastRowFirstColumn="0" w:lastRowLastColumn="0"/>
+            </w:pPr>
+            <w:r>
+              <w:t>28</w:t>
+            </w:r>
+          </w:p>
+        </w:tc>
+      </w:tr>
+      <w:tr>
+        <w:tc>
+          <w:tcPr>
+            <w:cnfStyle w:val="001000000000" w:firstRow="0" w:lastRow="0" w:firstColumn="1" w:lastColumn="0" w:oddVBand="0" w:evenVBand="0" w:oddHBand="0" w:evenHBand="0" w:firstRowFirstColumn="0" w:firstRowLastColumn="0" w:lastRowFirstColumn="0" w:lastRowLastColumn="0"/>
+            <w:tcW w:w="1345" w:type="dxa"/>
+            <w:shd w:val="clear" w:color="auto" w:fill="E8E8E8" w:themeFill="background2"/>
+          </w:tcPr>
+          <w:p>
+            <w:pPr>
+              <w:jc w:val="center"/>
+            </w:pPr>
+            <w:r>
+              <w:lastRenderedPageBreak/>
+              <w:t>401E</w:t>
+            </w:r>
+          </w:p>
+        </w:tc>
+        <w:tc>
+          <w:tcPr>
+            <w:tcW w:w="6570" w:type="dxa"/>
+            <w:shd w:val="clear" w:color="auto" w:fill="E8E8E8" w:themeFill="background2"/>
+          </w:tcPr>
+          <w:p>
+            <w:pPr>
+              <w:cnfStyle w:val="000000000000" w:firstRow="0" w:lastRow="0" w:firstColumn="0" w:lastColumn="0" w:oddVBand="0" w:evenVBand="0" w:oddHBand="0" w:evenHBand="0" w:firstRowFirstColumn="0" w:firstRowLastColumn="0" w:lastRowFirstColumn="0" w:lastRowLastColumn="0"/>
+            </w:pPr>
+            <w:r>
+              <w:t>Level settings</w:t>
+            </w:r>
+          </w:p>
+        </w:tc>
+        <w:tc>
+          <w:tcPr>
+            <w:tcW w:w="1260" w:type="dxa"/>
+            <w:shd w:val="clear" w:color="auto" w:fill="E8E8E8" w:themeFill="background2"/>
+          </w:tcPr>
+          <w:p>
+            <w:pPr>
+              <w:jc w:val="center"/>
+              <w:cnfStyle w:val="000000000000" w:firstRow="0" w:lastRow="0" w:firstColumn="0" w:lastColumn="0" w:oddVBand="0" w:evenVBand="0" w:oddHBand="0" w:evenHBand="0" w:firstRowFirstColumn="0" w:firstRowLastColumn="0" w:lastRowFirstColumn="0" w:lastRowLastColumn="0"/>
+            </w:pPr>
+            <w:r>
+              <w:t>5</w:t>
+            </w:r>
+          </w:p>
+        </w:tc>
+      </w:tr>
+      <w:tr>
+        <w:trPr>
+          <w:cnfStyle w:val="000000100000" w:firstRow="0" w:lastRow="0" w:firstColumn="0" w:lastColumn="0" w:oddVBand="0" w:evenVBand="0" w:oddHBand="1" w:evenHBand="0" w:firstRowFirstColumn="0" w:firstRowLastColumn="0" w:lastRowFirstColumn="0" w:lastRowLastColumn="0"/>
+        </w:trPr>
+        <w:tc>
+          <w:tcPr>
+            <w:cnfStyle w:val="001000000000" w:firstRow="0" w:lastRow="0" w:firstColumn="1" w:lastColumn="0" w:oddVBand="0" w:evenVBand="0" w:oddHBand="0" w:evenHBand="0" w:firstRowFirstColumn="0" w:firstRowLastColumn="0" w:lastRowFirstColumn="0" w:lastRowLastColumn="0"/>
+            <w:tcW w:w="1345" w:type="dxa"/>
+            <w:shd w:val="clear" w:color="auto" w:fill="E8E8E8" w:themeFill="background2"/>
+          </w:tcPr>
+          <w:p>
+            <w:pPr>
+              <w:jc w:val="center"/>
+            </w:pPr>
+            <w:r>
+              <w:t>40</w:t>
+            </w:r>
+            <w:r>
+              <w:t>23</w:t>
+            </w:r>
+          </w:p>
+        </w:tc>
+        <w:tc>
+          <w:tcPr>
+            <w:tcW w:w="6570" w:type="dxa"/>
+            <w:shd w:val="clear" w:color="auto" w:fill="E8E8E8" w:themeFill="background2"/>
+          </w:tcPr>
+          <w:p>
+            <w:pPr>
+              <w:cnfStyle w:val="000000100000" w:firstRow="0" w:lastRow="0" w:firstColumn="0" w:lastColumn="0" w:oddVBand="0" w:evenVBand="0" w:oddHBand="1" w:evenHBand="0" w:firstRowFirstColumn="0" w:firstRowLastColumn="0" w:lastRowFirstColumn="0" w:lastRowLastColumn="0"/>
+            </w:pPr>
+            <w:r>
+              <w:t>Level object descriptors (48)</w:t>
+            </w:r>
+          </w:p>
+        </w:tc>
+        <w:tc>
+          <w:tcPr>
+            <w:tcW w:w="1260" w:type="dxa"/>
+            <w:shd w:val="clear" w:color="auto" w:fill="E8E8E8" w:themeFill="background2"/>
+          </w:tcPr>
+          <w:p>
+            <w:pPr>
+              <w:jc w:val="center"/>
+              <w:cnfStyle w:val="000000100000" w:firstRow="0" w:lastRow="0" w:firstColumn="0" w:lastColumn="0" w:oddVBand="0" w:evenVBand="0" w:oddHBand="1" w:evenHBand="0" w:firstRowFirstColumn="0" w:firstRowLastColumn="0" w:lastRowFirstColumn="0" w:lastRowLastColumn="0"/>
+            </w:pPr>
+            <w:r>
+              <w:t>192</w:t>
+            </w:r>
+          </w:p>
+        </w:tc>
+      </w:tr>
+      <w:tr>
+        <w:tc>
+          <w:tcPr>
+            <w:cnfStyle w:val="001000000000" w:firstRow="0" w:lastRow="0" w:firstColumn="1" w:lastColumn="0" w:oddVBand="0" w:evenVBand="0" w:oddHBand="0" w:evenHBand="0" w:firstRowFirstColumn="0" w:firstRowLastColumn="0" w:lastRowFirstColumn="0" w:lastRowLastColumn="0"/>
+            <w:tcW w:w="1345" w:type="dxa"/>
+            <w:shd w:val="clear" w:color="auto" w:fill="E8E8E8" w:themeFill="background2"/>
+          </w:tcPr>
+          <w:p>
+            <w:pPr>
+              <w:jc w:val="center"/>
+            </w:pPr>
+            <w:r>
+              <w:t>40</w:t>
+            </w:r>
+            <w:r>
+              <w:t>E3</w:t>
+            </w:r>
+          </w:p>
+        </w:tc>
+        <w:tc>
+          <w:tcPr>
+            <w:tcW w:w="6570" w:type="dxa"/>
+            <w:shd w:val="clear" w:color="auto" w:fill="E8E8E8" w:themeFill="background2"/>
+          </w:tcPr>
+          <w:p>
+            <w:pPr>
+              <w:cnfStyle w:val="000000000000" w:firstRow="0" w:lastRow="0" w:firstColumn="0" w:lastColumn="0" w:oddVBand="0" w:evenVBand="0" w:oddHBand="0" w:evenHBand="0" w:firstRowFirstColumn="0" w:firstRowLastColumn="0" w:lastRowFirstColumn="0" w:lastRowLastColumn="0"/>
+            </w:pPr>
+            <w:r>
+              <w:t>Level sprite data</w:t>
+            </w:r>
+          </w:p>
+        </w:tc>
+        <w:tc>
+          <w:tcPr>
+            <w:tcW w:w="1260" w:type="dxa"/>
+            <w:shd w:val="clear" w:color="auto" w:fill="E8E8E8" w:themeFill="background2"/>
+          </w:tcPr>
+          <w:p>
+            <w:pPr>
+              <w:jc w:val="center"/>
+              <w:cnfStyle w:val="000000000000" w:firstRow="0" w:lastRow="0" w:firstColumn="0" w:lastColumn="0" w:oddVBand="0" w:evenVBand="0" w:oddHBand="0" w:evenHBand="0" w:firstRowFirstColumn="0" w:firstRowLastColumn="0" w:lastRowFirstColumn="0" w:lastRowLastColumn="0"/>
+            </w:pPr>
+            <w:r>
+              <w:t>3712</w:t>
+            </w:r>
+          </w:p>
+        </w:tc>
+      </w:tr>
+      <w:tr>
+        <w:trPr>
+          <w:cnfStyle w:val="000000100000" w:firstRow="0" w:lastRow="0" w:firstColumn="0" w:lastColumn="0" w:oddVBand="0" w:evenVBand="0" w:oddHBand="1" w:evenHBand="0" w:firstRowFirstColumn="0" w:firstRowLastColumn="0" w:lastRowFirstColumn="0" w:lastRowLastColumn="0"/>
+        </w:trPr>
+        <w:tc>
+          <w:tcPr>
+            <w:cnfStyle w:val="001000000000" w:firstRow="0" w:lastRow="0" w:firstColumn="1" w:lastColumn="0" w:oddVBand="0" w:evenVBand="0" w:oddHBand="0" w:evenHBand="0" w:firstRowFirstColumn="0" w:firstRowLastColumn="0" w:lastRowFirstColumn="0" w:lastRowLastColumn="0"/>
+            <w:tcW w:w="1345" w:type="dxa"/>
+            <w:shd w:val="clear" w:color="auto" w:fill="E8E8E8" w:themeFill="background2"/>
+          </w:tcPr>
+          <w:p>
+            <w:pPr>
+              <w:jc w:val="center"/>
+            </w:pPr>
+            <w:r>
+              <w:t>4F63</w:t>
+            </w:r>
+          </w:p>
+        </w:tc>
+        <w:tc>
+          <w:tcPr>
+            <w:tcW w:w="6570" w:type="dxa"/>
+            <w:shd w:val="clear" w:color="auto" w:fill="E8E8E8" w:themeFill="background2"/>
+          </w:tcPr>
+          <w:p>
+            <w:pPr>
+              <w:cnfStyle w:val="000000100000" w:firstRow="0" w:lastRow="0" w:firstColumn="0" w:lastColumn="0" w:oddVBand="0" w:evenVBand="0" w:oddHBand="1" w:evenHBand="0" w:firstRowFirstColumn="0" w:firstRowLastColumn="0" w:lastRowFirstColumn="0" w:lastRowLastColumn="0"/>
+            </w:pPr>
+            <w:r>
+              <w:t>Level initialization code</w:t>
+            </w:r>
+          </w:p>
+        </w:tc>
+        <w:tc>
+          <w:tcPr>
+            <w:tcW w:w="1260" w:type="dxa"/>
+            <w:shd w:val="clear" w:color="auto" w:fill="E8E8E8" w:themeFill="background2"/>
+          </w:tcPr>
+          <w:p>
+            <w:pPr>
+              <w:jc w:val="center"/>
+              <w:cnfStyle w:val="000000100000" w:firstRow="0" w:lastRow="0" w:firstColumn="0" w:lastColumn="0" w:oddVBand="0" w:evenVBand="0" w:oddHBand="1" w:evenHBand="0" w:firstRowFirstColumn="0" w:firstRowLastColumn="0" w:lastRowFirstColumn="0" w:lastRowLastColumn="0"/>
+            </w:pPr>
+            <w:r>
+              <w:t>1668</w:t>
+            </w:r>
+          </w:p>
+        </w:tc>
+      </w:tr>
+      <w:tr>
+        <w:tc>
+          <w:tcPr>
+            <w:cnfStyle w:val="001000000000" w:firstRow="0" w:lastRow="0" w:firstColumn="1" w:lastColumn="0" w:oddVBand="0" w:evenVBand="0" w:oddHBand="0" w:evenHBand="0" w:firstRowFirstColumn="0" w:firstRowLastColumn="0" w:lastRowFirstColumn="0" w:lastRowLastColumn="0"/>
+            <w:tcW w:w="1345" w:type="dxa"/>
+            <w:shd w:val="clear" w:color="auto" w:fill="DAE9F7" w:themeFill="text2" w:themeFillTint="1A"/>
+          </w:tcPr>
+          <w:p>
+            <w:pPr>
+              <w:jc w:val="center"/>
+            </w:pPr>
+            <w:r>
+              <w:t>55E7</w:t>
+            </w:r>
+          </w:p>
+        </w:tc>
+        <w:tc>
+          <w:tcPr>
+            <w:tcW w:w="6570" w:type="dxa"/>
+            <w:shd w:val="clear" w:color="auto" w:fill="DAE9F7" w:themeFill="text2" w:themeFillTint="1A"/>
+          </w:tcPr>
+          <w:p>
+            <w:pPr>
+              <w:cnfStyle w:val="000000000000" w:firstRow="0" w:lastRow="0" w:firstColumn="0" w:lastColumn="0" w:oddVBand="0" w:evenVBand="0" w:oddHBand="0" w:evenHBand="0" w:firstRowFirstColumn="0" w:firstRowLastColumn="0" w:lastRowFirstColumn="0" w:lastRowLastColumn="0"/>
+            </w:pPr>
+            <w:r>
+              <w:t>L</w:t>
+            </w:r>
+            <w:r>
+              <w:t xml:space="preserve">evel </w:t>
+            </w:r>
+            <w:r>
+              <w:t>experience</w:t>
+            </w:r>
+            <w:r>
+              <w:t>s</w:t>
+            </w:r>
+          </w:p>
+        </w:tc>
+        <w:tc>
+          <w:tcPr>
+            <w:tcW w:w="1260" w:type="dxa"/>
+            <w:shd w:val="clear" w:color="auto" w:fill="DAE9F7" w:themeFill="text2" w:themeFillTint="1A"/>
+          </w:tcPr>
+          <w:p>
+            <w:pPr>
+              <w:jc w:val="center"/>
+              <w:cnfStyle w:val="000000000000" w:firstRow="0" w:lastRow="0" w:firstColumn="0" w:lastColumn="0" w:oddVBand="0" w:evenVBand="0" w:oddHBand="0" w:evenHBand="0" w:firstRowFirstColumn="0" w:firstRowLastColumn="0" w:lastRowFirstColumn="0" w:lastRowLastColumn="0"/>
+              <w:rPr>
+                <w:b/>
+                <w:bCs/>
+              </w:rPr>
+            </w:pPr>
+            <w:r>
+              <w:rPr>
+                <w:b/>
+                <w:bCs/>
+              </w:rPr>
+              <w:t>TBD</w:t>
+            </w:r>
+          </w:p>
+        </w:tc>
+      </w:tr>
+      <w:tr>
+        <w:trPr>
+          <w:cnfStyle w:val="000000100000" w:firstRow="0" w:lastRow="0" w:firstColumn="0" w:lastColumn="0" w:oddVBand="0" w:evenVBand="0" w:oddHBand="1" w:evenHBand="0" w:firstRowFirstColumn="0" w:firstRowLastColumn="0" w:lastRowFirstColumn="0" w:lastRowLastColumn="0"/>
+        </w:trPr>
+        <w:tc>
+          <w:tcPr>
+            <w:cnfStyle w:val="001000000000" w:firstRow="0" w:lastRow="0" w:firstColumn="1" w:lastColumn="0" w:oddVBand="0" w:evenVBand="0" w:oddHBand="0" w:evenHBand="0" w:firstRowFirstColumn="0" w:firstRowLastColumn="0" w:lastRowFirstColumn="0" w:lastRowLastColumn="0"/>
+            <w:tcW w:w="1345" w:type="dxa"/>
+            <w:shd w:val="clear" w:color="auto" w:fill="auto"/>
+          </w:tcPr>
+          <w:p>
+            <w:pPr>
+              <w:jc w:val="center"/>
+              <w:rPr>
+                <w:b w:val="0"/>
+                <w:bCs w:val="0"/>
+              </w:rPr>
+            </w:pPr>
+            <w:r>
+              <w:t>…</w:t>
+            </w:r>
+          </w:p>
+        </w:tc>
+        <w:tc>
+          <w:tcPr>
+            <w:tcW w:w="6570" w:type="dxa"/>
+            <w:shd w:val="clear" w:color="auto" w:fill="auto"/>
+          </w:tcPr>
+          <w:p>
+            <w:pPr>
+              <w:cnfStyle w:val="000000100000" w:firstRow="0" w:lastRow="0" w:firstColumn="0" w:lastColumn="0" w:oddVBand="0" w:evenVBand="0" w:oddHBand="1" w:evenHBand="0" w:firstRowFirstColumn="0" w:firstRowLastColumn="0" w:lastRowFirstColumn="0" w:lastRowLastColumn="0"/>
+              <w:rPr>
+                <w:i/>
+                <w:iCs/>
+              </w:rPr>
+            </w:pPr>
+            <w:r>
+              <w:rPr>
+                <w:i/>
+                <w:iCs/>
+              </w:rPr>
+              <w:t>…</w:t>
+            </w:r>
+          </w:p>
+        </w:tc>
+        <w:tc>
+          <w:tcPr>
+            <w:tcW w:w="1260" w:type="dxa"/>
+            <w:shd w:val="clear" w:color="auto" w:fill="auto"/>
+          </w:tcPr>
+          <w:p>
+            <w:pPr>
+              <w:jc w:val="center"/>
+              <w:cnfStyle w:val="000000100000" w:firstRow="0" w:lastRow="0" w:firstColumn="0" w:lastColumn="0" w:oddVBand="0" w:evenVBand="0" w:oddHBand="1" w:evenHBand="0" w:firstRowFirstColumn="0" w:firstRowLastColumn="0" w:lastRowFirstColumn="0" w:lastRowLastColumn="0"/>
+            </w:pPr>
+            <w:r>
+              <w:t>…</w:t>
+            </w:r>
+          </w:p>
+        </w:tc>
+      </w:tr>
+      <w:tr>
+        <w:tc>
+          <w:tcPr>
+            <w:cnfStyle w:val="001000000000" w:firstRow="0" w:lastRow="0" w:firstColumn="1" w:lastColumn="0" w:oddVBand="0" w:evenVBand="0" w:oddHBand="0" w:evenHBand="0" w:firstRowFirstColumn="0" w:firstRowLastColumn="0" w:lastRowFirstColumn="0" w:lastRowLastColumn="0"/>
+            <w:tcW w:w="1345" w:type="dxa"/>
+            <w:shd w:val="clear" w:color="auto" w:fill="C1F0C7" w:themeFill="accent3" w:themeFillTint="33"/>
+          </w:tcPr>
+          <w:p>
+            <w:pPr>
+              <w:jc w:val="center"/>
+            </w:pPr>
+            <w:r>
+              <w:t>7C00</w:t>
+            </w:r>
+          </w:p>
+        </w:tc>
+        <w:tc>
+          <w:tcPr>
+            <w:tcW w:w="6570" w:type="dxa"/>
+            <w:shd w:val="clear" w:color="auto" w:fill="C1F0C7" w:themeFill="accent3" w:themeFillTint="33"/>
+          </w:tcPr>
+          <w:p>
+            <w:pPr>
+              <w:cnfStyle w:val="000000000000" w:firstRow="0" w:lastRow="0" w:firstColumn="0" w:lastColumn="0" w:oddVBand="0" w:evenVBand="0" w:oddHBand="0" w:evenHBand="0" w:firstRowFirstColumn="0" w:firstRowLastColumn="0" w:lastRowFirstColumn="0" w:lastRowLastColumn="0"/>
+            </w:pPr>
+            <w:r>
+              <w:t>Mode 7 screen</w:t>
+            </w:r>
+          </w:p>
+        </w:tc>
+        <w:tc>
+          <w:tcPr>
+            <w:tcW w:w="1260" w:type="dxa"/>
+            <w:shd w:val="clear" w:color="auto" w:fill="C1F0C7" w:themeFill="accent3" w:themeFillTint="33"/>
+          </w:tcPr>
+          <w:p>
+            <w:pPr>
+              <w:jc w:val="center"/>
+              <w:cnfStyle w:val="000000000000" w:firstRow="0" w:lastRow="0" w:firstColumn="0" w:lastColumn="0" w:oddVBand="0" w:evenVBand="0" w:oddHBand="0" w:evenHBand="0" w:firstRowFirstColumn="0" w:firstRowLastColumn="0" w:lastRowFirstColumn="0" w:lastRowLastColumn="0"/>
+            </w:pPr>
+            <w:r>
+              <w:t>1024</w:t>
+            </w:r>
+          </w:p>
+        </w:tc>
+      </w:tr>
+    </w:tbl>
+    <w:p/>
+    <w:p>
+      <w:r>
+        <w:t>The white and grey rows are identical to how memory is arranged during game titles and startup.</w:t>
+      </w:r>
+    </w:p>
+    <w:p>
+      <w:r>
+        <w:t>The light blue row shows the Mode 7 ‘</w:t>
+      </w:r>
+      <w:r>
+        <w:rPr>
+          <w:i/>
+          <w:iCs/>
+        </w:rPr>
+        <w:t>level complete</w:t>
+      </w:r>
+      <w:r>
+        <w:t>’ and ‘</w:t>
+      </w:r>
+      <w:r>
+        <w:rPr>
+          <w:i/>
+          <w:iCs/>
+        </w:rPr>
+        <w:t>k9 died</w:t>
+      </w:r>
+      <w:r>
+        <w:t>’ experiences</w:t>
       </w:r>
       <w:r>
         <w:t xml:space="preserve">, </w:t>
       </w:r>
       <w:r>
-        <w:t>show</w:t>
-      </w:r>
-      <w:r>
-        <w:t xml:space="preserve"> </w:t>
-      </w:r>
-      <w:r>
-        <w:t xml:space="preserve">the </w:t>
-      </w:r>
-      <w:r>
-        <w:t>M</w:t>
-      </w:r>
-      <w:r>
-        <w:t>ode</w:t>
-      </w:r>
-      <w:r>
-        <w:t xml:space="preserve"> </w:t>
-      </w:r>
-      <w:r>
-        <w:t>7 title screen</w:t>
-      </w:r>
-      <w:r>
-        <w:t>s</w:t>
-      </w:r>
-      <w:r>
-        <w:t xml:space="preserve">, and play the </w:t>
-      </w:r>
-      <w:r>
-        <w:t>Doctor Who</w:t>
-      </w:r>
-      <w:r>
-        <w:t xml:space="preserve"> theme music.</w:t>
-      </w:r>
-    </w:p>
-    <w:p>
-      <w:r>
-        <w:t xml:space="preserve">The light purple row shows a page backup </w:t>
-      </w:r>
-      <w:r>
-        <w:t>region</w:t>
-      </w:r>
-      <w:r>
-        <w:t xml:space="preserve"> that is used to </w:t>
-      </w:r>
-      <w:r>
-        <w:t xml:space="preserve">save and </w:t>
-      </w:r>
-      <w:r>
-        <w:t xml:space="preserve">restore code </w:t>
-      </w:r>
-      <w:r>
-        <w:t xml:space="preserve">(in Page &amp;17) </w:t>
-      </w:r>
-      <w:r>
-        <w:t>that DFS overwrites.</w:t>
-      </w:r>
-    </w:p>
-    <w:p>
-      <w:r>
-        <w:t>During startup the title screen</w:t>
-      </w:r>
-      <w:r>
-        <w:t>s</w:t>
-      </w:r>
-      <w:r>
-        <w:t xml:space="preserve"> </w:t>
-      </w:r>
-      <w:r>
-        <w:t xml:space="preserve">are </w:t>
-      </w:r>
-      <w:r>
-        <w:t xml:space="preserve">displayed in </w:t>
-      </w:r>
-      <w:r>
-        <w:t>M</w:t>
-      </w:r>
-      <w:r>
-        <w:t>ode</w:t>
-      </w:r>
-      <w:r>
-        <w:t xml:space="preserve"> </w:t>
-      </w:r>
-      <w:r>
-        <w:t xml:space="preserve">7, so the data/code </w:t>
-      </w:r>
-      <w:r>
-        <w:t xml:space="preserve">below &amp;7C00 </w:t>
-      </w:r>
-      <w:r>
-        <w:t xml:space="preserve">is not visible.  </w:t>
-      </w:r>
-      <w:r>
-        <w:t>D</w:t>
-      </w:r>
-      <w:r>
-        <w:t>uring level loading, the palette colors are set to black</w:t>
-      </w:r>
-      <w:r>
-        <w:t xml:space="preserve"> to achieve the same result.</w:t>
-      </w:r>
-    </w:p>
-    <w:p>
-      <w:r>
-        <w:t>The memory layout evolved during the development of the game, with allocation</w:t>
-      </w:r>
-      <w:r>
-        <w:t>s</w:t>
-      </w:r>
-      <w:r>
-        <w:t xml:space="preserve"> </w:t>
-      </w:r>
-      <w:r>
-        <w:t xml:space="preserve">moved </w:t>
-      </w:r>
-      <w:r>
-        <w:t>as needed.</w:t>
-      </w:r>
-    </w:p>
+        <w:t xml:space="preserve">plus the code/data used to </w:t>
+      </w:r>
+      <w:r>
+        <w:t>play the Doctor Who theme music.</w:t>
+      </w:r>
+    </w:p>
+    <w:p>
+      <w:pPr>
+        <w:pStyle w:val="Heading3"/>
+      </w:pPr>
+      <w:r>
+        <w:t>Game completion</w:t>
+      </w:r>
+    </w:p>
+    <w:p>
+      <w:r>
+        <w:t xml:space="preserve">When K9 reaches the TARDIS on the last level, the finale experience is loaded </w:t>
+      </w:r>
+      <w:r>
+        <w:t xml:space="preserve">from disc </w:t>
+      </w:r>
+      <w:r>
+        <w:t>and invoked.  The memory layout during this experience is as follows:</w:t>
+      </w:r>
+    </w:p>
+    <w:tbl>
+      <w:tblPr>
+        <w:tblStyle w:val="ListTable3-Accent4"/>
+        <w:tblW w:w="0" w:type="auto"/>
+        <w:tblLook w:val="04A0" w:firstRow="1" w:lastRow="0" w:firstColumn="1" w:lastColumn="0" w:noHBand="0" w:noVBand="1"/>
+      </w:tblPr>
+      <w:tblGrid>
+        <w:gridCol w:w="1345"/>
+        <w:gridCol w:w="6570"/>
+        <w:gridCol w:w="1260"/>
+      </w:tblGrid>
+      <w:tr>
+        <w:trPr>
+          <w:cnfStyle w:val="100000000000" w:firstRow="1" w:lastRow="0" w:firstColumn="0" w:lastColumn="0" w:oddVBand="0" w:evenVBand="0" w:oddHBand="0" w:evenHBand="0" w:firstRowFirstColumn="0" w:firstRowLastColumn="0" w:lastRowFirstColumn="0" w:lastRowLastColumn="0"/>
+        </w:trPr>
+        <w:tc>
+          <w:tcPr>
+            <w:cnfStyle w:val="001000000100" w:firstRow="0" w:lastRow="0" w:firstColumn="1" w:lastColumn="0" w:oddVBand="0" w:evenVBand="0" w:oddHBand="0" w:evenHBand="0" w:firstRowFirstColumn="1" w:firstRowLastColumn="0" w:lastRowFirstColumn="0" w:lastRowLastColumn="0"/>
+            <w:tcW w:w="1345" w:type="dxa"/>
+          </w:tcPr>
+          <w:p>
+            <w:pPr>
+              <w:jc w:val="center"/>
+            </w:pPr>
+            <w:r>
+              <w:t>Address (hex)</w:t>
+            </w:r>
+          </w:p>
+        </w:tc>
+        <w:tc>
+          <w:tcPr>
+            <w:tcW w:w="6570" w:type="dxa"/>
+          </w:tcPr>
+          <w:p>
+            <w:pPr>
+              <w:cnfStyle w:val="100000000000" w:firstRow="1" w:lastRow="0" w:firstColumn="0" w:lastColumn="0" w:oddVBand="0" w:evenVBand="0" w:oddHBand="0" w:evenHBand="0" w:firstRowFirstColumn="0" w:firstRowLastColumn="0" w:lastRowFirstColumn="0" w:lastRowLastColumn="0"/>
+            </w:pPr>
+            <w:r>
+              <w:t>Allocation</w:t>
+            </w:r>
+          </w:p>
+        </w:tc>
+        <w:tc>
+          <w:tcPr>
+            <w:tcW w:w="1260" w:type="dxa"/>
+          </w:tcPr>
+          <w:p>
+            <w:pPr>
+              <w:jc w:val="center"/>
+              <w:cnfStyle w:val="100000000000" w:firstRow="1" w:lastRow="0" w:firstColumn="0" w:lastColumn="0" w:oddVBand="0" w:evenVBand="0" w:oddHBand="0" w:evenHBand="0" w:firstRowFirstColumn="0" w:firstRowLastColumn="0" w:lastRowFirstColumn="0" w:lastRowLastColumn="0"/>
+            </w:pPr>
+            <w:r>
+              <w:t>Size (bytes)</w:t>
+            </w:r>
+          </w:p>
+        </w:tc>
+      </w:tr>
+      <w:tr>
+        <w:trPr>
+          <w:cnfStyle w:val="000000100000" w:firstRow="0" w:lastRow="0" w:firstColumn="0" w:lastColumn="0" w:oddVBand="0" w:evenVBand="0" w:oddHBand="1" w:evenHBand="0" w:firstRowFirstColumn="0" w:firstRowLastColumn="0" w:lastRowFirstColumn="0" w:lastRowLastColumn="0"/>
+        </w:trPr>
+        <w:tc>
+          <w:tcPr>
+            <w:cnfStyle w:val="001000000000" w:firstRow="0" w:lastRow="0" w:firstColumn="1" w:lastColumn="0" w:oddVBand="0" w:evenVBand="0" w:oddHBand="0" w:evenHBand="0" w:firstRowFirstColumn="0" w:firstRowLastColumn="0" w:lastRowFirstColumn="0" w:lastRowLastColumn="0"/>
+            <w:tcW w:w="1345" w:type="dxa"/>
+          </w:tcPr>
+          <w:p>
+            <w:pPr>
+              <w:jc w:val="center"/>
+              <w:rPr>
+                <w:b w:val="0"/>
+                <w:bCs w:val="0"/>
+              </w:rPr>
+            </w:pPr>
+            <w:r>
+              <w:rPr>
+                <w:b w:val="0"/>
+                <w:bCs w:val="0"/>
+              </w:rPr>
+              <w:t>…</w:t>
+            </w:r>
+          </w:p>
+        </w:tc>
+        <w:tc>
+          <w:tcPr>
+            <w:tcW w:w="6570" w:type="dxa"/>
+          </w:tcPr>
+          <w:p>
+            <w:pPr>
+              <w:cnfStyle w:val="000000100000" w:firstRow="0" w:lastRow="0" w:firstColumn="0" w:lastColumn="0" w:oddVBand="0" w:evenVBand="0" w:oddHBand="1" w:evenHBand="0" w:firstRowFirstColumn="0" w:firstRowLastColumn="0" w:lastRowFirstColumn="0" w:lastRowLastColumn="0"/>
+            </w:pPr>
+            <w:r>
+              <w:t>…</w:t>
+            </w:r>
+          </w:p>
+        </w:tc>
+        <w:tc>
+          <w:tcPr>
+            <w:tcW w:w="1260" w:type="dxa"/>
+          </w:tcPr>
+          <w:p>
+            <w:pPr>
+              <w:jc w:val="center"/>
+              <w:cnfStyle w:val="000000100000" w:firstRow="0" w:lastRow="0" w:firstColumn="0" w:lastColumn="0" w:oddVBand="0" w:evenVBand="0" w:oddHBand="1" w:evenHBand="0" w:firstRowFirstColumn="0" w:firstRowLastColumn="0" w:lastRowFirstColumn="0" w:lastRowLastColumn="0"/>
+            </w:pPr>
+          </w:p>
+        </w:tc>
+      </w:tr>
+      <w:tr>
+        <w:tc>
+          <w:tcPr>
+            <w:cnfStyle w:val="001000000000" w:firstRow="0" w:lastRow="0" w:firstColumn="1" w:lastColumn="0" w:oddVBand="0" w:evenVBand="0" w:oddHBand="0" w:evenHBand="0" w:firstRowFirstColumn="0" w:firstRowLastColumn="0" w:lastRowFirstColumn="0" w:lastRowLastColumn="0"/>
+            <w:tcW w:w="1345" w:type="dxa"/>
+            <w:shd w:val="clear" w:color="auto" w:fill="DAE9F7" w:themeFill="text2" w:themeFillTint="1A"/>
+          </w:tcPr>
+          <w:p>
+            <w:pPr>
+              <w:jc w:val="center"/>
+            </w:pPr>
+            <w:r>
+              <w:t>55E7</w:t>
+            </w:r>
+          </w:p>
+        </w:tc>
+        <w:tc>
+          <w:tcPr>
+            <w:tcW w:w="6570" w:type="dxa"/>
+            <w:shd w:val="clear" w:color="auto" w:fill="DAE9F7" w:themeFill="text2" w:themeFillTint="1A"/>
+          </w:tcPr>
+          <w:p>
+            <w:pPr>
+              <w:cnfStyle w:val="000000000000" w:firstRow="0" w:lastRow="0" w:firstColumn="0" w:lastColumn="0" w:oddVBand="0" w:evenVBand="0" w:oddHBand="0" w:evenHBand="0" w:firstRowFirstColumn="0" w:firstRowLastColumn="0" w:lastRowFirstColumn="0" w:lastRowLastColumn="0"/>
+            </w:pPr>
+            <w:r>
+              <w:t>Finale experience</w:t>
+            </w:r>
+          </w:p>
+        </w:tc>
+        <w:tc>
+          <w:tcPr>
+            <w:tcW w:w="1260" w:type="dxa"/>
+            <w:shd w:val="clear" w:color="auto" w:fill="DAE9F7" w:themeFill="text2" w:themeFillTint="1A"/>
+          </w:tcPr>
+          <w:p>
+            <w:pPr>
+              <w:jc w:val="center"/>
+              <w:cnfStyle w:val="000000000000" w:firstRow="0" w:lastRow="0" w:firstColumn="0" w:lastColumn="0" w:oddVBand="0" w:evenVBand="0" w:oddHBand="0" w:evenHBand="0" w:firstRowFirstColumn="0" w:firstRowLastColumn="0" w:lastRowFirstColumn="0" w:lastRowLastColumn="0"/>
+            </w:pPr>
+            <w:r>
+              <w:t>2639</w:t>
+            </w:r>
+          </w:p>
+        </w:tc>
+      </w:tr>
+      <w:tr>
+        <w:trPr>
+          <w:cnfStyle w:val="000000100000" w:firstRow="0" w:lastRow="0" w:firstColumn="0" w:lastColumn="0" w:oddVBand="0" w:evenVBand="0" w:oddHBand="1" w:evenHBand="0" w:firstRowFirstColumn="0" w:firstRowLastColumn="0" w:lastRowFirstColumn="0" w:lastRowLastColumn="0"/>
+        </w:trPr>
+        <w:tc>
+          <w:tcPr>
+            <w:cnfStyle w:val="001000000000" w:firstRow="0" w:lastRow="0" w:firstColumn="1" w:lastColumn="0" w:oddVBand="0" w:evenVBand="0" w:oddHBand="0" w:evenHBand="0" w:firstRowFirstColumn="0" w:firstRowLastColumn="0" w:lastRowFirstColumn="0" w:lastRowLastColumn="0"/>
+            <w:tcW w:w="1345" w:type="dxa"/>
+            <w:shd w:val="clear" w:color="auto" w:fill="DAE9F7" w:themeFill="text2" w:themeFillTint="1A"/>
+          </w:tcPr>
+          <w:p>
+            <w:pPr>
+              <w:jc w:val="center"/>
+            </w:pPr>
+            <w:r>
+              <w:t>6036</w:t>
+            </w:r>
+          </w:p>
+        </w:tc>
+        <w:tc>
+          <w:tcPr>
+            <w:tcW w:w="6570" w:type="dxa"/>
+            <w:shd w:val="clear" w:color="auto" w:fill="DAE9F7" w:themeFill="text2" w:themeFillTint="1A"/>
+          </w:tcPr>
+          <w:p>
+            <w:pPr>
+              <w:cnfStyle w:val="000000100000" w:firstRow="0" w:lastRow="0" w:firstColumn="0" w:lastColumn="0" w:oddVBand="0" w:evenVBand="0" w:oddHBand="1" w:evenHBand="0" w:firstRowFirstColumn="0" w:firstRowLastColumn="0" w:lastRowFirstColumn="0" w:lastRowLastColumn="0"/>
+            </w:pPr>
+            <w:r>
+              <w:t>Music data and code</w:t>
+            </w:r>
+          </w:p>
+        </w:tc>
+        <w:tc>
+          <w:tcPr>
+            <w:tcW w:w="1260" w:type="dxa"/>
+            <w:shd w:val="clear" w:color="auto" w:fill="DAE9F7" w:themeFill="text2" w:themeFillTint="1A"/>
+          </w:tcPr>
+          <w:p>
+            <w:pPr>
+              <w:jc w:val="center"/>
+              <w:cnfStyle w:val="000000100000" w:firstRow="0" w:lastRow="0" w:firstColumn="0" w:lastColumn="0" w:oddVBand="0" w:evenVBand="0" w:oddHBand="1" w:evenHBand="0" w:firstRowFirstColumn="0" w:firstRowLastColumn="0" w:lastRowFirstColumn="0" w:lastRowLastColumn="0"/>
+            </w:pPr>
+            <w:r>
+              <w:t>3216</w:t>
+            </w:r>
+          </w:p>
+        </w:tc>
+      </w:tr>
+      <w:tr>
+        <w:tc>
+          <w:tcPr>
+            <w:cnfStyle w:val="001000000000" w:firstRow="0" w:lastRow="0" w:firstColumn="1" w:lastColumn="0" w:oddVBand="0" w:evenVBand="0" w:oddHBand="0" w:evenHBand="0" w:firstRowFirstColumn="0" w:firstRowLastColumn="0" w:lastRowFirstColumn="0" w:lastRowLastColumn="0"/>
+            <w:tcW w:w="1345" w:type="dxa"/>
+            <w:shd w:val="clear" w:color="auto" w:fill="auto"/>
+          </w:tcPr>
+          <w:p>
+            <w:pPr>
+              <w:jc w:val="center"/>
+              <w:rPr>
+                <w:b w:val="0"/>
+                <w:bCs w:val="0"/>
+              </w:rPr>
+            </w:pPr>
+            <w:r>
+              <w:rPr>
+                <w:b w:val="0"/>
+                <w:bCs w:val="0"/>
+              </w:rPr>
+              <w:t>…</w:t>
+            </w:r>
+          </w:p>
+        </w:tc>
+        <w:tc>
+          <w:tcPr>
+            <w:tcW w:w="6570" w:type="dxa"/>
+            <w:shd w:val="clear" w:color="auto" w:fill="auto"/>
+          </w:tcPr>
+          <w:p>
+            <w:pPr>
+              <w:cnfStyle w:val="000000000000" w:firstRow="0" w:lastRow="0" w:firstColumn="0" w:lastColumn="0" w:oddVBand="0" w:evenVBand="0" w:oddHBand="0" w:evenHBand="0" w:firstRowFirstColumn="0" w:firstRowLastColumn="0" w:lastRowFirstColumn="0" w:lastRowLastColumn="0"/>
+              <w:rPr>
+                <w:i/>
+                <w:iCs/>
+              </w:rPr>
+            </w:pPr>
+            <w:r>
+              <w:rPr>
+                <w:i/>
+                <w:iCs/>
+              </w:rPr>
+              <w:t>…</w:t>
+            </w:r>
+          </w:p>
+        </w:tc>
+        <w:tc>
+          <w:tcPr>
+            <w:tcW w:w="1260" w:type="dxa"/>
+            <w:shd w:val="clear" w:color="auto" w:fill="auto"/>
+          </w:tcPr>
+          <w:p>
+            <w:pPr>
+              <w:jc w:val="center"/>
+              <w:cnfStyle w:val="000000000000" w:firstRow="0" w:lastRow="0" w:firstColumn="0" w:lastColumn="0" w:oddVBand="0" w:evenVBand="0" w:oddHBand="0" w:evenHBand="0" w:firstRowFirstColumn="0" w:firstRowLastColumn="0" w:lastRowFirstColumn="0" w:lastRowLastColumn="0"/>
+            </w:pPr>
+          </w:p>
+        </w:tc>
+      </w:tr>
+      <w:tr>
+        <w:trPr>
+          <w:cnfStyle w:val="000000100000" w:firstRow="0" w:lastRow="0" w:firstColumn="0" w:lastColumn="0" w:oddVBand="0" w:evenVBand="0" w:oddHBand="1" w:evenHBand="0" w:firstRowFirstColumn="0" w:firstRowLastColumn="0" w:lastRowFirstColumn="0" w:lastRowLastColumn="0"/>
+        </w:trPr>
+        <w:tc>
+          <w:tcPr>
+            <w:cnfStyle w:val="001000000000" w:firstRow="0" w:lastRow="0" w:firstColumn="1" w:lastColumn="0" w:oddVBand="0" w:evenVBand="0" w:oddHBand="0" w:evenHBand="0" w:firstRowFirstColumn="0" w:firstRowLastColumn="0" w:lastRowFirstColumn="0" w:lastRowLastColumn="0"/>
+            <w:tcW w:w="1345" w:type="dxa"/>
+            <w:shd w:val="clear" w:color="auto" w:fill="C1F0C7" w:themeFill="accent3" w:themeFillTint="33"/>
+          </w:tcPr>
+          <w:p>
+            <w:pPr>
+              <w:jc w:val="center"/>
+            </w:pPr>
+            <w:r>
+              <w:t>7C00</w:t>
+            </w:r>
+          </w:p>
+        </w:tc>
+        <w:tc>
+          <w:tcPr>
+            <w:tcW w:w="6570" w:type="dxa"/>
+            <w:shd w:val="clear" w:color="auto" w:fill="C1F0C7" w:themeFill="accent3" w:themeFillTint="33"/>
+          </w:tcPr>
+          <w:p>
+            <w:pPr>
+              <w:cnfStyle w:val="000000100000" w:firstRow="0" w:lastRow="0" w:firstColumn="0" w:lastColumn="0" w:oddVBand="0" w:evenVBand="0" w:oddHBand="1" w:evenHBand="0" w:firstRowFirstColumn="0" w:firstRowLastColumn="0" w:lastRowFirstColumn="0" w:lastRowLastColumn="0"/>
+            </w:pPr>
+            <w:r>
+              <w:t>Mode 7 screen</w:t>
+            </w:r>
+          </w:p>
+        </w:tc>
+        <w:tc>
+          <w:tcPr>
+            <w:tcW w:w="1260" w:type="dxa"/>
+            <w:shd w:val="clear" w:color="auto" w:fill="C1F0C7" w:themeFill="accent3" w:themeFillTint="33"/>
+          </w:tcPr>
+          <w:p>
+            <w:pPr>
+              <w:jc w:val="center"/>
+              <w:cnfStyle w:val="000000100000" w:firstRow="0" w:lastRow="0" w:firstColumn="0" w:lastColumn="0" w:oddVBand="0" w:evenVBand="0" w:oddHBand="1" w:evenHBand="0" w:firstRowFirstColumn="0" w:firstRowLastColumn="0" w:lastRowFirstColumn="0" w:lastRowLastColumn="0"/>
+            </w:pPr>
+            <w:r>
+              <w:t>1024</w:t>
+            </w:r>
+          </w:p>
+        </w:tc>
+      </w:tr>
+    </w:tbl>
+    <w:p/>
     <w:p>
       <w:pPr>
         <w:pStyle w:val="Heading2"/>
@@ -23857,6 +25002,7 @@
         </w:numPr>
       </w:pPr>
       <w:r>
+        <w:lastRenderedPageBreak/>
         <w:t xml:space="preserve">Broad clipping is performed </w:t>
       </w:r>
       <w:r>
@@ -23965,7 +25111,6 @@
         </w:numPr>
       </w:pPr>
       <w:r>
-        <w:lastRenderedPageBreak/>
         <w:t xml:space="preserve">Used an optimized </w:t>
       </w:r>
       <w:r>
@@ -24436,6 +25581,7 @@
         </w:numPr>
       </w:pPr>
       <w:r>
+        <w:lastRenderedPageBreak/>
         <w:t>Only c</w:t>
       </w:r>
       <w:r>
@@ -24594,7 +25740,6 @@
         </w:numPr>
       </w:pPr>
       <w:r>
-        <w:lastRenderedPageBreak/>
         <w:t>Used conditional branching whenever possible, instead of jumps.</w:t>
       </w:r>
       <w:r>
@@ -25107,6 +26252,7 @@
     </w:p>
     <w:p>
       <w:r>
+        <w:lastRenderedPageBreak/>
         <w:t xml:space="preserve">Control flow </w:t>
       </w:r>
       <w:r>
@@ -25341,474 +26487,474 @@
     </w:p>
     <w:p>
       <w:r>
+        <w:t xml:space="preserve">The accumulator is </w:t>
+      </w:r>
+      <w:r>
+        <w:t xml:space="preserve">typically </w:t>
+      </w:r>
+      <w:r>
+        <w:t xml:space="preserve">used to pass arguments to routines that </w:t>
+      </w:r>
+      <w:r>
+        <w:t>accept</w:t>
+      </w:r>
+      <w:r>
+        <w:t xml:space="preserve"> a </w:t>
+      </w:r>
+      <w:r>
+        <w:t xml:space="preserve">single </w:t>
+      </w:r>
+      <w:r>
+        <w:t>argument</w:t>
+      </w:r>
+      <w:r>
+        <w:t>,</w:t>
+      </w:r>
+      <w:r>
+        <w:t xml:space="preserve"> and the </w:t>
+      </w:r>
+      <w:r>
+        <w:t xml:space="preserve">X register </w:t>
+      </w:r>
+      <w:r>
+        <w:t xml:space="preserve">is </w:t>
+      </w:r>
+      <w:r>
+        <w:t xml:space="preserve">exclusively </w:t>
+      </w:r>
+      <w:r>
+        <w:t xml:space="preserve">used to </w:t>
+      </w:r>
+      <w:r>
+        <w:t>pass game object</w:t>
+      </w:r>
+      <w:r>
+        <w:t xml:space="preserve">s, </w:t>
+      </w:r>
+      <w:r>
+        <w:t>as</w:t>
+      </w:r>
+      <w:r>
+        <w:t xml:space="preserve"> an </w:t>
+      </w:r>
+      <w:r>
+        <w:t>index</w:t>
+      </w:r>
+      <w:r>
+        <w:t xml:space="preserve">.  </w:t>
+      </w:r>
+      <w:r>
+        <w:t xml:space="preserve">In other situations, </w:t>
+      </w:r>
+      <w:r>
+        <w:t>z</w:t>
+      </w:r>
+      <w:r>
+        <w:t xml:space="preserve">ero-page variables are </w:t>
+      </w:r>
+      <w:r>
+        <w:t xml:space="preserve">used to </w:t>
+      </w:r>
+      <w:r>
+        <w:t>pass argument</w:t>
+      </w:r>
+      <w:r>
+        <w:t>s</w:t>
+      </w:r>
+      <w:r>
+        <w:t>.</w:t>
+      </w:r>
+      <w:r>
+        <w:t xml:space="preserve">  </w:t>
+      </w:r>
+      <w:r>
+        <w:t xml:space="preserve">The </w:t>
+      </w:r>
+      <w:r>
+        <w:t xml:space="preserve">Y register </w:t>
+      </w:r>
+      <w:r>
+        <w:t>is rarely</w:t>
+      </w:r>
+      <w:r>
+        <w:t xml:space="preserve"> </w:t>
+      </w:r>
+      <w:r>
+        <w:t>used</w:t>
+      </w:r>
+      <w:r>
+        <w:t>.</w:t>
+      </w:r>
+    </w:p>
+    <w:p>
+      <w:r>
+        <w:t>As for the stack</w:t>
+      </w:r>
+      <w:r>
+        <w:t>…</w:t>
+      </w:r>
+      <w:r>
+        <w:t xml:space="preserve"> r</w:t>
+      </w:r>
+      <w:r>
+        <w:t xml:space="preserve">outines occasionally push and pop values, </w:t>
+      </w:r>
+      <w:r>
+        <w:t xml:space="preserve">but </w:t>
+      </w:r>
+      <w:r>
+        <w:t xml:space="preserve">this is </w:t>
+      </w:r>
+      <w:r>
+        <w:t>rare</w:t>
+      </w:r>
+      <w:r>
+        <w:t xml:space="preserve">. </w:t>
+      </w:r>
+      <w:r>
+        <w:t xml:space="preserve"> Z</w:t>
+      </w:r>
+      <w:r>
+        <w:t xml:space="preserve">ero-page </w:t>
+      </w:r>
+      <w:r>
+        <w:t xml:space="preserve">variables </w:t>
+      </w:r>
+      <w:r>
+        <w:t xml:space="preserve">are typically used </w:t>
+      </w:r>
+      <w:r>
+        <w:t>to hold temporary values as this avoids issues where control flow can result in push/pop mismatches.</w:t>
+      </w:r>
+      <w:r>
+        <w:t xml:space="preserve"> </w:t>
+      </w:r>
+    </w:p>
+    <w:p>
+      <w:pPr>
+        <w:pStyle w:val="Heading2"/>
+      </w:pPr>
+      <w:r>
+        <w:t>Game design</w:t>
+      </w:r>
+    </w:p>
+    <w:p>
+      <w:r>
+        <w:t xml:space="preserve">The playability of a game is determined by many </w:t>
+      </w:r>
+      <w:r>
+        <w:t>factors.  The player needs to be challenged</w:t>
+      </w:r>
+      <w:r>
+        <w:t xml:space="preserve">, and </w:t>
+      </w:r>
+      <w:r>
+        <w:t xml:space="preserve">needs to </w:t>
+      </w:r>
+      <w:r>
+        <w:t xml:space="preserve">work, to </w:t>
+      </w:r>
+      <w:r>
+        <w:t xml:space="preserve">feel a </w:t>
+      </w:r>
+      <w:r>
+        <w:t xml:space="preserve">real </w:t>
+      </w:r>
+      <w:r>
+        <w:t xml:space="preserve">sense of </w:t>
+      </w:r>
+      <w:r>
+        <w:t>gratification</w:t>
+      </w:r>
+      <w:r>
+        <w:t xml:space="preserve"> and reward</w:t>
+      </w:r>
+      <w:r>
+        <w:t xml:space="preserve"> later</w:t>
+      </w:r>
+      <w:r>
+        <w:t>.</w:t>
+      </w:r>
+      <w:r>
+        <w:t xml:space="preserve">  The </w:t>
+      </w:r>
+      <w:r>
+        <w:t>players’</w:t>
+      </w:r>
+      <w:r>
+        <w:t xml:space="preserve"> </w:t>
+      </w:r>
+      <w:r>
+        <w:t>attention mu</w:t>
+      </w:r>
+      <w:r>
+        <w:t>st</w:t>
+      </w:r>
+      <w:r>
+        <w:t xml:space="preserve"> also be held</w:t>
+      </w:r>
+      <w:r>
+        <w:t xml:space="preserve"> by the game</w:t>
+      </w:r>
+      <w:r>
+        <w:t>,</w:t>
+      </w:r>
+      <w:r>
+        <w:t xml:space="preserve"> by </w:t>
+      </w:r>
+      <w:r>
+        <w:t>presenting occasional surprises</w:t>
+      </w:r>
+      <w:r>
+        <w:t xml:space="preserve"> and changing thi</w:t>
+      </w:r>
+      <w:r>
+        <w:t>ng</w:t>
+      </w:r>
+      <w:r>
+        <w:t>s</w:t>
+      </w:r>
+      <w:r>
+        <w:t xml:space="preserve"> up</w:t>
+      </w:r>
+      <w:r>
+        <w:t xml:space="preserve"> on the player</w:t>
+      </w:r>
+      <w:r>
+        <w:t>.</w:t>
+      </w:r>
+      <w:r>
+        <w:t xml:space="preserve">  </w:t>
+      </w:r>
+      <w:r>
+        <w:t xml:space="preserve">And </w:t>
+      </w:r>
+      <w:r>
+        <w:t xml:space="preserve">above all, the </w:t>
+      </w:r>
+      <w:r>
+        <w:t xml:space="preserve">player </w:t>
+      </w:r>
+      <w:r>
+        <w:t xml:space="preserve">should not be </w:t>
+      </w:r>
+      <w:r>
+        <w:t>punished</w:t>
+      </w:r>
+      <w:r>
+        <w:t xml:space="preserve"> for playing the game</w:t>
+      </w:r>
+      <w:r>
+        <w:t>.</w:t>
+      </w:r>
+      <w:r>
+        <w:t xml:space="preserve">  The game must </w:t>
+      </w:r>
+      <w:r>
+        <w:t xml:space="preserve">be robust (not crash) and </w:t>
+      </w:r>
+      <w:r>
+        <w:t xml:space="preserve">its difficulty should </w:t>
+      </w:r>
+      <w:r>
+        <w:t xml:space="preserve">increase </w:t>
+      </w:r>
+      <w:r>
+        <w:t>in a reasonable manner.</w:t>
+      </w:r>
+    </w:p>
+    <w:p>
+      <w:r>
+        <w:t>The following choices were made to make th</w:t>
+      </w:r>
+      <w:r>
+        <w:t>is</w:t>
+      </w:r>
+      <w:r>
+        <w:t xml:space="preserve"> game feel more </w:t>
+      </w:r>
+      <w:r>
+        <w:t>current</w:t>
+      </w:r>
+      <w:r>
+        <w:t>.</w:t>
+      </w:r>
+    </w:p>
+    <w:p>
+      <w:r>
+        <w:t xml:space="preserve">Unlike many 1980’s games, </w:t>
+      </w:r>
+      <w:r>
+        <w:t>K9 does not have three lives</w:t>
+      </w:r>
+      <w:r>
+        <w:t xml:space="preserve"> and there isn’t a notion of </w:t>
+      </w:r>
+      <w:r>
+        <w:t xml:space="preserve">score or points.   The goal of the game is </w:t>
+      </w:r>
+      <w:r>
+        <w:t xml:space="preserve">to </w:t>
+      </w:r>
+      <w:r>
+        <w:t xml:space="preserve">just successfully </w:t>
+      </w:r>
+      <w:r>
+        <w:t>navigate</w:t>
+      </w:r>
+      <w:r>
+        <w:t xml:space="preserve"> K9 t</w:t>
+      </w:r>
+      <w:r>
+        <w:t>h</w:t>
+      </w:r>
+      <w:r>
+        <w:t>r</w:t>
+      </w:r>
+      <w:r>
+        <w:t xml:space="preserve">ough all the </w:t>
+      </w:r>
+      <w:r>
+        <w:t>levels</w:t>
+      </w:r>
+      <w:r>
+        <w:t>.</w:t>
+      </w:r>
+    </w:p>
+    <w:p>
+      <w:r>
+        <w:t xml:space="preserve">K9 dies when </w:t>
+      </w:r>
+      <w:r>
+        <w:t xml:space="preserve">K9’s </w:t>
+      </w:r>
+      <w:r>
+        <w:t xml:space="preserve">health </w:t>
+      </w:r>
+      <w:r>
+        <w:t xml:space="preserve">becomes zero.  K9 gains health by collecting jewels, and loses health when using </w:t>
+      </w:r>
+      <w:r>
+        <w:t xml:space="preserve">the laser, or </w:t>
+      </w:r>
+      <w:r>
+        <w:t xml:space="preserve">when </w:t>
+      </w:r>
+      <w:r>
+        <w:t>attacked</w:t>
+      </w:r>
+      <w:r>
+        <w:t xml:space="preserve"> by a Dalek</w:t>
+      </w:r>
+      <w:r>
+        <w:t>.</w:t>
+      </w:r>
+      <w:r>
+        <w:t xml:space="preserve">  When K9’s health is low, the laser cannot be used and the health bar in the game bar changes color.  To reinforce low health, a </w:t>
+      </w:r>
+      <w:r>
+        <w:t>heart rate monitor beep is sounded every second or so.  This becomes a continuous tone if K9</w:t>
+      </w:r>
+      <w:r>
+        <w:t>’s battery is flat</w:t>
+      </w:r>
+      <w:r>
+        <w:t>.</w:t>
+      </w:r>
+    </w:p>
+    <w:p>
+      <w:r>
+        <w:t>If K9 dies, the current level is restated.  The user can also choose to restart the current level if they become stuck</w:t>
+      </w:r>
+      <w:r>
+        <w:t>, by pressing the ‘R’ key.</w:t>
+      </w:r>
+    </w:p>
+    <w:p>
+      <w:r>
         <w:lastRenderedPageBreak/>
-        <w:t xml:space="preserve">The accumulator is </w:t>
-      </w:r>
-      <w:r>
-        <w:t xml:space="preserve">typically </w:t>
-      </w:r>
-      <w:r>
-        <w:t xml:space="preserve">used to pass arguments to routines that </w:t>
-      </w:r>
-      <w:r>
-        <w:t>accept</w:t>
-      </w:r>
-      <w:r>
-        <w:t xml:space="preserve"> a </w:t>
-      </w:r>
-      <w:r>
-        <w:t xml:space="preserve">single </w:t>
-      </w:r>
-      <w:r>
-        <w:t>argument</w:t>
-      </w:r>
-      <w:r>
-        <w:t>,</w:t>
-      </w:r>
-      <w:r>
-        <w:t xml:space="preserve"> and the </w:t>
-      </w:r>
-      <w:r>
-        <w:t xml:space="preserve">X register </w:t>
-      </w:r>
-      <w:r>
-        <w:t xml:space="preserve">is </w:t>
-      </w:r>
-      <w:r>
-        <w:t xml:space="preserve">exclusively </w:t>
-      </w:r>
-      <w:r>
-        <w:t xml:space="preserve">used to </w:t>
-      </w:r>
-      <w:r>
-        <w:t>pass game object</w:t>
-      </w:r>
-      <w:r>
-        <w:t xml:space="preserve">s, </w:t>
-      </w:r>
-      <w:r>
-        <w:t>as</w:t>
-      </w:r>
-      <w:r>
-        <w:t xml:space="preserve"> an </w:t>
-      </w:r>
-      <w:r>
-        <w:t>index</w:t>
-      </w:r>
-      <w:r>
-        <w:t xml:space="preserve">.  </w:t>
-      </w:r>
-      <w:r>
-        <w:t xml:space="preserve">In other situations, </w:t>
-      </w:r>
-      <w:r>
-        <w:t>z</w:t>
-      </w:r>
-      <w:r>
-        <w:t xml:space="preserve">ero-page variables are </w:t>
-      </w:r>
-      <w:r>
-        <w:t xml:space="preserve">used to </w:t>
-      </w:r>
-      <w:r>
-        <w:t>pass argument</w:t>
+        <w:t>And unlike many 1980’s games, t</w:t>
+      </w:r>
+      <w:r>
+        <w:t xml:space="preserve">he player </w:t>
+      </w:r>
+      <w:r>
+        <w:t xml:space="preserve">direction </w:t>
+      </w:r>
+      <w:r>
+        <w:t xml:space="preserve">keys </w:t>
+      </w:r>
+      <w:r>
+        <w:t xml:space="preserve">are </w:t>
+      </w:r>
+      <w:r>
+        <w:t>W</w:t>
+      </w:r>
+      <w:r>
+        <w:t>ASD</w:t>
+      </w:r>
+      <w:r>
+        <w:t>.</w:t>
+      </w:r>
+    </w:p>
+    <w:p>
+      <w:r>
+        <w:t>Locked doors and keys are used to add a puzzle element to the game.</w:t>
+      </w:r>
+      <w:r>
+        <w:t xml:space="preserve">  Key</w:t>
       </w:r>
       <w:r>
         <w:t>s</w:t>
       </w:r>
       <w:r>
-        <w:t>.</w:t>
+        <w:t xml:space="preserve"> can be collected and then used to </w:t>
+      </w:r>
+      <w:r>
+        <w:t xml:space="preserve">pass </w:t>
+      </w:r>
+      <w:r>
+        <w:t xml:space="preserve">through </w:t>
+      </w:r>
+      <w:r>
+        <w:t xml:space="preserve">locked </w:t>
+      </w:r>
+      <w:r>
+        <w:t xml:space="preserve">doors, </w:t>
+      </w:r>
+      <w:r>
+        <w:t>after which they are used.</w:t>
       </w:r>
       <w:r>
         <w:t xml:space="preserve">  </w:t>
       </w:r>
       <w:r>
-        <w:t xml:space="preserve">The </w:t>
-      </w:r>
-      <w:r>
-        <w:t xml:space="preserve">Y register </w:t>
-      </w:r>
-      <w:r>
-        <w:t>is rarely</w:t>
-      </w:r>
-      <w:r>
-        <w:t xml:space="preserve"> </w:t>
-      </w:r>
-      <w:r>
-        <w:t>used</w:t>
-      </w:r>
-      <w:r>
-        <w:t>.</w:t>
-      </w:r>
-    </w:p>
-    <w:p>
-      <w:r>
-        <w:t>As for the stack</w:t>
-      </w:r>
-      <w:r>
-        <w:t>…</w:t>
-      </w:r>
-      <w:r>
-        <w:t xml:space="preserve"> r</w:t>
-      </w:r>
-      <w:r>
-        <w:t xml:space="preserve">outines occasionally push and pop values, </w:t>
-      </w:r>
-      <w:r>
-        <w:t xml:space="preserve">but </w:t>
-      </w:r>
-      <w:r>
-        <w:t xml:space="preserve">this is </w:t>
-      </w:r>
-      <w:r>
-        <w:t>rare</w:t>
-      </w:r>
-      <w:r>
-        <w:t xml:space="preserve">. </w:t>
-      </w:r>
-      <w:r>
-        <w:t xml:space="preserve"> Z</w:t>
-      </w:r>
-      <w:r>
-        <w:t xml:space="preserve">ero-page </w:t>
-      </w:r>
-      <w:r>
-        <w:t xml:space="preserve">variables </w:t>
-      </w:r>
-      <w:r>
-        <w:t xml:space="preserve">are typically used </w:t>
-      </w:r>
-      <w:r>
-        <w:t>to hold temporary values as this avoids issues where control flow can result in push/pop mismatches.</w:t>
-      </w:r>
-      <w:r>
-        <w:t xml:space="preserve"> </w:t>
-      </w:r>
-    </w:p>
-    <w:p>
-      <w:pPr>
-        <w:pStyle w:val="Heading2"/>
-      </w:pPr>
-      <w:r>
-        <w:t>Game design</w:t>
-      </w:r>
-    </w:p>
-    <w:p>
-      <w:r>
-        <w:t xml:space="preserve">The playability of a game is determined by many </w:t>
-      </w:r>
-      <w:r>
-        <w:t>factors.  The player needs to be challenged</w:t>
-      </w:r>
-      <w:r>
-        <w:t xml:space="preserve">, and </w:t>
-      </w:r>
-      <w:r>
-        <w:t xml:space="preserve">needs to </w:t>
-      </w:r>
-      <w:r>
-        <w:t xml:space="preserve">work, to </w:t>
-      </w:r>
-      <w:r>
-        <w:t xml:space="preserve">feel a </w:t>
-      </w:r>
-      <w:r>
-        <w:t xml:space="preserve">real </w:t>
-      </w:r>
-      <w:r>
-        <w:t xml:space="preserve">sense of </w:t>
-      </w:r>
-      <w:r>
-        <w:t>gratification</w:t>
-      </w:r>
-      <w:r>
-        <w:t xml:space="preserve"> and reward</w:t>
-      </w:r>
-      <w:r>
-        <w:t xml:space="preserve"> later</w:t>
-      </w:r>
-      <w:r>
-        <w:t>.</w:t>
-      </w:r>
-      <w:r>
-        <w:t xml:space="preserve">  The </w:t>
-      </w:r>
-      <w:r>
-        <w:t>players’</w:t>
-      </w:r>
-      <w:r>
-        <w:t xml:space="preserve"> </w:t>
-      </w:r>
-      <w:r>
-        <w:t>attention mu</w:t>
-      </w:r>
-      <w:r>
-        <w:t>st</w:t>
-      </w:r>
-      <w:r>
-        <w:t xml:space="preserve"> also be held</w:t>
-      </w:r>
-      <w:r>
-        <w:t xml:space="preserve"> by the game</w:t>
-      </w:r>
-      <w:r>
-        <w:t>,</w:t>
-      </w:r>
-      <w:r>
-        <w:t xml:space="preserve"> by </w:t>
-      </w:r>
-      <w:r>
-        <w:t>presenting occasional surprises</w:t>
-      </w:r>
-      <w:r>
-        <w:t xml:space="preserve"> and changing thi</w:t>
-      </w:r>
-      <w:r>
-        <w:t>ng</w:t>
+        <w:t xml:space="preserve">Doors stay unlocked until a Darek uses them.  </w:t>
+      </w:r>
+      <w:r>
+        <w:t>Alternatively</w:t>
+      </w:r>
+      <w:r>
+        <w:t xml:space="preserve">, </w:t>
+      </w:r>
+      <w:r>
+        <w:t xml:space="preserve">K9 can follow a Dalek </w:t>
+      </w:r>
+      <w:r>
+        <w:t>through a door.</w:t>
+      </w:r>
+    </w:p>
+    <w:p>
+      <w:r>
+        <w:t>Other</w:t>
+      </w:r>
+      <w:r>
+        <w:t xml:space="preserve"> puzzle element</w:t>
       </w:r>
       <w:r>
         <w:t>s</w:t>
       </w:r>
       <w:r>
-        <w:t xml:space="preserve"> up</w:t>
-      </w:r>
-      <w:r>
-        <w:t xml:space="preserve"> on the player</w:t>
-      </w:r>
-      <w:r>
-        <w:t>.</w:t>
-      </w:r>
-      <w:r>
-        <w:t xml:space="preserve">  </w:t>
-      </w:r>
-      <w:r>
-        <w:t xml:space="preserve">And </w:t>
-      </w:r>
-      <w:r>
-        <w:t xml:space="preserve">above all, the </w:t>
-      </w:r>
-      <w:r>
-        <w:t xml:space="preserve">player </w:t>
-      </w:r>
-      <w:r>
-        <w:t xml:space="preserve">should not be </w:t>
-      </w:r>
-      <w:r>
-        <w:t>punished</w:t>
-      </w:r>
-      <w:r>
-        <w:t xml:space="preserve"> for playing the game</w:t>
-      </w:r>
-      <w:r>
-        <w:t>.</w:t>
-      </w:r>
-      <w:r>
-        <w:t xml:space="preserve">  The game must </w:t>
-      </w:r>
-      <w:r>
-        <w:t xml:space="preserve">be robust (not crash) and </w:t>
-      </w:r>
-      <w:r>
-        <w:t xml:space="preserve">its difficulty should </w:t>
-      </w:r>
-      <w:r>
-        <w:t xml:space="preserve">increase </w:t>
-      </w:r>
-      <w:r>
-        <w:t>in a reasonable manner.</w:t>
-      </w:r>
-    </w:p>
-    <w:p>
-      <w:r>
-        <w:t>The following choices were made to make th</w:t>
-      </w:r>
-      <w:r>
-        <w:t>is</w:t>
-      </w:r>
-      <w:r>
-        <w:t xml:space="preserve"> game feel more </w:t>
-      </w:r>
-      <w:r>
-        <w:t>current</w:t>
-      </w:r>
-      <w:r>
-        <w:t>.</w:t>
-      </w:r>
-    </w:p>
-    <w:p>
-      <w:r>
-        <w:t xml:space="preserve">Unlike many 1980’s games, </w:t>
-      </w:r>
-      <w:r>
-        <w:t>K9 does not have three lives</w:t>
-      </w:r>
-      <w:r>
-        <w:t xml:space="preserve"> and there isn’t a notion of </w:t>
-      </w:r>
-      <w:r>
-        <w:t xml:space="preserve">score or points.   The goal of the game is </w:t>
-      </w:r>
-      <w:r>
-        <w:t xml:space="preserve">to </w:t>
-      </w:r>
-      <w:r>
-        <w:t xml:space="preserve">just successfully </w:t>
-      </w:r>
-      <w:r>
-        <w:t>navigate</w:t>
-      </w:r>
-      <w:r>
-        <w:t xml:space="preserve"> K9 t</w:t>
-      </w:r>
-      <w:r>
-        <w:t>h</w:t>
-      </w:r>
-      <w:r>
-        <w:t>r</w:t>
-      </w:r>
-      <w:r>
-        <w:t xml:space="preserve">ough all the </w:t>
-      </w:r>
-      <w:r>
-        <w:t>levels</w:t>
-      </w:r>
-      <w:r>
-        <w:t>.</w:t>
-      </w:r>
-    </w:p>
-    <w:p>
-      <w:r>
-        <w:t xml:space="preserve">K9 dies when </w:t>
-      </w:r>
-      <w:r>
-        <w:t xml:space="preserve">K9’s </w:t>
-      </w:r>
-      <w:r>
-        <w:t xml:space="preserve">health </w:t>
-      </w:r>
-      <w:r>
-        <w:t xml:space="preserve">becomes zero.  K9 gains health by collecting jewels, and loses health when using </w:t>
-      </w:r>
-      <w:r>
-        <w:t xml:space="preserve">the laser, or </w:t>
-      </w:r>
-      <w:r>
-        <w:t xml:space="preserve">when </w:t>
-      </w:r>
-      <w:r>
-        <w:t>attacked</w:t>
-      </w:r>
-      <w:r>
-        <w:t xml:space="preserve"> by a Dalek</w:t>
-      </w:r>
-      <w:r>
-        <w:t>.</w:t>
-      </w:r>
-      <w:r>
-        <w:t xml:space="preserve">  When K9’s health is low, the laser cannot be used and the health bar in the game bar changes color.  To reinforce low health, a </w:t>
-      </w:r>
-      <w:r>
-        <w:t>heart rate monitor beep is sounded every second or so.  This becomes a continuous tone if K9</w:t>
-      </w:r>
-      <w:r>
-        <w:t>’s battery is flat</w:t>
-      </w:r>
-      <w:r>
-        <w:t>.</w:t>
-      </w:r>
-    </w:p>
-    <w:p>
-      <w:r>
-        <w:t>If K9 dies, the current level is restated.  The user can also choose to restart the current level if they become stuck</w:t>
-      </w:r>
-      <w:r>
-        <w:t>, by pressing the ‘R’ key.</w:t>
-      </w:r>
-    </w:p>
-    <w:p>
-      <w:r>
-        <w:t>And unlike many 1980’s games, t</w:t>
-      </w:r>
-      <w:r>
-        <w:t xml:space="preserve">he player </w:t>
-      </w:r>
-      <w:r>
-        <w:t xml:space="preserve">direction </w:t>
-      </w:r>
-      <w:r>
-        <w:t xml:space="preserve">keys </w:t>
-      </w:r>
-      <w:r>
-        <w:t xml:space="preserve">are </w:t>
-      </w:r>
-      <w:r>
-        <w:t>W</w:t>
-      </w:r>
-      <w:r>
-        <w:t>ASD</w:t>
-      </w:r>
-      <w:r>
-        <w:t>.</w:t>
-      </w:r>
-    </w:p>
-    <w:p>
-      <w:r>
-        <w:t>Locked doors and keys are used to add a puzzle element to the game.</w:t>
-      </w:r>
-      <w:r>
-        <w:t xml:space="preserve">  Key</w:t>
-      </w:r>
-      <w:r>
-        <w:t>s</w:t>
-      </w:r>
-      <w:r>
-        <w:t xml:space="preserve"> can be collected and then used to </w:t>
-      </w:r>
-      <w:r>
-        <w:t xml:space="preserve">pass </w:t>
-      </w:r>
-      <w:r>
-        <w:t xml:space="preserve">through </w:t>
-      </w:r>
-      <w:r>
-        <w:t xml:space="preserve">locked </w:t>
-      </w:r>
-      <w:r>
-        <w:t xml:space="preserve">doors, </w:t>
-      </w:r>
-      <w:r>
-        <w:t>after which they are used.</w:t>
-      </w:r>
-      <w:r>
-        <w:t xml:space="preserve">  </w:t>
-      </w:r>
-      <w:r>
-        <w:t xml:space="preserve">Doors stay unlocked until a Darek uses them.  </w:t>
-      </w:r>
-      <w:r>
-        <w:t>Alternatively</w:t>
-      </w:r>
-      <w:r>
-        <w:t xml:space="preserve">, </w:t>
-      </w:r>
-      <w:r>
-        <w:t xml:space="preserve">K9 can follow a Dalek </w:t>
-      </w:r>
-      <w:r>
-        <w:t>through a door.</w:t>
-      </w:r>
-    </w:p>
-    <w:p>
-      <w:r>
-        <w:t>Other</w:t>
-      </w:r>
-      <w:r>
-        <w:t xml:space="preserve"> puzzle element</w:t>
-      </w:r>
-      <w:r>
-        <w:t>s</w:t>
-      </w:r>
-      <w:r>
         <w:t xml:space="preserve"> of the game </w:t>
       </w:r>
       <w:r>
@@ -25828,7 +26974,6 @@
     </w:p>
     <w:p>
       <w:r>
-        <w:lastRenderedPageBreak/>
         <w:t>Teleports were later added to allow K9 to traverse a level in a non-linear manner.</w:t>
       </w:r>
     </w:p>
@@ -25927,7 +27072,11 @@
         <w:t>Page grids</w:t>
       </w:r>
       <w:r>
-        <w:t xml:space="preserve">.  Early in the development of the game I came up with a level model that allowed for an arbitrary arrangement of pages.  From a data structure perspective, the model was simple and provided for a wide range of interesting level topologies.  However, any code that traversed tiles had to deal with potential page boundaries.  The mistake I made was not realizing that choosing such a data structure would require that I adopt an abstraction (function-based or macro-based) to traverse it, which was something I was </w:t>
+        <w:t xml:space="preserve">.  Early in the development of the game I came up with a level model that allowed for an arbitrary arrangement of pages.  From a data structure perspective, the model was simple and provided for a wide range of interesting level topologies.  </w:t>
+      </w:r>
+      <w:r>
+        <w:lastRenderedPageBreak/>
+        <w:t xml:space="preserve">However, any code that traversed tiles had to deal with potential page boundaries.  The mistake I made was not realizing that choosing such a data structure would require that I adopt an abstraction (function-based or macro-based) to traverse it, which was something I was </w:t>
       </w:r>
       <w:r>
         <w:t xml:space="preserve">not </w:t>
@@ -25936,11 +27085,7 @@
         <w:t xml:space="preserve">willing </w:t>
       </w:r>
       <w:r>
-        <w:t xml:space="preserve">to do.  In trying to avoid this I ended up with complex code in several key areas of functionality… drawing tile strips when scrolling, collision detection, laser hit detection, and elevator operations.  After spending considerable time fixing several nasty bugs, I stepped back and asked myself if the benefits of the page grid design outweighed all the added code complexity.  I concluded it wasn’t and removed the page grid, opting instead to go with a single large rectangular tile grid which could be either 16x128, 32x64, 64x32, </w:t>
-      </w:r>
-      <w:r>
-        <w:lastRenderedPageBreak/>
-        <w:t>or 128x16 tiles in size.  The change resulted in a significant reduction in code size, and much simpler tile traversal logic throughout the code base.</w:t>
+        <w:t>to do.  In trying to avoid this I ended up with complex code in several key areas of functionality… drawing tile strips when scrolling, collision detection, laser hit detection, and elevator operations.  After spending considerable time fixing several nasty bugs, I stepped back and asked myself if the benefits of the page grid design outweighed all the added code complexity.  I concluded it wasn’t and removed the page grid, opting instead to go with a single large rectangular tile grid which could be either 16x128, 32x64, 64x32, or 128x16 tiles in size.  The change resulted in a significant reduction in code size, and much simpler tile traversal logic throughout the code base.</w:t>
       </w:r>
     </w:p>
     <w:p>
@@ -26221,6 +27366,7 @@
         <w:pStyle w:val="Heading2"/>
       </w:pPr>
       <w:r>
+        <w:lastRenderedPageBreak/>
         <w:t>Resources</w:t>
       </w:r>
     </w:p>
@@ -26303,7 +27449,6 @@
     </w:p>
     <w:p>
       <w:r>
-        <w:lastRenderedPageBreak/>
         <w:t xml:space="preserve">Elite disc </w:t>
       </w:r>
       <w:r>
@@ -26337,7 +27482,7 @@
     <mc:AlternateContent>
       <mc:Choice Requires="v">
         <w:pict>
-          <v:shapetype w14:anchorId="5EAFB43C" id="_x0000_t75" coordsize="21600,21600" o:spt="75" o:preferrelative="t" path="m@4@5l@4@11@9@11@9@5xe" filled="f" stroked="f">
+          <v:shapetype w14:anchorId="6C55E3A2" id="_x0000_t75" coordsize="21600,21600" o:spt="75" o:preferrelative="t" path="m@4@5l@4@11@9@11@9@5xe" filled="f" stroked="f">
             <v:stroke joinstyle="miter"/>
             <v:formulas>
               <v:f eqn="if lineDrawn pixelLineWidth 0"/>
@@ -26363,10 +27508,10 @@
       </mc:Choice>
       <mc:Fallback>
         <w:drawing>
-          <wp:inline distT="0" distB="0" distL="0" distR="0" wp14:anchorId="4ABF6084" wp14:editId="2AE68132">
+          <wp:inline distT="0" distB="0" distL="0" distR="0" wp14:anchorId="0B0CEE58" wp14:editId="0A206536">
             <wp:extent cx="194650" cy="145988"/>
             <wp:effectExtent l="0" t="0" r="0" b="6985"/>
-            <wp:docPr id="813666847" name="Picture 1"/>
+            <wp:docPr id="648227811" name="Picture 1"/>
             <wp:cNvGraphicFramePr>
               <a:graphicFrameLocks xmlns:a="http://schemas.openxmlformats.org/drawingml/2006/main" noChangeAspect="1"/>
             </wp:cNvGraphicFramePr>
@@ -26404,17 +27549,17 @@
     <mc:AlternateContent>
       <mc:Choice Requires="v">
         <w:pict>
-          <v:shape w14:anchorId="01A59A9A" id="Picture 1" o:spid="_x0000_i1025" type="#_x0000_t75" style="width:15.7pt;height:11.75pt;visibility:visible;mso-wrap-style:square">
+          <v:shape w14:anchorId="4792B199" id="Picture 1" o:spid="_x0000_i1025" type="#_x0000_t75" style="width:15.7pt;height:11.75pt;visibility:visible;mso-wrap-style:square">
             <v:imagedata r:id="rId3" o:title=""/>
           </v:shape>
         </w:pict>
       </mc:Choice>
       <mc:Fallback>
         <w:drawing>
-          <wp:inline distT="0" distB="0" distL="0" distR="0" wp14:anchorId="67F71B73" wp14:editId="0DE50523">
+          <wp:inline distT="0" distB="0" distL="0" distR="0" wp14:anchorId="17D787C9" wp14:editId="4280E237">
             <wp:extent cx="199177" cy="149383"/>
             <wp:effectExtent l="0" t="0" r="0" b="3175"/>
-            <wp:docPr id="445293949" name="Picture 1"/>
+            <wp:docPr id="1908038599" name="Picture 1"/>
             <wp:cNvGraphicFramePr>
               <a:graphicFrameLocks xmlns:a="http://schemas.openxmlformats.org/drawingml/2006/main" noChangeAspect="1"/>
             </wp:cNvGraphicFramePr>

</xml_diff>

<commit_message>
Tied up level loading code and freed up four zero page variables
</commit_message>
<xml_diff>
--- a/docs/Development.docx
+++ b/docs/Development.docx
@@ -473,7 +473,6 @@
       <w:r>
         <w:t xml:space="preserve"> </w:t>
       </w:r>
-      <w:proofErr w:type="spellStart"/>
       <w:r>
         <w:rPr>
           <w:b/>
@@ -483,7 +482,6 @@
         </w:rPr>
         <w:t>BeebAsm</w:t>
       </w:r>
-      <w:proofErr w:type="spellEnd"/>
       <w:r>
         <w:t>, an excellent assembler th</w:t>
       </w:r>
@@ -493,7 +491,6 @@
       <w:r>
         <w:t xml:space="preserve">I could use on Windows to produce an SSD, which I could then run in </w:t>
       </w:r>
-      <w:proofErr w:type="spellStart"/>
       <w:r>
         <w:rPr>
           <w:b/>
@@ -504,7 +501,6 @@
         <w:lastRenderedPageBreak/>
         <w:t>BeebEm</w:t>
       </w:r>
-      <w:proofErr w:type="spellEnd"/>
       <w:r>
         <w:t>, an emulator</w:t>
       </w:r>
@@ -638,7 +634,6 @@
       <w:r>
         <w:t xml:space="preserve">After looking at some examples that were installed with </w:t>
       </w:r>
-      <w:proofErr w:type="spellStart"/>
       <w:r>
         <w:rPr>
           <w:b/>
@@ -648,7 +643,6 @@
         </w:rPr>
         <w:t>BeebAsm</w:t>
       </w:r>
-      <w:proofErr w:type="spellEnd"/>
       <w:r>
         <w:t xml:space="preserve">, I </w:t>
       </w:r>
@@ -783,7 +777,6 @@
       <w:r>
         <w:t xml:space="preserve">The prototype was based on </w:t>
       </w:r>
-      <w:proofErr w:type="spellStart"/>
       <w:r>
         <w:rPr>
           <w:b/>
@@ -802,7 +795,6 @@
         </w:rPr>
         <w:t>’s</w:t>
       </w:r>
-      <w:proofErr w:type="spellEnd"/>
       <w:r>
         <w:t xml:space="preserve"> </w:t>
       </w:r>
@@ -2513,7 +2505,6 @@
       <w:r>
         <w:t xml:space="preserve"> and </w:t>
       </w:r>
-      <w:proofErr w:type="spellStart"/>
       <w:r>
         <w:rPr>
           <w:b/>
@@ -2532,7 +2523,6 @@
         </w:rPr>
         <w:t>lekAnimate</w:t>
       </w:r>
-      <w:proofErr w:type="spellEnd"/>
       <w:r>
         <w:t xml:space="preserve"> </w:t>
       </w:r>
@@ -2859,7 +2849,6 @@
       <w:r>
         <w:t xml:space="preserve"> using the </w:t>
       </w:r>
-      <w:proofErr w:type="spellStart"/>
       <w:r>
         <w:rPr>
           <w:b/>
@@ -2874,15 +2863,7 @@
           <w:b/>
           <w:bCs/>
         </w:rPr>
-        <w:t>’s</w:t>
-      </w:r>
-      <w:proofErr w:type="spellEnd"/>
-      <w:r>
-        <w:rPr>
-          <w:b/>
-          <w:bCs/>
-        </w:rPr>
-        <w:t xml:space="preserve"> </w:t>
+        <w:t xml:space="preserve">’s </w:t>
       </w:r>
       <w:r>
         <w:rPr>
@@ -4546,7 +4527,6 @@
           <w:bCs/>
         </w:rPr>
       </w:pPr>
-      <w:proofErr w:type="spellStart"/>
       <w:r>
         <w:rPr>
           <w:b/>
@@ -4554,7 +4534,6 @@
         </w:rPr>
         <w:t>objectXLo</w:t>
       </w:r>
-      <w:proofErr w:type="spellEnd"/>
       <w:r>
         <w:rPr>
           <w:b/>
@@ -4562,7 +4541,6 @@
         </w:rPr>
         <w:t xml:space="preserve"> &amp; </w:t>
       </w:r>
-      <w:proofErr w:type="spellStart"/>
       <w:r>
         <w:rPr>
           <w:b/>
@@ -4570,7 +4548,6 @@
         </w:rPr>
         <w:t>objectXHi</w:t>
       </w:r>
-      <w:proofErr w:type="spellEnd"/>
       <w:r>
         <w:rPr>
           <w:b/>
@@ -4603,39 +4580,28 @@
           <w:bCs/>
         </w:rPr>
       </w:pPr>
-      <w:proofErr w:type="spellStart"/>
       <w:r>
         <w:rPr>
           <w:b/>
           <w:bCs/>
         </w:rPr>
         <w:lastRenderedPageBreak/>
-        <w:t>objectYLo</w:t>
-      </w:r>
-      <w:proofErr w:type="spellEnd"/>
+        <w:t xml:space="preserve">objectYLo </w:t>
+      </w:r>
       <w:r>
         <w:rPr>
           <w:b/>
           <w:bCs/>
         </w:rPr>
-        <w:t xml:space="preserve"> </w:t>
+        <w:t xml:space="preserve">&amp; </w:t>
       </w:r>
       <w:r>
         <w:rPr>
           <w:b/>
           <w:bCs/>
         </w:rPr>
-        <w:t xml:space="preserve">&amp; </w:t>
-      </w:r>
-      <w:proofErr w:type="spellStart"/>
-      <w:r>
-        <w:rPr>
-          <w:b/>
-          <w:bCs/>
-        </w:rPr>
         <w:t>objectYHi</w:t>
       </w:r>
-      <w:proofErr w:type="spellEnd"/>
       <w:r>
         <w:rPr>
           <w:b/>
@@ -4676,31 +4642,13 @@
           <w:bCs/>
         </w:rPr>
       </w:pPr>
-      <w:proofErr w:type="spellStart"/>
       <w:r>
         <w:rPr>
           <w:b/>
           <w:bCs/>
         </w:rPr>
-        <w:t>objectWidth</w:t>
-      </w:r>
-      <w:proofErr w:type="spellEnd"/>
-      <w:r>
-        <w:rPr>
-          <w:b/>
-          <w:bCs/>
-        </w:rPr>
-        <w:t xml:space="preserve"> &amp; </w:t>
-      </w:r>
-      <w:proofErr w:type="spellStart"/>
-      <w:r>
-        <w:rPr>
-          <w:b/>
-          <w:bCs/>
-        </w:rPr>
-        <w:t>objectHeight</w:t>
-      </w:r>
-      <w:proofErr w:type="spellEnd"/>
+        <w:t>objectWidth &amp; objectHeight</w:t>
+      </w:r>
       <w:r>
         <w:rPr>
           <w:b/>
@@ -4727,7 +4675,6 @@
           <w:bCs/>
         </w:rPr>
       </w:pPr>
-      <w:proofErr w:type="spellStart"/>
       <w:r>
         <w:rPr>
           <w:b/>
@@ -4735,7 +4682,6 @@
         </w:rPr>
         <w:t>objectAnimation</w:t>
       </w:r>
-      <w:proofErr w:type="spellEnd"/>
       <w:r>
         <w:rPr>
           <w:b/>
@@ -4768,7 +4714,6 @@
           <w:bCs/>
         </w:rPr>
       </w:pPr>
-      <w:proofErr w:type="spellStart"/>
       <w:r>
         <w:rPr>
           <w:b/>
@@ -4776,7 +4721,6 @@
         </w:rPr>
         <w:t>objectState</w:t>
       </w:r>
-      <w:proofErr w:type="spellEnd"/>
       <w:r>
         <w:rPr>
           <w:b/>
@@ -4868,7 +4812,6 @@
           <w:bCs/>
         </w:rPr>
       </w:pPr>
-      <w:proofErr w:type="spellStart"/>
       <w:r>
         <w:rPr>
           <w:b/>
@@ -4876,7 +4819,6 @@
         </w:rPr>
         <w:t>objectSpriteIndex</w:t>
       </w:r>
-      <w:proofErr w:type="spellEnd"/>
       <w:r>
         <w:rPr>
           <w:b/>
@@ -4911,31 +4853,13 @@
           <w:numId w:val="8"/>
         </w:numPr>
       </w:pPr>
-      <w:proofErr w:type="spellStart"/>
       <w:r>
         <w:rPr>
           <w:b/>
           <w:bCs/>
         </w:rPr>
-        <w:t>objectFrameCallbackLo</w:t>
-      </w:r>
-      <w:proofErr w:type="spellEnd"/>
-      <w:r>
-        <w:rPr>
-          <w:b/>
-          <w:bCs/>
-        </w:rPr>
-        <w:t xml:space="preserve"> &amp; </w:t>
-      </w:r>
-      <w:proofErr w:type="spellStart"/>
-      <w:r>
-        <w:rPr>
-          <w:b/>
-          <w:bCs/>
-        </w:rPr>
-        <w:t>objectFrameCallbackHi</w:t>
-      </w:r>
-      <w:proofErr w:type="spellEnd"/>
+        <w:t>objectFrameCallbackLo &amp; objectFrameCallbackHi</w:t>
+      </w:r>
       <w:r>
         <w:rPr>
           <w:b/>
@@ -4983,7 +4907,6 @@
           <w:bCs/>
         </w:rPr>
       </w:pPr>
-      <w:proofErr w:type="spellStart"/>
       <w:r>
         <w:rPr>
           <w:b/>
@@ -4991,7 +4914,6 @@
         </w:rPr>
         <w:t>objectFrameCounter</w:t>
       </w:r>
-      <w:proofErr w:type="spellEnd"/>
       <w:r>
         <w:rPr>
           <w:b/>
@@ -6309,7 +6231,6 @@
       <w:r>
         <w:t xml:space="preserve">setting </w:t>
       </w:r>
-      <w:proofErr w:type="spellStart"/>
       <w:r>
         <w:rPr>
           <w:i/>
@@ -6331,7 +6252,6 @@
         </w:rPr>
         <w:t>Addr</w:t>
       </w:r>
-      <w:proofErr w:type="spellEnd"/>
       <w:r>
         <w:t xml:space="preserve"> </w:t>
       </w:r>
@@ -6431,7 +6351,6 @@
       <w:r>
         <w:t xml:space="preserve">in the low nibble of </w:t>
       </w:r>
-      <w:proofErr w:type="spellStart"/>
       <w:r>
         <w:rPr>
           <w:i/>
@@ -6439,7 +6358,6 @@
         </w:rPr>
         <w:t>objectState</w:t>
       </w:r>
-      <w:proofErr w:type="spellEnd"/>
       <w:r>
         <w:t xml:space="preserve"> array</w:t>
       </w:r>
@@ -6706,7 +6624,6 @@
       <w:r>
         <w:t xml:space="preserve"> </w:t>
       </w:r>
-      <w:proofErr w:type="spellStart"/>
       <w:r>
         <w:rPr>
           <w:i/>
@@ -6714,7 +6631,6 @@
         </w:rPr>
         <w:t>clearTile</w:t>
       </w:r>
-      <w:proofErr w:type="spellEnd"/>
       <w:r>
         <w:t xml:space="preserve"> </w:t>
       </w:r>
@@ -6729,7 +6645,6 @@
       <w:r>
         <w:t xml:space="preserve">The </w:t>
       </w:r>
-      <w:proofErr w:type="spellStart"/>
       <w:r>
         <w:rPr>
           <w:i/>
@@ -6737,7 +6652,6 @@
         </w:rPr>
         <w:t>clearTile</w:t>
       </w:r>
-      <w:proofErr w:type="spellEnd"/>
       <w:r>
         <w:t xml:space="preserve"> </w:t>
       </w:r>
@@ -7440,15 +7354,7 @@
         <w:t>the elevator stops.</w:t>
       </w:r>
       <w:r>
-        <w:t xml:space="preserve">  The </w:t>
-      </w:r>
-      <w:proofErr w:type="spellStart"/>
-      <w:r>
-        <w:t>objectFrameCount</w:t>
-      </w:r>
-      <w:proofErr w:type="spellEnd"/>
-      <w:r>
-        <w:t xml:space="preserve"> is repurposed for this.</w:t>
+        <w:t xml:space="preserve">  The objectFrameCount is repurposed for this.</w:t>
       </w:r>
     </w:p>
     <w:p>
@@ -7460,15 +7366,7 @@
         </w:numPr>
       </w:pPr>
       <w:r>
-        <w:t xml:space="preserve">Mark K9 and the elevator game objects as both ascending or descending by populating their respective </w:t>
-      </w:r>
-      <w:proofErr w:type="spellStart"/>
-      <w:r>
-        <w:t>objectState’s</w:t>
-      </w:r>
-      <w:proofErr w:type="spellEnd"/>
-      <w:r>
-        <w:t xml:space="preserve"> </w:t>
+        <w:t xml:space="preserve">Mark K9 and the elevator game objects as both ascending or descending by populating their respective objectState’s </w:t>
       </w:r>
       <w:r>
         <w:rPr>
@@ -7852,7 +7750,6 @@
       <w:r>
         <w:t xml:space="preserve">stored in </w:t>
       </w:r>
-      <w:proofErr w:type="spellStart"/>
       <w:r>
         <w:rPr>
           <w:i/>
@@ -7861,7 +7758,6 @@
         </w:rPr>
         <w:t>objectFrameCounter</w:t>
       </w:r>
-      <w:proofErr w:type="spellEnd"/>
       <w:r>
         <w:t xml:space="preserve"> variable</w:t>
       </w:r>
@@ -8025,7 +7921,6 @@
       <w:r>
         <w:t xml:space="preserve">checking the erase-above and erase-below </w:t>
       </w:r>
-      <w:proofErr w:type="spellStart"/>
       <w:r>
         <w:rPr>
           <w:i/>
@@ -8040,7 +7935,6 @@
         </w:rPr>
         <w:t>’s</w:t>
       </w:r>
-      <w:proofErr w:type="spellEnd"/>
       <w:r>
         <w:t xml:space="preserve"> render flags</w:t>
       </w:r>
@@ -8646,7 +8540,6 @@
       <w:r>
         <w:t xml:space="preserve">A zero-page </w:t>
       </w:r>
-      <w:proofErr w:type="spellStart"/>
       <w:r>
         <w:rPr>
           <w:i/>
@@ -8654,7 +8547,6 @@
         </w:rPr>
         <w:t>laserFrameCount</w:t>
       </w:r>
-      <w:proofErr w:type="spellEnd"/>
       <w:r>
         <w:t xml:space="preserve"> variable was introduced which controls laser rendering.  </w:t>
       </w:r>
@@ -8682,7 +8574,6 @@
       <w:r>
         <w:t xml:space="preserve">sets </w:t>
       </w:r>
-      <w:proofErr w:type="spellStart"/>
       <w:r>
         <w:rPr>
           <w:i/>
@@ -8690,7 +8581,6 @@
         </w:rPr>
         <w:t>laserFrameCount</w:t>
       </w:r>
-      <w:proofErr w:type="spellEnd"/>
       <w:r>
         <w:rPr>
           <w:i/>
@@ -8707,7 +8597,6 @@
       <w:r>
         <w:t xml:space="preserve">and </w:t>
       </w:r>
-      <w:proofErr w:type="spellStart"/>
       <w:r>
         <w:rPr>
           <w:i/>
@@ -8715,7 +8604,6 @@
         </w:rPr>
         <w:t>laserFrameCount</w:t>
       </w:r>
-      <w:proofErr w:type="spellEnd"/>
       <w:r>
         <w:rPr>
           <w:i/>
@@ -8766,7 +8654,6 @@
       <w:r>
         <w:t xml:space="preserve">the </w:t>
       </w:r>
-      <w:proofErr w:type="spellStart"/>
       <w:proofErr w:type="gramStart"/>
       <w:r>
         <w:rPr>
@@ -8775,7 +8662,6 @@
         </w:rPr>
         <w:t>objectState</w:t>
       </w:r>
-      <w:proofErr w:type="spellEnd"/>
       <w:proofErr w:type="gramEnd"/>
       <w:r>
         <w:t xml:space="preserve"> variable</w:t>
@@ -8880,7 +8766,6 @@
       <w:r>
         <w:t xml:space="preserve"> above. This is the fourth render flag in the high nibble of the </w:t>
       </w:r>
-      <w:proofErr w:type="spellStart"/>
       <w:r>
         <w:rPr>
           <w:i/>
@@ -8888,7 +8773,6 @@
         </w:rPr>
         <w:t>objectState</w:t>
       </w:r>
-      <w:proofErr w:type="spellEnd"/>
       <w:r>
         <w:t xml:space="preserve"> variable.</w:t>
       </w:r>
@@ -9012,7 +8896,6 @@
       <w:r>
         <w:t xml:space="preserve"> </w:t>
       </w:r>
-      <w:proofErr w:type="spellStart"/>
       <w:r>
         <w:rPr>
           <w:i/>
@@ -9020,7 +8903,6 @@
         </w:rPr>
         <w:t>debugTileGridFlags</w:t>
       </w:r>
-      <w:proofErr w:type="spellEnd"/>
       <w:r>
         <w:t xml:space="preserve"> routine that rendered a little box </w:t>
       </w:r>
@@ -9110,7 +8992,6 @@
       <w:r>
         <w:t xml:space="preserve">to allow </w:t>
       </w:r>
-      <w:proofErr w:type="spellStart"/>
       <w:r>
         <w:rPr>
           <w:i/>
@@ -9118,7 +8999,6 @@
         </w:rPr>
         <w:t>debugTileGridFlags</w:t>
       </w:r>
-      <w:proofErr w:type="spellEnd"/>
       <w:r>
         <w:rPr>
           <w:i/>
@@ -10251,6 +10131,37 @@
           </w:p>
         </w:tc>
       </w:tr>
+      <w:tr>
+        <w:trPr>
+          <w:cnfStyle w:val="000000100000" w:firstRow="0" w:lastRow="0" w:firstColumn="0" w:lastColumn="0" w:oddVBand="0" w:evenVBand="0" w:oddHBand="1" w:evenHBand="0" w:firstRowFirstColumn="0" w:firstRowLastColumn="0" w:lastRowFirstColumn="0" w:lastRowLastColumn="0"/>
+        </w:trPr>
+        <w:tc>
+          <w:tcPr>
+            <w:cnfStyle w:val="001000000000" w:firstRow="0" w:lastRow="0" w:firstColumn="1" w:lastColumn="0" w:oddVBand="0" w:evenVBand="0" w:oddHBand="0" w:evenHBand="0" w:firstRowFirstColumn="0" w:firstRowLastColumn="0" w:lastRowFirstColumn="0" w:lastRowLastColumn="0"/>
+            <w:tcW w:w="2245" w:type="dxa"/>
+            <w:shd w:val="clear" w:color="auto" w:fill="auto"/>
+          </w:tcPr>
+          <w:p>
+            <w:r>
+              <w:t>Mode7.6502</w:t>
+            </w:r>
+          </w:p>
+        </w:tc>
+        <w:tc>
+          <w:tcPr>
+            <w:tcW w:w="3600" w:type="dxa"/>
+            <w:shd w:val="clear" w:color="auto" w:fill="auto"/>
+          </w:tcPr>
+          <w:p>
+            <w:pPr>
+              <w:cnfStyle w:val="000000100000" w:firstRow="0" w:lastRow="0" w:firstColumn="0" w:lastColumn="0" w:oddVBand="0" w:evenVBand="0" w:oddHBand="1" w:evenHBand="0" w:firstRowFirstColumn="0" w:firstRowLastColumn="0" w:lastRowFirstColumn="0" w:lastRowLastColumn="0"/>
+            </w:pPr>
+            <w:r>
+              <w:t>Mode 7 utility routines</w:t>
+            </w:r>
+          </w:p>
+        </w:tc>
+      </w:tr>
     </w:tbl>
     <w:p>
       <w:pPr>
@@ -10595,7 +10506,6 @@
       <w:r>
         <w:t xml:space="preserve">replaced </w:t>
       </w:r>
-      <w:proofErr w:type="spellStart"/>
       <w:r>
         <w:rPr>
           <w:i/>
@@ -10603,11 +10513,9 @@
         </w:rPr>
         <w:t>objectWidth</w:t>
       </w:r>
-      <w:proofErr w:type="spellEnd"/>
       <w:r>
         <w:t xml:space="preserve"> and </w:t>
       </w:r>
-      <w:proofErr w:type="spellStart"/>
       <w:r>
         <w:rPr>
           <w:i/>
@@ -10615,7 +10523,6 @@
         </w:rPr>
         <w:t>objectHeight</w:t>
       </w:r>
-      <w:proofErr w:type="spellEnd"/>
       <w:r>
         <w:t xml:space="preserve"> game object arrays with a function</w:t>
       </w:r>
@@ -10651,7 +10558,6 @@
       <w:r>
         <w:t xml:space="preserve">, and </w:t>
       </w:r>
-      <w:proofErr w:type="spellStart"/>
       <w:r>
         <w:rPr>
           <w:i/>
@@ -10659,11 +10565,9 @@
         </w:rPr>
         <w:t>widthMinusOne</w:t>
       </w:r>
-      <w:proofErr w:type="spellEnd"/>
       <w:r>
         <w:t xml:space="preserve"> and </w:t>
       </w:r>
-      <w:proofErr w:type="spellStart"/>
       <w:r>
         <w:rPr>
           <w:i/>
@@ -10671,7 +10575,6 @@
         </w:rPr>
         <w:t>heightMinisOne</w:t>
       </w:r>
-      <w:proofErr w:type="spellEnd"/>
       <w:r>
         <w:t>.</w:t>
       </w:r>
@@ -10721,15 +10624,7 @@
         <w:t xml:space="preserve"> I </w:t>
       </w:r>
       <w:r>
-        <w:t xml:space="preserve">stored the object type in the </w:t>
-      </w:r>
-      <w:proofErr w:type="spellStart"/>
-      <w:r>
-        <w:t>objectAnimation</w:t>
-      </w:r>
-      <w:proofErr w:type="spellEnd"/>
-      <w:r>
-        <w:t xml:space="preserve"> game object array, </w:t>
+        <w:t xml:space="preserve">stored the object type in the objectAnimation game object array, </w:t>
       </w:r>
       <w:r>
         <w:t xml:space="preserve">shifting up the other values, and </w:t>
@@ -10747,13 +10642,8 @@
         <w:t xml:space="preserve">array </w:t>
       </w:r>
       <w:r>
-        <w:t xml:space="preserve">to </w:t>
-      </w:r>
-      <w:proofErr w:type="spellStart"/>
-      <w:r>
-        <w:t>objectType</w:t>
-      </w:r>
-      <w:proofErr w:type="spellEnd"/>
+        <w:t>to objectType</w:t>
+      </w:r>
       <w:r>
         <w:t>.</w:t>
       </w:r>
@@ -11574,7 +11464,6 @@
       <w:r>
         <w:t xml:space="preserve">I then wrote a </w:t>
       </w:r>
-      <w:proofErr w:type="spellStart"/>
       <w:r>
         <w:rPr>
           <w:i/>
@@ -11582,7 +11471,6 @@
         </w:rPr>
         <w:t>loadLevel</w:t>
       </w:r>
-      <w:proofErr w:type="spellEnd"/>
       <w:r>
         <w:t xml:space="preserve"> </w:t>
       </w:r>
@@ -11613,7 +11501,6 @@
       <w:r>
         <w:t xml:space="preserve">the loaded </w:t>
       </w:r>
-      <w:proofErr w:type="spellStart"/>
       <w:r>
         <w:rPr>
           <w:i/>
@@ -11621,7 +11508,6 @@
         </w:rPr>
         <w:t>initializeLevel</w:t>
       </w:r>
-      <w:proofErr w:type="spellEnd"/>
       <w:r>
         <w:t xml:space="preserve"> </w:t>
       </w:r>
@@ -11634,7 +11520,6 @@
       <w:r>
         <w:t xml:space="preserve">  A </w:t>
       </w:r>
-      <w:proofErr w:type="spellStart"/>
       <w:r>
         <w:rPr>
           <w:i/>
@@ -11642,7 +11527,6 @@
         </w:rPr>
         <w:t>showLevel</w:t>
       </w:r>
-      <w:proofErr w:type="spellEnd"/>
       <w:r>
         <w:t xml:space="preserve"> routine </w:t>
       </w:r>
@@ -11831,7 +11715,6 @@
       <w:r>
         <w:t xml:space="preserve"> a level, and a ‘R’ key handler was implemented to call the </w:t>
       </w:r>
-      <w:proofErr w:type="spellStart"/>
       <w:r>
         <w:rPr>
           <w:i/>
@@ -11839,14 +11722,12 @@
         </w:rPr>
         <w:t>loadLevel</w:t>
       </w:r>
-      <w:proofErr w:type="spellEnd"/>
       <w:r>
         <w:t xml:space="preserve"> </w:t>
       </w:r>
       <w:r>
         <w:t xml:space="preserve">routine indirectly through a </w:t>
       </w:r>
-      <w:proofErr w:type="spellStart"/>
       <w:r>
         <w:rPr>
           <w:i/>
@@ -11854,7 +11735,6 @@
         </w:rPr>
         <w:t>reloadLevel</w:t>
       </w:r>
-      <w:proofErr w:type="spellEnd"/>
       <w:r>
         <w:t xml:space="preserve"> routine.</w:t>
       </w:r>
@@ -12390,7 +12270,6 @@
       <w:r>
         <w:t xml:space="preserve"> action became </w:t>
       </w:r>
-      <w:proofErr w:type="spellStart"/>
       <w:r>
         <w:rPr>
           <w:b/>
@@ -12400,11 +12279,9 @@
         </w:rPr>
         <w:t>PursueLeft</w:t>
       </w:r>
-      <w:proofErr w:type="spellEnd"/>
       <w:r>
         <w:t xml:space="preserve">, </w:t>
       </w:r>
-      <w:proofErr w:type="spellStart"/>
       <w:r>
         <w:rPr>
           <w:b/>
@@ -12414,11 +12291,9 @@
         </w:rPr>
         <w:t>PursueRight</w:t>
       </w:r>
-      <w:proofErr w:type="spellEnd"/>
       <w:r>
         <w:t xml:space="preserve">, </w:t>
       </w:r>
-      <w:proofErr w:type="spellStart"/>
       <w:r>
         <w:rPr>
           <w:b/>
@@ -12428,14 +12303,12 @@
         </w:rPr>
         <w:t>PursueUp</w:t>
       </w:r>
-      <w:proofErr w:type="spellEnd"/>
       <w:r>
         <w:t xml:space="preserve">, </w:t>
       </w:r>
       <w:r>
         <w:t xml:space="preserve">or </w:t>
       </w:r>
-      <w:proofErr w:type="spellStart"/>
       <w:r>
         <w:rPr>
           <w:b/>
@@ -12445,7 +12318,6 @@
         </w:rPr>
         <w:t>PursueDown</w:t>
       </w:r>
-      <w:proofErr w:type="spellEnd"/>
       <w:r>
         <w:t>.</w:t>
       </w:r>
@@ -12497,7 +12369,6 @@
         </w:rPr>
         <w:tab/>
       </w:r>
-      <w:proofErr w:type="spellStart"/>
       <w:r>
         <w:rPr>
           <w:b/>
@@ -12514,9 +12385,11 @@
           <w:i/>
           <w:iCs/>
         </w:rPr>
-        <w:t>Left</w:t>
-      </w:r>
-      <w:proofErr w:type="spellEnd"/>
+        <w:t xml:space="preserve">Left </w:t>
+      </w:r>
+      <w:r>
+        <w:t>and</w:t>
+      </w:r>
       <w:r>
         <w:rPr>
           <w:b/>
@@ -12526,9 +12399,7 @@
         </w:rPr>
         <w:t xml:space="preserve"> </w:t>
       </w:r>
-      <w:r>
-        <w:t>and</w:t>
-      </w:r>
+      <w:proofErr w:type="gramStart"/>
       <w:r>
         <w:rPr>
           <w:b/>
@@ -12536,10 +12407,8 @@
           <w:i/>
           <w:iCs/>
         </w:rPr>
-        <w:t xml:space="preserve"> </w:t>
-      </w:r>
-      <w:proofErr w:type="spellStart"/>
-      <w:proofErr w:type="gramStart"/>
+        <w:t>PursueRight</w:t>
+      </w:r>
       <w:r>
         <w:rPr>
           <w:b/>
@@ -12547,9 +12416,63 @@
           <w:i/>
           <w:iCs/>
         </w:rPr>
-        <w:t>PursueRight</w:t>
-      </w:r>
-      <w:proofErr w:type="spellEnd"/>
+        <w:t xml:space="preserve"> </w:t>
+      </w:r>
+      <w:r>
+        <w:t xml:space="preserve"> –</w:t>
+      </w:r>
+      <w:proofErr w:type="gramEnd"/>
+      <w:r>
+        <w:t xml:space="preserve"> </w:t>
+      </w:r>
+      <w:r>
+        <w:t xml:space="preserve">Daleks </w:t>
+      </w:r>
+      <w:r>
+        <w:t>move quickly left or right</w:t>
+      </w:r>
+      <w:r>
+        <w:t>, or vice versa</w:t>
+      </w:r>
+      <w:r>
+        <w:t xml:space="preserve">. </w:t>
+      </w:r>
+      <w:r>
+        <w:t xml:space="preserve">If </w:t>
+      </w:r>
+      <w:r>
+        <w:t>a Dalek</w:t>
+      </w:r>
+      <w:r>
+        <w:t xml:space="preserve"> encounters a wall, the </w:t>
+      </w:r>
+      <w:r>
+        <w:t xml:space="preserve">Dalek </w:t>
+      </w:r>
+      <w:r>
+        <w:t>turns</w:t>
+      </w:r>
+      <w:r>
+        <w:t>,</w:t>
+      </w:r>
+      <w:r>
+        <w:t xml:space="preserve"> and the </w:t>
+      </w:r>
+      <w:r>
+        <w:t xml:space="preserve">action </w:t>
+      </w:r>
+      <w:r>
+        <w:t xml:space="preserve">is </w:t>
+      </w:r>
+      <w:r>
+        <w:t>change</w:t>
+      </w:r>
+      <w:r>
+        <w:t xml:space="preserve">d </w:t>
+      </w:r>
+      <w:r>
+        <w:t xml:space="preserve">to </w:t>
+      </w:r>
       <w:r>
         <w:rPr>
           <w:b/>
@@ -12557,64 +12480,11 @@
           <w:i/>
           <w:iCs/>
         </w:rPr>
-        <w:t xml:space="preserve"> </w:t>
-      </w:r>
-      <w:r>
-        <w:t xml:space="preserve"> –</w:t>
-      </w:r>
-      <w:proofErr w:type="gramEnd"/>
-      <w:r>
-        <w:t xml:space="preserve"> </w:t>
-      </w:r>
-      <w:r>
-        <w:t xml:space="preserve">Daleks </w:t>
-      </w:r>
-      <w:r>
-        <w:t>move quickly left or right</w:t>
-      </w:r>
-      <w:r>
-        <w:t>, or vice versa</w:t>
-      </w:r>
-      <w:r>
-        <w:t xml:space="preserve">. </w:t>
-      </w:r>
-      <w:r>
-        <w:t xml:space="preserve">If </w:t>
-      </w:r>
-      <w:r>
-        <w:t>a Dalek</w:t>
-      </w:r>
-      <w:r>
-        <w:t xml:space="preserve"> encounters a wall, the </w:t>
-      </w:r>
-      <w:r>
-        <w:t xml:space="preserve">Dalek </w:t>
-      </w:r>
-      <w:r>
-        <w:t>turns</w:t>
-      </w:r>
-      <w:r>
-        <w:t>,</w:t>
-      </w:r>
-      <w:r>
-        <w:t xml:space="preserve"> and the </w:t>
-      </w:r>
-      <w:r>
-        <w:t xml:space="preserve">action </w:t>
-      </w:r>
-      <w:r>
-        <w:t xml:space="preserve">is </w:t>
-      </w:r>
-      <w:r>
-        <w:t>change</w:t>
-      </w:r>
-      <w:r>
-        <w:t xml:space="preserve">d </w:t>
-      </w:r>
-      <w:r>
-        <w:t xml:space="preserve">to </w:t>
-      </w:r>
-      <w:proofErr w:type="spellStart"/>
+        <w:t>PursueUp</w:t>
+      </w:r>
+      <w:r>
+        <w:t xml:space="preserve"> or </w:t>
+      </w:r>
       <w:r>
         <w:rPr>
           <w:b/>
@@ -12622,13 +12492,16 @@
           <w:i/>
           <w:iCs/>
         </w:rPr>
-        <w:t>PursueUp</w:t>
-      </w:r>
-      <w:proofErr w:type="spellEnd"/>
-      <w:r>
-        <w:t xml:space="preserve"> or </w:t>
-      </w:r>
-      <w:proofErr w:type="spellStart"/>
+        <w:t>PursueDown</w:t>
+      </w:r>
+      <w:r>
+        <w:t>.</w:t>
+      </w:r>
+    </w:p>
+    <w:p>
+      <w:pPr>
+        <w:ind w:left="720"/>
+      </w:pPr>
       <w:r>
         <w:rPr>
           <w:b/>
@@ -12636,18 +12509,8 @@
           <w:i/>
           <w:iCs/>
         </w:rPr>
-        <w:t>PursueDown</w:t>
-      </w:r>
-      <w:proofErr w:type="spellEnd"/>
-      <w:r>
-        <w:t>.</w:t>
-      </w:r>
-    </w:p>
-    <w:p>
-      <w:pPr>
-        <w:ind w:left="720"/>
-      </w:pPr>
-      <w:proofErr w:type="spellStart"/>
+        <w:t>Pursue</w:t>
+      </w:r>
       <w:r>
         <w:rPr>
           <w:b/>
@@ -12655,7 +12518,10 @@
           <w:i/>
           <w:iCs/>
         </w:rPr>
-        <w:t>Pursue</w:t>
+        <w:t xml:space="preserve">Up </w:t>
+      </w:r>
+      <w:r>
+        <w:t>and</w:t>
       </w:r>
       <w:r>
         <w:rPr>
@@ -12664,9 +12530,9 @@
           <w:i/>
           <w:iCs/>
         </w:rPr>
-        <w:t>Up</w:t>
-      </w:r>
-      <w:proofErr w:type="spellEnd"/>
+        <w:t xml:space="preserve"> </w:t>
+      </w:r>
+      <w:proofErr w:type="gramStart"/>
       <w:r>
         <w:rPr>
           <w:b/>
@@ -12674,10 +12540,38 @@
           <w:i/>
           <w:iCs/>
         </w:rPr>
-        <w:t xml:space="preserve"> </w:t>
-      </w:r>
-      <w:r>
-        <w:t>and</w:t>
+        <w:t xml:space="preserve">PursueDown </w:t>
+      </w:r>
+      <w:r>
+        <w:t xml:space="preserve"> –</w:t>
+      </w:r>
+      <w:proofErr w:type="gramEnd"/>
+      <w:r>
+        <w:t xml:space="preserve"> Daleks </w:t>
+      </w:r>
+      <w:r>
+        <w:t>move quickly left or right</w:t>
+      </w:r>
+      <w:r>
+        <w:t xml:space="preserve">, or vice versa, looking for an elevator to ride up or down. </w:t>
+      </w:r>
+      <w:r>
+        <w:t xml:space="preserve">If a Dalek encounters a wall, </w:t>
+      </w:r>
+      <w:r>
+        <w:t xml:space="preserve">the Dalek </w:t>
+      </w:r>
+      <w:r>
+        <w:t>turns,</w:t>
+      </w:r>
+      <w:r>
+        <w:t xml:space="preserve"> and the </w:t>
+      </w:r>
+      <w:r>
+        <w:t xml:space="preserve">action </w:t>
+      </w:r>
+      <w:r>
+        <w:t xml:space="preserve">is toggled between </w:t>
       </w:r>
       <w:r>
         <w:rPr>
@@ -12686,10 +12580,17 @@
           <w:i/>
           <w:iCs/>
         </w:rPr>
+        <w:t>PursueUp</w:t>
+      </w:r>
+      <w:r>
         <w:t xml:space="preserve"> </w:t>
       </w:r>
-      <w:proofErr w:type="spellStart"/>
-      <w:proofErr w:type="gramStart"/>
+      <w:r>
+        <w:t>and</w:t>
+      </w:r>
+      <w:r>
+        <w:t xml:space="preserve"> </w:t>
+      </w:r>
       <w:r>
         <w:rPr>
           <w:b/>
@@ -12699,78 +12600,6 @@
         </w:rPr>
         <w:t>PursueDown</w:t>
       </w:r>
-      <w:proofErr w:type="spellEnd"/>
-      <w:r>
-        <w:rPr>
-          <w:b/>
-          <w:bCs/>
-          <w:i/>
-          <w:iCs/>
-        </w:rPr>
-        <w:t xml:space="preserve"> </w:t>
-      </w:r>
-      <w:r>
-        <w:t xml:space="preserve"> –</w:t>
-      </w:r>
-      <w:proofErr w:type="gramEnd"/>
-      <w:r>
-        <w:t xml:space="preserve"> Daleks </w:t>
-      </w:r>
-      <w:r>
-        <w:t>move quickly left or right</w:t>
-      </w:r>
-      <w:r>
-        <w:t xml:space="preserve">, or vice versa, looking for an elevator to ride up or down. </w:t>
-      </w:r>
-      <w:r>
-        <w:t xml:space="preserve">If a Dalek encounters a wall, </w:t>
-      </w:r>
-      <w:r>
-        <w:t xml:space="preserve">the Dalek </w:t>
-      </w:r>
-      <w:r>
-        <w:t>turns,</w:t>
-      </w:r>
-      <w:r>
-        <w:t xml:space="preserve"> and the </w:t>
-      </w:r>
-      <w:r>
-        <w:t xml:space="preserve">action </w:t>
-      </w:r>
-      <w:r>
-        <w:t xml:space="preserve">is toggled between </w:t>
-      </w:r>
-      <w:proofErr w:type="spellStart"/>
-      <w:r>
-        <w:rPr>
-          <w:b/>
-          <w:bCs/>
-          <w:i/>
-          <w:iCs/>
-        </w:rPr>
-        <w:t>PursueUp</w:t>
-      </w:r>
-      <w:proofErr w:type="spellEnd"/>
-      <w:r>
-        <w:t xml:space="preserve"> </w:t>
-      </w:r>
-      <w:r>
-        <w:t>and</w:t>
-      </w:r>
-      <w:r>
-        <w:t xml:space="preserve"> </w:t>
-      </w:r>
-      <w:proofErr w:type="spellStart"/>
-      <w:r>
-        <w:rPr>
-          <w:b/>
-          <w:bCs/>
-          <w:i/>
-          <w:iCs/>
-        </w:rPr>
-        <w:t>PursueDown</w:t>
-      </w:r>
-      <w:proofErr w:type="spellEnd"/>
       <w:r>
         <w:rPr>
           <w:b/>
@@ -12900,7 +12729,6 @@
       <w:r>
         <w:t xml:space="preserve">set to </w:t>
       </w:r>
-      <w:proofErr w:type="spellStart"/>
       <w:r>
         <w:rPr>
           <w:b/>
@@ -12910,11 +12738,9 @@
         </w:rPr>
         <w:t>pursueLeft</w:t>
       </w:r>
-      <w:proofErr w:type="spellEnd"/>
       <w:r>
         <w:t xml:space="preserve"> or </w:t>
       </w:r>
-      <w:proofErr w:type="spellStart"/>
       <w:r>
         <w:rPr>
           <w:b/>
@@ -12933,7 +12759,6 @@
         </w:rPr>
         <w:t>ueRight</w:t>
       </w:r>
-      <w:proofErr w:type="spellEnd"/>
       <w:r>
         <w:t>.</w:t>
       </w:r>
@@ -12943,7 +12768,6 @@
       <w:r>
         <w:t xml:space="preserve">action is set to </w:t>
       </w:r>
-      <w:proofErr w:type="spellStart"/>
       <w:r>
         <w:rPr>
           <w:b/>
@@ -12962,11 +12786,9 @@
         </w:rPr>
         <w:t>Up</w:t>
       </w:r>
-      <w:proofErr w:type="spellEnd"/>
       <w:r>
         <w:t xml:space="preserve"> or </w:t>
       </w:r>
-      <w:proofErr w:type="spellStart"/>
       <w:r>
         <w:rPr>
           <w:b/>
@@ -12985,7 +12807,6 @@
         </w:rPr>
         <w:t>Down</w:t>
       </w:r>
-      <w:proofErr w:type="spellEnd"/>
       <w:r>
         <w:t>.</w:t>
       </w:r>
@@ -13284,7 +13105,6 @@
       <w:r>
         <w:t xml:space="preserve">, </w:t>
       </w:r>
-      <w:proofErr w:type="spellStart"/>
       <w:r>
         <w:rPr>
           <w:b/>
@@ -13294,7 +13114,6 @@
         </w:rPr>
         <w:t>pursueLeft</w:t>
       </w:r>
-      <w:proofErr w:type="spellEnd"/>
       <w:r>
         <w:rPr>
           <w:b/>
@@ -13316,7 +13135,6 @@
         </w:rPr>
         <w:t xml:space="preserve"> </w:t>
       </w:r>
-      <w:proofErr w:type="spellStart"/>
       <w:r>
         <w:rPr>
           <w:b/>
@@ -13333,9 +13151,11 @@
           <w:i/>
           <w:iCs/>
         </w:rPr>
-        <w:t>Right</w:t>
-      </w:r>
-      <w:proofErr w:type="spellEnd"/>
+        <w:t xml:space="preserve">Right </w:t>
+      </w:r>
+      <w:r>
+        <w:t>related</w:t>
+      </w:r>
       <w:r>
         <w:rPr>
           <w:b/>
@@ -13346,7 +13166,104 @@
         <w:t xml:space="preserve"> </w:t>
       </w:r>
       <w:r>
-        <w:t>related</w:t>
+        <w:t>rules</w:t>
+      </w:r>
+      <w:r>
+        <w:t>.</w:t>
+      </w:r>
+    </w:p>
+    <w:p>
+      <w:r>
+        <w:t xml:space="preserve">I </w:t>
+      </w:r>
+      <w:r>
+        <w:t xml:space="preserve">implemented </w:t>
+      </w:r>
+      <w:r>
+        <w:t xml:space="preserve">a </w:t>
+      </w:r>
+      <w:r>
+        <w:rPr>
+          <w:i/>
+          <w:iCs/>
+        </w:rPr>
+        <w:t>dalekAI</w:t>
+      </w:r>
+      <w:r>
+        <w:t xml:space="preserve"> function that </w:t>
+      </w:r>
+      <w:r>
+        <w:t xml:space="preserve">encapsulated the </w:t>
+      </w:r>
+      <w:r>
+        <w:t xml:space="preserve">common </w:t>
+      </w:r>
+      <w:r>
+        <w:t>behavioral rules</w:t>
+      </w:r>
+      <w:r>
+        <w:t xml:space="preserve">, </w:t>
+      </w:r>
+      <w:r>
+        <w:t xml:space="preserve">running these against </w:t>
+      </w:r>
+      <w:r>
+        <w:t xml:space="preserve">each </w:t>
+      </w:r>
+      <w:r>
+        <w:t>Dalek every 16 frames.</w:t>
+      </w:r>
+      <w:r>
+        <w:t xml:space="preserve">  </w:t>
+      </w:r>
+      <w:r>
+        <w:t xml:space="preserve">It’s invoked from the game loop. </w:t>
+      </w:r>
+    </w:p>
+    <w:p>
+      <w:r>
+        <w:t xml:space="preserve">The </w:t>
+      </w:r>
+      <w:r>
+        <w:t xml:space="preserve">routine checks </w:t>
+      </w:r>
+      <w:r>
+        <w:t xml:space="preserve">to see if K9 </w:t>
+      </w:r>
+      <w:r>
+        <w:t xml:space="preserve">is </w:t>
+      </w:r>
+      <w:r>
+        <w:t>in sight</w:t>
+      </w:r>
+      <w:r>
+        <w:t xml:space="preserve"> (using a helper routine)</w:t>
+      </w:r>
+      <w:r>
+        <w:t>,</w:t>
+      </w:r>
+      <w:r>
+        <w:t xml:space="preserve"> promot</w:t>
+      </w:r>
+      <w:r>
+        <w:t>ing</w:t>
+      </w:r>
+      <w:r>
+        <w:t xml:space="preserve"> </w:t>
+      </w:r>
+      <w:proofErr w:type="gramStart"/>
+      <w:r>
+        <w:t xml:space="preserve">the </w:t>
+      </w:r>
+      <w:r>
+        <w:t>Dalek’s</w:t>
+      </w:r>
+      <w:proofErr w:type="gramEnd"/>
+      <w:r>
+        <w:t xml:space="preserve"> </w:t>
+      </w:r>
+      <w:r>
+        <w:t xml:space="preserve">action to </w:t>
       </w:r>
       <w:r>
         <w:rPr>
@@ -13355,111 +13272,8 @@
           <w:i/>
           <w:iCs/>
         </w:rPr>
-        <w:t xml:space="preserve"> </w:t>
-      </w:r>
-      <w:r>
-        <w:t>rules</w:t>
-      </w:r>
-      <w:r>
-        <w:t>.</w:t>
-      </w:r>
-    </w:p>
-    <w:p>
-      <w:r>
-        <w:t xml:space="preserve">I </w:t>
-      </w:r>
-      <w:r>
-        <w:t xml:space="preserve">implemented </w:t>
-      </w:r>
-      <w:r>
-        <w:t xml:space="preserve">a </w:t>
-      </w:r>
-      <w:proofErr w:type="spellStart"/>
-      <w:r>
-        <w:rPr>
-          <w:i/>
-          <w:iCs/>
-        </w:rPr>
-        <w:t>dalekAI</w:t>
-      </w:r>
-      <w:proofErr w:type="spellEnd"/>
-      <w:r>
-        <w:t xml:space="preserve"> function that </w:t>
-      </w:r>
-      <w:r>
-        <w:t xml:space="preserve">encapsulated the </w:t>
-      </w:r>
-      <w:r>
-        <w:t xml:space="preserve">common </w:t>
-      </w:r>
-      <w:r>
-        <w:t>behavioral rules</w:t>
-      </w:r>
-      <w:r>
-        <w:t xml:space="preserve">, </w:t>
-      </w:r>
-      <w:r>
-        <w:t xml:space="preserve">running these against </w:t>
-      </w:r>
-      <w:r>
-        <w:t xml:space="preserve">each </w:t>
-      </w:r>
-      <w:r>
-        <w:t>Dalek every 16 frames.</w:t>
-      </w:r>
-      <w:r>
-        <w:t xml:space="preserve">  </w:t>
-      </w:r>
-      <w:r>
-        <w:t xml:space="preserve">It’s invoked from the game loop. </w:t>
-      </w:r>
-    </w:p>
-    <w:p>
-      <w:r>
-        <w:t xml:space="preserve">The </w:t>
-      </w:r>
-      <w:r>
-        <w:t xml:space="preserve">routine checks </w:t>
-      </w:r>
-      <w:r>
-        <w:t xml:space="preserve">to see if K9 </w:t>
-      </w:r>
-      <w:r>
-        <w:t xml:space="preserve">is </w:t>
-      </w:r>
-      <w:r>
-        <w:t>in sight</w:t>
-      </w:r>
-      <w:r>
-        <w:t xml:space="preserve"> (using a helper routine)</w:t>
-      </w:r>
-      <w:r>
-        <w:t>,</w:t>
-      </w:r>
-      <w:r>
-        <w:t xml:space="preserve"> promot</w:t>
-      </w:r>
-      <w:r>
-        <w:t>ing</w:t>
-      </w:r>
-      <w:r>
-        <w:t xml:space="preserve"> </w:t>
-      </w:r>
-      <w:proofErr w:type="gramStart"/>
-      <w:r>
-        <w:t xml:space="preserve">the </w:t>
-      </w:r>
-      <w:r>
-        <w:t>Dalek’s</w:t>
-      </w:r>
-      <w:proofErr w:type="gramEnd"/>
-      <w:r>
-        <w:t xml:space="preserve"> </w:t>
-      </w:r>
-      <w:r>
-        <w:t xml:space="preserve">action to </w:t>
-      </w:r>
-      <w:proofErr w:type="spellStart"/>
+        <w:t>PursueLeft</w:t>
+      </w:r>
       <w:r>
         <w:rPr>
           <w:b/>
@@ -13467,9 +13281,11 @@
           <w:i/>
           <w:iCs/>
         </w:rPr>
-        <w:t>PursueLeft</w:t>
-      </w:r>
-      <w:proofErr w:type="spellEnd"/>
+        <w:t xml:space="preserve"> </w:t>
+      </w:r>
+      <w:r>
+        <w:t>or</w:t>
+      </w:r>
       <w:r>
         <w:rPr>
           <w:b/>
@@ -13477,10 +13293,208 @@
           <w:i/>
           <w:iCs/>
         </w:rPr>
+        <w:t xml:space="preserve"> PursueRight</w:t>
+      </w:r>
+      <w:r>
+        <w:t xml:space="preserve"> if so.</w:t>
+      </w:r>
+      <w:r>
+        <w:t xml:space="preserve"> The function also </w:t>
+      </w:r>
+      <w:r>
+        <w:t>checks to see if K9 is within weapon’s range</w:t>
+      </w:r>
+      <w:r>
+        <w:t>, firing its weapon if it is.</w:t>
+      </w:r>
+    </w:p>
+    <w:p>
+      <w:r>
+        <w:t xml:space="preserve">I then updated </w:t>
+      </w:r>
+      <w:r>
+        <w:t xml:space="preserve">the </w:t>
+      </w:r>
+      <w:r>
+        <w:rPr>
+          <w:i/>
+          <w:iCs/>
+        </w:rPr>
+        <w:t>dalekAnimate</w:t>
+      </w:r>
+      <w:r>
+        <w:t xml:space="preserve"> and all the </w:t>
+      </w:r>
+      <w:r>
+        <w:t xml:space="preserve">Dalek </w:t>
+      </w:r>
+      <w:r>
+        <w:t xml:space="preserve">frame callback functions </w:t>
+      </w:r>
+      <w:r>
+        <w:t xml:space="preserve">to </w:t>
+      </w:r>
+      <w:r>
+        <w:t xml:space="preserve">amend their </w:t>
+      </w:r>
+      <w:r>
+        <w:t>behaviors</w:t>
+      </w:r>
+      <w:r>
+        <w:t xml:space="preserve"> based on </w:t>
+      </w:r>
+      <w:r>
+        <w:t xml:space="preserve">the </w:t>
+      </w:r>
+      <w:r>
+        <w:t>current action.</w:t>
+      </w:r>
+      <w:r>
+        <w:t xml:space="preserve">  The challenge was keeping the impact (increased code-size) to a </w:t>
+      </w:r>
+      <w:r>
+        <w:t>minimum</w:t>
+      </w:r>
+      <w:r>
+        <w:t>.</w:t>
+      </w:r>
+      <w:r>
+        <w:t xml:space="preserve"> A lot of time was spent refactoring these functio</w:t>
+      </w:r>
+      <w:r>
+        <w:t>ns to use as few code bytes as possible.</w:t>
+      </w:r>
+    </w:p>
+    <w:p>
+      <w:r>
+        <w:t>On</w:t>
+      </w:r>
+      <w:r>
+        <w:t>e</w:t>
+      </w:r>
+      <w:r>
+        <w:t xml:space="preserve"> notable challenge was how best to </w:t>
+      </w:r>
+      <w:r>
+        <w:t xml:space="preserve">show </w:t>
+      </w:r>
+      <w:r>
+        <w:t>damage being inflicted on K9.</w:t>
+      </w:r>
+      <w:r>
+        <w:t xml:space="preserve">  After brainstorming many ideas, I ended up implementing a simple </w:t>
+      </w:r>
+      <w:r>
+        <w:t>first-person</w:t>
+      </w:r>
+      <w:r>
         <w:t xml:space="preserve"> </w:t>
       </w:r>
       <w:r>
-        <w:t>or</w:t>
+        <w:t xml:space="preserve">effect where </w:t>
+      </w:r>
+      <w:r>
+        <w:t xml:space="preserve">the </w:t>
+      </w:r>
+      <w:r>
+        <w:t xml:space="preserve">screen </w:t>
+      </w:r>
+      <w:r>
+        <w:t xml:space="preserve">is flashed </w:t>
+      </w:r>
+      <w:r>
+        <w:t>black</w:t>
+      </w:r>
+      <w:r>
+        <w:t>,</w:t>
+      </w:r>
+      <w:r>
+        <w:t xml:space="preserve"> </w:t>
+      </w:r>
+      <w:r>
+        <w:t>at a</w:t>
+      </w:r>
+      <w:r>
+        <w:t xml:space="preserve"> low frequence</w:t>
+      </w:r>
+      <w:r>
+        <w:t>,</w:t>
+      </w:r>
+      <w:r>
+        <w:t xml:space="preserve"> </w:t>
+      </w:r>
+      <w:r>
+        <w:t>and a</w:t>
+      </w:r>
+      <w:r>
+        <w:t>n obnoxious sound</w:t>
+      </w:r>
+      <w:r>
+        <w:t xml:space="preserve"> is </w:t>
+      </w:r>
+      <w:r>
+        <w:t>played</w:t>
+      </w:r>
+      <w:r>
+        <w:t>.</w:t>
+      </w:r>
+      <w:r>
+        <w:t xml:space="preserve">  The effect is quite </w:t>
+      </w:r>
+      <w:r>
+        <w:t>e</w:t>
+      </w:r>
+      <w:r>
+        <w:t>ffective</w:t>
+      </w:r>
+      <w:r>
+        <w:t>!</w:t>
+      </w:r>
+    </w:p>
+    <w:p>
+      <w:r>
+        <w:t xml:space="preserve">I also added a Mode 7 </w:t>
+      </w:r>
+      <w:r>
+        <w:t xml:space="preserve">incomplete level </w:t>
+      </w:r>
+      <w:r>
+        <w:t xml:space="preserve">screen, which </w:t>
+      </w:r>
+      <w:r>
+        <w:t>shows</w:t>
+      </w:r>
+      <w:r>
+        <w:t xml:space="preserve"> </w:t>
+      </w:r>
+      <w:r>
+        <w:t xml:space="preserve">if </w:t>
+      </w:r>
+      <w:r>
+        <w:t>K</w:t>
+      </w:r>
+      <w:r>
+        <w:t xml:space="preserve">9’s health </w:t>
+      </w:r>
+      <w:r>
+        <w:t xml:space="preserve">becomes </w:t>
+      </w:r>
+      <w:r>
+        <w:t>zero</w:t>
+      </w:r>
+      <w:r>
+        <w:t>.  Pressing space restarts the level.</w:t>
+      </w:r>
+    </w:p>
+    <w:p>
+      <w:r>
+        <w:t xml:space="preserve">I then turned to </w:t>
+      </w:r>
+      <w:r>
+        <w:t>implementing</w:t>
+      </w:r>
+      <w:r>
+        <w:t xml:space="preserve"> the </w:t>
       </w:r>
       <w:r>
         <w:rPr>
@@ -13489,9 +13503,11 @@
           <w:i/>
           <w:iCs/>
         </w:rPr>
-        <w:t xml:space="preserve"> </w:t>
-      </w:r>
-      <w:proofErr w:type="spellStart"/>
+        <w:t>PursueUp</w:t>
+      </w:r>
+      <w:r>
+        <w:t xml:space="preserve"> and </w:t>
+      </w:r>
       <w:r>
         <w:rPr>
           <w:b/>
@@ -13499,249 +13515,20 @@
           <w:i/>
           <w:iCs/>
         </w:rPr>
-        <w:t>PursueRight</w:t>
-      </w:r>
-      <w:proofErr w:type="spellEnd"/>
-      <w:r>
-        <w:t xml:space="preserve"> if so.</w:t>
-      </w:r>
-      <w:r>
-        <w:t xml:space="preserve"> The function also </w:t>
-      </w:r>
-      <w:r>
-        <w:t>checks to see if K9 is within weapon’s range</w:t>
-      </w:r>
-      <w:r>
-        <w:t>, firing its weapon if it is.</w:t>
-      </w:r>
-    </w:p>
-    <w:p>
-      <w:r>
-        <w:t xml:space="preserve">I then updated </w:t>
-      </w:r>
-      <w:r>
-        <w:t xml:space="preserve">the </w:t>
-      </w:r>
-      <w:proofErr w:type="spellStart"/>
-      <w:r>
-        <w:rPr>
-          <w:i/>
-          <w:iCs/>
-        </w:rPr>
-        <w:t>dalekAnimate</w:t>
-      </w:r>
-      <w:proofErr w:type="spellEnd"/>
-      <w:r>
-        <w:t xml:space="preserve"> and all the </w:t>
-      </w:r>
-      <w:r>
-        <w:t xml:space="preserve">Dalek </w:t>
-      </w:r>
-      <w:r>
-        <w:t xml:space="preserve">frame callback functions </w:t>
-      </w:r>
-      <w:r>
-        <w:t xml:space="preserve">to </w:t>
-      </w:r>
-      <w:r>
-        <w:t xml:space="preserve">amend their </w:t>
-      </w:r>
-      <w:r>
-        <w:t>behaviors</w:t>
-      </w:r>
-      <w:r>
-        <w:t xml:space="preserve"> based on </w:t>
-      </w:r>
-      <w:r>
-        <w:t xml:space="preserve">the </w:t>
-      </w:r>
-      <w:r>
-        <w:t>current action.</w:t>
-      </w:r>
-      <w:r>
-        <w:t xml:space="preserve">  The challenge was keeping the impact (increased code-size) to a </w:t>
-      </w:r>
-      <w:r>
-        <w:t>minimum</w:t>
+        <w:t>PursueDown</w:t>
+      </w:r>
+      <w:r>
+        <w:t xml:space="preserve"> behavior</w:t>
+      </w:r>
+      <w:r>
+        <w:t>al rule</w:t>
+      </w:r>
+      <w:r>
+        <w:t>s</w:t>
       </w:r>
       <w:r>
         <w:t>.</w:t>
       </w:r>
-      <w:r>
-        <w:t xml:space="preserve"> A lot of time was spent refactoring these functio</w:t>
-      </w:r>
-      <w:r>
-        <w:t>ns to use as few code bytes as possible.</w:t>
-      </w:r>
-    </w:p>
-    <w:p>
-      <w:r>
-        <w:t>On</w:t>
-      </w:r>
-      <w:r>
-        <w:t>e</w:t>
-      </w:r>
-      <w:r>
-        <w:t xml:space="preserve"> notable challenge was how best to </w:t>
-      </w:r>
-      <w:r>
-        <w:t xml:space="preserve">show </w:t>
-      </w:r>
-      <w:r>
-        <w:t>damage being inflicted on K9.</w:t>
-      </w:r>
-      <w:r>
-        <w:t xml:space="preserve">  After brainstorming many ideas, I ended up implementing a simple </w:t>
-      </w:r>
-      <w:r>
-        <w:t>first-person</w:t>
-      </w:r>
-      <w:r>
-        <w:t xml:space="preserve"> </w:t>
-      </w:r>
-      <w:r>
-        <w:t xml:space="preserve">effect where </w:t>
-      </w:r>
-      <w:r>
-        <w:t xml:space="preserve">the </w:t>
-      </w:r>
-      <w:r>
-        <w:t xml:space="preserve">screen </w:t>
-      </w:r>
-      <w:r>
-        <w:t xml:space="preserve">is flashed </w:t>
-      </w:r>
-      <w:r>
-        <w:t>black</w:t>
-      </w:r>
-      <w:r>
-        <w:t>,</w:t>
-      </w:r>
-      <w:r>
-        <w:t xml:space="preserve"> </w:t>
-      </w:r>
-      <w:r>
-        <w:t>at a</w:t>
-      </w:r>
-      <w:r>
-        <w:t xml:space="preserve"> low frequence</w:t>
-      </w:r>
-      <w:r>
-        <w:t>,</w:t>
-      </w:r>
-      <w:r>
-        <w:t xml:space="preserve"> </w:t>
-      </w:r>
-      <w:r>
-        <w:t>and a</w:t>
-      </w:r>
-      <w:r>
-        <w:t>n obnoxious sound</w:t>
-      </w:r>
-      <w:r>
-        <w:t xml:space="preserve"> is </w:t>
-      </w:r>
-      <w:r>
-        <w:t>played</w:t>
-      </w:r>
-      <w:r>
-        <w:t>.</w:t>
-      </w:r>
-      <w:r>
-        <w:t xml:space="preserve">  The effect is quite </w:t>
-      </w:r>
-      <w:r>
-        <w:t>e</w:t>
-      </w:r>
-      <w:r>
-        <w:t>ffective</w:t>
-      </w:r>
-      <w:r>
-        <w:t>!</w:t>
-      </w:r>
-    </w:p>
-    <w:p>
-      <w:r>
-        <w:t xml:space="preserve">I also added a Mode 7 </w:t>
-      </w:r>
-      <w:r>
-        <w:t xml:space="preserve">incomplete level </w:t>
-      </w:r>
-      <w:r>
-        <w:t xml:space="preserve">screen, which </w:t>
-      </w:r>
-      <w:r>
-        <w:t>shows</w:t>
-      </w:r>
-      <w:r>
-        <w:t xml:space="preserve"> </w:t>
-      </w:r>
-      <w:r>
-        <w:t xml:space="preserve">if </w:t>
-      </w:r>
-      <w:r>
-        <w:t>K</w:t>
-      </w:r>
-      <w:r>
-        <w:t xml:space="preserve">9’s health </w:t>
-      </w:r>
-      <w:r>
-        <w:t xml:space="preserve">becomes </w:t>
-      </w:r>
-      <w:r>
-        <w:t>zero</w:t>
-      </w:r>
-      <w:r>
-        <w:t>.  Pressing space restarts the level.</w:t>
-      </w:r>
-    </w:p>
-    <w:p>
-      <w:r>
-        <w:t xml:space="preserve">I then turned to </w:t>
-      </w:r>
-      <w:r>
-        <w:t>implementing</w:t>
-      </w:r>
-      <w:r>
-        <w:t xml:space="preserve"> the </w:t>
-      </w:r>
-      <w:proofErr w:type="spellStart"/>
-      <w:r>
-        <w:rPr>
-          <w:b/>
-          <w:bCs/>
-          <w:i/>
-          <w:iCs/>
-        </w:rPr>
-        <w:t>PursueUp</w:t>
-      </w:r>
-      <w:proofErr w:type="spellEnd"/>
-      <w:r>
-        <w:t xml:space="preserve"> and </w:t>
-      </w:r>
-      <w:proofErr w:type="spellStart"/>
-      <w:r>
-        <w:rPr>
-          <w:b/>
-          <w:bCs/>
-          <w:i/>
-          <w:iCs/>
-        </w:rPr>
-        <w:t>PursueDown</w:t>
-      </w:r>
-      <w:proofErr w:type="spellEnd"/>
-      <w:r>
-        <w:t xml:space="preserve"> behavior</w:t>
-      </w:r>
-      <w:r>
-        <w:t>al rule</w:t>
-      </w:r>
-      <w:r>
-        <w:t>s</w:t>
-      </w:r>
-      <w:r>
-        <w:t>.</w:t>
-      </w:r>
     </w:p>
     <w:p>
       <w:r>
@@ -13762,7 +13549,6 @@
       <w:r>
         <w:t xml:space="preserve">e to support this.  Fortunately, the low nibble of the elevator’s </w:t>
       </w:r>
-      <w:proofErr w:type="spellStart"/>
       <w:proofErr w:type="gramStart"/>
       <w:r>
         <w:rPr>
@@ -13771,7 +13557,6 @@
         </w:rPr>
         <w:t>objectState</w:t>
       </w:r>
-      <w:proofErr w:type="spellEnd"/>
       <w:proofErr w:type="gramEnd"/>
       <w:r>
         <w:t xml:space="preserve"> variable </w:t>
@@ -14003,14 +13788,9 @@
       <w:r>
         <w:t xml:space="preserve"> - When one or more Daleks are in pursuit of K9, a </w:t>
       </w:r>
-      <w:proofErr w:type="spellStart"/>
       <w:proofErr w:type="gramStart"/>
       <w:r>
-        <w:t>PacMan</w:t>
-      </w:r>
-      <w:proofErr w:type="spellEnd"/>
-      <w:r>
-        <w:t xml:space="preserve"> like</w:t>
+        <w:t>PacMan like</w:t>
       </w:r>
       <w:proofErr w:type="gramEnd"/>
       <w:r>
@@ -14263,7 +14043,6 @@
       <w:r>
         <w:t xml:space="preserve">Channel 2 is used for the collect key/jewel, door locked, and K9 movement sound effects.  These sound effects are mutually exclusive except for the movement sound effect.  The game uses a </w:t>
       </w:r>
-      <w:proofErr w:type="spellStart"/>
       <w:r>
         <w:rPr>
           <w:i/>
@@ -14271,7 +14050,6 @@
         </w:rPr>
         <w:t>frameCount</w:t>
       </w:r>
-      <w:proofErr w:type="spellEnd"/>
       <w:r>
         <w:t xml:space="preserve"> based timer to inhibit playing the movement sound effect when the other sound effects are playing.</w:t>
       </w:r>
@@ -15377,7 +15155,6 @@
       <w:r>
         <w:t xml:space="preserve"> into the sprite data and let the </w:t>
       </w:r>
-      <w:proofErr w:type="spellStart"/>
       <w:r>
         <w:rPr>
           <w:i/>
@@ -15385,7 +15162,6 @@
         </w:rPr>
         <w:t>drawSprite</w:t>
       </w:r>
-      <w:proofErr w:type="spellEnd"/>
       <w:r>
         <w:t xml:space="preserve"> routine do all the work of putting the pixels on the screen, however this would result in the ‘</w:t>
       </w:r>
@@ -15816,7 +15592,6 @@
       <w:r>
         <w:t xml:space="preserve">from </w:t>
       </w:r>
-      <w:proofErr w:type="spellStart"/>
       <w:r>
         <w:rPr>
           <w:i/>
@@ -15824,11 +15599,9 @@
         </w:rPr>
         <w:t>drawObject</w:t>
       </w:r>
-      <w:proofErr w:type="spellEnd"/>
       <w:r>
         <w:t xml:space="preserve"> and </w:t>
       </w:r>
-      <w:proofErr w:type="spellStart"/>
       <w:r>
         <w:rPr>
           <w:i/>
@@ -15836,7 +15609,6 @@
         </w:rPr>
         <w:t>drawLaserOn</w:t>
       </w:r>
-      <w:proofErr w:type="spellEnd"/>
       <w:r>
         <w:rPr>
           <w:i/>
@@ -16987,7 +16759,6 @@
       <w:r>
         <w:t xml:space="preserve">The title functionality starts and stops playback by invoking the </w:t>
       </w:r>
-      <w:proofErr w:type="spellStart"/>
       <w:r>
         <w:rPr>
           <w:b/>
@@ -16997,11 +16768,9 @@
         </w:rPr>
         <w:t>playMusic</w:t>
       </w:r>
-      <w:proofErr w:type="spellEnd"/>
       <w:r>
         <w:t xml:space="preserve"> and </w:t>
       </w:r>
-      <w:proofErr w:type="spellStart"/>
       <w:r>
         <w:rPr>
           <w:b/>
@@ -17011,7 +16780,6 @@
         </w:rPr>
         <w:t>stopMusic</w:t>
       </w:r>
-      <w:proofErr w:type="spellEnd"/>
       <w:r>
         <w:t xml:space="preserve"> routines.  These routines start and stop the music, which is played in the </w:t>
       </w:r>
@@ -19062,11 +18830,9 @@
             <w:tcW w:w="3116" w:type="dxa"/>
           </w:tcPr>
           <w:p>
-            <w:proofErr w:type="spellStart"/>
             <w:r>
               <w:t>soundVector_beginPursuit</w:t>
             </w:r>
-            <w:proofErr w:type="spellEnd"/>
           </w:p>
         </w:tc>
         <w:tc>
@@ -19077,14 +18843,12 @@
             <w:pPr>
               <w:cnfStyle w:val="000000100000" w:firstRow="0" w:lastRow="0" w:firstColumn="0" w:lastColumn="0" w:oddVBand="0" w:evenVBand="0" w:oddHBand="1" w:evenHBand="0" w:firstRowFirstColumn="0" w:firstRowLastColumn="0" w:lastRowFirstColumn="0" w:lastRowLastColumn="0"/>
             </w:pPr>
-            <w:proofErr w:type="spellStart"/>
             <w:r>
               <w:t>soundEffect_pursuitO</w:t>
             </w:r>
             <w:r>
               <w:t>n</w:t>
             </w:r>
-            <w:proofErr w:type="spellEnd"/>
           </w:p>
         </w:tc>
         <w:tc>
@@ -19095,14 +18859,12 @@
             <w:pPr>
               <w:cnfStyle w:val="000000100000" w:firstRow="0" w:lastRow="0" w:firstColumn="0" w:lastColumn="0" w:oddVBand="0" w:evenVBand="0" w:oddHBand="1" w:evenHBand="0" w:firstRowFirstColumn="0" w:firstRowLastColumn="0" w:lastRowFirstColumn="0" w:lastRowLastColumn="0"/>
             </w:pPr>
-            <w:proofErr w:type="spellStart"/>
             <w:r>
               <w:t>sample_</w:t>
             </w:r>
             <w:r>
               <w:t>soundExterminate</w:t>
             </w:r>
-            <w:proofErr w:type="spellEnd"/>
           </w:p>
         </w:tc>
       </w:tr>
@@ -19113,11 +18875,9 @@
             <w:tcW w:w="3116" w:type="dxa"/>
           </w:tcPr>
           <w:p>
-            <w:proofErr w:type="spellStart"/>
             <w:r>
               <w:t>soundVector_updatePursuit</w:t>
             </w:r>
-            <w:proofErr w:type="spellEnd"/>
           </w:p>
         </w:tc>
         <w:tc>
@@ -19144,11 +18904,9 @@
             <w:pPr>
               <w:cnfStyle w:val="000000000000" w:firstRow="0" w:lastRow="0" w:firstColumn="0" w:lastColumn="0" w:oddVBand="0" w:evenVBand="0" w:oddHBand="0" w:evenHBand="0" w:firstRowFirstColumn="0" w:firstRowLastColumn="0" w:lastRowFirstColumn="0" w:lastRowLastColumn="0"/>
             </w:pPr>
-            <w:proofErr w:type="spellStart"/>
             <w:r>
               <w:t>sample_updatePursuit</w:t>
             </w:r>
-            <w:proofErr w:type="spellEnd"/>
           </w:p>
         </w:tc>
       </w:tr>
@@ -19162,12 +18920,10 @@
             <w:tcW w:w="3116" w:type="dxa"/>
           </w:tcPr>
           <w:p>
-            <w:proofErr w:type="spellStart"/>
             <w:r>
               <w:lastRenderedPageBreak/>
               <w:t>soundVector_endPursuit</w:t>
             </w:r>
-            <w:proofErr w:type="spellEnd"/>
           </w:p>
         </w:tc>
         <w:tc>
@@ -19178,11 +18934,9 @@
             <w:pPr>
               <w:cnfStyle w:val="000000100000" w:firstRow="0" w:lastRow="0" w:firstColumn="0" w:lastColumn="0" w:oddVBand="0" w:evenVBand="0" w:oddHBand="1" w:evenHBand="0" w:firstRowFirstColumn="0" w:firstRowLastColumn="0" w:lastRowFirstColumn="0" w:lastRowLastColumn="0"/>
             </w:pPr>
-            <w:proofErr w:type="spellStart"/>
             <w:r>
               <w:t>soundEffect_pursuitOff</w:t>
             </w:r>
-            <w:proofErr w:type="spellEnd"/>
           </w:p>
         </w:tc>
         <w:tc>
@@ -19193,11 +18947,9 @@
             <w:pPr>
               <w:cnfStyle w:val="000000100000" w:firstRow="0" w:lastRow="0" w:firstColumn="0" w:lastColumn="0" w:oddVBand="0" w:evenVBand="0" w:oddHBand="1" w:evenHBand="0" w:firstRowFirstColumn="0" w:firstRowLastColumn="0" w:lastRowFirstColumn="0" w:lastRowLastColumn="0"/>
             </w:pPr>
-            <w:proofErr w:type="spellStart"/>
             <w:r>
               <w:t>sample_stop</w:t>
             </w:r>
-            <w:proofErr w:type="spellEnd"/>
           </w:p>
         </w:tc>
       </w:tr>
@@ -19208,11 +18960,9 @@
             <w:tcW w:w="3116" w:type="dxa"/>
           </w:tcPr>
           <w:p>
-            <w:proofErr w:type="spellStart"/>
             <w:r>
               <w:t>soundVector_enemyLasered</w:t>
             </w:r>
-            <w:proofErr w:type="spellEnd"/>
           </w:p>
         </w:tc>
         <w:tc>
@@ -19239,11 +18989,9 @@
             <w:pPr>
               <w:cnfStyle w:val="000000000000" w:firstRow="0" w:lastRow="0" w:firstColumn="0" w:lastColumn="0" w:oddVBand="0" w:evenVBand="0" w:oddHBand="0" w:evenHBand="0" w:firstRowFirstColumn="0" w:firstRowLastColumn="0" w:lastRowFirstColumn="0" w:lastRowLastColumn="0"/>
             </w:pPr>
-            <w:proofErr w:type="spellStart"/>
             <w:r>
               <w:t>sample_soundGrown</w:t>
             </w:r>
-            <w:proofErr w:type="spellEnd"/>
           </w:p>
         </w:tc>
       </w:tr>
@@ -19257,11 +19005,9 @@
             <w:tcW w:w="3116" w:type="dxa"/>
           </w:tcPr>
           <w:p>
-            <w:proofErr w:type="spellStart"/>
             <w:r>
               <w:t>soundVector_weaponFired</w:t>
             </w:r>
-            <w:proofErr w:type="spellEnd"/>
           </w:p>
         </w:tc>
         <w:tc>
@@ -19272,11 +19018,9 @@
             <w:pPr>
               <w:cnfStyle w:val="000000100000" w:firstRow="0" w:lastRow="0" w:firstColumn="0" w:lastColumn="0" w:oddVBand="0" w:evenVBand="0" w:oddHBand="1" w:evenHBand="0" w:firstRowFirstColumn="0" w:firstRowLastColumn="0" w:lastRowFirstColumn="0" w:lastRowLastColumn="0"/>
             </w:pPr>
-            <w:proofErr w:type="spellStart"/>
             <w:r>
               <w:t>soundEffect_pain</w:t>
             </w:r>
-            <w:proofErr w:type="spellEnd"/>
           </w:p>
         </w:tc>
         <w:tc>
@@ -19287,11 +19031,9 @@
             <w:pPr>
               <w:cnfStyle w:val="000000100000" w:firstRow="0" w:lastRow="0" w:firstColumn="0" w:lastColumn="0" w:oddVBand="0" w:evenVBand="0" w:oddHBand="1" w:evenHBand="0" w:firstRowFirstColumn="0" w:firstRowLastColumn="0" w:lastRowFirstColumn="0" w:lastRowLastColumn="0"/>
             </w:pPr>
-            <w:proofErr w:type="spellStart"/>
             <w:r>
               <w:t>sample_soundWeapon</w:t>
             </w:r>
-            <w:proofErr w:type="spellEnd"/>
           </w:p>
         </w:tc>
       </w:tr>
@@ -19557,11 +19299,9 @@
       <w:r>
         <w:t xml:space="preserve">in </w:t>
       </w:r>
-      <w:proofErr w:type="spellStart"/>
       <w:r>
         <w:t>BeebEm</w:t>
       </w:r>
-      <w:proofErr w:type="spellEnd"/>
       <w:r>
         <w:t xml:space="preserve">, though there was a </w:t>
       </w:r>
@@ -19765,11 +19505,9 @@
             <w:tcW w:w="2586" w:type="dxa"/>
           </w:tcPr>
           <w:p>
-            <w:proofErr w:type="spellStart"/>
             <w:r>
               <w:t>enemyDestroyed</w:t>
             </w:r>
-            <w:proofErr w:type="spellEnd"/>
           </w:p>
         </w:tc>
         <w:tc>
@@ -19806,11 +19544,9 @@
             <w:tcW w:w="2586" w:type="dxa"/>
           </w:tcPr>
           <w:p>
-            <w:proofErr w:type="spellStart"/>
             <w:r>
               <w:t>startLevel</w:t>
             </w:r>
-            <w:proofErr w:type="spellEnd"/>
           </w:p>
         </w:tc>
         <w:tc>
@@ -19850,11 +19586,9 @@
             <w:tcW w:w="2586" w:type="dxa"/>
           </w:tcPr>
           <w:p>
-            <w:proofErr w:type="spellStart"/>
             <w:r>
               <w:t>completeLevel</w:t>
             </w:r>
-            <w:proofErr w:type="spellEnd"/>
           </w:p>
         </w:tc>
         <w:tc>
@@ -19865,11 +19599,9 @@
             <w:pPr>
               <w:cnfStyle w:val="000000100000" w:firstRow="0" w:lastRow="0" w:firstColumn="0" w:lastColumn="0" w:oddVBand="0" w:evenVBand="0" w:oddHBand="1" w:evenHBand="0" w:firstRowFirstColumn="0" w:firstRowLastColumn="0" w:lastRowFirstColumn="0" w:lastRowLastColumn="0"/>
             </w:pPr>
-            <w:proofErr w:type="spellStart"/>
             <w:r>
               <w:t>soundEffect_levelComplete</w:t>
             </w:r>
-            <w:proofErr w:type="spellEnd"/>
           </w:p>
         </w:tc>
         <w:tc>
@@ -19880,14 +19612,12 @@
             <w:pPr>
               <w:cnfStyle w:val="000000100000" w:firstRow="0" w:lastRow="0" w:firstColumn="0" w:lastColumn="0" w:oddVBand="0" w:evenVBand="0" w:oddHBand="1" w:evenHBand="0" w:firstRowFirstColumn="0" w:firstRowLastColumn="0" w:lastRowFirstColumn="0" w:lastRowLastColumn="0"/>
             </w:pPr>
-            <w:proofErr w:type="spellStart"/>
             <w:r>
               <w:t>sample_</w:t>
             </w:r>
             <w:r>
               <w:t>soundTardisDoor</w:t>
             </w:r>
-            <w:proofErr w:type="spellEnd"/>
           </w:p>
         </w:tc>
       </w:tr>
@@ -20887,7 +20617,6 @@
       <w:r>
         <w:t xml:space="preserve"> travel. Since adding a new dynamic type would require nine bits in </w:t>
       </w:r>
-      <w:proofErr w:type="spellStart"/>
       <w:r>
         <w:rPr>
           <w:b/>
@@ -20896,7 +20625,6 @@
         <w:lastRenderedPageBreak/>
         <w:t>objectState</w:t>
       </w:r>
-      <w:proofErr w:type="spellEnd"/>
       <w:r>
         <w:t xml:space="preserve">, I </w:t>
       </w:r>
@@ -20918,7 +20646,6 @@
       <w:r>
         <w:t xml:space="preserve">elevator, using </w:t>
       </w:r>
-      <w:proofErr w:type="spellStart"/>
       <w:r>
         <w:rPr>
           <w:b/>
@@ -20926,7 +20653,6 @@
         </w:rPr>
         <w:t>objectFrameCounter</w:t>
       </w:r>
-      <w:proofErr w:type="spellEnd"/>
       <w:r>
         <w:t xml:space="preserve"> </w:t>
       </w:r>
@@ -20993,7 +20719,6 @@
       <w:r>
         <w:t xml:space="preserve">in </w:t>
       </w:r>
-      <w:proofErr w:type="spellStart"/>
       <w:r>
         <w:rPr>
           <w:b/>
@@ -21003,7 +20728,6 @@
         </w:rPr>
         <w:t>objectFrameCounter</w:t>
       </w:r>
-      <w:proofErr w:type="spellEnd"/>
       <w:r>
         <w:rPr>
           <w:b/>
@@ -21178,7 +20902,6 @@
       <w:r>
         <w:t xml:space="preserve">files were created in the level asset folders, with the </w:t>
       </w:r>
-      <w:proofErr w:type="spellStart"/>
       <w:r>
         <w:rPr>
           <w:b/>
@@ -21186,7 +20909,6 @@
         </w:rPr>
         <w:t>BMPConverter</w:t>
       </w:r>
-      <w:proofErr w:type="spellEnd"/>
       <w:r>
         <w:t xml:space="preserve"> console app updated to convert and include these in the generated level atlas data files.</w:t>
       </w:r>
@@ -21243,7 +20965,6 @@
       <w:r>
         <w:t xml:space="preserve">A new </w:t>
       </w:r>
-      <w:proofErr w:type="spellStart"/>
       <w:r>
         <w:rPr>
           <w:b/>
@@ -21251,7 +20972,6 @@
         </w:rPr>
         <w:t>rideTeleport</w:t>
       </w:r>
-      <w:proofErr w:type="spellEnd"/>
       <w:r>
         <w:t xml:space="preserve"> routine was introduced </w:t>
       </w:r>
@@ -21319,7 +21039,6 @@
       <w:r>
         <w:t xml:space="preserve">Find the destination teleport object (elevator), held in </w:t>
       </w:r>
-      <w:proofErr w:type="spellStart"/>
       <w:r>
         <w:rPr>
           <w:b/>
@@ -21329,7 +21048,6 @@
         </w:rPr>
         <w:t>objectFrameCounter</w:t>
       </w:r>
-      <w:proofErr w:type="spellEnd"/>
       <w:r>
         <w:t>.</w:t>
       </w:r>
@@ -21652,6 +21370,241 @@
     </w:p>
     <w:p>
       <w:pPr>
+        <w:pStyle w:val="Heading2"/>
+      </w:pPr>
+      <w:r>
+        <w:t>Destructible walls</w:t>
+      </w:r>
+    </w:p>
+    <w:p>
+      <w:r>
+        <w:t>I was now at the point where I’d didn’t think I’d be able to implement any more features as I’d pretty much exhausted ways to free up more memory, or so I thought.</w:t>
+      </w:r>
+    </w:p>
+    <w:p>
+      <w:r>
+        <w:t xml:space="preserve">I </w:t>
+      </w:r>
+      <w:r>
+        <w:t xml:space="preserve">then remembered </w:t>
+      </w:r>
+      <w:r>
+        <w:t xml:space="preserve">that additional memory could be freed by </w:t>
+      </w:r>
+      <w:r>
+        <w:t>moving</w:t>
+      </w:r>
+      <w:r>
+        <w:t xml:space="preserve"> the Mode-7 interstitial experiences into the level files. Although I had previously considered this approach, I initially decided against it due to concerns about the user experience. However, following </w:t>
+      </w:r>
+      <w:r>
+        <w:lastRenderedPageBreak/>
+        <w:t xml:space="preserve">the implementation of crop transitions, which provide a seamless transition between experiences, I determined that spinning the disc after a crop transition would be </w:t>
+      </w:r>
+      <w:r>
+        <w:t>fine</w:t>
+      </w:r>
+      <w:r>
+        <w:t>.</w:t>
+      </w:r>
+    </w:p>
+    <w:p>
+      <w:r>
+        <w:t xml:space="preserve">The changes were straightforward to implement.  I moved all the Mode 7 utility routines into a new source file (mode7.6502) and included this after the level initialization code (level.6502).  I then updated how the </w:t>
+      </w:r>
+      <w:r>
+        <w:rPr>
+          <w:b/>
+          <w:bCs/>
+        </w:rPr>
+        <w:t>game</w:t>
+      </w:r>
+      <w:r>
+        <w:t xml:space="preserve">, </w:t>
+      </w:r>
+      <w:r>
+        <w:rPr>
+          <w:b/>
+          <w:bCs/>
+        </w:rPr>
+        <w:t>levels</w:t>
+      </w:r>
+      <w:r>
+        <w:t xml:space="preserve">, and the </w:t>
+      </w:r>
+      <w:r>
+        <w:rPr>
+          <w:b/>
+          <w:bCs/>
+        </w:rPr>
+        <w:t>finale</w:t>
+      </w:r>
+      <w:r>
+        <w:t xml:space="preserve"> </w:t>
+      </w:r>
+      <w:r>
+        <w:t>files were</w:t>
+      </w:r>
+      <w:r>
+        <w:t xml:space="preserve"> packaged to include th</w:t>
+      </w:r>
+      <w:r>
+        <w:t>e mode seven code</w:t>
+      </w:r>
+      <w:r>
+        <w:t>.</w:t>
+      </w:r>
+      <w:r>
+        <w:t xml:space="preserve">  The changes freed up </w:t>
+      </w:r>
+      <w:r>
+        <w:rPr>
+          <w:b/>
+          <w:bCs/>
+        </w:rPr>
+        <w:t>361</w:t>
+      </w:r>
+      <w:r>
+        <w:t xml:space="preserve"> bytes!</w:t>
+      </w:r>
+    </w:p>
+    <w:p>
+      <w:r>
+        <w:t xml:space="preserve">I then set out </w:t>
+      </w:r>
+      <w:r>
+        <w:t xml:space="preserve">to </w:t>
+      </w:r>
+      <w:r>
+        <w:t>implement</w:t>
+      </w:r>
+      <w:r>
+        <w:t xml:space="preserve"> </w:t>
+      </w:r>
+      <w:r>
+        <w:t xml:space="preserve">destructible walls, </w:t>
+      </w:r>
+      <w:r>
+        <w:t xml:space="preserve">a feature </w:t>
+      </w:r>
+      <w:r>
+        <w:t xml:space="preserve">that </w:t>
+      </w:r>
+      <w:r>
+        <w:t>allow</w:t>
+      </w:r>
+      <w:r>
+        <w:t>s</w:t>
+      </w:r>
+      <w:r>
+        <w:t xml:space="preserve"> K9 to destroy a wall using his laser.</w:t>
+      </w:r>
+    </w:p>
+    <w:p>
+      <w:pPr>
+        <w:pStyle w:val="Heading3"/>
+      </w:pPr>
+      <w:r>
+        <w:t>Implementation</w:t>
+      </w:r>
+    </w:p>
+    <w:p>
+      <w:r>
+        <w:t>Destructible walls are implemented using a new tile type</w:t>
+      </w:r>
+      <w:r>
+        <w:t>: DESTRUCTIBLE_WALL.  The level editor was updated to allow tiles to be tagged using the new tile type.</w:t>
+      </w:r>
+    </w:p>
+    <w:p>
+      <w:r>
+        <w:t xml:space="preserve">The laser hit testing code was then updated to detect destructible walls.  If the laser hits a destructible wall the </w:t>
+      </w:r>
+      <w:r>
+        <w:t xml:space="preserve">wall’s </w:t>
+      </w:r>
+      <w:r>
+        <w:t xml:space="preserve">strength is reduced, and if </w:t>
+      </w:r>
+      <w:r>
+        <w:t xml:space="preserve">this </w:t>
+      </w:r>
+      <w:r>
+        <w:t xml:space="preserve">reaches zero, the </w:t>
+      </w:r>
+      <w:r>
+        <w:t xml:space="preserve">wall </w:t>
+      </w:r>
+      <w:r>
+        <w:t xml:space="preserve">tile is </w:t>
+      </w:r>
+      <w:r>
+        <w:t xml:space="preserve">destroyed by </w:t>
+      </w:r>
+      <w:r>
+        <w:t>convert</w:t>
+      </w:r>
+      <w:r>
+        <w:t>ing it</w:t>
+      </w:r>
+      <w:r>
+        <w:t xml:space="preserve"> to a blank tile</w:t>
+      </w:r>
+      <w:r>
+        <w:t>.  Otherwise, t</w:t>
+      </w:r>
+      <w:r>
+        <w:t xml:space="preserve">he </w:t>
+      </w:r>
+      <w:r>
+        <w:t xml:space="preserve">wall </w:t>
+      </w:r>
+      <w:r>
+        <w:t>tile is drawn the next frame with a ‘lasered’ effect applied.</w:t>
+      </w:r>
+    </w:p>
+    <w:p>
+      <w:r>
+        <w:t xml:space="preserve">A new </w:t>
+      </w:r>
+      <w:r>
+        <w:rPr>
+          <w:b/>
+          <w:bCs/>
+          <w:i/>
+          <w:iCs/>
+        </w:rPr>
+        <w:t>drawTile</w:t>
+      </w:r>
+      <w:r>
+        <w:t xml:space="preserve"> routine was created to draw a tile, with or without a laser effect applied.  This replaces the existing </w:t>
+      </w:r>
+      <w:r>
+        <w:rPr>
+          <w:b/>
+          <w:bCs/>
+          <w:i/>
+          <w:iCs/>
+        </w:rPr>
+        <w:t>drawBlankTile</w:t>
+      </w:r>
+      <w:r>
+        <w:t xml:space="preserve"> routine.</w:t>
+      </w:r>
+    </w:p>
+    <w:p>
+      <w:r>
+        <w:t xml:space="preserve">The following </w:t>
+      </w:r>
+      <w:r>
+        <w:t xml:space="preserve">zero-page variables are used to track the current destructible wall’s strength and redraw properties: </w:t>
+      </w:r>
+      <w:r>
+        <w:t>TBD</w:t>
+      </w:r>
+    </w:p>
+    <w:p>
+      <w:pPr>
         <w:pStyle w:val="Heading1"/>
       </w:pPr>
       <w:r>
@@ -21692,81 +21645,78 @@
         <w:pStyle w:val="Heading2"/>
       </w:pPr>
       <w:r>
+        <w:t>M</w:t>
+      </w:r>
+      <w:r>
+        <w:t xml:space="preserve">emory </w:t>
+      </w:r>
+      <w:r>
+        <w:t>usage and layout</w:t>
+      </w:r>
+    </w:p>
+    <w:p>
+      <w:r>
+        <w:t xml:space="preserve">This </w:t>
+      </w:r>
+      <w:r>
+        <w:t xml:space="preserve">section </w:t>
+      </w:r>
+      <w:r>
+        <w:t>describe</w:t>
+      </w:r>
+      <w:r>
+        <w:t>s</w:t>
+      </w:r>
+      <w:r>
+        <w:t xml:space="preserve"> the game’s memory layout, which was designed for a disc version of the game, where levels </w:t>
+      </w:r>
+      <w:r>
+        <w:t>are</w:t>
+      </w:r>
+      <w:r>
+        <w:t xml:space="preserve"> loaded/reloaded from disc.</w:t>
+      </w:r>
+    </w:p>
+    <w:p>
+      <w:r>
+        <w:t>The limited memory on the BBC micro creates a lot of challenges, so finding ways to eke out and repurpose memory is essential.  Thankfully, there are great resources online that help here.</w:t>
+      </w:r>
+      <w:r>
+        <w:t xml:space="preserve">  The Elite </w:t>
+      </w:r>
+      <w:r>
+        <w:t xml:space="preserve">documentation </w:t>
+      </w:r>
+      <w:r>
+        <w:t xml:space="preserve">by </w:t>
+      </w:r>
+      <w:r>
+        <w:t>Mark Moxon</w:t>
+      </w:r>
+      <w:r>
+        <w:t xml:space="preserve"> </w:t>
+      </w:r>
+      <w:r>
+        <w:t xml:space="preserve">is </w:t>
+      </w:r>
+      <w:r>
+        <w:t>noteworthy</w:t>
+      </w:r>
+      <w:r>
+        <w:t>.</w:t>
+      </w:r>
+    </w:p>
+    <w:p>
+      <w:r>
+        <w:t>The memory layout evolved during the development of the game, with allocations moved as needed.  This section shows the current layout.</w:t>
+      </w:r>
+    </w:p>
+    <w:p>
+      <w:pPr>
+        <w:pStyle w:val="Heading3"/>
+      </w:pPr>
+      <w:r>
         <w:lastRenderedPageBreak/>
-        <w:t>M</w:t>
-      </w:r>
-      <w:r>
-        <w:t xml:space="preserve">emory </w:t>
-      </w:r>
-      <w:r>
-        <w:t>usage and layout</w:t>
-      </w:r>
-    </w:p>
-    <w:p>
-      <w:r>
-        <w:t xml:space="preserve">This </w:t>
-      </w:r>
-      <w:r>
-        <w:t xml:space="preserve">section </w:t>
-      </w:r>
-      <w:r>
-        <w:t>describe</w:t>
-      </w:r>
-      <w:r>
-        <w:t>s</w:t>
-      </w:r>
-      <w:r>
-        <w:t xml:space="preserve"> the game’s memory layout, which was designed for a disc version of the game, where levels </w:t>
-      </w:r>
-      <w:r>
-        <w:t>are</w:t>
-      </w:r>
-      <w:r>
-        <w:t xml:space="preserve"> loaded/reloaded from disc.</w:t>
-      </w:r>
-    </w:p>
-    <w:p>
-      <w:r>
-        <w:t>The limited memory on the BBC micro creates a lot of challenges, so finding ways to eke out and repurpose memory is essential.  Thankfully, there are great resources online that help here.</w:t>
-      </w:r>
-      <w:r>
-        <w:t xml:space="preserve">  The Elite </w:t>
-      </w:r>
-      <w:r>
-        <w:t xml:space="preserve">documentation </w:t>
-      </w:r>
-      <w:r>
-        <w:t xml:space="preserve">by </w:t>
-      </w:r>
-      <w:r>
-        <w:t>Mark Moxon</w:t>
-      </w:r>
-      <w:r>
-        <w:t xml:space="preserve"> </w:t>
-      </w:r>
-      <w:r>
-        <w:t xml:space="preserve">is </w:t>
-      </w:r>
-      <w:r>
-        <w:t>noteworthy</w:t>
-      </w:r>
-      <w:r>
-        <w:t>.</w:t>
-      </w:r>
-    </w:p>
-    <w:p>
-      <w:r>
-        <w:t>The memory layout evolved during the development of the game, with allocations moved as needed.</w:t>
-      </w:r>
-      <w:r>
-        <w:t xml:space="preserve">  This section shows the current layout.</w:t>
-      </w:r>
-    </w:p>
-    <w:p>
-      <w:pPr>
-        <w:pStyle w:val="Heading3"/>
-      </w:pPr>
-      <w:r>
         <w:t>Game play</w:t>
       </w:r>
     </w:p>
@@ -22882,7 +22832,6 @@
               <w:jc w:val="center"/>
             </w:pPr>
             <w:r>
-              <w:lastRenderedPageBreak/>
               <w:t>1100</w:t>
             </w:r>
           </w:p>
@@ -23261,6 +23210,7 @@
         </w:numPr>
       </w:pPr>
       <w:r>
+        <w:lastRenderedPageBreak/>
         <w:t xml:space="preserve">Blue rows depict memory MOS and DFS uses but </w:t>
       </w:r>
       <w:r>
@@ -24090,7 +24040,6 @@
               <w:jc w:val="center"/>
             </w:pPr>
             <w:r>
-              <w:lastRenderedPageBreak/>
               <w:t>60</w:t>
             </w:r>
             <w:r>
@@ -24359,6 +24308,7 @@
     </w:p>
     <w:p>
       <w:r>
+        <w:lastRenderedPageBreak/>
         <w:t>The light blue row</w:t>
       </w:r>
       <w:r>
@@ -24985,7 +24935,6 @@
               <w:jc w:val="center"/>
             </w:pPr>
             <w:r>
-              <w:lastRenderedPageBreak/>
               <w:t>40</w:t>
             </w:r>
             <w:r>
@@ -25294,16 +25243,7 @@
         <w:br/>
       </w:r>
       <w:r>
-        <w:t xml:space="preserve">A level file is </w:t>
-      </w:r>
-      <w:r>
-        <w:t xml:space="preserve">simply loaded at </w:t>
-      </w:r>
-      <w:r>
-        <w:t>address &amp;30B0</w:t>
-      </w:r>
-      <w:r>
-        <w:t>, populating the memory space as depicted by the white, gray, and light blue rows</w:t>
+        <w:t>A level file is simply loaded at address &amp;30B0, populating the memory space as depicted by the white, gray, and light blue rows</w:t>
       </w:r>
       <w:r>
         <w:t xml:space="preserve"> abo</w:t>
@@ -25314,6 +25254,7 @@
     </w:p>
     <w:p>
       <w:r>
+        <w:lastRenderedPageBreak/>
         <w:t>The white and grey rows are identical to how memory is arranged during game titles and startup.</w:t>
       </w:r>
     </w:p>
@@ -25907,7 +25848,6 @@
         </w:numPr>
       </w:pPr>
       <w:r>
-        <w:lastRenderedPageBreak/>
         <w:t xml:space="preserve">Broad clipping is performed </w:t>
       </w:r>
       <w:r>
@@ -26016,6 +25956,7 @@
         </w:numPr>
       </w:pPr>
       <w:r>
+        <w:lastRenderedPageBreak/>
         <w:t xml:space="preserve">Used an optimized </w:t>
       </w:r>
       <w:r>
@@ -26214,7 +26155,6 @@
       <w:r>
         <w:t xml:space="preserve">Removed </w:t>
       </w:r>
-      <w:proofErr w:type="spellStart"/>
       <w:r>
         <w:rPr>
           <w:i/>
@@ -26222,11 +26162,9 @@
         </w:rPr>
         <w:t>objectWidth</w:t>
       </w:r>
-      <w:proofErr w:type="spellEnd"/>
       <w:r>
         <w:t xml:space="preserve"> &amp; </w:t>
       </w:r>
-      <w:proofErr w:type="spellStart"/>
       <w:r>
         <w:rPr>
           <w:i/>
@@ -26234,7 +26172,6 @@
         </w:rPr>
         <w:t>objectHeight</w:t>
       </w:r>
-      <w:proofErr w:type="spellEnd"/>
       <w:r>
         <w:t xml:space="preserve"> arrays</w:t>
       </w:r>
@@ -26264,7 +26201,6 @@
       <w:r>
         <w:t xml:space="preserve">, </w:t>
       </w:r>
-      <w:proofErr w:type="spellStart"/>
       <w:r>
         <w:rPr>
           <w:i/>
@@ -26272,14 +26208,12 @@
         </w:rPr>
         <w:t>widthMinusOne</w:t>
       </w:r>
-      <w:proofErr w:type="spellEnd"/>
       <w:r>
         <w:t xml:space="preserve">, </w:t>
       </w:r>
       <w:r>
         <w:t xml:space="preserve">and </w:t>
       </w:r>
-      <w:proofErr w:type="spellStart"/>
       <w:r>
         <w:rPr>
           <w:i/>
@@ -26287,7 +26221,6 @@
         </w:rPr>
         <w:t>heightMinusOne</w:t>
       </w:r>
-      <w:proofErr w:type="spellEnd"/>
       <w:r>
         <w:t xml:space="preserve">.  </w:t>
       </w:r>
@@ -26309,7 +26242,6 @@
       <w:r>
         <w:t xml:space="preserve"> which were previously subtracting one from </w:t>
       </w:r>
-      <w:proofErr w:type="spellStart"/>
       <w:r>
         <w:rPr>
           <w:i/>
@@ -26317,11 +26249,9 @@
         </w:rPr>
         <w:t>objectWidth</w:t>
       </w:r>
-      <w:proofErr w:type="spellEnd"/>
       <w:r>
         <w:t xml:space="preserve"> &amp; </w:t>
       </w:r>
-      <w:proofErr w:type="spellStart"/>
       <w:r>
         <w:rPr>
           <w:i/>
@@ -26343,7 +26273,6 @@
         </w:rPr>
         <w:t>ght</w:t>
       </w:r>
-      <w:proofErr w:type="spellEnd"/>
       <w:r>
         <w:t xml:space="preserve">.  </w:t>
       </w:r>
@@ -26359,7 +26288,6 @@
       <w:r>
         <w:t xml:space="preserve">Bit-packed </w:t>
       </w:r>
-      <w:proofErr w:type="spellStart"/>
       <w:r>
         <w:rPr>
           <w:i/>
@@ -26367,11 +26295,9 @@
         </w:rPr>
         <w:t>objectType</w:t>
       </w:r>
-      <w:proofErr w:type="spellEnd"/>
       <w:r>
         <w:t xml:space="preserve"> and </w:t>
       </w:r>
-      <w:proofErr w:type="spellStart"/>
       <w:r>
         <w:rPr>
           <w:i/>
@@ -26379,7 +26305,6 @@
         </w:rPr>
         <w:t>objectState</w:t>
       </w:r>
-      <w:proofErr w:type="spellEnd"/>
       <w:r>
         <w:t xml:space="preserve"> array</w:t>
       </w:r>
@@ -26510,7 +26435,6 @@
         </w:numPr>
       </w:pPr>
       <w:r>
-        <w:lastRenderedPageBreak/>
         <w:t>Only c</w:t>
       </w:r>
       <w:r>
@@ -26669,6 +26593,7 @@
         </w:numPr>
       </w:pPr>
       <w:r>
+        <w:lastRenderedPageBreak/>
         <w:t>Used conditional branching whenever possible, instead of jumps.</w:t>
       </w:r>
       <w:r>
@@ -26719,7 +26644,6 @@
       <w:r>
         <w:t xml:space="preserve">JMP </w:t>
       </w:r>
-      <w:proofErr w:type="spellStart"/>
       <w:r>
         <w:rPr>
           <w:i/>
@@ -26728,13 +26652,8 @@
         <w:t>xxx</w:t>
       </w:r>
       <w:r>
-        <w:t>x</w:t>
-      </w:r>
-      <w:proofErr w:type="spellEnd"/>
-      <w:r>
-        <w:t xml:space="preserve"> instead of JSR </w:t>
-      </w:r>
-      <w:proofErr w:type="spellStart"/>
+        <w:t xml:space="preserve">x instead of JSR </w:t>
+      </w:r>
       <w:r>
         <w:rPr>
           <w:i/>
@@ -26742,7 +26661,6 @@
         </w:rPr>
         <w:t>xxxx</w:t>
       </w:r>
-      <w:proofErr w:type="spellEnd"/>
       <w:r>
         <w:t xml:space="preserve">, </w:t>
       </w:r>
@@ -26918,7 +26836,6 @@
       <w:r>
         <w:t xml:space="preserve"> and </w:t>
       </w:r>
-      <w:proofErr w:type="spellStart"/>
       <w:r>
         <w:rPr>
           <w:i/>
@@ -26926,7 +26843,6 @@
         </w:rPr>
         <w:t>dalekAnimate</w:t>
       </w:r>
-      <w:proofErr w:type="spellEnd"/>
       <w:r>
         <w:t xml:space="preserve"> routines do this.</w:t>
       </w:r>
@@ -27069,18 +26985,8 @@
           <w:sz w:val="18"/>
           <w:szCs w:val="18"/>
         </w:rPr>
-        <w:t xml:space="preserve"> </w:t>
-      </w:r>
-      <w:proofErr w:type="spellStart"/>
-      <w:r>
-        <w:rPr>
-          <w:rFonts w:ascii="Cascadia Code" w:hAnsi="Cascadia Code"/>
-          <w:sz w:val="18"/>
-          <w:szCs w:val="18"/>
-        </w:rPr>
-        <w:t>Bh</w:t>
-      </w:r>
-      <w:proofErr w:type="spellEnd"/>
+        <w:t xml:space="preserve"> Bh</w:t>
+      </w:r>
       <w:r>
         <w:rPr>
           <w:rFonts w:ascii="Cascadia Code" w:hAnsi="Cascadia Code"/>
@@ -27185,7 +27091,6 @@
       <w:r>
         <w:t xml:space="preserve">Routines always define a new scope (a wonderful </w:t>
       </w:r>
-      <w:proofErr w:type="spellStart"/>
       <w:r>
         <w:rPr>
           <w:b/>
@@ -27195,14 +27100,12 @@
         </w:rPr>
         <w:t>BeebAsm</w:t>
       </w:r>
-      <w:proofErr w:type="spellEnd"/>
       <w:r>
         <w:t xml:space="preserve"> feature) to limit the scope of contained labels and local data. Nested scopes are not used.</w:t>
       </w:r>
     </w:p>
     <w:p>
       <w:r>
-        <w:lastRenderedPageBreak/>
         <w:t xml:space="preserve">Control flow </w:t>
       </w:r>
       <w:r>
@@ -27437,6 +27340,7 @@
     </w:p>
     <w:p>
       <w:r>
+        <w:lastRenderedPageBreak/>
         <w:t xml:space="preserve">The accumulator is </w:t>
       </w:r>
       <w:r>
@@ -27830,108 +27734,108 @@
     </w:p>
     <w:p>
       <w:r>
+        <w:t>And unlike many 1980’s games, t</w:t>
+      </w:r>
+      <w:r>
+        <w:t xml:space="preserve">he player </w:t>
+      </w:r>
+      <w:r>
+        <w:t xml:space="preserve">direction </w:t>
+      </w:r>
+      <w:r>
+        <w:t xml:space="preserve">keys </w:t>
+      </w:r>
+      <w:r>
+        <w:t xml:space="preserve">are </w:t>
+      </w:r>
+      <w:r>
+        <w:t>W</w:t>
+      </w:r>
+      <w:r>
+        <w:t>ASD</w:t>
+      </w:r>
+      <w:r>
+        <w:t>.</w:t>
+      </w:r>
+    </w:p>
+    <w:p>
+      <w:r>
+        <w:t>Locked doors and keys are used to add a puzzle element to the game.</w:t>
+      </w:r>
+      <w:r>
+        <w:t xml:space="preserve">  Key</w:t>
+      </w:r>
+      <w:r>
+        <w:t>s</w:t>
+      </w:r>
+      <w:r>
+        <w:t xml:space="preserve"> can be collected and then used to </w:t>
+      </w:r>
+      <w:r>
+        <w:t xml:space="preserve">pass </w:t>
+      </w:r>
+      <w:r>
+        <w:t xml:space="preserve">through </w:t>
+      </w:r>
+      <w:r>
+        <w:t xml:space="preserve">locked </w:t>
+      </w:r>
+      <w:r>
+        <w:t xml:space="preserve">doors, </w:t>
+      </w:r>
+      <w:r>
+        <w:t>after which they are used.</w:t>
+      </w:r>
+      <w:r>
+        <w:t xml:space="preserve">  </w:t>
+      </w:r>
+      <w:r>
+        <w:t xml:space="preserve">Doors stay unlocked until a Darek uses them.  </w:t>
+      </w:r>
+      <w:r>
+        <w:t>Alternatively</w:t>
+      </w:r>
+      <w:r>
+        <w:t xml:space="preserve">, </w:t>
+      </w:r>
+      <w:r>
+        <w:t xml:space="preserve">K9 can follow a Dalek </w:t>
+      </w:r>
+      <w:r>
+        <w:t>through a door.</w:t>
+      </w:r>
+    </w:p>
+    <w:p>
+      <w:r>
+        <w:t>Other</w:t>
+      </w:r>
+      <w:r>
+        <w:t xml:space="preserve"> puzzle element</w:t>
+      </w:r>
+      <w:r>
+        <w:t>s</w:t>
+      </w:r>
+      <w:r>
+        <w:t xml:space="preserve"> of the game </w:t>
+      </w:r>
+      <w:r>
+        <w:t xml:space="preserve">include getting a Dalek to follow K9, and then hiding K9 behind a door, blocking a Dalek from using an elevator for a specific amount of time, </w:t>
+      </w:r>
+      <w:r>
+        <w:t>and using a Dalek to hide from another one.</w:t>
+      </w:r>
+    </w:p>
+    <w:p>
+      <w:r>
+        <w:t>To hold the attention of the player, each level can have its own palette and sprite definitions.</w:t>
+      </w:r>
+      <w:r>
+        <w:t xml:space="preserve">  The relative strength of jewels and Daleks can also be configured.</w:t>
+      </w:r>
+    </w:p>
+    <w:p>
+      <w:r>
         <w:lastRenderedPageBreak/>
-        <w:t>And unlike many 1980’s games, t</w:t>
-      </w:r>
-      <w:r>
-        <w:t xml:space="preserve">he player </w:t>
-      </w:r>
-      <w:r>
-        <w:t xml:space="preserve">direction </w:t>
-      </w:r>
-      <w:r>
-        <w:t xml:space="preserve">keys </w:t>
-      </w:r>
-      <w:r>
-        <w:t xml:space="preserve">are </w:t>
-      </w:r>
-      <w:r>
-        <w:t>W</w:t>
-      </w:r>
-      <w:r>
-        <w:t>ASD</w:t>
-      </w:r>
-      <w:r>
-        <w:t>.</w:t>
-      </w:r>
-    </w:p>
-    <w:p>
-      <w:r>
-        <w:t>Locked doors and keys are used to add a puzzle element to the game.</w:t>
-      </w:r>
-      <w:r>
-        <w:t xml:space="preserve">  Key</w:t>
-      </w:r>
-      <w:r>
-        <w:t>s</w:t>
-      </w:r>
-      <w:r>
-        <w:t xml:space="preserve"> can be collected and then used to </w:t>
-      </w:r>
-      <w:r>
-        <w:t xml:space="preserve">pass </w:t>
-      </w:r>
-      <w:r>
-        <w:t xml:space="preserve">through </w:t>
-      </w:r>
-      <w:r>
-        <w:t xml:space="preserve">locked </w:t>
-      </w:r>
-      <w:r>
-        <w:t xml:space="preserve">doors, </w:t>
-      </w:r>
-      <w:r>
-        <w:t>after which they are used.</w:t>
-      </w:r>
-      <w:r>
-        <w:t xml:space="preserve">  </w:t>
-      </w:r>
-      <w:r>
-        <w:t xml:space="preserve">Doors stay unlocked until a Darek uses them.  </w:t>
-      </w:r>
-      <w:r>
-        <w:t>Alternatively</w:t>
-      </w:r>
-      <w:r>
-        <w:t xml:space="preserve">, </w:t>
-      </w:r>
-      <w:r>
-        <w:t xml:space="preserve">K9 can follow a Dalek </w:t>
-      </w:r>
-      <w:r>
-        <w:t>through a door.</w:t>
-      </w:r>
-    </w:p>
-    <w:p>
-      <w:r>
-        <w:t>Other</w:t>
-      </w:r>
-      <w:r>
-        <w:t xml:space="preserve"> puzzle element</w:t>
-      </w:r>
-      <w:r>
-        <w:t>s</w:t>
-      </w:r>
-      <w:r>
-        <w:t xml:space="preserve"> of the game </w:t>
-      </w:r>
-      <w:r>
-        <w:t xml:space="preserve">include getting a Dalek to follow K9, and then hiding K9 behind a door, blocking a Dalek from using an elevator for a specific amount of time, </w:t>
-      </w:r>
-      <w:r>
-        <w:t>and using a Dalek to hide from another one.</w:t>
-      </w:r>
-    </w:p>
-    <w:p>
-      <w:r>
-        <w:t>To hold the attention of the player, each level can have its own palette and sprite definitions.</w:t>
-      </w:r>
-      <w:r>
-        <w:t xml:space="preserve">  The relative strength of jewels and Daleks can also be configured.</w:t>
-      </w:r>
-    </w:p>
-    <w:p>
-      <w:r>
         <w:t xml:space="preserve">Teleports were later added to allow K9 to </w:t>
       </w:r>
       <w:proofErr w:type="gramStart"/>
@@ -28046,20 +27950,20 @@
         <w:t>Page grids</w:t>
       </w:r>
       <w:r>
-        <w:t xml:space="preserve">.  Early in the development of the game I came up with a level model that allowed for an arbitrary arrangement of pages.  From a data structure perspective, the model was simple and provided for a wide range of interesting level topologies.  </w:t>
+        <w:t xml:space="preserve">.  Early in the development of the game I came up with a level model that allowed for an arbitrary arrangement of pages.  From a data structure perspective, the model was simple and provided for a wide range of interesting level topologies.  However, any code that traversed tiles had to deal with potential page boundaries.  The mistake I made was not realizing that choosing such a data structure would require that I adopt an abstraction (function-based or macro-based) to traverse it, which was something I was </w:t>
+      </w:r>
+      <w:r>
+        <w:t xml:space="preserve">not </w:t>
+      </w:r>
+      <w:r>
+        <w:t xml:space="preserve">willing </w:t>
+      </w:r>
+      <w:r>
+        <w:t xml:space="preserve">to do.  In trying to avoid this I ended up with complex code in several key areas of functionality… drawing tile strips when scrolling, collision detection, laser hit detection, and elevator operations.  After spending considerable time fixing several nasty bugs, I stepped back and asked myself if the benefits of the page grid design outweighed all the added code complexity.  I concluded it wasn’t and removed the page grid, opting instead to go with a single large rectangular tile grid which could be either 16x128, 32x64, 64x32, </w:t>
       </w:r>
       <w:r>
         <w:lastRenderedPageBreak/>
-        <w:t xml:space="preserve">However, any code that traversed tiles had to deal with potential page boundaries.  The mistake I made was not realizing that choosing such a data structure would require that I adopt an abstraction (function-based or macro-based) to traverse it, which was something I was </w:t>
-      </w:r>
-      <w:r>
-        <w:t xml:space="preserve">not </w:t>
-      </w:r>
-      <w:r>
-        <w:t xml:space="preserve">willing </w:t>
-      </w:r>
-      <w:r>
-        <w:t>to do.  In trying to avoid this I ended up with complex code in several key areas of functionality… drawing tile strips when scrolling, collision detection, laser hit detection, and elevator operations.  After spending considerable time fixing several nasty bugs, I stepped back and asked myself if the benefits of the page grid design outweighed all the added code complexity.  I concluded it wasn’t and removed the page grid, opting instead to go with a single large rectangular tile grid which could be either 16x128, 32x64, 64x32, or 128x16 tiles in size.  The change resulted in a significant reduction in code size, and much simpler tile traversal logic throughout the code base.</w:t>
+        <w:t>or 128x16 tiles in size.  The change resulted in a significant reduction in code size, and much simpler tile traversal logic throughout the code base.</w:t>
       </w:r>
     </w:p>
     <w:p>
@@ -28104,15 +28008,7 @@
         <w:t xml:space="preserve"> </w:t>
       </w:r>
       <w:r>
-        <w:t xml:space="preserve">1 overlays, rendering the graphics and text directly over the gameplay screen.  To do this I needed to write custom </w:t>
-      </w:r>
-      <w:proofErr w:type="spellStart"/>
-      <w:r>
-        <w:t>drawText</w:t>
-      </w:r>
-      <w:proofErr w:type="spellEnd"/>
-      <w:r>
-        <w:t xml:space="preserve"> routines that used the MOS’s character definitions stored at &amp;8000.  Although this worked well, the draw code took up precious bytes and I was forced to</w:t>
+        <w:t>1 overlays, rendering the graphics and text directly over the gameplay screen.  To do this I needed to write custom drawText routines that used the MOS’s character definitions stored at &amp;8000.  Although this worked well, the draw code took up precious bytes and I was forced to</w:t>
       </w:r>
       <w:r>
         <w:t xml:space="preserve"> </w:t>
@@ -28358,7 +28254,6 @@
         <w:pStyle w:val="Heading2"/>
       </w:pPr>
       <w:r>
-        <w:lastRenderedPageBreak/>
         <w:t>Resources</w:t>
       </w:r>
     </w:p>
@@ -28421,16 +28316,8 @@
           <w:rPr>
             <w:rStyle w:val="Hyperlink"/>
           </w:rPr>
-          <w:t>mdfs.net/Docs/Comp/BBC/</w:t>
+          <w:t>mdfs.net/Docs/Comp/BBC/AllMem</w:t>
         </w:r>
-        <w:proofErr w:type="spellStart"/>
-        <w:r>
-          <w:rPr>
-            <w:rStyle w:val="Hyperlink"/>
-          </w:rPr>
-          <w:t>AllMem</w:t>
-        </w:r>
-        <w:proofErr w:type="spellEnd"/>
       </w:hyperlink>
     </w:p>
     <w:p>
@@ -28448,20 +28335,13 @@
           <w:rPr>
             <w:rStyle w:val="Hyperlink"/>
           </w:rPr>
-          <w:t>mdfs.net/Docs/Comp/BBC/Disk/</w:t>
+          <w:t>mdfs.net/Docs/Comp/BBC/Disk/DFSMem</w:t>
         </w:r>
-        <w:proofErr w:type="spellStart"/>
-        <w:r>
-          <w:rPr>
-            <w:rStyle w:val="Hyperlink"/>
-          </w:rPr>
-          <w:t>DFSMem</w:t>
-        </w:r>
-        <w:proofErr w:type="spellEnd"/>
       </w:hyperlink>
     </w:p>
     <w:p>
       <w:r>
+        <w:lastRenderedPageBreak/>
         <w:t xml:space="preserve">Elite disc </w:t>
       </w:r>
       <w:r>
@@ -28495,7 +28375,7 @@
     <mc:AlternateContent>
       <mc:Choice Requires="v">
         <w:pict>
-          <v:shapetype w14:anchorId="2F93A398" id="_x0000_t75" coordsize="21600,21600" o:spt="75" o:preferrelative="t" path="m@4@5l@4@11@9@11@9@5xe" filled="f" stroked="f">
+          <v:shapetype w14:anchorId="6110DF57" id="_x0000_t75" coordsize="21600,21600" o:spt="75" o:preferrelative="t" path="m@4@5l@4@11@9@11@9@5xe" filled="f" stroked="f">
             <v:stroke joinstyle="miter"/>
             <v:formulas>
               <v:f eqn="if lineDrawn pixelLineWidth 0"/>
@@ -28521,10 +28401,10 @@
       </mc:Choice>
       <mc:Fallback>
         <w:drawing>
-          <wp:inline distT="0" distB="0" distL="0" distR="0" wp14:anchorId="20CA04A3" wp14:editId="0120B417">
+          <wp:inline distT="0" distB="0" distL="0" distR="0" wp14:anchorId="3E69E836" wp14:editId="7FFE3854">
             <wp:extent cx="194650" cy="145988"/>
             <wp:effectExtent l="0" t="0" r="0" b="6985"/>
-            <wp:docPr id="1015689231" name="Picture 1"/>
+            <wp:docPr id="297005148" name="Picture 1"/>
             <wp:cNvGraphicFramePr>
               <a:graphicFrameLocks xmlns:a="http://schemas.openxmlformats.org/drawingml/2006/main" noChangeAspect="1"/>
             </wp:cNvGraphicFramePr>
@@ -28562,17 +28442,17 @@
     <mc:AlternateContent>
       <mc:Choice Requires="v">
         <w:pict>
-          <v:shape w14:anchorId="2772AABF" id="Picture 1" o:spid="_x0000_i1025" type="#_x0000_t75" style="width:15.7pt;height:11.75pt;visibility:visible;mso-wrap-style:square">
+          <v:shape w14:anchorId="61919558" id="Picture 1" o:spid="_x0000_i1025" type="#_x0000_t75" style="width:15.7pt;height:11.75pt;visibility:visible;mso-wrap-style:square">
             <v:imagedata r:id="rId3" o:title=""/>
           </v:shape>
         </w:pict>
       </mc:Choice>
       <mc:Fallback>
         <w:drawing>
-          <wp:inline distT="0" distB="0" distL="0" distR="0" wp14:anchorId="5EA985C9" wp14:editId="287E490A">
+          <wp:inline distT="0" distB="0" distL="0" distR="0" wp14:anchorId="56C3F11D" wp14:editId="3605D674">
             <wp:extent cx="199177" cy="149383"/>
             <wp:effectExtent l="0" t="0" r="0" b="3175"/>
-            <wp:docPr id="894842258" name="Picture 1"/>
+            <wp:docPr id="75788734" name="Picture 1"/>
             <wp:cNvGraphicFramePr>
               <a:graphicFrameLocks xmlns:a="http://schemas.openxmlformats.org/drawingml/2006/main" noChangeAspect="1"/>
             </wp:cNvGraphicFramePr>
@@ -31254,6 +31134,95 @@
     </w:lvl>
   </w:abstractNum>
   <w:abstractNum w:abstractNumId="25" w15:restartNumberingAfterBreak="0">
+    <w:nsid w:val="73EF61E6"/>
+    <w:multiLevelType w:val="hybridMultilevel"/>
+    <w:tmpl w:val="99B8CF16"/>
+    <w:lvl w:ilvl="0" w:tplc="04090011">
+      <w:start w:val="1"/>
+      <w:numFmt w:val="decimal"/>
+      <w:lvlText w:val="%1)"/>
+      <w:lvlJc w:val="left"/>
+      <w:pPr>
+        <w:ind w:left="720" w:hanging="360"/>
+      </w:pPr>
+      <w:rPr>
+        <w:rFonts w:hint="default"/>
+      </w:rPr>
+    </w:lvl>
+    <w:lvl w:ilvl="1" w:tplc="04090019" w:tentative="1">
+      <w:start w:val="1"/>
+      <w:numFmt w:val="lowerLetter"/>
+      <w:lvlText w:val="%2."/>
+      <w:lvlJc w:val="left"/>
+      <w:pPr>
+        <w:ind w:left="1440" w:hanging="360"/>
+      </w:pPr>
+    </w:lvl>
+    <w:lvl w:ilvl="2" w:tplc="0409001B" w:tentative="1">
+      <w:start w:val="1"/>
+      <w:numFmt w:val="lowerRoman"/>
+      <w:lvlText w:val="%3."/>
+      <w:lvlJc w:val="right"/>
+      <w:pPr>
+        <w:ind w:left="2160" w:hanging="180"/>
+      </w:pPr>
+    </w:lvl>
+    <w:lvl w:ilvl="3" w:tplc="0409000F" w:tentative="1">
+      <w:start w:val="1"/>
+      <w:numFmt w:val="decimal"/>
+      <w:lvlText w:val="%4."/>
+      <w:lvlJc w:val="left"/>
+      <w:pPr>
+        <w:ind w:left="2880" w:hanging="360"/>
+      </w:pPr>
+    </w:lvl>
+    <w:lvl w:ilvl="4" w:tplc="04090019" w:tentative="1">
+      <w:start w:val="1"/>
+      <w:numFmt w:val="lowerLetter"/>
+      <w:lvlText w:val="%5."/>
+      <w:lvlJc w:val="left"/>
+      <w:pPr>
+        <w:ind w:left="3600" w:hanging="360"/>
+      </w:pPr>
+    </w:lvl>
+    <w:lvl w:ilvl="5" w:tplc="0409001B" w:tentative="1">
+      <w:start w:val="1"/>
+      <w:numFmt w:val="lowerRoman"/>
+      <w:lvlText w:val="%6."/>
+      <w:lvlJc w:val="right"/>
+      <w:pPr>
+        <w:ind w:left="4320" w:hanging="180"/>
+      </w:pPr>
+    </w:lvl>
+    <w:lvl w:ilvl="6" w:tplc="0409000F" w:tentative="1">
+      <w:start w:val="1"/>
+      <w:numFmt w:val="decimal"/>
+      <w:lvlText w:val="%7."/>
+      <w:lvlJc w:val="left"/>
+      <w:pPr>
+        <w:ind w:left="5040" w:hanging="360"/>
+      </w:pPr>
+    </w:lvl>
+    <w:lvl w:ilvl="7" w:tplc="04090019" w:tentative="1">
+      <w:start w:val="1"/>
+      <w:numFmt w:val="lowerLetter"/>
+      <w:lvlText w:val="%8."/>
+      <w:lvlJc w:val="left"/>
+      <w:pPr>
+        <w:ind w:left="5760" w:hanging="360"/>
+      </w:pPr>
+    </w:lvl>
+    <w:lvl w:ilvl="8" w:tplc="0409001B" w:tentative="1">
+      <w:start w:val="1"/>
+      <w:numFmt w:val="lowerRoman"/>
+      <w:lvlText w:val="%9."/>
+      <w:lvlJc w:val="right"/>
+      <w:pPr>
+        <w:ind w:left="6480" w:hanging="180"/>
+      </w:pPr>
+    </w:lvl>
+  </w:abstractNum>
+  <w:abstractNum w:abstractNumId="26" w15:restartNumberingAfterBreak="0">
     <w:nsid w:val="7525577B"/>
     <w:multiLevelType w:val="hybridMultilevel"/>
     <w:tmpl w:val="B830AF46"/>
@@ -31366,7 +31335,7 @@
       </w:rPr>
     </w:lvl>
   </w:abstractNum>
-  <w:abstractNum w:abstractNumId="26" w15:restartNumberingAfterBreak="0">
+  <w:abstractNum w:abstractNumId="27" w15:restartNumberingAfterBreak="0">
     <w:nsid w:val="7ACB2100"/>
     <w:multiLevelType w:val="hybridMultilevel"/>
     <w:tmpl w:val="6BEA828E"/>
@@ -31503,7 +31472,7 @@
     <w:abstractNumId w:val="5"/>
   </w:num>
   <w:num w:numId="9" w16cid:durableId="1465924744">
-    <w:abstractNumId w:val="26"/>
+    <w:abstractNumId w:val="27"/>
   </w:num>
   <w:num w:numId="10" w16cid:durableId="320810464">
     <w:abstractNumId w:val="13"/>
@@ -31512,7 +31481,7 @@
     <w:abstractNumId w:val="20"/>
   </w:num>
   <w:num w:numId="12" w16cid:durableId="1713075570">
-    <w:abstractNumId w:val="25"/>
+    <w:abstractNumId w:val="26"/>
   </w:num>
   <w:num w:numId="13" w16cid:durableId="1666863145">
     <w:abstractNumId w:val="2"/>
@@ -31558,6 +31527,9 @@
   </w:num>
   <w:num w:numId="27" w16cid:durableId="1880436652">
     <w:abstractNumId w:val="14"/>
+  </w:num>
+  <w:num w:numId="28" w16cid:durableId="756484431">
+    <w:abstractNumId w:val="25"/>
   </w:num>
 </w:numbering>
 </file>
@@ -32162,7 +32134,6 @@
   <w:style w:type="character" w:default="1" w:styleId="DefaultParagraphFont">
     <w:name w:val="Default Paragraph Font"/>
     <w:uiPriority w:val="1"/>
-    <w:semiHidden/>
     <w:unhideWhenUsed/>
   </w:style>
   <w:style w:type="table" w:default="1" w:styleId="TableNormal">

</xml_diff>

<commit_message>
Increased switch pairing block size to 32 bytes
</commit_message>
<xml_diff>
--- a/docs/Development.docx
+++ b/docs/Development.docx
@@ -21533,10 +21533,11 @@
       <w:r>
         <w:t>.</w:t>
       </w:r>
-    </w:p>
-    <w:p>
-      <w:r>
-        <w:t>Pairing can be removed by replacing a switch, paired object, or paired tile.</w:t>
+      <w:r>
+        <w:t xml:space="preserve">  Switch pairings can be </w:t>
+      </w:r>
+      <w:r>
+        <w:t>removed by replacing a switch, paired object, or paired tile.</w:t>
       </w:r>
     </w:p>
     <w:p>
@@ -21552,7 +21553,7 @@
         <w:t xml:space="preserve">The level file format was extended to include a </w:t>
       </w:r>
       <w:r>
-        <w:t>16</w:t>
+        <w:t>32</w:t>
       </w:r>
       <w:r>
         <w:t>-</w:t>
@@ -21985,15 +21986,6 @@
           <w:i/>
           <w:iCs/>
         </w:rPr>
-        <w:t>byte-</w:t>
-      </w:r>
-      <w:r>
-        <w:rPr>
-          <w:b/>
-          <w:bCs/>
-          <w:i/>
-          <w:iCs/>
-        </w:rPr>
         <w:t>count</w:t>
       </w:r>
       <w:r>
@@ -22116,15 +22108,6 @@
           <w:i/>
           <w:iCs/>
         </w:rPr>
-        <w:t>byte-</w:t>
-      </w:r>
-      <w:r>
-        <w:rPr>
-          <w:b/>
-          <w:bCs/>
-          <w:i/>
-          <w:iCs/>
-        </w:rPr>
         <w:t>count</w:t>
       </w:r>
       <w:r>
@@ -22281,6 +22264,9 @@
       </w:r>
     </w:p>
     <w:p>
+      <w:pPr>
+        <w:ind w:left="720" w:hanging="720"/>
+      </w:pPr>
       <w:r>
         <w:tab/>
       </w:r>
@@ -22297,22 +22283,6 @@
           <w:bCs/>
           <w:i/>
           <w:iCs/>
-        </w:rPr>
-        <w:t>byte</w:t>
-      </w:r>
-      <w:r>
-        <w:rPr>
-          <w:b/>
-          <w:bCs/>
-        </w:rPr>
-        <w:t>-</w:t>
-      </w:r>
-      <w:r>
-        <w:rPr>
-          <w:b/>
-          <w:bCs/>
-          <w:i/>
-          <w:iCs/>
           <w:u w:val="single"/>
         </w:rPr>
         <w:t>count</w:t>
@@ -22331,22 +22301,79 @@
         <w:t xml:space="preserve"> is </w:t>
       </w:r>
       <w:r>
-        <w:t xml:space="preserve">the </w:t>
-      </w:r>
-      <w:r>
-        <w:t xml:space="preserve">number of subsequent </w:t>
-      </w:r>
-      <w:r>
-        <w:t>bytes</w:t>
+        <w:t xml:space="preserve">a one-byte value containing the number of </w:t>
+      </w:r>
+      <w:r>
+        <w:t>object indices or tile coordinates</w:t>
       </w:r>
       <w:r>
         <w:t>.</w:t>
       </w:r>
+    </w:p>
+    <w:p>
       <w:r>
         <w:tab/>
       </w:r>
-    </w:p>
-    <w:p>
+      <w:r>
+        <w:rPr>
+          <w:b/>
+          <w:bCs/>
+        </w:rPr>
+        <w:t>&lt;</w:t>
+      </w:r>
+      <w:r>
+        <w:rPr>
+          <w:b/>
+          <w:bCs/>
+          <w:i/>
+          <w:iCs/>
+        </w:rPr>
+        <w:t>object-index</w:t>
+      </w:r>
+      <w:r>
+        <w:rPr>
+          <w:b/>
+          <w:bCs/>
+          <w:i/>
+          <w:iCs/>
+        </w:rPr>
+        <w:t>&gt;</w:t>
+      </w:r>
+      <w:r>
+        <w:rPr>
+          <w:b/>
+          <w:bCs/>
+          <w:i/>
+          <w:iCs/>
+        </w:rPr>
+        <w:t xml:space="preserve"> </w:t>
+      </w:r>
+      <w:r>
+        <w:t xml:space="preserve">is </w:t>
+      </w:r>
+      <w:r>
+        <w:t xml:space="preserve">a one-byte value containing the </w:t>
+      </w:r>
+      <w:r>
+        <w:t>index of a</w:t>
+      </w:r>
+      <w:r>
+        <w:rPr>
+          <w:b/>
+          <w:bCs/>
+          <w:i/>
+          <w:iCs/>
+        </w:rPr>
+        <w:t xml:space="preserve"> </w:t>
+      </w:r>
+      <w:r>
+        <w:t>paired object.</w:t>
+      </w:r>
+    </w:p>
+    <w:p>
+      <w:pPr>
+        <w:ind w:left="720" w:hanging="720"/>
+      </w:pPr>
       <w:r>
         <w:tab/>
       </w:r>
@@ -22364,7 +22391,25 @@
           <w:i/>
           <w:iCs/>
         </w:rPr>
-        <w:t>object-index</w:t>
+        <w:t>tile-</w:t>
+      </w:r>
+      <w:r>
+        <w:rPr>
+          <w:b/>
+          <w:bCs/>
+          <w:i/>
+          <w:iCs/>
+        </w:rPr>
+        <w:t>x-</w:t>
+      </w:r>
+      <w:r>
+        <w:rPr>
+          <w:b/>
+          <w:bCs/>
+          <w:i/>
+          <w:iCs/>
+        </w:rPr>
+        <w:t>coord</w:t>
       </w:r>
       <w:r>
         <w:rPr>
@@ -22376,33 +22421,7 @@
         <w:t>&gt;</w:t>
       </w:r>
       <w:r>
-        <w:rPr>
-          <w:b/>
-          <w:bCs/>
-          <w:i/>
-          <w:iCs/>
-        </w:rPr>
-        <w:t xml:space="preserve"> </w:t>
-      </w:r>
-      <w:r>
-        <w:t>is the index of a</w:t>
-      </w:r>
-      <w:r>
-        <w:rPr>
-          <w:b/>
-          <w:bCs/>
-          <w:i/>
-          <w:iCs/>
-        </w:rPr>
-        <w:t xml:space="preserve"> </w:t>
-      </w:r>
-      <w:r>
-        <w:t>paired object.</w:t>
-      </w:r>
-    </w:p>
-    <w:p>
-      <w:r>
-        <w:tab/>
+        <w:t xml:space="preserve"> and </w:t>
       </w:r>
       <w:r>
         <w:rPr>
@@ -22427,7 +22446,7 @@
           <w:i/>
           <w:iCs/>
         </w:rPr>
-        <w:t>x-</w:t>
+        <w:t>y-</w:t>
       </w:r>
       <w:r>
         <w:rPr>
@@ -22448,53 +22467,13 @@
         <w:t>&gt;</w:t>
       </w:r>
       <w:r>
-        <w:t xml:space="preserve"> and </w:t>
-      </w:r>
-      <w:r>
-        <w:rPr>
-          <w:b/>
-          <w:bCs/>
-        </w:rPr>
-        <w:t>&lt;</w:t>
-      </w:r>
-      <w:r>
-        <w:rPr>
-          <w:b/>
-          <w:bCs/>
-          <w:i/>
-          <w:iCs/>
-        </w:rPr>
-        <w:t>tile-</w:t>
-      </w:r>
-      <w:r>
-        <w:rPr>
-          <w:b/>
-          <w:bCs/>
-          <w:i/>
-          <w:iCs/>
-        </w:rPr>
-        <w:t>y-</w:t>
-      </w:r>
-      <w:r>
-        <w:rPr>
-          <w:b/>
-          <w:bCs/>
-          <w:i/>
-          <w:iCs/>
-        </w:rPr>
-        <w:t>coord</w:t>
-      </w:r>
-      <w:r>
-        <w:rPr>
-          <w:b/>
-          <w:bCs/>
-          <w:i/>
-          <w:iCs/>
-        </w:rPr>
-        <w:t>&gt;</w:t>
-      </w:r>
-      <w:r>
-        <w:t xml:space="preserve"> are the tile coordinates of a paired tile.</w:t>
+        <w:t xml:space="preserve"> are </w:t>
+      </w:r>
+      <w:r>
+        <w:t xml:space="preserve">two-byte values containing the level X and Y coordinates of </w:t>
+      </w:r>
+      <w:r>
+        <w:t>a paired tile.</w:t>
       </w:r>
     </w:p>
     <w:p>
@@ -29293,7 +29272,7 @@
     <mc:AlternateContent>
       <mc:Choice Requires="v">
         <w:pict>
-          <v:shapetype w14:anchorId="29EEAC8B" id="_x0000_t75" coordsize="21600,21600" o:spt="75" o:preferrelative="t" path="m@4@5l@4@11@9@11@9@5xe" filled="f" stroked="f">
+          <v:shapetype w14:anchorId="34B911AE" id="_x0000_t75" coordsize="21600,21600" o:spt="75" o:preferrelative="t" path="m@4@5l@4@11@9@11@9@5xe" filled="f" stroked="f">
             <v:stroke joinstyle="miter"/>
             <v:formulas>
               <v:f eqn="if lineDrawn pixelLineWidth 0"/>
@@ -29319,10 +29298,10 @@
       </mc:Choice>
       <mc:Fallback>
         <w:drawing>
-          <wp:inline distT="0" distB="0" distL="0" distR="0" wp14:anchorId="03EF4361" wp14:editId="0CF88D93">
+          <wp:inline distT="0" distB="0" distL="0" distR="0" wp14:anchorId="00F16194" wp14:editId="47390943">
             <wp:extent cx="194650" cy="145988"/>
             <wp:effectExtent l="0" t="0" r="0" b="6985"/>
-            <wp:docPr id="61786065" name="Picture 1"/>
+            <wp:docPr id="1728379990" name="Picture 1"/>
             <wp:cNvGraphicFramePr>
               <a:graphicFrameLocks xmlns:a="http://schemas.openxmlformats.org/drawingml/2006/main" noChangeAspect="1"/>
             </wp:cNvGraphicFramePr>
@@ -29360,17 +29339,17 @@
     <mc:AlternateContent>
       <mc:Choice Requires="v">
         <w:pict>
-          <v:shape w14:anchorId="3BC2812E" id="Picture 1" o:spid="_x0000_i1025" type="#_x0000_t75" style="width:15.7pt;height:11.75pt;visibility:visible;mso-wrap-style:square">
+          <v:shape w14:anchorId="4A2D8C45" id="Picture 1" o:spid="_x0000_i1025" type="#_x0000_t75" style="width:15.7pt;height:11.75pt;visibility:visible;mso-wrap-style:square">
             <v:imagedata r:id="rId3" o:title=""/>
           </v:shape>
         </w:pict>
       </mc:Choice>
       <mc:Fallback>
         <w:drawing>
-          <wp:inline distT="0" distB="0" distL="0" distR="0" wp14:anchorId="365BEFC2" wp14:editId="0009B787">
+          <wp:inline distT="0" distB="0" distL="0" distR="0" wp14:anchorId="72252668" wp14:editId="163F4BA2">
             <wp:extent cx="199177" cy="149383"/>
             <wp:effectExtent l="0" t="0" r="0" b="3175"/>
-            <wp:docPr id="1073250660" name="Picture 1"/>
+            <wp:docPr id="1773288237" name="Picture 1"/>
             <wp:cNvGraphicFramePr>
               <a:graphicFrameLocks xmlns:a="http://schemas.openxmlformats.org/drawingml/2006/main" noChangeAspect="1"/>
             </wp:cNvGraphicFramePr>

</xml_diff>

<commit_message>
Added sound effect for switches and destructible tiles
</commit_message>
<xml_diff>
--- a/docs/Development.docx
+++ b/docs/Development.docx
@@ -14408,7 +14408,7 @@
               <w:cnfStyle w:val="000000000000" w:firstRow="0" w:lastRow="0" w:firstColumn="0" w:lastColumn="0" w:oddVBand="0" w:evenVBand="0" w:oddHBand="0" w:evenHBand="0" w:firstRowFirstColumn="0" w:firstRowLastColumn="0" w:lastRowFirstColumn="0" w:lastRowLastColumn="0"/>
             </w:pPr>
             <w:r>
-              <w:t>No</w:t>
+              <w:t>Yes</w:t>
             </w:r>
           </w:p>
         </w:tc>
@@ -20166,7 +20166,10 @@
         <w:t>Another great suggestion</w:t>
       </w:r>
       <w:r>
-        <w:t>, which I liked, was the idea of adding teleports which would allow K9 to move around within a level in a non-linear way.</w:t>
+        <w:t xml:space="preserve"> </w:t>
+      </w:r>
+      <w:r>
+        <w:t>was the idea of adding teleports which would allow K9 to move around within a level in a non-linear way.</w:t>
       </w:r>
     </w:p>
     <w:p>
@@ -21304,7 +21307,10 @@
         <w:t>memory</w:t>
       </w:r>
       <w:r>
-        <w:t xml:space="preserve"> available.  Another feature could be implemented!</w:t>
+        <w:t xml:space="preserve"> available.  Another feature could be implemented</w:t>
+      </w:r>
+      <w:r>
+        <w:t>.</w:t>
       </w:r>
     </w:p>
     <w:p>
@@ -24731,7 +24737,7 @@
               <w:cnfStyle w:val="000000000000" w:firstRow="0" w:lastRow="0" w:firstColumn="0" w:lastColumn="0" w:oddVBand="0" w:evenVBand="0" w:oddHBand="0" w:evenHBand="0" w:firstRowFirstColumn="0" w:firstRowLastColumn="0" w:lastRowFirstColumn="0" w:lastRowLastColumn="0"/>
             </w:pPr>
             <w:r>
-              <w:t>16</w:t>
+              <w:t>32</w:t>
             </w:r>
           </w:p>
         </w:tc>
@@ -24751,7 +24757,7 @@
               <w:jc w:val="center"/>
             </w:pPr>
             <w:r>
-              <w:t>TBD</w:t>
+              <w:t>4103</w:t>
             </w:r>
           </w:p>
         </w:tc>
@@ -24797,7 +24803,13 @@
               <w:jc w:val="center"/>
             </w:pPr>
             <w:r>
-              <w:t>4F63</w:t>
+              <w:t>4F</w:t>
+            </w:r>
+            <w:r>
+              <w:t>8</w:t>
+            </w:r>
+            <w:r>
+              <w:t>3</w:t>
             </w:r>
           </w:p>
         </w:tc>
@@ -24826,7 +24838,10 @@
               <w:cnfStyle w:val="000000000000" w:firstRow="0" w:lastRow="0" w:firstColumn="0" w:lastColumn="0" w:oddVBand="0" w:evenVBand="0" w:oddHBand="0" w:evenHBand="0" w:firstRowFirstColumn="0" w:firstRowLastColumn="0" w:lastRowFirstColumn="0" w:lastRowLastColumn="0"/>
             </w:pPr>
             <w:r>
-              <w:t>1668</w:t>
+              <w:t>1</w:t>
+            </w:r>
+            <w:r>
+              <w:t>753</w:t>
             </w:r>
           </w:p>
         </w:tc>
@@ -24846,7 +24861,10 @@
               <w:jc w:val="center"/>
             </w:pPr>
             <w:r>
-              <w:t>55E7</w:t>
+              <w:t>5</w:t>
+            </w:r>
+            <w:r>
+              <w:t>65C</w:t>
             </w:r>
           </w:p>
         </w:tc>
@@ -24896,7 +24914,10 @@
               <w:t>5</w:t>
             </w:r>
             <w:r>
-              <w:t>633</w:t>
+              <w:t>6</w:t>
+            </w:r>
+            <w:r>
+              <w:t>A8</w:t>
             </w:r>
           </w:p>
         </w:tc>
@@ -24957,7 +24978,7 @@
               <w:t>60</w:t>
             </w:r>
             <w:r>
-              <w:t>82</w:t>
+              <w:t>F7</w:t>
             </w:r>
           </w:p>
         </w:tc>
@@ -25508,10 +25529,7 @@
               <w:jc w:val="center"/>
             </w:pPr>
             <w:r>
-              <w:t>3</w:t>
-            </w:r>
-            <w:r>
-              <w:t>0B0</w:t>
+              <w:t>20B0</w:t>
             </w:r>
           </w:p>
         </w:tc>
@@ -25873,7 +25891,7 @@
               <w:cnfStyle w:val="000000000000" w:firstRow="0" w:lastRow="0" w:firstColumn="0" w:lastColumn="0" w:oddVBand="0" w:evenVBand="0" w:oddHBand="0" w:evenHBand="0" w:firstRowFirstColumn="0" w:firstRowLastColumn="0" w:lastRowFirstColumn="0" w:lastRowLastColumn="0"/>
             </w:pPr>
             <w:r>
-              <w:t>16</w:t>
+              <w:t>32</w:t>
             </w:r>
           </w:p>
         </w:tc>
@@ -25893,10 +25911,7 @@
               <w:jc w:val="center"/>
             </w:pPr>
             <w:r>
-              <w:t>40</w:t>
-            </w:r>
-            <w:r>
-              <w:t>E3</w:t>
+              <w:t>4103</w:t>
             </w:r>
           </w:p>
         </w:tc>
@@ -25942,7 +25957,13 @@
               <w:jc w:val="center"/>
             </w:pPr>
             <w:r>
-              <w:t>4F63</w:t>
+              <w:t>4F</w:t>
+            </w:r>
+            <w:r>
+              <w:t>8</w:t>
+            </w:r>
+            <w:r>
+              <w:t>3</w:t>
             </w:r>
           </w:p>
         </w:tc>
@@ -25974,7 +25995,7 @@
               <w:cnfStyle w:val="000000000000" w:firstRow="0" w:lastRow="0" w:firstColumn="0" w:lastColumn="0" w:oddVBand="0" w:evenVBand="0" w:oddHBand="0" w:evenHBand="0" w:firstRowFirstColumn="0" w:firstRowLastColumn="0" w:lastRowFirstColumn="0" w:lastRowLastColumn="0"/>
             </w:pPr>
             <w:r>
-              <w:t>1668</w:t>
+              <w:t>1753</w:t>
             </w:r>
           </w:p>
         </w:tc>
@@ -25994,7 +26015,10 @@
               <w:jc w:val="center"/>
             </w:pPr>
             <w:r>
-              <w:t>55E7</w:t>
+              <w:t>5</w:t>
+            </w:r>
+            <w:r>
+              <w:t>65C</w:t>
             </w:r>
           </w:p>
         </w:tc>
@@ -26047,7 +26071,7 @@
               <w:t>5</w:t>
             </w:r>
             <w:r>
-              <w:t>633</w:t>
+              <w:t>6A8</w:t>
             </w:r>
           </w:p>
         </w:tc>
@@ -26379,7 +26403,10 @@
               <w:jc w:val="center"/>
             </w:pPr>
             <w:r>
-              <w:t>55E7</w:t>
+              <w:t>5</w:t>
+            </w:r>
+            <w:r>
+              <w:t>65C</w:t>
             </w:r>
           </w:p>
         </w:tc>
@@ -26428,10 +26455,10 @@
               <w:jc w:val="center"/>
             </w:pPr>
             <w:r>
-              <w:t>55</w:t>
-            </w:r>
-            <w:r>
-              <w:t>33</w:t>
+              <w:t>5</w:t>
+            </w:r>
+            <w:r>
+              <w:t>6A8</w:t>
             </w:r>
           </w:p>
         </w:tc>
@@ -26480,7 +26507,7 @@
               <w:t>60</w:t>
             </w:r>
             <w:r>
-              <w:t>82</w:t>
+              <w:t>F7</w:t>
             </w:r>
           </w:p>
         </w:tc>
@@ -29272,7 +29299,7 @@
     <mc:AlternateContent>
       <mc:Choice Requires="v">
         <w:pict>
-          <v:shapetype w14:anchorId="34B911AE" id="_x0000_t75" coordsize="21600,21600" o:spt="75" o:preferrelative="t" path="m@4@5l@4@11@9@11@9@5xe" filled="f" stroked="f">
+          <v:shapetype w14:anchorId="2AC2804C" id="_x0000_t75" coordsize="21600,21600" o:spt="75" o:preferrelative="t" path="m@4@5l@4@11@9@11@9@5xe" filled="f" stroked="f">
             <v:stroke joinstyle="miter"/>
             <v:formulas>
               <v:f eqn="if lineDrawn pixelLineWidth 0"/>
@@ -29298,10 +29325,10 @@
       </mc:Choice>
       <mc:Fallback>
         <w:drawing>
-          <wp:inline distT="0" distB="0" distL="0" distR="0" wp14:anchorId="00F16194" wp14:editId="47390943">
+          <wp:inline distT="0" distB="0" distL="0" distR="0" wp14:anchorId="662F0D5D" wp14:editId="36208A32">
             <wp:extent cx="194650" cy="145988"/>
             <wp:effectExtent l="0" t="0" r="0" b="6985"/>
-            <wp:docPr id="1728379990" name="Picture 1"/>
+            <wp:docPr id="1354057702" name="Picture 1"/>
             <wp:cNvGraphicFramePr>
               <a:graphicFrameLocks xmlns:a="http://schemas.openxmlformats.org/drawingml/2006/main" noChangeAspect="1"/>
             </wp:cNvGraphicFramePr>
@@ -29339,17 +29366,17 @@
     <mc:AlternateContent>
       <mc:Choice Requires="v">
         <w:pict>
-          <v:shape w14:anchorId="4A2D8C45" id="Picture 1" o:spid="_x0000_i1025" type="#_x0000_t75" style="width:15.7pt;height:11.75pt;visibility:visible;mso-wrap-style:square">
+          <v:shape w14:anchorId="68C7AE2C" id="Picture 1" o:spid="_x0000_i1025" type="#_x0000_t75" style="width:15.7pt;height:11.75pt;visibility:visible;mso-wrap-style:square">
             <v:imagedata r:id="rId3" o:title=""/>
           </v:shape>
         </w:pict>
       </mc:Choice>
       <mc:Fallback>
         <w:drawing>
-          <wp:inline distT="0" distB="0" distL="0" distR="0" wp14:anchorId="72252668" wp14:editId="163F4BA2">
+          <wp:inline distT="0" distB="0" distL="0" distR="0" wp14:anchorId="19626434" wp14:editId="6EAACFAB">
             <wp:extent cx="199177" cy="149383"/>
             <wp:effectExtent l="0" t="0" r="0" b="3175"/>
-            <wp:docPr id="1773288237" name="Picture 1"/>
+            <wp:docPr id="1956432355" name="Picture 1"/>
             <wp:cNvGraphicFramePr>
               <a:graphicFrameLocks xmlns:a="http://schemas.openxmlformats.org/drawingml/2006/main" noChangeAspect="1"/>
             </wp:cNvGraphicFramePr>

</xml_diff>

<commit_message>
Updated docs, level 1 and 3
</commit_message>
<xml_diff>
--- a/docs/Development.docx
+++ b/docs/Development.docx
@@ -473,6 +473,7 @@
       <w:r>
         <w:t xml:space="preserve"> </w:t>
       </w:r>
+      <w:proofErr w:type="spellStart"/>
       <w:r>
         <w:rPr>
           <w:b/>
@@ -482,6 +483,7 @@
         </w:rPr>
         <w:t>BeebAsm</w:t>
       </w:r>
+      <w:proofErr w:type="spellEnd"/>
       <w:r>
         <w:t>, an excellent assembler th</w:t>
       </w:r>
@@ -491,6 +493,7 @@
       <w:r>
         <w:t xml:space="preserve">I could use on Windows to produce an SSD, which I could then run in </w:t>
       </w:r>
+      <w:proofErr w:type="spellStart"/>
       <w:r>
         <w:rPr>
           <w:b/>
@@ -501,6 +504,7 @@
         <w:lastRenderedPageBreak/>
         <w:t>BeebEm</w:t>
       </w:r>
+      <w:proofErr w:type="spellEnd"/>
       <w:r>
         <w:t>, an emulator</w:t>
       </w:r>
@@ -626,6 +630,7 @@
       <w:r>
         <w:t xml:space="preserve">After looking at some examples that were installed with </w:t>
       </w:r>
+      <w:proofErr w:type="spellStart"/>
       <w:r>
         <w:rPr>
           <w:b/>
@@ -635,6 +640,7 @@
         </w:rPr>
         <w:t>BeebAsm</w:t>
       </w:r>
+      <w:proofErr w:type="spellEnd"/>
       <w:r>
         <w:t xml:space="preserve">, I </w:t>
       </w:r>
@@ -769,6 +775,7 @@
       <w:r>
         <w:t xml:space="preserve">The prototype was based on </w:t>
       </w:r>
+      <w:proofErr w:type="spellStart"/>
       <w:r>
         <w:rPr>
           <w:b/>
@@ -787,6 +794,7 @@
         </w:rPr>
         <w:t>’s</w:t>
       </w:r>
+      <w:proofErr w:type="spellEnd"/>
       <w:r>
         <w:t xml:space="preserve"> </w:t>
       </w:r>
@@ -2497,6 +2505,7 @@
       <w:r>
         <w:t xml:space="preserve"> and </w:t>
       </w:r>
+      <w:proofErr w:type="spellStart"/>
       <w:r>
         <w:rPr>
           <w:b/>
@@ -2515,6 +2524,7 @@
         </w:rPr>
         <w:t>lekAnimate</w:t>
       </w:r>
+      <w:proofErr w:type="spellEnd"/>
       <w:r>
         <w:t xml:space="preserve"> </w:t>
       </w:r>
@@ -2841,6 +2851,7 @@
       <w:r>
         <w:t xml:space="preserve"> using the </w:t>
       </w:r>
+      <w:proofErr w:type="spellStart"/>
       <w:r>
         <w:rPr>
           <w:b/>
@@ -2855,7 +2866,15 @@
           <w:b/>
           <w:bCs/>
         </w:rPr>
-        <w:t xml:space="preserve">’s </w:t>
+        <w:t>’s</w:t>
+      </w:r>
+      <w:proofErr w:type="spellEnd"/>
+      <w:r>
+        <w:rPr>
+          <w:b/>
+          <w:bCs/>
+        </w:rPr>
+        <w:t xml:space="preserve"> </w:t>
       </w:r>
       <w:r>
         <w:rPr>
@@ -4511,6 +4530,7 @@
           <w:bCs/>
         </w:rPr>
       </w:pPr>
+      <w:proofErr w:type="spellStart"/>
       <w:r>
         <w:rPr>
           <w:b/>
@@ -4518,6 +4538,7 @@
         </w:rPr>
         <w:t>objectXLo</w:t>
       </w:r>
+      <w:proofErr w:type="spellEnd"/>
       <w:r>
         <w:rPr>
           <w:b/>
@@ -4525,6 +4546,7 @@
         </w:rPr>
         <w:t xml:space="preserve"> &amp; </w:t>
       </w:r>
+      <w:proofErr w:type="spellStart"/>
       <w:r>
         <w:rPr>
           <w:b/>
@@ -4532,6 +4554,7 @@
         </w:rPr>
         <w:t>objectXHi</w:t>
       </w:r>
+      <w:proofErr w:type="spellEnd"/>
       <w:r>
         <w:rPr>
           <w:b/>
@@ -4564,28 +4587,39 @@
           <w:bCs/>
         </w:rPr>
       </w:pPr>
+      <w:proofErr w:type="spellStart"/>
       <w:r>
         <w:rPr>
           <w:b/>
           <w:bCs/>
         </w:rPr>
         <w:lastRenderedPageBreak/>
-        <w:t xml:space="preserve">objectYLo </w:t>
-      </w:r>
+        <w:t>objectYLo</w:t>
+      </w:r>
+      <w:proofErr w:type="spellEnd"/>
       <w:r>
         <w:rPr>
           <w:b/>
           <w:bCs/>
         </w:rPr>
-        <w:t xml:space="preserve">&amp; </w:t>
+        <w:t xml:space="preserve"> </w:t>
       </w:r>
       <w:r>
         <w:rPr>
           <w:b/>
           <w:bCs/>
         </w:rPr>
+        <w:t xml:space="preserve">&amp; </w:t>
+      </w:r>
+      <w:proofErr w:type="spellStart"/>
+      <w:r>
+        <w:rPr>
+          <w:b/>
+          <w:bCs/>
+        </w:rPr>
         <w:t>objectYHi</w:t>
       </w:r>
+      <w:proofErr w:type="spellEnd"/>
       <w:r>
         <w:rPr>
           <w:b/>
@@ -4621,13 +4655,31 @@
           <w:bCs/>
         </w:rPr>
       </w:pPr>
+      <w:proofErr w:type="spellStart"/>
       <w:r>
         <w:rPr>
           <w:b/>
           <w:bCs/>
         </w:rPr>
-        <w:t>objectWidth &amp; objectHeight</w:t>
-      </w:r>
+        <w:t>objectWidth</w:t>
+      </w:r>
+      <w:proofErr w:type="spellEnd"/>
+      <w:r>
+        <w:rPr>
+          <w:b/>
+          <w:bCs/>
+        </w:rPr>
+        <w:t xml:space="preserve"> &amp; </w:t>
+      </w:r>
+      <w:proofErr w:type="spellStart"/>
+      <w:r>
+        <w:rPr>
+          <w:b/>
+          <w:bCs/>
+        </w:rPr>
+        <w:t>objectHeight</w:t>
+      </w:r>
+      <w:proofErr w:type="spellEnd"/>
       <w:r>
         <w:rPr>
           <w:b/>
@@ -4654,6 +4706,7 @@
           <w:bCs/>
         </w:rPr>
       </w:pPr>
+      <w:proofErr w:type="spellStart"/>
       <w:r>
         <w:rPr>
           <w:b/>
@@ -4661,6 +4714,7 @@
         </w:rPr>
         <w:t>objectAnimation</w:t>
       </w:r>
+      <w:proofErr w:type="spellEnd"/>
       <w:r>
         <w:rPr>
           <w:b/>
@@ -4693,6 +4747,7 @@
           <w:bCs/>
         </w:rPr>
       </w:pPr>
+      <w:proofErr w:type="spellStart"/>
       <w:r>
         <w:rPr>
           <w:b/>
@@ -4700,6 +4755,7 @@
         </w:rPr>
         <w:t>objectState</w:t>
       </w:r>
+      <w:proofErr w:type="spellEnd"/>
       <w:r>
         <w:rPr>
           <w:b/>
@@ -4791,6 +4847,7 @@
           <w:bCs/>
         </w:rPr>
       </w:pPr>
+      <w:proofErr w:type="spellStart"/>
       <w:r>
         <w:rPr>
           <w:b/>
@@ -4798,6 +4855,7 @@
         </w:rPr>
         <w:t>objectSpriteIndex</w:t>
       </w:r>
+      <w:proofErr w:type="spellEnd"/>
       <w:r>
         <w:rPr>
           <w:b/>
@@ -4832,13 +4890,31 @@
           <w:numId w:val="8"/>
         </w:numPr>
       </w:pPr>
+      <w:proofErr w:type="spellStart"/>
       <w:r>
         <w:rPr>
           <w:b/>
           <w:bCs/>
         </w:rPr>
-        <w:t>objectFrameCallbackLo &amp; objectFrameCallbackHi</w:t>
-      </w:r>
+        <w:t>objectFrameCallbackLo</w:t>
+      </w:r>
+      <w:proofErr w:type="spellEnd"/>
+      <w:r>
+        <w:rPr>
+          <w:b/>
+          <w:bCs/>
+        </w:rPr>
+        <w:t xml:space="preserve"> &amp; </w:t>
+      </w:r>
+      <w:proofErr w:type="spellStart"/>
+      <w:r>
+        <w:rPr>
+          <w:b/>
+          <w:bCs/>
+        </w:rPr>
+        <w:t>objectFrameCallbackHi</w:t>
+      </w:r>
+      <w:proofErr w:type="spellEnd"/>
       <w:r>
         <w:rPr>
           <w:b/>
@@ -4886,6 +4962,7 @@
           <w:bCs/>
         </w:rPr>
       </w:pPr>
+      <w:proofErr w:type="spellStart"/>
       <w:r>
         <w:rPr>
           <w:b/>
@@ -4893,6 +4970,7 @@
         </w:rPr>
         <w:t>objectFrameCounter</w:t>
       </w:r>
+      <w:proofErr w:type="spellEnd"/>
       <w:r>
         <w:rPr>
           <w:b/>
@@ -6194,6 +6272,7 @@
       <w:r>
         <w:t xml:space="preserve">setting </w:t>
       </w:r>
+      <w:proofErr w:type="spellStart"/>
       <w:r>
         <w:rPr>
           <w:i/>
@@ -6215,6 +6294,7 @@
         </w:rPr>
         <w:t>Addr</w:t>
       </w:r>
+      <w:proofErr w:type="spellEnd"/>
       <w:r>
         <w:t xml:space="preserve"> </w:t>
       </w:r>
@@ -6314,6 +6394,7 @@
       <w:r>
         <w:t xml:space="preserve">in the low nibble of </w:t>
       </w:r>
+      <w:proofErr w:type="spellStart"/>
       <w:r>
         <w:rPr>
           <w:i/>
@@ -6321,6 +6402,7 @@
         </w:rPr>
         <w:t>objectState</w:t>
       </w:r>
+      <w:proofErr w:type="spellEnd"/>
       <w:r>
         <w:t xml:space="preserve"> array</w:t>
       </w:r>
@@ -6587,6 +6669,7 @@
       <w:r>
         <w:t xml:space="preserve"> </w:t>
       </w:r>
+      <w:proofErr w:type="spellStart"/>
       <w:r>
         <w:rPr>
           <w:i/>
@@ -6594,6 +6677,7 @@
         </w:rPr>
         <w:t>clearTile</w:t>
       </w:r>
+      <w:proofErr w:type="spellEnd"/>
       <w:r>
         <w:t xml:space="preserve"> </w:t>
       </w:r>
@@ -6608,6 +6692,7 @@
       <w:r>
         <w:t xml:space="preserve">The </w:t>
       </w:r>
+      <w:proofErr w:type="spellStart"/>
       <w:r>
         <w:rPr>
           <w:i/>
@@ -6615,6 +6700,7 @@
         </w:rPr>
         <w:t>clearTile</w:t>
       </w:r>
+      <w:proofErr w:type="spellEnd"/>
       <w:r>
         <w:t xml:space="preserve"> </w:t>
       </w:r>
@@ -7296,7 +7382,15 @@
         <w:t>the elevator stops.</w:t>
       </w:r>
       <w:r>
-        <w:t xml:space="preserve">  The objectFrameCount is repurposed for this.</w:t>
+        <w:t xml:space="preserve">  The </w:t>
+      </w:r>
+      <w:proofErr w:type="spellStart"/>
+      <w:r>
+        <w:t>objectFrameCount</w:t>
+      </w:r>
+      <w:proofErr w:type="spellEnd"/>
+      <w:r>
+        <w:t xml:space="preserve"> is repurposed for this.</w:t>
       </w:r>
     </w:p>
     <w:p>
@@ -7308,7 +7402,15 @@
         </w:numPr>
       </w:pPr>
       <w:r>
-        <w:t xml:space="preserve">Mark K9 and the elevator game objects as both ascending or descending by populating their respective objectState’s </w:t>
+        <w:t xml:space="preserve">Mark K9 and the elevator game objects as both ascending or descending by populating their respective </w:t>
+      </w:r>
+      <w:proofErr w:type="spellStart"/>
+      <w:r>
+        <w:t>objectState’s</w:t>
+      </w:r>
+      <w:proofErr w:type="spellEnd"/>
+      <w:r>
+        <w:t xml:space="preserve"> </w:t>
       </w:r>
       <w:r>
         <w:rPr>
@@ -7692,6 +7794,7 @@
       <w:r>
         <w:t xml:space="preserve">stored in </w:t>
       </w:r>
+      <w:proofErr w:type="spellStart"/>
       <w:r>
         <w:rPr>
           <w:i/>
@@ -7700,6 +7803,7 @@
         </w:rPr>
         <w:t>objectFrameCounter</w:t>
       </w:r>
+      <w:proofErr w:type="spellEnd"/>
       <w:r>
         <w:t xml:space="preserve"> variable</w:t>
       </w:r>
@@ -7863,6 +7967,7 @@
       <w:r>
         <w:t xml:space="preserve">checking the erase-above and erase-below </w:t>
       </w:r>
+      <w:proofErr w:type="spellStart"/>
       <w:r>
         <w:rPr>
           <w:i/>
@@ -7877,6 +7982,7 @@
         </w:rPr>
         <w:t>’s</w:t>
       </w:r>
+      <w:proofErr w:type="spellEnd"/>
       <w:r>
         <w:t xml:space="preserve"> render flags</w:t>
       </w:r>
@@ -8474,6 +8580,7 @@
       <w:r>
         <w:t xml:space="preserve">A zero-page </w:t>
       </w:r>
+      <w:proofErr w:type="spellStart"/>
       <w:r>
         <w:rPr>
           <w:i/>
@@ -8481,6 +8588,7 @@
         </w:rPr>
         <w:t>laserFrameCount</w:t>
       </w:r>
+      <w:proofErr w:type="spellEnd"/>
       <w:r>
         <w:t xml:space="preserve"> variable was introduced which controls laser rendering.  </w:t>
       </w:r>
@@ -8508,6 +8616,7 @@
       <w:r>
         <w:t xml:space="preserve">sets </w:t>
       </w:r>
+      <w:proofErr w:type="spellStart"/>
       <w:r>
         <w:rPr>
           <w:i/>
@@ -8515,6 +8624,7 @@
         </w:rPr>
         <w:t>laserFrameCount</w:t>
       </w:r>
+      <w:proofErr w:type="spellEnd"/>
       <w:r>
         <w:rPr>
           <w:i/>
@@ -8531,6 +8641,7 @@
       <w:r>
         <w:t xml:space="preserve">and </w:t>
       </w:r>
+      <w:proofErr w:type="spellStart"/>
       <w:r>
         <w:rPr>
           <w:i/>
@@ -8538,6 +8649,7 @@
         </w:rPr>
         <w:t>laserFrameCount</w:t>
       </w:r>
+      <w:proofErr w:type="spellEnd"/>
       <w:r>
         <w:rPr>
           <w:i/>
@@ -8588,6 +8700,7 @@
       <w:r>
         <w:t xml:space="preserve">the </w:t>
       </w:r>
+      <w:proofErr w:type="spellStart"/>
       <w:r>
         <w:rPr>
           <w:i/>
@@ -8595,6 +8708,7 @@
         </w:rPr>
         <w:t>objectState</w:t>
       </w:r>
+      <w:proofErr w:type="spellEnd"/>
       <w:r>
         <w:t xml:space="preserve"> variable</w:t>
       </w:r>
@@ -8698,6 +8812,7 @@
       <w:r>
         <w:t xml:space="preserve"> above. This is the fourth render flag in the high nibble of the </w:t>
       </w:r>
+      <w:proofErr w:type="spellStart"/>
       <w:r>
         <w:rPr>
           <w:i/>
@@ -8705,6 +8820,7 @@
         </w:rPr>
         <w:t>objectState</w:t>
       </w:r>
+      <w:proofErr w:type="spellEnd"/>
       <w:r>
         <w:t xml:space="preserve"> variable.</w:t>
       </w:r>
@@ -8828,6 +8944,7 @@
       <w:r>
         <w:t xml:space="preserve"> </w:t>
       </w:r>
+      <w:proofErr w:type="spellStart"/>
       <w:r>
         <w:rPr>
           <w:i/>
@@ -8835,6 +8952,7 @@
         </w:rPr>
         <w:t>debugTileGridFlags</w:t>
       </w:r>
+      <w:proofErr w:type="spellEnd"/>
       <w:r>
         <w:t xml:space="preserve"> routine that rendered a little box </w:t>
       </w:r>
@@ -8924,6 +9042,7 @@
       <w:r>
         <w:t xml:space="preserve">to allow </w:t>
       </w:r>
+      <w:proofErr w:type="spellStart"/>
       <w:r>
         <w:rPr>
           <w:i/>
@@ -8931,6 +9050,7 @@
         </w:rPr>
         <w:t>debugTileGridFlags</w:t>
       </w:r>
+      <w:proofErr w:type="spellEnd"/>
       <w:r>
         <w:rPr>
           <w:i/>
@@ -10495,6 +10615,7 @@
       <w:r>
         <w:t xml:space="preserve">replaced </w:t>
       </w:r>
+      <w:proofErr w:type="spellStart"/>
       <w:r>
         <w:rPr>
           <w:i/>
@@ -10502,9 +10623,11 @@
         </w:rPr>
         <w:t>objectWidth</w:t>
       </w:r>
+      <w:proofErr w:type="spellEnd"/>
       <w:r>
         <w:t xml:space="preserve"> and </w:t>
       </w:r>
+      <w:proofErr w:type="spellStart"/>
       <w:r>
         <w:rPr>
           <w:i/>
@@ -10512,6 +10635,7 @@
         </w:rPr>
         <w:t>objectHeight</w:t>
       </w:r>
+      <w:proofErr w:type="spellEnd"/>
       <w:r>
         <w:t xml:space="preserve"> game </w:t>
       </w:r>
@@ -10551,6 +10675,7 @@
       <w:r>
         <w:t xml:space="preserve">, and </w:t>
       </w:r>
+      <w:proofErr w:type="spellStart"/>
       <w:r>
         <w:rPr>
           <w:i/>
@@ -10558,9 +10683,11 @@
         </w:rPr>
         <w:t>widthMinusOne</w:t>
       </w:r>
+      <w:proofErr w:type="spellEnd"/>
       <w:r>
         <w:t xml:space="preserve"> and </w:t>
       </w:r>
+      <w:proofErr w:type="spellStart"/>
       <w:r>
         <w:rPr>
           <w:i/>
@@ -10568,6 +10695,7 @@
         </w:rPr>
         <w:t>heightMinisOne</w:t>
       </w:r>
+      <w:proofErr w:type="spellEnd"/>
       <w:r>
         <w:t>.</w:t>
       </w:r>
@@ -10616,7 +10744,15 @@
         <w:t xml:space="preserve"> I </w:t>
       </w:r>
       <w:r>
-        <w:t xml:space="preserve">stored the object type in the objectAnimation game object array, </w:t>
+        <w:t xml:space="preserve">stored the object type in the </w:t>
+      </w:r>
+      <w:proofErr w:type="spellStart"/>
+      <w:r>
+        <w:t>objectAnimation</w:t>
+      </w:r>
+      <w:proofErr w:type="spellEnd"/>
+      <w:r>
+        <w:t xml:space="preserve"> game object array, </w:t>
       </w:r>
       <w:r>
         <w:t xml:space="preserve">shifting up the other values, and </w:t>
@@ -10634,8 +10770,13 @@
         <w:t xml:space="preserve">array </w:t>
       </w:r>
       <w:r>
-        <w:t>to objectType</w:t>
-      </w:r>
+        <w:t xml:space="preserve">to </w:t>
+      </w:r>
+      <w:proofErr w:type="spellStart"/>
+      <w:r>
+        <w:t>objectType</w:t>
+      </w:r>
+      <w:proofErr w:type="spellEnd"/>
       <w:r>
         <w:t>.</w:t>
       </w:r>
@@ -11435,6 +11576,7 @@
       <w:r>
         <w:t xml:space="preserve">I then wrote a </w:t>
       </w:r>
+      <w:proofErr w:type="spellStart"/>
       <w:r>
         <w:rPr>
           <w:i/>
@@ -11442,6 +11584,7 @@
         </w:rPr>
         <w:t>loadLevel</w:t>
       </w:r>
+      <w:proofErr w:type="spellEnd"/>
       <w:r>
         <w:t xml:space="preserve"> </w:t>
       </w:r>
@@ -11472,6 +11615,7 @@
       <w:r>
         <w:t xml:space="preserve">the loaded </w:t>
       </w:r>
+      <w:proofErr w:type="spellStart"/>
       <w:r>
         <w:rPr>
           <w:i/>
@@ -11479,6 +11623,7 @@
         </w:rPr>
         <w:t>initializeLevel</w:t>
       </w:r>
+      <w:proofErr w:type="spellEnd"/>
       <w:r>
         <w:t xml:space="preserve"> </w:t>
       </w:r>
@@ -11491,6 +11636,7 @@
       <w:r>
         <w:t xml:space="preserve">  A </w:t>
       </w:r>
+      <w:proofErr w:type="spellStart"/>
       <w:r>
         <w:rPr>
           <w:i/>
@@ -11498,6 +11644,7 @@
         </w:rPr>
         <w:t>showLevel</w:t>
       </w:r>
+      <w:proofErr w:type="spellEnd"/>
       <w:r>
         <w:t xml:space="preserve"> routine </w:t>
       </w:r>
@@ -11686,6 +11833,7 @@
       <w:r>
         <w:t xml:space="preserve"> a level, and a ‘R’ key handler was implemented to call the </w:t>
       </w:r>
+      <w:proofErr w:type="spellStart"/>
       <w:r>
         <w:rPr>
           <w:i/>
@@ -11693,12 +11841,14 @@
         </w:rPr>
         <w:t>loadLevel</w:t>
       </w:r>
+      <w:proofErr w:type="spellEnd"/>
       <w:r>
         <w:t xml:space="preserve"> </w:t>
       </w:r>
       <w:r>
         <w:t xml:space="preserve">routine indirectly through a </w:t>
       </w:r>
+      <w:proofErr w:type="spellStart"/>
       <w:r>
         <w:rPr>
           <w:i/>
@@ -11706,6 +11856,7 @@
         </w:rPr>
         <w:t>reloadLevel</w:t>
       </w:r>
+      <w:proofErr w:type="spellEnd"/>
       <w:r>
         <w:t xml:space="preserve"> routine.</w:t>
       </w:r>
@@ -12241,6 +12392,7 @@
       <w:r>
         <w:t xml:space="preserve"> action became </w:t>
       </w:r>
+      <w:proofErr w:type="spellStart"/>
       <w:r>
         <w:rPr>
           <w:b/>
@@ -12250,9 +12402,11 @@
         </w:rPr>
         <w:t>PursueLeft</w:t>
       </w:r>
+      <w:proofErr w:type="spellEnd"/>
       <w:r>
         <w:t xml:space="preserve">, </w:t>
       </w:r>
+      <w:proofErr w:type="spellStart"/>
       <w:r>
         <w:rPr>
           <w:b/>
@@ -12262,9 +12416,11 @@
         </w:rPr>
         <w:t>PursueRight</w:t>
       </w:r>
+      <w:proofErr w:type="spellEnd"/>
       <w:r>
         <w:t xml:space="preserve">, </w:t>
       </w:r>
+      <w:proofErr w:type="spellStart"/>
       <w:r>
         <w:rPr>
           <w:b/>
@@ -12274,12 +12430,14 @@
         </w:rPr>
         <w:t>PursueUp</w:t>
       </w:r>
+      <w:proofErr w:type="spellEnd"/>
       <w:r>
         <w:t xml:space="preserve">, </w:t>
       </w:r>
       <w:r>
         <w:t xml:space="preserve">or </w:t>
       </w:r>
+      <w:proofErr w:type="spellStart"/>
       <w:r>
         <w:rPr>
           <w:b/>
@@ -12289,6 +12447,7 @@
         </w:rPr>
         <w:t>PursueDown</w:t>
       </w:r>
+      <w:proofErr w:type="spellEnd"/>
       <w:r>
         <w:t>.</w:t>
       </w:r>
@@ -12335,6 +12494,7 @@
         </w:rPr>
         <w:tab/>
       </w:r>
+      <w:proofErr w:type="spellStart"/>
       <w:r>
         <w:rPr>
           <w:b/>
@@ -12351,11 +12511,9 @@
           <w:i/>
           <w:iCs/>
         </w:rPr>
-        <w:t xml:space="preserve">Left </w:t>
-      </w:r>
-      <w:r>
-        <w:t>and</w:t>
-      </w:r>
+        <w:t>Left</w:t>
+      </w:r>
+      <w:proofErr w:type="spellEnd"/>
       <w:r>
         <w:rPr>
           <w:b/>
@@ -12363,7 +12521,10 @@
           <w:i/>
           <w:iCs/>
         </w:rPr>
-        <w:t xml:space="preserve"> PursueRight</w:t>
+        <w:t xml:space="preserve"> </w:t>
+      </w:r>
+      <w:r>
+        <w:t>and</w:t>
       </w:r>
       <w:r>
         <w:rPr>
@@ -12374,57 +12535,7 @@
         </w:rPr>
         <w:t xml:space="preserve"> </w:t>
       </w:r>
-      <w:r>
-        <w:t xml:space="preserve"> – </w:t>
-      </w:r>
-      <w:r>
-        <w:t xml:space="preserve">Daleks </w:t>
-      </w:r>
-      <w:r>
-        <w:t>move quickly left or right</w:t>
-      </w:r>
-      <w:r>
-        <w:t>, or vice versa</w:t>
-      </w:r>
-      <w:r>
-        <w:t xml:space="preserve">. </w:t>
-      </w:r>
-      <w:r>
-        <w:t xml:space="preserve">If </w:t>
-      </w:r>
-      <w:r>
-        <w:t>a Dalek</w:t>
-      </w:r>
-      <w:r>
-        <w:t xml:space="preserve"> encounters a wall, the </w:t>
-      </w:r>
-      <w:r>
-        <w:t xml:space="preserve">Dalek </w:t>
-      </w:r>
-      <w:r>
-        <w:t>turns</w:t>
-      </w:r>
-      <w:r>
-        <w:t>,</w:t>
-      </w:r>
-      <w:r>
-        <w:t xml:space="preserve"> and the </w:t>
-      </w:r>
-      <w:r>
-        <w:t xml:space="preserve">action </w:t>
-      </w:r>
-      <w:r>
-        <w:t xml:space="preserve">is </w:t>
-      </w:r>
-      <w:r>
-        <w:t>change</w:t>
-      </w:r>
-      <w:r>
-        <w:t xml:space="preserve">d </w:t>
-      </w:r>
-      <w:r>
-        <w:t xml:space="preserve">to </w:t>
-      </w:r>
+      <w:proofErr w:type="spellStart"/>
       <w:r>
         <w:rPr>
           <w:b/>
@@ -12432,11 +12543,9 @@
           <w:i/>
           <w:iCs/>
         </w:rPr>
-        <w:t>PursueUp</w:t>
-      </w:r>
-      <w:r>
-        <w:t xml:space="preserve"> or </w:t>
-      </w:r>
+        <w:t>PursueRight</w:t>
+      </w:r>
+      <w:proofErr w:type="spellEnd"/>
       <w:r>
         <w:rPr>
           <w:b/>
@@ -12444,16 +12553,60 @@
           <w:i/>
           <w:iCs/>
         </w:rPr>
-        <w:t>PursueDown</w:t>
-      </w:r>
-      <w:r>
-        <w:t>.</w:t>
-      </w:r>
-    </w:p>
-    <w:p>
-      <w:pPr>
-        <w:ind w:left="720"/>
-      </w:pPr>
+        <w:t xml:space="preserve"> </w:t>
+      </w:r>
+      <w:r>
+        <w:t xml:space="preserve"> – </w:t>
+      </w:r>
+      <w:r>
+        <w:t xml:space="preserve">Daleks </w:t>
+      </w:r>
+      <w:r>
+        <w:t>move quickly left or right</w:t>
+      </w:r>
+      <w:r>
+        <w:t>, or vice versa</w:t>
+      </w:r>
+      <w:r>
+        <w:t xml:space="preserve">. </w:t>
+      </w:r>
+      <w:r>
+        <w:t xml:space="preserve">If </w:t>
+      </w:r>
+      <w:r>
+        <w:t>a Dalek</w:t>
+      </w:r>
+      <w:r>
+        <w:t xml:space="preserve"> encounters a wall, the </w:t>
+      </w:r>
+      <w:r>
+        <w:t xml:space="preserve">Dalek </w:t>
+      </w:r>
+      <w:r>
+        <w:t>turns</w:t>
+      </w:r>
+      <w:r>
+        <w:t>,</w:t>
+      </w:r>
+      <w:r>
+        <w:t xml:space="preserve"> and the </w:t>
+      </w:r>
+      <w:r>
+        <w:t xml:space="preserve">action </w:t>
+      </w:r>
+      <w:r>
+        <w:t xml:space="preserve">is </w:t>
+      </w:r>
+      <w:r>
+        <w:t>change</w:t>
+      </w:r>
+      <w:r>
+        <w:t xml:space="preserve">d </w:t>
+      </w:r>
+      <w:r>
+        <w:t xml:space="preserve">to </w:t>
+      </w:r>
+      <w:proofErr w:type="spellStart"/>
       <w:r>
         <w:rPr>
           <w:b/>
@@ -12461,8 +12614,13 @@
           <w:i/>
           <w:iCs/>
         </w:rPr>
-        <w:t>Pursue</w:t>
-      </w:r>
+        <w:t>PursueUp</w:t>
+      </w:r>
+      <w:proofErr w:type="spellEnd"/>
+      <w:r>
+        <w:t xml:space="preserve"> or </w:t>
+      </w:r>
+      <w:proofErr w:type="spellStart"/>
       <w:r>
         <w:rPr>
           <w:b/>
@@ -12470,11 +12628,18 @@
           <w:i/>
           <w:iCs/>
         </w:rPr>
-        <w:t xml:space="preserve">Up </w:t>
-      </w:r>
-      <w:r>
-        <w:t>and</w:t>
-      </w:r>
+        <w:t>PursueDown</w:t>
+      </w:r>
+      <w:proofErr w:type="spellEnd"/>
+      <w:r>
+        <w:t>.</w:t>
+      </w:r>
+    </w:p>
+    <w:p>
+      <w:pPr>
+        <w:ind w:left="720"/>
+      </w:pPr>
+      <w:proofErr w:type="spellStart"/>
       <w:r>
         <w:rPr>
           <w:b/>
@@ -12482,34 +12647,7 @@
           <w:i/>
           <w:iCs/>
         </w:rPr>
-        <w:t xml:space="preserve"> PursueDown </w:t>
-      </w:r>
-      <w:r>
-        <w:t xml:space="preserve"> – Daleks </w:t>
-      </w:r>
-      <w:r>
-        <w:t>move quickly left or right</w:t>
-      </w:r>
-      <w:r>
-        <w:t xml:space="preserve">, or vice versa, looking for an elevator to ride up or down. </w:t>
-      </w:r>
-      <w:r>
-        <w:t xml:space="preserve">If a Dalek encounters a wall, </w:t>
-      </w:r>
-      <w:r>
-        <w:t xml:space="preserve">the Dalek </w:t>
-      </w:r>
-      <w:r>
-        <w:t>turns,</w:t>
-      </w:r>
-      <w:r>
-        <w:t xml:space="preserve"> and the </w:t>
-      </w:r>
-      <w:r>
-        <w:t xml:space="preserve">action </w:t>
-      </w:r>
-      <w:r>
-        <w:t xml:space="preserve">is toggled between </w:t>
+        <w:t>Pursue</w:t>
       </w:r>
       <w:r>
         <w:rPr>
@@ -12518,17 +12656,9 @@
           <w:i/>
           <w:iCs/>
         </w:rPr>
-        <w:t>PursueUp</w:t>
-      </w:r>
-      <w:r>
-        <w:t xml:space="preserve"> </w:t>
-      </w:r>
-      <w:r>
-        <w:t>and</w:t>
-      </w:r>
-      <w:r>
-        <w:t xml:space="preserve"> </w:t>
-      </w:r>
+        <w:t>Up</w:t>
+      </w:r>
+      <w:proofErr w:type="spellEnd"/>
       <w:r>
         <w:rPr>
           <w:b/>
@@ -12536,8 +12666,98 @@
           <w:i/>
           <w:iCs/>
         </w:rPr>
+        <w:t xml:space="preserve"> </w:t>
+      </w:r>
+      <w:r>
+        <w:t>and</w:t>
+      </w:r>
+      <w:r>
+        <w:rPr>
+          <w:b/>
+          <w:bCs/>
+          <w:i/>
+          <w:iCs/>
+        </w:rPr>
+        <w:t xml:space="preserve"> </w:t>
+      </w:r>
+      <w:proofErr w:type="spellStart"/>
+      <w:r>
+        <w:rPr>
+          <w:b/>
+          <w:bCs/>
+          <w:i/>
+          <w:iCs/>
+        </w:rPr>
         <w:t>PursueDown</w:t>
       </w:r>
+      <w:proofErr w:type="spellEnd"/>
+      <w:r>
+        <w:rPr>
+          <w:b/>
+          <w:bCs/>
+          <w:i/>
+          <w:iCs/>
+        </w:rPr>
+        <w:t xml:space="preserve"> </w:t>
+      </w:r>
+      <w:r>
+        <w:t xml:space="preserve"> – Daleks </w:t>
+      </w:r>
+      <w:r>
+        <w:t>move quickly left or right</w:t>
+      </w:r>
+      <w:r>
+        <w:t xml:space="preserve">, or vice versa, looking for an elevator to ride up or down. </w:t>
+      </w:r>
+      <w:r>
+        <w:t xml:space="preserve">If a Dalek encounters a wall, </w:t>
+      </w:r>
+      <w:r>
+        <w:t xml:space="preserve">the Dalek </w:t>
+      </w:r>
+      <w:r>
+        <w:t>turns,</w:t>
+      </w:r>
+      <w:r>
+        <w:t xml:space="preserve"> and the </w:t>
+      </w:r>
+      <w:r>
+        <w:t xml:space="preserve">action </w:t>
+      </w:r>
+      <w:r>
+        <w:t xml:space="preserve">is toggled between </w:t>
+      </w:r>
+      <w:proofErr w:type="spellStart"/>
+      <w:r>
+        <w:rPr>
+          <w:b/>
+          <w:bCs/>
+          <w:i/>
+          <w:iCs/>
+        </w:rPr>
+        <w:t>PursueUp</w:t>
+      </w:r>
+      <w:proofErr w:type="spellEnd"/>
+      <w:r>
+        <w:t xml:space="preserve"> </w:t>
+      </w:r>
+      <w:r>
+        <w:t>and</w:t>
+      </w:r>
+      <w:r>
+        <w:t xml:space="preserve"> </w:t>
+      </w:r>
+      <w:proofErr w:type="spellStart"/>
+      <w:r>
+        <w:rPr>
+          <w:b/>
+          <w:bCs/>
+          <w:i/>
+          <w:iCs/>
+        </w:rPr>
+        <w:t>PursueDown</w:t>
+      </w:r>
+      <w:proofErr w:type="spellEnd"/>
       <w:r>
         <w:rPr>
           <w:b/>
@@ -12667,6 +12887,7 @@
       <w:r>
         <w:t xml:space="preserve">set to </w:t>
       </w:r>
+      <w:proofErr w:type="spellStart"/>
       <w:r>
         <w:rPr>
           <w:b/>
@@ -12676,9 +12897,11 @@
         </w:rPr>
         <w:t>pursueLeft</w:t>
       </w:r>
+      <w:proofErr w:type="spellEnd"/>
       <w:r>
         <w:t xml:space="preserve"> or </w:t>
       </w:r>
+      <w:proofErr w:type="spellStart"/>
       <w:r>
         <w:rPr>
           <w:b/>
@@ -12697,6 +12920,7 @@
         </w:rPr>
         <w:t>ueRight</w:t>
       </w:r>
+      <w:proofErr w:type="spellEnd"/>
       <w:r>
         <w:t>.</w:t>
       </w:r>
@@ -12706,6 +12930,7 @@
       <w:r>
         <w:t xml:space="preserve">action is set to </w:t>
       </w:r>
+      <w:proofErr w:type="spellStart"/>
       <w:r>
         <w:rPr>
           <w:b/>
@@ -12724,9 +12949,11 @@
         </w:rPr>
         <w:t>Up</w:t>
       </w:r>
+      <w:proofErr w:type="spellEnd"/>
       <w:r>
         <w:t xml:space="preserve"> or </w:t>
       </w:r>
+      <w:proofErr w:type="spellStart"/>
       <w:r>
         <w:rPr>
           <w:b/>
@@ -12745,6 +12972,7 @@
         </w:rPr>
         <w:t>Down</w:t>
       </w:r>
+      <w:proofErr w:type="spellEnd"/>
       <w:r>
         <w:t>.</w:t>
       </w:r>
@@ -13041,6 +13269,7 @@
       <w:r>
         <w:t xml:space="preserve">, </w:t>
       </w:r>
+      <w:proofErr w:type="spellStart"/>
       <w:r>
         <w:rPr>
           <w:b/>
@@ -13050,6 +13279,7 @@
         </w:rPr>
         <w:t>pursueLeft</w:t>
       </w:r>
+      <w:proofErr w:type="spellEnd"/>
       <w:r>
         <w:rPr>
           <w:b/>
@@ -13071,6 +13301,7 @@
         </w:rPr>
         <w:t xml:space="preserve"> </w:t>
       </w:r>
+      <w:proofErr w:type="spellStart"/>
       <w:r>
         <w:rPr>
           <w:b/>
@@ -13087,11 +13318,9 @@
           <w:i/>
           <w:iCs/>
         </w:rPr>
-        <w:t xml:space="preserve">Right </w:t>
-      </w:r>
-      <w:r>
-        <w:t>related</w:t>
-      </w:r>
+        <w:t>Right</w:t>
+      </w:r>
+      <w:proofErr w:type="spellEnd"/>
       <w:r>
         <w:rPr>
           <w:b/>
@@ -13102,102 +13331,7 @@
         <w:t xml:space="preserve"> </w:t>
       </w:r>
       <w:r>
-        <w:t>rules</w:t>
-      </w:r>
-      <w:r>
-        <w:t>.</w:t>
-      </w:r>
-    </w:p>
-    <w:p>
-      <w:r>
-        <w:t xml:space="preserve">I </w:t>
-      </w:r>
-      <w:r>
-        <w:t xml:space="preserve">implemented </w:t>
-      </w:r>
-      <w:r>
-        <w:t xml:space="preserve">a </w:t>
-      </w:r>
-      <w:r>
-        <w:rPr>
-          <w:i/>
-          <w:iCs/>
-        </w:rPr>
-        <w:t>dalekAI</w:t>
-      </w:r>
-      <w:r>
-        <w:t xml:space="preserve"> function that </w:t>
-      </w:r>
-      <w:r>
-        <w:t xml:space="preserve">encapsulated the </w:t>
-      </w:r>
-      <w:r>
-        <w:t xml:space="preserve">common </w:t>
-      </w:r>
-      <w:r>
-        <w:t>behavioral rules</w:t>
-      </w:r>
-      <w:r>
-        <w:t xml:space="preserve">, </w:t>
-      </w:r>
-      <w:r>
-        <w:t xml:space="preserve">running these against </w:t>
-      </w:r>
-      <w:r>
-        <w:t xml:space="preserve">each </w:t>
-      </w:r>
-      <w:r>
-        <w:t>Dalek every 16 frames.</w:t>
-      </w:r>
-      <w:r>
-        <w:t xml:space="preserve">  </w:t>
-      </w:r>
-      <w:r>
-        <w:t xml:space="preserve">It’s invoked from the game loop. </w:t>
-      </w:r>
-    </w:p>
-    <w:p>
-      <w:r>
-        <w:t xml:space="preserve">The </w:t>
-      </w:r>
-      <w:r>
-        <w:t xml:space="preserve">routine checks </w:t>
-      </w:r>
-      <w:r>
-        <w:t xml:space="preserve">to see if K9 </w:t>
-      </w:r>
-      <w:r>
-        <w:t xml:space="preserve">is </w:t>
-      </w:r>
-      <w:r>
-        <w:t>in sight</w:t>
-      </w:r>
-      <w:r>
-        <w:t xml:space="preserve"> (using a helper routine)</w:t>
-      </w:r>
-      <w:r>
-        <w:t>,</w:t>
-      </w:r>
-      <w:r>
-        <w:t xml:space="preserve"> promot</w:t>
-      </w:r>
-      <w:r>
-        <w:t>ing</w:t>
-      </w:r>
-      <w:r>
-        <w:t xml:space="preserve"> </w:t>
-      </w:r>
-      <w:r>
-        <w:t xml:space="preserve">the </w:t>
-      </w:r>
-      <w:r>
-        <w:t>Dalek’s</w:t>
-      </w:r>
-      <w:r>
-        <w:t xml:space="preserve"> </w:t>
-      </w:r>
-      <w:r>
-        <w:t xml:space="preserve">action to </w:t>
+        <w:t>related</w:t>
       </w:r>
       <w:r>
         <w:rPr>
@@ -13206,8 +13340,109 @@
           <w:i/>
           <w:iCs/>
         </w:rPr>
-        <w:t>PursueLeft</w:t>
-      </w:r>
+        <w:t xml:space="preserve"> </w:t>
+      </w:r>
+      <w:r>
+        <w:t>rules</w:t>
+      </w:r>
+      <w:r>
+        <w:t>.</w:t>
+      </w:r>
+    </w:p>
+    <w:p>
+      <w:r>
+        <w:t xml:space="preserve">I </w:t>
+      </w:r>
+      <w:r>
+        <w:t xml:space="preserve">implemented </w:t>
+      </w:r>
+      <w:r>
+        <w:t xml:space="preserve">a </w:t>
+      </w:r>
+      <w:proofErr w:type="spellStart"/>
+      <w:r>
+        <w:rPr>
+          <w:i/>
+          <w:iCs/>
+        </w:rPr>
+        <w:t>dalekAI</w:t>
+      </w:r>
+      <w:proofErr w:type="spellEnd"/>
+      <w:r>
+        <w:t xml:space="preserve"> function that </w:t>
+      </w:r>
+      <w:r>
+        <w:t xml:space="preserve">encapsulated the </w:t>
+      </w:r>
+      <w:r>
+        <w:t xml:space="preserve">common </w:t>
+      </w:r>
+      <w:r>
+        <w:t>behavioral rules</w:t>
+      </w:r>
+      <w:r>
+        <w:t xml:space="preserve">, </w:t>
+      </w:r>
+      <w:r>
+        <w:t xml:space="preserve">running these against </w:t>
+      </w:r>
+      <w:r>
+        <w:t xml:space="preserve">each </w:t>
+      </w:r>
+      <w:r>
+        <w:t>Dalek every 16 frames.</w:t>
+      </w:r>
+      <w:r>
+        <w:t xml:space="preserve">  </w:t>
+      </w:r>
+      <w:r>
+        <w:t xml:space="preserve">It’s invoked from the game loop. </w:t>
+      </w:r>
+    </w:p>
+    <w:p>
+      <w:r>
+        <w:t xml:space="preserve">The </w:t>
+      </w:r>
+      <w:r>
+        <w:t xml:space="preserve">routine checks </w:t>
+      </w:r>
+      <w:r>
+        <w:t xml:space="preserve">to see if K9 </w:t>
+      </w:r>
+      <w:r>
+        <w:t xml:space="preserve">is </w:t>
+      </w:r>
+      <w:r>
+        <w:t>in sight</w:t>
+      </w:r>
+      <w:r>
+        <w:t xml:space="preserve"> (using a helper routine)</w:t>
+      </w:r>
+      <w:r>
+        <w:t>,</w:t>
+      </w:r>
+      <w:r>
+        <w:t xml:space="preserve"> promot</w:t>
+      </w:r>
+      <w:r>
+        <w:t>ing</w:t>
+      </w:r>
+      <w:r>
+        <w:t xml:space="preserve"> </w:t>
+      </w:r>
+      <w:r>
+        <w:t xml:space="preserve">the </w:t>
+      </w:r>
+      <w:r>
+        <w:t>Dalek’s</w:t>
+      </w:r>
+      <w:r>
+        <w:t xml:space="preserve"> </w:t>
+      </w:r>
+      <w:r>
+        <w:t xml:space="preserve">action to </w:t>
+      </w:r>
+      <w:proofErr w:type="spellStart"/>
       <w:r>
         <w:rPr>
           <w:b/>
@@ -13215,11 +13450,9 @@
           <w:i/>
           <w:iCs/>
         </w:rPr>
-        <w:t xml:space="preserve"> </w:t>
-      </w:r>
-      <w:r>
-        <w:t>or</w:t>
-      </w:r>
+        <w:t>PursueLeft</w:t>
+      </w:r>
+      <w:proofErr w:type="spellEnd"/>
       <w:r>
         <w:rPr>
           <w:b/>
@@ -13227,208 +13460,10 @@
           <w:i/>
           <w:iCs/>
         </w:rPr>
-        <w:t xml:space="preserve"> PursueRight</w:t>
-      </w:r>
-      <w:r>
-        <w:t xml:space="preserve"> if so.</w:t>
-      </w:r>
-      <w:r>
-        <w:t xml:space="preserve"> The function also </w:t>
-      </w:r>
-      <w:r>
-        <w:t>checks to see if K9 is within weapon’s range</w:t>
-      </w:r>
-      <w:r>
-        <w:t>, firing its weapon if it is.</w:t>
-      </w:r>
-    </w:p>
-    <w:p>
-      <w:r>
-        <w:t xml:space="preserve">I then updated </w:t>
-      </w:r>
-      <w:r>
-        <w:t xml:space="preserve">the </w:t>
-      </w:r>
-      <w:r>
-        <w:rPr>
-          <w:i/>
-          <w:iCs/>
-        </w:rPr>
-        <w:t>dalekAnimate</w:t>
-      </w:r>
-      <w:r>
-        <w:t xml:space="preserve"> and all the </w:t>
-      </w:r>
-      <w:r>
-        <w:t xml:space="preserve">Dalek </w:t>
-      </w:r>
-      <w:r>
-        <w:t xml:space="preserve">frame callback functions </w:t>
-      </w:r>
-      <w:r>
-        <w:t xml:space="preserve">to </w:t>
-      </w:r>
-      <w:r>
-        <w:t xml:space="preserve">amend their </w:t>
-      </w:r>
-      <w:r>
-        <w:t>behaviors</w:t>
-      </w:r>
-      <w:r>
-        <w:t xml:space="preserve"> based on </w:t>
-      </w:r>
-      <w:r>
-        <w:t xml:space="preserve">the </w:t>
-      </w:r>
-      <w:r>
-        <w:t>current action.</w:t>
-      </w:r>
-      <w:r>
-        <w:t xml:space="preserve">  The challenge was keeping the impact (increased code-size) to a </w:t>
-      </w:r>
-      <w:r>
-        <w:t>minimum</w:t>
-      </w:r>
-      <w:r>
-        <w:t>.</w:t>
-      </w:r>
-      <w:r>
-        <w:t xml:space="preserve"> A lot of time was spent refactoring these functio</w:t>
-      </w:r>
-      <w:r>
-        <w:t>ns to use as few code bytes as possible.</w:t>
-      </w:r>
-    </w:p>
-    <w:p>
-      <w:r>
-        <w:t>On</w:t>
-      </w:r>
-      <w:r>
-        <w:t>e</w:t>
-      </w:r>
-      <w:r>
-        <w:t xml:space="preserve"> notable challenge was how best to </w:t>
-      </w:r>
-      <w:r>
-        <w:t xml:space="preserve">show </w:t>
-      </w:r>
-      <w:r>
-        <w:t>damage being inflicted on K9.</w:t>
-      </w:r>
-      <w:r>
-        <w:t xml:space="preserve">  After brainstorming many ideas, I ended up implementing a simple </w:t>
-      </w:r>
-      <w:r>
-        <w:t>first-person</w:t>
-      </w:r>
-      <w:r>
         <w:t xml:space="preserve"> </w:t>
       </w:r>
       <w:r>
-        <w:t xml:space="preserve">effect where </w:t>
-      </w:r>
-      <w:r>
-        <w:t xml:space="preserve">the </w:t>
-      </w:r>
-      <w:r>
-        <w:t xml:space="preserve">screen </w:t>
-      </w:r>
-      <w:r>
-        <w:t xml:space="preserve">is flashed </w:t>
-      </w:r>
-      <w:r>
-        <w:t>black</w:t>
-      </w:r>
-      <w:r>
-        <w:t>,</w:t>
-      </w:r>
-      <w:r>
-        <w:t xml:space="preserve"> </w:t>
-      </w:r>
-      <w:r>
-        <w:t>at a</w:t>
-      </w:r>
-      <w:r>
-        <w:t xml:space="preserve"> low frequence</w:t>
-      </w:r>
-      <w:r>
-        <w:t>,</w:t>
-      </w:r>
-      <w:r>
-        <w:t xml:space="preserve"> </w:t>
-      </w:r>
-      <w:r>
-        <w:t>and a</w:t>
-      </w:r>
-      <w:r>
-        <w:t>n obnoxious sound</w:t>
-      </w:r>
-      <w:r>
-        <w:t xml:space="preserve"> is </w:t>
-      </w:r>
-      <w:r>
-        <w:t>played</w:t>
-      </w:r>
-      <w:r>
-        <w:t>.</w:t>
-      </w:r>
-      <w:r>
-        <w:t xml:space="preserve">  The effect is quite </w:t>
-      </w:r>
-      <w:r>
-        <w:t>e</w:t>
-      </w:r>
-      <w:r>
-        <w:t>ffective</w:t>
-      </w:r>
-      <w:r>
-        <w:t>!</w:t>
-      </w:r>
-    </w:p>
-    <w:p>
-      <w:r>
-        <w:t xml:space="preserve">I also added a Mode 7 </w:t>
-      </w:r>
-      <w:r>
-        <w:t xml:space="preserve">incomplete level </w:t>
-      </w:r>
-      <w:r>
-        <w:t xml:space="preserve">screen, which </w:t>
-      </w:r>
-      <w:r>
-        <w:t>shows</w:t>
-      </w:r>
-      <w:r>
-        <w:t xml:space="preserve"> </w:t>
-      </w:r>
-      <w:r>
-        <w:t xml:space="preserve">if </w:t>
-      </w:r>
-      <w:r>
-        <w:t>K</w:t>
-      </w:r>
-      <w:r>
-        <w:t xml:space="preserve">9’s health </w:t>
-      </w:r>
-      <w:r>
-        <w:t xml:space="preserve">becomes </w:t>
-      </w:r>
-      <w:r>
-        <w:t>zero</w:t>
-      </w:r>
-      <w:r>
-        <w:t>.  Pressing space restarts the level.</w:t>
-      </w:r>
-    </w:p>
-    <w:p>
-      <w:r>
-        <w:t xml:space="preserve">I then turned to </w:t>
-      </w:r>
-      <w:r>
-        <w:t>implementing</w:t>
-      </w:r>
-      <w:r>
-        <w:t xml:space="preserve"> the </w:t>
+        <w:t>or</w:t>
       </w:r>
       <w:r>
         <w:rPr>
@@ -13437,11 +13472,9 @@
           <w:i/>
           <w:iCs/>
         </w:rPr>
-        <w:t>PursueUp</w:t>
-      </w:r>
-      <w:r>
-        <w:t xml:space="preserve"> and </w:t>
-      </w:r>
+        <w:t xml:space="preserve"> </w:t>
+      </w:r>
+      <w:proofErr w:type="spellStart"/>
       <w:r>
         <w:rPr>
           <w:b/>
@@ -13449,8 +13482,237 @@
           <w:i/>
           <w:iCs/>
         </w:rPr>
+        <w:t>PursueRight</w:t>
+      </w:r>
+      <w:proofErr w:type="spellEnd"/>
+      <w:r>
+        <w:t xml:space="preserve"> if so.</w:t>
+      </w:r>
+      <w:r>
+        <w:t xml:space="preserve"> The function also </w:t>
+      </w:r>
+      <w:r>
+        <w:t>checks to see if K9 is within weapon’s range</w:t>
+      </w:r>
+      <w:r>
+        <w:t>, firing its weapon if it is.</w:t>
+      </w:r>
+    </w:p>
+    <w:p>
+      <w:r>
+        <w:t xml:space="preserve">I then updated </w:t>
+      </w:r>
+      <w:r>
+        <w:t xml:space="preserve">the </w:t>
+      </w:r>
+      <w:proofErr w:type="spellStart"/>
+      <w:r>
+        <w:rPr>
+          <w:i/>
+          <w:iCs/>
+        </w:rPr>
+        <w:t>dalekAnimate</w:t>
+      </w:r>
+      <w:proofErr w:type="spellEnd"/>
+      <w:r>
+        <w:t xml:space="preserve"> and all the </w:t>
+      </w:r>
+      <w:r>
+        <w:t xml:space="preserve">Dalek </w:t>
+      </w:r>
+      <w:r>
+        <w:t xml:space="preserve">frame callback functions </w:t>
+      </w:r>
+      <w:r>
+        <w:t xml:space="preserve">to </w:t>
+      </w:r>
+      <w:r>
+        <w:t xml:space="preserve">amend their </w:t>
+      </w:r>
+      <w:r>
+        <w:t>behaviors</w:t>
+      </w:r>
+      <w:r>
+        <w:t xml:space="preserve"> based on </w:t>
+      </w:r>
+      <w:r>
+        <w:t xml:space="preserve">the </w:t>
+      </w:r>
+      <w:r>
+        <w:t>current action.</w:t>
+      </w:r>
+      <w:r>
+        <w:t xml:space="preserve">  The challenge was keeping the impact (increased code-size) to a </w:t>
+      </w:r>
+      <w:r>
+        <w:t>minimum</w:t>
+      </w:r>
+      <w:r>
+        <w:t>.</w:t>
+      </w:r>
+      <w:r>
+        <w:t xml:space="preserve"> A lot of time was spent refactoring these functio</w:t>
+      </w:r>
+      <w:r>
+        <w:t>ns to use as few code bytes as possible.</w:t>
+      </w:r>
+    </w:p>
+    <w:p>
+      <w:r>
+        <w:t>On</w:t>
+      </w:r>
+      <w:r>
+        <w:t>e</w:t>
+      </w:r>
+      <w:r>
+        <w:t xml:space="preserve"> notable challenge was how best to </w:t>
+      </w:r>
+      <w:r>
+        <w:t xml:space="preserve">show </w:t>
+      </w:r>
+      <w:r>
+        <w:t>damage being inflicted on K9.</w:t>
+      </w:r>
+      <w:r>
+        <w:t xml:space="preserve">  After brainstorming many ideas, I ended up implementing a simple </w:t>
+      </w:r>
+      <w:r>
+        <w:t>first-person</w:t>
+      </w:r>
+      <w:r>
+        <w:t xml:space="preserve"> </w:t>
+      </w:r>
+      <w:r>
+        <w:t xml:space="preserve">effect where </w:t>
+      </w:r>
+      <w:r>
+        <w:t xml:space="preserve">the </w:t>
+      </w:r>
+      <w:r>
+        <w:t xml:space="preserve">screen </w:t>
+      </w:r>
+      <w:r>
+        <w:t xml:space="preserve">is flashed </w:t>
+      </w:r>
+      <w:r>
+        <w:t>black</w:t>
+      </w:r>
+      <w:r>
+        <w:t>,</w:t>
+      </w:r>
+      <w:r>
+        <w:t xml:space="preserve"> </w:t>
+      </w:r>
+      <w:r>
+        <w:t>at a</w:t>
+      </w:r>
+      <w:r>
+        <w:t xml:space="preserve"> low frequence</w:t>
+      </w:r>
+      <w:r>
+        <w:t>,</w:t>
+      </w:r>
+      <w:r>
+        <w:t xml:space="preserve"> </w:t>
+      </w:r>
+      <w:r>
+        <w:t>and a</w:t>
+      </w:r>
+      <w:r>
+        <w:t>n obnoxious sound</w:t>
+      </w:r>
+      <w:r>
+        <w:t xml:space="preserve"> is </w:t>
+      </w:r>
+      <w:r>
+        <w:t>played</w:t>
+      </w:r>
+      <w:r>
+        <w:t>.</w:t>
+      </w:r>
+      <w:r>
+        <w:t xml:space="preserve">  The effect is quite </w:t>
+      </w:r>
+      <w:r>
+        <w:t>e</w:t>
+      </w:r>
+      <w:r>
+        <w:t>ffective</w:t>
+      </w:r>
+      <w:r>
+        <w:t>!</w:t>
+      </w:r>
+    </w:p>
+    <w:p>
+      <w:r>
+        <w:t xml:space="preserve">I also added a Mode 7 </w:t>
+      </w:r>
+      <w:r>
+        <w:t xml:space="preserve">incomplete level </w:t>
+      </w:r>
+      <w:r>
+        <w:t xml:space="preserve">screen, which </w:t>
+      </w:r>
+      <w:r>
+        <w:t>shows</w:t>
+      </w:r>
+      <w:r>
+        <w:t xml:space="preserve"> </w:t>
+      </w:r>
+      <w:r>
+        <w:t xml:space="preserve">if </w:t>
+      </w:r>
+      <w:r>
+        <w:t>K</w:t>
+      </w:r>
+      <w:r>
+        <w:t xml:space="preserve">9’s health </w:t>
+      </w:r>
+      <w:r>
+        <w:t xml:space="preserve">becomes </w:t>
+      </w:r>
+      <w:r>
+        <w:t>zero</w:t>
+      </w:r>
+      <w:r>
+        <w:t>.  Pressing space restarts the level.</w:t>
+      </w:r>
+    </w:p>
+    <w:p>
+      <w:r>
+        <w:t xml:space="preserve">I then turned to </w:t>
+      </w:r>
+      <w:r>
+        <w:t>implementing</w:t>
+      </w:r>
+      <w:r>
+        <w:t xml:space="preserve"> the </w:t>
+      </w:r>
+      <w:proofErr w:type="spellStart"/>
+      <w:r>
+        <w:rPr>
+          <w:b/>
+          <w:bCs/>
+          <w:i/>
+          <w:iCs/>
+        </w:rPr>
+        <w:t>PursueUp</w:t>
+      </w:r>
+      <w:proofErr w:type="spellEnd"/>
+      <w:r>
+        <w:t xml:space="preserve"> and </w:t>
+      </w:r>
+      <w:proofErr w:type="spellStart"/>
+      <w:r>
+        <w:rPr>
+          <w:b/>
+          <w:bCs/>
+          <w:i/>
+          <w:iCs/>
+        </w:rPr>
         <w:t>PursueDown</w:t>
       </w:r>
+      <w:proofErr w:type="spellEnd"/>
       <w:r>
         <w:t xml:space="preserve"> behavior</w:t>
       </w:r>
@@ -13484,6 +13746,7 @@
       <w:r>
         <w:t xml:space="preserve">e to support this.  Fortunately, the low nibble of the elevator’s </w:t>
       </w:r>
+      <w:proofErr w:type="spellStart"/>
       <w:r>
         <w:rPr>
           <w:i/>
@@ -13491,6 +13754,7 @@
         </w:rPr>
         <w:t>objectState</w:t>
       </w:r>
+      <w:proofErr w:type="spellEnd"/>
       <w:r>
         <w:t xml:space="preserve"> variable </w:t>
       </w:r>
@@ -13707,7 +13971,15 @@
         <w:t>Daleks in pursuit</w:t>
       </w:r>
       <w:r>
-        <w:t xml:space="preserve"> - When one or more Daleks are in pursuit of K9, a PacMan like sound effect plays, giving the player a sense of pressure.  The sound effect provide</w:t>
+        <w:t xml:space="preserve"> - When one or more Daleks are in pursuit of K9, a </w:t>
+      </w:r>
+      <w:proofErr w:type="spellStart"/>
+      <w:r>
+        <w:t>PacMan</w:t>
+      </w:r>
+      <w:proofErr w:type="spellEnd"/>
+      <w:r>
+        <w:t xml:space="preserve"> like sound effect plays, giving the player a sense of pressure.  The sound effect provide</w:t>
       </w:r>
       <w:r>
         <w:t>s</w:t>
@@ -13766,10 +14038,7 @@
         <w:t>– when a jewel and key it collected</w:t>
       </w:r>
       <w:r>
-        <w:t xml:space="preserve"> </w:t>
-      </w:r>
-      <w:r>
-        <w:t>an affirmative</w:t>
+        <w:t xml:space="preserve"> an affirmative</w:t>
       </w:r>
       <w:r>
         <w:t xml:space="preserve"> sound is played.  A medium tone which quickly rises to a high tone.</w:t>
@@ -13954,6 +14223,7 @@
       <w:r>
         <w:t xml:space="preserve">, door locked, and K9 movement sound effects.  These sound effects are mutually exclusive except for the movement sound effect.  The game uses a </w:t>
       </w:r>
+      <w:proofErr w:type="spellStart"/>
       <w:r>
         <w:rPr>
           <w:i/>
@@ -13961,6 +14231,7 @@
         </w:rPr>
         <w:t>frameCount</w:t>
       </w:r>
+      <w:proofErr w:type="spellEnd"/>
       <w:r>
         <w:t xml:space="preserve"> based timer to inhibit playing the movement sound effect when the other sound effects are playing.</w:t>
       </w:r>
@@ -15138,6 +15409,7 @@
       <w:r>
         <w:t xml:space="preserve"> into the sprite data and let the </w:t>
       </w:r>
+      <w:proofErr w:type="spellStart"/>
       <w:r>
         <w:rPr>
           <w:i/>
@@ -15145,6 +15417,7 @@
         </w:rPr>
         <w:t>drawSprite</w:t>
       </w:r>
+      <w:proofErr w:type="spellEnd"/>
       <w:r>
         <w:t xml:space="preserve"> routine do all the work of putting the pixels on the screen, however this would result in the ‘</w:t>
       </w:r>
@@ -15571,6 +15844,7 @@
       <w:r>
         <w:t xml:space="preserve">from </w:t>
       </w:r>
+      <w:proofErr w:type="spellStart"/>
       <w:r>
         <w:rPr>
           <w:i/>
@@ -15578,9 +15852,11 @@
         </w:rPr>
         <w:t>drawObject</w:t>
       </w:r>
+      <w:proofErr w:type="spellEnd"/>
       <w:r>
         <w:t xml:space="preserve"> and </w:t>
       </w:r>
+      <w:proofErr w:type="spellStart"/>
       <w:r>
         <w:rPr>
           <w:i/>
@@ -15588,6 +15864,7 @@
         </w:rPr>
         <w:t>drawLaserOn</w:t>
       </w:r>
+      <w:proofErr w:type="spellEnd"/>
       <w:r>
         <w:rPr>
           <w:i/>
@@ -16729,6 +17006,7 @@
       <w:r>
         <w:t xml:space="preserve">The title functionality starts and stops playback by invoking the </w:t>
       </w:r>
+      <w:proofErr w:type="spellStart"/>
       <w:r>
         <w:rPr>
           <w:b/>
@@ -16738,9 +17016,11 @@
         </w:rPr>
         <w:t>playMusic</w:t>
       </w:r>
+      <w:proofErr w:type="spellEnd"/>
       <w:r>
         <w:t xml:space="preserve"> and </w:t>
       </w:r>
+      <w:proofErr w:type="spellStart"/>
       <w:r>
         <w:rPr>
           <w:b/>
@@ -16750,6 +17030,7 @@
         </w:rPr>
         <w:t>stopMusic</w:t>
       </w:r>
+      <w:proofErr w:type="spellEnd"/>
       <w:r>
         <w:t xml:space="preserve"> routines.  These routines start and stop the music, which is played in the </w:t>
       </w:r>
@@ -18670,9 +18951,11 @@
             <w:tcW w:w="3116" w:type="dxa"/>
           </w:tcPr>
           <w:p>
+            <w:proofErr w:type="spellStart"/>
             <w:r>
               <w:t>soundVector_beginPursuit</w:t>
             </w:r>
+            <w:proofErr w:type="spellEnd"/>
           </w:p>
         </w:tc>
         <w:tc>
@@ -18683,12 +18966,14 @@
             <w:pPr>
               <w:cnfStyle w:val="000000100000" w:firstRow="0" w:lastRow="0" w:firstColumn="0" w:lastColumn="0" w:oddVBand="0" w:evenVBand="0" w:oddHBand="1" w:evenHBand="0" w:firstRowFirstColumn="0" w:firstRowLastColumn="0" w:lastRowFirstColumn="0" w:lastRowLastColumn="0"/>
             </w:pPr>
+            <w:proofErr w:type="spellStart"/>
             <w:r>
               <w:t>soundEffect_pursuitO</w:t>
             </w:r>
             <w:r>
               <w:t>n</w:t>
             </w:r>
+            <w:proofErr w:type="spellEnd"/>
           </w:p>
         </w:tc>
         <w:tc>
@@ -18699,12 +18984,14 @@
             <w:pPr>
               <w:cnfStyle w:val="000000100000" w:firstRow="0" w:lastRow="0" w:firstColumn="0" w:lastColumn="0" w:oddVBand="0" w:evenVBand="0" w:oddHBand="1" w:evenHBand="0" w:firstRowFirstColumn="0" w:firstRowLastColumn="0" w:lastRowFirstColumn="0" w:lastRowLastColumn="0"/>
             </w:pPr>
+            <w:proofErr w:type="spellStart"/>
             <w:r>
               <w:t>sample_</w:t>
             </w:r>
             <w:r>
               <w:t>soundExterminate</w:t>
             </w:r>
+            <w:proofErr w:type="spellEnd"/>
           </w:p>
         </w:tc>
       </w:tr>
@@ -18715,9 +19002,11 @@
             <w:tcW w:w="3116" w:type="dxa"/>
           </w:tcPr>
           <w:p>
+            <w:proofErr w:type="spellStart"/>
             <w:r>
               <w:t>soundVector_updatePursuit</w:t>
             </w:r>
+            <w:proofErr w:type="spellEnd"/>
           </w:p>
         </w:tc>
         <w:tc>
@@ -18744,9 +19033,11 @@
             <w:pPr>
               <w:cnfStyle w:val="000000000000" w:firstRow="0" w:lastRow="0" w:firstColumn="0" w:lastColumn="0" w:oddVBand="0" w:evenVBand="0" w:oddHBand="0" w:evenHBand="0" w:firstRowFirstColumn="0" w:firstRowLastColumn="0" w:lastRowFirstColumn="0" w:lastRowLastColumn="0"/>
             </w:pPr>
+            <w:proofErr w:type="spellStart"/>
             <w:r>
               <w:t>sample_updatePursuit</w:t>
             </w:r>
+            <w:proofErr w:type="spellEnd"/>
           </w:p>
         </w:tc>
       </w:tr>
@@ -18760,9 +19051,11 @@
             <w:tcW w:w="3116" w:type="dxa"/>
           </w:tcPr>
           <w:p>
+            <w:proofErr w:type="spellStart"/>
             <w:r>
               <w:t>soundVector_endPursuit</w:t>
             </w:r>
+            <w:proofErr w:type="spellEnd"/>
           </w:p>
         </w:tc>
         <w:tc>
@@ -18773,9 +19066,11 @@
             <w:pPr>
               <w:cnfStyle w:val="000000100000" w:firstRow="0" w:lastRow="0" w:firstColumn="0" w:lastColumn="0" w:oddVBand="0" w:evenVBand="0" w:oddHBand="1" w:evenHBand="0" w:firstRowFirstColumn="0" w:firstRowLastColumn="0" w:lastRowFirstColumn="0" w:lastRowLastColumn="0"/>
             </w:pPr>
+            <w:proofErr w:type="spellStart"/>
             <w:r>
               <w:t>soundEffect_pursuitOff</w:t>
             </w:r>
+            <w:proofErr w:type="spellEnd"/>
           </w:p>
         </w:tc>
         <w:tc>
@@ -18786,9 +19081,11 @@
             <w:pPr>
               <w:cnfStyle w:val="000000100000" w:firstRow="0" w:lastRow="0" w:firstColumn="0" w:lastColumn="0" w:oddVBand="0" w:evenVBand="0" w:oddHBand="1" w:evenHBand="0" w:firstRowFirstColumn="0" w:firstRowLastColumn="0" w:lastRowFirstColumn="0" w:lastRowLastColumn="0"/>
             </w:pPr>
+            <w:proofErr w:type="spellStart"/>
             <w:r>
               <w:t>sample_stop</w:t>
             </w:r>
+            <w:proofErr w:type="spellEnd"/>
           </w:p>
         </w:tc>
       </w:tr>
@@ -18799,9 +19096,11 @@
             <w:tcW w:w="3116" w:type="dxa"/>
           </w:tcPr>
           <w:p>
+            <w:proofErr w:type="spellStart"/>
             <w:r>
               <w:t>soundVector_enemyLasered</w:t>
             </w:r>
+            <w:proofErr w:type="spellEnd"/>
           </w:p>
         </w:tc>
         <w:tc>
@@ -18828,9 +19127,11 @@
             <w:pPr>
               <w:cnfStyle w:val="000000000000" w:firstRow="0" w:lastRow="0" w:firstColumn="0" w:lastColumn="0" w:oddVBand="0" w:evenVBand="0" w:oddHBand="0" w:evenHBand="0" w:firstRowFirstColumn="0" w:firstRowLastColumn="0" w:lastRowFirstColumn="0" w:lastRowLastColumn="0"/>
             </w:pPr>
+            <w:proofErr w:type="spellStart"/>
             <w:r>
               <w:t>sample_soundGrown</w:t>
             </w:r>
+            <w:proofErr w:type="spellEnd"/>
           </w:p>
         </w:tc>
       </w:tr>
@@ -18844,9 +19145,11 @@
             <w:tcW w:w="3116" w:type="dxa"/>
           </w:tcPr>
           <w:p>
+            <w:proofErr w:type="spellStart"/>
             <w:r>
               <w:t>soundVector_weaponFired</w:t>
             </w:r>
+            <w:proofErr w:type="spellEnd"/>
           </w:p>
         </w:tc>
         <w:tc>
@@ -18857,9 +19160,11 @@
             <w:pPr>
               <w:cnfStyle w:val="000000100000" w:firstRow="0" w:lastRow="0" w:firstColumn="0" w:lastColumn="0" w:oddVBand="0" w:evenVBand="0" w:oddHBand="1" w:evenHBand="0" w:firstRowFirstColumn="0" w:firstRowLastColumn="0" w:lastRowFirstColumn="0" w:lastRowLastColumn="0"/>
             </w:pPr>
+            <w:proofErr w:type="spellStart"/>
             <w:r>
               <w:t>soundEffect_pain</w:t>
             </w:r>
+            <w:proofErr w:type="spellEnd"/>
           </w:p>
         </w:tc>
         <w:tc>
@@ -18870,9 +19175,11 @@
             <w:pPr>
               <w:cnfStyle w:val="000000100000" w:firstRow="0" w:lastRow="0" w:firstColumn="0" w:lastColumn="0" w:oddVBand="0" w:evenVBand="0" w:oddHBand="1" w:evenHBand="0" w:firstRowFirstColumn="0" w:firstRowLastColumn="0" w:lastRowFirstColumn="0" w:lastRowLastColumn="0"/>
             </w:pPr>
+            <w:proofErr w:type="spellStart"/>
             <w:r>
               <w:t>sample_soundWeapon</w:t>
             </w:r>
+            <w:proofErr w:type="spellEnd"/>
           </w:p>
         </w:tc>
       </w:tr>
@@ -19115,9 +19422,11 @@
       <w:r>
         <w:t xml:space="preserve">in </w:t>
       </w:r>
+      <w:proofErr w:type="spellStart"/>
       <w:r>
         <w:t>BeebEm</w:t>
       </w:r>
+      <w:proofErr w:type="spellEnd"/>
       <w:r>
         <w:t xml:space="preserve">, though there was a </w:t>
       </w:r>
@@ -19323,9 +19632,11 @@
             <w:tcW w:w="2586" w:type="dxa"/>
           </w:tcPr>
           <w:p>
+            <w:proofErr w:type="spellStart"/>
             <w:r>
               <w:t>enemyDestroyed</w:t>
             </w:r>
+            <w:proofErr w:type="spellEnd"/>
           </w:p>
         </w:tc>
         <w:tc>
@@ -19362,9 +19673,11 @@
             <w:tcW w:w="2586" w:type="dxa"/>
           </w:tcPr>
           <w:p>
+            <w:proofErr w:type="spellStart"/>
             <w:r>
               <w:t>startLevel</w:t>
             </w:r>
+            <w:proofErr w:type="spellEnd"/>
           </w:p>
         </w:tc>
         <w:tc>
@@ -19404,9 +19717,11 @@
             <w:tcW w:w="2586" w:type="dxa"/>
           </w:tcPr>
           <w:p>
+            <w:proofErr w:type="spellStart"/>
             <w:r>
               <w:t>completeLevel</w:t>
             </w:r>
+            <w:proofErr w:type="spellEnd"/>
           </w:p>
         </w:tc>
         <w:tc>
@@ -19417,9 +19732,11 @@
             <w:pPr>
               <w:cnfStyle w:val="000000100000" w:firstRow="0" w:lastRow="0" w:firstColumn="0" w:lastColumn="0" w:oddVBand="0" w:evenVBand="0" w:oddHBand="1" w:evenHBand="0" w:firstRowFirstColumn="0" w:firstRowLastColumn="0" w:lastRowFirstColumn="0" w:lastRowLastColumn="0"/>
             </w:pPr>
+            <w:proofErr w:type="spellStart"/>
             <w:r>
               <w:t>soundEffect_levelComplete</w:t>
             </w:r>
+            <w:proofErr w:type="spellEnd"/>
           </w:p>
         </w:tc>
         <w:tc>
@@ -19430,12 +19747,14 @@
             <w:pPr>
               <w:cnfStyle w:val="000000100000" w:firstRow="0" w:lastRow="0" w:firstColumn="0" w:lastColumn="0" w:oddVBand="0" w:evenVBand="0" w:oddHBand="1" w:evenHBand="0" w:firstRowFirstColumn="0" w:firstRowLastColumn="0" w:lastRowFirstColumn="0" w:lastRowLastColumn="0"/>
             </w:pPr>
+            <w:proofErr w:type="spellStart"/>
             <w:r>
               <w:t>sample_</w:t>
             </w:r>
             <w:r>
               <w:t>soundTardisDoor</w:t>
             </w:r>
+            <w:proofErr w:type="spellEnd"/>
           </w:p>
         </w:tc>
       </w:tr>
@@ -20334,7 +20653,10 @@
         <w:t xml:space="preserve">was the idea of adding teleports which would allow K9 to </w:t>
       </w:r>
       <w:r>
-        <w:t>travel</w:t>
+        <w:t>trave</w:t>
+      </w:r>
+      <w:r>
+        <w:t>rse</w:t>
       </w:r>
       <w:r>
         <w:t xml:space="preserve"> a level in a non-linear way.</w:t>
@@ -20360,13 +20682,7 @@
         <w:t xml:space="preserve">so that it was made up from six tiles instead of eight.  </w:t>
       </w:r>
       <w:r>
-        <w:t xml:space="preserve">I could then </w:t>
-      </w:r>
-      <w:r>
-        <w:t>reduce the number of tiles that can be defined in a level from twenty-nine</w:t>
-      </w:r>
-      <w:r>
-        <w:t xml:space="preserve"> to twenty-seven which </w:t>
+        <w:t xml:space="preserve">I could then reduce the number of tiles that can be defined in a level from twenty-nine to twenty-seven which </w:t>
       </w:r>
       <w:r>
         <w:t>free</w:t>
@@ -20456,6 +20772,7 @@
       <w:r>
         <w:t xml:space="preserve"> travel. Since adding a new dynamic type would require nine bits in </w:t>
       </w:r>
+      <w:proofErr w:type="spellStart"/>
       <w:r>
         <w:rPr>
           <w:b/>
@@ -20463,6 +20780,7 @@
         </w:rPr>
         <w:t>objectState</w:t>
       </w:r>
+      <w:proofErr w:type="spellEnd"/>
       <w:r>
         <w:t xml:space="preserve">, I </w:t>
       </w:r>
@@ -20484,6 +20802,7 @@
       <w:r>
         <w:t xml:space="preserve">elevator, using </w:t>
       </w:r>
+      <w:proofErr w:type="spellStart"/>
       <w:r>
         <w:rPr>
           <w:b/>
@@ -20491,6 +20810,7 @@
         </w:rPr>
         <w:t>objectFrameCounter</w:t>
       </w:r>
+      <w:proofErr w:type="spellEnd"/>
       <w:r>
         <w:t xml:space="preserve"> </w:t>
       </w:r>
@@ -20557,6 +20877,7 @@
       <w:r>
         <w:t xml:space="preserve">in </w:t>
       </w:r>
+      <w:proofErr w:type="spellStart"/>
       <w:r>
         <w:rPr>
           <w:b/>
@@ -20566,6 +20887,7 @@
         </w:rPr>
         <w:t>objectFrameCounter</w:t>
       </w:r>
+      <w:proofErr w:type="spellEnd"/>
       <w:r>
         <w:rPr>
           <w:b/>
@@ -20675,6 +20997,7 @@
       <w:r>
         <w:t xml:space="preserve">files were created in the level asset folders, with the </w:t>
       </w:r>
+      <w:proofErr w:type="spellStart"/>
       <w:r>
         <w:rPr>
           <w:b/>
@@ -20682,6 +21005,7 @@
         </w:rPr>
         <w:t>BMPConverter</w:t>
       </w:r>
+      <w:proofErr w:type="spellEnd"/>
       <w:r>
         <w:t xml:space="preserve"> console app updated to convert and include these in the generated level atlas data files.</w:t>
       </w:r>
@@ -20731,6 +21055,7 @@
         <w:lastRenderedPageBreak/>
         <w:t xml:space="preserve">A new </w:t>
       </w:r>
+      <w:proofErr w:type="spellStart"/>
       <w:r>
         <w:rPr>
           <w:b/>
@@ -20738,6 +21063,7 @@
         </w:rPr>
         <w:t>rideTeleport</w:t>
       </w:r>
+      <w:proofErr w:type="spellEnd"/>
       <w:r>
         <w:t xml:space="preserve"> routine was introduced </w:t>
       </w:r>
@@ -20805,6 +21131,7 @@
       <w:r>
         <w:t xml:space="preserve">Find the destination teleport object (elevator), held in </w:t>
       </w:r>
+      <w:proofErr w:type="spellStart"/>
       <w:r>
         <w:rPr>
           <w:b/>
@@ -20814,6 +21141,7 @@
         </w:rPr>
         <w:t>objectFrameCounter</w:t>
       </w:r>
+      <w:proofErr w:type="spellEnd"/>
       <w:r>
         <w:t>.</w:t>
       </w:r>
@@ -21195,18 +21523,24 @@
         <w:t xml:space="preserve"> now implemented</w:t>
       </w:r>
       <w:r>
-        <w:t xml:space="preserve">, I determined that spinning the disc after a crop transition would be </w:t>
-      </w:r>
-      <w:r>
-        <w:t>fine</w:t>
-      </w:r>
-      <w:r>
-        <w:t>.</w:t>
-      </w:r>
-    </w:p>
-    <w:p>
-      <w:r>
-        <w:t xml:space="preserve">The changes were straightforward to implement.  I moved all the Mode 7 utility routines into a new source file (mode7.6502) and included this after the level initialization code (level.6502).  I then updated how the </w:t>
+        <w:t xml:space="preserve">, spinning the disc after a crop transition would be </w:t>
+      </w:r>
+      <w:r>
+        <w:t>fine,</w:t>
+      </w:r>
+      <w:r>
+        <w:t xml:space="preserve"> so I proceeded with the change</w:t>
+      </w:r>
+      <w:r>
+        <w:t xml:space="preserve">s, which </w:t>
+      </w:r>
+      <w:r>
+        <w:t xml:space="preserve">were straightforward to implement.  </w:t>
+      </w:r>
+    </w:p>
+    <w:p>
+      <w:r>
+        <w:t xml:space="preserve">I moved all the Mode 7 utility routines into a new source file (mode7.6502) and included this after the level initialization code (level.6502).  I then updated how the </w:t>
       </w:r>
       <w:r>
         <w:rPr>
@@ -21401,6 +21735,7 @@
       <w:r>
         <w:t xml:space="preserve">A new </w:t>
       </w:r>
+      <w:proofErr w:type="spellStart"/>
       <w:r>
         <w:rPr>
           <w:b/>
@@ -21410,6 +21745,7 @@
         </w:rPr>
         <w:t>drawTile</w:t>
       </w:r>
+      <w:proofErr w:type="spellEnd"/>
       <w:r>
         <w:t xml:space="preserve"> routine was </w:t>
       </w:r>
@@ -21533,7 +21869,13 @@
         <w:t>laser</w:t>
       </w:r>
       <w:r>
-        <w:t xml:space="preserve">, at which point one or more paired objects can be activated.  I decided that </w:t>
+        <w:t xml:space="preserve">, at which point one or more paired objects </w:t>
+      </w:r>
+      <w:r>
+        <w:t xml:space="preserve">would </w:t>
+      </w:r>
+      <w:r>
+        <w:t xml:space="preserve">be activated.  I decided that </w:t>
       </w:r>
       <w:r>
         <w:t>Daleks, d</w:t>
@@ -21560,28 +21902,25 @@
         <w:t xml:space="preserve">could all be </w:t>
       </w:r>
       <w:r>
-        <w:t>paired with to a switch</w:t>
-      </w:r>
-      <w:r>
-        <w:t xml:space="preserve">, </w:t>
-      </w:r>
-      <w:r>
-        <w:t>and allow multiple</w:t>
-      </w:r>
-      <w:r>
-        <w:t xml:space="preserve"> objects to be activated by </w:t>
-      </w:r>
-      <w:r>
-        <w:t xml:space="preserve">single </w:t>
-      </w:r>
-      <w:r>
-        <w:t>switch.</w:t>
-      </w:r>
-      <w:r>
-        <w:t xml:space="preserve">  </w:t>
-      </w:r>
-      <w:r>
-        <w:t>For simplicity, an object can only be paired with one switch.</w:t>
+        <w:t>paired with a switch</w:t>
+      </w:r>
+      <w:r>
+        <w:t xml:space="preserve">. I would also </w:t>
+      </w:r>
+      <w:r>
+        <w:t>allow multiple</w:t>
+      </w:r>
+      <w:r>
+        <w:t xml:space="preserve"> objects to </w:t>
+      </w:r>
+      <w:r>
+        <w:t xml:space="preserve">be </w:t>
+      </w:r>
+      <w:r>
+        <w:t>paired to a switch, but not allow an object to be paired with multiple switches</w:t>
+      </w:r>
+      <w:r>
+        <w:t>.</w:t>
       </w:r>
     </w:p>
     <w:p>
@@ -21679,7 +22018,607 @@
         <w:t>Paired d</w:t>
       </w:r>
       <w:r>
-        <w:t>oors become operational.</w:t>
+        <w:t>oors</w:t>
+      </w:r>
+      <w:r>
+        <w:t xml:space="preserve">, </w:t>
+      </w:r>
+      <w:r>
+        <w:t>e</w:t>
+      </w:r>
+      <w:r>
+        <w:t xml:space="preserve">levators </w:t>
+      </w:r>
+      <w:r>
+        <w:t xml:space="preserve">and teleports </w:t>
+      </w:r>
+      <w:r>
+        <w:t>become operational</w:t>
+      </w:r>
+      <w:r>
+        <w:t>.</w:t>
+      </w:r>
+    </w:p>
+    <w:p>
+      <w:r>
+        <w:t xml:space="preserve">Of course, the last </w:t>
+      </w:r>
+      <w:r>
+        <w:t xml:space="preserve">behavior </w:t>
+      </w:r>
+      <w:r>
+        <w:t>require</w:t>
+      </w:r>
+      <w:r>
+        <w:t>s</w:t>
+      </w:r>
+      <w:r>
+        <w:t xml:space="preserve"> that doors, elevator</w:t>
+      </w:r>
+      <w:r>
+        <w:t>s, and teleports</w:t>
+      </w:r>
+      <w:r>
+        <w:t xml:space="preserve"> can be disabled, which is not currently </w:t>
+      </w:r>
+      <w:r>
+        <w:t>supported</w:t>
+      </w:r>
+      <w:r>
+        <w:t xml:space="preserve">. </w:t>
+      </w:r>
+      <w:r>
+        <w:t xml:space="preserve"> </w:t>
+      </w:r>
+      <w:r>
+        <w:t>I decided that d</w:t>
+      </w:r>
+      <w:r>
+        <w:t xml:space="preserve">isabled doors, </w:t>
+      </w:r>
+      <w:r>
+        <w:t>elevator</w:t>
+      </w:r>
+      <w:r>
+        <w:t xml:space="preserve">, and </w:t>
+      </w:r>
+      <w:r>
+        <w:t>teleports</w:t>
+      </w:r>
+      <w:r>
+        <w:t xml:space="preserve"> don’t</w:t>
+      </w:r>
+      <w:r>
+        <w:t xml:space="preserve"> animate and are not operational.</w:t>
+      </w:r>
+    </w:p>
+    <w:p>
+      <w:pPr>
+        <w:pStyle w:val="Heading3"/>
+      </w:pPr>
+      <w:r>
+        <w:t>Implementation</w:t>
+      </w:r>
+    </w:p>
+    <w:p>
+      <w:r>
+        <w:t>Switches are modelled using two new tile types: SWITCH_OFF and SWITCH_ON.</w:t>
+      </w:r>
+      <w:r>
+        <w:t xml:space="preserve"> </w:t>
+      </w:r>
+    </w:p>
+    <w:p>
+      <w:r>
+        <w:t xml:space="preserve">The level </w:t>
+      </w:r>
+      <w:r>
+        <w:t xml:space="preserve">editor </w:t>
+      </w:r>
+      <w:r>
+        <w:t xml:space="preserve">was updated to </w:t>
+      </w:r>
+      <w:r>
+        <w:t xml:space="preserve">support these and updated to </w:t>
+      </w:r>
+      <w:r>
+        <w:t>enforce that only one SWITCH_OFF and SWITCH_ON tile can be defined</w:t>
+      </w:r>
+      <w:r>
+        <w:t xml:space="preserve"> within a level</w:t>
+      </w:r>
+      <w:r>
+        <w:t>, and that a SWITCH_ON tile must be defined i</w:t>
+      </w:r>
+      <w:r>
+        <w:t>f</w:t>
+      </w:r>
+      <w:r>
+        <w:t xml:space="preserve"> a SWITCH_OFF tile is placed.</w:t>
+      </w:r>
+    </w:p>
+    <w:p>
+      <w:r>
+        <w:t xml:space="preserve">The editor was also updated allowing game objects and tiles </w:t>
+      </w:r>
+      <w:r>
+        <w:t xml:space="preserve">to be </w:t>
+      </w:r>
+      <w:r>
+        <w:t xml:space="preserve">paired by control clicking on the switch and then control clicking on objects </w:t>
+      </w:r>
+      <w:r>
+        <w:t>and</w:t>
+      </w:r>
+      <w:r>
+        <w:t xml:space="preserve"> tiles.  Switch pairings can be removed by replacing a switch, paired object, or paired tile.</w:t>
+      </w:r>
+    </w:p>
+    <w:p>
+      <w:r>
+        <w:t xml:space="preserve">The level file format was extended to include a </w:t>
+      </w:r>
+      <w:r>
+        <w:rPr>
+          <w:b/>
+          <w:bCs/>
+        </w:rPr>
+        <w:t>32-byte data block</w:t>
+      </w:r>
+      <w:r>
+        <w:t xml:space="preserve"> which encodes the levels’ switch pairings.  The encod</w:t>
+      </w:r>
+      <w:r>
+        <w:t>ing is</w:t>
+      </w:r>
+      <w:r>
+        <w:t xml:space="preserve"> as follows:</w:t>
+      </w:r>
+    </w:p>
+    <w:p>
+      <w:pPr>
+        <w:ind w:firstLine="720"/>
+        <w:rPr>
+          <w:b/>
+          <w:bCs/>
+        </w:rPr>
+      </w:pPr>
+      <w:r>
+        <w:t>Switch pairings =</w:t>
+      </w:r>
+      <w:r>
+        <w:rPr>
+          <w:i/>
+          <w:iCs/>
+        </w:rPr>
+        <w:t xml:space="preserve"> </w:t>
+      </w:r>
+      <w:r>
+        <w:rPr>
+          <w:b/>
+          <w:bCs/>
+        </w:rPr>
+        <w:t>&lt;</w:t>
+      </w:r>
+      <w:r>
+        <w:rPr>
+          <w:b/>
+          <w:bCs/>
+          <w:i/>
+          <w:iCs/>
+        </w:rPr>
+        <w:t>switch</w:t>
+      </w:r>
+      <w:r>
+        <w:rPr>
+          <w:b/>
+          <w:bCs/>
+          <w:i/>
+          <w:iCs/>
+        </w:rPr>
+        <w:t xml:space="preserve">-record&gt; </w:t>
+      </w:r>
+      <w:r>
+        <w:rPr>
+          <w:b/>
+          <w:bCs/>
+        </w:rPr>
+        <w:t>*</w:t>
+      </w:r>
+    </w:p>
+    <w:p>
+      <w:r>
+        <w:t>Where</w:t>
+      </w:r>
+      <w:r>
+        <w:t>:</w:t>
+      </w:r>
+    </w:p>
+    <w:p>
+      <w:pPr>
+        <w:rPr>
+          <w:b/>
+          <w:bCs/>
+          <w:i/>
+          <w:iCs/>
+        </w:rPr>
+      </w:pPr>
+      <w:r>
+        <w:tab/>
+      </w:r>
+      <w:r>
+        <w:rPr>
+          <w:b/>
+          <w:bCs/>
+        </w:rPr>
+        <w:t>&lt;</w:t>
+      </w:r>
+      <w:r>
+        <w:rPr>
+          <w:b/>
+          <w:bCs/>
+          <w:i/>
+          <w:iCs/>
+        </w:rPr>
+        <w:t>switch-record&gt;</w:t>
+      </w:r>
+      <w:r>
+        <w:rPr>
+          <w:b/>
+          <w:bCs/>
+          <w:i/>
+          <w:iCs/>
+        </w:rPr>
+        <w:t xml:space="preserve"> = &lt;switch-address&gt; &lt;paired-objects&gt; &lt;paired-tiles&gt;</w:t>
+      </w:r>
+    </w:p>
+    <w:p>
+      <w:r>
+        <w:t>Where</w:t>
+      </w:r>
+      <w:r>
+        <w:t>:</w:t>
+      </w:r>
+    </w:p>
+    <w:p>
+      <w:r>
+        <w:tab/>
+      </w:r>
+      <w:r>
+        <w:rPr>
+          <w:b/>
+          <w:bCs/>
+          <w:i/>
+          <w:iCs/>
+        </w:rPr>
+        <w:t>&lt;</w:t>
+      </w:r>
+      <w:r>
+        <w:rPr>
+          <w:b/>
+          <w:bCs/>
+          <w:i/>
+          <w:iCs/>
+        </w:rPr>
+        <w:t>switch-address</w:t>
+      </w:r>
+      <w:r>
+        <w:rPr>
+          <w:b/>
+          <w:bCs/>
+          <w:i/>
+          <w:iCs/>
+        </w:rPr>
+        <w:t xml:space="preserve">&gt; </w:t>
+      </w:r>
+      <w:r>
+        <w:t>is a</w:t>
+      </w:r>
+      <w:r>
+        <w:rPr>
+          <w:b/>
+          <w:bCs/>
+          <w:i/>
+          <w:iCs/>
+        </w:rPr>
+        <w:t xml:space="preserve"> </w:t>
+      </w:r>
+      <w:r>
+        <w:t>two-</w:t>
+      </w:r>
+      <w:r>
+        <w:t>byte</w:t>
+      </w:r>
+      <w:r>
+        <w:rPr>
+          <w:b/>
+          <w:bCs/>
+          <w:i/>
+          <w:iCs/>
+        </w:rPr>
+        <w:t xml:space="preserve"> </w:t>
+      </w:r>
+      <w:r>
+        <w:t>tile grid</w:t>
+      </w:r>
+      <w:r>
+        <w:rPr>
+          <w:b/>
+          <w:bCs/>
+          <w:i/>
+          <w:iCs/>
+        </w:rPr>
+        <w:t xml:space="preserve"> </w:t>
+      </w:r>
+      <w:r>
+        <w:t xml:space="preserve">address </w:t>
+      </w:r>
+      <w:r>
+        <w:t>(little endian format).</w:t>
+      </w:r>
+    </w:p>
+    <w:p>
+      <w:pPr>
+        <w:ind w:firstLine="720"/>
+        <w:rPr>
+          <w:b/>
+          <w:bCs/>
+          <w:i/>
+          <w:iCs/>
+        </w:rPr>
+      </w:pPr>
+      <w:r>
+        <w:rPr>
+          <w:b/>
+          <w:bCs/>
+          <w:i/>
+          <w:iCs/>
+        </w:rPr>
+        <w:lastRenderedPageBreak/>
+        <w:t>&lt;paired-objects&gt; = &lt;count&gt; &lt;</w:t>
+      </w:r>
+      <w:r>
+        <w:rPr>
+          <w:b/>
+          <w:bCs/>
+          <w:i/>
+          <w:iCs/>
+        </w:rPr>
+        <w:t>object-index</w:t>
+      </w:r>
+      <w:r>
+        <w:rPr>
+          <w:b/>
+          <w:bCs/>
+          <w:i/>
+          <w:iCs/>
+        </w:rPr>
+        <w:t xml:space="preserve">&gt; * </w:t>
+      </w:r>
+    </w:p>
+    <w:p>
+      <w:pPr>
+        <w:ind w:firstLine="720"/>
+      </w:pPr>
+      <w:r>
+        <w:rPr>
+          <w:b/>
+          <w:bCs/>
+          <w:i/>
+          <w:iCs/>
+        </w:rPr>
+        <w:t xml:space="preserve">&lt;paired-tiles&gt; = &lt;count&gt; (&lt;tile-x-coord&gt; &lt;tile-y-coord&gt;) * </w:t>
+      </w:r>
+    </w:p>
+    <w:p>
+      <w:r>
+        <w:t>Where</w:t>
+      </w:r>
+      <w:r>
+        <w:t>:</w:t>
+      </w:r>
+    </w:p>
+    <w:p>
+      <w:pPr>
+        <w:ind w:left="720" w:hanging="720"/>
+      </w:pPr>
+      <w:r>
+        <w:tab/>
+      </w:r>
+      <w:r>
+        <w:rPr>
+          <w:b/>
+          <w:bCs/>
+        </w:rPr>
+        <w:t>&lt;</w:t>
+      </w:r>
+      <w:r>
+        <w:rPr>
+          <w:b/>
+          <w:bCs/>
+          <w:i/>
+          <w:iCs/>
+          <w:u w:val="single"/>
+        </w:rPr>
+        <w:t>count</w:t>
+      </w:r>
+      <w:r>
+        <w:rPr>
+          <w:b/>
+          <w:bCs/>
+          <w:i/>
+          <w:iCs/>
+          <w:u w:val="single"/>
+        </w:rPr>
+        <w:t>&gt;</w:t>
+      </w:r>
+      <w:r>
+        <w:t xml:space="preserve"> is a one-byte value containing the number of object indices or tile coordinates.</w:t>
+      </w:r>
+    </w:p>
+    <w:p>
+      <w:r>
+        <w:tab/>
+      </w:r>
+      <w:r>
+        <w:rPr>
+          <w:b/>
+          <w:bCs/>
+        </w:rPr>
+        <w:t>&lt;</w:t>
+      </w:r>
+      <w:r>
+        <w:rPr>
+          <w:b/>
+          <w:bCs/>
+          <w:i/>
+          <w:iCs/>
+        </w:rPr>
+        <w:t>object-index</w:t>
+      </w:r>
+      <w:r>
+        <w:rPr>
+          <w:b/>
+          <w:bCs/>
+          <w:i/>
+          <w:iCs/>
+        </w:rPr>
+        <w:t>&gt;</w:t>
+      </w:r>
+      <w:r>
+        <w:rPr>
+          <w:b/>
+          <w:bCs/>
+          <w:i/>
+          <w:iCs/>
+        </w:rPr>
+        <w:t xml:space="preserve"> </w:t>
+      </w:r>
+      <w:r>
+        <w:t xml:space="preserve">is </w:t>
+      </w:r>
+      <w:r>
+        <w:t xml:space="preserve">a one-byte value containing the </w:t>
+      </w:r>
+      <w:r>
+        <w:t>index of a</w:t>
+      </w:r>
+      <w:r>
+        <w:rPr>
+          <w:b/>
+          <w:bCs/>
+          <w:i/>
+          <w:iCs/>
+        </w:rPr>
+        <w:t xml:space="preserve"> </w:t>
+      </w:r>
+      <w:r>
+        <w:t>paired object.</w:t>
+      </w:r>
+    </w:p>
+    <w:p>
+      <w:pPr>
+        <w:ind w:left="720" w:hanging="720"/>
+      </w:pPr>
+      <w:r>
+        <w:tab/>
+      </w:r>
+      <w:r>
+        <w:rPr>
+          <w:b/>
+          <w:bCs/>
+        </w:rPr>
+        <w:t>&lt;</w:t>
+      </w:r>
+      <w:r>
+        <w:rPr>
+          <w:b/>
+          <w:bCs/>
+          <w:i/>
+          <w:iCs/>
+        </w:rPr>
+        <w:t>tile-</w:t>
+      </w:r>
+      <w:r>
+        <w:rPr>
+          <w:b/>
+          <w:bCs/>
+          <w:i/>
+          <w:iCs/>
+        </w:rPr>
+        <w:t>x-</w:t>
+      </w:r>
+      <w:r>
+        <w:rPr>
+          <w:b/>
+          <w:bCs/>
+          <w:i/>
+          <w:iCs/>
+        </w:rPr>
+        <w:t>coord</w:t>
+      </w:r>
+      <w:r>
+        <w:rPr>
+          <w:b/>
+          <w:bCs/>
+          <w:i/>
+          <w:iCs/>
+        </w:rPr>
+        <w:t>&gt;</w:t>
+      </w:r>
+      <w:r>
+        <w:t xml:space="preserve"> and </w:t>
+      </w:r>
+      <w:r>
+        <w:rPr>
+          <w:b/>
+          <w:bCs/>
+        </w:rPr>
+        <w:t>&lt;</w:t>
+      </w:r>
+      <w:r>
+        <w:rPr>
+          <w:b/>
+          <w:bCs/>
+          <w:i/>
+          <w:iCs/>
+        </w:rPr>
+        <w:t>tile-</w:t>
+      </w:r>
+      <w:r>
+        <w:rPr>
+          <w:b/>
+          <w:bCs/>
+          <w:i/>
+          <w:iCs/>
+        </w:rPr>
+        <w:t>y-</w:t>
+      </w:r>
+      <w:r>
+        <w:rPr>
+          <w:b/>
+          <w:bCs/>
+          <w:i/>
+          <w:iCs/>
+        </w:rPr>
+        <w:t>coord</w:t>
+      </w:r>
+      <w:r>
+        <w:rPr>
+          <w:b/>
+          <w:bCs/>
+          <w:i/>
+          <w:iCs/>
+        </w:rPr>
+        <w:t>&gt;</w:t>
+      </w:r>
+      <w:r>
+        <w:t xml:space="preserve"> are two-byte values containing the level X and Y coordinates of a paired tile.</w:t>
+      </w:r>
+    </w:p>
+    <w:p>
+      <w:r>
+        <w:t>This nets to the following memory usage:</w:t>
       </w:r>
     </w:p>
     <w:p>
@@ -21691,16 +22630,210 @@
         </w:numPr>
       </w:pPr>
       <w:r>
-        <w:t>Paired e</w:t>
-      </w:r>
-      <w:r>
-        <w:t xml:space="preserve">levators </w:t>
-      </w:r>
-      <w:r>
-        <w:t xml:space="preserve">and teleports </w:t>
-      </w:r>
-      <w:r>
-        <w:t>become operational</w:t>
+        <w:t xml:space="preserve">Each </w:t>
+      </w:r>
+      <w:r>
+        <w:t>switch require</w:t>
+      </w:r>
+      <w:r>
+        <w:t>s</w:t>
+      </w:r>
+      <w:r>
+        <w:t xml:space="preserve"> 4 bytes (</w:t>
+      </w:r>
+      <w:r>
+        <w:t>switch-</w:t>
+      </w:r>
+      <w:r>
+        <w:t>address + two counts)</w:t>
+      </w:r>
+    </w:p>
+    <w:p>
+      <w:pPr>
+        <w:pStyle w:val="ListParagraph"/>
+        <w:numPr>
+          <w:ilvl w:val="0"/>
+          <w:numId w:val="2"/>
+        </w:numPr>
+      </w:pPr>
+      <w:r>
+        <w:t xml:space="preserve">Each paired object (Dalek, </w:t>
+      </w:r>
+      <w:r>
+        <w:t xml:space="preserve">door, elevator, or teleport) </w:t>
+      </w:r>
+      <w:r>
+        <w:t>require</w:t>
+      </w:r>
+      <w:r>
+        <w:t>s</w:t>
+      </w:r>
+      <w:r>
+        <w:t xml:space="preserve"> 1 byte</w:t>
+      </w:r>
+    </w:p>
+    <w:p>
+      <w:pPr>
+        <w:pStyle w:val="ListParagraph"/>
+        <w:numPr>
+          <w:ilvl w:val="0"/>
+          <w:numId w:val="2"/>
+        </w:numPr>
+      </w:pPr>
+      <w:r>
+        <w:t>Each pa</w:t>
+      </w:r>
+      <w:r>
+        <w:t>ired tile required 4 bytes (</w:t>
+      </w:r>
+      <w:r>
+        <w:t xml:space="preserve">two two-byte </w:t>
+      </w:r>
+      <w:r>
+        <w:t>coord</w:t>
+      </w:r>
+      <w:r>
+        <w:t>inates</w:t>
+      </w:r>
+      <w:r>
+        <w:t>)</w:t>
+      </w:r>
+    </w:p>
+    <w:p>
+      <w:r>
+        <w:t>The level editor was updated to serialize the switch pairings, reporting an error is there if there is insufficient memory to encode all the pairings.</w:t>
+      </w:r>
+    </w:p>
+    <w:p>
+      <w:r>
+        <w:t xml:space="preserve">The </w:t>
+      </w:r>
+      <w:r>
+        <w:t xml:space="preserve">serialized object </w:t>
+      </w:r>
+      <w:r>
+        <w:t xml:space="preserve">descriptors were updated to </w:t>
+      </w:r>
+      <w:r>
+        <w:t xml:space="preserve">include a </w:t>
+      </w:r>
+      <w:r>
+        <w:t>dis</w:t>
+      </w:r>
+      <w:r>
+        <w:t>abled state</w:t>
+      </w:r>
+      <w:r>
+        <w:t xml:space="preserve">, which is set for all paired </w:t>
+      </w:r>
+      <w:r>
+        <w:t xml:space="preserve">doors, </w:t>
+      </w:r>
+      <w:r>
+        <w:t xml:space="preserve">elevators, </w:t>
+      </w:r>
+      <w:r>
+        <w:t xml:space="preserve">and </w:t>
+      </w:r>
+      <w:r>
+        <w:t>teleports.</w:t>
+      </w:r>
+    </w:p>
+    <w:p>
+      <w:r>
+        <w:t>The game code was then modified as follows</w:t>
+      </w:r>
+      <w:r>
+        <w:t>…</w:t>
+      </w:r>
+    </w:p>
+    <w:p>
+      <w:r>
+        <w:t xml:space="preserve">A </w:t>
+      </w:r>
+      <w:r>
+        <w:t>corresponding</w:t>
+      </w:r>
+      <w:r>
+        <w:t xml:space="preserve"> </w:t>
+      </w:r>
+      <w:r>
+        <w:t>disabled state was introduced for elevators, teleports, and doors</w:t>
+      </w:r>
+      <w:r>
+        <w:t xml:space="preserve">, overloading the existing </w:t>
+      </w:r>
+      <w:r>
+        <w:t xml:space="preserve">lasered render flag </w:t>
+      </w:r>
+      <w:r>
+        <w:t>(that</w:t>
+      </w:r>
+      <w:r>
+        <w:t>’s</w:t>
+      </w:r>
+      <w:r>
+        <w:t xml:space="preserve"> used for Daleks).  </w:t>
+      </w:r>
+      <w:r>
+        <w:t xml:space="preserve">The level initialize code was updated to set this state </w:t>
+      </w:r>
+      <w:r>
+        <w:t xml:space="preserve">for </w:t>
+      </w:r>
+      <w:r>
+        <w:t xml:space="preserve">paired </w:t>
+      </w:r>
+      <w:r>
+        <w:t xml:space="preserve">doors, </w:t>
+      </w:r>
+      <w:r>
+        <w:t>elevators</w:t>
+      </w:r>
+      <w:r>
+        <w:t xml:space="preserve">, and </w:t>
+      </w:r>
+      <w:r>
+        <w:t xml:space="preserve">teleports, and their </w:t>
+      </w:r>
+      <w:r>
+        <w:t xml:space="preserve">respective </w:t>
+      </w:r>
+      <w:r>
+        <w:t xml:space="preserve">frame callback routines were modified </w:t>
+      </w:r>
+      <w:r>
+        <w:t xml:space="preserve">to </w:t>
+      </w:r>
+      <w:r>
+        <w:t xml:space="preserve">implement the disabled </w:t>
+      </w:r>
+      <w:r>
+        <w:t>behavior</w:t>
+      </w:r>
+      <w:r>
+        <w:t xml:space="preserve">, </w:t>
+      </w:r>
+      <w:r>
+        <w:t>which do</w:t>
+      </w:r>
+      <w:r>
+        <w:t xml:space="preserve"> </w:t>
+      </w:r>
+      <w:r>
+        <w:t xml:space="preserve">nothing </w:t>
+      </w:r>
+      <w:r>
+        <w:t xml:space="preserve">when </w:t>
+      </w:r>
+      <w:r>
+        <w:t xml:space="preserve">the </w:t>
+      </w:r>
+      <w:r>
+        <w:t xml:space="preserve">disabled state </w:t>
+      </w:r>
+      <w:r>
+        <w:t>flag is set</w:t>
       </w:r>
       <w:r>
         <w:t>.</w:t>
@@ -21708,710 +22841,104 @@
     </w:p>
     <w:p>
       <w:r>
-        <w:t xml:space="preserve">Of course, the last two require that doors, teleports, and elevators can be disabled, which is not currently the case. </w:t>
-      </w:r>
-      <w:r>
-        <w:t xml:space="preserve"> </w:t>
-      </w:r>
-      <w:r>
-        <w:t>Disabled doors</w:t>
-      </w:r>
-      <w:r>
-        <w:t xml:space="preserve">, teleports, and elevator </w:t>
-      </w:r>
-      <w:r>
-        <w:t>don’t animate</w:t>
-      </w:r>
-      <w:r>
-        <w:t xml:space="preserve"> and are not operational.</w:t>
-      </w:r>
-    </w:p>
-    <w:p>
-      <w:pPr>
-        <w:pStyle w:val="Heading3"/>
-      </w:pPr>
-      <w:r>
-        <w:t>Implementation</w:t>
-      </w:r>
-    </w:p>
-    <w:p>
-      <w:r>
-        <w:t>Switches are modelled using two new tile types: SWITCH_OFF and SWITCH_ON.</w:t>
-      </w:r>
-      <w:r>
-        <w:t xml:space="preserve"> </w:t>
-      </w:r>
-    </w:p>
-    <w:p>
-      <w:r>
-        <w:t xml:space="preserve">The level </w:t>
-      </w:r>
-      <w:r>
-        <w:t xml:space="preserve">editor </w:t>
-      </w:r>
-      <w:r>
-        <w:t xml:space="preserve">was updated to </w:t>
-      </w:r>
-      <w:r>
-        <w:t xml:space="preserve">support these and updated to </w:t>
-      </w:r>
-      <w:r>
-        <w:t>enforce that only one SWITCH_OFF and SWITCH_ON tile can be defined</w:t>
-      </w:r>
-      <w:r>
-        <w:t xml:space="preserve"> within a level</w:t>
-      </w:r>
-      <w:r>
-        <w:t>, and that a SWITCH_ON tile must be defined i</w:t>
-      </w:r>
-      <w:r>
-        <w:t>f</w:t>
-      </w:r>
-      <w:r>
-        <w:t xml:space="preserve"> a SWITCH_OFF tile is placed.</w:t>
-      </w:r>
-    </w:p>
-    <w:p>
-      <w:r>
-        <w:t>The editor was also updated allowing game o</w:t>
-      </w:r>
-      <w:r>
-        <w:t xml:space="preserve">bjects and tiles </w:t>
-      </w:r>
-      <w:r>
-        <w:t xml:space="preserve">to be </w:t>
-      </w:r>
-      <w:r>
-        <w:t>paired by control clicking on the switch and then control clicking on objects or tiles.  Switch pairings can be removed by replacing a switch, paired object, or paired tile.</w:t>
-      </w:r>
-    </w:p>
-    <w:p>
-      <w:r>
-        <w:t>The level file format was extended to include a 32-byte data block which encodes the levels’ switch pairings.  The pairings are encoded as follows:</w:t>
-      </w:r>
-    </w:p>
-    <w:p>
-      <w:pPr>
-        <w:ind w:firstLine="720"/>
-        <w:rPr>
-          <w:b/>
-          <w:bCs/>
-        </w:rPr>
-      </w:pPr>
-      <w:r>
-        <w:t>Switch pairings =</w:t>
-      </w:r>
-      <w:r>
-        <w:rPr>
-          <w:i/>
-          <w:iCs/>
-        </w:rPr>
-        <w:t xml:space="preserve"> </w:t>
-      </w:r>
-      <w:r>
-        <w:rPr>
-          <w:b/>
-          <w:bCs/>
-        </w:rPr>
-        <w:t>&lt;</w:t>
-      </w:r>
-      <w:r>
-        <w:rPr>
-          <w:b/>
-          <w:bCs/>
-          <w:i/>
-          <w:iCs/>
-        </w:rPr>
-        <w:t>switch</w:t>
-      </w:r>
-      <w:r>
-        <w:rPr>
-          <w:b/>
-          <w:bCs/>
-          <w:i/>
-          <w:iCs/>
-        </w:rPr>
-        <w:t xml:space="preserve">-record&gt; </w:t>
-      </w:r>
-      <w:r>
-        <w:rPr>
-          <w:b/>
-          <w:bCs/>
-        </w:rPr>
-        <w:t>*</w:t>
-      </w:r>
-    </w:p>
-    <w:p>
-      <w:r>
-        <w:t>Where</w:t>
-      </w:r>
-      <w:r>
-        <w:t>:</w:t>
-      </w:r>
-    </w:p>
-    <w:p>
-      <w:pPr>
-        <w:rPr>
-          <w:b/>
-          <w:bCs/>
-          <w:i/>
-          <w:iCs/>
-        </w:rPr>
-      </w:pPr>
-      <w:r>
-        <w:tab/>
-      </w:r>
-      <w:r>
-        <w:rPr>
-          <w:b/>
-          <w:bCs/>
-        </w:rPr>
-        <w:t>&lt;</w:t>
-      </w:r>
-      <w:r>
-        <w:rPr>
-          <w:b/>
-          <w:bCs/>
-          <w:i/>
-          <w:iCs/>
-        </w:rPr>
-        <w:t>switch-record&gt;</w:t>
-      </w:r>
-      <w:r>
-        <w:rPr>
-          <w:b/>
-          <w:bCs/>
-          <w:i/>
-          <w:iCs/>
-        </w:rPr>
-        <w:t xml:space="preserve"> = &lt;switch-address&gt; &lt;paired-objects&gt; &lt;paired-tiles&gt;</w:t>
-      </w:r>
-    </w:p>
-    <w:p>
-      <w:r>
-        <w:t>Where</w:t>
-      </w:r>
-      <w:r>
-        <w:t>:</w:t>
-      </w:r>
-    </w:p>
-    <w:p>
-      <w:r>
-        <w:tab/>
-      </w:r>
-      <w:r>
-        <w:rPr>
-          <w:b/>
-          <w:bCs/>
-          <w:i/>
-          <w:iCs/>
-        </w:rPr>
-        <w:t>&lt;</w:t>
-      </w:r>
-      <w:r>
-        <w:rPr>
-          <w:b/>
-          <w:bCs/>
-          <w:i/>
-          <w:iCs/>
-        </w:rPr>
-        <w:t>switch-address</w:t>
-      </w:r>
-      <w:r>
-        <w:rPr>
-          <w:b/>
-          <w:bCs/>
-          <w:i/>
-          <w:iCs/>
-        </w:rPr>
-        <w:t xml:space="preserve">&gt; </w:t>
-      </w:r>
-      <w:r>
-        <w:t>is a</w:t>
-      </w:r>
-      <w:r>
-        <w:rPr>
-          <w:b/>
-          <w:bCs/>
-          <w:i/>
-          <w:iCs/>
-        </w:rPr>
-        <w:t xml:space="preserve"> </w:t>
-      </w:r>
-      <w:r>
-        <w:t>two-</w:t>
-      </w:r>
-      <w:r>
-        <w:t>byte</w:t>
-      </w:r>
-      <w:r>
-        <w:rPr>
-          <w:b/>
-          <w:bCs/>
-          <w:i/>
-          <w:iCs/>
-        </w:rPr>
-        <w:t xml:space="preserve"> </w:t>
-      </w:r>
-      <w:r>
-        <w:t>tile grid</w:t>
-      </w:r>
-      <w:r>
-        <w:rPr>
-          <w:b/>
-          <w:bCs/>
-          <w:i/>
-          <w:iCs/>
-        </w:rPr>
-        <w:t xml:space="preserve"> </w:t>
-      </w:r>
-      <w:r>
-        <w:t xml:space="preserve">address </w:t>
-      </w:r>
-      <w:r>
-        <w:t>(little endian format).</w:t>
-      </w:r>
-    </w:p>
-    <w:p>
-      <w:pPr>
-        <w:ind w:firstLine="720"/>
-        <w:rPr>
-          <w:b/>
-          <w:bCs/>
-          <w:i/>
-          <w:iCs/>
-        </w:rPr>
-      </w:pPr>
-      <w:r>
-        <w:rPr>
-          <w:b/>
-          <w:bCs/>
-          <w:i/>
-          <w:iCs/>
-        </w:rPr>
+        <w:t xml:space="preserve">The </w:t>
+      </w:r>
+      <w:r>
+        <w:t xml:space="preserve">destructible wall </w:t>
+      </w:r>
+      <w:r>
+        <w:t>laser hit</w:t>
+      </w:r>
+      <w:r>
+        <w:t>-</w:t>
+      </w:r>
+      <w:r>
+        <w:t xml:space="preserve">testing code was </w:t>
+      </w:r>
+      <w:r>
+        <w:t xml:space="preserve">then </w:t>
+      </w:r>
+      <w:r>
+        <w:t xml:space="preserve">generalized to </w:t>
+      </w:r>
+      <w:r>
+        <w:t xml:space="preserve">also support </w:t>
+      </w:r>
+      <w:r>
+        <w:t>switch-off tiles, replacing these with switch-on tiles</w:t>
+      </w:r>
+      <w:r>
+        <w:t xml:space="preserve"> instead of </w:t>
+      </w:r>
+      <w:r>
+        <w:t xml:space="preserve">a </w:t>
+      </w:r>
+      <w:r>
+        <w:t>space.  The cod</w:t>
+      </w:r>
+      <w:r>
+        <w:t xml:space="preserve">e was also updated </w:t>
+      </w:r>
+      <w:r>
+        <w:t>to activate</w:t>
+      </w:r>
+      <w:r>
+        <w:t xml:space="preserve"> the switch’s paired objects</w:t>
+      </w:r>
+      <w:r>
+        <w:t xml:space="preserve"> by enumerating over the 32-byte </w:t>
+      </w:r>
+      <w:r>
+        <w:t xml:space="preserve">data </w:t>
+      </w:r>
+      <w:r>
+        <w:t>block</w:t>
+      </w:r>
+      <w:r>
+        <w:t xml:space="preserve">, activating the appropriate </w:t>
+      </w:r>
+      <w:r>
+        <w:t xml:space="preserve">paired </w:t>
+      </w:r>
+      <w:r>
+        <w:t>objects.</w:t>
+      </w:r>
+    </w:p>
+    <w:p>
+      <w:r>
+        <w:t>Paired Daleks’ actions are promoted to PACE, paired tiles are replaced with a blank tile, and the disabled state flag is cleared for paired doors, elevators, and teleports.</w:t>
+      </w:r>
+    </w:p>
+    <w:p>
+      <w:r>
+        <w:t>An achievement sound effect was also added when a destructible wall is destroyed, or when a switch turned on</w:t>
+      </w:r>
+      <w:r>
+        <w:t>, to reenforce that something positive occurred.</w:t>
+      </w:r>
+    </w:p>
+    <w:p>
+      <w:r>
         <w:lastRenderedPageBreak/>
-        <w:t>&lt;paired-objects&gt; = &lt;count&gt; &lt;</w:t>
-      </w:r>
-      <w:r>
-        <w:rPr>
-          <w:b/>
-          <w:bCs/>
-          <w:i/>
-          <w:iCs/>
-        </w:rPr>
-        <w:t>object-index</w:t>
-      </w:r>
-      <w:r>
-        <w:rPr>
-          <w:b/>
-          <w:bCs/>
-          <w:i/>
-          <w:iCs/>
-        </w:rPr>
-        <w:t xml:space="preserve">&gt; * </w:t>
-      </w:r>
-    </w:p>
-    <w:p>
-      <w:pPr>
-        <w:ind w:firstLine="720"/>
-      </w:pPr>
-      <w:r>
-        <w:rPr>
-          <w:b/>
-          <w:bCs/>
-          <w:i/>
-          <w:iCs/>
-        </w:rPr>
-        <w:t xml:space="preserve">&lt;paired-tiles&gt; = &lt;count&gt; (&lt;tile-x-coord&gt; &lt;tile-y-coord&gt;) * </w:t>
-      </w:r>
-    </w:p>
-    <w:p>
-      <w:r>
-        <w:t>Where</w:t>
-      </w:r>
-      <w:r>
-        <w:t>:</w:t>
-      </w:r>
-    </w:p>
-    <w:p>
-      <w:pPr>
-        <w:ind w:left="720" w:hanging="720"/>
-      </w:pPr>
-      <w:r>
-        <w:tab/>
-      </w:r>
-      <w:r>
-        <w:rPr>
-          <w:b/>
-          <w:bCs/>
-        </w:rPr>
-        <w:t>&lt;</w:t>
-      </w:r>
-      <w:r>
-        <w:rPr>
-          <w:b/>
-          <w:bCs/>
-          <w:i/>
-          <w:iCs/>
-          <w:u w:val="single"/>
-        </w:rPr>
-        <w:t>count</w:t>
-      </w:r>
-      <w:r>
-        <w:rPr>
-          <w:b/>
-          <w:bCs/>
-          <w:i/>
-          <w:iCs/>
-          <w:u w:val="single"/>
-        </w:rPr>
-        <w:t>&gt;</w:t>
-      </w:r>
-      <w:r>
-        <w:t xml:space="preserve"> is a one-byte value containing the number of object indices or tile coordinates.</w:t>
-      </w:r>
-    </w:p>
-    <w:p>
-      <w:r>
-        <w:tab/>
-      </w:r>
-      <w:r>
-        <w:rPr>
-          <w:b/>
-          <w:bCs/>
-        </w:rPr>
-        <w:t>&lt;</w:t>
-      </w:r>
-      <w:r>
-        <w:rPr>
-          <w:b/>
-          <w:bCs/>
-          <w:i/>
-          <w:iCs/>
-        </w:rPr>
-        <w:t>object-index</w:t>
-      </w:r>
-      <w:r>
-        <w:rPr>
-          <w:b/>
-          <w:bCs/>
-          <w:i/>
-          <w:iCs/>
-        </w:rPr>
-        <w:t>&gt;</w:t>
-      </w:r>
-      <w:r>
-        <w:rPr>
-          <w:b/>
-          <w:bCs/>
-          <w:i/>
-          <w:iCs/>
-        </w:rPr>
-        <w:t xml:space="preserve"> </w:t>
-      </w:r>
-      <w:r>
-        <w:t xml:space="preserve">is </w:t>
-      </w:r>
-      <w:r>
-        <w:t xml:space="preserve">a one-byte value containing the </w:t>
-      </w:r>
-      <w:r>
-        <w:t>index of a</w:t>
-      </w:r>
-      <w:r>
-        <w:rPr>
-          <w:b/>
-          <w:bCs/>
-          <w:i/>
-          <w:iCs/>
-        </w:rPr>
-        <w:t xml:space="preserve"> </w:t>
-      </w:r>
-      <w:r>
-        <w:t>paired object.</w:t>
-      </w:r>
-    </w:p>
-    <w:p>
-      <w:pPr>
-        <w:ind w:left="720" w:hanging="720"/>
-      </w:pPr>
-      <w:r>
-        <w:tab/>
-      </w:r>
-      <w:r>
-        <w:rPr>
-          <w:b/>
-          <w:bCs/>
-        </w:rPr>
-        <w:t>&lt;</w:t>
-      </w:r>
-      <w:r>
-        <w:rPr>
-          <w:b/>
-          <w:bCs/>
-          <w:i/>
-          <w:iCs/>
-        </w:rPr>
-        <w:t>tile-</w:t>
-      </w:r>
-      <w:r>
-        <w:rPr>
-          <w:b/>
-          <w:bCs/>
-          <w:i/>
-          <w:iCs/>
-        </w:rPr>
-        <w:t>x-</w:t>
-      </w:r>
-      <w:r>
-        <w:rPr>
-          <w:b/>
-          <w:bCs/>
-          <w:i/>
-          <w:iCs/>
-        </w:rPr>
-        <w:t>coord</w:t>
-      </w:r>
-      <w:r>
-        <w:rPr>
-          <w:b/>
-          <w:bCs/>
-          <w:i/>
-          <w:iCs/>
-        </w:rPr>
-        <w:t>&gt;</w:t>
-      </w:r>
-      <w:r>
-        <w:t xml:space="preserve"> and </w:t>
-      </w:r>
-      <w:r>
-        <w:rPr>
-          <w:b/>
-          <w:bCs/>
-        </w:rPr>
-        <w:t>&lt;</w:t>
-      </w:r>
-      <w:r>
-        <w:rPr>
-          <w:b/>
-          <w:bCs/>
-          <w:i/>
-          <w:iCs/>
-        </w:rPr>
-        <w:t>tile-</w:t>
-      </w:r>
-      <w:r>
-        <w:rPr>
-          <w:b/>
-          <w:bCs/>
-          <w:i/>
-          <w:iCs/>
-        </w:rPr>
-        <w:t>y-</w:t>
-      </w:r>
-      <w:r>
-        <w:rPr>
-          <w:b/>
-          <w:bCs/>
-          <w:i/>
-          <w:iCs/>
-        </w:rPr>
-        <w:t>coord</w:t>
-      </w:r>
-      <w:r>
-        <w:rPr>
-          <w:b/>
-          <w:bCs/>
-          <w:i/>
-          <w:iCs/>
-        </w:rPr>
-        <w:t>&gt;</w:t>
-      </w:r>
-      <w:r>
-        <w:t xml:space="preserve"> are two-byte values containing the level X and Y coordinates of a paired tile.</w:t>
-      </w:r>
-    </w:p>
-    <w:p>
-      <w:r>
-        <w:t xml:space="preserve">The </w:t>
-      </w:r>
-      <w:r>
-        <w:t xml:space="preserve">serialized </w:t>
-      </w:r>
-      <w:r>
-        <w:t xml:space="preserve">object </w:t>
-      </w:r>
-      <w:r>
-        <w:t xml:space="preserve">descriptors were updated to </w:t>
-      </w:r>
-      <w:r>
-        <w:t xml:space="preserve">include a </w:t>
-      </w:r>
-      <w:r>
-        <w:t>dis</w:t>
-      </w:r>
-      <w:r>
-        <w:t>abled state</w:t>
-      </w:r>
-      <w:r>
-        <w:t xml:space="preserve">, which is set for all paired </w:t>
-      </w:r>
-      <w:r>
-        <w:t>elevators, teleports, and doors.</w:t>
-      </w:r>
-    </w:p>
-    <w:p>
-      <w:r>
-        <w:t>The game code was then modified as follows.</w:t>
-      </w:r>
-    </w:p>
-    <w:p>
-      <w:r>
-        <w:t xml:space="preserve">A </w:t>
-      </w:r>
-      <w:r>
-        <w:t>corresponding</w:t>
-      </w:r>
-      <w:r>
-        <w:t xml:space="preserve"> </w:t>
-      </w:r>
-      <w:r>
-        <w:t>disabled state was introduced for elevators, teleports, and doors</w:t>
-      </w:r>
-      <w:r>
-        <w:t xml:space="preserve">, overloading the existing </w:t>
-      </w:r>
-      <w:r>
-        <w:t xml:space="preserve">lasered render flag </w:t>
-      </w:r>
-      <w:r>
-        <w:t>(that</w:t>
-      </w:r>
-      <w:r>
-        <w:t>’s</w:t>
-      </w:r>
-      <w:r>
-        <w:t xml:space="preserve"> used for Daleks).  </w:t>
-      </w:r>
-      <w:r>
-        <w:t xml:space="preserve">The level initialize code was updated to set this state </w:t>
-      </w:r>
-      <w:r>
-        <w:t xml:space="preserve">on paired elevators, teleports, and doors, and their </w:t>
-      </w:r>
-      <w:r>
-        <w:t xml:space="preserve">respective </w:t>
-      </w:r>
-      <w:r>
-        <w:t xml:space="preserve">frame callback routines were modified </w:t>
-      </w:r>
-      <w:r>
-        <w:t xml:space="preserve">to </w:t>
-      </w:r>
-      <w:r>
-        <w:t xml:space="preserve">implement the disabled </w:t>
-      </w:r>
-      <w:r>
-        <w:t>behavior</w:t>
-      </w:r>
-      <w:r>
-        <w:t xml:space="preserve">, doing nothing </w:t>
-      </w:r>
-      <w:r>
-        <w:t xml:space="preserve">when </w:t>
-      </w:r>
-      <w:r>
-        <w:t xml:space="preserve">the </w:t>
-      </w:r>
-      <w:r>
-        <w:t xml:space="preserve">disabled state </w:t>
-      </w:r>
-      <w:r>
-        <w:t>flag is set</w:t>
-      </w:r>
-      <w:r>
-        <w:t>.</w:t>
-      </w:r>
-    </w:p>
-    <w:p>
-      <w:r>
-        <w:t xml:space="preserve">The </w:t>
-      </w:r>
-      <w:r>
-        <w:t xml:space="preserve">destructible wall </w:t>
-      </w:r>
-      <w:r>
-        <w:t>laser hit</w:t>
-      </w:r>
-      <w:r>
-        <w:t>-</w:t>
-      </w:r>
-      <w:r>
-        <w:t xml:space="preserve">testing code was </w:t>
-      </w:r>
-      <w:r>
-        <w:t xml:space="preserve">then </w:t>
-      </w:r>
-      <w:r>
-        <w:t xml:space="preserve">generalized to </w:t>
-      </w:r>
-      <w:r>
-        <w:t xml:space="preserve">also support </w:t>
-      </w:r>
-      <w:r>
-        <w:t>switch-off tiles, replacing these with switch-on tiles</w:t>
-      </w:r>
-      <w:r>
-        <w:t xml:space="preserve"> instead of </w:t>
-      </w:r>
-      <w:r>
-        <w:t xml:space="preserve">a </w:t>
-      </w:r>
-      <w:r>
-        <w:t>space.  The cod</w:t>
-      </w:r>
-      <w:r>
-        <w:t xml:space="preserve">e was also updated </w:t>
-      </w:r>
-      <w:r>
-        <w:t>to activate</w:t>
-      </w:r>
-      <w:r>
-        <w:t xml:space="preserve"> the switch’s paired objects</w:t>
-      </w:r>
-      <w:r>
-        <w:t xml:space="preserve"> by enumerating over the 32-byte </w:t>
-      </w:r>
-      <w:r>
-        <w:t xml:space="preserve">data </w:t>
-      </w:r>
-      <w:r>
-        <w:t>block</w:t>
-      </w:r>
-      <w:r>
-        <w:t xml:space="preserve">, activating the appropriate </w:t>
-      </w:r>
-      <w:r>
-        <w:t xml:space="preserve">paired </w:t>
-      </w:r>
-      <w:r>
-        <w:t>objects.</w:t>
-      </w:r>
-    </w:p>
-    <w:p>
-      <w:r>
-        <w:t>An achievement sound effect was also added when a destructible wall is destroyed, or when a switch turned on.</w:t>
-      </w:r>
-    </w:p>
-    <w:p>
-      <w:r>
         <w:t>Several</w:t>
       </w:r>
       <w:r>
         <w:t xml:space="preserve"> additional code size optimizations were needed to squeeze in the functionality</w:t>
       </w:r>
       <w:r>
-        <w:t xml:space="preserve"> within the available memory.  These included factoring more duplicated code.</w:t>
+        <w:t xml:space="preserve"> within the available memory.  Th</w:t>
+      </w:r>
+      <w:r>
+        <w:t>is</w:t>
+      </w:r>
+      <w:r>
+        <w:t xml:space="preserve"> included factoring </w:t>
+      </w:r>
+      <w:r>
+        <w:t xml:space="preserve">out </w:t>
+      </w:r>
+      <w:r>
+        <w:t>more duplicated code.</w:t>
       </w:r>
     </w:p>
     <w:p>
@@ -22490,7 +23017,6 @@
     </w:p>
     <w:p>
       <w:r>
-        <w:lastRenderedPageBreak/>
         <w:t>The limited memory on the BBC micro creates a lot of challenges, so finding ways to eke out and repurpose memory is essential.  Thankfully, there are great resources online that help here.</w:t>
       </w:r>
       <w:r>
@@ -23179,6 +23705,7 @@
               <w:jc w:val="center"/>
             </w:pPr>
             <w:r>
+              <w:lastRenderedPageBreak/>
               <w:t>0</w:t>
             </w:r>
             <w:r>
@@ -23883,7 +24410,6 @@
               <w:jc w:val="center"/>
             </w:pPr>
             <w:r>
-              <w:lastRenderedPageBreak/>
               <w:t>3800</w:t>
             </w:r>
           </w:p>
@@ -24433,6 +24959,7 @@
               <w:jc w:val="center"/>
             </w:pPr>
             <w:r>
+              <w:lastRenderedPageBreak/>
               <w:t>4000</w:t>
             </w:r>
           </w:p>
@@ -25070,7 +25597,6 @@
               <w:jc w:val="center"/>
             </w:pPr>
             <w:r>
-              <w:lastRenderedPageBreak/>
               <w:t>7B00</w:t>
             </w:r>
           </w:p>
@@ -25407,6 +25933,7 @@
               <w:jc w:val="center"/>
             </w:pPr>
             <w:r>
+              <w:lastRenderedPageBreak/>
               <w:t>Address (hex)</w:t>
             </w:r>
           </w:p>
@@ -25938,7 +26465,6 @@
               <w:jc w:val="center"/>
             </w:pPr>
             <w:r>
-              <w:lastRenderedPageBreak/>
               <w:t>5</w:t>
             </w:r>
             <w:r>
@@ -26610,6 +27136,7 @@
         </w:numPr>
       </w:pPr>
       <w:r>
+        <w:lastRenderedPageBreak/>
         <w:t>Unrolled</w:t>
       </w:r>
       <w:r>
@@ -26743,7 +27270,6 @@
         </w:numPr>
       </w:pPr>
       <w:r>
-        <w:lastRenderedPageBreak/>
         <w:t xml:space="preserve">Broad clipping is performed </w:t>
       </w:r>
       <w:r>
@@ -26906,7 +27432,13 @@
         <w:t>order</w:t>
       </w:r>
       <w:r>
-        <w:t xml:space="preserve"> array in just a few passes typically.</w:t>
+        <w:t xml:space="preserve"> array in just a few passes</w:t>
+      </w:r>
+      <w:r>
+        <w:t>,</w:t>
+      </w:r>
+      <w:r>
+        <w:t xml:space="preserve"> typically.</w:t>
       </w:r>
     </w:p>
     <w:p>
@@ -26987,7 +27519,7 @@
         <w:t>ing</w:t>
       </w:r>
       <w:r>
-        <w:t xml:space="preserve"> zero-page transient variables as routine parameters and local variables extensively. </w:t>
+        <w:t xml:space="preserve"> zero-page transient variables as routine parameters and local variables extensively.</w:t>
       </w:r>
     </w:p>
     <w:p>
@@ -27042,6 +27574,7 @@
       <w:r>
         <w:t xml:space="preserve">Removed </w:t>
       </w:r>
+      <w:proofErr w:type="spellStart"/>
       <w:r>
         <w:rPr>
           <w:i/>
@@ -27049,9 +27582,11 @@
         </w:rPr>
         <w:t>objectWidth</w:t>
       </w:r>
+      <w:proofErr w:type="spellEnd"/>
       <w:r>
         <w:t xml:space="preserve"> &amp; </w:t>
       </w:r>
+      <w:proofErr w:type="spellStart"/>
       <w:r>
         <w:rPr>
           <w:i/>
@@ -27059,6 +27594,7 @@
         </w:rPr>
         <w:t>objectHeight</w:t>
       </w:r>
+      <w:proofErr w:type="spellEnd"/>
       <w:r>
         <w:t xml:space="preserve"> arrays</w:t>
       </w:r>
@@ -27088,6 +27624,7 @@
       <w:r>
         <w:t xml:space="preserve">, </w:t>
       </w:r>
+      <w:proofErr w:type="spellStart"/>
       <w:r>
         <w:rPr>
           <w:i/>
@@ -27095,12 +27632,14 @@
         </w:rPr>
         <w:t>widthMinusOne</w:t>
       </w:r>
+      <w:proofErr w:type="spellEnd"/>
       <w:r>
         <w:t xml:space="preserve">, </w:t>
       </w:r>
       <w:r>
         <w:t xml:space="preserve">and </w:t>
       </w:r>
+      <w:proofErr w:type="spellStart"/>
       <w:r>
         <w:rPr>
           <w:i/>
@@ -27108,6 +27647,7 @@
         </w:rPr>
         <w:t>heightMinusOne</w:t>
       </w:r>
+      <w:proofErr w:type="spellEnd"/>
       <w:r>
         <w:t xml:space="preserve">.  </w:t>
       </w:r>
@@ -27129,6 +27669,7 @@
       <w:r>
         <w:t xml:space="preserve"> which were previously subtracting one from </w:t>
       </w:r>
+      <w:proofErr w:type="spellStart"/>
       <w:r>
         <w:rPr>
           <w:i/>
@@ -27136,9 +27677,11 @@
         </w:rPr>
         <w:t>objectWidth</w:t>
       </w:r>
+      <w:proofErr w:type="spellEnd"/>
       <w:r>
         <w:t xml:space="preserve"> &amp; </w:t>
       </w:r>
+      <w:proofErr w:type="spellStart"/>
       <w:r>
         <w:rPr>
           <w:i/>
@@ -27160,6 +27703,7 @@
         </w:rPr>
         <w:t>ght</w:t>
       </w:r>
+      <w:proofErr w:type="spellEnd"/>
       <w:r>
         <w:t xml:space="preserve">.  </w:t>
       </w:r>
@@ -27173,8 +27717,10 @@
         </w:numPr>
       </w:pPr>
       <w:r>
+        <w:lastRenderedPageBreak/>
         <w:t xml:space="preserve">Bit-packed </w:t>
       </w:r>
+      <w:proofErr w:type="spellStart"/>
       <w:r>
         <w:rPr>
           <w:i/>
@@ -27182,9 +27728,11 @@
         </w:rPr>
         <w:t>objectType</w:t>
       </w:r>
+      <w:proofErr w:type="spellEnd"/>
       <w:r>
         <w:t xml:space="preserve"> and </w:t>
       </w:r>
+      <w:proofErr w:type="spellStart"/>
       <w:r>
         <w:rPr>
           <w:i/>
@@ -27192,6 +27740,7 @@
         </w:rPr>
         <w:t>objectState</w:t>
       </w:r>
+      <w:proofErr w:type="spellEnd"/>
       <w:r>
         <w:t xml:space="preserve"> array</w:t>
       </w:r>
@@ -27322,7 +27871,6 @@
         </w:numPr>
       </w:pPr>
       <w:r>
-        <w:lastRenderedPageBreak/>
         <w:t>Only c</w:t>
       </w:r>
       <w:r>
@@ -27389,6 +27937,9 @@
         <w:t xml:space="preserve"> Likewise, </w:t>
       </w:r>
       <w:r>
+        <w:t xml:space="preserve">interstitial screen experience and </w:t>
+      </w:r>
+      <w:r>
         <w:t>l</w:t>
       </w:r>
       <w:r>
@@ -27408,45 +27959,6 @@
       </w:r>
       <w:r>
         <w:t>after being loaded</w:t>
-      </w:r>
-      <w:r>
-        <w:t xml:space="preserve">.  The code is not seen because the palette is set to black during </w:t>
-      </w:r>
-      <w:r>
-        <w:t xml:space="preserve">level </w:t>
-      </w:r>
-      <w:r>
-        <w:t xml:space="preserve">loading </w:t>
-      </w:r>
-      <w:r>
-        <w:t>and initialization</w:t>
-      </w:r>
-      <w:r>
-        <w:t>.</w:t>
-      </w:r>
-    </w:p>
-    <w:p>
-      <w:pPr>
-        <w:pStyle w:val="ListParagraph"/>
-        <w:numPr>
-          <w:ilvl w:val="0"/>
-          <w:numId w:val="15"/>
-        </w:numPr>
-      </w:pPr>
-      <w:r>
-        <w:t>Run-length encoded t</w:t>
-      </w:r>
-      <w:r>
-        <w:t>ext</w:t>
-      </w:r>
-      <w:r>
-        <w:t xml:space="preserve"> </w:t>
-      </w:r>
-      <w:r>
-        <w:t>strings</w:t>
-      </w:r>
-      <w:r>
-        <w:t>, compacting their size</w:t>
       </w:r>
       <w:r>
         <w:t>.</w:t>
@@ -27531,6 +28043,7 @@
       <w:r>
         <w:t xml:space="preserve">JMP </w:t>
       </w:r>
+      <w:proofErr w:type="spellStart"/>
       <w:r>
         <w:rPr>
           <w:i/>
@@ -27539,8 +28052,13 @@
         <w:t>xxx</w:t>
       </w:r>
       <w:r>
-        <w:t xml:space="preserve">x instead of JSR </w:t>
-      </w:r>
+        <w:t>x</w:t>
+      </w:r>
+      <w:proofErr w:type="spellEnd"/>
+      <w:r>
+        <w:t xml:space="preserve"> instead of JSR </w:t>
+      </w:r>
+      <w:proofErr w:type="spellStart"/>
       <w:r>
         <w:rPr>
           <w:i/>
@@ -27548,6 +28066,7 @@
         </w:rPr>
         <w:t>xxxx</w:t>
       </w:r>
+      <w:proofErr w:type="spellEnd"/>
       <w:r>
         <w:t xml:space="preserve">, </w:t>
       </w:r>
@@ -27723,6 +28242,7 @@
       <w:r>
         <w:t xml:space="preserve"> and </w:t>
       </w:r>
+      <w:proofErr w:type="spellStart"/>
       <w:r>
         <w:rPr>
           <w:i/>
@@ -27730,6 +28250,7 @@
         </w:rPr>
         <w:t>dalekAnimate</w:t>
       </w:r>
+      <w:proofErr w:type="spellEnd"/>
       <w:r>
         <w:t xml:space="preserve"> routines do this.</w:t>
       </w:r>
@@ -27872,8 +28393,18 @@
           <w:sz w:val="18"/>
           <w:szCs w:val="18"/>
         </w:rPr>
-        <w:t xml:space="preserve"> Bh</w:t>
-      </w:r>
+        <w:t xml:space="preserve"> </w:t>
+      </w:r>
+      <w:proofErr w:type="spellStart"/>
+      <w:r>
+        <w:rPr>
+          <w:rFonts w:ascii="Cascadia Code" w:hAnsi="Cascadia Code"/>
+          <w:sz w:val="18"/>
+          <w:szCs w:val="18"/>
+        </w:rPr>
+        <w:t>Bh</w:t>
+      </w:r>
+      <w:proofErr w:type="spellEnd"/>
       <w:r>
         <w:rPr>
           <w:rFonts w:ascii="Cascadia Code" w:hAnsi="Cascadia Code"/>
@@ -27956,7 +28487,10 @@
     </w:p>
     <w:p>
       <w:r>
-        <w:t xml:space="preserve">The code is quite </w:t>
+        <w:t xml:space="preserve">The code is </w:t>
+      </w:r>
+      <w:r>
+        <w:t xml:space="preserve">fairly </w:t>
       </w:r>
       <w:r>
         <w:t>structured with routines</w:t>
@@ -27976,8 +28510,10 @@
     </w:p>
     <w:p>
       <w:r>
+        <w:lastRenderedPageBreak/>
         <w:t xml:space="preserve">Routines always define a new scope (a wonderful </w:t>
       </w:r>
+      <w:proofErr w:type="spellStart"/>
       <w:r>
         <w:rPr>
           <w:b/>
@@ -27987,13 +28523,13 @@
         </w:rPr>
         <w:t>BeebAsm</w:t>
       </w:r>
+      <w:proofErr w:type="spellEnd"/>
       <w:r>
         <w:t xml:space="preserve"> feature) to limit the scope of contained labels and local data. Nested scopes are not used.</w:t>
       </w:r>
     </w:p>
     <w:p>
       <w:r>
-        <w:lastRenderedPageBreak/>
         <w:t xml:space="preserve">Control flow </w:t>
       </w:r>
       <w:r>
@@ -28605,6 +29141,7 @@
     </w:p>
     <w:p>
       <w:r>
+        <w:lastRenderedPageBreak/>
         <w:t>If K9 dies, the current level is restated.  The user can also choose to restart the current level if they become stuck</w:t>
       </w:r>
       <w:r>
@@ -28613,7 +29150,6 @@
     </w:p>
     <w:p>
       <w:r>
-        <w:lastRenderedPageBreak/>
         <w:t>And unlike many 1980’s games, t</w:t>
       </w:r>
       <w:r>
@@ -28810,14 +29346,11 @@
           <w:b/>
           <w:bCs/>
         </w:rPr>
+        <w:lastRenderedPageBreak/>
         <w:t>Page grids</w:t>
       </w:r>
       <w:r>
-        <w:t xml:space="preserve">.  Early in the development of the game I came up with a level model that allowed for an arbitrary arrangement of pages.  From a data structure perspective, the model was simple and provided for a wide range of interesting level topologies.  </w:t>
-      </w:r>
-      <w:r>
-        <w:lastRenderedPageBreak/>
-        <w:t xml:space="preserve">However, any code that traversed tiles had to deal with potential page boundaries.  The mistake I made was not realizing that choosing such a data structure would require that I adopt an abstraction (function-based or macro-based) to traverse it, which was something I was </w:t>
+        <w:t xml:space="preserve">.  Early in the development of the game I came up with a level model that allowed for an arbitrary arrangement of pages.  From a data structure perspective, the model was simple and provided for a wide range of interesting level topologies.  However, any code that traversed tiles had to deal with potential page boundaries.  The mistake I made was not realizing that choosing such a data structure would require that I adopt an abstraction (function-based or macro-based) to traverse it, which was something I was </w:t>
       </w:r>
       <w:r>
         <w:t xml:space="preserve">not </w:t>
@@ -28871,7 +29404,15 @@
         <w:t xml:space="preserve"> </w:t>
       </w:r>
       <w:r>
-        <w:t>1 overlays, rendering the graphics and text directly over the gameplay screen.  To do this I needed to write custom drawText routines that used the MOS’s character definitions stored at &amp;8000.  Although this worked well, the draw code took up precious bytes and I was forced to</w:t>
+        <w:t xml:space="preserve">1 overlays, rendering the graphics and text directly over the gameplay screen.  To do this I needed to write custom </w:t>
+      </w:r>
+      <w:proofErr w:type="spellStart"/>
+      <w:r>
+        <w:t>drawText</w:t>
+      </w:r>
+      <w:proofErr w:type="spellEnd"/>
+      <w:r>
+        <w:t xml:space="preserve"> routines that used the MOS’s character definitions stored at &amp;8000.  Although this worked well, the draw code took up precious bytes and I was forced to</w:t>
       </w:r>
       <w:r>
         <w:t xml:space="preserve"> </w:t>
@@ -29087,7 +29628,11 @@
         <w:t>rule</w:t>
       </w:r>
       <w:r>
-        <w:t xml:space="preserve"> made spotting address mode mistakes far easier.  All uppercase constants should be proceeded with a ‘#’ and all camel-case constants should not, unless they are being used within </w:t>
+        <w:t xml:space="preserve"> made spotting address mode mistakes far easier.  All uppercase constants should be </w:t>
+      </w:r>
+      <w:r>
+        <w:lastRenderedPageBreak/>
+        <w:t xml:space="preserve">proceeded with a ‘#’ and all camel-case constants should not, unless they are being used within </w:t>
       </w:r>
       <w:r>
         <w:t>#</w:t>
@@ -29107,7 +29652,6 @@
         <w:pStyle w:val="Heading2"/>
       </w:pPr>
       <w:r>
-        <w:lastRenderedPageBreak/>
         <w:t>Resources</w:t>
       </w:r>
     </w:p>
@@ -29165,8 +29709,16 @@
           <w:rPr>
             <w:rStyle w:val="Hyperlink"/>
           </w:rPr>
-          <w:t>mdfs.net/Docs/Comp/BBC/AllMem</w:t>
+          <w:t>mdfs.net/Docs/Comp/BBC/</w:t>
         </w:r>
+        <w:proofErr w:type="spellStart"/>
+        <w:r>
+          <w:rPr>
+            <w:rStyle w:val="Hyperlink"/>
+          </w:rPr>
+          <w:t>AllMem</w:t>
+        </w:r>
+        <w:proofErr w:type="spellEnd"/>
       </w:hyperlink>
     </w:p>
     <w:p>
@@ -29184,8 +29736,16 @@
           <w:rPr>
             <w:rStyle w:val="Hyperlink"/>
           </w:rPr>
-          <w:t>mdfs.net/Docs/Comp/BBC/Disk/DFSMem</w:t>
+          <w:t>mdfs.net/Docs/Comp/BBC/Disk/</w:t>
         </w:r>
+        <w:proofErr w:type="spellStart"/>
+        <w:r>
+          <w:rPr>
+            <w:rStyle w:val="Hyperlink"/>
+          </w:rPr>
+          <w:t>DFSMem</w:t>
+        </w:r>
+        <w:proofErr w:type="spellEnd"/>
       </w:hyperlink>
     </w:p>
     <w:p>
@@ -29223,7 +29783,7 @@
     <mc:AlternateContent>
       <mc:Choice Requires="v">
         <w:pict>
-          <v:shapetype w14:anchorId="41EC9D36" id="_x0000_t75" coordsize="21600,21600" o:spt="75" o:preferrelative="t" path="m@4@5l@4@11@9@11@9@5xe" filled="f" stroked="f">
+          <v:shapetype w14:anchorId="3667FCBE" id="_x0000_t75" coordsize="21600,21600" o:spt="75" o:preferrelative="t" path="m@4@5l@4@11@9@11@9@5xe" filled="f" stroked="f">
             <v:stroke joinstyle="miter"/>
             <v:formulas>
               <v:f eqn="if lineDrawn pixelLineWidth 0"/>
@@ -29249,10 +29809,10 @@
       </mc:Choice>
       <mc:Fallback>
         <w:drawing>
-          <wp:inline distT="0" distB="0" distL="0" distR="0" wp14:anchorId="1BC3CAB8" wp14:editId="4144B01D">
+          <wp:inline distT="0" distB="0" distL="0" distR="0" wp14:anchorId="1B397074" wp14:editId="059BD79A">
             <wp:extent cx="194650" cy="145988"/>
             <wp:effectExtent l="0" t="0" r="0" b="6985"/>
-            <wp:docPr id="365153264" name="Picture 1"/>
+            <wp:docPr id="25279407" name="Picture 1"/>
             <wp:cNvGraphicFramePr>
               <a:graphicFrameLocks xmlns:a="http://schemas.openxmlformats.org/drawingml/2006/main" noChangeAspect="1"/>
             </wp:cNvGraphicFramePr>
@@ -29290,17 +29850,17 @@
     <mc:AlternateContent>
       <mc:Choice Requires="v">
         <w:pict>
-          <v:shape w14:anchorId="68102B66" id="Picture 1" o:spid="_x0000_i1025" type="#_x0000_t75" style="width:15.7pt;height:11.75pt;visibility:visible;mso-wrap-style:square">
+          <v:shape w14:anchorId="29C7DAB3" id="Picture 1" o:spid="_x0000_i1025" type="#_x0000_t75" style="width:15.7pt;height:11.75pt;visibility:visible;mso-wrap-style:square">
             <v:imagedata r:id="rId3" o:title=""/>
           </v:shape>
         </w:pict>
       </mc:Choice>
       <mc:Fallback>
         <w:drawing>
-          <wp:inline distT="0" distB="0" distL="0" distR="0" wp14:anchorId="03251604" wp14:editId="40CA43E3">
+          <wp:inline distT="0" distB="0" distL="0" distR="0" wp14:anchorId="46AAF108" wp14:editId="26EDA1B1">
             <wp:extent cx="199177" cy="149383"/>
             <wp:effectExtent l="0" t="0" r="0" b="3175"/>
-            <wp:docPr id="1250164960" name="Picture 1"/>
+            <wp:docPr id="257653522" name="Picture 1"/>
             <wp:cNvGraphicFramePr>
               <a:graphicFrameLocks xmlns:a="http://schemas.openxmlformats.org/drawingml/2006/main" noChangeAspect="1"/>
             </wp:cNvGraphicFramePr>
@@ -33213,6 +33773,7 @@
   <w:style w:type="character" w:default="1" w:styleId="DefaultParagraphFont">
     <w:name w:val="Default Paragraph Font"/>
     <w:uiPriority w:val="1"/>
+    <w:semiHidden/>
     <w:unhideWhenUsed/>
   </w:style>
   <w:style w:type="table" w:default="1" w:styleId="TableNormal">

</xml_diff>

<commit_message>
Add copy & paste tile functionality to level editor
</commit_message>
<xml_diff>
--- a/docs/Development.docx
+++ b/docs/Development.docx
@@ -491,6 +491,7 @@
       <w:r>
         <w:t xml:space="preserve"> </w:t>
       </w:r>
+      <w:proofErr w:type="spellStart"/>
       <w:r>
         <w:rPr>
           <w:b/>
@@ -500,6 +501,7 @@
         </w:rPr>
         <w:t>BeebAsm</w:t>
       </w:r>
+      <w:proofErr w:type="spellEnd"/>
       <w:r>
         <w:t>, an excellent assembler th</w:t>
       </w:r>
@@ -509,6 +511,7 @@
       <w:r>
         <w:t xml:space="preserve">I could use on Windows to produce an SSD, which I could then run in </w:t>
       </w:r>
+      <w:proofErr w:type="spellStart"/>
       <w:r>
         <w:rPr>
           <w:b/>
@@ -519,6 +522,7 @@
         <w:lastRenderedPageBreak/>
         <w:t>BeebEm</w:t>
       </w:r>
+      <w:proofErr w:type="spellEnd"/>
       <w:r>
         <w:t>, an emulator</w:t>
       </w:r>
@@ -625,7 +629,15 @@
         <w:t>d</w:t>
       </w:r>
       <w:r>
-        <w:t xml:space="preserve"> the repro to </w:t>
+        <w:t xml:space="preserve"> the </w:t>
+      </w:r>
+      <w:proofErr w:type="gramStart"/>
+      <w:r>
+        <w:t>repro</w:t>
+      </w:r>
+      <w:proofErr w:type="gramEnd"/>
+      <w:r>
+        <w:t xml:space="preserve"> to </w:t>
       </w:r>
       <w:r>
         <w:rPr>
@@ -644,6 +656,7 @@
       <w:r>
         <w:t xml:space="preserve">After looking at some examples that were installed with </w:t>
       </w:r>
+      <w:proofErr w:type="spellStart"/>
       <w:r>
         <w:rPr>
           <w:b/>
@@ -653,6 +666,7 @@
         </w:rPr>
         <w:t>BeebAsm</w:t>
       </w:r>
+      <w:proofErr w:type="spellEnd"/>
       <w:r>
         <w:t xml:space="preserve">, I </w:t>
       </w:r>
@@ -787,6 +801,7 @@
       <w:r>
         <w:t xml:space="preserve">The prototype was based on </w:t>
       </w:r>
+      <w:proofErr w:type="spellStart"/>
       <w:r>
         <w:rPr>
           <w:b/>
@@ -805,6 +820,7 @@
         </w:rPr>
         <w:t>’s</w:t>
       </w:r>
+      <w:proofErr w:type="spellEnd"/>
       <w:r>
         <w:t xml:space="preserve"> </w:t>
       </w:r>
@@ -919,8 +935,13 @@
       <w:r>
         <w:t xml:space="preserve">ith </w:t>
       </w:r>
-      <w:r>
-        <w:t xml:space="preserve">code that </w:t>
+      <w:proofErr w:type="gramStart"/>
+      <w:r>
+        <w:t>code</w:t>
+      </w:r>
+      <w:proofErr w:type="gramEnd"/>
+      <w:r>
+        <w:t xml:space="preserve"> that </w:t>
       </w:r>
       <w:r>
         <w:t xml:space="preserve">cleared and rendered </w:t>
@@ -2156,7 +2177,15 @@
         <w:t>data, plus a hard-coded level page</w:t>
       </w:r>
       <w:r>
-        <w:t xml:space="preserve"> into the prototype, and implemented a </w:t>
+        <w:t xml:space="preserve"> into the </w:t>
+      </w:r>
+      <w:proofErr w:type="gramStart"/>
+      <w:r>
+        <w:t>prototype, and</w:t>
+      </w:r>
+      <w:proofErr w:type="gramEnd"/>
+      <w:r>
+        <w:t xml:space="preserve"> implemented a </w:t>
       </w:r>
       <w:r>
         <w:rPr>
@@ -2515,6 +2544,7 @@
       <w:r>
         <w:t xml:space="preserve"> and </w:t>
       </w:r>
+      <w:proofErr w:type="spellStart"/>
       <w:r>
         <w:rPr>
           <w:b/>
@@ -2533,6 +2563,7 @@
         </w:rPr>
         <w:t>lekAnimate</w:t>
       </w:r>
+      <w:proofErr w:type="spellEnd"/>
       <w:r>
         <w:t xml:space="preserve"> </w:t>
       </w:r>
@@ -2871,6 +2902,7 @@
       <w:r>
         <w:t xml:space="preserve"> using the </w:t>
       </w:r>
+      <w:proofErr w:type="spellStart"/>
       <w:r>
         <w:rPr>
           <w:b/>
@@ -2885,7 +2917,15 @@
           <w:b/>
           <w:bCs/>
         </w:rPr>
-        <w:t xml:space="preserve">’s </w:t>
+        <w:t>’s</w:t>
+      </w:r>
+      <w:proofErr w:type="spellEnd"/>
+      <w:r>
+        <w:rPr>
+          <w:b/>
+          <w:bCs/>
+        </w:rPr>
+        <w:t xml:space="preserve"> </w:t>
       </w:r>
       <w:r>
         <w:rPr>
@@ -3847,7 +3887,15 @@
     <w:p>
       <w:r>
         <w:lastRenderedPageBreak/>
-        <w:t>I updated the level model to hold this occupancy information directly within the page tile grids, which up until this point just held tile indices (values 0..31).  I used one of the three unused bits</w:t>
+        <w:t xml:space="preserve">I updated the level model to hold this occupancy information directly within the page tile grids, which up until this point just held tile indices (values </w:t>
+      </w:r>
+      <w:proofErr w:type="gramStart"/>
+      <w:r>
+        <w:t>0..</w:t>
+      </w:r>
+      <w:proofErr w:type="gramEnd"/>
+      <w:r>
+        <w:t>31).  I used one of the three unused bits</w:t>
       </w:r>
       <w:r>
         <w:t xml:space="preserve"> </w:t>
@@ -4559,6 +4607,7 @@
           <w:bCs/>
         </w:rPr>
       </w:pPr>
+      <w:proofErr w:type="spellStart"/>
       <w:r>
         <w:rPr>
           <w:b/>
@@ -4566,6 +4615,7 @@
         </w:rPr>
         <w:t>objectXLo</w:t>
       </w:r>
+      <w:proofErr w:type="spellEnd"/>
       <w:r>
         <w:rPr>
           <w:b/>
@@ -4573,6 +4623,7 @@
         </w:rPr>
         <w:t xml:space="preserve"> &amp; </w:t>
       </w:r>
+      <w:proofErr w:type="spellStart"/>
       <w:r>
         <w:rPr>
           <w:b/>
@@ -4580,6 +4631,7 @@
         </w:rPr>
         <w:t>objectXHi</w:t>
       </w:r>
+      <w:proofErr w:type="spellEnd"/>
       <w:r>
         <w:rPr>
           <w:b/>
@@ -4612,21 +4664,31 @@
           <w:bCs/>
         </w:rPr>
       </w:pPr>
+      <w:proofErr w:type="spellStart"/>
       <w:r>
         <w:rPr>
           <w:b/>
           <w:bCs/>
         </w:rPr>
         <w:lastRenderedPageBreak/>
-        <w:t xml:space="preserve">objectYLo </w:t>
-      </w:r>
+        <w:t>objectYLo</w:t>
+      </w:r>
+      <w:proofErr w:type="spellEnd"/>
       <w:r>
         <w:rPr>
           <w:b/>
           <w:bCs/>
         </w:rPr>
+        <w:t xml:space="preserve"> </w:t>
+      </w:r>
+      <w:r>
+        <w:rPr>
+          <w:b/>
+          <w:bCs/>
+        </w:rPr>
         <w:t xml:space="preserve">&amp; </w:t>
       </w:r>
+      <w:proofErr w:type="spellStart"/>
       <w:r>
         <w:rPr>
           <w:b/>
@@ -4634,6 +4696,7 @@
         </w:rPr>
         <w:t>objectYHi</w:t>
       </w:r>
+      <w:proofErr w:type="spellEnd"/>
       <w:r>
         <w:rPr>
           <w:b/>
@@ -4644,11 +4707,16 @@
       <w:r>
         <w:t xml:space="preserve">Object’s </w:t>
       </w:r>
+      <w:proofErr w:type="gramStart"/>
       <w:r>
         <w:t xml:space="preserve">top </w:t>
       </w:r>
       <w:r>
-        <w:t xml:space="preserve">level </w:t>
+        <w:t>level</w:t>
+      </w:r>
+      <w:proofErr w:type="gramEnd"/>
+      <w:r>
+        <w:t xml:space="preserve"> </w:t>
       </w:r>
       <w:r>
         <w:t>coordinate</w:t>
@@ -4669,13 +4737,31 @@
           <w:bCs/>
         </w:rPr>
       </w:pPr>
+      <w:proofErr w:type="spellStart"/>
       <w:r>
         <w:rPr>
           <w:b/>
           <w:bCs/>
         </w:rPr>
-        <w:t>objectWidth &amp; objectHeight</w:t>
-      </w:r>
+        <w:t>objectWidth</w:t>
+      </w:r>
+      <w:proofErr w:type="spellEnd"/>
+      <w:r>
+        <w:rPr>
+          <w:b/>
+          <w:bCs/>
+        </w:rPr>
+        <w:t xml:space="preserve"> &amp; </w:t>
+      </w:r>
+      <w:proofErr w:type="spellStart"/>
+      <w:r>
+        <w:rPr>
+          <w:b/>
+          <w:bCs/>
+        </w:rPr>
+        <w:t>objectHeight</w:t>
+      </w:r>
+      <w:proofErr w:type="spellEnd"/>
       <w:r>
         <w:rPr>
           <w:b/>
@@ -4702,6 +4788,7 @@
           <w:bCs/>
         </w:rPr>
       </w:pPr>
+      <w:proofErr w:type="spellStart"/>
       <w:r>
         <w:rPr>
           <w:b/>
@@ -4709,6 +4796,7 @@
         </w:rPr>
         <w:t>objectAnimation</w:t>
       </w:r>
+      <w:proofErr w:type="spellEnd"/>
       <w:r>
         <w:rPr>
           <w:b/>
@@ -4741,6 +4829,7 @@
           <w:bCs/>
         </w:rPr>
       </w:pPr>
+      <w:proofErr w:type="spellStart"/>
       <w:r>
         <w:rPr>
           <w:b/>
@@ -4748,6 +4837,7 @@
         </w:rPr>
         <w:t>objectState</w:t>
       </w:r>
+      <w:proofErr w:type="spellEnd"/>
       <w:r>
         <w:rPr>
           <w:b/>
@@ -4839,6 +4929,7 @@
           <w:bCs/>
         </w:rPr>
       </w:pPr>
+      <w:proofErr w:type="spellStart"/>
       <w:r>
         <w:rPr>
           <w:b/>
@@ -4846,6 +4937,7 @@
         </w:rPr>
         <w:t>objectSpriteIndex</w:t>
       </w:r>
+      <w:proofErr w:type="spellEnd"/>
       <w:r>
         <w:rPr>
           <w:b/>
@@ -4880,13 +4972,31 @@
           <w:numId w:val="8"/>
         </w:numPr>
       </w:pPr>
+      <w:proofErr w:type="spellStart"/>
       <w:r>
         <w:rPr>
           <w:b/>
           <w:bCs/>
         </w:rPr>
-        <w:t>objectFrameCallbackLo &amp; objectFrameCallbackHi</w:t>
-      </w:r>
+        <w:t>objectFrameCallbackLo</w:t>
+      </w:r>
+      <w:proofErr w:type="spellEnd"/>
+      <w:r>
+        <w:rPr>
+          <w:b/>
+          <w:bCs/>
+        </w:rPr>
+        <w:t xml:space="preserve"> &amp; </w:t>
+      </w:r>
+      <w:proofErr w:type="spellStart"/>
+      <w:r>
+        <w:rPr>
+          <w:b/>
+          <w:bCs/>
+        </w:rPr>
+        <w:t>objectFrameCallbackHi</w:t>
+      </w:r>
+      <w:proofErr w:type="spellEnd"/>
       <w:r>
         <w:rPr>
           <w:b/>
@@ -4934,6 +5044,7 @@
           <w:bCs/>
         </w:rPr>
       </w:pPr>
+      <w:proofErr w:type="spellStart"/>
       <w:r>
         <w:rPr>
           <w:b/>
@@ -4941,6 +5052,7 @@
         </w:rPr>
         <w:t>objectFrameCounter</w:t>
       </w:r>
+      <w:proofErr w:type="spellEnd"/>
       <w:r>
         <w:rPr>
           <w:b/>
@@ -5398,7 +5510,15 @@
         <w:t>eight</w:t>
       </w:r>
       <w:r>
-        <w:t xml:space="preserve"> tiles as being </w:t>
+        <w:t xml:space="preserve"> tiles </w:t>
+      </w:r>
+      <w:proofErr w:type="gramStart"/>
+      <w:r>
+        <w:t>as being</w:t>
+      </w:r>
+      <w:proofErr w:type="gramEnd"/>
+      <w:r>
+        <w:t xml:space="preserve"> </w:t>
       </w:r>
       <w:r>
         <w:rPr>
@@ -6086,7 +6206,23 @@
         <w:t>by something</w:t>
       </w:r>
       <w:r>
-        <w:t>, and bits 0..5 hold the tile index (values 0..31).</w:t>
+        <w:t xml:space="preserve">, and bits </w:t>
+      </w:r>
+      <w:proofErr w:type="gramStart"/>
+      <w:r>
+        <w:t>0..</w:t>
+      </w:r>
+      <w:proofErr w:type="gramEnd"/>
+      <w:r>
+        <w:t xml:space="preserve">5 hold the tile index (values </w:t>
+      </w:r>
+      <w:proofErr w:type="gramStart"/>
+      <w:r>
+        <w:t>0..</w:t>
+      </w:r>
+      <w:proofErr w:type="gramEnd"/>
+      <w:r>
+        <w:t>31).</w:t>
       </w:r>
       <w:r>
         <w:t xml:space="preserve"> </w:t>
@@ -6257,6 +6393,7 @@
       <w:r>
         <w:t xml:space="preserve">setting </w:t>
       </w:r>
+      <w:proofErr w:type="spellStart"/>
       <w:r>
         <w:rPr>
           <w:i/>
@@ -6278,6 +6415,7 @@
         </w:rPr>
         <w:t>Addr</w:t>
       </w:r>
+      <w:proofErr w:type="spellEnd"/>
       <w:r>
         <w:t xml:space="preserve"> </w:t>
       </w:r>
@@ -6377,6 +6515,7 @@
       <w:r>
         <w:t xml:space="preserve">in the low nibble of </w:t>
       </w:r>
+      <w:proofErr w:type="spellStart"/>
       <w:r>
         <w:rPr>
           <w:i/>
@@ -6384,6 +6523,7 @@
         </w:rPr>
         <w:t>objectState</w:t>
       </w:r>
+      <w:proofErr w:type="spellEnd"/>
       <w:r>
         <w:t xml:space="preserve"> array</w:t>
       </w:r>
@@ -6452,10 +6592,18 @@
         <w:t xml:space="preserve">As an aside, I later enhanced the door logic so that once a door is unlocked with a key, it remains unlocked until a Dalek </w:t>
       </w:r>
       <w:r>
-        <w:t>uses the door</w:t>
-      </w:r>
-      <w:r>
-        <w:t>, and locks it again.</w:t>
+        <w:t xml:space="preserve">uses the </w:t>
+      </w:r>
+      <w:proofErr w:type="gramStart"/>
+      <w:r>
+        <w:t>door</w:t>
+      </w:r>
+      <w:r>
+        <w:t>, and</w:t>
+      </w:r>
+      <w:proofErr w:type="gramEnd"/>
+      <w:r>
+        <w:t xml:space="preserve"> locks it again.</w:t>
       </w:r>
     </w:p>
     <w:p>
@@ -6650,6 +6798,7 @@
       <w:r>
         <w:t xml:space="preserve"> </w:t>
       </w:r>
+      <w:proofErr w:type="spellStart"/>
       <w:r>
         <w:rPr>
           <w:i/>
@@ -6657,6 +6806,7 @@
         </w:rPr>
         <w:t>clearTile</w:t>
       </w:r>
+      <w:proofErr w:type="spellEnd"/>
       <w:r>
         <w:t xml:space="preserve"> </w:t>
       </w:r>
@@ -6671,6 +6821,7 @@
       <w:r>
         <w:t xml:space="preserve">The </w:t>
       </w:r>
+      <w:proofErr w:type="spellStart"/>
       <w:r>
         <w:rPr>
           <w:i/>
@@ -6678,6 +6829,7 @@
         </w:rPr>
         <w:t>clearTile</w:t>
       </w:r>
+      <w:proofErr w:type="spellEnd"/>
       <w:r>
         <w:t xml:space="preserve"> </w:t>
       </w:r>
@@ -6921,10 +7073,23 @@
         <w:t xml:space="preserve"> and </w:t>
       </w:r>
       <w:r>
-        <w:t>extended the number of supported digits from four (0..3) to ten (</w:t>
-      </w:r>
-      <w:r>
-        <w:t>0..9).</w:t>
+        <w:t>extended the number of supported digits from four (</w:t>
+      </w:r>
+      <w:proofErr w:type="gramStart"/>
+      <w:r>
+        <w:t>0..</w:t>
+      </w:r>
+      <w:proofErr w:type="gramEnd"/>
+      <w:r>
+        <w:t>3) to ten (</w:t>
+      </w:r>
+      <w:proofErr w:type="gramStart"/>
+      <w:r>
+        <w:t>0..</w:t>
+      </w:r>
+      <w:proofErr w:type="gramEnd"/>
+      <w:r>
+        <w:t>9).</w:t>
       </w:r>
       <w:r>
         <w:t xml:space="preserve">  Numerous code size optimizations were needed to free up sufficient space for the</w:t>
@@ -7359,7 +7524,15 @@
         <w:t>the elevator stops.</w:t>
       </w:r>
       <w:r>
-        <w:t xml:space="preserve">  The objectFrameCount is repurposed for this.</w:t>
+        <w:t xml:space="preserve">  The </w:t>
+      </w:r>
+      <w:proofErr w:type="spellStart"/>
+      <w:r>
+        <w:t>objectFrameCount</w:t>
+      </w:r>
+      <w:proofErr w:type="spellEnd"/>
+      <w:r>
+        <w:t xml:space="preserve"> is repurposed for this.</w:t>
       </w:r>
     </w:p>
     <w:p>
@@ -7371,7 +7544,15 @@
         </w:numPr>
       </w:pPr>
       <w:r>
-        <w:t xml:space="preserve">Mark K9 and the elevator game objects as both ascending or descending by populating their respective objectState’s </w:t>
+        <w:t xml:space="preserve">Mark K9 and the elevator game objects as both ascending or descending by populating their respective </w:t>
+      </w:r>
+      <w:proofErr w:type="spellStart"/>
+      <w:r>
+        <w:t>objectState’s</w:t>
+      </w:r>
+      <w:proofErr w:type="spellEnd"/>
+      <w:r>
+        <w:t xml:space="preserve"> </w:t>
       </w:r>
       <w:r>
         <w:rPr>
@@ -7755,6 +7936,7 @@
       <w:r>
         <w:t xml:space="preserve">stored in </w:t>
       </w:r>
+      <w:proofErr w:type="spellStart"/>
       <w:r>
         <w:rPr>
           <w:i/>
@@ -7763,6 +7945,7 @@
         </w:rPr>
         <w:t>objectFrameCounter</w:t>
       </w:r>
+      <w:proofErr w:type="spellEnd"/>
       <w:r>
         <w:t xml:space="preserve"> variable</w:t>
       </w:r>
@@ -7926,6 +8109,7 @@
       <w:r>
         <w:t xml:space="preserve">checking the erase-above and erase-below </w:t>
       </w:r>
+      <w:proofErr w:type="spellStart"/>
       <w:r>
         <w:rPr>
           <w:i/>
@@ -7940,6 +8124,7 @@
         </w:rPr>
         <w:t>’s</w:t>
       </w:r>
+      <w:proofErr w:type="spellEnd"/>
       <w:r>
         <w:t xml:space="preserve"> render flags</w:t>
       </w:r>
@@ -8540,6 +8725,7 @@
       <w:r>
         <w:t xml:space="preserve">A zero-page </w:t>
       </w:r>
+      <w:proofErr w:type="spellStart"/>
       <w:r>
         <w:rPr>
           <w:i/>
@@ -8547,6 +8733,7 @@
         </w:rPr>
         <w:t>laserFrameCount</w:t>
       </w:r>
+      <w:proofErr w:type="spellEnd"/>
       <w:r>
         <w:t xml:space="preserve"> variable was introduced which controls laser rendering.  </w:t>
       </w:r>
@@ -8574,6 +8761,7 @@
       <w:r>
         <w:t xml:space="preserve">sets </w:t>
       </w:r>
+      <w:proofErr w:type="spellStart"/>
       <w:r>
         <w:rPr>
           <w:i/>
@@ -8581,6 +8769,7 @@
         </w:rPr>
         <w:t>laserFrameCount</w:t>
       </w:r>
+      <w:proofErr w:type="spellEnd"/>
       <w:r>
         <w:rPr>
           <w:i/>
@@ -8597,6 +8786,7 @@
       <w:r>
         <w:t xml:space="preserve">and </w:t>
       </w:r>
+      <w:proofErr w:type="spellStart"/>
       <w:r>
         <w:rPr>
           <w:i/>
@@ -8604,6 +8794,7 @@
         </w:rPr>
         <w:t>laserFrameCount</w:t>
       </w:r>
+      <w:proofErr w:type="spellEnd"/>
       <w:r>
         <w:rPr>
           <w:i/>
@@ -8654,6 +8845,7 @@
       <w:r>
         <w:t xml:space="preserve">the </w:t>
       </w:r>
+      <w:proofErr w:type="spellStart"/>
       <w:r>
         <w:rPr>
           <w:i/>
@@ -8661,6 +8853,7 @@
         </w:rPr>
         <w:t>objectState</w:t>
       </w:r>
+      <w:proofErr w:type="spellEnd"/>
       <w:r>
         <w:t xml:space="preserve"> variable</w:t>
       </w:r>
@@ -8764,6 +8957,7 @@
       <w:r>
         <w:t xml:space="preserve"> above. This is the fourth render flag in the high nibble of the </w:t>
       </w:r>
+      <w:proofErr w:type="spellStart"/>
       <w:r>
         <w:rPr>
           <w:i/>
@@ -8771,6 +8965,7 @@
         </w:rPr>
         <w:t>objectState</w:t>
       </w:r>
+      <w:proofErr w:type="spellEnd"/>
       <w:r>
         <w:t xml:space="preserve"> variable.</w:t>
       </w:r>
@@ -8815,7 +9010,15 @@
     </w:p>
     <w:p>
       <w:r>
-        <w:t>As development progressed, more and more feature</w:t>
+        <w:t xml:space="preserve">As development progressed, </w:t>
+      </w:r>
+      <w:proofErr w:type="gramStart"/>
+      <w:r>
+        <w:t>more and more</w:t>
+      </w:r>
+      <w:proofErr w:type="gramEnd"/>
+      <w:r>
+        <w:t xml:space="preserve"> feature</w:t>
       </w:r>
       <w:r>
         <w:t>s</w:t>
@@ -8894,6 +9097,7 @@
       <w:r>
         <w:t xml:space="preserve"> </w:t>
       </w:r>
+      <w:proofErr w:type="spellStart"/>
       <w:r>
         <w:rPr>
           <w:i/>
@@ -8901,6 +9105,7 @@
         </w:rPr>
         <w:t>debugTileGridFlags</w:t>
       </w:r>
+      <w:proofErr w:type="spellEnd"/>
       <w:r>
         <w:t xml:space="preserve"> routine that rendered a little box </w:t>
       </w:r>
@@ -8990,6 +9195,7 @@
       <w:r>
         <w:t xml:space="preserve">to allow </w:t>
       </w:r>
+      <w:proofErr w:type="spellStart"/>
       <w:r>
         <w:rPr>
           <w:i/>
@@ -8997,6 +9203,7 @@
         </w:rPr>
         <w:t>debugTileGridFlags</w:t>
       </w:r>
+      <w:proofErr w:type="spellEnd"/>
       <w:r>
         <w:rPr>
           <w:i/>
@@ -10576,6 +10783,7 @@
       <w:r>
         <w:t xml:space="preserve">replaced </w:t>
       </w:r>
+      <w:proofErr w:type="spellStart"/>
       <w:r>
         <w:rPr>
           <w:i/>
@@ -10583,9 +10791,11 @@
         </w:rPr>
         <w:t>objectWidth</w:t>
       </w:r>
+      <w:proofErr w:type="spellEnd"/>
       <w:r>
         <w:t xml:space="preserve"> and </w:t>
       </w:r>
+      <w:proofErr w:type="spellStart"/>
       <w:r>
         <w:rPr>
           <w:i/>
@@ -10593,18 +10803,35 @@
         </w:rPr>
         <w:t>objectHeight</w:t>
       </w:r>
+      <w:proofErr w:type="spellEnd"/>
       <w:r>
         <w:t xml:space="preserve"> game </w:t>
       </w:r>
       <w:r>
         <w:lastRenderedPageBreak/>
-        <w:t>object arrays with a function</w:t>
-      </w:r>
-      <w:r>
-        <w:t xml:space="preserve"> that used a small lookup table instead</w:t>
-      </w:r>
-      <w:r>
-        <w:t xml:space="preserve">, caching the </w:t>
+        <w:t xml:space="preserve">object arrays with </w:t>
+      </w:r>
+      <w:proofErr w:type="gramStart"/>
+      <w:r>
+        <w:t>a function</w:t>
+      </w:r>
+      <w:r>
+        <w:t xml:space="preserve"> that used a</w:t>
+      </w:r>
+      <w:proofErr w:type="gramEnd"/>
+      <w:r>
+        <w:t xml:space="preserve"> small lookup table instead</w:t>
+      </w:r>
+      <w:r>
+        <w:t xml:space="preserve">, </w:t>
+      </w:r>
+      <w:proofErr w:type="gramStart"/>
+      <w:r>
+        <w:t>caching</w:t>
+      </w:r>
+      <w:proofErr w:type="gramEnd"/>
+      <w:r>
+        <w:t xml:space="preserve"> the </w:t>
       </w:r>
       <w:r>
         <w:rPr>
@@ -10632,6 +10859,7 @@
       <w:r>
         <w:t xml:space="preserve">, and </w:t>
       </w:r>
+      <w:proofErr w:type="spellStart"/>
       <w:r>
         <w:rPr>
           <w:i/>
@@ -10639,9 +10867,11 @@
         </w:rPr>
         <w:t>widthMinusOne</w:t>
       </w:r>
+      <w:proofErr w:type="spellEnd"/>
       <w:r>
         <w:t xml:space="preserve"> and </w:t>
       </w:r>
+      <w:proofErr w:type="spellStart"/>
       <w:r>
         <w:rPr>
           <w:i/>
@@ -10663,6 +10893,7 @@
         </w:rPr>
         <w:t>sOne</w:t>
       </w:r>
+      <w:proofErr w:type="spellEnd"/>
       <w:r>
         <w:t>.</w:t>
       </w:r>
@@ -10711,7 +10942,15 @@
         <w:t xml:space="preserve"> I </w:t>
       </w:r>
       <w:r>
-        <w:t xml:space="preserve">stored the object type in the objectAnimation game object array, </w:t>
+        <w:t xml:space="preserve">stored the object type in the </w:t>
+      </w:r>
+      <w:proofErr w:type="spellStart"/>
+      <w:r>
+        <w:t>objectAnimation</w:t>
+      </w:r>
+      <w:proofErr w:type="spellEnd"/>
+      <w:r>
+        <w:t xml:space="preserve"> game object array, </w:t>
       </w:r>
       <w:r>
         <w:t xml:space="preserve">shifting up the other values, and </w:t>
@@ -10729,8 +10968,13 @@
         <w:t xml:space="preserve">array </w:t>
       </w:r>
       <w:r>
-        <w:t>to objectType</w:t>
-      </w:r>
+        <w:t xml:space="preserve">to </w:t>
+      </w:r>
+      <w:proofErr w:type="spellStart"/>
+      <w:r>
+        <w:t>objectType</w:t>
+      </w:r>
+      <w:proofErr w:type="spellEnd"/>
       <w:r>
         <w:t>.</w:t>
       </w:r>
@@ -11542,6 +11786,7 @@
       <w:r>
         <w:t xml:space="preserve">I then wrote a </w:t>
       </w:r>
+      <w:proofErr w:type="spellStart"/>
       <w:r>
         <w:rPr>
           <w:i/>
@@ -11549,6 +11794,7 @@
         </w:rPr>
         <w:t>loadLevel</w:t>
       </w:r>
+      <w:proofErr w:type="spellEnd"/>
       <w:r>
         <w:t xml:space="preserve"> </w:t>
       </w:r>
@@ -11579,6 +11825,7 @@
       <w:r>
         <w:t xml:space="preserve">the loaded </w:t>
       </w:r>
+      <w:proofErr w:type="spellStart"/>
       <w:r>
         <w:rPr>
           <w:i/>
@@ -11586,6 +11833,7 @@
         </w:rPr>
         <w:t>initializeLevel</w:t>
       </w:r>
+      <w:proofErr w:type="spellEnd"/>
       <w:r>
         <w:t xml:space="preserve"> </w:t>
       </w:r>
@@ -11598,6 +11846,7 @@
       <w:r>
         <w:t xml:space="preserve">  A </w:t>
       </w:r>
+      <w:proofErr w:type="spellStart"/>
       <w:r>
         <w:rPr>
           <w:i/>
@@ -11605,6 +11854,7 @@
         </w:rPr>
         <w:t>showLevel</w:t>
       </w:r>
+      <w:proofErr w:type="spellEnd"/>
       <w:r>
         <w:t xml:space="preserve"> routine </w:t>
       </w:r>
@@ -11835,6 +12085,7 @@
       <w:r>
         <w:t xml:space="preserve"> a level, and a ‘R’ key handler was implemented to call the </w:t>
       </w:r>
+      <w:proofErr w:type="spellStart"/>
       <w:r>
         <w:rPr>
           <w:i/>
@@ -11842,12 +12093,14 @@
         </w:rPr>
         <w:t>loadLevel</w:t>
       </w:r>
+      <w:proofErr w:type="spellEnd"/>
       <w:r>
         <w:t xml:space="preserve"> </w:t>
       </w:r>
       <w:r>
         <w:t xml:space="preserve">routine indirectly through a </w:t>
       </w:r>
+      <w:proofErr w:type="spellStart"/>
       <w:r>
         <w:rPr>
           <w:i/>
@@ -11855,6 +12108,7 @@
         </w:rPr>
         <w:t>reloadLevel</w:t>
       </w:r>
+      <w:proofErr w:type="spellEnd"/>
       <w:r>
         <w:t xml:space="preserve"> routine.</w:t>
       </w:r>
@@ -12396,6 +12650,7 @@
       <w:r>
         <w:t xml:space="preserve"> action became </w:t>
       </w:r>
+      <w:proofErr w:type="spellStart"/>
       <w:r>
         <w:rPr>
           <w:b/>
@@ -12405,9 +12660,11 @@
         </w:rPr>
         <w:t>PursueLeft</w:t>
       </w:r>
+      <w:proofErr w:type="spellEnd"/>
       <w:r>
         <w:t xml:space="preserve">, </w:t>
       </w:r>
+      <w:proofErr w:type="spellStart"/>
       <w:r>
         <w:rPr>
           <w:b/>
@@ -12417,9 +12674,11 @@
         </w:rPr>
         <w:t>PursueRight</w:t>
       </w:r>
+      <w:proofErr w:type="spellEnd"/>
       <w:r>
         <w:t xml:space="preserve">, </w:t>
       </w:r>
+      <w:proofErr w:type="spellStart"/>
       <w:r>
         <w:rPr>
           <w:b/>
@@ -12429,12 +12688,14 @@
         </w:rPr>
         <w:t>PursueUp</w:t>
       </w:r>
+      <w:proofErr w:type="spellEnd"/>
       <w:r>
         <w:t xml:space="preserve">, </w:t>
       </w:r>
       <w:r>
         <w:t xml:space="preserve">or </w:t>
       </w:r>
+      <w:proofErr w:type="spellStart"/>
       <w:r>
         <w:rPr>
           <w:b/>
@@ -12444,6 +12705,7 @@
         </w:rPr>
         <w:t>PursueDown</w:t>
       </w:r>
+      <w:proofErr w:type="spellEnd"/>
       <w:r>
         <w:t>.</w:t>
       </w:r>
@@ -12496,6 +12758,7 @@
         </w:rPr>
         <w:tab/>
       </w:r>
+      <w:proofErr w:type="spellStart"/>
       <w:r>
         <w:rPr>
           <w:b/>
@@ -12512,7 +12775,17 @@
           <w:i/>
           <w:iCs/>
         </w:rPr>
-        <w:t xml:space="preserve">Left </w:t>
+        <w:t>Left</w:t>
+      </w:r>
+      <w:proofErr w:type="spellEnd"/>
+      <w:r>
+        <w:rPr>
+          <w:b/>
+          <w:bCs/>
+          <w:i/>
+          <w:iCs/>
+        </w:rPr>
+        <w:t xml:space="preserve"> </w:t>
       </w:r>
       <w:r>
         <w:t>and</w:t>
@@ -12524,8 +12797,10 @@
           <w:i/>
           <w:iCs/>
         </w:rPr>
-        <w:t xml:space="preserve"> PursueRight</w:t>
-      </w:r>
+        <w:t xml:space="preserve"> </w:t>
+      </w:r>
+      <w:proofErr w:type="spellStart"/>
+      <w:proofErr w:type="gramStart"/>
       <w:r>
         <w:rPr>
           <w:b/>
@@ -12533,10 +12808,24 @@
           <w:i/>
           <w:iCs/>
         </w:rPr>
+        <w:t>PursueRight</w:t>
+      </w:r>
+      <w:proofErr w:type="spellEnd"/>
+      <w:r>
+        <w:rPr>
+          <w:b/>
+          <w:bCs/>
+          <w:i/>
+          <w:iCs/>
+        </w:rPr>
         <w:t xml:space="preserve"> </w:t>
       </w:r>
       <w:r>
-        <w:t xml:space="preserve"> – </w:t>
+        <w:t xml:space="preserve"> –</w:t>
+      </w:r>
+      <w:proofErr w:type="gramEnd"/>
+      <w:r>
+        <w:t xml:space="preserve"> </w:t>
       </w:r>
       <w:r>
         <w:t xml:space="preserve">Daleks </w:t>
@@ -12586,6 +12875,7 @@
       <w:r>
         <w:t xml:space="preserve">to </w:t>
       </w:r>
+      <w:proofErr w:type="spellStart"/>
       <w:r>
         <w:rPr>
           <w:b/>
@@ -12595,9 +12885,11 @@
         </w:rPr>
         <w:t>PursueUp</w:t>
       </w:r>
+      <w:proofErr w:type="spellEnd"/>
       <w:r>
         <w:t xml:space="preserve"> or </w:t>
       </w:r>
+      <w:proofErr w:type="spellStart"/>
       <w:r>
         <w:rPr>
           <w:b/>
@@ -12607,6 +12899,7 @@
         </w:rPr>
         <w:t>PursueDown</w:t>
       </w:r>
+      <w:proofErr w:type="spellEnd"/>
       <w:r>
         <w:t>.</w:t>
       </w:r>
@@ -12615,6 +12908,7 @@
       <w:pPr>
         <w:ind w:left="720"/>
       </w:pPr>
+      <w:proofErr w:type="spellStart"/>
       <w:r>
         <w:rPr>
           <w:b/>
@@ -12631,7 +12925,17 @@
           <w:i/>
           <w:iCs/>
         </w:rPr>
-        <w:t xml:space="preserve">Up </w:t>
+        <w:t>Up</w:t>
+      </w:r>
+      <w:proofErr w:type="spellEnd"/>
+      <w:r>
+        <w:rPr>
+          <w:b/>
+          <w:bCs/>
+          <w:i/>
+          <w:iCs/>
+        </w:rPr>
+        <w:t xml:space="preserve"> </w:t>
       </w:r>
       <w:r>
         <w:t>and</w:t>
@@ -12643,10 +12947,35 @@
           <w:i/>
           <w:iCs/>
         </w:rPr>
-        <w:t xml:space="preserve"> PursueDown </w:t>
-      </w:r>
-      <w:r>
-        <w:t xml:space="preserve"> – Daleks </w:t>
+        <w:t xml:space="preserve"> </w:t>
+      </w:r>
+      <w:proofErr w:type="spellStart"/>
+      <w:proofErr w:type="gramStart"/>
+      <w:r>
+        <w:rPr>
+          <w:b/>
+          <w:bCs/>
+          <w:i/>
+          <w:iCs/>
+        </w:rPr>
+        <w:t>PursueDown</w:t>
+      </w:r>
+      <w:proofErr w:type="spellEnd"/>
+      <w:r>
+        <w:rPr>
+          <w:b/>
+          <w:bCs/>
+          <w:i/>
+          <w:iCs/>
+        </w:rPr>
+        <w:t xml:space="preserve"> </w:t>
+      </w:r>
+      <w:r>
+        <w:t xml:space="preserve"> –</w:t>
+      </w:r>
+      <w:proofErr w:type="gramEnd"/>
+      <w:r>
+        <w:t xml:space="preserve"> Daleks </w:t>
       </w:r>
       <w:r>
         <w:t>move quickly left or right</w:t>
@@ -12673,6 +13002,7 @@
       <w:r>
         <w:t xml:space="preserve">is toggled between </w:t>
       </w:r>
+      <w:proofErr w:type="spellStart"/>
       <w:r>
         <w:rPr>
           <w:b/>
@@ -12682,6 +13012,7 @@
         </w:rPr>
         <w:t>PursueUp</w:t>
       </w:r>
+      <w:proofErr w:type="spellEnd"/>
       <w:r>
         <w:t xml:space="preserve"> </w:t>
       </w:r>
@@ -12691,6 +13022,7 @@
       <w:r>
         <w:t xml:space="preserve"> </w:t>
       </w:r>
+      <w:proofErr w:type="spellStart"/>
       <w:r>
         <w:rPr>
           <w:b/>
@@ -12700,6 +13032,7 @@
         </w:rPr>
         <w:t>PursueDown</w:t>
       </w:r>
+      <w:proofErr w:type="spellEnd"/>
       <w:r>
         <w:rPr>
           <w:b/>
@@ -12828,6 +13161,7 @@
       <w:r>
         <w:t xml:space="preserve">set to </w:t>
       </w:r>
+      <w:proofErr w:type="spellStart"/>
       <w:r>
         <w:rPr>
           <w:b/>
@@ -12837,9 +13171,11 @@
         </w:rPr>
         <w:t>pursueLeft</w:t>
       </w:r>
+      <w:proofErr w:type="spellEnd"/>
       <w:r>
         <w:t xml:space="preserve"> or </w:t>
       </w:r>
+      <w:proofErr w:type="spellStart"/>
       <w:r>
         <w:rPr>
           <w:b/>
@@ -12858,6 +13194,7 @@
         </w:rPr>
         <w:t>ueRight</w:t>
       </w:r>
+      <w:proofErr w:type="spellEnd"/>
       <w:r>
         <w:t>.</w:t>
       </w:r>
@@ -12867,6 +13204,7 @@
       <w:r>
         <w:t xml:space="preserve">action is set to </w:t>
       </w:r>
+      <w:proofErr w:type="spellStart"/>
       <w:r>
         <w:rPr>
           <w:b/>
@@ -12885,9 +13223,11 @@
         </w:rPr>
         <w:t>Up</w:t>
       </w:r>
+      <w:proofErr w:type="spellEnd"/>
       <w:r>
         <w:t xml:space="preserve"> or </w:t>
       </w:r>
+      <w:proofErr w:type="spellStart"/>
       <w:r>
         <w:rPr>
           <w:b/>
@@ -12906,6 +13246,7 @@
         </w:rPr>
         <w:t>Down</w:t>
       </w:r>
+      <w:proofErr w:type="spellEnd"/>
       <w:r>
         <w:t>.</w:t>
       </w:r>
@@ -13131,6 +13472,7 @@
       <w:r>
         <w:t xml:space="preserve">Daleks whose action is </w:t>
       </w:r>
+      <w:proofErr w:type="gramStart"/>
       <w:r>
         <w:rPr>
           <w:b/>
@@ -13140,6 +13482,7 @@
         </w:rPr>
         <w:t>pursue</w:t>
       </w:r>
+      <w:proofErr w:type="gramEnd"/>
       <w:r>
         <w:t xml:space="preserve"> are downgraded to </w:t>
       </w:r>
@@ -13205,6 +13548,7 @@
       <w:r>
         <w:t xml:space="preserve">, </w:t>
       </w:r>
+      <w:proofErr w:type="spellStart"/>
       <w:r>
         <w:rPr>
           <w:b/>
@@ -13214,6 +13558,7 @@
         </w:rPr>
         <w:t>pursueLeft</w:t>
       </w:r>
+      <w:proofErr w:type="spellEnd"/>
       <w:r>
         <w:rPr>
           <w:b/>
@@ -13235,6 +13580,7 @@
         </w:rPr>
         <w:t xml:space="preserve"> </w:t>
       </w:r>
+      <w:proofErr w:type="spellStart"/>
       <w:r>
         <w:rPr>
           <w:b/>
@@ -13251,7 +13597,17 @@
           <w:i/>
           <w:iCs/>
         </w:rPr>
-        <w:t xml:space="preserve">Right </w:t>
+        <w:t>Right</w:t>
+      </w:r>
+      <w:proofErr w:type="spellEnd"/>
+      <w:r>
+        <w:rPr>
+          <w:b/>
+          <w:bCs/>
+          <w:i/>
+          <w:iCs/>
+        </w:rPr>
+        <w:t xml:space="preserve"> </w:t>
       </w:r>
       <w:r>
         <w:t>related</w:t>
@@ -13282,6 +13638,7 @@
       <w:r>
         <w:t xml:space="preserve">a </w:t>
       </w:r>
+      <w:proofErr w:type="spellStart"/>
       <w:r>
         <w:rPr>
           <w:i/>
@@ -13289,6 +13646,7 @@
         </w:rPr>
         <w:t>dalekAI</w:t>
       </w:r>
+      <w:proofErr w:type="spellEnd"/>
       <w:r>
         <w:t xml:space="preserve"> </w:t>
       </w:r>
@@ -13360,18 +13718,21 @@
       <w:r>
         <w:t xml:space="preserve"> </w:t>
       </w:r>
+      <w:proofErr w:type="gramStart"/>
       <w:r>
         <w:t xml:space="preserve">the </w:t>
       </w:r>
       <w:r>
         <w:t>Dalek’s</w:t>
       </w:r>
+      <w:proofErr w:type="gramEnd"/>
       <w:r>
         <w:t xml:space="preserve"> </w:t>
       </w:r>
       <w:r>
         <w:t xml:space="preserve">action to </w:t>
       </w:r>
+      <w:proofErr w:type="spellStart"/>
       <w:r>
         <w:rPr>
           <w:b/>
@@ -13381,6 +13742,7 @@
         </w:rPr>
         <w:t>PursueLeft</w:t>
       </w:r>
+      <w:proofErr w:type="spellEnd"/>
       <w:r>
         <w:rPr>
           <w:b/>
@@ -13400,8 +13762,19 @@
           <w:i/>
           <w:iCs/>
         </w:rPr>
-        <w:t xml:space="preserve"> PursueRight</w:t>
-      </w:r>
+        <w:t xml:space="preserve"> </w:t>
+      </w:r>
+      <w:proofErr w:type="spellStart"/>
+      <w:r>
+        <w:rPr>
+          <w:b/>
+          <w:bCs/>
+          <w:i/>
+          <w:iCs/>
+        </w:rPr>
+        <w:t>PursueRight</w:t>
+      </w:r>
+      <w:proofErr w:type="spellEnd"/>
       <w:r>
         <w:t xml:space="preserve"> if so.</w:t>
       </w:r>
@@ -13422,6 +13795,7 @@
       <w:r>
         <w:t xml:space="preserve">the </w:t>
       </w:r>
+      <w:proofErr w:type="spellStart"/>
       <w:r>
         <w:rPr>
           <w:i/>
@@ -13429,6 +13803,7 @@
         </w:rPr>
         <w:t>dalekAnimate</w:t>
       </w:r>
+      <w:proofErr w:type="spellEnd"/>
       <w:r>
         <w:t xml:space="preserve"> and all the </w:t>
       </w:r>
@@ -13604,6 +13979,7 @@
       <w:r>
         <w:t xml:space="preserve"> the </w:t>
       </w:r>
+      <w:proofErr w:type="spellStart"/>
       <w:r>
         <w:rPr>
           <w:b/>
@@ -13613,9 +13989,11 @@
         </w:rPr>
         <w:t>PursueUp</w:t>
       </w:r>
+      <w:proofErr w:type="spellEnd"/>
       <w:r>
         <w:t xml:space="preserve"> and </w:t>
       </w:r>
+      <w:proofErr w:type="spellStart"/>
       <w:r>
         <w:rPr>
           <w:b/>
@@ -13625,6 +14003,7 @@
         </w:rPr>
         <w:t>PursueDown</w:t>
       </w:r>
+      <w:proofErr w:type="spellEnd"/>
       <w:r>
         <w:t xml:space="preserve"> behavior</w:t>
       </w:r>
@@ -13657,6 +14036,7 @@
       <w:r>
         <w:t xml:space="preserve">e to support this.  Fortunately, the low nibble of the elevator’s </w:t>
       </w:r>
+      <w:proofErr w:type="spellStart"/>
       <w:r>
         <w:rPr>
           <w:i/>
@@ -13664,6 +14044,7 @@
         </w:rPr>
         <w:t>objectState</w:t>
       </w:r>
+      <w:proofErr w:type="spellEnd"/>
       <w:r>
         <w:t xml:space="preserve"> variable </w:t>
       </w:r>
@@ -13779,7 +14160,15 @@
         <w:t xml:space="preserve">small </w:t>
       </w:r>
       <w:r>
-        <w:t xml:space="preserve">set of fairly simple rules </w:t>
+        <w:t xml:space="preserve">set of </w:t>
+      </w:r>
+      <w:proofErr w:type="gramStart"/>
+      <w:r>
+        <w:t>fairly simple</w:t>
+      </w:r>
+      <w:proofErr w:type="gramEnd"/>
+      <w:r>
+        <w:t xml:space="preserve"> rules </w:t>
       </w:r>
       <w:r>
         <w:t xml:space="preserve">can give </w:t>
@@ -13886,13 +14275,34 @@
         <w:t>Daleks in pursuit</w:t>
       </w:r>
       <w:r>
-        <w:t xml:space="preserve"> - When one or more Daleks are in pursuit of K9, a PacMan like sound effect plays, giving the player a sense of pressure.  The sound effect provide</w:t>
+        <w:t xml:space="preserve"> - When one or more Daleks are in pursuit of K9, a </w:t>
+      </w:r>
+      <w:proofErr w:type="spellStart"/>
+      <w:proofErr w:type="gramStart"/>
+      <w:r>
+        <w:t>PacMan</w:t>
+      </w:r>
+      <w:proofErr w:type="spellEnd"/>
+      <w:r>
+        <w:t xml:space="preserve"> like</w:t>
+      </w:r>
+      <w:proofErr w:type="gramEnd"/>
+      <w:r>
+        <w:t xml:space="preserve"> sound effect plays, giving the player a sense of pressure.  The sound effect provide</w:t>
       </w:r>
       <w:r>
         <w:t>s</w:t>
       </w:r>
       <w:r>
-        <w:t xml:space="preserve"> an important que as there may be times when a Dalek sees K9 before the player sees the Dalek!</w:t>
+        <w:t xml:space="preserve"> an important </w:t>
+      </w:r>
+      <w:proofErr w:type="gramStart"/>
+      <w:r>
+        <w:t>que</w:t>
+      </w:r>
+      <w:proofErr w:type="gramEnd"/>
+      <w:r>
+        <w:t xml:space="preserve"> as there may be times when a Dalek sees K9 before the player sees the Dalek!</w:t>
       </w:r>
     </w:p>
     <w:p>
@@ -14004,7 +14414,15 @@
         <w:t>Laser activated</w:t>
       </w:r>
       <w:r>
-        <w:t xml:space="preserve"> – when K9’s laser is active, a low oscillating tone is sounded.</w:t>
+        <w:t xml:space="preserve"> – when K9’s laser is </w:t>
+      </w:r>
+      <w:proofErr w:type="gramStart"/>
+      <w:r>
+        <w:t>active,</w:t>
+      </w:r>
+      <w:proofErr w:type="gramEnd"/>
+      <w:r>
+        <w:t xml:space="preserve"> a low oscillating tone is sounded.</w:t>
       </w:r>
     </w:p>
     <w:p>
@@ -14024,7 +14442,15 @@
         <w:t>K9 is hurt</w:t>
       </w:r>
       <w:r>
-        <w:t xml:space="preserve"> – when K9 is damaged by an Dalek weapon, an annoying white noise sound effect is played, which is quite unpleasant.  It </w:t>
+        <w:t xml:space="preserve"> – when K9 is damaged by </w:t>
+      </w:r>
+      <w:proofErr w:type="gramStart"/>
+      <w:r>
+        <w:t>an</w:t>
+      </w:r>
+      <w:proofErr w:type="gramEnd"/>
+      <w:r>
+        <w:t xml:space="preserve"> Dalek weapon, an annoying white noise sound effect is played, which is quite unpleasant.  It </w:t>
       </w:r>
       <w:r>
         <w:t xml:space="preserve">is </w:t>
@@ -14130,6 +14556,7 @@
       <w:r>
         <w:t xml:space="preserve">, door locked, and K9 movement sound effects.  These sound effects are mutually exclusive except for the movement sound effect.  The game uses a </w:t>
       </w:r>
+      <w:proofErr w:type="spellStart"/>
       <w:r>
         <w:rPr>
           <w:i/>
@@ -14137,6 +14564,7 @@
         </w:rPr>
         <w:t>frameCount</w:t>
       </w:r>
+      <w:proofErr w:type="spellEnd"/>
       <w:r>
         <w:t xml:space="preserve"> based timer to inhibit playing the movement sound effect when the other sound effects are playing.</w:t>
       </w:r>
@@ -14168,11 +14596,16 @@
         <w:t>‘</w:t>
       </w:r>
       <w:r>
-        <w:t>in pursuit</w:t>
+        <w:t xml:space="preserve">in </w:t>
+      </w:r>
+      <w:proofErr w:type="gramStart"/>
+      <w:r>
+        <w:t>pursuit</w:t>
       </w:r>
       <w:r>
         <w:t>’</w:t>
       </w:r>
+      <w:proofErr w:type="gramEnd"/>
       <w:r>
         <w:t xml:space="preserve"> sound effect.</w:t>
       </w:r>
@@ -15314,6 +15747,7 @@
       <w:r>
         <w:t xml:space="preserve"> into the sprite data and let the </w:t>
       </w:r>
+      <w:proofErr w:type="spellStart"/>
       <w:r>
         <w:rPr>
           <w:i/>
@@ -15321,6 +15755,7 @@
         </w:rPr>
         <w:t>drawSprite</w:t>
       </w:r>
+      <w:proofErr w:type="spellEnd"/>
       <w:r>
         <w:t xml:space="preserve"> routine do all the work of putting the pixels on the screen, however this would result in the ‘</w:t>
       </w:r>
@@ -15361,7 +15796,15 @@
         <w:t xml:space="preserve">in size </w:t>
       </w:r>
       <w:r>
-        <w:t>and uses 41 bytes of data (health bar atlas + sprite array).  The total memory required was 226 bytes</w:t>
+        <w:t xml:space="preserve">and uses 41 bytes of data (health bar atlas + </w:t>
+      </w:r>
+      <w:proofErr w:type="gramStart"/>
+      <w:r>
+        <w:t>sprite</w:t>
+      </w:r>
+      <w:proofErr w:type="gramEnd"/>
+      <w:r>
+        <w:t xml:space="preserve"> array).  The total memory required was 226 bytes</w:t>
       </w:r>
       <w:r>
         <w:t>.</w:t>
@@ -15744,6 +16187,7 @@
       <w:r>
         <w:t xml:space="preserve">from </w:t>
       </w:r>
+      <w:proofErr w:type="spellStart"/>
       <w:r>
         <w:rPr>
           <w:i/>
@@ -15751,9 +16195,11 @@
         </w:rPr>
         <w:t>drawObject</w:t>
       </w:r>
+      <w:proofErr w:type="spellEnd"/>
       <w:r>
         <w:t xml:space="preserve"> and </w:t>
       </w:r>
+      <w:proofErr w:type="spellStart"/>
       <w:r>
         <w:rPr>
           <w:i/>
@@ -15761,6 +16207,7 @@
         </w:rPr>
         <w:t>drawLaserOn</w:t>
       </w:r>
+      <w:proofErr w:type="spellEnd"/>
       <w:r>
         <w:rPr>
           <w:i/>
@@ -16903,6 +17350,7 @@
       <w:r>
         <w:t xml:space="preserve">The title functionality starts and stops playback by invoking the </w:t>
       </w:r>
+      <w:proofErr w:type="spellStart"/>
       <w:r>
         <w:rPr>
           <w:b/>
@@ -16912,9 +17360,11 @@
         </w:rPr>
         <w:t>playMusic</w:t>
       </w:r>
+      <w:proofErr w:type="spellEnd"/>
       <w:r>
         <w:t xml:space="preserve"> and </w:t>
       </w:r>
+      <w:proofErr w:type="spellStart"/>
       <w:r>
         <w:rPr>
           <w:b/>
@@ -16924,6 +17374,7 @@
         </w:rPr>
         <w:t>stopMusic</w:t>
       </w:r>
+      <w:proofErr w:type="spellEnd"/>
       <w:r>
         <w:t xml:space="preserve"> routines.  These routines start and stop the music, which is played in the </w:t>
       </w:r>
@@ -17020,11 +17471,21 @@
     </w:p>
     <w:p>
       <w:r>
-        <w:t xml:space="preserve">I spent quite a bit of time tweaking the envelope definitions to get a more interesting sound. Of course, I was not able to replicate the original sound given </w:t>
-      </w:r>
+        <w:t xml:space="preserve">I spent quite a bit of time tweaking the envelope definitions to get a more interesting sound. Of course, I </w:t>
+      </w:r>
+      <w:proofErr w:type="gramStart"/>
+      <w:r>
+        <w:t>was not able to</w:t>
+      </w:r>
+      <w:proofErr w:type="gramEnd"/>
+      <w:r>
+        <w:t xml:space="preserve"> replicate the original sound given </w:t>
+      </w:r>
+      <w:proofErr w:type="gramStart"/>
       <w:r>
         <w:t>the Beeb’s</w:t>
       </w:r>
+      <w:proofErr w:type="gramEnd"/>
       <w:r>
         <w:t xml:space="preserve"> limited capabilities.  </w:t>
       </w:r>
@@ -17996,7 +18457,15 @@
         <w:t xml:space="preserve"> distinct files </w:t>
       </w:r>
       <w:r>
-        <w:t>(pcm1..pcn5)</w:t>
+        <w:t>(pcm</w:t>
+      </w:r>
+      <w:proofErr w:type="gramStart"/>
+      <w:r>
+        <w:t>1..</w:t>
+      </w:r>
+      <w:proofErr w:type="gramEnd"/>
+      <w:r>
+        <w:t>pcn5)</w:t>
       </w:r>
       <w:r>
         <w:t xml:space="preserve"> in the disc image.</w:t>
@@ -18092,7 +18561,15 @@
         <w:t xml:space="preserve">is set </w:t>
       </w:r>
       <w:r>
-        <w:t xml:space="preserve">to 125KHz and its volume </w:t>
+        <w:t xml:space="preserve">to </w:t>
+      </w:r>
+      <w:proofErr w:type="gramStart"/>
+      <w:r>
+        <w:t>125KHz</w:t>
+      </w:r>
+      <w:proofErr w:type="gramEnd"/>
+      <w:r>
+        <w:t xml:space="preserve"> and its volume </w:t>
       </w:r>
       <w:r>
         <w:t xml:space="preserve">is set </w:t>
@@ -18151,7 +18628,15 @@
         <w:t>.</w:t>
       </w:r>
       <w:r>
-        <w:t xml:space="preserve">  There was a little tearing but no detectable slowdown or control latency.</w:t>
+        <w:t xml:space="preserve">  There was a little </w:t>
+      </w:r>
+      <w:proofErr w:type="gramStart"/>
+      <w:r>
+        <w:t>tearing</w:t>
+      </w:r>
+      <w:proofErr w:type="gramEnd"/>
+      <w:r>
+        <w:t xml:space="preserve"> but no detectable slowdown or control latency.</w:t>
       </w:r>
       <w:r>
         <w:t xml:space="preserve">  </w:t>
@@ -18331,26 +18816,60 @@
       <w:r>
         <w:t xml:space="preserve">In the first pass, </w:t>
       </w:r>
+      <w:proofErr w:type="gramStart"/>
       <w:r>
         <w:rPr>
           <w:b/>
           <w:bCs/>
         </w:rPr>
-        <w:t>AND #&amp;0F</w:t>
-      </w:r>
+        <w:t>AND #&amp;</w:t>
+      </w:r>
+      <w:proofErr w:type="gramEnd"/>
       <w:r>
         <w:rPr>
           <w:b/>
           <w:bCs/>
         </w:rPr>
-        <w:t xml:space="preserve"> : </w:t>
-      </w:r>
+        <w:t>0</w:t>
+      </w:r>
+      <w:proofErr w:type="gramStart"/>
       <w:r>
         <w:rPr>
           <w:b/>
           <w:bCs/>
         </w:rPr>
-        <w:t>AND #&amp;0F</w:t>
+        <w:t>F</w:t>
+      </w:r>
+      <w:r>
+        <w:rPr>
+          <w:b/>
+          <w:bCs/>
+        </w:rPr>
+        <w:t xml:space="preserve"> :</w:t>
+      </w:r>
+      <w:proofErr w:type="gramEnd"/>
+      <w:r>
+        <w:rPr>
+          <w:b/>
+          <w:bCs/>
+        </w:rPr>
+        <w:t xml:space="preserve"> </w:t>
+      </w:r>
+      <w:proofErr w:type="gramStart"/>
+      <w:r>
+        <w:rPr>
+          <w:b/>
+          <w:bCs/>
+        </w:rPr>
+        <w:t>AND #&amp;</w:t>
+      </w:r>
+      <w:proofErr w:type="gramEnd"/>
+      <w:r>
+        <w:rPr>
+          <w:b/>
+          <w:bCs/>
+        </w:rPr>
+        <w:t>0F</w:t>
       </w:r>
       <w:r>
         <w:t xml:space="preserve"> is </w:t>
@@ -18375,7 +18894,55 @@
           <w:b/>
           <w:bCs/>
         </w:rPr>
-        <w:t>LSR A : LSR A : LSR A : LSR A</w:t>
+        <w:t xml:space="preserve">LSR </w:t>
+      </w:r>
+      <w:proofErr w:type="gramStart"/>
+      <w:r>
+        <w:rPr>
+          <w:b/>
+          <w:bCs/>
+        </w:rPr>
+        <w:t>A :</w:t>
+      </w:r>
+      <w:proofErr w:type="gramEnd"/>
+      <w:r>
+        <w:rPr>
+          <w:b/>
+          <w:bCs/>
+        </w:rPr>
+        <w:t xml:space="preserve"> LSR </w:t>
+      </w:r>
+      <w:proofErr w:type="gramStart"/>
+      <w:r>
+        <w:rPr>
+          <w:b/>
+          <w:bCs/>
+        </w:rPr>
+        <w:t>A :</w:t>
+      </w:r>
+      <w:proofErr w:type="gramEnd"/>
+      <w:r>
+        <w:rPr>
+          <w:b/>
+          <w:bCs/>
+        </w:rPr>
+        <w:t xml:space="preserve"> LSR </w:t>
+      </w:r>
+      <w:proofErr w:type="gramStart"/>
+      <w:r>
+        <w:rPr>
+          <w:b/>
+          <w:bCs/>
+        </w:rPr>
+        <w:t>A :</w:t>
+      </w:r>
+      <w:proofErr w:type="gramEnd"/>
+      <w:r>
+        <w:rPr>
+          <w:b/>
+          <w:bCs/>
+        </w:rPr>
+        <w:t xml:space="preserve"> LSR A</w:t>
       </w:r>
       <w:r>
         <w:t xml:space="preserve"> is </w:t>
@@ -18395,12 +18962,21 @@
       <w:r>
         <w:t xml:space="preserve">  </w:t>
       </w:r>
+      <w:proofErr w:type="gramStart"/>
       <w:r>
         <w:rPr>
           <w:b/>
           <w:bCs/>
         </w:rPr>
-        <w:t>AND #&amp;0F</w:t>
+        <w:t>AND #&amp;</w:t>
+      </w:r>
+      <w:proofErr w:type="gramEnd"/>
+      <w:r>
+        <w:rPr>
+          <w:b/>
+          <w:bCs/>
+        </w:rPr>
+        <w:t>0F</w:t>
       </w:r>
       <w:r>
         <w:t xml:space="preserve"> is repeated</w:t>
@@ -18580,7 +19156,15 @@
         <w:t xml:space="preserve">routine first tests </w:t>
       </w:r>
       <w:r>
-        <w:t xml:space="preserve">for the 8KHz timer, only branching if the interrupt </w:t>
+        <w:t xml:space="preserve">for the 8KHz timer, only branching if the </w:t>
+      </w:r>
+      <w:proofErr w:type="gramStart"/>
+      <w:r>
+        <w:t>interrupt</w:t>
+      </w:r>
+      <w:proofErr w:type="gramEnd"/>
+      <w:r>
+        <w:t xml:space="preserve"> </w:t>
       </w:r>
       <w:r>
         <w:t xml:space="preserve">is </w:t>
@@ -18847,9 +19431,11 @@
             <w:tcW w:w="3116" w:type="dxa"/>
           </w:tcPr>
           <w:p>
+            <w:proofErr w:type="spellStart"/>
             <w:r>
               <w:t>soundVector_beginPursuit</w:t>
             </w:r>
+            <w:proofErr w:type="spellEnd"/>
           </w:p>
         </w:tc>
         <w:tc>
@@ -18860,12 +19446,14 @@
             <w:pPr>
               <w:cnfStyle w:val="000000100000" w:firstRow="0" w:lastRow="0" w:firstColumn="0" w:lastColumn="0" w:oddVBand="0" w:evenVBand="0" w:oddHBand="1" w:evenHBand="0" w:firstRowFirstColumn="0" w:firstRowLastColumn="0" w:lastRowFirstColumn="0" w:lastRowLastColumn="0"/>
             </w:pPr>
+            <w:proofErr w:type="spellStart"/>
             <w:r>
               <w:t>soundEffect_pursuitO</w:t>
             </w:r>
             <w:r>
               <w:t>n</w:t>
             </w:r>
+            <w:proofErr w:type="spellEnd"/>
           </w:p>
         </w:tc>
         <w:tc>
@@ -18876,12 +19464,14 @@
             <w:pPr>
               <w:cnfStyle w:val="000000100000" w:firstRow="0" w:lastRow="0" w:firstColumn="0" w:lastColumn="0" w:oddVBand="0" w:evenVBand="0" w:oddHBand="1" w:evenHBand="0" w:firstRowFirstColumn="0" w:firstRowLastColumn="0" w:lastRowFirstColumn="0" w:lastRowLastColumn="0"/>
             </w:pPr>
+            <w:proofErr w:type="spellStart"/>
             <w:r>
               <w:t>sample_</w:t>
             </w:r>
             <w:r>
               <w:t>soundExterminate</w:t>
             </w:r>
+            <w:proofErr w:type="spellEnd"/>
           </w:p>
         </w:tc>
       </w:tr>
@@ -18892,9 +19482,11 @@
             <w:tcW w:w="3116" w:type="dxa"/>
           </w:tcPr>
           <w:p>
+            <w:proofErr w:type="spellStart"/>
             <w:r>
               <w:t>soundVector_updatePursuit</w:t>
             </w:r>
+            <w:proofErr w:type="spellEnd"/>
           </w:p>
         </w:tc>
         <w:tc>
@@ -18921,9 +19513,11 @@
             <w:pPr>
               <w:cnfStyle w:val="000000000000" w:firstRow="0" w:lastRow="0" w:firstColumn="0" w:lastColumn="0" w:oddVBand="0" w:evenVBand="0" w:oddHBand="0" w:evenHBand="0" w:firstRowFirstColumn="0" w:firstRowLastColumn="0" w:lastRowFirstColumn="0" w:lastRowLastColumn="0"/>
             </w:pPr>
+            <w:proofErr w:type="spellStart"/>
             <w:r>
               <w:t>sample_updatePursuit</w:t>
             </w:r>
+            <w:proofErr w:type="spellEnd"/>
           </w:p>
         </w:tc>
       </w:tr>
@@ -18937,9 +19531,11 @@
             <w:tcW w:w="3116" w:type="dxa"/>
           </w:tcPr>
           <w:p>
+            <w:proofErr w:type="spellStart"/>
             <w:r>
               <w:t>soundVector_endPursuit</w:t>
             </w:r>
+            <w:proofErr w:type="spellEnd"/>
           </w:p>
         </w:tc>
         <w:tc>
@@ -18950,9 +19546,11 @@
             <w:pPr>
               <w:cnfStyle w:val="000000100000" w:firstRow="0" w:lastRow="0" w:firstColumn="0" w:lastColumn="0" w:oddVBand="0" w:evenVBand="0" w:oddHBand="1" w:evenHBand="0" w:firstRowFirstColumn="0" w:firstRowLastColumn="0" w:lastRowFirstColumn="0" w:lastRowLastColumn="0"/>
             </w:pPr>
+            <w:proofErr w:type="spellStart"/>
             <w:r>
               <w:t>soundEffect_pursuitOff</w:t>
             </w:r>
+            <w:proofErr w:type="spellEnd"/>
           </w:p>
         </w:tc>
         <w:tc>
@@ -18963,9 +19561,11 @@
             <w:pPr>
               <w:cnfStyle w:val="000000100000" w:firstRow="0" w:lastRow="0" w:firstColumn="0" w:lastColumn="0" w:oddVBand="0" w:evenVBand="0" w:oddHBand="1" w:evenHBand="0" w:firstRowFirstColumn="0" w:firstRowLastColumn="0" w:lastRowFirstColumn="0" w:lastRowLastColumn="0"/>
             </w:pPr>
+            <w:proofErr w:type="spellStart"/>
             <w:r>
               <w:t>sample_stop</w:t>
             </w:r>
+            <w:proofErr w:type="spellEnd"/>
           </w:p>
         </w:tc>
       </w:tr>
@@ -18976,9 +19576,11 @@
             <w:tcW w:w="3116" w:type="dxa"/>
           </w:tcPr>
           <w:p>
+            <w:proofErr w:type="spellStart"/>
             <w:r>
               <w:t>soundVector_enemyLasered</w:t>
             </w:r>
+            <w:proofErr w:type="spellEnd"/>
           </w:p>
         </w:tc>
         <w:tc>
@@ -19005,9 +19607,11 @@
             <w:pPr>
               <w:cnfStyle w:val="000000000000" w:firstRow="0" w:lastRow="0" w:firstColumn="0" w:lastColumn="0" w:oddVBand="0" w:evenVBand="0" w:oddHBand="0" w:evenHBand="0" w:firstRowFirstColumn="0" w:firstRowLastColumn="0" w:lastRowFirstColumn="0" w:lastRowLastColumn="0"/>
             </w:pPr>
+            <w:proofErr w:type="spellStart"/>
             <w:r>
               <w:t>sample_soundGrown</w:t>
             </w:r>
+            <w:proofErr w:type="spellEnd"/>
           </w:p>
         </w:tc>
       </w:tr>
@@ -19021,9 +19625,11 @@
             <w:tcW w:w="3116" w:type="dxa"/>
           </w:tcPr>
           <w:p>
+            <w:proofErr w:type="spellStart"/>
             <w:r>
               <w:t>soundVector_weaponFired</w:t>
             </w:r>
+            <w:proofErr w:type="spellEnd"/>
           </w:p>
         </w:tc>
         <w:tc>
@@ -19034,9 +19640,11 @@
             <w:pPr>
               <w:cnfStyle w:val="000000100000" w:firstRow="0" w:lastRow="0" w:firstColumn="0" w:lastColumn="0" w:oddVBand="0" w:evenVBand="0" w:oddHBand="1" w:evenHBand="0" w:firstRowFirstColumn="0" w:firstRowLastColumn="0" w:lastRowFirstColumn="0" w:lastRowLastColumn="0"/>
             </w:pPr>
+            <w:proofErr w:type="spellStart"/>
             <w:r>
               <w:t>soundEffect_pain</w:t>
             </w:r>
+            <w:proofErr w:type="spellEnd"/>
           </w:p>
         </w:tc>
         <w:tc>
@@ -19047,9 +19655,11 @@
             <w:pPr>
               <w:cnfStyle w:val="000000100000" w:firstRow="0" w:lastRow="0" w:firstColumn="0" w:lastColumn="0" w:oddVBand="0" w:evenVBand="0" w:oddHBand="1" w:evenHBand="0" w:firstRowFirstColumn="0" w:firstRowLastColumn="0" w:lastRowFirstColumn="0" w:lastRowLastColumn="0"/>
             </w:pPr>
+            <w:proofErr w:type="spellStart"/>
             <w:r>
               <w:t>sample_soundWeapon</w:t>
             </w:r>
+            <w:proofErr w:type="spellEnd"/>
           </w:p>
         </w:tc>
       </w:tr>
@@ -19083,13 +19693,29 @@
         <w:t>.</w:t>
       </w:r>
       <w:r>
-        <w:t xml:space="preserve">  This includes an alternative in-game interrupt </w:t>
+        <w:t xml:space="preserve">  This includes an alternative in-game </w:t>
+      </w:r>
+      <w:proofErr w:type="gramStart"/>
+      <w:r>
+        <w:t>interrupt</w:t>
+      </w:r>
+      <w:proofErr w:type="gramEnd"/>
+      <w:r>
+        <w:t xml:space="preserve"> </w:t>
       </w:r>
       <w:r>
         <w:t xml:space="preserve">service </w:t>
       </w:r>
       <w:r>
-        <w:t>routine which contains the sampling functionality. The routine jumps into the regular in-game interrupt routine to process other interrupts.  The routine is installed in place of the regular in-game routine when sideways RAM is detected.</w:t>
+        <w:t xml:space="preserve">routine which contains the sampling functionality. The routine jumps into the regular in-game interrupt routine to process other </w:t>
+      </w:r>
+      <w:proofErr w:type="gramStart"/>
+      <w:r>
+        <w:t>interrupts</w:t>
+      </w:r>
+      <w:proofErr w:type="gramEnd"/>
+      <w:r>
+        <w:t>.  The routine is installed in place of the regular in-game routine when sideways RAM is detected.</w:t>
       </w:r>
     </w:p>
     <w:p>
@@ -19201,7 +19827,15 @@
     </w:p>
     <w:p>
       <w:r>
-        <w:t xml:space="preserve">Another suggestion was to improve the level entry and exit experiences, by showing some </w:t>
+        <w:t xml:space="preserve">Another suggestion was to improve the </w:t>
+      </w:r>
+      <w:proofErr w:type="gramStart"/>
+      <w:r>
+        <w:t>level</w:t>
+      </w:r>
+      <w:proofErr w:type="gramEnd"/>
+      <w:r>
+        <w:t xml:space="preserve"> entry and exit experiences, by showing some </w:t>
       </w:r>
       <w:r>
         <w:t xml:space="preserve">form of </w:t>
@@ -19292,9 +19926,11 @@
       <w:r>
         <w:t xml:space="preserve">in </w:t>
       </w:r>
+      <w:proofErr w:type="spellStart"/>
       <w:r>
         <w:t>BeebEm</w:t>
       </w:r>
+      <w:proofErr w:type="spellEnd"/>
       <w:r>
         <w:t xml:space="preserve">, though there was a </w:t>
       </w:r>
@@ -19500,9 +20136,11 @@
             <w:tcW w:w="2586" w:type="dxa"/>
           </w:tcPr>
           <w:p>
+            <w:proofErr w:type="spellStart"/>
             <w:r>
               <w:t>enemyDestroyed</w:t>
             </w:r>
+            <w:proofErr w:type="spellEnd"/>
           </w:p>
         </w:tc>
         <w:tc>
@@ -19539,9 +20177,11 @@
             <w:tcW w:w="2586" w:type="dxa"/>
           </w:tcPr>
           <w:p>
+            <w:proofErr w:type="spellStart"/>
             <w:r>
               <w:t>startLevel</w:t>
             </w:r>
+            <w:proofErr w:type="spellEnd"/>
           </w:p>
         </w:tc>
         <w:tc>
@@ -19581,9 +20221,11 @@
             <w:tcW w:w="2586" w:type="dxa"/>
           </w:tcPr>
           <w:p>
+            <w:proofErr w:type="spellStart"/>
             <w:r>
               <w:t>completeLevel</w:t>
             </w:r>
+            <w:proofErr w:type="spellEnd"/>
           </w:p>
         </w:tc>
         <w:tc>
@@ -19594,9 +20236,11 @@
             <w:pPr>
               <w:cnfStyle w:val="000000100000" w:firstRow="0" w:lastRow="0" w:firstColumn="0" w:lastColumn="0" w:oddVBand="0" w:evenVBand="0" w:oddHBand="1" w:evenHBand="0" w:firstRowFirstColumn="0" w:firstRowLastColumn="0" w:lastRowFirstColumn="0" w:lastRowLastColumn="0"/>
             </w:pPr>
+            <w:proofErr w:type="spellStart"/>
             <w:r>
               <w:t>soundEffect_levelComplete</w:t>
             </w:r>
+            <w:proofErr w:type="spellEnd"/>
           </w:p>
         </w:tc>
         <w:tc>
@@ -19607,12 +20251,14 @@
             <w:pPr>
               <w:cnfStyle w:val="000000100000" w:firstRow="0" w:lastRow="0" w:firstColumn="0" w:lastColumn="0" w:oddVBand="0" w:evenVBand="0" w:oddHBand="1" w:evenHBand="0" w:firstRowFirstColumn="0" w:firstRowLastColumn="0" w:lastRowFirstColumn="0" w:lastRowLastColumn="0"/>
             </w:pPr>
+            <w:proofErr w:type="spellStart"/>
             <w:r>
               <w:t>sample_</w:t>
             </w:r>
             <w:r>
               <w:t>soundTardisDoor</w:t>
             </w:r>
+            <w:proofErr w:type="spellEnd"/>
           </w:p>
         </w:tc>
       </w:tr>
@@ -20072,7 +20718,15 @@
         <w:t>has</w:t>
       </w:r>
       <w:r>
-        <w:t xml:space="preserve"> completed (a countdown counter is used for this), restoring everything back if it has.  The code then determines whether the interrupt </w:t>
+        <w:t xml:space="preserve"> completed (a countdown counter is used for this), restoring everything back if it has.  The code then determines whether the </w:t>
+      </w:r>
+      <w:proofErr w:type="gramStart"/>
+      <w:r>
+        <w:t>interrupt</w:t>
+      </w:r>
+      <w:proofErr w:type="gramEnd"/>
+      <w:r>
+        <w:t xml:space="preserve"> </w:t>
       </w:r>
       <w:r>
         <w:t xml:space="preserve">request </w:t>
@@ -20083,7 +20737,15 @@
     </w:p>
     <w:p>
       <w:r>
-        <w:t xml:space="preserve">If the interrupt request is for the top </w:t>
+        <w:t xml:space="preserve">If the </w:t>
+      </w:r>
+      <w:proofErr w:type="gramStart"/>
+      <w:r>
+        <w:t>interrupt</w:t>
+      </w:r>
+      <w:proofErr w:type="gramEnd"/>
+      <w:r>
+        <w:t xml:space="preserve"> request is for the top </w:t>
       </w:r>
       <w:r>
         <w:t xml:space="preserve">crop </w:t>
@@ -20091,8 +20753,13 @@
       <w:r>
         <w:t xml:space="preserve">boundary, the palette is switched to the level’s palette and the </w:t>
       </w:r>
-      <w:r>
-        <w:t>interrupt is passed on</w:t>
+      <w:proofErr w:type="gramStart"/>
+      <w:r>
+        <w:t>interrupt</w:t>
+      </w:r>
+      <w:proofErr w:type="gramEnd"/>
+      <w:r>
+        <w:t xml:space="preserve"> is passed on</w:t>
       </w:r>
       <w:r>
         <w:t xml:space="preserve"> </w:t>
@@ -20103,7 +20770,15 @@
     </w:p>
     <w:p>
       <w:r>
-        <w:t xml:space="preserve">If the interrupt request is for the bottom </w:t>
+        <w:t xml:space="preserve">If the </w:t>
+      </w:r>
+      <w:proofErr w:type="gramStart"/>
+      <w:r>
+        <w:t>interrupt</w:t>
+      </w:r>
+      <w:proofErr w:type="gramEnd"/>
+      <w:r>
+        <w:t xml:space="preserve"> request is for the bottom </w:t>
       </w:r>
       <w:r>
         <w:t xml:space="preserve">crop </w:t>
@@ -20253,7 +20928,15 @@
         <w:t>accommodate the change, converting the level data files to the new format</w:t>
       </w:r>
       <w:r>
-        <w:t xml:space="preserve"> in the process.  As part of this I also moved the crop transition variables into zero page (reducing code size further), moving the black palette (16-bytes) out to regular memory.  </w:t>
+        <w:t xml:space="preserve"> in the process.  As part of this I also moved the crop transition variables into zero </w:t>
+      </w:r>
+      <w:proofErr w:type="gramStart"/>
+      <w:r>
+        <w:t>page</w:t>
+      </w:r>
+      <w:proofErr w:type="gramEnd"/>
+      <w:r>
+        <w:t xml:space="preserve"> (reducing code size further), moving the black palette (16-bytes) out to regular memory.  </w:t>
       </w:r>
       <w:r>
         <w:t>After these changes, the code just fit, barely.</w:t>
@@ -20316,7 +20999,15 @@
         <w:t xml:space="preserve"> a more graphical screen</w:t>
       </w:r>
       <w:r>
-        <w:t>, whilst playing the Doctor Who theme music</w:t>
+        <w:t xml:space="preserve">, whilst playing </w:t>
+      </w:r>
+      <w:proofErr w:type="gramStart"/>
+      <w:r>
+        <w:t>the Doctor</w:t>
+      </w:r>
+      <w:proofErr w:type="gramEnd"/>
+      <w:r>
+        <w:t xml:space="preserve"> Who theme music</w:t>
       </w:r>
       <w:r>
         <w:t xml:space="preserve"> in the background.</w:t>
@@ -20510,12 +21201,14 @@
       <w:r>
         <w:t xml:space="preserve">was the idea of adding teleports which would allow K9 to </w:t>
       </w:r>
+      <w:proofErr w:type="gramStart"/>
       <w:r>
         <w:t>trave</w:t>
       </w:r>
       <w:r>
         <w:t>rse</w:t>
       </w:r>
+      <w:proofErr w:type="gramEnd"/>
       <w:r>
         <w:t xml:space="preserve"> a level in a non-linear way.</w:t>
       </w:r>
@@ -20630,6 +21323,7 @@
       <w:r>
         <w:t xml:space="preserve"> travel. Since adding a new dynamic type would require nine bits in </w:t>
       </w:r>
+      <w:proofErr w:type="spellStart"/>
       <w:r>
         <w:rPr>
           <w:b/>
@@ -20637,6 +21331,7 @@
         </w:rPr>
         <w:t>objectState</w:t>
       </w:r>
+      <w:proofErr w:type="spellEnd"/>
       <w:r>
         <w:t xml:space="preserve">, I </w:t>
       </w:r>
@@ -20658,6 +21353,7 @@
       <w:r>
         <w:t xml:space="preserve">elevator, using </w:t>
       </w:r>
+      <w:proofErr w:type="spellStart"/>
       <w:r>
         <w:rPr>
           <w:b/>
@@ -20665,6 +21361,7 @@
         </w:rPr>
         <w:t>objectFrameCounter</w:t>
       </w:r>
+      <w:proofErr w:type="spellEnd"/>
       <w:r>
         <w:t xml:space="preserve"> </w:t>
       </w:r>
@@ -20731,6 +21428,7 @@
       <w:r>
         <w:t xml:space="preserve">in </w:t>
       </w:r>
+      <w:proofErr w:type="spellStart"/>
       <w:r>
         <w:rPr>
           <w:b/>
@@ -20740,6 +21438,7 @@
         </w:rPr>
         <w:t>objectFrameCounter</w:t>
       </w:r>
+      <w:proofErr w:type="spellEnd"/>
       <w:r>
         <w:rPr>
           <w:b/>
@@ -20849,6 +21548,7 @@
       <w:r>
         <w:t xml:space="preserve">files were created in the level asset folders, with the </w:t>
       </w:r>
+      <w:proofErr w:type="spellStart"/>
       <w:r>
         <w:rPr>
           <w:b/>
@@ -20856,11 +21556,20 @@
         </w:rPr>
         <w:t>BMPConverter</w:t>
       </w:r>
+      <w:proofErr w:type="spellEnd"/>
       <w:r>
         <w:t xml:space="preserve"> console app updated to convert and include these in the generated level atlas data files.</w:t>
       </w:r>
       <w:r>
-        <w:t xml:space="preserve">  The generated files </w:t>
+        <w:t xml:space="preserve">  The </w:t>
+      </w:r>
+      <w:proofErr w:type="gramStart"/>
+      <w:r>
+        <w:t>generated files</w:t>
+      </w:r>
+      <w:proofErr w:type="gramEnd"/>
+      <w:r>
+        <w:t xml:space="preserve"> </w:t>
       </w:r>
       <w:r>
         <w:t>were</w:t>
@@ -20905,6 +21614,7 @@
       <w:r>
         <w:t xml:space="preserve">A new </w:t>
       </w:r>
+      <w:proofErr w:type="spellStart"/>
       <w:r>
         <w:rPr>
           <w:b/>
@@ -20912,6 +21622,7 @@
         </w:rPr>
         <w:t>rideTeleport</w:t>
       </w:r>
+      <w:proofErr w:type="spellEnd"/>
       <w:r>
         <w:t xml:space="preserve"> routine was introduced </w:t>
       </w:r>
@@ -20979,6 +21690,7 @@
       <w:r>
         <w:t xml:space="preserve">Find the destination teleport object (elevator), held in </w:t>
       </w:r>
+      <w:proofErr w:type="spellStart"/>
       <w:r>
         <w:rPr>
           <w:b/>
@@ -20988,6 +21700,7 @@
         </w:rPr>
         <w:t>objectFrameCounter</w:t>
       </w:r>
+      <w:proofErr w:type="spellEnd"/>
       <w:r>
         <w:t>.</w:t>
       </w:r>
@@ -21581,6 +22294,7 @@
       <w:r>
         <w:t xml:space="preserve">A new </w:t>
       </w:r>
+      <w:proofErr w:type="spellStart"/>
       <w:r>
         <w:rPr>
           <w:b/>
@@ -21590,6 +22304,7 @@
         </w:rPr>
         <w:t>drawTile</w:t>
       </w:r>
+      <w:proofErr w:type="spellEnd"/>
       <w:r>
         <w:t xml:space="preserve"> routine was </w:t>
       </w:r>
@@ -21761,7 +22476,23 @@
         <w:t xml:space="preserve">be </w:t>
       </w:r>
       <w:r>
-        <w:t>paired to a switch, but not allow an object to be paired with multiple switches</w:t>
+        <w:t xml:space="preserve">paired </w:t>
+      </w:r>
+      <w:proofErr w:type="gramStart"/>
+      <w:r>
+        <w:t>to</w:t>
+      </w:r>
+      <w:proofErr w:type="gramEnd"/>
+      <w:r>
+        <w:t xml:space="preserve"> a </w:t>
+      </w:r>
+      <w:proofErr w:type="gramStart"/>
+      <w:r>
+        <w:t>switch, but</w:t>
+      </w:r>
+      <w:proofErr w:type="gramEnd"/>
+      <w:r>
+        <w:t xml:space="preserve"> not allow an object to be paired with multiple switches</w:t>
       </w:r>
       <w:r>
         <w:t>.</w:t>
@@ -22917,7 +23648,21 @@
         <w:t xml:space="preserve">a level with </w:t>
       </w:r>
       <w:r>
-        <w:t>weeping angels, instead of Daleks, within a church, graveyard theme.</w:t>
+        <w:t>weeping angels, instead of Daleks,</w:t>
+      </w:r>
+      <w:r>
+        <w:t xml:space="preserve"> </w:t>
+      </w:r>
+      <w:proofErr w:type="gramStart"/>
+      <w:r>
+        <w:t xml:space="preserve">within </w:t>
+      </w:r>
+      <w:r>
+        <w:t xml:space="preserve"> graveyard</w:t>
+      </w:r>
+      <w:proofErr w:type="gramEnd"/>
+      <w:r>
+        <w:t xml:space="preserve"> theme.</w:t>
       </w:r>
     </w:p>
     <w:p>
@@ -22955,7 +23700,13 @@
         <w:t>, with surprises!</w:t>
       </w:r>
       <w:r>
-        <w:t xml:space="preserve">  K9 has to navigate the maze to find the TARDIS</w:t>
+        <w:t xml:space="preserve">  K9 </w:t>
+      </w:r>
+      <w:r>
+        <w:t>must</w:t>
+      </w:r>
+      <w:r>
+        <w:t xml:space="preserve"> navigate the maze to find the TARDIS</w:t>
       </w:r>
     </w:p>
     <w:p>
@@ -23106,6 +23857,154 @@
         <w:pStyle w:val="Heading1"/>
       </w:pPr>
       <w:r>
+        <w:t>Reflections</w:t>
+      </w:r>
+    </w:p>
+    <w:p>
+      <w:pPr>
+        <w:pStyle w:val="ListParagraph"/>
+        <w:numPr>
+          <w:ilvl w:val="0"/>
+          <w:numId w:val="2"/>
+        </w:numPr>
+      </w:pPr>
+      <w:r>
+        <w:t xml:space="preserve">Improving the game took as long as </w:t>
+      </w:r>
+      <w:r>
+        <w:t>‘</w:t>
+      </w:r>
+      <w:r>
+        <w:t>completing</w:t>
+      </w:r>
+      <w:r>
+        <w:t>’</w:t>
+      </w:r>
+      <w:r>
+        <w:t xml:space="preserve"> the functionality</w:t>
+      </w:r>
+    </w:p>
+    <w:p>
+      <w:pPr>
+        <w:pStyle w:val="ListParagraph"/>
+        <w:numPr>
+          <w:ilvl w:val="0"/>
+          <w:numId w:val="2"/>
+        </w:numPr>
+      </w:pPr>
+      <w:r>
+        <w:t>Designing the levels was time</w:t>
+      </w:r>
+      <w:r>
+        <w:t>-</w:t>
+      </w:r>
+      <w:r>
+        <w:t>consuming</w:t>
+      </w:r>
+      <w:r>
+        <w:t xml:space="preserve"> and </w:t>
+      </w:r>
+      <w:r>
+        <w:t>rewarding.</w:t>
+      </w:r>
+    </w:p>
+    <w:p>
+      <w:pPr>
+        <w:pStyle w:val="ListParagraph"/>
+        <w:numPr>
+          <w:ilvl w:val="0"/>
+          <w:numId w:val="2"/>
+        </w:numPr>
+      </w:pPr>
+      <w:r>
+        <w:t xml:space="preserve">Getting feedback was immensely useful.  It pushed the game far beyond where I </w:t>
+      </w:r>
+      <w:r>
+        <w:t>thought it</w:t>
+      </w:r>
+      <w:r>
+        <w:t xml:space="preserve"> was possible.</w:t>
+      </w:r>
+    </w:p>
+    <w:p>
+      <w:pPr>
+        <w:pStyle w:val="ListParagraph"/>
+        <w:numPr>
+          <w:ilvl w:val="0"/>
+          <w:numId w:val="2"/>
+        </w:numPr>
+      </w:pPr>
+      <w:r>
+        <w:t>The decision to write a platform game was certainly a good one as it did indeed provide ample opportunity to learn and try out different things.</w:t>
+      </w:r>
+    </w:p>
+    <w:p>
+      <w:pPr>
+        <w:pStyle w:val="ListParagraph"/>
+        <w:numPr>
+          <w:ilvl w:val="0"/>
+          <w:numId w:val="2"/>
+        </w:numPr>
+      </w:pPr>
+      <w:r>
+        <w:t>The tools (</w:t>
+      </w:r>
+      <w:proofErr w:type="spellStart"/>
+      <w:r>
+        <w:t>BeebAsm</w:t>
+      </w:r>
+      <w:proofErr w:type="spellEnd"/>
+      <w:r>
+        <w:t xml:space="preserve"> and </w:t>
+      </w:r>
+      <w:proofErr w:type="spellStart"/>
+      <w:r>
+        <w:t>BeebEm</w:t>
+      </w:r>
+      <w:proofErr w:type="spellEnd"/>
+      <w:r>
+        <w:t>) and online resources made a huge difference.  Developing the game without them would have been significantly more difficult</w:t>
+      </w:r>
+      <w:r>
+        <w:t>.</w:t>
+      </w:r>
+    </w:p>
+    <w:p>
+      <w:pPr>
+        <w:pStyle w:val="ListParagraph"/>
+        <w:numPr>
+          <w:ilvl w:val="0"/>
+          <w:numId w:val="2"/>
+        </w:numPr>
+      </w:pPr>
+      <w:r>
+        <w:t xml:space="preserve">The decision to write a disc-based game was also a good choice as it allowed all non-gameplay functionality to be loaded on demand, </w:t>
+      </w:r>
+      <w:r>
+        <w:t>enabling a richer</w:t>
+      </w:r>
+      <w:r>
+        <w:t xml:space="preserve"> gameplay </w:t>
+      </w:r>
+      <w:r>
+        <w:lastRenderedPageBreak/>
+        <w:t>experience within the game.</w:t>
+      </w:r>
+      <w:r>
+        <w:t xml:space="preserve">  It also matched the typical configuration of BBC Micros today which typically ha</w:t>
+      </w:r>
+      <w:r>
+        <w:t>ve</w:t>
+      </w:r>
+      <w:r>
+        <w:t xml:space="preserve"> a SD card backed disc drive installed.</w:t>
+      </w:r>
+    </w:p>
+    <w:p>
+      <w:pPr>
+        <w:pStyle w:val="Heading1"/>
+      </w:pPr>
+      <w:r>
         <w:t>Miscellaneous</w:t>
       </w:r>
     </w:p>
@@ -23206,7 +24105,6 @@
     </w:p>
     <w:p>
       <w:r>
-        <w:lastRenderedPageBreak/>
         <w:t>The memory layout evolved during the development of the game, with allocations moved as needed.  This section shows the current layout.</w:t>
       </w:r>
     </w:p>
@@ -23818,9 +24716,11 @@
             <w:r>
               <w:t xml:space="preserve"> </w:t>
             </w:r>
+            <w:proofErr w:type="gramStart"/>
             <w:r>
               <w:t>sprite</w:t>
             </w:r>
+            <w:proofErr w:type="gramEnd"/>
             <w:r>
               <w:t xml:space="preserve"> </w:t>
             </w:r>
@@ -23866,6 +24766,7 @@
               <w:jc w:val="center"/>
             </w:pPr>
             <w:r>
+              <w:lastRenderedPageBreak/>
               <w:t>0</w:t>
             </w:r>
             <w:r>
@@ -24431,12 +25332,14 @@
             <w:r>
               <w:t xml:space="preserve">Game </w:t>
             </w:r>
+            <w:proofErr w:type="gramStart"/>
             <w:r>
               <w:t>s</w:t>
             </w:r>
             <w:r>
               <w:t>prite data</w:t>
             </w:r>
+            <w:proofErr w:type="gramEnd"/>
             <w:r>
               <w:t>*</w:t>
             </w:r>
@@ -24677,7 +25580,6 @@
         </w:numPr>
       </w:pPr>
       <w:r>
-        <w:lastRenderedPageBreak/>
         <w:t>The stack (page 1) is reduced to just 64 bytes, allowing 192 bytes to be repurposed.</w:t>
       </w:r>
     </w:p>
@@ -24723,7 +25625,21 @@
         <w:t xml:space="preserve"> repurposed. This is achieved by avoiding related MOS and DFS functionality or using the functionality in limited and controlled ways.</w:t>
       </w:r>
       <w:r>
-        <w:t xml:space="preserve">  Notable regions repurposed include the NMI workspace (which has to be acquired from MOS), the MOS keyboard and printer buffers, and transient regions of DFS workspace</w:t>
+        <w:t xml:space="preserve">  Notable regions repurposed include the NMI workspace (which </w:t>
+      </w:r>
+      <w:r>
+        <w:t>is</w:t>
+      </w:r>
+      <w:r>
+        <w:t xml:space="preserve"> </w:t>
+      </w:r>
+      <w:proofErr w:type="gramStart"/>
+      <w:r>
+        <w:t>be acquired</w:t>
+      </w:r>
+      <w:proofErr w:type="gramEnd"/>
+      <w:r>
+        <w:t xml:space="preserve"> from MOS), the MOS keyboard and printer buffers, and transient regions of DFS workspace</w:t>
       </w:r>
       <w:r>
         <w:t>.</w:t>
@@ -24845,7 +25761,13 @@
         <w:t>available</w:t>
       </w:r>
       <w:r>
-        <w:t>.  MOS/DFS use 896 bytes</w:t>
+        <w:t xml:space="preserve">.  MOS/DFS use </w:t>
+      </w:r>
+      <w:r>
+        <w:t xml:space="preserve">just </w:t>
+      </w:r>
+      <w:r>
+        <w:t>896 bytes</w:t>
       </w:r>
       <w:r>
         <w:t>.</w:t>
@@ -24863,7 +25785,15 @@
         <w:t>*</w:t>
       </w:r>
       <w:r>
-        <w:t xml:space="preserve">On machines with 16K+ of sideways RAM, sampling code (sample.6502) replaces the </w:t>
+        <w:t xml:space="preserve">On machines with 16K+ of sideways RAM, sampling code (sample.6502) </w:t>
+      </w:r>
+      <w:proofErr w:type="gramStart"/>
+      <w:r>
+        <w:t>replaces</w:t>
+      </w:r>
+      <w:proofErr w:type="gramEnd"/>
+      <w:r>
+        <w:t xml:space="preserve"> the </w:t>
       </w:r>
       <w:r>
         <w:rPr>
@@ -24918,7 +25848,22 @@
     </w:p>
     <w:p>
       <w:r>
-        <w:t>During startup and titles, the 32K of available memory is allocated as follows:</w:t>
+        <w:t xml:space="preserve">During startup and titles, </w:t>
+      </w:r>
+      <w:r>
+        <w:t xml:space="preserve">memory </w:t>
+      </w:r>
+      <w:r>
+        <w:t xml:space="preserve">addresses </w:t>
+      </w:r>
+      <w:r>
+        <w:t xml:space="preserve">&amp;3130 to &amp;8000 </w:t>
+      </w:r>
+      <w:r>
+        <w:t>are</w:t>
+      </w:r>
+      <w:r>
+        <w:t xml:space="preserve"> allocated as follows:</w:t>
       </w:r>
     </w:p>
     <w:tbl>
@@ -25132,6 +26077,7 @@
               <w:jc w:val="center"/>
             </w:pPr>
             <w:r>
+              <w:lastRenderedPageBreak/>
               <w:t>4000</w:t>
             </w:r>
           </w:p>
@@ -25857,7 +26803,6 @@
     <w:p/>
     <w:p>
       <w:r>
-        <w:lastRenderedPageBreak/>
         <w:t>The white and gray rows</w:t>
       </w:r>
       <w:r>
@@ -25896,10 +26841,18 @@
         <w:t xml:space="preserve"> </w:t>
       </w:r>
       <w:r>
-        <w:t xml:space="preserve">functionality, which includes common Mode 7 routines, the </w:t>
-      </w:r>
-      <w:r>
-        <w:t>Doctor Who</w:t>
+        <w:t xml:space="preserve">functionality, which includes common Mode 7 routines, </w:t>
+      </w:r>
+      <w:proofErr w:type="gramStart"/>
+      <w:r>
+        <w:t xml:space="preserve">the </w:t>
+      </w:r>
+      <w:r>
+        <w:t>Doctor</w:t>
+      </w:r>
+      <w:proofErr w:type="gramEnd"/>
+      <w:r>
+        <w:t xml:space="preserve"> Who</w:t>
       </w:r>
       <w:r>
         <w:t xml:space="preserve"> theme music</w:t>
@@ -26106,6 +27059,7 @@
               <w:jc w:val="center"/>
             </w:pPr>
             <w:r>
+              <w:lastRenderedPageBreak/>
               <w:t>Address (hex)</w:t>
             </w:r>
           </w:p>
@@ -26807,7 +27761,6 @@
               <w:jc w:val="center"/>
             </w:pPr>
             <w:r>
-              <w:lastRenderedPageBreak/>
               <w:t>7C00</w:t>
             </w:r>
           </w:p>
@@ -26848,7 +27801,13 @@
         <w:br/>
       </w:r>
       <w:r>
-        <w:t>A level file is simply loaded at address &amp;30B0, populating the memory space as depicted by the white, gray, and light blue rows</w:t>
+        <w:t>A level file is simply loaded at address &amp;30</w:t>
+      </w:r>
+      <w:r>
+        <w:t>3</w:t>
+      </w:r>
+      <w:r>
+        <w:t>0, populating the memory space as depicted by the white, gray, and light blue rows</w:t>
       </w:r>
       <w:r>
         <w:t xml:space="preserve"> abo</w:t>
@@ -27287,7 +28246,13 @@
         <w:t>6CC</w:t>
       </w:r>
       <w:r>
-        <w:t>, populated the light blue rows depicted above.</w:t>
+        <w:t xml:space="preserve">, </w:t>
+      </w:r>
+      <w:r>
+        <w:t xml:space="preserve">populating </w:t>
+      </w:r>
+      <w:r>
+        <w:t>the light blue rows depicted above.</w:t>
       </w:r>
     </w:p>
     <w:p>
@@ -27318,6 +28283,7 @@
         </w:numPr>
       </w:pPr>
       <w:r>
+        <w:lastRenderedPageBreak/>
         <w:t>Unrolled</w:t>
       </w:r>
       <w:r>
@@ -27408,6 +28374,9 @@
         <w:t xml:space="preserve"> after a tile-grid </w:t>
       </w:r>
       <w:r>
+        <w:t xml:space="preserve">flag </w:t>
+      </w:r>
+      <w:r>
         <w:t>match</w:t>
       </w:r>
       <w:r>
@@ -27425,6 +28394,7 @@
       <w:r>
         <w:t xml:space="preserve">The use of an object </w:t>
       </w:r>
+      <w:proofErr w:type="gramStart"/>
       <w:r>
         <w:rPr>
           <w:i/>
@@ -27432,6 +28402,7 @@
         </w:rPr>
         <w:t>redraw</w:t>
       </w:r>
+      <w:proofErr w:type="gramEnd"/>
       <w:r>
         <w:t xml:space="preserve"> flag ensure</w:t>
       </w:r>
@@ -27487,7 +28458,6 @@
         </w:numPr>
       </w:pPr>
       <w:r>
-        <w:lastRenderedPageBreak/>
         <w:t xml:space="preserve">Reduced the number of animation updates.  For example, static doors and </w:t>
       </w:r>
       <w:r>
@@ -27590,7 +28560,15 @@
         <w:t xml:space="preserve"> that sweeps across screen memory</w:t>
       </w:r>
       <w:r>
-        <w:t xml:space="preserve">. The code is executed every 32 frames (approx. twice a second) so it has a negligible impact on overall performance.  The algorithm is also quite efficient over small datasets which are already sorted, or close to being sorted.  Tests showed that the algorithm re-sorts the </w:t>
+        <w:t>. The code is executed every 32 frames (approx. twice a second</w:t>
+      </w:r>
+      <w:proofErr w:type="gramStart"/>
+      <w:r>
+        <w:t>)</w:t>
+      </w:r>
+      <w:proofErr w:type="gramEnd"/>
+      <w:r>
+        <w:t xml:space="preserve"> so it has a negligible impact on overall performance.  The algorithm is also quite efficient over small datasets which are already sorted, or close to being sorted.  Tests showed that the algorithm re-sorts the </w:t>
       </w:r>
       <w:r>
         <w:rPr>
@@ -27756,6 +28734,7 @@
       <w:r>
         <w:t xml:space="preserve">Removed </w:t>
       </w:r>
+      <w:proofErr w:type="spellStart"/>
       <w:r>
         <w:rPr>
           <w:i/>
@@ -27763,9 +28742,11 @@
         </w:rPr>
         <w:t>objectWidth</w:t>
       </w:r>
+      <w:proofErr w:type="spellEnd"/>
       <w:r>
         <w:t xml:space="preserve"> &amp; </w:t>
       </w:r>
+      <w:proofErr w:type="spellStart"/>
       <w:r>
         <w:rPr>
           <w:i/>
@@ -27773,6 +28754,7 @@
         </w:rPr>
         <w:t>objectHeight</w:t>
       </w:r>
+      <w:proofErr w:type="spellEnd"/>
       <w:r>
         <w:t xml:space="preserve"> arrays</w:t>
       </w:r>
@@ -27802,6 +28784,7 @@
       <w:r>
         <w:t xml:space="preserve">, </w:t>
       </w:r>
+      <w:proofErr w:type="spellStart"/>
       <w:r>
         <w:rPr>
           <w:i/>
@@ -27809,12 +28792,14 @@
         </w:rPr>
         <w:t>widthMinusOne</w:t>
       </w:r>
+      <w:proofErr w:type="spellEnd"/>
       <w:r>
         <w:t xml:space="preserve">, </w:t>
       </w:r>
       <w:r>
         <w:t xml:space="preserve">and </w:t>
       </w:r>
+      <w:proofErr w:type="spellStart"/>
       <w:r>
         <w:rPr>
           <w:i/>
@@ -27822,6 +28807,7 @@
         </w:rPr>
         <w:t>heightMinusOne</w:t>
       </w:r>
+      <w:proofErr w:type="spellEnd"/>
       <w:r>
         <w:t xml:space="preserve">.  </w:t>
       </w:r>
@@ -27843,6 +28829,7 @@
       <w:r>
         <w:t xml:space="preserve"> which were previously subtracting one from </w:t>
       </w:r>
+      <w:proofErr w:type="spellStart"/>
       <w:r>
         <w:rPr>
           <w:i/>
@@ -27850,9 +28837,11 @@
         </w:rPr>
         <w:t>objectWidth</w:t>
       </w:r>
+      <w:proofErr w:type="spellEnd"/>
       <w:r>
         <w:t xml:space="preserve"> &amp; </w:t>
       </w:r>
+      <w:proofErr w:type="spellStart"/>
       <w:r>
         <w:rPr>
           <w:i/>
@@ -27874,6 +28863,7 @@
         </w:rPr>
         <w:t>ght</w:t>
       </w:r>
+      <w:proofErr w:type="spellEnd"/>
       <w:r>
         <w:t xml:space="preserve">.  </w:t>
       </w:r>
@@ -27887,8 +28877,10 @@
         </w:numPr>
       </w:pPr>
       <w:r>
+        <w:lastRenderedPageBreak/>
         <w:t xml:space="preserve">Bit-packed </w:t>
       </w:r>
+      <w:proofErr w:type="spellStart"/>
       <w:r>
         <w:rPr>
           <w:i/>
@@ -27896,9 +28888,11 @@
         </w:rPr>
         <w:t>objectType</w:t>
       </w:r>
+      <w:proofErr w:type="spellEnd"/>
       <w:r>
         <w:t xml:space="preserve"> and </w:t>
       </w:r>
+      <w:proofErr w:type="spellStart"/>
       <w:r>
         <w:rPr>
           <w:i/>
@@ -27906,6 +28900,7 @@
         </w:rPr>
         <w:t>objectState</w:t>
       </w:r>
+      <w:proofErr w:type="spellEnd"/>
       <w:r>
         <w:t xml:space="preserve"> array</w:t>
       </w:r>
@@ -28102,11 +29097,7 @@
         <w:t xml:space="preserve"> Likewise, </w:t>
       </w:r>
       <w:r>
-        <w:t xml:space="preserve">interstitial </w:t>
-      </w:r>
-      <w:r>
-        <w:lastRenderedPageBreak/>
-        <w:t xml:space="preserve">screen experience and </w:t>
+        <w:t xml:space="preserve">interstitial screen experience and </w:t>
       </w:r>
       <w:r>
         <w:t>l</w:t>
@@ -28212,6 +29203,7 @@
       <w:r>
         <w:t xml:space="preserve">JMP </w:t>
       </w:r>
+      <w:proofErr w:type="spellStart"/>
       <w:r>
         <w:rPr>
           <w:i/>
@@ -28220,8 +29212,13 @@
         <w:t>xxx</w:t>
       </w:r>
       <w:r>
-        <w:t xml:space="preserve">x instead of JSR </w:t>
-      </w:r>
+        <w:t>x</w:t>
+      </w:r>
+      <w:proofErr w:type="spellEnd"/>
+      <w:r>
+        <w:t xml:space="preserve"> instead of JSR </w:t>
+      </w:r>
+      <w:proofErr w:type="spellStart"/>
       <w:r>
         <w:rPr>
           <w:i/>
@@ -28229,6 +29226,7 @@
         </w:rPr>
         <w:t>xxxx</w:t>
       </w:r>
+      <w:proofErr w:type="spellEnd"/>
       <w:r>
         <w:t xml:space="preserve">, </w:t>
       </w:r>
@@ -28404,6 +29402,7 @@
       <w:r>
         <w:t xml:space="preserve"> and </w:t>
       </w:r>
+      <w:proofErr w:type="spellStart"/>
       <w:r>
         <w:rPr>
           <w:i/>
@@ -28411,6 +29410,7 @@
         </w:rPr>
         <w:t>dalekAnimate</w:t>
       </w:r>
+      <w:proofErr w:type="spellEnd"/>
       <w:r>
         <w:t xml:space="preserve"> routines do this.</w:t>
       </w:r>
@@ -28422,6 +29422,46 @@
           <w:ilvl w:val="0"/>
           <w:numId w:val="16"/>
         </w:numPr>
+      </w:pPr>
+      <w:r>
+        <w:t xml:space="preserve">Used unsigned integers </w:t>
+      </w:r>
+      <w:r>
+        <w:t xml:space="preserve">for scalar values.  </w:t>
+      </w:r>
+      <w:r>
+        <w:t xml:space="preserve">Comparing </w:t>
+      </w:r>
+      <w:r>
+        <w:t xml:space="preserve">unsigned integers </w:t>
+      </w:r>
+      <w:proofErr w:type="gramStart"/>
+      <w:r>
+        <w:t>require</w:t>
+      </w:r>
+      <w:proofErr w:type="gramEnd"/>
+      <w:r>
+        <w:t xml:space="preserve"> </w:t>
+      </w:r>
+      <w:proofErr w:type="gramStart"/>
+      <w:r>
+        <w:t>less</w:t>
+      </w:r>
+      <w:proofErr w:type="gramEnd"/>
+      <w:r>
+        <w:t xml:space="preserve"> instructions than comparing signed ones</w:t>
+      </w:r>
+      <w:r>
+        <w:t>.</w:t>
+      </w:r>
+    </w:p>
+    <w:p>
+      <w:pPr>
+        <w:pStyle w:val="ListParagraph"/>
+        <w:numPr>
+          <w:ilvl w:val="0"/>
+          <w:numId w:val="16"/>
+        </w:numPr>
         <w:rPr>
           <w:rFonts w:ascii="Cascadia Code" w:hAnsi="Cascadia Code"/>
           <w:sz w:val="18"/>
@@ -28459,6 +29499,8 @@
       <w:r>
         <w:rPr>
           <w:rFonts w:ascii="Cascadia Code" w:hAnsi="Cascadia Code"/>
+          <w:b/>
+          <w:bCs/>
           <w:sz w:val="18"/>
           <w:szCs w:val="18"/>
         </w:rPr>
@@ -28467,114 +29509,238 @@
       <w:r>
         <w:rPr>
           <w:rFonts w:ascii="Cascadia Code" w:hAnsi="Cascadia Code"/>
+          <w:b/>
+          <w:bCs/>
           <w:sz w:val="18"/>
           <w:szCs w:val="18"/>
         </w:rPr>
-        <w:t xml:space="preserve"> A</w:t>
-      </w:r>
+        <w:t xml:space="preserve"> </w:t>
+      </w:r>
+      <w:proofErr w:type="gramStart"/>
       <w:r>
         <w:rPr>
           <w:rFonts w:ascii="Cascadia Code" w:hAnsi="Cascadia Code"/>
+          <w:b/>
+          <w:bCs/>
           <w:sz w:val="18"/>
           <w:szCs w:val="18"/>
         </w:rPr>
-        <w:t>l</w:t>
+        <w:t>A</w:t>
       </w:r>
       <w:r>
         <w:rPr>
           <w:rFonts w:ascii="Cascadia Code" w:hAnsi="Cascadia Code"/>
+          <w:b/>
+          <w:bCs/>
           <w:sz w:val="18"/>
           <w:szCs w:val="18"/>
         </w:rPr>
-        <w:br/>
-        <w:t xml:space="preserve">  </w:t>
+        <w:t>l</w:t>
       </w:r>
       <w:r>
         <w:rPr>
           <w:rFonts w:ascii="Cascadia Code" w:hAnsi="Cascadia Code"/>
+          <w:b/>
+          <w:bCs/>
           <w:sz w:val="18"/>
           <w:szCs w:val="18"/>
         </w:rPr>
-        <w:t>CMP</w:t>
+        <w:t xml:space="preserve"> </w:t>
       </w:r>
       <w:r>
         <w:rPr>
           <w:rFonts w:ascii="Cascadia Code" w:hAnsi="Cascadia Code"/>
+          <w:b/>
+          <w:bCs/>
           <w:sz w:val="18"/>
           <w:szCs w:val="18"/>
         </w:rPr>
-        <w:t xml:space="preserve"> Bl</w:t>
-      </w:r>
+        <w:t>:</w:t>
+      </w:r>
+      <w:proofErr w:type="gramEnd"/>
       <w:r>
         <w:rPr>
           <w:rFonts w:ascii="Cascadia Code" w:hAnsi="Cascadia Code"/>
+          <w:b/>
+          <w:bCs/>
           <w:sz w:val="18"/>
           <w:szCs w:val="18"/>
         </w:rPr>
-        <w:br/>
-        <w:t xml:space="preserve">  </w:t>
+        <w:t xml:space="preserve"> </w:t>
       </w:r>
       <w:r>
         <w:rPr>
           <w:rFonts w:ascii="Cascadia Code" w:hAnsi="Cascadia Code"/>
+          <w:b/>
+          <w:bCs/>
           <w:sz w:val="18"/>
           <w:szCs w:val="18"/>
         </w:rPr>
-        <w:t>LDA</w:t>
+        <w:t>CMP</w:t>
       </w:r>
       <w:r>
         <w:rPr>
           <w:rFonts w:ascii="Cascadia Code" w:hAnsi="Cascadia Code"/>
+          <w:b/>
+          <w:bCs/>
           <w:sz w:val="18"/>
           <w:szCs w:val="18"/>
         </w:rPr>
-        <w:t xml:space="preserve"> Ah</w:t>
-      </w:r>
+        <w:t xml:space="preserve"> </w:t>
+      </w:r>
+      <w:proofErr w:type="gramStart"/>
       <w:r>
         <w:rPr>
           <w:rFonts w:ascii="Cascadia Code" w:hAnsi="Cascadia Code"/>
+          <w:b/>
+          <w:bCs/>
           <w:sz w:val="18"/>
           <w:szCs w:val="18"/>
         </w:rPr>
-        <w:br/>
-        <w:t xml:space="preserve">  </w:t>
+        <w:t>Bl</w:t>
       </w:r>
       <w:r>
         <w:rPr>
           <w:rFonts w:ascii="Cascadia Code" w:hAnsi="Cascadia Code"/>
+          <w:b/>
+          <w:bCs/>
           <w:sz w:val="18"/>
           <w:szCs w:val="18"/>
         </w:rPr>
-        <w:t>SBC</w:t>
-      </w:r>
+        <w:t xml:space="preserve"> :</w:t>
+      </w:r>
+      <w:proofErr w:type="gramEnd"/>
       <w:r>
         <w:rPr>
           <w:rFonts w:ascii="Cascadia Code" w:hAnsi="Cascadia Code"/>
+          <w:b/>
+          <w:bCs/>
           <w:sz w:val="18"/>
           <w:szCs w:val="18"/>
         </w:rPr>
-        <w:t xml:space="preserve"> Bh</w:t>
+        <w:t xml:space="preserve"> </w:t>
       </w:r>
       <w:r>
         <w:rPr>
           <w:rFonts w:ascii="Cascadia Code" w:hAnsi="Cascadia Code"/>
+          <w:b/>
+          <w:bCs/>
           <w:sz w:val="18"/>
           <w:szCs w:val="18"/>
         </w:rPr>
-        <w:br/>
-        <w:t xml:space="preserve">  </w:t>
+        <w:t>LDA</w:t>
       </w:r>
       <w:r>
         <w:rPr>
           <w:rFonts w:ascii="Cascadia Code" w:hAnsi="Cascadia Code"/>
+          <w:b/>
+          <w:bCs/>
           <w:sz w:val="18"/>
           <w:szCs w:val="18"/>
         </w:rPr>
+        <w:t xml:space="preserve"> </w:t>
+      </w:r>
+      <w:proofErr w:type="gramStart"/>
+      <w:r>
+        <w:rPr>
+          <w:rFonts w:ascii="Cascadia Code" w:hAnsi="Cascadia Code"/>
+          <w:b/>
+          <w:bCs/>
+          <w:sz w:val="18"/>
+          <w:szCs w:val="18"/>
+        </w:rPr>
+        <w:t>Ah</w:t>
+      </w:r>
+      <w:r>
+        <w:rPr>
+          <w:rFonts w:ascii="Cascadia Code" w:hAnsi="Cascadia Code"/>
+          <w:b/>
+          <w:bCs/>
+          <w:sz w:val="18"/>
+          <w:szCs w:val="18"/>
+        </w:rPr>
+        <w:t xml:space="preserve"> :</w:t>
+      </w:r>
+      <w:proofErr w:type="gramEnd"/>
+      <w:r>
+        <w:rPr>
+          <w:rFonts w:ascii="Cascadia Code" w:hAnsi="Cascadia Code"/>
+          <w:b/>
+          <w:bCs/>
+          <w:sz w:val="18"/>
+          <w:szCs w:val="18"/>
+        </w:rPr>
+        <w:t xml:space="preserve"> </w:t>
+      </w:r>
+      <w:r>
+        <w:rPr>
+          <w:rFonts w:ascii="Cascadia Code" w:hAnsi="Cascadia Code"/>
+          <w:b/>
+          <w:bCs/>
+          <w:sz w:val="18"/>
+          <w:szCs w:val="18"/>
+        </w:rPr>
+        <w:t>SBC</w:t>
+      </w:r>
+      <w:r>
+        <w:rPr>
+          <w:rFonts w:ascii="Cascadia Code" w:hAnsi="Cascadia Code"/>
+          <w:b/>
+          <w:bCs/>
+          <w:sz w:val="18"/>
+          <w:szCs w:val="18"/>
+        </w:rPr>
+        <w:t xml:space="preserve"> </w:t>
+      </w:r>
+      <w:proofErr w:type="spellStart"/>
+      <w:proofErr w:type="gramStart"/>
+      <w:r>
+        <w:rPr>
+          <w:rFonts w:ascii="Cascadia Code" w:hAnsi="Cascadia Code"/>
+          <w:b/>
+          <w:bCs/>
+          <w:sz w:val="18"/>
+          <w:szCs w:val="18"/>
+        </w:rPr>
+        <w:t>Bh</w:t>
+      </w:r>
+      <w:proofErr w:type="spellEnd"/>
+      <w:r>
+        <w:rPr>
+          <w:rFonts w:ascii="Cascadia Code" w:hAnsi="Cascadia Code"/>
+          <w:b/>
+          <w:bCs/>
+          <w:sz w:val="18"/>
+          <w:szCs w:val="18"/>
+        </w:rPr>
+        <w:t xml:space="preserve"> :</w:t>
+      </w:r>
+      <w:proofErr w:type="gramEnd"/>
+      <w:r>
+        <w:rPr>
+          <w:rFonts w:ascii="Cascadia Code" w:hAnsi="Cascadia Code"/>
+          <w:b/>
+          <w:bCs/>
+          <w:sz w:val="18"/>
+          <w:szCs w:val="18"/>
+        </w:rPr>
+        <w:t xml:space="preserve"> </w:t>
+      </w:r>
+      <w:r>
+        <w:rPr>
+          <w:rFonts w:ascii="Cascadia Code" w:hAnsi="Cascadia Code"/>
+          <w:b/>
+          <w:bCs/>
+          <w:sz w:val="18"/>
+          <w:szCs w:val="18"/>
+        </w:rPr>
         <w:t xml:space="preserve">BCC </w:t>
       </w:r>
       <w:r>
         <w:rPr>
           <w:rFonts w:ascii="Cascadia Code" w:hAnsi="Cascadia Code"/>
+          <w:b/>
+          <w:bCs/>
           <w:i/>
           <w:iCs/>
           <w:sz w:val="18"/>
@@ -28640,10 +29806,10 @@
         <w:t xml:space="preserve">The code is </w:t>
       </w:r>
       <w:r>
-        <w:t xml:space="preserve">fairly </w:t>
-      </w:r>
-      <w:r>
-        <w:t>structured with routines</w:t>
+        <w:t>structured</w:t>
+      </w:r>
+      <w:r>
+        <w:t xml:space="preserve"> with routines</w:t>
       </w:r>
       <w:r>
         <w:t xml:space="preserve"> used extensively throughout the program</w:t>
@@ -28660,8 +29826,10 @@
     </w:p>
     <w:p>
       <w:r>
+        <w:lastRenderedPageBreak/>
         <w:t xml:space="preserve">Routines always define a new scope (a wonderful </w:t>
       </w:r>
+      <w:proofErr w:type="spellStart"/>
       <w:r>
         <w:rPr>
           <w:b/>
@@ -28671,6 +29839,7 @@
         </w:rPr>
         <w:t>BeebAsm</w:t>
       </w:r>
+      <w:proofErr w:type="spellEnd"/>
       <w:r>
         <w:t xml:space="preserve"> feature) to limit the scope of contained labels and local data. Nested scopes are not used.</w:t>
       </w:r>
@@ -28883,597 +30052,653 @@
     </w:p>
     <w:p>
       <w:r>
+        <w:t xml:space="preserve">Comments are shown in-line with the code and occasionally to the right.  They aim to provide a higher-level </w:t>
+      </w:r>
+      <w:r>
+        <w:t>outline</w:t>
+      </w:r>
+      <w:r>
+        <w:t xml:space="preserve"> of the code rather than document what every instruction is doing.</w:t>
+      </w:r>
+    </w:p>
+    <w:p>
+      <w:r>
+        <w:t xml:space="preserve">Routine parameter passing </w:t>
+      </w:r>
+      <w:r>
+        <w:t xml:space="preserve">uses the </w:t>
+      </w:r>
+      <w:r>
+        <w:t>following rule</w:t>
+      </w:r>
+      <w:r>
+        <w:t>s:</w:t>
+      </w:r>
+      <w:r>
+        <w:t xml:space="preserve"> </w:t>
+      </w:r>
+    </w:p>
+    <w:p>
+      <w:r>
+        <w:t xml:space="preserve">The accumulator is </w:t>
+      </w:r>
+      <w:r>
+        <w:t xml:space="preserve">typically </w:t>
+      </w:r>
+      <w:r>
+        <w:t xml:space="preserve">used to pass arguments to routines that </w:t>
+      </w:r>
+      <w:r>
+        <w:t>accept</w:t>
+      </w:r>
+      <w:r>
+        <w:t xml:space="preserve"> a </w:t>
+      </w:r>
+      <w:r>
+        <w:t xml:space="preserve">single </w:t>
+      </w:r>
+      <w:r>
+        <w:t>argument</w:t>
+      </w:r>
+      <w:r>
+        <w:t>,</w:t>
+      </w:r>
+      <w:r>
+        <w:t xml:space="preserve"> and the </w:t>
+      </w:r>
+      <w:r>
+        <w:t xml:space="preserve">X register </w:t>
+      </w:r>
+      <w:r>
+        <w:t xml:space="preserve">is </w:t>
+      </w:r>
+      <w:r>
+        <w:t xml:space="preserve">exclusively </w:t>
+      </w:r>
+      <w:r>
+        <w:t xml:space="preserve">used to </w:t>
+      </w:r>
+      <w:r>
+        <w:t>pass game object</w:t>
+      </w:r>
+      <w:r>
+        <w:t xml:space="preserve">s, </w:t>
+      </w:r>
+      <w:r>
+        <w:t>as</w:t>
+      </w:r>
+      <w:r>
+        <w:t xml:space="preserve"> an </w:t>
+      </w:r>
+      <w:r>
+        <w:t>index</w:t>
+      </w:r>
+      <w:r>
+        <w:t xml:space="preserve">.  </w:t>
+      </w:r>
+      <w:r>
+        <w:t xml:space="preserve">In other situations, </w:t>
+      </w:r>
+      <w:r>
+        <w:t>z</w:t>
+      </w:r>
+      <w:r>
+        <w:t xml:space="preserve">ero-page variables are </w:t>
+      </w:r>
+      <w:r>
+        <w:t xml:space="preserve">used to </w:t>
+      </w:r>
+      <w:r>
+        <w:t>pass argument</w:t>
+      </w:r>
+      <w:r>
+        <w:t>s</w:t>
+      </w:r>
+      <w:r>
+        <w:t>.</w:t>
+      </w:r>
+      <w:r>
+        <w:t xml:space="preserve">  </w:t>
+      </w:r>
+      <w:r>
+        <w:t xml:space="preserve">The </w:t>
+      </w:r>
+      <w:r>
+        <w:t xml:space="preserve">Y register </w:t>
+      </w:r>
+      <w:r>
+        <w:t>is rarely</w:t>
+      </w:r>
+      <w:r>
+        <w:t xml:space="preserve"> </w:t>
+      </w:r>
+      <w:r>
+        <w:t>used</w:t>
+      </w:r>
+      <w:r>
+        <w:t>.</w:t>
+      </w:r>
+    </w:p>
+    <w:p>
+      <w:r>
+        <w:t>As for the stack</w:t>
+      </w:r>
+      <w:r>
+        <w:t>…</w:t>
+      </w:r>
+      <w:r>
+        <w:t xml:space="preserve"> r</w:t>
+      </w:r>
+      <w:r>
+        <w:t xml:space="preserve">outines occasionally push and pop values, </w:t>
+      </w:r>
+      <w:r>
+        <w:t xml:space="preserve">but </w:t>
+      </w:r>
+      <w:r>
+        <w:t xml:space="preserve">this is </w:t>
+      </w:r>
+      <w:r>
+        <w:t>rare</w:t>
+      </w:r>
+      <w:r>
+        <w:t xml:space="preserve">. </w:t>
+      </w:r>
+      <w:r>
+        <w:t xml:space="preserve"> Z</w:t>
+      </w:r>
+      <w:r>
+        <w:t xml:space="preserve">ero-page </w:t>
+      </w:r>
+      <w:r>
+        <w:t xml:space="preserve">variables </w:t>
+      </w:r>
+      <w:r>
+        <w:t xml:space="preserve">are typically used </w:t>
+      </w:r>
+      <w:r>
+        <w:t>to hold temporary values as this avoids issues where control flow can result in push/pop mismatches.</w:t>
+      </w:r>
+      <w:r>
+        <w:t xml:space="preserve"> </w:t>
+      </w:r>
+    </w:p>
+    <w:p>
+      <w:pPr>
+        <w:pStyle w:val="Heading2"/>
+      </w:pPr>
+      <w:r>
+        <w:t>Game design</w:t>
+      </w:r>
+    </w:p>
+    <w:p>
+      <w:r>
+        <w:t xml:space="preserve">The playability of a game is determined by many </w:t>
+      </w:r>
+      <w:r>
+        <w:t>factors.  The player needs to be challenged</w:t>
+      </w:r>
+      <w:r>
+        <w:t xml:space="preserve">, and </w:t>
+      </w:r>
+      <w:r>
+        <w:t xml:space="preserve">needs to </w:t>
+      </w:r>
+      <w:r>
+        <w:t xml:space="preserve">work, to </w:t>
+      </w:r>
+      <w:r>
+        <w:t xml:space="preserve">feel a </w:t>
+      </w:r>
+      <w:r>
+        <w:t xml:space="preserve">real </w:t>
+      </w:r>
+      <w:r>
+        <w:t xml:space="preserve">sense of </w:t>
+      </w:r>
+      <w:r>
+        <w:t>gratification</w:t>
+      </w:r>
+      <w:r>
+        <w:t xml:space="preserve"> and reward</w:t>
+      </w:r>
+      <w:r>
+        <w:t xml:space="preserve"> later</w:t>
+      </w:r>
+      <w:r>
+        <w:t>.</w:t>
+      </w:r>
+      <w:r>
+        <w:t xml:space="preserve">  The </w:t>
+      </w:r>
+      <w:r>
+        <w:t>players’</w:t>
+      </w:r>
+      <w:r>
+        <w:t xml:space="preserve"> </w:t>
+      </w:r>
+      <w:r>
+        <w:t>attention mu</w:t>
+      </w:r>
+      <w:r>
+        <w:t>st</w:t>
+      </w:r>
+      <w:r>
+        <w:t xml:space="preserve"> also be held</w:t>
+      </w:r>
+      <w:r>
+        <w:t xml:space="preserve"> by the game</w:t>
+      </w:r>
+      <w:r>
+        <w:t>,</w:t>
+      </w:r>
+      <w:r>
+        <w:t xml:space="preserve"> by </w:t>
+      </w:r>
+      <w:r>
+        <w:t>presenting occasional surprises</w:t>
+      </w:r>
+      <w:r>
+        <w:t xml:space="preserve"> and changing thi</w:t>
+      </w:r>
+      <w:r>
+        <w:t>ng</w:t>
+      </w:r>
+      <w:r>
+        <w:t>s</w:t>
+      </w:r>
+      <w:r>
+        <w:t xml:space="preserve"> up</w:t>
+      </w:r>
+      <w:r>
+        <w:t xml:space="preserve"> on the player</w:t>
+      </w:r>
+      <w:r>
+        <w:t>.</w:t>
+      </w:r>
+      <w:r>
+        <w:t xml:space="preserve">  </w:t>
+      </w:r>
+      <w:r>
+        <w:t xml:space="preserve">And </w:t>
+      </w:r>
+      <w:r>
+        <w:t xml:space="preserve">above all, the </w:t>
+      </w:r>
+      <w:r>
+        <w:t xml:space="preserve">player </w:t>
+      </w:r>
+      <w:r>
+        <w:t xml:space="preserve">should not be </w:t>
+      </w:r>
+      <w:r>
+        <w:t>punished</w:t>
+      </w:r>
+      <w:r>
+        <w:t xml:space="preserve"> for playing the game</w:t>
+      </w:r>
+      <w:r>
+        <w:t>.</w:t>
+      </w:r>
+      <w:r>
+        <w:t xml:space="preserve">  The game must </w:t>
+      </w:r>
+      <w:r>
+        <w:t>be robust (not crash</w:t>
+      </w:r>
+      <w:proofErr w:type="gramStart"/>
+      <w:r>
+        <w:t>)</w:t>
+      </w:r>
+      <w:proofErr w:type="gramEnd"/>
+      <w:r>
+        <w:t xml:space="preserve"> and </w:t>
+      </w:r>
+      <w:r>
+        <w:t xml:space="preserve">its difficulty should </w:t>
+      </w:r>
+      <w:r>
+        <w:t xml:space="preserve">increase </w:t>
+      </w:r>
+      <w:r>
+        <w:t>in a reasonable manner.</w:t>
+      </w:r>
+    </w:p>
+    <w:p>
+      <w:r>
+        <w:t>The following choices were made to make th</w:t>
+      </w:r>
+      <w:r>
+        <w:t>is</w:t>
+      </w:r>
+      <w:r>
+        <w:t xml:space="preserve"> game feel more </w:t>
+      </w:r>
+      <w:r>
+        <w:t>current</w:t>
+      </w:r>
+      <w:r>
+        <w:t>.</w:t>
+      </w:r>
+    </w:p>
+    <w:p>
+      <w:r>
+        <w:t xml:space="preserve">Unlike many 1980’s games, </w:t>
+      </w:r>
+      <w:r>
+        <w:t>K9 does not have three lives</w:t>
+      </w:r>
+      <w:r>
+        <w:t xml:space="preserve"> and there isn’t a notion of </w:t>
+      </w:r>
+      <w:r>
+        <w:t xml:space="preserve">score or points.   The goal of the game is </w:t>
+      </w:r>
+      <w:r>
+        <w:t xml:space="preserve">to </w:t>
+      </w:r>
+      <w:r>
+        <w:t xml:space="preserve">just successfully </w:t>
+      </w:r>
+      <w:r>
+        <w:t>navigate</w:t>
+      </w:r>
+      <w:r>
+        <w:t xml:space="preserve"> K9 t</w:t>
+      </w:r>
+      <w:r>
+        <w:t>h</w:t>
+      </w:r>
+      <w:r>
+        <w:t>r</w:t>
+      </w:r>
+      <w:r>
+        <w:t xml:space="preserve">ough all the </w:t>
+      </w:r>
+      <w:r>
+        <w:t>levels</w:t>
+      </w:r>
+      <w:r>
+        <w:t>.</w:t>
+      </w:r>
+    </w:p>
+    <w:p>
+      <w:r>
+        <w:t xml:space="preserve">K9 dies when </w:t>
+      </w:r>
+      <w:r>
+        <w:t xml:space="preserve">K9’s </w:t>
+      </w:r>
+      <w:r>
+        <w:t xml:space="preserve">health </w:t>
+      </w:r>
+      <w:r>
+        <w:t xml:space="preserve">becomes zero.  K9 gains health by collecting jewels, and loses health when using </w:t>
+      </w:r>
+      <w:r>
+        <w:t xml:space="preserve">the laser, or </w:t>
+      </w:r>
+      <w:r>
+        <w:t xml:space="preserve">when </w:t>
+      </w:r>
+      <w:r>
+        <w:t>attacked</w:t>
+      </w:r>
+      <w:r>
+        <w:t xml:space="preserve"> by a Dalek</w:t>
+      </w:r>
+      <w:r>
+        <w:t xml:space="preserve"> or </w:t>
+      </w:r>
+      <w:r>
+        <w:t xml:space="preserve">other </w:t>
+      </w:r>
+      <w:r>
+        <w:t>e</w:t>
+      </w:r>
+      <w:r>
+        <w:t>n</w:t>
+      </w:r>
+      <w:r>
+        <w:t>e</w:t>
+      </w:r>
+      <w:r>
+        <w:t>m</w:t>
+      </w:r>
+      <w:r>
+        <w:t>y</w:t>
+      </w:r>
+      <w:r>
+        <w:t>.</w:t>
+      </w:r>
+      <w:r>
+        <w:t xml:space="preserve">  When K9’s health is low, the laser cannot be used and the health bar in the game bar changes color.  To reinforce low health, a </w:t>
+      </w:r>
+      <w:r>
+        <w:t>heart rate monitor beep is sounded every second or so.  This becomes a continuous tone if K9</w:t>
+      </w:r>
+      <w:r>
+        <w:t>’s battery is flat</w:t>
+      </w:r>
+      <w:r>
+        <w:t>.</w:t>
+      </w:r>
+    </w:p>
+    <w:p>
+      <w:r>
         <w:lastRenderedPageBreak/>
-        <w:t xml:space="preserve">Comments are shown in-line with the code and occasionally to the right.  They aim to provide a higher-level </w:t>
-      </w:r>
-      <w:r>
-        <w:t>outline</w:t>
-      </w:r>
-      <w:r>
-        <w:t xml:space="preserve"> of the code rather than document what every instruction is doing.</w:t>
-      </w:r>
-    </w:p>
-    <w:p>
-      <w:r>
-        <w:t xml:space="preserve">Routine parameter passing </w:t>
-      </w:r>
-      <w:r>
-        <w:t xml:space="preserve">uses the </w:t>
-      </w:r>
-      <w:r>
-        <w:t>following rule</w:t>
-      </w:r>
-      <w:r>
-        <w:t>s:</w:t>
+        <w:t>If K9 dies, the current level is restated.  The user can also choose to restart the current level if they become stuck</w:t>
+      </w:r>
+      <w:r>
+        <w:t>, by pressing the ‘R’ key.</w:t>
+      </w:r>
+    </w:p>
+    <w:p>
+      <w:r>
+        <w:t>And unlike many 1980’s games, t</w:t>
+      </w:r>
+      <w:r>
+        <w:t xml:space="preserve">he player </w:t>
+      </w:r>
+      <w:r>
+        <w:t xml:space="preserve">direction </w:t>
+      </w:r>
+      <w:r>
+        <w:t xml:space="preserve">keys </w:t>
+      </w:r>
+      <w:r>
+        <w:t xml:space="preserve">are </w:t>
+      </w:r>
+      <w:r>
+        <w:t>W</w:t>
+      </w:r>
+      <w:r>
+        <w:t>ASD</w:t>
+      </w:r>
+      <w:r>
+        <w:t>.</w:t>
+      </w:r>
+    </w:p>
+    <w:p>
+      <w:r>
+        <w:t>Locked doors and keys are used to add a puzzle element to the game.</w:t>
+      </w:r>
+      <w:r>
+        <w:t xml:space="preserve">  Key</w:t>
+      </w:r>
+      <w:r>
+        <w:t>s</w:t>
+      </w:r>
+      <w:r>
+        <w:t xml:space="preserve"> can be collected and then used to </w:t>
+      </w:r>
+      <w:r>
+        <w:t xml:space="preserve">pass </w:t>
+      </w:r>
+      <w:r>
+        <w:t xml:space="preserve">through </w:t>
+      </w:r>
+      <w:r>
+        <w:t xml:space="preserve">locked </w:t>
+      </w:r>
+      <w:r>
+        <w:t xml:space="preserve">doors, </w:t>
+      </w:r>
+      <w:r>
+        <w:t>after which they are used.</w:t>
+      </w:r>
+      <w:r>
+        <w:t xml:space="preserve">  </w:t>
+      </w:r>
+      <w:r>
+        <w:t xml:space="preserve">Doors stay unlocked until a Darek uses them.  </w:t>
+      </w:r>
+      <w:r>
+        <w:t>Alternatively</w:t>
+      </w:r>
+      <w:r>
+        <w:t xml:space="preserve">, </w:t>
+      </w:r>
+      <w:r>
+        <w:t xml:space="preserve">K9 can follow a Dalek </w:t>
+      </w:r>
+      <w:r>
+        <w:t>through a door.</w:t>
+      </w:r>
+    </w:p>
+    <w:p>
+      <w:r>
+        <w:t>Other</w:t>
+      </w:r>
+      <w:r>
+        <w:t xml:space="preserve"> puzzle element</w:t>
+      </w:r>
+      <w:r>
+        <w:t>s</w:t>
+      </w:r>
+      <w:r>
+        <w:t xml:space="preserve"> of the game </w:t>
+      </w:r>
+      <w:r>
+        <w:t xml:space="preserve">include getting a Dalek to follow K9, and then hiding K9 behind a door, blocking a Dalek from using an elevator for a specific amount of time, </w:t>
+      </w:r>
+      <w:r>
+        <w:t>and using a Dalek to hide from another one.</w:t>
+      </w:r>
+    </w:p>
+    <w:p>
+      <w:r>
+        <w:t xml:space="preserve">To hold the attention of the player, each level can have its own </w:t>
+      </w:r>
+      <w:r>
+        <w:t xml:space="preserve">color </w:t>
+      </w:r>
+      <w:r>
+        <w:t>palette and sprite definitions.</w:t>
+      </w:r>
+      <w:r>
+        <w:t xml:space="preserve">  The relative strength of jewels and Daleks can also be configured.</w:t>
+      </w:r>
+    </w:p>
+    <w:p>
+      <w:r>
+        <w:t xml:space="preserve">Teleports were later added to allow K9 to </w:t>
+      </w:r>
+      <w:proofErr w:type="gramStart"/>
+      <w:r>
+        <w:t>traverse</w:t>
+      </w:r>
+      <w:proofErr w:type="gramEnd"/>
+      <w:r>
+        <w:t xml:space="preserve"> a level in a non-linear manner.</w:t>
+      </w:r>
+    </w:p>
+    <w:p>
+      <w:r>
+        <w:t xml:space="preserve">Destructible walls and switches were also added later to </w:t>
+      </w:r>
+      <w:r>
+        <w:t>expand puzzle opportunities.</w:t>
+      </w:r>
+    </w:p>
+    <w:p>
+      <w:r>
+        <w:t xml:space="preserve">The above choices hopefully give the game a more modern feeling, where gameplay is more open, and the consequences of dying </w:t>
+      </w:r>
+      <w:r>
+        <w:t xml:space="preserve">less </w:t>
+      </w:r>
+      <w:r>
+        <w:t>severe.</w:t>
+      </w:r>
+      <w:r>
+        <w:t xml:space="preserve">  That said, there are no saved </w:t>
+      </w:r>
+      <w:r>
+        <w:t>checkpoints,</w:t>
       </w:r>
       <w:r>
         <w:t xml:space="preserve"> </w:t>
       </w:r>
-    </w:p>
-    <w:p>
-      <w:r>
-        <w:t xml:space="preserve">The accumulator is </w:t>
-      </w:r>
-      <w:r>
-        <w:t xml:space="preserve">typically </w:t>
-      </w:r>
-      <w:r>
-        <w:t xml:space="preserve">used to pass arguments to routines that </w:t>
-      </w:r>
-      <w:r>
-        <w:t>accept</w:t>
-      </w:r>
-      <w:r>
-        <w:t xml:space="preserve"> a </w:t>
-      </w:r>
-      <w:r>
-        <w:t xml:space="preserve">single </w:t>
-      </w:r>
-      <w:r>
-        <w:t>argument</w:t>
-      </w:r>
-      <w:r>
-        <w:t>,</w:t>
-      </w:r>
-      <w:r>
-        <w:t xml:space="preserve"> and the </w:t>
-      </w:r>
-      <w:r>
-        <w:t xml:space="preserve">X register </w:t>
-      </w:r>
-      <w:r>
-        <w:t xml:space="preserve">is </w:t>
-      </w:r>
-      <w:r>
-        <w:t xml:space="preserve">exclusively </w:t>
-      </w:r>
-      <w:r>
-        <w:t xml:space="preserve">used to </w:t>
-      </w:r>
-      <w:r>
-        <w:t>pass game object</w:t>
-      </w:r>
-      <w:r>
-        <w:t xml:space="preserve">s, </w:t>
-      </w:r>
-      <w:r>
-        <w:t>as</w:t>
-      </w:r>
-      <w:r>
-        <w:t xml:space="preserve"> an </w:t>
-      </w:r>
-      <w:r>
-        <w:t>index</w:t>
-      </w:r>
-      <w:r>
-        <w:t xml:space="preserve">.  </w:t>
-      </w:r>
-      <w:r>
-        <w:t xml:space="preserve">In other situations, </w:t>
-      </w:r>
-      <w:r>
-        <w:t>z</w:t>
-      </w:r>
-      <w:r>
-        <w:t xml:space="preserve">ero-page variables are </w:t>
-      </w:r>
-      <w:r>
-        <w:t xml:space="preserve">used to </w:t>
-      </w:r>
-      <w:r>
-        <w:t>pass argument</w:t>
+      <w:r>
+        <w:t xml:space="preserve">so the game </w:t>
+      </w:r>
+      <w:r>
+        <w:t>must</w:t>
+      </w:r>
+      <w:r>
+        <w:t xml:space="preserve"> be played from start to finish in one go (unless an emulator is used).</w:t>
+      </w:r>
+    </w:p>
+    <w:p>
+      <w:pPr>
+        <w:pStyle w:val="Heading2"/>
+      </w:pPr>
+      <w:r>
+        <w:t>Missteps</w:t>
+      </w:r>
+    </w:p>
+    <w:p>
+      <w:r>
+        <w:t>From reading this document, it may appear that every decision taken was a good one, and things were fully thought though before implementation began, and that coding was purely a typing exercise, and that development proceeded without detours or missteps.  This was not the case.</w:t>
+      </w:r>
+    </w:p>
+    <w:p>
+      <w:r>
+        <w:t xml:space="preserve">The reality is that developing code is an iterative process (at least for me) where I build out a spike of functionality, flush it out, build on it, rework it, and then refine it.  I then pursue another area of functionality in a similar manner occasionally going back to </w:t>
+      </w:r>
+      <w:r>
+        <w:t>revisit and rework early work</w:t>
+      </w:r>
+      <w:r>
+        <w:t>, while always trying to improve on what I have.  Sometimes, the code becomes complex or convoluted, and the path forward is less clear</w:t>
+      </w:r>
+      <w:r>
+        <w:t xml:space="preserve"> and </w:t>
+      </w:r>
+      <w:r>
+        <w:t>harder to pursue.  This is normally an indication that there is something inherently wrong or missing with the approach, or underlying data structures, so one steps back and revisit</w:t>
       </w:r>
       <w:r>
         <w:t>s</w:t>
       </w:r>
       <w:r>
-        <w:t>.</w:t>
-      </w:r>
-      <w:r>
-        <w:t xml:space="preserve">  </w:t>
-      </w:r>
-      <w:r>
-        <w:t xml:space="preserve">The </w:t>
-      </w:r>
-      <w:r>
-        <w:t xml:space="preserve">Y register </w:t>
-      </w:r>
-      <w:r>
-        <w:t>is rarely</w:t>
-      </w:r>
-      <w:r>
-        <w:t xml:space="preserve"> </w:t>
-      </w:r>
-      <w:r>
-        <w:t>used</w:t>
-      </w:r>
-      <w:r>
-        <w:t>.</w:t>
-      </w:r>
-    </w:p>
-    <w:p>
-      <w:r>
-        <w:t>As for the stack</w:t>
-      </w:r>
-      <w:r>
-        <w:t>…</w:t>
-      </w:r>
-      <w:r>
-        <w:t xml:space="preserve"> r</w:t>
-      </w:r>
-      <w:r>
-        <w:t xml:space="preserve">outines occasionally push and pop values, </w:t>
-      </w:r>
-      <w:r>
-        <w:t xml:space="preserve">but </w:t>
-      </w:r>
-      <w:r>
-        <w:t xml:space="preserve">this is </w:t>
-      </w:r>
-      <w:r>
-        <w:t>rare</w:t>
-      </w:r>
-      <w:r>
-        <w:t xml:space="preserve">. </w:t>
-      </w:r>
-      <w:r>
-        <w:t xml:space="preserve"> Z</w:t>
-      </w:r>
-      <w:r>
-        <w:t xml:space="preserve">ero-page </w:t>
-      </w:r>
-      <w:r>
-        <w:t xml:space="preserve">variables </w:t>
-      </w:r>
-      <w:r>
-        <w:t xml:space="preserve">are typically used </w:t>
-      </w:r>
-      <w:r>
-        <w:t>to hold temporary values as this avoids issues where control flow can result in push/pop mismatches.</w:t>
-      </w:r>
-      <w:r>
-        <w:t xml:space="preserve"> </w:t>
-      </w:r>
-    </w:p>
-    <w:p>
-      <w:pPr>
-        <w:pStyle w:val="Heading2"/>
-      </w:pPr>
-      <w:r>
-        <w:t>Game design</w:t>
-      </w:r>
-    </w:p>
-    <w:p>
-      <w:r>
-        <w:t xml:space="preserve">The playability of a game is determined by many </w:t>
-      </w:r>
-      <w:r>
-        <w:t>factors.  The player needs to be challenged</w:t>
-      </w:r>
-      <w:r>
-        <w:t xml:space="preserve">, and </w:t>
-      </w:r>
-      <w:r>
-        <w:t xml:space="preserve">needs to </w:t>
-      </w:r>
-      <w:r>
-        <w:t xml:space="preserve">work, to </w:t>
-      </w:r>
-      <w:r>
-        <w:t xml:space="preserve">feel a </w:t>
-      </w:r>
-      <w:r>
-        <w:t xml:space="preserve">real </w:t>
-      </w:r>
-      <w:r>
-        <w:t xml:space="preserve">sense of </w:t>
-      </w:r>
-      <w:r>
-        <w:t>gratification</w:t>
-      </w:r>
-      <w:r>
-        <w:t xml:space="preserve"> and reward</w:t>
-      </w:r>
-      <w:r>
-        <w:t xml:space="preserve"> later</w:t>
-      </w:r>
-      <w:r>
-        <w:t>.</w:t>
-      </w:r>
-      <w:r>
-        <w:t xml:space="preserve">  The </w:t>
-      </w:r>
-      <w:r>
-        <w:t>players’</w:t>
-      </w:r>
-      <w:r>
-        <w:t xml:space="preserve"> </w:t>
-      </w:r>
-      <w:r>
-        <w:t>attention mu</w:t>
-      </w:r>
-      <w:r>
-        <w:t>st</w:t>
-      </w:r>
-      <w:r>
-        <w:t xml:space="preserve"> also be held</w:t>
-      </w:r>
-      <w:r>
-        <w:t xml:space="preserve"> by the game</w:t>
-      </w:r>
-      <w:r>
-        <w:t>,</w:t>
-      </w:r>
-      <w:r>
-        <w:t xml:space="preserve"> by </w:t>
-      </w:r>
-      <w:r>
-        <w:t>presenting occasional surprises</w:t>
-      </w:r>
-      <w:r>
-        <w:t xml:space="preserve"> and changing thi</w:t>
-      </w:r>
-      <w:r>
-        <w:t>ng</w:t>
-      </w:r>
-      <w:r>
-        <w:t>s</w:t>
-      </w:r>
-      <w:r>
-        <w:t xml:space="preserve"> up</w:t>
-      </w:r>
-      <w:r>
-        <w:t xml:space="preserve"> on the player</w:t>
-      </w:r>
-      <w:r>
-        <w:t>.</w:t>
-      </w:r>
-      <w:r>
-        <w:t xml:space="preserve">  </w:t>
-      </w:r>
-      <w:r>
-        <w:t xml:space="preserve">And </w:t>
-      </w:r>
-      <w:r>
-        <w:t xml:space="preserve">above all, the </w:t>
-      </w:r>
-      <w:r>
-        <w:t xml:space="preserve">player </w:t>
-      </w:r>
-      <w:r>
-        <w:t xml:space="preserve">should not be </w:t>
-      </w:r>
-      <w:r>
-        <w:t>punished</w:t>
-      </w:r>
-      <w:r>
-        <w:t xml:space="preserve"> for playing the game</w:t>
-      </w:r>
-      <w:r>
-        <w:t>.</w:t>
-      </w:r>
-      <w:r>
-        <w:t xml:space="preserve">  The game must </w:t>
-      </w:r>
-      <w:r>
-        <w:t xml:space="preserve">be robust (not crash) and </w:t>
-      </w:r>
-      <w:r>
-        <w:t xml:space="preserve">its difficulty should </w:t>
-      </w:r>
-      <w:r>
-        <w:t xml:space="preserve">increase </w:t>
-      </w:r>
-      <w:r>
-        <w:t>in a reasonable manner.</w:t>
-      </w:r>
-    </w:p>
-    <w:p>
-      <w:r>
-        <w:t>The following choices were made to make th</w:t>
-      </w:r>
-      <w:r>
-        <w:t>is</w:t>
-      </w:r>
-      <w:r>
-        <w:t xml:space="preserve"> game feel more </w:t>
-      </w:r>
-      <w:r>
-        <w:t>current</w:t>
-      </w:r>
-      <w:r>
-        <w:t>.</w:t>
-      </w:r>
-    </w:p>
-    <w:p>
-      <w:r>
-        <w:t xml:space="preserve">Unlike many 1980’s games, </w:t>
-      </w:r>
-      <w:r>
-        <w:t>K9 does not have three lives</w:t>
-      </w:r>
-      <w:r>
-        <w:t xml:space="preserve"> and there isn’t a notion of </w:t>
-      </w:r>
-      <w:r>
-        <w:t xml:space="preserve">score or points.   The goal of the game is </w:t>
-      </w:r>
-      <w:r>
-        <w:t xml:space="preserve">to </w:t>
-      </w:r>
-      <w:r>
-        <w:t xml:space="preserve">just successfully </w:t>
-      </w:r>
-      <w:r>
-        <w:t>navigate</w:t>
-      </w:r>
-      <w:r>
-        <w:t xml:space="preserve"> K9 t</w:t>
-      </w:r>
-      <w:r>
-        <w:t>h</w:t>
-      </w:r>
-      <w:r>
-        <w:t>r</w:t>
-      </w:r>
-      <w:r>
-        <w:t xml:space="preserve">ough all the </w:t>
-      </w:r>
-      <w:r>
-        <w:t>levels</w:t>
-      </w:r>
-      <w:r>
-        <w:t>.</w:t>
-      </w:r>
-    </w:p>
-    <w:p>
-      <w:r>
-        <w:t xml:space="preserve">K9 dies when </w:t>
-      </w:r>
-      <w:r>
-        <w:t xml:space="preserve">K9’s </w:t>
-      </w:r>
-      <w:r>
-        <w:t xml:space="preserve">health </w:t>
-      </w:r>
-      <w:r>
-        <w:t xml:space="preserve">becomes zero.  K9 gains health by collecting jewels, and loses health when using </w:t>
-      </w:r>
-      <w:r>
-        <w:t xml:space="preserve">the laser, or </w:t>
-      </w:r>
-      <w:r>
-        <w:t xml:space="preserve">when </w:t>
-      </w:r>
-      <w:r>
-        <w:t>attacked</w:t>
-      </w:r>
-      <w:r>
-        <w:t xml:space="preserve"> by a Dalek</w:t>
-      </w:r>
-      <w:r>
-        <w:t>.</w:t>
-      </w:r>
-      <w:r>
-        <w:t xml:space="preserve">  When K9’s health is low, the laser cannot be used and the health bar in the game bar changes color.  To reinforce low health, a </w:t>
-      </w:r>
-      <w:r>
-        <w:t>heart rate monitor beep is sounded every second or so.  This becomes a continuous tone if K9</w:t>
-      </w:r>
-      <w:r>
-        <w:t>’s battery is flat</w:t>
-      </w:r>
-      <w:r>
-        <w:t>.</w:t>
-      </w:r>
-    </w:p>
-    <w:p>
-      <w:r>
-        <w:t>If K9 dies, the current level is restated.  The user can also choose to restart the current level if they become stuck</w:t>
-      </w:r>
-      <w:r>
-        <w:t>, by pressing the ‘R’ key.</w:t>
-      </w:r>
-    </w:p>
-    <w:p>
-      <w:r>
-        <w:t>And unlike many 1980’s games, t</w:t>
-      </w:r>
-      <w:r>
-        <w:t xml:space="preserve">he player </w:t>
-      </w:r>
-      <w:r>
-        <w:t xml:space="preserve">direction </w:t>
-      </w:r>
-      <w:r>
-        <w:t xml:space="preserve">keys </w:t>
-      </w:r>
-      <w:r>
-        <w:t xml:space="preserve">are </w:t>
-      </w:r>
-      <w:r>
-        <w:t>W</w:t>
-      </w:r>
-      <w:r>
-        <w:t>ASD</w:t>
-      </w:r>
-      <w:r>
-        <w:t>.</w:t>
-      </w:r>
-    </w:p>
-    <w:p>
-      <w:r>
-        <w:t>Locked doors and keys are used to add a puzzle element to the game.</w:t>
-      </w:r>
-      <w:r>
-        <w:t xml:space="preserve">  Key</w:t>
-      </w:r>
-      <w:r>
-        <w:t>s</w:t>
-      </w:r>
-      <w:r>
-        <w:t xml:space="preserve"> can be collected and then used to </w:t>
-      </w:r>
-      <w:r>
-        <w:t xml:space="preserve">pass </w:t>
-      </w:r>
-      <w:r>
-        <w:t xml:space="preserve">through </w:t>
-      </w:r>
-      <w:r>
-        <w:t xml:space="preserve">locked </w:t>
-      </w:r>
-      <w:r>
-        <w:t xml:space="preserve">doors, </w:t>
-      </w:r>
-      <w:r>
-        <w:t>after which they are used.</w:t>
-      </w:r>
-      <w:r>
-        <w:t xml:space="preserve">  </w:t>
-      </w:r>
-      <w:r>
-        <w:t xml:space="preserve">Doors stay unlocked until a Darek uses them.  </w:t>
-      </w:r>
-      <w:r>
-        <w:t>Alternatively</w:t>
-      </w:r>
-      <w:r>
-        <w:t xml:space="preserve">, </w:t>
-      </w:r>
-      <w:r>
-        <w:t xml:space="preserve">K9 can follow a Dalek </w:t>
-      </w:r>
-      <w:r>
-        <w:t>through a door.</w:t>
-      </w:r>
-    </w:p>
-    <w:p>
-      <w:r>
-        <w:lastRenderedPageBreak/>
-        <w:t>Other</w:t>
-      </w:r>
-      <w:r>
-        <w:t xml:space="preserve"> puzzle element</w:t>
-      </w:r>
-      <w:r>
-        <w:t>s</w:t>
-      </w:r>
-      <w:r>
-        <w:t xml:space="preserve"> of the game </w:t>
-      </w:r>
-      <w:r>
-        <w:t xml:space="preserve">include getting a Dalek to follow K9, and then hiding K9 behind a door, blocking a Dalek from using an elevator for a specific amount of time, </w:t>
-      </w:r>
-      <w:r>
-        <w:t>and using a Dalek to hide from another one.</w:t>
-      </w:r>
-    </w:p>
-    <w:p>
-      <w:r>
-        <w:t>To hold the attention of the player, each level can have its own palette and sprite definitions.</w:t>
-      </w:r>
-      <w:r>
-        <w:t xml:space="preserve">  The relative strength of jewels and Daleks can also be configured.</w:t>
-      </w:r>
-    </w:p>
-    <w:p>
-      <w:r>
-        <w:t>Teleports were later added to allow K9 to traverse a level in a non-linear manner.</w:t>
-      </w:r>
-    </w:p>
-    <w:p>
-      <w:r>
-        <w:t xml:space="preserve">The above choices hopefully give the game a more modern feeling, where gameplay is more open, and the consequences of dying </w:t>
-      </w:r>
-      <w:r>
-        <w:t xml:space="preserve">less </w:t>
-      </w:r>
-      <w:r>
-        <w:t>severe.</w:t>
-      </w:r>
-      <w:r>
-        <w:t xml:space="preserve">  That said, there are no saved </w:t>
-      </w:r>
-      <w:r>
-        <w:t>checkpoints,</w:t>
-      </w:r>
-      <w:r>
-        <w:t xml:space="preserve"> </w:t>
-      </w:r>
-      <w:r>
-        <w:t xml:space="preserve">so the game </w:t>
-      </w:r>
-      <w:r>
-        <w:t>must</w:t>
-      </w:r>
-      <w:r>
-        <w:t xml:space="preserve"> be played from start to finish in one go (unless an emulator is used).</w:t>
-      </w:r>
-    </w:p>
-    <w:p>
-      <w:pPr>
-        <w:pStyle w:val="Heading2"/>
-      </w:pPr>
-      <w:r>
-        <w:t>Missteps</w:t>
-      </w:r>
-    </w:p>
-    <w:p>
-      <w:r>
-        <w:t>From reading this document, it may appear that every decision taken was a good one, and things were fully thought though before implementation began, and that coding was purely a typing exercise, and that development proceeded without detours or missteps.  This was not the case.</w:t>
-      </w:r>
-    </w:p>
-    <w:p>
-      <w:r>
-        <w:t xml:space="preserve">The reality is that developing code is an iterative process (at least for me) where I build out a spike of functionality, flush it out, build on it, rework it, and then refine it.  I then pursue another area of functionality in a similar manner occasionally going back to </w:t>
-      </w:r>
-      <w:r>
-        <w:t>revisit and rework early work</w:t>
-      </w:r>
-      <w:r>
-        <w:t>, while always trying to improve on what I have.  Sometimes, the code becomes complex or convoluted, and the path forward is less clear</w:t>
-      </w:r>
-      <w:r>
-        <w:t xml:space="preserve"> and </w:t>
-      </w:r>
-      <w:r>
-        <w:t>harder to pursue.  This is normally an indication that there is something inherently wrong or missing with the approach, or underlying data structures, so one steps back and revisit</w:t>
-      </w:r>
-      <w:r>
-        <w:t>s</w:t>
-      </w:r>
-      <w:r>
         <w:t xml:space="preserve"> previous decisions and choices.  </w:t>
       </w:r>
       <w:r>
-        <w:t xml:space="preserve">Unfortunately, I’m </w:t>
-      </w:r>
-      <w:r>
-        <w:t>not smart enough to see the full ramifications of every decision I make</w:t>
-      </w:r>
-      <w:r>
-        <w:t xml:space="preserve"> so I occasionally need to backtrack.</w:t>
+        <w:t xml:space="preserve">I’m unable to see the </w:t>
+      </w:r>
+      <w:r>
+        <w:t xml:space="preserve">full ramifications of every decision </w:t>
+      </w:r>
+      <w:r>
+        <w:t xml:space="preserve">so occasionally I need to </w:t>
+      </w:r>
+      <w:r>
+        <w:t>backtrack</w:t>
+      </w:r>
+      <w:r>
+        <w:t>, adapt, and move forward again.</w:t>
       </w:r>
     </w:p>
     <w:p>
@@ -29494,10 +30719,11 @@
           <w:b/>
           <w:bCs/>
         </w:rPr>
+        <w:lastRenderedPageBreak/>
         <w:t>Page grids</w:t>
       </w:r>
       <w:r>
-        <w:t xml:space="preserve">.  Early in the development of the game I came up with a level model that allowed for an arbitrary arrangement of pages.  From a data structure perspective, the model was simple and provided for a wide range of interesting level topologies.  However, any code that traversed tiles had to deal with potential page boundaries.  The mistake I made was not realizing that choosing such a data structure would require that I adopt an abstraction (function-based or macro-based) to traverse it, which was something I was </w:t>
+        <w:t xml:space="preserve">.  Early in the development of the game I came up with a level model that allowed for an arbitrary arrangement of pages.  From a data structure perspective, the model was simple and provided for a wide range of interesting level topologies.  However, any code that traversed tiles had to deal with page boundaries.  The mistake I made was not realizing that choosing such a data structure would require that I adopt an abstraction (function-based or macro-based) to traverse it, which was something I was </w:t>
       </w:r>
       <w:r>
         <w:t xml:space="preserve">not </w:t>
@@ -29506,11 +30732,7 @@
         <w:t xml:space="preserve">willing </w:t>
       </w:r>
       <w:r>
-        <w:t xml:space="preserve">to do.  In trying to avoid this I ended up with complex code in several key areas of functionality… drawing tile strips when </w:t>
-      </w:r>
-      <w:r>
-        <w:lastRenderedPageBreak/>
-        <w:t>scrolling, collision detection, laser hit detection, and elevator operations.  After spending considerable time fixing several nasty bugs, I stepped back and asked myself if the benefits of the page grid design outweighed all the added code complexity.  I concluded it wasn’t and removed the page grid, opting instead to go with a single large rectangular tile grid which could be either 16x128, 32x64, 64x32, or 128x16 tiles in size.  The change resulted in a significant reduction in code size, and much simpler tile traversal logic throughout the code base.</w:t>
+        <w:t>to do.  In trying to avoid this I ended up with complex code in several key areas of functionality… drawing tile strips when scrolling, collision detection, laser hit detection, and elevator operations.  After spending considerable time fixing several nasty bugs, I stepped back and asked myself if the benefits of the page grid design outweighed all the added code complexity.  I concluded it wasn’t and removed the page grid, opting instead to go with a single large rectangular tile grid which could be either 16x128, 32x64, 64x32, or 128x16 tiles in size.  The change resulted in a significant reduction in code size, and much simpler tile traversal logic throughout the code base.</w:t>
       </w:r>
     </w:p>
     <w:p>
@@ -29555,7 +30777,15 @@
         <w:t xml:space="preserve"> </w:t>
       </w:r>
       <w:r>
-        <w:t>1 overlays, rendering the graphics and text directly over the gameplay screen.  To do this I needed to write custom drawText routines that used the MOS’s character definitions stored at &amp;8000.  Although this worked well, the draw code took up precious bytes and I was forced to</w:t>
+        <w:t xml:space="preserve">1 overlays, rendering the graphics and text directly over the gameplay screen.  To do this I needed to write custom </w:t>
+      </w:r>
+      <w:proofErr w:type="spellStart"/>
+      <w:r>
+        <w:t>drawText</w:t>
+      </w:r>
+      <w:proofErr w:type="spellEnd"/>
+      <w:r>
+        <w:t xml:space="preserve"> routines that used the MOS’s character definitions stored at &amp;8000.  Although this worked well, the draw code took up precious bytes and I was forced to</w:t>
       </w:r>
       <w:r>
         <w:t xml:space="preserve"> </w:t>
@@ -29771,19 +31001,33 @@
         <w:t>rule</w:t>
       </w:r>
       <w:r>
-        <w:t xml:space="preserve"> made spotting address mode mistakes far easier.  All uppercase constants should be proceeded with a ‘#’ and all camel-case constants should not, unless they are being used within </w:t>
+        <w:t xml:space="preserve"> made spotting address mode mistakes far easier.  All uppercase constants should be </w:t>
+      </w:r>
+      <w:r>
+        <w:lastRenderedPageBreak/>
+        <w:t xml:space="preserve">proceeded with a ‘#’ and all camel-case constants should not, unless they are being used within </w:t>
       </w:r>
       <w:r>
         <w:t>#</w:t>
       </w:r>
-      <w:r>
-        <w:t xml:space="preserve">HI(…) or </w:t>
+      <w:proofErr w:type="gramStart"/>
+      <w:r>
+        <w:t>HI(</w:t>
+      </w:r>
+      <w:proofErr w:type="gramEnd"/>
+      <w:r>
+        <w:t xml:space="preserve">…) or </w:t>
       </w:r>
       <w:r>
         <w:t>#</w:t>
       </w:r>
-      <w:r>
-        <w:t>LO(…).</w:t>
+      <w:proofErr w:type="gramStart"/>
+      <w:r>
+        <w:t>LO(</w:t>
+      </w:r>
+      <w:proofErr w:type="gramEnd"/>
+      <w:r>
+        <w:t>…).</w:t>
       </w:r>
     </w:p>
     <w:p>
@@ -29798,11 +31042,16 @@
       <w:r>
         <w:t xml:space="preserve">6502 </w:t>
       </w:r>
+      <w:proofErr w:type="gramStart"/>
       <w:r>
         <w:t>i</w:t>
       </w:r>
       <w:r>
-        <w:t xml:space="preserve">nstruction set - </w:t>
+        <w:t>nstruction</w:t>
+      </w:r>
+      <w:proofErr w:type="gramEnd"/>
+      <w:r>
+        <w:t xml:space="preserve"> set - </w:t>
       </w:r>
       <w:hyperlink r:id="rId28" w:history="1">
         <w:r>
@@ -29841,7 +31090,6 @@
     </w:p>
     <w:p>
       <w:r>
-        <w:lastRenderedPageBreak/>
         <w:t xml:space="preserve">Memory Map - </w:t>
       </w:r>
       <w:hyperlink r:id="rId31" w:history="1">
@@ -29849,8 +31097,16 @@
           <w:rPr>
             <w:rStyle w:val="Hyperlink"/>
           </w:rPr>
-          <w:t>mdfs.net/Docs/Comp/BBC/AllMem</w:t>
+          <w:t>mdfs.net/Docs/Comp/BBC/</w:t>
         </w:r>
+        <w:proofErr w:type="spellStart"/>
+        <w:r>
+          <w:rPr>
+            <w:rStyle w:val="Hyperlink"/>
+          </w:rPr>
+          <w:t>AllMem</w:t>
+        </w:r>
+        <w:proofErr w:type="spellEnd"/>
       </w:hyperlink>
     </w:p>
     <w:p>
@@ -29868,8 +31124,16 @@
           <w:rPr>
             <w:rStyle w:val="Hyperlink"/>
           </w:rPr>
-          <w:t>mdfs.net/Docs/Comp/BBC/Disk/DFSMem</w:t>
+          <w:t>mdfs.net/Docs/Comp/BBC/Disk/</w:t>
         </w:r>
+        <w:proofErr w:type="spellStart"/>
+        <w:r>
+          <w:rPr>
+            <w:rStyle w:val="Hyperlink"/>
+          </w:rPr>
+          <w:t>DFSMem</w:t>
+        </w:r>
+        <w:proofErr w:type="spellEnd"/>
       </w:hyperlink>
     </w:p>
     <w:p>
@@ -29907,7 +31171,7 @@
     <mc:AlternateContent>
       <mc:Choice Requires="v">
         <w:pict>
-          <v:shapetype w14:anchorId="39D1596B" id="_x0000_t75" coordsize="21600,21600" o:spt="75" o:preferrelative="t" path="m@4@5l@4@11@9@11@9@5xe" filled="f" stroked="f">
+          <v:shapetype w14:anchorId="1EC5BC79" id="_x0000_t75" coordsize="21600,21600" o:spt="75" o:preferrelative="t" path="m@4@5l@4@11@9@11@9@5xe" filled="f" stroked="f">
             <v:stroke joinstyle="miter"/>
             <v:formulas>
               <v:f eqn="if lineDrawn pixelLineWidth 0"/>
@@ -29933,10 +31197,10 @@
       </mc:Choice>
       <mc:Fallback>
         <w:drawing>
-          <wp:inline distT="0" distB="0" distL="0" distR="0" wp14:anchorId="5F26A676" wp14:editId="68CCF4D3">
+          <wp:inline distT="0" distB="0" distL="0" distR="0" wp14:anchorId="4F32B596" wp14:editId="676D1E9F">
             <wp:extent cx="194650" cy="145988"/>
             <wp:effectExtent l="0" t="0" r="0" b="6985"/>
-            <wp:docPr id="1848588583" name="Picture 1"/>
+            <wp:docPr id="755773845" name="Picture 1"/>
             <wp:cNvGraphicFramePr>
               <a:graphicFrameLocks xmlns:a="http://schemas.openxmlformats.org/drawingml/2006/main" noChangeAspect="1"/>
             </wp:cNvGraphicFramePr>
@@ -29974,17 +31238,17 @@
     <mc:AlternateContent>
       <mc:Choice Requires="v">
         <w:pict>
-          <v:shape w14:anchorId="0E5934D2" id="Picture 1" o:spid="_x0000_i1025" type="#_x0000_t75" style="width:15.7pt;height:11.75pt;visibility:visible;mso-wrap-style:square">
+          <v:shape w14:anchorId="2D2A12DD" id="Picture 1" o:spid="_x0000_i1025" type="#_x0000_t75" style="width:15.7pt;height:11.75pt;visibility:visible;mso-wrap-style:square">
             <v:imagedata r:id="rId3" o:title=""/>
           </v:shape>
         </w:pict>
       </mc:Choice>
       <mc:Fallback>
         <w:drawing>
-          <wp:inline distT="0" distB="0" distL="0" distR="0" wp14:anchorId="19D93B70" wp14:editId="3DCA0A09">
+          <wp:inline distT="0" distB="0" distL="0" distR="0" wp14:anchorId="603C9F83" wp14:editId="10C0580F">
             <wp:extent cx="199177" cy="149383"/>
             <wp:effectExtent l="0" t="0" r="0" b="3175"/>
-            <wp:docPr id="476168759" name="Picture 1"/>
+            <wp:docPr id="669374198" name="Picture 1"/>
             <wp:cNvGraphicFramePr>
               <a:graphicFrameLocks xmlns:a="http://schemas.openxmlformats.org/drawingml/2006/main" noChangeAspect="1"/>
             </wp:cNvGraphicFramePr>

</xml_diff>

<commit_message>
Updated address locations to align with last change
</commit_message>
<xml_diff>
--- a/docs/Development.docx
+++ b/docs/Development.docx
@@ -8866,7 +8866,7 @@
       </w:pPr>
       <w:r>
         <w:pict w14:anchorId="047D7D79">
-          <v:shape id="Picture 1" o:spid="_x0000_i1045" type="#_x0000_t75" style="width:12.35pt;height:9.35pt;visibility:visible;mso-wrap-style:square" o:bullet="t">
+          <v:shape id="Picture 1" o:spid="_x0000_i1029" type="#_x0000_t75" style="width:12.35pt;height:9.35pt;visibility:visible;mso-wrap-style:square" o:bullet="t">
             <v:imagedata r:id="rId15" o:title=""/>
           </v:shape>
         </w:pict>
@@ -8996,7 +8996,7 @@
       </w:pPr>
       <w:r>
         <w:pict w14:anchorId="155D07C4">
-          <v:shape id="_x0000_i1046" type="#_x0000_t75" style="width:12.35pt;height:9.35pt;visibility:visible;mso-wrap-style:square" o:bullet="t">
+          <v:shape id="_x0000_i1030" type="#_x0000_t75" style="width:12.35pt;height:9.35pt;visibility:visible;mso-wrap-style:square" o:bullet="t">
             <v:imagedata r:id="rId17" o:title=""/>
           </v:shape>
         </w:pict>
@@ -9040,7 +9040,7 @@
       </w:pPr>
       <w:r>
         <w:pict w14:anchorId="4E781177">
-          <v:shape id="_x0000_i1047" type="#_x0000_t75" style="width:13pt;height:10pt;visibility:visible;mso-wrap-style:square">
+          <v:shape id="_x0000_i1031" type="#_x0000_t75" style="width:13pt;height:10pt;visibility:visible;mso-wrap-style:square">
             <v:imagedata r:id="rId18" o:title=""/>
           </v:shape>
         </w:pict>
@@ -15692,33 +15692,61 @@
         <w:t>music</w:t>
       </w:r>
       <w:r>
-        <w:t xml:space="preserve"> was composed by Ron Grainer and arranged and realized by Delia Derbyshire, assisted by engineer Dick Mills. </w:t>
-      </w:r>
-      <w:r>
-        <w:rPr>
-          <w:i/>
-          <w:iCs/>
-        </w:rPr>
-        <w:t>Ref</w:t>
-      </w:r>
-      <w:r>
-        <w:t xml:space="preserve">: </w:t>
+        <w:t xml:space="preserve"> was composed by </w:t>
       </w:r>
       <w:hyperlink r:id="rId21" w:history="1">
         <w:r>
           <w:rPr>
             <w:rStyle w:val="Hyperlink"/>
           </w:rPr>
-          <w:t>BBC Two - An Adventure in Space and Time - Delia Derbyshire</w:t>
+          <w:t>Ron Grainer</w:t>
         </w:r>
       </w:hyperlink>
-    </w:p>
-    <w:p>
-      <w:r>
-        <w:t xml:space="preserve">I found Delia Derbyshire’s score online, </w:t>
-      </w:r>
-      <w:r>
-        <w:t xml:space="preserve">which contained </w:t>
+      <w:r>
+        <w:t xml:space="preserve"> and</w:t>
+      </w:r>
+      <w:r>
+        <w:t xml:space="preserve"> </w:t>
+      </w:r>
+      <w:r>
+        <w:t xml:space="preserve">realized by </w:t>
+      </w:r>
+      <w:hyperlink r:id="rId22" w:history="1">
+        <w:r>
+          <w:rPr>
+            <w:rStyle w:val="Hyperlink"/>
+          </w:rPr>
+          <w:t>Delia Derbyshire</w:t>
+        </w:r>
+      </w:hyperlink>
+      <w:r>
+        <w:t>, assisted by engineer Dick Mills</w:t>
+      </w:r>
+      <w:r>
+        <w:t>.</w:t>
+      </w:r>
+      <w:r>
+        <w:t xml:space="preserve"> </w:t>
+      </w:r>
+    </w:p>
+    <w:p>
+      <w:r>
+        <w:t xml:space="preserve">I found </w:t>
+      </w:r>
+      <w:r>
+        <w:t xml:space="preserve">the original </w:t>
+      </w:r>
+      <w:r>
+        <w:t xml:space="preserve">score online, </w:t>
+      </w:r>
+      <w:r>
+        <w:t>which contain</w:t>
+      </w:r>
+      <w:r>
+        <w:t>s</w:t>
+      </w:r>
+      <w:r>
+        <w:t xml:space="preserve"> </w:t>
       </w:r>
       <w:r>
         <w:t>melody</w:t>
@@ -16538,7 +16566,7 @@
         </w:rPr>
         <w:t xml:space="preserve">Ref: </w:t>
       </w:r>
-      <w:hyperlink r:id="rId22" w:history="1">
+      <w:hyperlink r:id="rId23" w:history="1">
         <w:r>
           <w:rPr>
             <w:rStyle w:val="Hyperlink"/>
@@ -16581,7 +16609,7 @@
                     <pic:cNvPicPr/>
                   </pic:nvPicPr>
                   <pic:blipFill>
-                    <a:blip r:embed="rId23"/>
+                    <a:blip r:embed="rId24"/>
                     <a:stretch>
                       <a:fillRect/>
                     </a:stretch>
@@ -17270,7 +17298,7 @@
                     <pic:cNvPicPr/>
                   </pic:nvPicPr>
                   <pic:blipFill>
-                    <a:blip r:embed="rId24"/>
+                    <a:blip r:embed="rId25"/>
                     <a:stretch>
                       <a:fillRect/>
                     </a:stretch>
@@ -18615,31 +18643,13 @@
     </w:p>
     <w:p>
       <w:r>
-        <w:t xml:space="preserve">To reduce tearing, which unfortunately occurs when samples are played, </w:t>
-      </w:r>
-      <w:r>
-        <w:t xml:space="preserve">the v-sync signal </w:t>
-      </w:r>
-      <w:r>
-        <w:t xml:space="preserve">(which the game loop waits on) </w:t>
-      </w:r>
-      <w:r>
-        <w:t>was brought forward to when the screen memory read finishes, which is 18 scanlines (</w:t>
+        <w:t>To reduce tearing, which unfortunately occurs when samples are played, the v-sync signal (which the game loop waits on) was brought forward to when the screen memory read finishes, which is 18 scanlines (</w:t>
       </w:r>
       <w:r>
         <w:t>1152</w:t>
       </w:r>
       <w:r>
-        <w:t xml:space="preserve"> micro-seconds) </w:t>
-      </w:r>
-      <w:r>
-        <w:t xml:space="preserve">earlier than when the actual </w:t>
-      </w:r>
-      <w:r>
-        <w:t>v-sync interrup</w:t>
-      </w:r>
-      <w:r>
-        <w:t>t occurs.</w:t>
+        <w:t xml:space="preserve"> micro-seconds) earlier than when the actual v-sync interrupt occurs.</w:t>
       </w:r>
     </w:p>
     <w:p>
@@ -19661,7 +19671,7 @@
                     <pic:cNvPicPr/>
                   </pic:nvPicPr>
                   <pic:blipFill>
-                    <a:blip r:embed="rId25"/>
+                    <a:blip r:embed="rId26"/>
                     <a:stretch>
                       <a:fillRect/>
                     </a:stretch>
@@ -19711,7 +19721,7 @@
                     <pic:cNvPicPr/>
                   </pic:nvPicPr>
                   <pic:blipFill>
-                    <a:blip r:embed="rId26"/>
+                    <a:blip r:embed="rId27"/>
                     <a:stretch>
                       <a:fillRect/>
                     </a:stretch>
@@ -19761,7 +19771,7 @@
                     <pic:cNvPicPr/>
                   </pic:nvPicPr>
                   <pic:blipFill>
-                    <a:blip r:embed="rId27"/>
+                    <a:blip r:embed="rId28"/>
                     <a:stretch>
                       <a:fillRect/>
                     </a:stretch>
@@ -19811,7 +19821,7 @@
                     <pic:cNvPicPr/>
                   </pic:nvPicPr>
                   <pic:blipFill>
-                    <a:blip r:embed="rId28"/>
+                    <a:blip r:embed="rId29"/>
                     <a:stretch>
                       <a:fillRect/>
                     </a:stretch>
@@ -19861,7 +19871,7 @@
                     <pic:cNvPicPr/>
                   </pic:nvPicPr>
                   <pic:blipFill>
-                    <a:blip r:embed="rId29"/>
+                    <a:blip r:embed="rId30"/>
                     <a:stretch>
                       <a:fillRect/>
                     </a:stretch>
@@ -20359,7 +20369,7 @@
                     <pic:cNvPicPr/>
                   </pic:nvPicPr>
                   <pic:blipFill>
-                    <a:blip r:embed="rId30"/>
+                    <a:blip r:embed="rId31"/>
                     <a:stretch>
                       <a:fillRect/>
                     </a:stretch>
@@ -20412,7 +20422,7 @@
                     <pic:cNvPicPr/>
                   </pic:nvPicPr>
                   <pic:blipFill>
-                    <a:blip r:embed="rId31"/>
+                    <a:blip r:embed="rId32"/>
                     <a:stretch>
                       <a:fillRect/>
                     </a:stretch>
@@ -21256,19 +21266,7 @@
     </w:p>
     <w:p>
       <w:r>
-        <w:t>Later, a</w:t>
-      </w:r>
-      <w:r>
-        <w:t xml:space="preserve"> new source file (</w:t>
-      </w:r>
-      <w:r>
-        <w:t>teleport</w:t>
-      </w:r>
-      <w:r>
-        <w:t xml:space="preserve">.6502) was introduced which contains the </w:t>
-      </w:r>
-      <w:r>
-        <w:t xml:space="preserve">teleport specific </w:t>
+        <w:t xml:space="preserve">Later, a new source file (teleport.6502) was introduced which contains the teleport specific </w:t>
       </w:r>
       <w:r>
         <w:t>routines</w:t>
@@ -23054,78 +23052,50 @@
           <w:b/>
           <w:bCs/>
         </w:rPr>
-        <w:t xml:space="preserve">Level </w:t>
+        <w:t xml:space="preserve">Level 5 - </w:t>
       </w:r>
       <w:r>
         <w:rPr>
           <w:b/>
           <w:bCs/>
         </w:rPr>
-        <w:t>5</w:t>
-      </w:r>
+        <w:t>Maze</w:t>
+      </w:r>
+      <w:r>
+        <w:t xml:space="preserve"> </w:t>
+      </w:r>
+      <w:r>
+        <w:t>–</w:t>
+      </w:r>
+      <w:r>
+        <w:t xml:space="preserve"> A </w:t>
+      </w:r>
+      <w:r>
+        <w:t>level consisting of a maze of teleports</w:t>
+      </w:r>
+      <w:r>
+        <w:t>, with surprises!</w:t>
+      </w:r>
+      <w:r>
+        <w:t xml:space="preserve">  K9 </w:t>
+      </w:r>
+      <w:r>
+        <w:t>must</w:t>
+      </w:r>
+      <w:r>
+        <w:t xml:space="preserve"> navigate the maze to find the TARDIS</w:t>
+      </w:r>
+      <w:r>
+        <w:t>.  A locked door is placed just in front of the TARDIS, so a hidden key must also be found.</w:t>
+      </w:r>
+    </w:p>
+    <w:p>
       <w:r>
         <w:rPr>
           <w:b/>
           <w:bCs/>
         </w:rPr>
-        <w:t xml:space="preserve"> - </w:t>
-      </w:r>
-      <w:r>
-        <w:rPr>
-          <w:b/>
-          <w:bCs/>
-        </w:rPr>
-        <w:t>Maze</w:t>
-      </w:r>
-      <w:r>
-        <w:t xml:space="preserve"> </w:t>
-      </w:r>
-      <w:r>
-        <w:t>–</w:t>
-      </w:r>
-      <w:r>
-        <w:t xml:space="preserve"> A </w:t>
-      </w:r>
-      <w:r>
-        <w:t>level consisting of a maze of teleports</w:t>
-      </w:r>
-      <w:r>
-        <w:t>, with surprises!</w:t>
-      </w:r>
-      <w:r>
-        <w:t xml:space="preserve">  K9 </w:t>
-      </w:r>
-      <w:r>
-        <w:t>must</w:t>
-      </w:r>
-      <w:r>
-        <w:t xml:space="preserve"> navigate the maze to find the TARDIS</w:t>
-      </w:r>
-      <w:r>
-        <w:t>.  A locked door is placed just in front of the TARDIS, so a hidden key must also be found.</w:t>
-      </w:r>
-    </w:p>
-    <w:p>
-      <w:r>
-        <w:rPr>
-          <w:b/>
-          <w:bCs/>
-        </w:rPr>
-        <w:t xml:space="preserve">Level </w:t>
-      </w:r>
-      <w:r>
-        <w:rPr>
-          <w:b/>
-          <w:bCs/>
-        </w:rPr>
-        <w:t>6</w:t>
-      </w:r>
-      <w:r>
-        <w:rPr>
-          <w:b/>
-          <w:bCs/>
-        </w:rPr>
-        <w:t xml:space="preserve"> - </w:t>
+        <w:t xml:space="preserve">Level 6 - </w:t>
       </w:r>
       <w:r>
         <w:rPr>
@@ -25890,7 +25860,10 @@
               <w:t>1</w:t>
             </w:r>
             <w:r>
-              <w:t>753</w:t>
+              <w:t>7</w:t>
+            </w:r>
+            <w:r>
+              <w:t>61</w:t>
             </w:r>
           </w:p>
         </w:tc>
@@ -25910,10 +25883,7 @@
               <w:jc w:val="center"/>
             </w:pPr>
             <w:r>
-              <w:t>5</w:t>
-            </w:r>
-            <w:r>
-              <w:t>65C</w:t>
+              <w:t>5664</w:t>
             </w:r>
           </w:p>
         </w:tc>
@@ -25960,13 +25930,7 @@
             </w:pPr>
             <w:r>
               <w:lastRenderedPageBreak/>
-              <w:t>5</w:t>
-            </w:r>
-            <w:r>
-              <w:t>6</w:t>
-            </w:r>
-            <w:r>
-              <w:t>A8</w:t>
+              <w:t>56B0</w:t>
             </w:r>
           </w:p>
         </w:tc>
@@ -26024,10 +25988,7 @@
               <w:jc w:val="center"/>
             </w:pPr>
             <w:r>
-              <w:t>60</w:t>
-            </w:r>
-            <w:r>
-              <w:t>F7</w:t>
+              <w:t>60FF</w:t>
             </w:r>
           </w:p>
         </w:tc>
@@ -26361,10 +26322,7 @@
         <w:t xml:space="preserve">functionality, which includes common Mode 7 routines, </w:t>
       </w:r>
       <w:r>
-        <w:t>title screens</w:t>
-      </w:r>
-      <w:r>
-        <w:t xml:space="preserve">, and </w:t>
+        <w:t xml:space="preserve">title screens, and </w:t>
       </w:r>
       <w:r>
         <w:t xml:space="preserve">the </w:t>
@@ -27115,7 +27073,7 @@
               <w:cnfStyle w:val="000000000000" w:firstRow="0" w:lastRow="0" w:firstColumn="0" w:lastColumn="0" w:oddVBand="0" w:evenVBand="0" w:oddHBand="0" w:evenHBand="0" w:firstRowFirstColumn="0" w:firstRowLastColumn="0" w:lastRowFirstColumn="0" w:lastRowLastColumn="0"/>
             </w:pPr>
             <w:r>
-              <w:t>1753</w:t>
+              <w:t>1761</w:t>
             </w:r>
           </w:p>
         </w:tc>
@@ -27135,10 +27093,7 @@
               <w:jc w:val="center"/>
             </w:pPr>
             <w:r>
-              <w:t>5</w:t>
-            </w:r>
-            <w:r>
-              <w:t>65C</w:t>
+              <w:t>5664</w:t>
             </w:r>
           </w:p>
         </w:tc>
@@ -27188,10 +27143,7 @@
               <w:jc w:val="center"/>
             </w:pPr>
             <w:r>
-              <w:t>5</w:t>
-            </w:r>
-            <w:r>
-              <w:t>6A8</w:t>
+              <w:t>56B0</w:t>
             </w:r>
           </w:p>
         </w:tc>
@@ -27320,16 +27272,7 @@
               </w:rPr>
             </w:pPr>
             <w:r>
-              <w:t xml:space="preserve">DFS </w:t>
-            </w:r>
-            <w:r>
-              <w:t xml:space="preserve">command </w:t>
-            </w:r>
-            <w:r>
-              <w:t>page backup</w:t>
-            </w:r>
-            <w:r>
-              <w:t xml:space="preserve"> </w:t>
+              <w:t xml:space="preserve">DFS command page backup </w:t>
             </w:r>
           </w:p>
         </w:tc>
@@ -27424,10 +27367,7 @@
         <w:t xml:space="preserve">The white </w:t>
       </w:r>
       <w:r>
-        <w:t>rows are identical to how memory is arranged during game</w:t>
-      </w:r>
-      <w:r>
-        <w:t xml:space="preserve"> play. </w:t>
+        <w:t xml:space="preserve">rows are identical to how memory is arranged during game play. </w:t>
       </w:r>
     </w:p>
     <w:p>
@@ -27640,10 +27580,7 @@
               <w:jc w:val="center"/>
             </w:pPr>
             <w:r>
-              <w:t>5</w:t>
-            </w:r>
-            <w:r>
-              <w:t>65C</w:t>
+              <w:t>5664</w:t>
             </w:r>
           </w:p>
         </w:tc>
@@ -27692,10 +27629,7 @@
               <w:jc w:val="center"/>
             </w:pPr>
             <w:r>
-              <w:t>5</w:t>
-            </w:r>
-            <w:r>
-              <w:t>6A8</w:t>
+              <w:t>56B0</w:t>
             </w:r>
           </w:p>
         </w:tc>
@@ -27741,10 +27675,7 @@
               <w:jc w:val="center"/>
             </w:pPr>
             <w:r>
-              <w:t>60</w:t>
-            </w:r>
-            <w:r>
-              <w:t>F7</w:t>
+              <w:t>60FF</w:t>
             </w:r>
           </w:p>
         </w:tc>
@@ -27895,7 +27826,10 @@
         <w:t>The finale file is loaded at address &amp;5</w:t>
       </w:r>
       <w:r>
-        <w:t>6CC</w:t>
+        <w:t>6</w:t>
+      </w:r>
+      <w:r>
+        <w:t>64</w:t>
       </w:r>
       <w:r>
         <w:t xml:space="preserve">, </w:t>
@@ -29240,7 +29174,7 @@
         </w:rPr>
         <w:t xml:space="preserve">Bruce Clark </w:t>
       </w:r>
-      <w:hyperlink r:id="rId32" w:history="1">
+      <w:hyperlink r:id="rId33" w:history="1">
         <w:r>
           <w:rPr>
             <w:i/>
@@ -30504,7 +30438,7 @@
       <w:r>
         <w:t xml:space="preserve"> set - </w:t>
       </w:r>
-      <w:hyperlink r:id="rId33" w:history="1">
+      <w:hyperlink r:id="rId34" w:history="1">
         <w:r>
           <w:rPr>
             <w:rStyle w:val="Hyperlink"/>
@@ -30527,7 +30461,7 @@
       <w:r>
         <w:t xml:space="preserve">utorials - </w:t>
       </w:r>
-      <w:hyperlink r:id="rId34" w:history="1">
+      <w:hyperlink r:id="rId35" w:history="1">
         <w:r>
           <w:rPr>
             <w:rStyle w:val="Hyperlink"/>
@@ -30544,7 +30478,7 @@
           <w:numId w:val="31"/>
         </w:numPr>
       </w:pPr>
-      <w:hyperlink r:id="rId35" w:history="1">
+      <w:hyperlink r:id="rId36" w:history="1">
         <w:r>
           <w:rPr>
             <w:rStyle w:val="Hyperlink"/>
@@ -30564,7 +30498,7 @@
       <w:r>
         <w:t xml:space="preserve">Memory Map - </w:t>
       </w:r>
-      <w:hyperlink r:id="rId36" w:history="1">
+      <w:hyperlink r:id="rId37" w:history="1">
         <w:r>
           <w:rPr>
             <w:rStyle w:val="Hyperlink"/>
@@ -30590,7 +30524,7 @@
       <w:r>
         <w:t xml:space="preserve"> </w:t>
       </w:r>
-      <w:hyperlink r:id="rId37" w:history="1">
+      <w:hyperlink r:id="rId38" w:history="1">
         <w:r>
           <w:rPr>
             <w:rStyle w:val="Hyperlink"/>
@@ -30616,7 +30550,7 @@
       <w:r>
         <w:t xml:space="preserve">(Mark Moxon) - </w:t>
       </w:r>
-      <w:hyperlink r:id="rId38" w:history="1">
+      <w:hyperlink r:id="rId39" w:history="1">
         <w:r>
           <w:rPr>
             <w:rStyle w:val="Hyperlink"/>
@@ -30626,12 +30560,12 @@
       </w:hyperlink>
     </w:p>
     <w:sectPr>
-      <w:headerReference w:type="even" r:id="rId39"/>
-      <w:headerReference w:type="default" r:id="rId40"/>
-      <w:footerReference w:type="even" r:id="rId41"/>
-      <w:footerReference w:type="default" r:id="rId42"/>
-      <w:headerReference w:type="first" r:id="rId43"/>
-      <w:footerReference w:type="first" r:id="rId44"/>
+      <w:headerReference w:type="even" r:id="rId40"/>
+      <w:headerReference w:type="default" r:id="rId41"/>
+      <w:footerReference w:type="even" r:id="rId42"/>
+      <w:footerReference w:type="default" r:id="rId43"/>
+      <w:headerReference w:type="first" r:id="rId44"/>
+      <w:footerReference w:type="first" r:id="rId45"/>
       <w:pgSz w:w="12240" w:h="15840"/>
       <w:pgMar w:top="1440" w:right="1440" w:bottom="1440" w:left="1440" w:header="720" w:footer="720" w:gutter="0"/>
       <w:cols w:space="720"/>
@@ -30893,28 +30827,28 @@
         <v:path o:extrusionok="f" gradientshapeok="t" o:connecttype="rect"/>
         <o:lock v:ext="edit" aspectratio="t"/>
       </v:shapetype>
-      <v:shape id="_x0000_i1730" type="#_x0000_t75" style="width:30pt;height:22.65pt;visibility:visible;mso-wrap-style:square" o:bullet="t">
+      <v:shape id="_x0000_i1086" type="#_x0000_t75" style="width:30pt;height:22.65pt;visibility:visible;mso-wrap-style:square" o:bullet="t">
         <v:imagedata r:id="rId1" o:title=""/>
       </v:shape>
     </w:pict>
   </w:numPicBullet>
   <w:numPicBullet w:numPicBulletId="1">
     <w:pict>
-      <v:shape id="_x0000_i1731" type="#_x0000_t75" style="width:30pt;height:22.65pt;visibility:visible;mso-wrap-style:square" o:bullet="t">
+      <v:shape id="_x0000_i1087" type="#_x0000_t75" style="width:30pt;height:22.65pt;visibility:visible;mso-wrap-style:square" o:bullet="t">
         <v:imagedata r:id="rId2" o:title=""/>
       </v:shape>
     </w:pict>
   </w:numPicBullet>
   <w:numPicBullet w:numPicBulletId="2">
     <w:pict>
-      <v:shape id="_x0000_i1732" type="#_x0000_t75" style="width:30pt;height:22.65pt;visibility:visible;mso-wrap-style:square" o:bullet="t">
+      <v:shape id="_x0000_i1088" type="#_x0000_t75" style="width:30pt;height:22.65pt;visibility:visible;mso-wrap-style:square" o:bullet="t">
         <v:imagedata r:id="rId3" o:title=""/>
       </v:shape>
     </w:pict>
   </w:numPicBullet>
   <w:numPicBullet w:numPicBulletId="3">
     <w:pict>
-      <v:shape id="_x0000_i1733" type="#_x0000_t75" style="width:28.65pt;height:21.65pt;visibility:visible;mso-wrap-style:square" o:bullet="t">
+      <v:shape id="_x0000_i1089" type="#_x0000_t75" style="width:28.65pt;height:21.65pt;visibility:visible;mso-wrap-style:square" o:bullet="t">
         <v:imagedata r:id="rId4" o:title=""/>
       </v:shape>
     </w:pict>

</xml_diff>

<commit_message>
Changes:  - Stop enemies from using their weapon when K9 is on an elevator  - Increased the size of switch pairings data block to 48 bytes.  - Consolidated god-mode code into thekeyboardInputHandlers routine  - Added debug mode to help test levels  - Defined missing size constants  - Updated documentation (for above)
</commit_message>
<xml_diff>
--- a/docs/Development.docx
+++ b/docs/Development.docx
@@ -13837,10 +13837,7 @@
       </w:r>
       <w:proofErr w:type="spellEnd"/>
       <w:r>
-        <w:t>)</w:t>
-      </w:r>
-      <w:r>
-        <w:t xml:space="preserve"> </w:t>
+        <w:t xml:space="preserve">) </w:t>
       </w:r>
       <w:r>
         <w:t xml:space="preserve">that </w:t>
@@ -22095,19 +22092,13 @@
         <w:t xml:space="preserve"> the </w:t>
       </w:r>
       <w:r>
-        <w:t>teleport</w:t>
-      </w:r>
-      <w:r>
-        <w:t xml:space="preserve">’s </w:t>
+        <w:t xml:space="preserve">teleport’s </w:t>
       </w:r>
       <w:r>
         <w:t xml:space="preserve">destination </w:t>
       </w:r>
       <w:r>
-        <w:t>teleport</w:t>
-      </w:r>
-      <w:r>
-        <w:t>’s index</w:t>
+        <w:t>teleport’s index</w:t>
       </w:r>
       <w:r>
         <w:t>.</w:t>
@@ -23483,7 +23474,48 @@
         <w:t>32-byte data block</w:t>
       </w:r>
       <w:r>
-        <w:t xml:space="preserve"> which encodes the levels’ switch pairings.  The encod</w:t>
+        <w:t xml:space="preserve"> </w:t>
+      </w:r>
+      <w:r>
+        <w:rPr>
+          <w:b/>
+          <w:bCs/>
+        </w:rPr>
+        <w:t>(</w:t>
+      </w:r>
+      <w:r>
+        <w:rPr>
+          <w:b/>
+          <w:bCs/>
+        </w:rPr>
+        <w:t xml:space="preserve">later </w:t>
+      </w:r>
+      <w:r>
+        <w:rPr>
+          <w:b/>
+          <w:bCs/>
+        </w:rPr>
+        <w:t>enlarged to 48</w:t>
+      </w:r>
+      <w:r>
+        <w:rPr>
+          <w:b/>
+          <w:bCs/>
+        </w:rPr>
+        <w:t>-</w:t>
+      </w:r>
+      <w:r>
+        <w:rPr>
+          <w:b/>
+          <w:bCs/>
+        </w:rPr>
+        <w:t>bytes)</w:t>
+      </w:r>
+      <w:r>
+        <w:t xml:space="preserve"> </w:t>
+      </w:r>
+      <w:r>
+        <w:t>which encodes the levels’ switch pairings.  The encod</w:t>
       </w:r>
       <w:r>
         <w:t>ing is</w:t>
@@ -27599,7 +27631,7 @@
               <w:cnfStyle w:val="000000000000" w:firstRow="0" w:lastRow="0" w:firstColumn="0" w:lastColumn="0" w:oddVBand="0" w:evenVBand="0" w:oddHBand="0" w:evenHBand="0" w:firstRowFirstColumn="0" w:firstRowLastColumn="0" w:lastRowFirstColumn="0" w:lastRowLastColumn="0"/>
             </w:pPr>
             <w:r>
-              <w:t>32</w:t>
+              <w:t>48</w:t>
             </w:r>
           </w:p>
         </w:tc>
@@ -27623,7 +27655,7 @@
               <w:jc w:val="center"/>
             </w:pPr>
             <w:r>
-              <w:t>4103</w:t>
+              <w:t>4113</w:t>
             </w:r>
           </w:p>
         </w:tc>
@@ -27681,13 +27713,7 @@
               <w:jc w:val="center"/>
             </w:pPr>
             <w:r>
-              <w:t>4F</w:t>
-            </w:r>
-            <w:r>
-              <w:t>8</w:t>
-            </w:r>
-            <w:r>
-              <w:t>3</w:t>
+              <w:t>4F93</w:t>
             </w:r>
           </w:p>
         </w:tc>
@@ -27746,7 +27772,7 @@
               <w:jc w:val="center"/>
             </w:pPr>
             <w:r>
-              <w:t>5668</w:t>
+              <w:t>5678</w:t>
             </w:r>
           </w:p>
         </w:tc>
@@ -27804,7 +27830,7 @@
               <w:jc w:val="center"/>
             </w:pPr>
             <w:r>
-              <w:t>56B4</w:t>
+              <w:t>56C4</w:t>
             </w:r>
           </w:p>
         </w:tc>
@@ -27872,7 +27898,7 @@
               <w:jc w:val="center"/>
             </w:pPr>
             <w:r>
-              <w:t>6103</w:t>
+              <w:t>6113</w:t>
             </w:r>
           </w:p>
         </w:tc>
@@ -29005,7 +29031,7 @@
               <w:cnfStyle w:val="000000000000" w:firstRow="0" w:lastRow="0" w:firstColumn="0" w:lastColumn="0" w:oddVBand="0" w:evenVBand="0" w:oddHBand="0" w:evenHBand="0" w:firstRowFirstColumn="0" w:firstRowLastColumn="0" w:lastRowFirstColumn="0" w:lastRowLastColumn="0"/>
             </w:pPr>
             <w:r>
-              <w:t>32</w:t>
+              <w:t>48</w:t>
             </w:r>
           </w:p>
         </w:tc>
@@ -29029,7 +29055,7 @@
               <w:jc w:val="center"/>
             </w:pPr>
             <w:r>
-              <w:t>4103</w:t>
+              <w:t>4113</w:t>
             </w:r>
           </w:p>
         </w:tc>
@@ -29087,13 +29113,7 @@
               <w:jc w:val="center"/>
             </w:pPr>
             <w:r>
-              <w:t>4F</w:t>
-            </w:r>
-            <w:r>
-              <w:t>8</w:t>
-            </w:r>
-            <w:r>
-              <w:t>3</w:t>
+              <w:t>4F93</w:t>
             </w:r>
           </w:p>
         </w:tc>
@@ -29155,7 +29175,7 @@
               <w:jc w:val="center"/>
             </w:pPr>
             <w:r>
-              <w:t>5668</w:t>
+              <w:t>5678</w:t>
             </w:r>
           </w:p>
         </w:tc>
@@ -29217,7 +29237,7 @@
               <w:jc w:val="center"/>
             </w:pPr>
             <w:r>
-              <w:t>56B4</w:t>
+              <w:t>56C4</w:t>
             </w:r>
           </w:p>
         </w:tc>
@@ -29735,7 +29755,7 @@
               <w:jc w:val="center"/>
             </w:pPr>
             <w:r>
-              <w:t>5668</w:t>
+              <w:t>5678</w:t>
             </w:r>
           </w:p>
         </w:tc>
@@ -29793,7 +29813,7 @@
               <w:jc w:val="center"/>
             </w:pPr>
             <w:r>
-              <w:t>56B4</w:t>
+              <w:t>56C4</w:t>
             </w:r>
           </w:p>
         </w:tc>
@@ -29848,7 +29868,7 @@
               <w:jc w:val="center"/>
             </w:pPr>
             <w:r>
-              <w:t>6103</w:t>
+              <w:t>6113</w:t>
             </w:r>
           </w:p>
         </w:tc>
@@ -30081,7 +30101,7 @@
         <w:t>The finale file is loaded at address &amp;</w:t>
       </w:r>
       <w:r>
-        <w:t>5668</w:t>
+        <w:t>5678</w:t>
       </w:r>
       <w:r>
         <w:t xml:space="preserve">, </w:t>
@@ -33426,28 +33446,28 @@
         <v:path o:extrusionok="f" gradientshapeok="t" o:connecttype="rect"/>
         <o:lock v:ext="edit" aspectratio="t"/>
       </v:shapetype>
-      <v:shape id="_x0000_i1466" type="#_x0000_t75" style="width:30pt;height:22.65pt;visibility:visible;mso-wrap-style:square" o:bullet="t">
+      <v:shape id="_x0000_i1078" type="#_x0000_t75" style="width:30pt;height:22.65pt;visibility:visible;mso-wrap-style:square" o:bullet="t">
         <v:imagedata r:id="rId1" o:title=""/>
       </v:shape>
     </w:pict>
   </w:numPicBullet>
   <w:numPicBullet w:numPicBulletId="1">
     <w:pict>
-      <v:shape id="_x0000_i1467" type="#_x0000_t75" style="width:30pt;height:22.65pt;visibility:visible;mso-wrap-style:square" o:bullet="t">
+      <v:shape id="_x0000_i1079" type="#_x0000_t75" style="width:30pt;height:22.65pt;visibility:visible;mso-wrap-style:square" o:bullet="t">
         <v:imagedata r:id="rId2" o:title=""/>
       </v:shape>
     </w:pict>
   </w:numPicBullet>
   <w:numPicBullet w:numPicBulletId="2">
     <w:pict>
-      <v:shape id="_x0000_i1468" type="#_x0000_t75" style="width:30pt;height:22.65pt;visibility:visible;mso-wrap-style:square" o:bullet="t">
+      <v:shape id="_x0000_i1080" type="#_x0000_t75" style="width:30pt;height:22.65pt;visibility:visible;mso-wrap-style:square" o:bullet="t">
         <v:imagedata r:id="rId3" o:title=""/>
       </v:shape>
     </w:pict>
   </w:numPicBullet>
   <w:numPicBullet w:numPicBulletId="3">
     <w:pict>
-      <v:shape id="_x0000_i1469" type="#_x0000_t75" style="width:28.65pt;height:21.65pt;visibility:visible;mso-wrap-style:square" o:bullet="t">
+      <v:shape id="_x0000_i1081" type="#_x0000_t75" style="width:28.65pt;height:21.65pt;visibility:visible;mso-wrap-style:square" o:bullet="t">
         <v:imagedata r:id="rId4" o:title=""/>
       </v:shape>
     </w:pict>
@@ -37447,6 +37467,7 @@
   <w:style w:type="character" w:default="1" w:styleId="DefaultParagraphFont">
     <w:name w:val="Default Paragraph Font"/>
     <w:uiPriority w:val="1"/>
+    <w:semiHidden/>
     <w:unhideWhenUsed/>
   </w:style>
   <w:style w:type="table" w:default="1" w:styleId="TableNormal">

</xml_diff>

<commit_message>
Changes to enable the K9 samples to be played in level 4, the Weeping Angels level.  The sampling code was refactored to acquire and release tone generator 3.
</commit_message>
<xml_diff>
--- a/docs/Development.docx
+++ b/docs/Development.docx
@@ -25509,7 +25509,21 @@
           <w:i/>
           <w:iCs/>
         </w:rPr>
-        <w:t>I'm intrigued to find out whether the angels only move when K9 is facing away from them, that would be so cool. </w:t>
+        <w:t>I'm intrigued to find out whether the angels only move when K9 is facing away from them, that would be so cool</w:t>
+      </w:r>
+      <w:r>
+        <w:rPr>
+          <w:i/>
+          <w:iCs/>
+        </w:rPr>
+        <w:t>…</w:t>
+      </w:r>
+      <w:r>
+        <w:rPr>
+          <w:i/>
+          <w:iCs/>
+        </w:rPr>
+        <w:t> </w:t>
       </w:r>
     </w:p>
     <w:p>
@@ -25553,16 +25567,16 @@
         <w:t>weeping_angels</w:t>
       </w:r>
       <w:r>
-        <w:t xml:space="preserve"> feature branch as the game was now public.  I would </w:t>
+        <w:t xml:space="preserve"> feature branch.  I would </w:t>
       </w:r>
       <w:r>
         <w:t xml:space="preserve">iterate </w:t>
       </w:r>
       <w:r>
-        <w:t xml:space="preserve">within this </w:t>
-      </w:r>
-      <w:r>
-        <w:t xml:space="preserve">and later </w:t>
+        <w:t xml:space="preserve">in this branch </w:t>
+      </w:r>
+      <w:r>
+        <w:t xml:space="preserve">and </w:t>
       </w:r>
       <w:r>
         <w:t xml:space="preserve">merge </w:t>
@@ -25581,7 +25595,10 @@
         <w:t>main</w:t>
       </w:r>
       <w:r>
-        <w:t>.</w:t>
+        <w:t xml:space="preserve"> later</w:t>
+      </w:r>
+      <w:r>
+        <w:t xml:space="preserve"> after completing the functionality</w:t>
       </w:r>
     </w:p>
     <w:p>
@@ -25680,40 +25697,74 @@
         <w:t>d</w:t>
       </w:r>
       <w:r>
-        <w:t xml:space="preserve"> a Weeping Angels setting in the Level Editor (Settings dialog) serializing </w:t>
-      </w:r>
-      <w:r>
-        <w:t xml:space="preserve">the value </w:t>
-      </w:r>
-      <w:r>
-        <w:t xml:space="preserve">in a </w:t>
-      </w:r>
-      <w:r>
-        <w:rPr>
-          <w:i/>
-          <w:iCs/>
-        </w:rPr>
-        <w:t>level</w:t>
-      </w:r>
-      <w:r>
-        <w:rPr>
-          <w:i/>
-          <w:iCs/>
-        </w:rPr>
-        <w:t>F</w:t>
-      </w:r>
-      <w:r>
-        <w:rPr>
-          <w:i/>
-          <w:iCs/>
-        </w:rPr>
-        <w:t>lags</w:t>
-      </w:r>
-      <w:r>
-        <w:t xml:space="preserve"> field</w:t>
-      </w:r>
-      <w:r>
-        <w:t>.</w:t>
+        <w:t xml:space="preserve"> a</w:t>
+      </w:r>
+      <w:r>
+        <w:t>n</w:t>
+      </w:r>
+      <w:r>
+        <w:t xml:space="preserve"> </w:t>
+      </w:r>
+      <w:r>
+        <w:rPr>
+          <w:b/>
+          <w:bCs/>
+        </w:rPr>
+        <w:t>E</w:t>
+      </w:r>
+      <w:r>
+        <w:rPr>
+          <w:b/>
+          <w:bCs/>
+        </w:rPr>
+        <w:t>nemy</w:t>
+      </w:r>
+      <w:r>
+        <w:rPr>
+          <w:b/>
+          <w:bCs/>
+          <w:i/>
+          <w:iCs/>
+        </w:rPr>
+        <w:t xml:space="preserve"> </w:t>
+      </w:r>
+      <w:r>
+        <w:rPr>
+          <w:b/>
+          <w:bCs/>
+        </w:rPr>
+        <w:t>T</w:t>
+      </w:r>
+      <w:r>
+        <w:rPr>
+          <w:b/>
+          <w:bCs/>
+        </w:rPr>
+        <w:t>ype</w:t>
+      </w:r>
+      <w:r>
+        <w:t xml:space="preserve"> </w:t>
+      </w:r>
+      <w:r>
+        <w:t>setting in the Level Editor (Settings dialog)</w:t>
+      </w:r>
+      <w:r>
+        <w:t xml:space="preserve">, which can be set to either </w:t>
+      </w:r>
+      <w:r>
+        <w:t xml:space="preserve">a </w:t>
+      </w:r>
+      <w:r>
+        <w:t>Generic, Dalek, or Weeping Angel</w:t>
+      </w:r>
+      <w:r>
+        <w:t xml:space="preserve"> value</w:t>
+      </w:r>
+      <w:r>
+        <w:t>.  It replaces the Play Samples</w:t>
+      </w:r>
+      <w:r>
+        <w:t xml:space="preserve"> setting.</w:t>
       </w:r>
     </w:p>
     <w:p>
@@ -25734,17 +25785,23 @@
         <w:t>d</w:t>
       </w:r>
       <w:r>
-        <w:t xml:space="preserve"> a </w:t>
-      </w:r>
-      <w:r>
-        <w:rPr>
-          <w:i/>
-          <w:iCs/>
-        </w:rPr>
-        <w:t>weepingAngels</w:t>
-      </w:r>
-      <w:r>
-        <w:t xml:space="preserve"> zero</w:t>
+        <w:t xml:space="preserve"> a</w:t>
+      </w:r>
+      <w:r>
+        <w:t>n</w:t>
+      </w:r>
+      <w:r>
+        <w:t xml:space="preserve"> </w:t>
+      </w:r>
+      <w:r>
+        <w:rPr>
+          <w:i/>
+          <w:iCs/>
+        </w:rPr>
+        <w:t xml:space="preserve">enemyType </w:t>
+      </w:r>
+      <w:r>
+        <w:t>zero</w:t>
       </w:r>
       <w:r>
         <w:t>-</w:t>
@@ -25753,19 +25810,10 @@
         <w:t>page variable</w:t>
       </w:r>
       <w:r>
-        <w:t xml:space="preserve">, which denotes if </w:t>
-      </w:r>
-      <w:r>
-        <w:t xml:space="preserve">the level’s </w:t>
-      </w:r>
-      <w:r>
-        <w:t>enemies are Weeping Angels</w:t>
-      </w:r>
-      <w:r>
-        <w:t xml:space="preserve"> or not</w:t>
-      </w:r>
-      <w:r>
-        <w:t xml:space="preserve">.  This is set in the </w:t>
+        <w:t xml:space="preserve">, </w:t>
+      </w:r>
+      <w:r>
+        <w:t xml:space="preserve">initialized in the </w:t>
       </w:r>
       <w:r>
         <w:rPr>
@@ -25778,17 +25826,22 @@
         <w:t xml:space="preserve"> routine</w:t>
       </w:r>
       <w:r>
-        <w:t xml:space="preserve"> which deserializes the </w:t>
-      </w:r>
-      <w:r>
-        <w:rPr>
-          <w:i/>
-          <w:iCs/>
-        </w:rPr>
-        <w:t>levelFlags</w:t>
-      </w:r>
-      <w:r>
-        <w:t xml:space="preserve"> field.</w:t>
+        <w:t xml:space="preserve"> </w:t>
+      </w:r>
+      <w:r>
+        <w:t>(level.6502)</w:t>
+      </w:r>
+      <w:r>
+        <w:t xml:space="preserve"> </w:t>
+      </w:r>
+      <w:r>
+        <w:t xml:space="preserve">which </w:t>
+      </w:r>
+      <w:r>
+        <w:t xml:space="preserve">deserializes </w:t>
+      </w:r>
+      <w:r>
+        <w:t>loaded level data.</w:t>
       </w:r>
     </w:p>
     <w:p>
@@ -25917,7 +25970,7 @@
         <w:t>their teeth</w:t>
       </w:r>
       <w:r>
-        <w:t>, only works at short range</w:t>
+        <w:t>, only work at short range</w:t>
       </w:r>
       <w:r>
         <w:t xml:space="preserve">.  </w:t>
@@ -25942,13 +25995,7 @@
         <w:t>enemyWeaponRangePlusOne</w:t>
       </w:r>
       <w:r>
-        <w:t xml:space="preserve"> and used this in place of #(</w:t>
-      </w:r>
-      <w:r>
-        <w:t>ENEMY_WEAPON_RANGE</w:t>
-      </w:r>
-      <w:r>
-        <w:t xml:space="preserve"> + 1) in the code.</w:t>
+        <w:t xml:space="preserve"> and used this in place of #(ENEMY_WEAPON_RANGE + 1) in the code.</w:t>
       </w:r>
       <w:r>
         <w:t xml:space="preserve"> The variable is initialized in</w:t>
@@ -26072,16 +26119,19 @@
         <w:t xml:space="preserve">  </w:t>
       </w:r>
       <w:r>
-        <w:t>This was g</w:t>
-      </w:r>
-      <w:r>
-        <w:t>reat</w:t>
-      </w:r>
-      <w:r>
-        <w:t>, however now</w:t>
-      </w:r>
-      <w:r>
-        <w:t xml:space="preserve"> K9 </w:t>
+        <w:t xml:space="preserve">This </w:t>
+      </w:r>
+      <w:r>
+        <w:t xml:space="preserve">worked well except that Weeping Angels were </w:t>
+      </w:r>
+      <w:r>
+        <w:t xml:space="preserve">now </w:t>
+      </w:r>
+      <w:r>
+        <w:t xml:space="preserve">too easy to kill.  </w:t>
+      </w:r>
+      <w:r>
+        <w:t xml:space="preserve">K9 </w:t>
       </w:r>
       <w:r>
         <w:t xml:space="preserve">could </w:t>
@@ -26090,403 +26140,292 @@
         <w:t xml:space="preserve">simply face a Weeping Angel and destroy it </w:t>
       </w:r>
       <w:r>
-        <w:t xml:space="preserve">simply </w:t>
-      </w:r>
-      <w:r>
-        <w:t>with the laser.</w:t>
-      </w:r>
-      <w:r>
-        <w:t xml:space="preserve">  This was not good.</w:t>
-      </w:r>
-    </w:p>
-    <w:p>
-      <w:r>
-        <w:t xml:space="preserve">After exchanging ideas, I landed on the idea that K9’s laser breaks the quantum lock, allowing </w:t>
-      </w:r>
-      <w:r>
-        <w:t>Weeping Angels to move when fired upon</w:t>
+        <w:t xml:space="preserve">using the </w:t>
+      </w:r>
+      <w:r>
+        <w:t>laser.</w:t>
+      </w:r>
+    </w:p>
+    <w:p>
+      <w:r>
+        <w:t xml:space="preserve">After exchanging ideas, I landed on the idea that </w:t>
+      </w:r>
+      <w:r>
+        <w:t>Weeping Angels can mo</w:t>
+      </w:r>
+      <w:r>
+        <w:t>v</w:t>
+      </w:r>
+      <w:r>
+        <w:t>e when lasered</w:t>
+      </w:r>
+      <w:r>
+        <w:t xml:space="preserve"> (the laser breaks the quantum lock</w:t>
+      </w:r>
+      <w:r>
+        <w:t>?</w:t>
+      </w:r>
+      <w:r>
+        <w:t>)</w:t>
+      </w:r>
+      <w:r>
+        <w:t xml:space="preserve">, and </w:t>
+      </w:r>
+      <w:r>
+        <w:t xml:space="preserve">they </w:t>
+      </w:r>
+      <w:r>
+        <w:t xml:space="preserve">can use their teeth </w:t>
+      </w:r>
+      <w:r>
+        <w:t>when they are close</w:t>
       </w:r>
       <w:r>
         <w:t>.</w:t>
       </w:r>
       <w:r>
-        <w:t xml:space="preserve">  I </w:t>
-      </w:r>
-      <w:r>
-        <w:t>also changed</w:t>
-      </w:r>
-      <w:r>
-        <w:t xml:space="preserve"> the logic </w:t>
-      </w:r>
-      <w:r>
-        <w:t>allow</w:t>
-      </w:r>
-      <w:r>
-        <w:t>ing</w:t>
-      </w:r>
-      <w:r>
-        <w:t xml:space="preserve"> Weeping Angels to use their weapon</w:t>
+        <w:t xml:space="preserve">  These changes seemed </w:t>
+      </w:r>
+      <w:r>
+        <w:t xml:space="preserve">reasonable </w:t>
+      </w:r>
+      <w:r>
+        <w:t xml:space="preserve">and addressed </w:t>
+      </w:r>
+      <w:r>
+        <w:t xml:space="preserve">the playability </w:t>
+      </w:r>
+      <w:r>
+        <w:t>issue</w:t>
+      </w:r>
+      <w:r>
+        <w:t>.</w:t>
+      </w:r>
+    </w:p>
+    <w:p>
+      <w:r>
+        <w:t>I was happy with the overall experience</w:t>
+      </w:r>
+      <w:r>
+        <w:t>, except for the sound</w:t>
+      </w:r>
+      <w:r>
+        <w:t>.</w:t>
+      </w:r>
+    </w:p>
+    <w:p>
+      <w:pPr>
+        <w:pStyle w:val="Heading2"/>
+      </w:pPr>
+      <w:r>
+        <w:lastRenderedPageBreak/>
+        <w:t>S</w:t>
+      </w:r>
+      <w:r>
+        <w:t xml:space="preserve">ound </w:t>
+      </w:r>
+      <w:r>
+        <w:t>improvements</w:t>
+      </w:r>
+    </w:p>
+    <w:p>
+      <w:r>
+        <w:t xml:space="preserve">The main issue with the sound in </w:t>
+      </w:r>
+      <w:r>
+        <w:t>level 4</w:t>
+      </w:r>
+      <w:r>
+        <w:t>, the Weeping Angels level</w:t>
+      </w:r>
+      <w:r>
+        <w:t xml:space="preserve">, is that the </w:t>
+      </w:r>
+      <w:r>
+        <w:t xml:space="preserve">K9 </w:t>
+      </w:r>
+      <w:r>
+        <w:t>‘</w:t>
+      </w:r>
+      <w:r>
+        <w:rPr>
+          <w:i/>
+          <w:iCs/>
+        </w:rPr>
+        <w:t>insufficient data’</w:t>
+      </w:r>
+      <w:r>
+        <w:t xml:space="preserve"> and ‘</w:t>
+      </w:r>
+      <w:r>
+        <w:rPr>
+          <w:i/>
+          <w:iCs/>
+        </w:rPr>
+        <w:t>affirmative</w:t>
+      </w:r>
+      <w:r>
+        <w:t xml:space="preserve">’ </w:t>
+      </w:r>
+      <w:r>
+        <w:t>samples don’t play</w:t>
+      </w:r>
+      <w:r>
+        <w:t xml:space="preserve">, which feels </w:t>
+      </w:r>
+      <w:r>
+        <w:t xml:space="preserve">really </w:t>
+      </w:r>
+      <w:r>
+        <w:t>odd</w:t>
+      </w:r>
+      <w:r>
+        <w:t>.</w:t>
+      </w:r>
+    </w:p>
+    <w:p>
+      <w:r>
+        <w:t>The root cause is that all samples are disabled in the level because samples are played on tone generator 3, which is also used to play the</w:t>
+      </w:r>
+      <w:r>
+        <w:t xml:space="preserve"> </w:t>
+      </w:r>
+      <w:r>
+        <w:t>enemy</w:t>
+      </w:r>
+      <w:r>
+        <w:t>-</w:t>
+      </w:r>
+      <w:r>
+        <w:t>in</w:t>
+      </w:r>
+      <w:r>
+        <w:t>-</w:t>
+      </w:r>
+      <w:r>
+        <w:t xml:space="preserve">pursuit </w:t>
+      </w:r>
+      <w:r>
+        <w:t xml:space="preserve">MOS-based </w:t>
+      </w:r>
+      <w:r>
+        <w:t>sound effect</w:t>
+      </w:r>
+      <w:r>
+        <w:t>, which is played instead of the ‘</w:t>
+      </w:r>
+      <w:r>
+        <w:rPr>
+          <w:i/>
+          <w:iCs/>
+        </w:rPr>
+        <w:t>exterminate</w:t>
+      </w:r>
+      <w:r>
+        <w:rPr>
+          <w:i/>
+          <w:iCs/>
+        </w:rPr>
+        <w:t>!</w:t>
+      </w:r>
+      <w:r>
+        <w:t>’ sample.</w:t>
+      </w:r>
+    </w:p>
+    <w:p>
+      <w:r>
+        <w:t>After exploring a number of ideas to get around the limitation, including moving the pursuit sound effect to tone generators 1 or 2</w:t>
+      </w:r>
+      <w:r>
+        <w:t xml:space="preserve"> (which did not pan out),</w:t>
+      </w:r>
+      <w:r>
+        <w:t xml:space="preserve"> I landed on the idea that the sample code only uses tone generator 3 when it needs it, acquiring and releasing it as needed.</w:t>
+      </w:r>
+    </w:p>
+    <w:p>
+      <w:r>
+        <w:t>The acquire and release code would contain</w:t>
+      </w:r>
+      <w:r>
+        <w:t xml:space="preserve"> </w:t>
+      </w:r>
+      <w:r>
+        <w:rPr>
+          <w:b/>
+          <w:bCs/>
+        </w:rPr>
+        <w:t>a</w:t>
+      </w:r>
+      <w:r>
+        <w:rPr>
+          <w:b/>
+          <w:bCs/>
+        </w:rPr>
+        <w:t>)</w:t>
+      </w:r>
+      <w:r>
+        <w:t xml:space="preserve"> set up the tone generator for MOS or Sample-based playback</w:t>
+      </w:r>
+      <w:r>
+        <w:t xml:space="preserve">, and </w:t>
+      </w:r>
+      <w:r>
+        <w:rPr>
+          <w:b/>
+          <w:bCs/>
+        </w:rPr>
+        <w:t>b</w:t>
+      </w:r>
+      <w:r>
+        <w:rPr>
+          <w:b/>
+          <w:bCs/>
+        </w:rPr>
+        <w:t>)</w:t>
+      </w:r>
+      <w:r>
+        <w:t xml:space="preserve"> pause and resume the MOS</w:t>
+      </w:r>
+      <w:r>
+        <w:t>-</w:t>
+      </w:r>
+      <w:r>
+        <w:t>based pursuit sound effect</w:t>
+      </w:r>
+      <w:r>
+        <w:t>.</w:t>
+      </w:r>
+    </w:p>
+    <w:p>
+      <w:r>
+        <w:t>The approach worked well through I did need to free up quite a bit of memory</w:t>
       </w:r>
       <w:r>
         <w:t xml:space="preserve">, </w:t>
       </w:r>
       <w:r>
-        <w:t>their teeth</w:t>
-      </w:r>
-      <w:r>
-        <w:t>,</w:t>
-      </w:r>
-      <w:r>
-        <w:t xml:space="preserve"> </w:t>
-      </w:r>
-      <w:r>
-        <w:t>when facing K9</w:t>
-      </w:r>
-      <w:r>
-        <w:t>.</w:t>
-      </w:r>
-      <w:r>
-        <w:t xml:space="preserve">  </w:t>
-      </w:r>
-      <w:r>
-        <w:t>These tweaks were straightforward to implement and addres</w:t>
-      </w:r>
-      <w:r>
-        <w:t>sed</w:t>
-      </w:r>
-      <w:r>
-        <w:t xml:space="preserve"> the gameplay issues</w:t>
-      </w:r>
-      <w:r>
-        <w:t>.</w:t>
-      </w:r>
-    </w:p>
-    <w:p>
-      <w:r>
-        <w:t>Finally, I tweaked the Weeping Angels level (level 4) to account for the new behavior.</w:t>
-      </w:r>
-      <w:r>
-        <w:t xml:space="preserve">  </w:t>
-      </w:r>
-    </w:p>
-    <w:p>
-      <w:r>
-        <w:lastRenderedPageBreak/>
-        <w:t>I was happy with the overall experience</w:t>
-      </w:r>
-      <w:r>
-        <w:t>, except for the sound</w:t>
-      </w:r>
-      <w:r>
-        <w:t>.</w:t>
-      </w:r>
-    </w:p>
-    <w:p>
-      <w:pPr>
-        <w:pStyle w:val="Heading2"/>
-      </w:pPr>
-      <w:r>
-        <w:t>S</w:t>
-      </w:r>
-      <w:r>
-        <w:t xml:space="preserve">ound </w:t>
-      </w:r>
-      <w:r>
-        <w:t>improvements</w:t>
-      </w:r>
-    </w:p>
-    <w:p>
-      <w:r>
-        <w:t xml:space="preserve">There </w:t>
-      </w:r>
-      <w:r>
-        <w:t>are</w:t>
-      </w:r>
-      <w:r>
-        <w:t xml:space="preserve"> </w:t>
-      </w:r>
-      <w:r>
-        <w:t xml:space="preserve">two issues with </w:t>
-      </w:r>
-      <w:r>
-        <w:t xml:space="preserve">the sound in </w:t>
-      </w:r>
-      <w:r>
-        <w:t>level 4</w:t>
-      </w:r>
-      <w:r>
-        <w:t>, the Weeping Angels level.</w:t>
-      </w:r>
-      <w:r>
-        <w:t xml:space="preserve">  </w:t>
-      </w:r>
-    </w:p>
-    <w:p>
-      <w:r>
-        <w:t xml:space="preserve">Firstly, the K9 </w:t>
-      </w:r>
-      <w:r>
-        <w:t>‘</w:t>
-      </w:r>
-      <w:r>
-        <w:rPr>
-          <w:i/>
-          <w:iCs/>
-        </w:rPr>
-        <w:t>insufficient data’</w:t>
-      </w:r>
-      <w:r>
-        <w:t xml:space="preserve"> and ‘</w:t>
-      </w:r>
-      <w:r>
-        <w:rPr>
-          <w:i/>
-          <w:iCs/>
-        </w:rPr>
-        <w:t>affirmative</w:t>
-      </w:r>
-      <w:r>
-        <w:t xml:space="preserve">’ </w:t>
-      </w:r>
-      <w:r>
-        <w:t>samples don’t play</w:t>
-      </w:r>
-      <w:r>
-        <w:t>, which feels odd, as they play on all the other levels</w:t>
-      </w:r>
-      <w:r>
-        <w:t xml:space="preserve"> (</w:t>
-      </w:r>
-      <w:r>
-        <w:t xml:space="preserve">provided </w:t>
-      </w:r>
-      <w:r>
-        <w:t>32K of sideways RAM is available</w:t>
-      </w:r>
-      <w:r>
-        <w:t>)</w:t>
-      </w:r>
-      <w:r>
-        <w:t xml:space="preserve">.  </w:t>
-      </w:r>
-      <w:r>
-        <w:t>S</w:t>
-      </w:r>
-      <w:r>
-        <w:t xml:space="preserve">econdly, </w:t>
-      </w:r>
-      <w:r>
-        <w:t>the continuous helter-skelter pursuit sound</w:t>
-      </w:r>
-      <w:r>
-        <w:t xml:space="preserve"> effect</w:t>
-      </w:r>
-      <w:r>
-        <w:t>, played instead of the repeating ‘</w:t>
-      </w:r>
-      <w:r>
-        <w:rPr>
-          <w:i/>
-          <w:iCs/>
-        </w:rPr>
-        <w:t>exterminate</w:t>
-      </w:r>
-      <w:r>
-        <w:t>’ sample</w:t>
-      </w:r>
-      <w:r>
-        <w:t>,</w:t>
-      </w:r>
-      <w:r>
-        <w:t xml:space="preserve"> </w:t>
-      </w:r>
-      <w:r>
-        <w:t xml:space="preserve">is ill-suited for the </w:t>
-      </w:r>
-      <w:r>
-        <w:t>level’s graveyard / crypt theme.</w:t>
-      </w:r>
-    </w:p>
-    <w:p>
-      <w:r>
-        <w:t>The first issue stems from a conflict between playing the pursuit sound effect and playing samples (any sample), with generator 3 used by both.</w:t>
-      </w:r>
-    </w:p>
-    <w:p>
-      <w:r>
-        <w:t xml:space="preserve">To play the K9 samples, the pursuit sound effect would need to </w:t>
-      </w:r>
-      <w:r>
-        <w:t xml:space="preserve">move to </w:t>
-      </w:r>
-      <w:r>
-        <w:t xml:space="preserve">either </w:t>
-      </w:r>
-      <w:r>
-        <w:t>tone generator 1 or 2. Unfortunately, the continuous laser sound effect is played on tone generate 1, so that</w:t>
-      </w:r>
-      <w:r>
-        <w:t>’s not an option</w:t>
-      </w:r>
-      <w:r>
-        <w:t>.  As for tone generator 2</w:t>
-      </w:r>
-      <w:r>
-        <w:t>…</w:t>
-      </w:r>
-      <w:r>
-        <w:t xml:space="preserve"> the achievement, blocked, low-health, and K9 movement sounds</w:t>
-      </w:r>
-      <w:r>
-        <w:t xml:space="preserve"> are currently played on this, with the K9 movement sound blocked from playing when the other sounds play.</w:t>
-      </w:r>
-    </w:p>
-    <w:p>
-      <w:r>
-        <w:t xml:space="preserve">The pursuit sound effect </w:t>
-      </w:r>
-      <w:r>
-        <w:t xml:space="preserve">could </w:t>
-      </w:r>
-      <w:r>
-        <w:t xml:space="preserve">be </w:t>
-      </w:r>
-      <w:r>
-        <w:t xml:space="preserve">relocated on </w:t>
-      </w:r>
-      <w:r>
-        <w:t xml:space="preserve">tone generator 2, but only if it </w:t>
-      </w:r>
-      <w:r>
-        <w:t xml:space="preserve">is </w:t>
-      </w:r>
-      <w:r>
-        <w:t xml:space="preserve">changed to a periodic sound.  </w:t>
-      </w:r>
-      <w:r>
-        <w:t xml:space="preserve">I explored this option, making </w:t>
-      </w:r>
-      <w:r>
-        <w:t>a low beat that increases in frequency as pursuing enemies get nearer</w:t>
-      </w:r>
-      <w:r>
-        <w:t xml:space="preserve"> to K9</w:t>
-      </w:r>
-      <w:r>
-        <w:t>.</w:t>
-      </w:r>
-    </w:p>
-    <w:p>
-      <w:r>
-        <w:t>This worked well, and b</w:t>
-      </w:r>
-      <w:r>
-        <w:t xml:space="preserve">etter still the low beat </w:t>
-      </w:r>
-      <w:r>
-        <w:t xml:space="preserve">effect </w:t>
-      </w:r>
-      <w:r>
-        <w:t>fit much better with Level’s 4 theme</w:t>
-      </w:r>
-      <w:r>
-        <w:t>, thus addressing the second issue.</w:t>
-      </w:r>
-    </w:p>
-    <w:p>
-      <w:pPr>
-        <w:pStyle w:val="Heading4"/>
-      </w:pPr>
-      <w:r>
-        <w:t>Implementation</w:t>
-      </w:r>
-    </w:p>
-    <w:p>
-      <w:pPr>
-        <w:pStyle w:val="ListParagraph"/>
-        <w:numPr>
-          <w:ilvl w:val="0"/>
-          <w:numId w:val="2"/>
-        </w:numPr>
-      </w:pPr>
-      <w:r>
-        <w:t xml:space="preserve">Move pursuit </w:t>
-      </w:r>
-      <w:r>
-        <w:t xml:space="preserve">sound effect </w:t>
-      </w:r>
-      <w:r>
-        <w:t>to tone generator 2</w:t>
-      </w:r>
-    </w:p>
-    <w:p>
-      <w:pPr>
-        <w:pStyle w:val="ListParagraph"/>
-        <w:numPr>
-          <w:ilvl w:val="0"/>
-          <w:numId w:val="2"/>
-        </w:numPr>
-      </w:pPr>
-      <w:r>
-        <w:t>Replace</w:t>
-      </w:r>
-      <w:r>
-        <w:rPr>
-          <w:i/>
-          <w:iCs/>
-        </w:rPr>
-        <w:t xml:space="preserve"> </w:t>
-      </w:r>
-      <w:r>
-        <w:rPr>
-          <w:i/>
-          <w:iCs/>
-        </w:rPr>
-        <w:t>enemyWeaponRangePlusOne</w:t>
-      </w:r>
-      <w:r>
-        <w:rPr>
-          <w:i/>
-          <w:iCs/>
-        </w:rPr>
-        <w:t xml:space="preserve"> </w:t>
-      </w:r>
-      <w:r>
-        <w:t>with</w:t>
-      </w:r>
-      <w:r>
-        <w:rPr>
-          <w:i/>
-          <w:iCs/>
-        </w:rPr>
-        <w:t xml:space="preserve"> </w:t>
-      </w:r>
-      <w:r>
-        <w:t>code gen</w:t>
-      </w:r>
-    </w:p>
-    <w:p>
-      <w:pPr>
-        <w:pStyle w:val="ListParagraph"/>
-        <w:numPr>
-          <w:ilvl w:val="0"/>
-          <w:numId w:val="2"/>
-        </w:numPr>
-      </w:pPr>
-      <w:r>
-        <w:t>Replace level editor flags with enemy type</w:t>
-      </w:r>
-    </w:p>
-    <w:p>
-      <w:pPr>
-        <w:pStyle w:val="ListParagraph"/>
-        <w:numPr>
-          <w:ilvl w:val="0"/>
-          <w:numId w:val="2"/>
-        </w:numPr>
-      </w:pPr>
-      <w:r>
-        <w:t>Sound enemy died effect to before transition</w:t>
+        <w:t xml:space="preserve">which I accomplished by </w:t>
+      </w:r>
+      <w:r>
+        <w:t xml:space="preserve">refactoring the </w:t>
+      </w:r>
+      <w:r>
+        <w:rPr>
+          <w:i/>
+          <w:iCs/>
+        </w:rPr>
+        <w:t>objectFrameCallback</w:t>
+      </w:r>
+      <w:r>
+        <w:rPr>
+          <w:i/>
+          <w:iCs/>
+        </w:rPr>
+        <w:t>Lo/Hi</w:t>
+      </w:r>
+      <w:r>
+        <w:t xml:space="preserve"> code to be index-based, rather than address-based.</w:t>
       </w:r>
     </w:p>
     <w:p>
@@ -28221,7 +28160,7 @@
                 <w:b/>
                 <w:bCs/>
               </w:rPr>
-              <w:t>6960</w:t>
+              <w:t>7056</w:t>
             </w:r>
           </w:p>
         </w:tc>
@@ -28245,10 +28184,7 @@
               <w:jc w:val="center"/>
             </w:pPr>
             <w:r>
-              <w:t>2</w:t>
-            </w:r>
-            <w:r>
-              <w:t>C30</w:t>
+              <w:t>2C90</w:t>
             </w:r>
           </w:p>
         </w:tc>
@@ -28661,14 +28597,7 @@
           <w:b/>
           <w:bCs/>
         </w:rPr>
-        <w:t>69</w:t>
-      </w:r>
-      <w:r>
-        <w:rPr>
-          <w:b/>
-          <w:bCs/>
-        </w:rPr>
-        <w:t>60</w:t>
+        <w:t>7056</w:t>
       </w:r>
       <w:r>
         <w:t xml:space="preserve"> bytes</w:t>
@@ -29489,7 +29418,13 @@
               <w:cnfStyle w:val="000000000000" w:firstRow="0" w:lastRow="0" w:firstColumn="0" w:lastColumn="0" w:oddVBand="0" w:evenVBand="0" w:oddHBand="0" w:evenHBand="0" w:firstRowFirstColumn="0" w:firstRowLastColumn="0" w:lastRowFirstColumn="0" w:lastRowLastColumn="0"/>
             </w:pPr>
             <w:r>
-              <w:t>1741</w:t>
+              <w:t>1</w:t>
+            </w:r>
+            <w:r>
+              <w:t>6</w:t>
+            </w:r>
+            <w:r>
+              <w:t>37</w:t>
             </w:r>
           </w:p>
         </w:tc>
@@ -29513,7 +29448,10 @@
               <w:jc w:val="center"/>
             </w:pPr>
             <w:r>
-              <w:t>5660</w:t>
+              <w:t>56</w:t>
+            </w:r>
+            <w:r>
+              <w:t>1C</w:t>
             </w:r>
           </w:p>
         </w:tc>
@@ -29571,7 +29509,10 @@
               <w:jc w:val="center"/>
             </w:pPr>
             <w:r>
-              <w:t>56AC</w:t>
+              <w:t>56</w:t>
+            </w:r>
+            <w:r>
+              <w:t>68</w:t>
             </w:r>
           </w:p>
         </w:tc>
@@ -29660,7 +29601,10 @@
               <w:jc w:val="center"/>
             </w:pPr>
             <w:r>
-              <w:t>60F9</w:t>
+              <w:t>60</w:t>
+            </w:r>
+            <w:r>
+              <w:t>B5</w:t>
             </w:r>
           </w:p>
         </w:tc>
@@ -29698,7 +29642,10 @@
               <w:t>3</w:t>
             </w:r>
             <w:r>
-              <w:t>228</w:t>
+              <w:t>2</w:t>
+            </w:r>
+            <w:r>
+              <w:t>05</w:t>
             </w:r>
           </w:p>
         </w:tc>
@@ -30143,10 +30090,7 @@
         <w:t xml:space="preserve">only </w:t>
       </w:r>
       <w:r>
-        <w:t>2</w:t>
-      </w:r>
-      <w:r>
-        <w:t>09</w:t>
+        <w:t>300</w:t>
       </w:r>
       <w:r>
         <w:t xml:space="preserve"> bytes of unused memory, between </w:t>
@@ -30947,7 +30891,7 @@
               <w:cnfStyle w:val="000000000000" w:firstRow="0" w:lastRow="0" w:firstColumn="0" w:lastColumn="0" w:oddVBand="0" w:evenVBand="0" w:oddHBand="0" w:evenHBand="0" w:firstRowFirstColumn="0" w:firstRowLastColumn="0" w:lastRowFirstColumn="0" w:lastRowLastColumn="0"/>
             </w:pPr>
             <w:r>
-              <w:t>1741</w:t>
+              <w:t>1637</w:t>
             </w:r>
           </w:p>
         </w:tc>
@@ -30971,7 +30915,7 @@
               <w:jc w:val="center"/>
             </w:pPr>
             <w:r>
-              <w:t>5660</w:t>
+              <w:t>561C</w:t>
             </w:r>
           </w:p>
         </w:tc>
@@ -31033,7 +30977,7 @@
               <w:jc w:val="center"/>
             </w:pPr>
             <w:r>
-              <w:t>56AC</w:t>
+              <w:t>5668</w:t>
             </w:r>
           </w:p>
         </w:tc>
@@ -31570,7 +31514,7 @@
               <w:jc w:val="center"/>
             </w:pPr>
             <w:r>
-              <w:t>5660</w:t>
+              <w:t>561C</w:t>
             </w:r>
           </w:p>
         </w:tc>
@@ -31628,7 +31572,7 @@
               <w:jc w:val="center"/>
             </w:pPr>
             <w:r>
-              <w:t>56AC</w:t>
+              <w:t>5668</w:t>
             </w:r>
           </w:p>
         </w:tc>
@@ -31718,7 +31662,10 @@
               <w:cnfStyle w:val="000000000000" w:firstRow="0" w:lastRow="0" w:firstColumn="0" w:lastColumn="0" w:oddVBand="0" w:evenVBand="0" w:oddHBand="0" w:evenHBand="0" w:firstRowFirstColumn="0" w:firstRowLastColumn="0" w:lastRowFirstColumn="0" w:lastRowLastColumn="0"/>
             </w:pPr>
             <w:r>
-              <w:t>3228</w:t>
+              <w:t>32</w:t>
+            </w:r>
+            <w:r>
+              <w:t>05</w:t>
             </w:r>
           </w:p>
         </w:tc>
@@ -31914,7 +31861,7 @@
         <w:t>The finale file is loaded at address &amp;</w:t>
       </w:r>
       <w:r>
-        <w:t>5660</w:t>
+        <w:t>561C</w:t>
       </w:r>
       <w:r>
         <w:t xml:space="preserve">, </w:t>
@@ -35071,28 +35018,28 @@
         <v:path o:extrusionok="f" gradientshapeok="t" o:connecttype="rect"/>
         <o:lock v:ext="edit" aspectratio="t"/>
       </v:shapetype>
-      <v:shape id="_x0000_i1118" type="#_x0000_t75" style="width:30pt;height:22.65pt;visibility:visible;mso-wrap-style:square" o:bullet="t">
+      <v:shape id="_x0000_i1202" type="#_x0000_t75" style="width:30pt;height:22.65pt;visibility:visible;mso-wrap-style:square" o:bullet="t">
         <v:imagedata r:id="rId1" o:title=""/>
       </v:shape>
     </w:pict>
   </w:numPicBullet>
   <w:numPicBullet w:numPicBulletId="1">
     <w:pict>
-      <v:shape id="_x0000_i1119" type="#_x0000_t75" style="width:30pt;height:22.65pt;visibility:visible;mso-wrap-style:square" o:bullet="t">
+      <v:shape id="_x0000_i1203" type="#_x0000_t75" style="width:30pt;height:22.65pt;visibility:visible;mso-wrap-style:square" o:bullet="t">
         <v:imagedata r:id="rId2" o:title=""/>
       </v:shape>
     </w:pict>
   </w:numPicBullet>
   <w:numPicBullet w:numPicBulletId="2">
     <w:pict>
-      <v:shape id="_x0000_i1120" type="#_x0000_t75" style="width:30pt;height:22.65pt;visibility:visible;mso-wrap-style:square" o:bullet="t">
+      <v:shape id="_x0000_i1204" type="#_x0000_t75" style="width:30pt;height:22.65pt;visibility:visible;mso-wrap-style:square" o:bullet="t">
         <v:imagedata r:id="rId3" o:title=""/>
       </v:shape>
     </w:pict>
   </w:numPicBullet>
   <w:numPicBullet w:numPicBulletId="3">
     <w:pict>
-      <v:shape id="_x0000_i1121" type="#_x0000_t75" style="width:28.65pt;height:21.65pt;visibility:visible;mso-wrap-style:square" o:bullet="t">
+      <v:shape id="_x0000_i1205" type="#_x0000_t75" style="width:28.65pt;height:21.65pt;visibility:visible;mso-wrap-style:square" o:bullet="t">
         <v:imagedata r:id="rId4" o:title=""/>
       </v:shape>
     </w:pict>
@@ -39184,6 +39131,7 @@
   <w:style w:type="character" w:default="1" w:styleId="DefaultParagraphFont">
     <w:name w:val="Default Paragraph Font"/>
     <w:uiPriority w:val="1"/>
+    <w:semiHidden/>
     <w:unhideWhenUsed/>
   </w:style>
   <w:style w:type="table" w:default="1" w:styleId="TableNormal">

</xml_diff>

<commit_message>
Fixed regression caused by temp being overwritten by sendSoundData.  Also corrected comments.
</commit_message>
<xml_diff>
--- a/docs/Development.docx
+++ b/docs/Development.docx
@@ -16318,7 +16318,7 @@
               <w:cnfStyle w:val="000000000000" w:firstRow="0" w:lastRow="0" w:firstColumn="0" w:lastColumn="0" w:oddVBand="0" w:evenVBand="0" w:oddHBand="0" w:evenHBand="0" w:firstRowFirstColumn="0" w:firstRowLastColumn="0" w:lastRowFirstColumn="0" w:lastRowLastColumn="0"/>
             </w:pPr>
             <w:r>
-              <w:t>None</w:t>
+              <w:t>Done, but not by me</w:t>
             </w:r>
           </w:p>
         </w:tc>
@@ -19400,7 +19400,13 @@
         <w:t xml:space="preserve"> distinct files </w:t>
       </w:r>
       <w:r>
-        <w:t>(pcm1..pcn5)</w:t>
+        <w:t>(pcm1..pc</w:t>
+      </w:r>
+      <w:r>
+        <w:t>m</w:t>
+      </w:r>
+      <w:r>
+        <w:t>5)</w:t>
       </w:r>
       <w:r>
         <w:t xml:space="preserve"> in the disc image.</w:t>
@@ -26345,10 +26351,7 @@
     </w:p>
     <w:p>
       <w:r>
-        <w:t>The acquire and release code would contain</w:t>
-      </w:r>
-      <w:r>
-        <w:t xml:space="preserve"> </w:t>
+        <w:t xml:space="preserve">The acquire and release code would </w:t>
       </w:r>
       <w:r>
         <w:rPr>
@@ -26365,7 +26368,19 @@
         <w:t>)</w:t>
       </w:r>
       <w:r>
-        <w:t xml:space="preserve"> set up the tone generator for MOS or Sample-based playback</w:t>
+        <w:t xml:space="preserve"> set up the tone generator </w:t>
+      </w:r>
+      <w:r>
+        <w:t xml:space="preserve">3 </w:t>
+      </w:r>
+      <w:r>
+        <w:t xml:space="preserve">for MOS or </w:t>
+      </w:r>
+      <w:r>
+        <w:t>s</w:t>
+      </w:r>
+      <w:r>
+        <w:t>ample-based playback</w:t>
       </w:r>
       <w:r>
         <w:t xml:space="preserve">, and </w:t>
@@ -31858,7 +31873,13 @@
         <w:br/>
       </w:r>
       <w:r>
-        <w:t>The finale file is loaded at address &amp;</w:t>
+        <w:t>The finale file</w:t>
+      </w:r>
+      <w:r>
+        <w:t xml:space="preserve"> (named ‘level0’)</w:t>
+      </w:r>
+      <w:r>
+        <w:t xml:space="preserve"> is loaded at address &amp;</w:t>
       </w:r>
       <w:r>
         <w:t>561C</w:t>
@@ -35018,28 +35039,28 @@
         <v:path o:extrusionok="f" gradientshapeok="t" o:connecttype="rect"/>
         <o:lock v:ext="edit" aspectratio="t"/>
       </v:shapetype>
-      <v:shape id="_x0000_i1202" type="#_x0000_t75" style="width:30pt;height:22.65pt;visibility:visible;mso-wrap-style:square" o:bullet="t">
+      <v:shape id="_x0000_i1070" type="#_x0000_t75" style="width:30pt;height:22.65pt;visibility:visible;mso-wrap-style:square" o:bullet="t">
         <v:imagedata r:id="rId1" o:title=""/>
       </v:shape>
     </w:pict>
   </w:numPicBullet>
   <w:numPicBullet w:numPicBulletId="1">
     <w:pict>
-      <v:shape id="_x0000_i1203" type="#_x0000_t75" style="width:30pt;height:22.65pt;visibility:visible;mso-wrap-style:square" o:bullet="t">
+      <v:shape id="_x0000_i1071" type="#_x0000_t75" style="width:30pt;height:22.65pt;visibility:visible;mso-wrap-style:square" o:bullet="t">
         <v:imagedata r:id="rId2" o:title=""/>
       </v:shape>
     </w:pict>
   </w:numPicBullet>
   <w:numPicBullet w:numPicBulletId="2">
     <w:pict>
-      <v:shape id="_x0000_i1204" type="#_x0000_t75" style="width:30pt;height:22.65pt;visibility:visible;mso-wrap-style:square" o:bullet="t">
+      <v:shape id="_x0000_i1072" type="#_x0000_t75" style="width:30pt;height:22.65pt;visibility:visible;mso-wrap-style:square" o:bullet="t">
         <v:imagedata r:id="rId3" o:title=""/>
       </v:shape>
     </w:pict>
   </w:numPicBullet>
   <w:numPicBullet w:numPicBulletId="3">
     <w:pict>
-      <v:shape id="_x0000_i1205" type="#_x0000_t75" style="width:28.65pt;height:21.65pt;visibility:visible;mso-wrap-style:square" o:bullet="t">
+      <v:shape id="_x0000_i1073" type="#_x0000_t75" style="width:28.65pt;height:21.65pt;visibility:visible;mso-wrap-style:square" o:bullet="t">
         <v:imagedata r:id="rId4" o:title=""/>
       </v:shape>
     </w:pict>

</xml_diff>

<commit_message>
Added palette inversion effect. Also:  - Corrected typos in comments  - Updated documentation.  - Fixed usage of waitForVSync
</commit_message>
<xml_diff>
--- a/docs/Development.docx
+++ b/docs/Development.docx
@@ -17351,10 +17351,20 @@
         <w:t xml:space="preserve">After making these improvements, I posted the game on </w:t>
       </w:r>
       <w:r>
+        <w:rPr>
+          <w:b/>
+          <w:bCs/>
+        </w:rPr>
         <w:t>stardot.org.uk</w:t>
       </w:r>
       <w:r>
-        <w:t xml:space="preserve"> to get more feedback</w:t>
+        <w:t xml:space="preserve"> </w:t>
+      </w:r>
+      <w:r>
+        <w:t xml:space="preserve">forum </w:t>
+      </w:r>
+      <w:r>
+        <w:t>to get more feedback</w:t>
       </w:r>
       <w:r>
         <w:t xml:space="preserve">.  </w:t>
@@ -17369,7 +17379,10 @@
         <w:t xml:space="preserve"> and </w:t>
       </w:r>
       <w:r>
-        <w:t>I gathered the following feedback.</w:t>
+        <w:t>I gathered the following feedback</w:t>
+      </w:r>
+      <w:r>
+        <w:t xml:space="preserve"> which I acted upon.</w:t>
       </w:r>
     </w:p>
     <w:tbl>
@@ -17392,7 +17405,7 @@
         <w:tc>
           <w:tcPr>
             <w:cnfStyle w:val="001000000100" w:firstRow="0" w:lastRow="0" w:firstColumn="1" w:lastColumn="0" w:oddVBand="0" w:evenVBand="0" w:oddHBand="0" w:evenHBand="0" w:firstRowFirstColumn="1" w:firstRowLastColumn="0" w:lastRowFirstColumn="0" w:lastRowLastColumn="0"/>
-            <w:tcW w:w="6925" w:type="dxa"/>
+            <w:tcW w:w="6724" w:type="dxa"/>
           </w:tcPr>
           <w:p>
             <w:pPr>
@@ -17408,7 +17421,7 @@
         </w:tc>
         <w:tc>
           <w:tcPr>
-            <w:tcW w:w="1350" w:type="dxa"/>
+            <w:tcW w:w="1583" w:type="dxa"/>
           </w:tcPr>
           <w:p>
             <w:pPr>
@@ -17424,7 +17437,7 @@
         </w:tc>
         <w:tc>
           <w:tcPr>
-            <w:tcW w:w="2515" w:type="dxa"/>
+            <w:tcW w:w="2483" w:type="dxa"/>
           </w:tcPr>
           <w:p>
             <w:pPr>
@@ -17447,7 +17460,7 @@
         <w:tc>
           <w:tcPr>
             <w:cnfStyle w:val="001000000000" w:firstRow="0" w:lastRow="0" w:firstColumn="1" w:lastColumn="0" w:oddVBand="0" w:evenVBand="0" w:oddHBand="0" w:evenHBand="0" w:firstRowFirstColumn="0" w:firstRowLastColumn="0" w:lastRowFirstColumn="0" w:lastRowLastColumn="0"/>
-            <w:tcW w:w="6925" w:type="dxa"/>
+            <w:tcW w:w="6724" w:type="dxa"/>
           </w:tcPr>
           <w:p>
             <w:pPr>
@@ -17470,7 +17483,7 @@
         </w:tc>
         <w:tc>
           <w:tcPr>
-            <w:tcW w:w="1350" w:type="dxa"/>
+            <w:tcW w:w="1583" w:type="dxa"/>
           </w:tcPr>
           <w:p>
             <w:pPr>
@@ -17488,7 +17501,7 @@
         </w:tc>
         <w:tc>
           <w:tcPr>
-            <w:tcW w:w="2515" w:type="dxa"/>
+            <w:tcW w:w="2483" w:type="dxa"/>
           </w:tcPr>
           <w:p>
             <w:pPr>
@@ -17521,7 +17534,7 @@
         <w:tc>
           <w:tcPr>
             <w:cnfStyle w:val="001000000000" w:firstRow="0" w:lastRow="0" w:firstColumn="1" w:lastColumn="0" w:oddVBand="0" w:evenVBand="0" w:oddHBand="0" w:evenHBand="0" w:firstRowFirstColumn="0" w:firstRowLastColumn="0" w:lastRowFirstColumn="0" w:lastRowLastColumn="0"/>
-            <w:tcW w:w="6925" w:type="dxa"/>
+            <w:tcW w:w="6724" w:type="dxa"/>
           </w:tcPr>
           <w:p>
             <w:pPr>
@@ -17544,7 +17557,7 @@
         </w:tc>
         <w:tc>
           <w:tcPr>
-            <w:tcW w:w="1350" w:type="dxa"/>
+            <w:tcW w:w="1583" w:type="dxa"/>
           </w:tcPr>
           <w:p>
             <w:pPr>
@@ -17562,7 +17575,7 @@
         </w:tc>
         <w:tc>
           <w:tcPr>
-            <w:tcW w:w="2515" w:type="dxa"/>
+            <w:tcW w:w="2483" w:type="dxa"/>
           </w:tcPr>
           <w:p>
             <w:pPr>
@@ -17585,7 +17598,7 @@
         <w:tc>
           <w:tcPr>
             <w:cnfStyle w:val="001000000000" w:firstRow="0" w:lastRow="0" w:firstColumn="1" w:lastColumn="0" w:oddVBand="0" w:evenVBand="0" w:oddHBand="0" w:evenHBand="0" w:firstRowFirstColumn="0" w:firstRowLastColumn="0" w:lastRowFirstColumn="0" w:lastRowLastColumn="0"/>
-            <w:tcW w:w="6925" w:type="dxa"/>
+            <w:tcW w:w="6724" w:type="dxa"/>
           </w:tcPr>
           <w:p>
             <w:pPr>
@@ -17657,7 +17670,7 @@
         </w:tc>
         <w:tc>
           <w:tcPr>
-            <w:tcW w:w="1350" w:type="dxa"/>
+            <w:tcW w:w="1583" w:type="dxa"/>
           </w:tcPr>
           <w:p>
             <w:pPr>
@@ -17677,7 +17690,7 @@
         </w:tc>
         <w:tc>
           <w:tcPr>
-            <w:tcW w:w="2515" w:type="dxa"/>
+            <w:tcW w:w="2483" w:type="dxa"/>
           </w:tcPr>
           <w:p>
             <w:pPr>
@@ -17699,7 +17712,7 @@
         <w:tc>
           <w:tcPr>
             <w:cnfStyle w:val="001000000000" w:firstRow="0" w:lastRow="0" w:firstColumn="1" w:lastColumn="0" w:oddVBand="0" w:evenVBand="0" w:oddHBand="0" w:evenHBand="0" w:firstRowFirstColumn="0" w:firstRowLastColumn="0" w:lastRowFirstColumn="0" w:lastRowLastColumn="0"/>
-            <w:tcW w:w="6925" w:type="dxa"/>
+            <w:tcW w:w="6724" w:type="dxa"/>
           </w:tcPr>
           <w:p>
             <w:pPr>
@@ -17722,7 +17735,7 @@
         </w:tc>
         <w:tc>
           <w:tcPr>
-            <w:tcW w:w="1350" w:type="dxa"/>
+            <w:tcW w:w="1583" w:type="dxa"/>
           </w:tcPr>
           <w:p>
             <w:pPr>
@@ -17742,7 +17755,7 @@
         </w:tc>
         <w:tc>
           <w:tcPr>
-            <w:tcW w:w="2515" w:type="dxa"/>
+            <w:tcW w:w="2483" w:type="dxa"/>
           </w:tcPr>
           <w:p>
             <w:pPr>
@@ -17753,6 +17766,76 @@
             </w:pPr>
             <w:r>
               <w:t>Done, but not by me</w:t>
+            </w:r>
+          </w:p>
+        </w:tc>
+      </w:tr>
+      <w:tr>
+        <w:trPr>
+          <w:cnfStyle w:val="000000100000" w:firstRow="0" w:lastRow="0" w:firstColumn="0" w:lastColumn="0" w:oddVBand="0" w:evenVBand="0" w:oddHBand="1" w:evenHBand="0" w:firstRowFirstColumn="0" w:firstRowLastColumn="0" w:lastRowFirstColumn="0" w:lastRowLastColumn="0"/>
+          <w:jc w:val="center"/>
+        </w:trPr>
+        <w:tc>
+          <w:tcPr>
+            <w:cnfStyle w:val="001000000000" w:firstRow="0" w:lastRow="0" w:firstColumn="1" w:lastColumn="0" w:oddVBand="0" w:evenVBand="0" w:oddHBand="0" w:evenHBand="0" w:firstRowFirstColumn="0" w:firstRowLastColumn="0" w:lastRowFirstColumn="0" w:lastRowLastColumn="0"/>
+            <w:tcW w:w="6724" w:type="dxa"/>
+          </w:tcPr>
+          <w:p>
+            <w:pPr>
+              <w:keepNext/>
+              <w:keepLines/>
+              <w:widowControl w:val="0"/>
+              <w:rPr>
+                <w:b w:val="0"/>
+                <w:bCs w:val="0"/>
+              </w:rPr>
+            </w:pPr>
+            <w:r>
+              <w:rPr>
+                <w:b w:val="0"/>
+                <w:bCs w:val="0"/>
+              </w:rPr>
+              <w:t>When a Dalek fires its weapon, show an inverted palette instead of a black screen.</w:t>
+            </w:r>
+          </w:p>
+        </w:tc>
+        <w:tc>
+          <w:tcPr>
+            <w:tcW w:w="1583" w:type="dxa"/>
+          </w:tcPr>
+          <w:p>
+            <w:pPr>
+              <w:keepNext/>
+              <w:keepLines/>
+              <w:widowControl w:val="0"/>
+              <w:cnfStyle w:val="000000100000" w:firstRow="0" w:lastRow="0" w:firstColumn="0" w:lastColumn="0" w:oddVBand="0" w:evenVBand="0" w:oddHBand="1" w:evenHBand="0" w:firstRowFirstColumn="0" w:firstRowLastColumn="0" w:lastRowFirstColumn="0" w:lastRowLastColumn="0"/>
+            </w:pPr>
+            <w:r>
+              <w:t>j</w:t>
+            </w:r>
+            <w:r>
+              <w:t xml:space="preserve">ms2, tricky, </w:t>
+            </w:r>
+            <w:proofErr w:type="spellStart"/>
+            <w:r>
+              <w:t>TobyLobster</w:t>
+            </w:r>
+            <w:proofErr w:type="spellEnd"/>
+          </w:p>
+        </w:tc>
+        <w:tc>
+          <w:tcPr>
+            <w:tcW w:w="2483" w:type="dxa"/>
+          </w:tcPr>
+          <w:p>
+            <w:pPr>
+              <w:keepNext/>
+              <w:keepLines/>
+              <w:widowControl w:val="0"/>
+              <w:cnfStyle w:val="000000100000" w:firstRow="0" w:lastRow="0" w:firstColumn="0" w:lastColumn="0" w:oddVBand="0" w:evenVBand="0" w:oddHBand="1" w:evenHBand="0" w:firstRowFirstColumn="0" w:firstRowLastColumn="0" w:lastRowFirstColumn="0" w:lastRowLastColumn="0"/>
+            </w:pPr>
+            <w:r>
+              <w:t>Implemented</w:t>
             </w:r>
           </w:p>
         </w:tc>
@@ -18102,21 +18185,13 @@
       </w:r>
       <w:proofErr w:type="gramEnd"/>
       <w:r>
-        <w:t xml:space="preserve"> clipped, </w:t>
-      </w:r>
-      <w:proofErr w:type="gramStart"/>
-      <w:r>
-        <w:t>left</w:t>
+        <w:t xml:space="preserve"> clipped, left</w:t>
       </w:r>
       <w:r>
         <w:t>-</w:t>
       </w:r>
       <w:r>
-        <w:t>side</w:t>
-      </w:r>
-      <w:proofErr w:type="gramEnd"/>
-      <w:r>
-        <w:t xml:space="preserve"> clipped, right</w:t>
+        <w:t>side clipped, right</w:t>
       </w:r>
       <w:r>
         <w:t>-</w:t>
@@ -20051,13 +20126,16 @@
         <w:t xml:space="preserve">ervice </w:t>
       </w:r>
       <w:r>
-        <w:t>Re</w:t>
-      </w:r>
-      <w:r>
-        <w:t>que</w:t>
-      </w:r>
-      <w:r>
-        <w:t xml:space="preserve">st (IRQ) </w:t>
+        <w:t>Routine</w:t>
+      </w:r>
+      <w:r>
+        <w:t xml:space="preserve"> (I</w:t>
+      </w:r>
+      <w:r>
+        <w:t>SR</w:t>
+      </w:r>
+      <w:r>
+        <w:t xml:space="preserve">) </w:t>
       </w:r>
       <w:r>
         <w:t>routine</w:t>
@@ -28198,8 +28276,16 @@
         <w:rPr>
           <w:rFonts w:ascii="Aptos" w:hAnsi="Aptos"/>
         </w:rPr>
-        <w:t>workspace needed modifying</w:t>
-      </w:r>
+        <w:t xml:space="preserve">workspace needed </w:t>
+      </w:r>
+      <w:proofErr w:type="gramStart"/>
+      <w:r>
+        <w:rPr>
+          <w:rFonts w:ascii="Aptos" w:hAnsi="Aptos"/>
+        </w:rPr>
+        <w:t>modifying</w:t>
+      </w:r>
+      <w:proofErr w:type="gramEnd"/>
       <w:r>
         <w:rPr>
           <w:rFonts w:ascii="Aptos" w:hAnsi="Aptos"/>
@@ -29503,6 +29589,649 @@
       <w:proofErr w:type="gramEnd"/>
       <w:r>
         <w:t xml:space="preserve"> B+.</w:t>
+      </w:r>
+    </w:p>
+    <w:p>
+      <w:pPr>
+        <w:pStyle w:val="Heading2"/>
+      </w:pPr>
+      <w:r>
+        <w:t>P</w:t>
+      </w:r>
+      <w:r>
+        <w:t>alette</w:t>
+      </w:r>
+      <w:r>
+        <w:t xml:space="preserve"> </w:t>
+      </w:r>
+      <w:r>
+        <w:t>inversion effect</w:t>
+      </w:r>
+    </w:p>
+    <w:p>
+      <w:pPr>
+        <w:rPr>
+          <w:rFonts w:ascii="Aptos" w:hAnsi="Aptos"/>
+          <w:color w:val="000000"/>
+        </w:rPr>
+      </w:pPr>
+      <w:r>
+        <w:t xml:space="preserve">Feedback on the </w:t>
+      </w:r>
+      <w:r>
+        <w:rPr>
+          <w:b/>
+          <w:bCs/>
+        </w:rPr>
+        <w:t>stardoc.org.uk</w:t>
+      </w:r>
+      <w:r>
+        <w:t xml:space="preserve"> forum </w:t>
+      </w:r>
+      <w:r>
+        <w:t xml:space="preserve">indicated a </w:t>
+      </w:r>
+      <w:r>
+        <w:t xml:space="preserve">potential issue with the blanking effect </w:t>
+      </w:r>
+      <w:r>
+        <w:t>use</w:t>
+      </w:r>
+      <w:r>
+        <w:t>d</w:t>
+      </w:r>
+      <w:r>
+        <w:t xml:space="preserve"> to </w:t>
+      </w:r>
+      <w:r>
+        <w:t xml:space="preserve">depict K9 being fired upon.  </w:t>
+      </w:r>
+      <w:r>
+        <w:rPr>
+          <w:rFonts w:ascii="Aptos" w:hAnsi="Aptos"/>
+          <w:b/>
+          <w:color w:val="000000"/>
+        </w:rPr>
+        <w:t>j</w:t>
+      </w:r>
+      <w:r>
+        <w:rPr>
+          <w:rFonts w:ascii="Aptos" w:hAnsi="Aptos"/>
+          <w:b/>
+          <w:color w:val="000000"/>
+        </w:rPr>
+        <w:t>ms2</w:t>
+      </w:r>
+      <w:r>
+        <w:rPr>
+          <w:rFonts w:ascii="Aptos" w:hAnsi="Aptos"/>
+          <w:color w:val="000000"/>
+        </w:rPr>
+        <w:t xml:space="preserve"> </w:t>
+      </w:r>
+      <w:r>
+        <w:rPr>
+          <w:rFonts w:ascii="Aptos" w:hAnsi="Aptos"/>
+          <w:color w:val="000000"/>
+        </w:rPr>
+        <w:t xml:space="preserve">did not </w:t>
+      </w:r>
+      <w:r>
+        <w:rPr>
+          <w:rFonts w:ascii="Aptos" w:hAnsi="Aptos"/>
+          <w:color w:val="000000"/>
+        </w:rPr>
+        <w:t xml:space="preserve">initially </w:t>
+      </w:r>
+      <w:r>
+        <w:rPr>
+          <w:rFonts w:ascii="Aptos" w:hAnsi="Aptos"/>
+          <w:color w:val="000000"/>
+        </w:rPr>
+        <w:t>understand what the blanking effect was, thinking it was a bug.</w:t>
+      </w:r>
+    </w:p>
+    <w:p>
+      <w:pPr>
+        <w:rPr>
+          <w:rFonts w:ascii="Aptos" w:hAnsi="Aptos"/>
+          <w:color w:val="000000"/>
+        </w:rPr>
+      </w:pPr>
+      <w:r>
+        <w:rPr>
+          <w:rFonts w:ascii="Aptos" w:hAnsi="Aptos"/>
+          <w:color w:val="000000"/>
+        </w:rPr>
+        <w:t xml:space="preserve">After some discussion, </w:t>
+      </w:r>
+      <w:r>
+        <w:rPr>
+          <w:rFonts w:ascii="Aptos" w:hAnsi="Aptos"/>
+          <w:b/>
+          <w:bCs/>
+          <w:color w:val="000000"/>
+        </w:rPr>
+        <w:t>tricky</w:t>
+      </w:r>
+      <w:r>
+        <w:rPr>
+          <w:rFonts w:ascii="Aptos" w:hAnsi="Aptos"/>
+          <w:color w:val="000000"/>
+        </w:rPr>
+        <w:t xml:space="preserve"> suggested using a </w:t>
+      </w:r>
+      <w:r>
+        <w:rPr>
+          <w:rFonts w:ascii="Aptos" w:hAnsi="Aptos"/>
+          <w:color w:val="000000"/>
+        </w:rPr>
+        <w:t xml:space="preserve">palette inversion </w:t>
+      </w:r>
+      <w:r>
+        <w:rPr>
+          <w:rFonts w:ascii="Aptos" w:hAnsi="Aptos"/>
+          <w:color w:val="000000"/>
+        </w:rPr>
+        <w:t xml:space="preserve">effect </w:t>
+      </w:r>
+      <w:r>
+        <w:rPr>
+          <w:rFonts w:ascii="Aptos" w:hAnsi="Aptos"/>
+          <w:color w:val="000000"/>
+        </w:rPr>
+        <w:t>instead</w:t>
+      </w:r>
+      <w:r>
+        <w:rPr>
+          <w:rFonts w:ascii="Aptos" w:hAnsi="Aptos"/>
+          <w:color w:val="000000"/>
+        </w:rPr>
+        <w:t>, or using flashing color</w:t>
+      </w:r>
+      <w:r>
+        <w:rPr>
+          <w:rFonts w:ascii="Aptos" w:hAnsi="Aptos"/>
+          <w:color w:val="000000"/>
+        </w:rPr>
+        <w:t xml:space="preserve">s.  The palette inversion idea was supported by </w:t>
+      </w:r>
+      <w:proofErr w:type="spellStart"/>
+      <w:r>
+        <w:rPr>
+          <w:rFonts w:ascii="Aptos" w:hAnsi="Aptos"/>
+          <w:b/>
+          <w:bCs/>
+          <w:color w:val="000000"/>
+        </w:rPr>
+        <w:t>TodyLobster</w:t>
+      </w:r>
+      <w:proofErr w:type="spellEnd"/>
+      <w:r>
+        <w:rPr>
+          <w:rFonts w:ascii="Aptos" w:hAnsi="Aptos"/>
+          <w:color w:val="000000"/>
+        </w:rPr>
+        <w:t xml:space="preserve"> who felt it would match the effect on the original TV series.</w:t>
+      </w:r>
+    </w:p>
+    <w:p>
+      <w:r>
+        <w:lastRenderedPageBreak/>
+        <w:t xml:space="preserve">On reading the </w:t>
+      </w:r>
+      <w:r>
+        <w:t>comments,</w:t>
+      </w:r>
+      <w:r>
+        <w:t xml:space="preserve"> </w:t>
+      </w:r>
+      <w:r>
+        <w:t xml:space="preserve">I was initially reluctant to make </w:t>
+      </w:r>
+      <w:r>
+        <w:t>a</w:t>
+      </w:r>
+      <w:r>
+        <w:t xml:space="preserve"> change as I liked the blanking effect, and thought it worked well.  However, after mulling over the feedback </w:t>
+      </w:r>
+      <w:r>
+        <w:t>for a couple of week</w:t>
+      </w:r>
+      <w:r>
+        <w:t>s</w:t>
+      </w:r>
+      <w:r>
+        <w:t xml:space="preserve">, </w:t>
+      </w:r>
+      <w:r>
+        <w:t>and rereading the comments</w:t>
+      </w:r>
+      <w:r>
+        <w:t>,</w:t>
+      </w:r>
+      <w:r>
+        <w:t xml:space="preserve"> I thought I should </w:t>
+      </w:r>
+      <w:r>
+        <w:t xml:space="preserve">try </w:t>
+      </w:r>
+      <w:r>
+        <w:t xml:space="preserve">the palette </w:t>
+      </w:r>
+      <w:r>
+        <w:t>inver</w:t>
+      </w:r>
+      <w:r>
+        <w:t>sion effect to see what it look</w:t>
+      </w:r>
+      <w:r>
+        <w:t>ed</w:t>
+      </w:r>
+      <w:r>
+        <w:t xml:space="preserve"> like.</w:t>
+      </w:r>
+    </w:p>
+    <w:p>
+      <w:pPr>
+        <w:rPr>
+          <w:rFonts w:ascii="Aptos" w:hAnsi="Aptos"/>
+          <w:color w:val="000000"/>
+        </w:rPr>
+      </w:pPr>
+      <w:r>
+        <w:rPr>
+          <w:rFonts w:ascii="Aptos" w:hAnsi="Aptos"/>
+          <w:color w:val="000000"/>
+        </w:rPr>
+        <w:t xml:space="preserve">I decided that I would only add the </w:t>
+      </w:r>
+      <w:r>
+        <w:rPr>
+          <w:rFonts w:ascii="Aptos" w:hAnsi="Aptos"/>
+          <w:color w:val="000000"/>
+        </w:rPr>
+        <w:t>effect for levels containing Daleks</w:t>
+      </w:r>
+      <w:r>
+        <w:rPr>
+          <w:rFonts w:ascii="Aptos" w:hAnsi="Aptos"/>
+          <w:color w:val="000000"/>
+        </w:rPr>
+        <w:t>, as it did not seem appropriate for Weeping Angels and other enemies.</w:t>
+      </w:r>
+      <w:r>
+        <w:rPr>
+          <w:rFonts w:ascii="Aptos" w:hAnsi="Aptos"/>
+          <w:color w:val="000000"/>
+        </w:rPr>
+        <w:t xml:space="preserve">  The palette inversion effect is Dalek specific.</w:t>
+      </w:r>
+    </w:p>
+    <w:p>
+      <w:pPr>
+        <w:rPr>
+          <w:rFonts w:ascii="Aptos" w:hAnsi="Aptos"/>
+          <w:color w:val="000000"/>
+        </w:rPr>
+      </w:pPr>
+      <w:r>
+        <w:rPr>
+          <w:rFonts w:ascii="Aptos" w:hAnsi="Aptos"/>
+          <w:color w:val="000000"/>
+        </w:rPr>
+        <w:t xml:space="preserve">I was pleasantly surprised </w:t>
+      </w:r>
+      <w:r>
+        <w:rPr>
+          <w:rFonts w:ascii="Aptos" w:hAnsi="Aptos"/>
+          <w:color w:val="000000"/>
+        </w:rPr>
+        <w:t xml:space="preserve">with the </w:t>
+      </w:r>
+      <w:r>
+        <w:rPr>
+          <w:rFonts w:ascii="Aptos" w:hAnsi="Aptos"/>
+          <w:color w:val="000000"/>
+        </w:rPr>
+        <w:t>result,</w:t>
+      </w:r>
+      <w:r>
+        <w:rPr>
+          <w:rFonts w:ascii="Aptos" w:hAnsi="Aptos"/>
+          <w:color w:val="000000"/>
+        </w:rPr>
+        <w:t xml:space="preserve"> </w:t>
+      </w:r>
+      <w:r>
+        <w:rPr>
+          <w:rFonts w:ascii="Aptos" w:hAnsi="Aptos"/>
+          <w:color w:val="000000"/>
+        </w:rPr>
+        <w:t>which worked really well</w:t>
+      </w:r>
+      <w:r>
+        <w:rPr>
+          <w:rFonts w:ascii="Aptos" w:hAnsi="Aptos"/>
+          <w:color w:val="000000"/>
+        </w:rPr>
+        <w:t>, as shown below.</w:t>
+      </w:r>
+    </w:p>
+    <w:p>
+      <w:pPr>
+        <w:jc w:val="center"/>
+      </w:pPr>
+      <w:r>
+        <w:drawing>
+          <wp:inline distT="0" distB="0" distL="0" distR="0" wp14:anchorId="00D57EAE" wp14:editId="4087219D">
+            <wp:extent cx="2794000" cy="2235200"/>
+            <wp:effectExtent l="38100" t="38100" r="101600" b="88900"/>
+            <wp:docPr id="600298580" name="Picture 1" descr="A screenshot of a video game&#10;&#10;AI-generated content may be incorrect."/>
+            <wp:cNvGraphicFramePr>
+              <a:graphicFrameLocks xmlns:a="http://schemas.openxmlformats.org/drawingml/2006/main" noChangeAspect="1"/>
+            </wp:cNvGraphicFramePr>
+            <a:graphic xmlns:a="http://schemas.openxmlformats.org/drawingml/2006/main">
+              <a:graphicData uri="http://schemas.openxmlformats.org/drawingml/2006/picture">
+                <pic:pic xmlns:pic="http://schemas.openxmlformats.org/drawingml/2006/picture">
+                  <pic:nvPicPr>
+                    <pic:cNvPr id="600298580" name="Picture 1" descr="A screenshot of a video game&#10;&#10;AI-generated content may be incorrect."/>
+                    <pic:cNvPicPr/>
+                  </pic:nvPicPr>
+                  <pic:blipFill>
+                    <a:blip r:embed="rId40"/>
+                    <a:stretch>
+                      <a:fillRect/>
+                    </a:stretch>
+                  </pic:blipFill>
+                  <pic:spPr>
+                    <a:xfrm>
+                      <a:off x="0" y="0"/>
+                      <a:ext cx="2794134" cy="2235307"/>
+                    </a:xfrm>
+                    <a:prstGeom prst="rect">
+                      <a:avLst/>
+                    </a:prstGeom>
+                    <a:effectLst>
+                      <a:outerShdw blurRad="50800" dist="38100" dir="2700000" algn="tl" rotWithShape="0">
+                        <a:prstClr val="black">
+                          <a:alpha val="40000"/>
+                        </a:prstClr>
+                      </a:outerShdw>
+                    </a:effectLst>
+                  </pic:spPr>
+                </pic:pic>
+              </a:graphicData>
+            </a:graphic>
+          </wp:inline>
+        </w:drawing>
+      </w:r>
+    </w:p>
+    <w:p>
+      <w:pPr>
+        <w:pStyle w:val="Heading3"/>
+      </w:pPr>
+      <w:r>
+        <w:t>Implementation</w:t>
+      </w:r>
+    </w:p>
+    <w:p>
+      <w:pPr>
+        <w:rPr>
+          <w:rFonts w:ascii="Aptos" w:hAnsi="Aptos"/>
+          <w:color w:val="000000"/>
+        </w:rPr>
+      </w:pPr>
+      <w:r>
+        <w:rPr>
+          <w:rFonts w:ascii="Aptos" w:hAnsi="Aptos"/>
+          <w:color w:val="000000"/>
+        </w:rPr>
+        <w:t xml:space="preserve">The </w:t>
+      </w:r>
+      <w:r>
+        <w:rPr>
+          <w:rFonts w:ascii="Aptos" w:hAnsi="Aptos"/>
+          <w:color w:val="000000"/>
+        </w:rPr>
+        <w:t xml:space="preserve">effect </w:t>
+      </w:r>
+      <w:r>
+        <w:rPr>
+          <w:rFonts w:ascii="Aptos" w:hAnsi="Aptos"/>
+          <w:color w:val="000000"/>
+        </w:rPr>
+        <w:t xml:space="preserve">was implemented </w:t>
+      </w:r>
+      <w:r>
+        <w:rPr>
+          <w:rFonts w:ascii="Aptos" w:hAnsi="Aptos"/>
+          <w:color w:val="000000"/>
+        </w:rPr>
+        <w:t xml:space="preserve">by introducing a new </w:t>
+      </w:r>
+      <w:proofErr w:type="spellStart"/>
+      <w:r>
+        <w:rPr>
+          <w:rFonts w:ascii="Aptos" w:hAnsi="Aptos"/>
+          <w:b/>
+          <w:bCs/>
+          <w:i/>
+          <w:color w:val="000000"/>
+        </w:rPr>
+        <w:t>setInvertedLevelPalette</w:t>
+      </w:r>
+      <w:proofErr w:type="spellEnd"/>
+      <w:r>
+        <w:rPr>
+          <w:rFonts w:ascii="Aptos" w:hAnsi="Aptos"/>
+          <w:color w:val="000000"/>
+        </w:rPr>
+        <w:t xml:space="preserve"> routine, which takes the place of </w:t>
+      </w:r>
+      <w:proofErr w:type="spellStart"/>
+      <w:r>
+        <w:rPr>
+          <w:rFonts w:ascii="Aptos" w:hAnsi="Aptos"/>
+          <w:b/>
+          <w:bCs/>
+          <w:i/>
+          <w:color w:val="000000"/>
+        </w:rPr>
+        <w:t>setBlackPalette</w:t>
+      </w:r>
+      <w:proofErr w:type="spellEnd"/>
+      <w:r>
+        <w:rPr>
+          <w:rFonts w:ascii="Aptos" w:hAnsi="Aptos"/>
+          <w:color w:val="000000"/>
+        </w:rPr>
+        <w:t xml:space="preserve"> within the </w:t>
+      </w:r>
+      <w:r>
+        <w:rPr>
+          <w:rFonts w:ascii="Aptos" w:hAnsi="Aptos"/>
+          <w:b/>
+          <w:bCs/>
+          <w:i/>
+          <w:color w:val="000000"/>
+        </w:rPr>
+        <w:t>inflictK9Damage</w:t>
+      </w:r>
+      <w:r>
+        <w:rPr>
+          <w:rFonts w:ascii="Aptos" w:hAnsi="Aptos"/>
+          <w:b/>
+          <w:bCs/>
+          <w:i/>
+          <w:color w:val="000000"/>
+        </w:rPr>
+        <w:t xml:space="preserve"> </w:t>
+      </w:r>
+      <w:r>
+        <w:t>routine</w:t>
+      </w:r>
+      <w:r>
+        <w:t>.</w:t>
+      </w:r>
+      <w:r>
+        <w:rPr>
+          <w:rFonts w:ascii="Aptos" w:hAnsi="Aptos"/>
+          <w:color w:val="000000"/>
+        </w:rPr>
+        <w:t xml:space="preserve"> </w:t>
+      </w:r>
+      <w:r>
+        <w:rPr>
+          <w:rFonts w:ascii="Aptos" w:hAnsi="Aptos"/>
+          <w:color w:val="000000"/>
+        </w:rPr>
+        <w:t xml:space="preserve"> </w:t>
+      </w:r>
+      <w:r>
+        <w:rPr>
+          <w:rFonts w:ascii="Aptos" w:hAnsi="Aptos"/>
+          <w:color w:val="000000"/>
+        </w:rPr>
+        <w:t xml:space="preserve">To </w:t>
+      </w:r>
+      <w:r>
+        <w:rPr>
+          <w:rFonts w:ascii="Aptos" w:hAnsi="Aptos"/>
+          <w:color w:val="000000"/>
+        </w:rPr>
+        <w:t xml:space="preserve">reduce runtime </w:t>
+      </w:r>
+      <w:r>
+        <w:rPr>
+          <w:rFonts w:ascii="Aptos" w:hAnsi="Aptos"/>
+          <w:color w:val="000000"/>
+        </w:rPr>
+        <w:t>code size</w:t>
+      </w:r>
+      <w:r>
+        <w:rPr>
+          <w:rFonts w:ascii="Aptos" w:hAnsi="Aptos"/>
+          <w:color w:val="000000"/>
+        </w:rPr>
+        <w:t xml:space="preserve">, the </w:t>
+      </w:r>
+      <w:r>
+        <w:rPr>
+          <w:rFonts w:ascii="Aptos" w:hAnsi="Aptos"/>
+          <w:color w:val="000000"/>
+        </w:rPr>
+        <w:t xml:space="preserve">appropriate </w:t>
+      </w:r>
+      <w:r>
+        <w:rPr>
+          <w:rFonts w:ascii="Aptos" w:hAnsi="Aptos"/>
+          <w:color w:val="000000"/>
+        </w:rPr>
+        <w:t xml:space="preserve">set palette call is patched during level loading, eliminating the need </w:t>
+      </w:r>
+      <w:r>
+        <w:rPr>
+          <w:rFonts w:ascii="Aptos" w:hAnsi="Aptos"/>
+          <w:color w:val="000000"/>
+        </w:rPr>
+        <w:t>for the runtime code to test the type of enemy</w:t>
+      </w:r>
+      <w:r>
+        <w:rPr>
+          <w:rFonts w:ascii="Aptos" w:hAnsi="Aptos"/>
+          <w:color w:val="000000"/>
+        </w:rPr>
+        <w:t>.</w:t>
+      </w:r>
+    </w:p>
+    <w:p>
+      <w:r>
+        <w:rPr>
+          <w:rFonts w:ascii="Aptos" w:hAnsi="Aptos"/>
+          <w:color w:val="000000"/>
+        </w:rPr>
+        <w:t xml:space="preserve">As part of the change, I was able to remove the existing 16-byte </w:t>
+      </w:r>
+      <w:proofErr w:type="spellStart"/>
+      <w:r>
+        <w:rPr>
+          <w:rFonts w:ascii="Aptos" w:hAnsi="Aptos"/>
+          <w:b/>
+          <w:bCs/>
+          <w:i/>
+          <w:iCs/>
+          <w:color w:val="000000"/>
+        </w:rPr>
+        <w:t>blackPalette</w:t>
+      </w:r>
+      <w:proofErr w:type="spellEnd"/>
+      <w:r>
+        <w:rPr>
+          <w:rFonts w:ascii="Aptos" w:hAnsi="Aptos"/>
+          <w:color w:val="000000"/>
+        </w:rPr>
+        <w:t xml:space="preserve"> data structure, reusing the memory to hold the level’s palette instead.  This free up sufficient code space to implement the </w:t>
+      </w:r>
+      <w:proofErr w:type="spellStart"/>
+      <w:r>
+        <w:rPr>
+          <w:rFonts w:ascii="Aptos" w:hAnsi="Aptos"/>
+          <w:b/>
+          <w:bCs/>
+          <w:i/>
+          <w:iCs/>
+          <w:color w:val="000000"/>
+        </w:rPr>
+        <w:t>setInvertedLevelPalette</w:t>
+      </w:r>
+      <w:proofErr w:type="spellEnd"/>
+      <w:r>
+        <w:rPr>
+          <w:rFonts w:ascii="Aptos" w:hAnsi="Aptos"/>
+          <w:color w:val="000000"/>
+        </w:rPr>
+        <w:t xml:space="preserve"> routine</w:t>
+      </w:r>
+      <w:r>
+        <w:rPr>
+          <w:rFonts w:ascii="Aptos" w:hAnsi="Aptos"/>
+          <w:color w:val="000000"/>
+        </w:rPr>
+        <w:t>.</w:t>
+      </w:r>
+      <w:r>
+        <w:rPr>
+          <w:rFonts w:ascii="Aptos" w:hAnsi="Aptos"/>
+          <w:color w:val="000000"/>
+        </w:rPr>
+        <w:t xml:space="preserve">  The change </w:t>
+      </w:r>
+      <w:r>
+        <w:rPr>
+          <w:rFonts w:ascii="Aptos" w:hAnsi="Aptos"/>
+          <w:color w:val="000000"/>
+        </w:rPr>
+        <w:t xml:space="preserve">did however </w:t>
+      </w:r>
+      <w:r>
+        <w:rPr>
+          <w:rFonts w:ascii="Aptos" w:hAnsi="Aptos"/>
+          <w:color w:val="000000"/>
+        </w:rPr>
+        <w:t xml:space="preserve">require a small change to the </w:t>
+      </w:r>
+      <w:r>
+        <w:t xml:space="preserve">level file format and memory map </w:t>
+      </w:r>
+      <w:r>
+        <w:t>as the level palette now has to be relocated</w:t>
+      </w:r>
+      <w:r>
+        <w:t>.</w:t>
+      </w:r>
+      <w:r>
+        <w:t xml:space="preserve">  The memory usage and layout section below reflects the change.</w:t>
       </w:r>
     </w:p>
     <w:p>
@@ -30480,10 +31209,7 @@
               <w:t xml:space="preserve">and </w:t>
             </w:r>
             <w:r>
-              <w:t>black</w:t>
-            </w:r>
-            <w:r>
-              <w:t xml:space="preserve"> </w:t>
+              <w:t xml:space="preserve">level </w:t>
             </w:r>
             <w:r>
               <w:t>palette</w:t>
@@ -31298,7 +32024,7 @@
                 <w:b/>
                 <w:bCs/>
               </w:rPr>
-              <w:t>7056</w:t>
+              <w:t>7072</w:t>
             </w:r>
           </w:p>
         </w:tc>
@@ -31322,7 +32048,13 @@
               <w:jc w:val="center"/>
             </w:pPr>
             <w:r>
-              <w:t>2C90</w:t>
+              <w:t>2</w:t>
+            </w:r>
+            <w:r>
+              <w:t>C</w:t>
+            </w:r>
+            <w:r>
+              <w:t>A0</w:t>
             </w:r>
           </w:p>
         </w:tc>
@@ -31395,7 +32127,7 @@
               <w:t>3</w:t>
             </w:r>
             <w:r>
-              <w:t>130</w:t>
+              <w:t>140</w:t>
             </w:r>
           </w:p>
         </w:tc>
@@ -31411,7 +32143,10 @@
               <w:cnfStyle w:val="000000000000" w:firstRow="0" w:lastRow="0" w:firstColumn="0" w:lastColumn="0" w:oddVBand="0" w:evenVBand="0" w:oddHBand="0" w:evenHBand="0" w:firstRowFirstColumn="0" w:firstRowLastColumn="0" w:lastRowFirstColumn="0" w:lastRowLastColumn="0"/>
             </w:pPr>
             <w:r>
-              <w:t>Level palette</w:t>
+              <w:t>Level tiles</w:t>
+            </w:r>
+            <w:r>
+              <w:t xml:space="preserve"> (27)</w:t>
             </w:r>
           </w:p>
         </w:tc>
@@ -31428,7 +32163,7 @@
               <w:cnfStyle w:val="000000000000" w:firstRow="0" w:lastRow="0" w:firstColumn="0" w:lastColumn="0" w:oddVBand="0" w:evenVBand="0" w:oddHBand="0" w:evenHBand="0" w:firstRowFirstColumn="0" w:firstRowLastColumn="0" w:lastRowFirstColumn="0" w:lastRowLastColumn="0"/>
             </w:pPr>
             <w:r>
-              <w:t>16</w:t>
+              <w:t>1728</w:t>
             </w:r>
           </w:p>
         </w:tc>
@@ -31452,10 +32187,7 @@
               <w:jc w:val="center"/>
             </w:pPr>
             <w:r>
-              <w:t>3</w:t>
-            </w:r>
-            <w:r>
-              <w:t>140</w:t>
+              <w:t>3800</w:t>
             </w:r>
           </w:p>
         </w:tc>
@@ -31471,10 +32203,10 @@
               <w:cnfStyle w:val="000000100000" w:firstRow="0" w:lastRow="0" w:firstColumn="0" w:lastColumn="0" w:oddVBand="0" w:evenVBand="0" w:oddHBand="1" w:evenHBand="0" w:firstRowFirstColumn="0" w:firstRowLastColumn="0" w:lastRowFirstColumn="0" w:lastRowLastColumn="0"/>
             </w:pPr>
             <w:r>
-              <w:t>Level tiles</w:t>
-            </w:r>
-            <w:r>
-              <w:t xml:space="preserve"> (27)</w:t>
+              <w:t>Level tile grid</w:t>
+            </w:r>
+            <w:r>
+              <w:t>`</w:t>
             </w:r>
           </w:p>
         </w:tc>
@@ -31491,7 +32223,7 @@
               <w:cnfStyle w:val="000000100000" w:firstRow="0" w:lastRow="0" w:firstColumn="0" w:lastColumn="0" w:oddVBand="0" w:evenVBand="0" w:oddHBand="1" w:evenHBand="0" w:firstRowFirstColumn="0" w:firstRowLastColumn="0" w:lastRowFirstColumn="0" w:lastRowLastColumn="0"/>
             </w:pPr>
             <w:r>
-              <w:t>1728</w:t>
+              <w:t>2048</w:t>
             </w:r>
           </w:p>
         </w:tc>
@@ -31505,6 +32237,7 @@
           <w:tcPr>
             <w:cnfStyle w:val="001000000000" w:firstRow="0" w:lastRow="0" w:firstColumn="1" w:lastColumn="0" w:oddVBand="0" w:evenVBand="0" w:oddHBand="0" w:evenHBand="0" w:firstRowFirstColumn="0" w:firstRowLastColumn="0" w:lastRowFirstColumn="0" w:lastRowLastColumn="0"/>
             <w:tcW w:w="1165" w:type="dxa"/>
+            <w:shd w:val="clear" w:color="auto" w:fill="D9F2D0" w:themeFill="accent6" w:themeFillTint="33"/>
           </w:tcPr>
           <w:p>
             <w:pPr>
@@ -31514,13 +32247,14 @@
               <w:jc w:val="center"/>
             </w:pPr>
             <w:r>
-              <w:t>3800</w:t>
+              <w:t>4000</w:t>
             </w:r>
           </w:p>
         </w:tc>
         <w:tc>
           <w:tcPr>
             <w:tcW w:w="6979" w:type="dxa"/>
+            <w:shd w:val="clear" w:color="auto" w:fill="D9F2D0" w:themeFill="accent6" w:themeFillTint="33"/>
           </w:tcPr>
           <w:p>
             <w:pPr>
@@ -31530,16 +32264,14 @@
               <w:cnfStyle w:val="000000000000" w:firstRow="0" w:lastRow="0" w:firstColumn="0" w:lastColumn="0" w:oddVBand="0" w:evenVBand="0" w:oddHBand="0" w:evenHBand="0" w:firstRowFirstColumn="0" w:firstRowLastColumn="0" w:lastRowFirstColumn="0" w:lastRowLastColumn="0"/>
             </w:pPr>
             <w:r>
-              <w:t>Level tile grid</w:t>
-            </w:r>
-            <w:r>
-              <w:t>`</w:t>
+              <w:t>256x256 4-color screen</w:t>
             </w:r>
           </w:p>
         </w:tc>
         <w:tc>
           <w:tcPr>
             <w:tcW w:w="958" w:type="dxa"/>
+            <w:shd w:val="clear" w:color="auto" w:fill="D9F2D0" w:themeFill="accent6" w:themeFillTint="33"/>
           </w:tcPr>
           <w:p>
             <w:pPr>
@@ -31550,66 +32282,6 @@
               <w:cnfStyle w:val="000000000000" w:firstRow="0" w:lastRow="0" w:firstColumn="0" w:lastColumn="0" w:oddVBand="0" w:evenVBand="0" w:oddHBand="0" w:evenHBand="0" w:firstRowFirstColumn="0" w:firstRowLastColumn="0" w:lastRowFirstColumn="0" w:lastRowLastColumn="0"/>
             </w:pPr>
             <w:r>
-              <w:t>2048</w:t>
-            </w:r>
-          </w:p>
-        </w:tc>
-      </w:tr>
-      <w:tr>
-        <w:trPr>
-          <w:cnfStyle w:val="000000100000" w:firstRow="0" w:lastRow="0" w:firstColumn="0" w:lastColumn="0" w:oddVBand="0" w:evenVBand="0" w:oddHBand="1" w:evenHBand="0" w:firstRowFirstColumn="0" w:firstRowLastColumn="0" w:lastRowFirstColumn="0" w:lastRowLastColumn="0"/>
-          <w:cantSplit/>
-          <w:trHeight w:val="250"/>
-        </w:trPr>
-        <w:tc>
-          <w:tcPr>
-            <w:cnfStyle w:val="001000000000" w:firstRow="0" w:lastRow="0" w:firstColumn="1" w:lastColumn="0" w:oddVBand="0" w:evenVBand="0" w:oddHBand="0" w:evenHBand="0" w:firstRowFirstColumn="0" w:firstRowLastColumn="0" w:lastRowFirstColumn="0" w:lastRowLastColumn="0"/>
-            <w:tcW w:w="1165" w:type="dxa"/>
-            <w:shd w:val="clear" w:color="auto" w:fill="D9F2D0" w:themeFill="accent6" w:themeFillTint="33"/>
-          </w:tcPr>
-          <w:p>
-            <w:pPr>
-              <w:keepNext/>
-              <w:keepLines/>
-              <w:widowControl w:val="0"/>
-              <w:jc w:val="center"/>
-            </w:pPr>
-            <w:r>
-              <w:t>4000</w:t>
-            </w:r>
-          </w:p>
-        </w:tc>
-        <w:tc>
-          <w:tcPr>
-            <w:tcW w:w="6979" w:type="dxa"/>
-            <w:shd w:val="clear" w:color="auto" w:fill="D9F2D0" w:themeFill="accent6" w:themeFillTint="33"/>
-          </w:tcPr>
-          <w:p>
-            <w:pPr>
-              <w:keepNext/>
-              <w:keepLines/>
-              <w:widowControl w:val="0"/>
-              <w:cnfStyle w:val="000000100000" w:firstRow="0" w:lastRow="0" w:firstColumn="0" w:lastColumn="0" w:oddVBand="0" w:evenVBand="0" w:oddHBand="1" w:evenHBand="0" w:firstRowFirstColumn="0" w:firstRowLastColumn="0" w:lastRowFirstColumn="0" w:lastRowLastColumn="0"/>
-            </w:pPr>
-            <w:r>
-              <w:t>256x256 4-color screen</w:t>
-            </w:r>
-          </w:p>
-        </w:tc>
-        <w:tc>
-          <w:tcPr>
-            <w:tcW w:w="958" w:type="dxa"/>
-            <w:shd w:val="clear" w:color="auto" w:fill="D9F2D0" w:themeFill="accent6" w:themeFillTint="33"/>
-          </w:tcPr>
-          <w:p>
-            <w:pPr>
-              <w:keepNext/>
-              <w:keepLines/>
-              <w:widowControl w:val="0"/>
-              <w:jc w:val="center"/>
-              <w:cnfStyle w:val="000000100000" w:firstRow="0" w:lastRow="0" w:firstColumn="0" w:lastColumn="0" w:oddVBand="0" w:evenVBand="0" w:oddHBand="1" w:evenHBand="0" w:firstRowFirstColumn="0" w:firstRowLastColumn="0" w:lastRowFirstColumn="0" w:lastRowLastColumn="0"/>
-            </w:pPr>
-            <w:r>
               <w:t>16384</w:t>
             </w:r>
           </w:p>
@@ -31743,7 +32415,7 @@
           <w:b/>
           <w:bCs/>
         </w:rPr>
-        <w:t>7056</w:t>
+        <w:t>7072</w:t>
       </w:r>
       <w:r>
         <w:t xml:space="preserve"> bytes</w:t>
@@ -31917,7 +32589,13 @@
         <w:t xml:space="preserve">addresses </w:t>
       </w:r>
       <w:r>
-        <w:t xml:space="preserve">&amp;3130 to &amp;8000 </w:t>
+        <w:t>&amp;31</w:t>
+      </w:r>
+      <w:r>
+        <w:t>4</w:t>
+      </w:r>
+      <w:r>
+        <w:t xml:space="preserve">0 to &amp;8000 </w:t>
       </w:r>
       <w:r>
         <w:t>are</w:t>
@@ -32019,7 +32697,10 @@
               <w:jc w:val="center"/>
             </w:pPr>
             <w:r>
-              <w:t>3130</w:t>
+              <w:t>3</w:t>
+            </w:r>
+            <w:r>
+              <w:t>140</w:t>
             </w:r>
           </w:p>
         </w:tc>
@@ -32035,7 +32716,10 @@
               <w:cnfStyle w:val="000000100000" w:firstRow="0" w:lastRow="0" w:firstColumn="0" w:lastColumn="0" w:oddVBand="0" w:evenVBand="0" w:oddHBand="1" w:evenHBand="0" w:firstRowFirstColumn="0" w:firstRowLastColumn="0" w:lastRowFirstColumn="0" w:lastRowLastColumn="0"/>
             </w:pPr>
             <w:r>
-              <w:t>Level palette</w:t>
+              <w:t>Level tiles</w:t>
+            </w:r>
+            <w:r>
+              <w:t xml:space="preserve"> (27)</w:t>
             </w:r>
           </w:p>
         </w:tc>
@@ -32052,7 +32736,7 @@
               <w:cnfStyle w:val="000000100000" w:firstRow="0" w:lastRow="0" w:firstColumn="0" w:lastColumn="0" w:oddVBand="0" w:evenVBand="0" w:oddHBand="1" w:evenHBand="0" w:firstRowFirstColumn="0" w:firstRowLastColumn="0" w:lastRowFirstColumn="0" w:lastRowLastColumn="0"/>
             </w:pPr>
             <w:r>
-              <w:t>16</w:t>
+              <w:t>1728</w:t>
             </w:r>
           </w:p>
         </w:tc>
@@ -32074,10 +32758,7 @@
               <w:jc w:val="center"/>
             </w:pPr>
             <w:r>
-              <w:t>3</w:t>
-            </w:r>
-            <w:r>
-              <w:t>140</w:t>
+              <w:t>3800</w:t>
             </w:r>
           </w:p>
         </w:tc>
@@ -32093,10 +32774,7 @@
               <w:cnfStyle w:val="000000000000" w:firstRow="0" w:lastRow="0" w:firstColumn="0" w:lastColumn="0" w:oddVBand="0" w:evenVBand="0" w:oddHBand="0" w:evenHBand="0" w:firstRowFirstColumn="0" w:firstRowLastColumn="0" w:lastRowFirstColumn="0" w:lastRowLastColumn="0"/>
             </w:pPr>
             <w:r>
-              <w:t>Level tiles</w:t>
-            </w:r>
-            <w:r>
-              <w:t xml:space="preserve"> (27)</w:t>
+              <w:t>Level tile grid</w:t>
             </w:r>
           </w:p>
         </w:tc>
@@ -32113,7 +32791,7 @@
               <w:cnfStyle w:val="000000000000" w:firstRow="0" w:lastRow="0" w:firstColumn="0" w:lastColumn="0" w:oddVBand="0" w:evenVBand="0" w:oddHBand="0" w:evenHBand="0" w:firstRowFirstColumn="0" w:firstRowLastColumn="0" w:lastRowFirstColumn="0" w:lastRowLastColumn="0"/>
             </w:pPr>
             <w:r>
-              <w:t>1728</w:t>
+              <w:t>2048</w:t>
             </w:r>
           </w:p>
         </w:tc>
@@ -32127,6 +32805,7 @@
           <w:tcPr>
             <w:cnfStyle w:val="001000000000" w:firstRow="0" w:lastRow="0" w:firstColumn="1" w:lastColumn="0" w:oddVBand="0" w:evenVBand="0" w:oddHBand="0" w:evenHBand="0" w:firstRowFirstColumn="0" w:firstRowLastColumn="0" w:lastRowFirstColumn="0" w:lastRowLastColumn="0"/>
             <w:tcW w:w="1345" w:type="dxa"/>
+            <w:shd w:val="clear" w:color="auto" w:fill="E8E8E8" w:themeFill="background2"/>
           </w:tcPr>
           <w:p>
             <w:pPr>
@@ -32136,13 +32815,14 @@
               <w:jc w:val="center"/>
             </w:pPr>
             <w:r>
-              <w:t>3800</w:t>
+              <w:t>4000</w:t>
             </w:r>
           </w:p>
         </w:tc>
         <w:tc>
           <w:tcPr>
             <w:tcW w:w="6570" w:type="dxa"/>
+            <w:shd w:val="clear" w:color="auto" w:fill="E8E8E8" w:themeFill="background2"/>
           </w:tcPr>
           <w:p>
             <w:pPr>
@@ -32152,13 +32832,14 @@
               <w:cnfStyle w:val="000000100000" w:firstRow="0" w:lastRow="0" w:firstColumn="0" w:lastColumn="0" w:oddVBand="0" w:evenVBand="0" w:oddHBand="1" w:evenHBand="0" w:firstRowFirstColumn="0" w:firstRowLastColumn="0" w:lastRowFirstColumn="0" w:lastRowLastColumn="0"/>
             </w:pPr>
             <w:r>
-              <w:t>Level tile grid</w:t>
+              <w:t>Level extents</w:t>
             </w:r>
           </w:p>
         </w:tc>
         <w:tc>
           <w:tcPr>
             <w:tcW w:w="1260" w:type="dxa"/>
+            <w:shd w:val="clear" w:color="auto" w:fill="E8E8E8" w:themeFill="background2"/>
           </w:tcPr>
           <w:p>
             <w:pPr>
@@ -32169,7 +32850,7 @@
               <w:cnfStyle w:val="000000100000" w:firstRow="0" w:lastRow="0" w:firstColumn="0" w:lastColumn="0" w:oddVBand="0" w:evenVBand="0" w:oddHBand="1" w:evenHBand="0" w:firstRowFirstColumn="0" w:firstRowLastColumn="0" w:lastRowFirstColumn="0" w:lastRowLastColumn="0"/>
             </w:pPr>
             <w:r>
-              <w:t>2048</w:t>
+              <w:t>2</w:t>
             </w:r>
           </w:p>
         </w:tc>
@@ -32192,7 +32873,7 @@
               <w:jc w:val="center"/>
             </w:pPr>
             <w:r>
-              <w:t>4000</w:t>
+              <w:t>4002</w:t>
             </w:r>
           </w:p>
         </w:tc>
@@ -32209,7 +32890,7 @@
               <w:cnfStyle w:val="000000000000" w:firstRow="0" w:lastRow="0" w:firstColumn="0" w:lastColumn="0" w:oddVBand="0" w:evenVBand="0" w:oddHBand="0" w:evenHBand="0" w:firstRowFirstColumn="0" w:firstRowLastColumn="0" w:lastRowFirstColumn="0" w:lastRowLastColumn="0"/>
             </w:pPr>
             <w:r>
-              <w:t>Level extents</w:t>
+              <w:t>Level tile types</w:t>
             </w:r>
           </w:p>
         </w:tc>
@@ -32227,7 +32908,7 @@
               <w:cnfStyle w:val="000000000000" w:firstRow="0" w:lastRow="0" w:firstColumn="0" w:lastColumn="0" w:oddVBand="0" w:evenVBand="0" w:oddHBand="0" w:evenHBand="0" w:firstRowFirstColumn="0" w:firstRowLastColumn="0" w:lastRowFirstColumn="0" w:lastRowLastColumn="0"/>
             </w:pPr>
             <w:r>
-              <w:t>2</w:t>
+              <w:t>28</w:t>
             </w:r>
           </w:p>
         </w:tc>
@@ -32251,7 +32932,7 @@
               <w:jc w:val="center"/>
             </w:pPr>
             <w:r>
-              <w:t>4002</w:t>
+              <w:t>401E</w:t>
             </w:r>
           </w:p>
         </w:tc>
@@ -32268,7 +32949,7 @@
               <w:cnfStyle w:val="000000100000" w:firstRow="0" w:lastRow="0" w:firstColumn="0" w:lastColumn="0" w:oddVBand="0" w:evenVBand="0" w:oddHBand="1" w:evenHBand="0" w:firstRowFirstColumn="0" w:firstRowLastColumn="0" w:lastRowFirstColumn="0" w:lastRowLastColumn="0"/>
             </w:pPr>
             <w:r>
-              <w:t>Level tile types</w:t>
+              <w:t>Level palette</w:t>
             </w:r>
           </w:p>
         </w:tc>
@@ -32286,7 +32967,7 @@
               <w:cnfStyle w:val="000000100000" w:firstRow="0" w:lastRow="0" w:firstColumn="0" w:lastColumn="0" w:oddVBand="0" w:evenVBand="0" w:oddHBand="1" w:evenHBand="0" w:firstRowFirstColumn="0" w:firstRowLastColumn="0" w:lastRowFirstColumn="0" w:lastRowLastColumn="0"/>
             </w:pPr>
             <w:r>
-              <w:t>28</w:t>
+              <w:t>16</w:t>
             </w:r>
           </w:p>
         </w:tc>
@@ -32309,7 +32990,7 @@
               <w:jc w:val="center"/>
             </w:pPr>
             <w:r>
-              <w:t>401E</w:t>
+              <w:t>402E</w:t>
             </w:r>
           </w:p>
         </w:tc>
@@ -32368,7 +33049,7 @@
               <w:jc w:val="center"/>
             </w:pPr>
             <w:r>
-              <w:t>4023</w:t>
+              <w:t>4033</w:t>
             </w:r>
           </w:p>
         </w:tc>
@@ -32426,7 +33107,7 @@
               <w:jc w:val="center"/>
             </w:pPr>
             <w:r>
-              <w:t>40E3</w:t>
+              <w:t>40F3</w:t>
             </w:r>
           </w:p>
         </w:tc>
@@ -32443,10 +33124,7 @@
               <w:cnfStyle w:val="000000000000" w:firstRow="0" w:lastRow="0" w:firstColumn="0" w:lastColumn="0" w:oddVBand="0" w:evenVBand="0" w:oddHBand="0" w:evenHBand="0" w:firstRowFirstColumn="0" w:firstRowLastColumn="0" w:lastRowFirstColumn="0" w:lastRowLastColumn="0"/>
             </w:pPr>
             <w:r>
-              <w:t>Level s</w:t>
-            </w:r>
-            <w:r>
-              <w:t>witch pairings</w:t>
+              <w:t>Level switch pairings</w:t>
             </w:r>
           </w:p>
         </w:tc>
@@ -32488,7 +33166,7 @@
               <w:jc w:val="center"/>
             </w:pPr>
             <w:r>
-              <w:t>4113</w:t>
+              <w:t>4123</w:t>
             </w:r>
           </w:p>
         </w:tc>
@@ -32546,7 +33224,7 @@
               <w:jc w:val="center"/>
             </w:pPr>
             <w:r>
-              <w:t>4F93</w:t>
+              <w:t>4FA3</w:t>
             </w:r>
           </w:p>
         </w:tc>
@@ -32564,6 +33242,9 @@
             </w:pPr>
             <w:r>
               <w:t>Level initialization code</w:t>
+            </w:r>
+            <w:r>
+              <w:tab/>
             </w:r>
           </w:p>
         </w:tc>
@@ -32581,7 +33262,7 @@
               <w:cnfStyle w:val="000000000000" w:firstRow="0" w:lastRow="0" w:firstColumn="0" w:lastColumn="0" w:oddVBand="0" w:evenVBand="0" w:oddHBand="0" w:evenHBand="0" w:firstRowFirstColumn="0" w:firstRowLastColumn="0" w:lastRowFirstColumn="0" w:lastRowLastColumn="0"/>
             </w:pPr>
             <w:r>
-              <w:t>1714</w:t>
+              <w:t>1757</w:t>
             </w:r>
           </w:p>
         </w:tc>
@@ -32605,7 +33286,7 @@
               <w:jc w:val="center"/>
             </w:pPr>
             <w:r>
-              <w:t>5645</w:t>
+              <w:t>5680</w:t>
             </w:r>
           </w:p>
         </w:tc>
@@ -32663,7 +33344,7 @@
               <w:jc w:val="center"/>
             </w:pPr>
             <w:r>
-              <w:t>5691</w:t>
+              <w:t>56CC</w:t>
             </w:r>
           </w:p>
         </w:tc>
@@ -32680,16 +33361,7 @@
               <w:cnfStyle w:val="000000000000" w:firstRow="0" w:lastRow="0" w:firstColumn="0" w:lastColumn="0" w:oddVBand="0" w:evenVBand="0" w:oddHBand="0" w:evenHBand="0" w:firstRowFirstColumn="0" w:firstRowLastColumn="0" w:lastRowFirstColumn="0" w:lastRowLastColumn="0"/>
             </w:pPr>
             <w:r>
-              <w:t xml:space="preserve">Startup and </w:t>
-            </w:r>
-            <w:r>
-              <w:t>t</w:t>
-            </w:r>
-            <w:r>
-              <w:t>itle</w:t>
-            </w:r>
-            <w:r>
-              <w:t xml:space="preserve"> experiences</w:t>
+              <w:t>Startup and title experiences</w:t>
             </w:r>
           </w:p>
         </w:tc>
@@ -32704,7 +33376,13 @@
               <w:cnfStyle w:val="000000000000" w:firstRow="0" w:lastRow="0" w:firstColumn="0" w:lastColumn="0" w:oddVBand="0" w:evenVBand="0" w:oddHBand="0" w:evenHBand="0" w:firstRowFirstColumn="0" w:firstRowLastColumn="0" w:lastRowFirstColumn="0" w:lastRowLastColumn="0"/>
             </w:pPr>
             <w:r>
-              <w:t>2641</w:t>
+              <w:rPr>
+                <w:rFonts w:ascii="Aptos" w:hAnsi="Aptos"/>
+                <w:color w:val="000000"/>
+                <w:sz w:val="22"/>
+                <w:szCs w:val="22"/>
+              </w:rPr>
+              <w:t>2600</w:t>
             </w:r>
           </w:p>
         </w:tc>
@@ -32722,13 +33400,10 @@
           </w:tcPr>
           <w:p>
             <w:pPr>
-              <w:keepNext/>
-              <w:keepLines/>
-              <w:widowControl w:val="0"/>
               <w:jc w:val="center"/>
             </w:pPr>
             <w:r>
-              <w:t>60E2</w:t>
+              <w:t>60F4</w:t>
             </w:r>
           </w:p>
         </w:tc>
@@ -32763,13 +33438,7 @@
               <w:cnfStyle w:val="000000100000" w:firstRow="0" w:lastRow="0" w:firstColumn="0" w:lastColumn="0" w:oddVBand="0" w:evenVBand="0" w:oddHBand="1" w:evenHBand="0" w:firstRowFirstColumn="0" w:firstRowLastColumn="0" w:lastRowFirstColumn="0" w:lastRowLastColumn="0"/>
             </w:pPr>
             <w:r>
-              <w:t>3</w:t>
-            </w:r>
-            <w:r>
-              <w:t>2</w:t>
-            </w:r>
-            <w:r>
-              <w:t>05</w:t>
+              <w:t>3205</w:t>
             </w:r>
           </w:p>
         </w:tc>
@@ -32972,10 +33641,7 @@
               </w:rPr>
             </w:pPr>
             <w:r>
-              <w:t xml:space="preserve">DFS </w:t>
-            </w:r>
-            <w:r>
-              <w:t>page backup</w:t>
+              <w:t>DFS page backup</w:t>
             </w:r>
           </w:p>
         </w:tc>
@@ -33230,10 +33896,10 @@
         <w:t xml:space="preserve">only </w:t>
       </w:r>
       <w:r>
-        <w:t>25</w:t>
-      </w:r>
-      <w:r>
-        <w:t>5</w:t>
+        <w:t>2</w:t>
+      </w:r>
+      <w:r>
+        <w:t>37</w:t>
       </w:r>
       <w:r>
         <w:t xml:space="preserve"> bytes of unused memory, between </w:t>
@@ -33484,7 +34150,10 @@
               <w:jc w:val="center"/>
             </w:pPr>
             <w:r>
-              <w:t>3130</w:t>
+              <w:t>3</w:t>
+            </w:r>
+            <w:r>
+              <w:t>140</w:t>
             </w:r>
           </w:p>
         </w:tc>
@@ -33500,7 +34169,10 @@
               <w:cnfStyle w:val="000000100000" w:firstRow="0" w:lastRow="0" w:firstColumn="0" w:lastColumn="0" w:oddVBand="0" w:evenVBand="0" w:oddHBand="1" w:evenHBand="0" w:firstRowFirstColumn="0" w:firstRowLastColumn="0" w:lastRowFirstColumn="0" w:lastRowLastColumn="0"/>
             </w:pPr>
             <w:r>
-              <w:t>Level palette</w:t>
+              <w:t>Level tiles</w:t>
+            </w:r>
+            <w:r>
+              <w:t xml:space="preserve"> (27)</w:t>
             </w:r>
           </w:p>
         </w:tc>
@@ -33517,7 +34189,7 @@
               <w:cnfStyle w:val="000000100000" w:firstRow="0" w:lastRow="0" w:firstColumn="0" w:lastColumn="0" w:oddVBand="0" w:evenVBand="0" w:oddHBand="1" w:evenHBand="0" w:firstRowFirstColumn="0" w:firstRowLastColumn="0" w:lastRowFirstColumn="0" w:lastRowLastColumn="0"/>
             </w:pPr>
             <w:r>
-              <w:t>16</w:t>
+              <w:t>1728</w:t>
             </w:r>
           </w:p>
         </w:tc>
@@ -33539,10 +34211,7 @@
               <w:jc w:val="center"/>
             </w:pPr>
             <w:r>
-              <w:t>3</w:t>
-            </w:r>
-            <w:r>
-              <w:t>140</w:t>
+              <w:t>3800</w:t>
             </w:r>
           </w:p>
         </w:tc>
@@ -33558,10 +34227,7 @@
               <w:cnfStyle w:val="000000000000" w:firstRow="0" w:lastRow="0" w:firstColumn="0" w:lastColumn="0" w:oddVBand="0" w:evenVBand="0" w:oddHBand="0" w:evenHBand="0" w:firstRowFirstColumn="0" w:firstRowLastColumn="0" w:lastRowFirstColumn="0" w:lastRowLastColumn="0"/>
             </w:pPr>
             <w:r>
-              <w:t>Level tiles</w:t>
-            </w:r>
-            <w:r>
-              <w:t xml:space="preserve"> (27)</w:t>
+              <w:t>Level tile grid</w:t>
             </w:r>
           </w:p>
         </w:tc>
@@ -33578,7 +34244,7 @@
               <w:cnfStyle w:val="000000000000" w:firstRow="0" w:lastRow="0" w:firstColumn="0" w:lastColumn="0" w:oddVBand="0" w:evenVBand="0" w:oddHBand="0" w:evenHBand="0" w:firstRowFirstColumn="0" w:firstRowLastColumn="0" w:lastRowFirstColumn="0" w:lastRowLastColumn="0"/>
             </w:pPr>
             <w:r>
-              <w:t>1728</w:t>
+              <w:t>2048</w:t>
             </w:r>
           </w:p>
         </w:tc>
@@ -33592,6 +34258,7 @@
           <w:tcPr>
             <w:cnfStyle w:val="001000000000" w:firstRow="0" w:lastRow="0" w:firstColumn="1" w:lastColumn="0" w:oddVBand="0" w:evenVBand="0" w:oddHBand="0" w:evenHBand="0" w:firstRowFirstColumn="0" w:firstRowLastColumn="0" w:lastRowFirstColumn="0" w:lastRowLastColumn="0"/>
             <w:tcW w:w="1345" w:type="dxa"/>
+            <w:shd w:val="clear" w:color="auto" w:fill="E8E8E8" w:themeFill="background2"/>
           </w:tcPr>
           <w:p>
             <w:pPr>
@@ -33601,13 +34268,14 @@
               <w:jc w:val="center"/>
             </w:pPr>
             <w:r>
-              <w:t>3800</w:t>
+              <w:t>4000</w:t>
             </w:r>
           </w:p>
         </w:tc>
         <w:tc>
           <w:tcPr>
             <w:tcW w:w="6570" w:type="dxa"/>
+            <w:shd w:val="clear" w:color="auto" w:fill="E8E8E8" w:themeFill="background2"/>
           </w:tcPr>
           <w:p>
             <w:pPr>
@@ -33617,13 +34285,14 @@
               <w:cnfStyle w:val="000000100000" w:firstRow="0" w:lastRow="0" w:firstColumn="0" w:lastColumn="0" w:oddVBand="0" w:evenVBand="0" w:oddHBand="1" w:evenHBand="0" w:firstRowFirstColumn="0" w:firstRowLastColumn="0" w:lastRowFirstColumn="0" w:lastRowLastColumn="0"/>
             </w:pPr>
             <w:r>
-              <w:t>Level tile grid</w:t>
+              <w:t>Level extents</w:t>
             </w:r>
           </w:p>
         </w:tc>
         <w:tc>
           <w:tcPr>
             <w:tcW w:w="1260" w:type="dxa"/>
+            <w:shd w:val="clear" w:color="auto" w:fill="E8E8E8" w:themeFill="background2"/>
           </w:tcPr>
           <w:p>
             <w:pPr>
@@ -33634,7 +34303,7 @@
               <w:cnfStyle w:val="000000100000" w:firstRow="0" w:lastRow="0" w:firstColumn="0" w:lastColumn="0" w:oddVBand="0" w:evenVBand="0" w:oddHBand="1" w:evenHBand="0" w:firstRowFirstColumn="0" w:firstRowLastColumn="0" w:lastRowFirstColumn="0" w:lastRowLastColumn="0"/>
             </w:pPr>
             <w:r>
-              <w:t>2048</w:t>
+              <w:t>2</w:t>
             </w:r>
           </w:p>
         </w:tc>
@@ -33657,7 +34326,7 @@
               <w:jc w:val="center"/>
             </w:pPr>
             <w:r>
-              <w:t>4000</w:t>
+              <w:t>4002</w:t>
             </w:r>
           </w:p>
         </w:tc>
@@ -33674,7 +34343,7 @@
               <w:cnfStyle w:val="000000000000" w:firstRow="0" w:lastRow="0" w:firstColumn="0" w:lastColumn="0" w:oddVBand="0" w:evenVBand="0" w:oddHBand="0" w:evenHBand="0" w:firstRowFirstColumn="0" w:firstRowLastColumn="0" w:lastRowFirstColumn="0" w:lastRowLastColumn="0"/>
             </w:pPr>
             <w:r>
-              <w:t>Level extents</w:t>
+              <w:t>Level tile types</w:t>
             </w:r>
           </w:p>
         </w:tc>
@@ -33692,7 +34361,7 @@
               <w:cnfStyle w:val="000000000000" w:firstRow="0" w:lastRow="0" w:firstColumn="0" w:lastColumn="0" w:oddVBand="0" w:evenVBand="0" w:oddHBand="0" w:evenHBand="0" w:firstRowFirstColumn="0" w:firstRowLastColumn="0" w:lastRowFirstColumn="0" w:lastRowLastColumn="0"/>
             </w:pPr>
             <w:r>
-              <w:t>2</w:t>
+              <w:t>28</w:t>
             </w:r>
           </w:p>
         </w:tc>
@@ -33716,7 +34385,7 @@
               <w:jc w:val="center"/>
             </w:pPr>
             <w:r>
-              <w:t>4002</w:t>
+              <w:t>401E</w:t>
             </w:r>
           </w:p>
         </w:tc>
@@ -33733,7 +34402,7 @@
               <w:cnfStyle w:val="000000100000" w:firstRow="0" w:lastRow="0" w:firstColumn="0" w:lastColumn="0" w:oddVBand="0" w:evenVBand="0" w:oddHBand="1" w:evenHBand="0" w:firstRowFirstColumn="0" w:firstRowLastColumn="0" w:lastRowFirstColumn="0" w:lastRowLastColumn="0"/>
             </w:pPr>
             <w:r>
-              <w:t>Level tile types</w:t>
+              <w:t>Level palette</w:t>
             </w:r>
           </w:p>
         </w:tc>
@@ -33751,7 +34420,7 @@
               <w:cnfStyle w:val="000000100000" w:firstRow="0" w:lastRow="0" w:firstColumn="0" w:lastColumn="0" w:oddVBand="0" w:evenVBand="0" w:oddHBand="1" w:evenHBand="0" w:firstRowFirstColumn="0" w:firstRowLastColumn="0" w:lastRowFirstColumn="0" w:lastRowLastColumn="0"/>
             </w:pPr>
             <w:r>
-              <w:t>28</w:t>
+              <w:t>16</w:t>
             </w:r>
           </w:p>
         </w:tc>
@@ -33774,7 +34443,7 @@
               <w:jc w:val="center"/>
             </w:pPr>
             <w:r>
-              <w:t>401E</w:t>
+              <w:t>402E</w:t>
             </w:r>
           </w:p>
         </w:tc>
@@ -33833,7 +34502,7 @@
               <w:jc w:val="center"/>
             </w:pPr>
             <w:r>
-              <w:t>4023</w:t>
+              <w:t>4033</w:t>
             </w:r>
           </w:p>
         </w:tc>
@@ -33891,7 +34560,13 @@
               <w:jc w:val="center"/>
             </w:pPr>
             <w:r>
-              <w:t>40E3</w:t>
+              <w:t>40</w:t>
+            </w:r>
+            <w:r>
+              <w:t>F</w:t>
+            </w:r>
+            <w:r>
+              <w:t>3</w:t>
             </w:r>
           </w:p>
         </w:tc>
@@ -33950,7 +34625,13 @@
               <w:jc w:val="center"/>
             </w:pPr>
             <w:r>
-              <w:t>4113</w:t>
+              <w:t>41</w:t>
+            </w:r>
+            <w:r>
+              <w:t>2</w:t>
+            </w:r>
+            <w:r>
+              <w:t>3</w:t>
             </w:r>
           </w:p>
         </w:tc>
@@ -34008,7 +34689,13 @@
               <w:jc w:val="center"/>
             </w:pPr>
             <w:r>
-              <w:t>4F93</w:t>
+              <w:t>4F</w:t>
+            </w:r>
+            <w:r>
+              <w:t>A</w:t>
+            </w:r>
+            <w:r>
+              <w:t>3</w:t>
             </w:r>
           </w:p>
         </w:tc>
@@ -34046,7 +34733,10 @@
               <w:cnfStyle w:val="000000000000" w:firstRow="0" w:lastRow="0" w:firstColumn="0" w:lastColumn="0" w:oddVBand="0" w:evenVBand="0" w:oddHBand="0" w:evenHBand="0" w:firstRowFirstColumn="0" w:firstRowLastColumn="0" w:lastRowFirstColumn="0" w:lastRowLastColumn="0"/>
             </w:pPr>
             <w:r>
-              <w:t>1714</w:t>
+              <w:t>17</w:t>
+            </w:r>
+            <w:r>
+              <w:t>57</w:t>
             </w:r>
           </w:p>
         </w:tc>
@@ -34070,7 +34760,10 @@
               <w:jc w:val="center"/>
             </w:pPr>
             <w:r>
-              <w:t>5645</w:t>
+              <w:t>56</w:t>
+            </w:r>
+            <w:r>
+              <w:t>80</w:t>
             </w:r>
           </w:p>
         </w:tc>
@@ -34132,7 +34825,10 @@
               <w:jc w:val="center"/>
             </w:pPr>
             <w:r>
-              <w:t>5691</w:t>
+              <w:t>56</w:t>
+            </w:r>
+            <w:r>
+              <w:t>CC</w:t>
             </w:r>
           </w:p>
         </w:tc>
@@ -34167,7 +34863,7 @@
               <w:cnfStyle w:val="000000000000" w:firstRow="0" w:lastRow="0" w:firstColumn="0" w:lastColumn="0" w:oddVBand="0" w:evenVBand="0" w:oddHBand="0" w:evenHBand="0" w:firstRowFirstColumn="0" w:firstRowLastColumn="0" w:lastRowFirstColumn="0" w:lastRowLastColumn="0"/>
             </w:pPr>
             <w:r>
-              <w:t>2055</w:t>
+              <w:t>2061</w:t>
             </w:r>
           </w:p>
         </w:tc>
@@ -34378,7 +35074,7 @@
         <w:t>1</w:t>
       </w:r>
       <w:r>
-        <w:t>3</w:t>
+        <w:t>4</w:t>
       </w:r>
       <w:r>
         <w:t>0, populating the memory space depicted by the white, gray, and light blue rows</w:t>
@@ -34684,7 +35380,7 @@
               <w:jc w:val="center"/>
             </w:pPr>
             <w:r>
-              <w:t>5645</w:t>
+              <w:t>5680</w:t>
             </w:r>
           </w:p>
         </w:tc>
@@ -34742,7 +35438,7 @@
               <w:jc w:val="center"/>
             </w:pPr>
             <w:r>
-              <w:t>5691</w:t>
+              <w:t>56CC</w:t>
             </w:r>
           </w:p>
         </w:tc>
@@ -34777,7 +35473,10 @@
               <w:cnfStyle w:val="000000100000" w:firstRow="0" w:lastRow="0" w:firstColumn="0" w:lastColumn="0" w:oddVBand="0" w:evenVBand="0" w:oddHBand="1" w:evenHBand="0" w:firstRowFirstColumn="0" w:firstRowLastColumn="0" w:lastRowFirstColumn="0" w:lastRowLastColumn="0"/>
             </w:pPr>
             <w:r>
-              <w:t>2041</w:t>
+              <w:t>204</w:t>
+            </w:r>
+            <w:r>
+              <w:t>7</w:t>
             </w:r>
           </w:p>
         </w:tc>
@@ -34797,7 +35496,7 @@
               <w:jc w:val="center"/>
             </w:pPr>
             <w:r>
-              <w:t>60E2</w:t>
+              <w:t>60F4</w:t>
             </w:r>
           </w:p>
         </w:tc>
@@ -35037,7 +35736,7 @@
         <w:t xml:space="preserve"> is loaded at address &amp;</w:t>
       </w:r>
       <w:r>
-        <w:t>5645</w:t>
+        <w:t>5680</w:t>
       </w:r>
       <w:r>
         <w:t xml:space="preserve">, </w:t>
@@ -36845,7 +37544,7 @@
         </w:rPr>
         <w:t xml:space="preserve">Bruce Clark </w:t>
       </w:r>
-      <w:hyperlink r:id="rId40" w:history="1">
+      <w:hyperlink r:id="rId41" w:history="1">
         <w:r>
           <w:rPr>
             <w:i/>
@@ -38736,7 +39435,7 @@
                 <w:sz w:val="20"/>
                 <w:szCs w:val="20"/>
               </w:rPr>
-              <w:t>X</w:t>
+              <w:t xml:space="preserve"> X</w:t>
             </w:r>
           </w:p>
         </w:tc>
@@ -39338,7 +40037,14 @@
                 <w:sz w:val="20"/>
                 <w:szCs w:val="20"/>
               </w:rPr>
-              <w:t xml:space="preserve"> X</w:t>
+              <w:t xml:space="preserve"> </w:t>
+            </w:r>
+            <w:r>
+              <w:rPr>
+                <w:sz w:val="20"/>
+                <w:szCs w:val="20"/>
+              </w:rPr>
+              <w:t>X</w:t>
             </w:r>
           </w:p>
         </w:tc>
@@ -39359,7 +40065,7 @@
                 <w:sz w:val="20"/>
                 <w:szCs w:val="20"/>
               </w:rPr>
-              <w:t xml:space="preserve">X </w:t>
+              <w:t>X</w:t>
             </w:r>
           </w:p>
         </w:tc>
@@ -39845,13 +40551,6 @@
                 <w:szCs w:val="20"/>
               </w:rPr>
             </w:pPr>
-            <w:r>
-              <w:rPr>
-                <w:sz w:val="20"/>
-                <w:szCs w:val="20"/>
-              </w:rPr>
-              <w:t>X</w:t>
-            </w:r>
           </w:p>
         </w:tc>
         <w:tc>
@@ -41298,7 +41997,7 @@
                 <w:sz w:val="20"/>
                 <w:szCs w:val="20"/>
               </w:rPr>
-              <w:t xml:space="preserve"> X</w:t>
+              <w:t>X</w:t>
             </w:r>
           </w:p>
         </w:tc>
@@ -42048,8 +42747,9 @@
                 <w:sz w:val="20"/>
                 <w:szCs w:val="20"/>
               </w:rPr>
-              <w:t>no sideways RAM</w:t>
-            </w:r>
+              <w:t xml:space="preserve">no sideways </w:t>
+            </w:r>
+            <w:proofErr w:type="gramStart"/>
             <w:r>
               <w:rPr>
                 <w:b/>
@@ -42057,8 +42757,27 @@
                 <w:sz w:val="20"/>
                 <w:szCs w:val="20"/>
               </w:rPr>
+              <w:t>RAM</w:t>
+            </w:r>
+            <w:r>
+              <w:rPr>
+                <w:b/>
+                <w:bCs/>
+                <w:sz w:val="20"/>
+                <w:szCs w:val="20"/>
+              </w:rPr>
               <w:t>)</w:t>
             </w:r>
+            <w:r>
+              <w:rPr>
+                <w:b/>
+                <w:bCs/>
+                <w:sz w:val="20"/>
+                <w:szCs w:val="20"/>
+              </w:rPr>
+              <w:t>S</w:t>
+            </w:r>
+            <w:proofErr w:type="gramEnd"/>
           </w:p>
         </w:tc>
       </w:tr>
@@ -42097,23 +42816,7 @@
                 <w:sz w:val="20"/>
                 <w:szCs w:val="20"/>
               </w:rPr>
-              <w:t xml:space="preserve"> </w:t>
-            </w:r>
-            <w:proofErr w:type="spellStart"/>
-            <w:r>
-              <w:rPr>
-                <w:sz w:val="20"/>
-                <w:szCs w:val="20"/>
-              </w:rPr>
-              <w:t>Enemy</w:t>
-            </w:r>
-            <w:proofErr w:type="spellEnd"/>
-            <w:r>
-              <w:rPr>
-                <w:sz w:val="20"/>
-                <w:szCs w:val="20"/>
-              </w:rPr>
-              <w:t xml:space="preserve"> pursuit sound</w:t>
+              <w:t xml:space="preserve"> Enemy pursuit sound</w:t>
             </w:r>
           </w:p>
         </w:tc>
@@ -43992,7 +44695,7 @@
       <w:r>
         <w:t xml:space="preserve"> set - </w:t>
       </w:r>
-      <w:hyperlink r:id="rId41" w:history="1">
+      <w:hyperlink r:id="rId42" w:history="1">
         <w:r>
           <w:rPr>
             <w:rStyle w:val="Hyperlink"/>
@@ -44015,7 +44718,7 @@
       <w:r>
         <w:t xml:space="preserve">utorials - </w:t>
       </w:r>
-      <w:hyperlink r:id="rId42" w:history="1">
+      <w:hyperlink r:id="rId43" w:history="1">
         <w:r>
           <w:rPr>
             <w:rStyle w:val="Hyperlink"/>
@@ -44032,7 +44735,7 @@
           <w:numId w:val="31"/>
         </w:numPr>
       </w:pPr>
-      <w:hyperlink r:id="rId43" w:history="1">
+      <w:hyperlink r:id="rId44" w:history="1">
         <w:r>
           <w:rPr>
             <w:rStyle w:val="Hyperlink"/>
@@ -44053,7 +44756,7 @@
         <w:lastRenderedPageBreak/>
         <w:t xml:space="preserve">Memory Map - </w:t>
       </w:r>
-      <w:hyperlink r:id="rId44" w:history="1">
+      <w:hyperlink r:id="rId45" w:history="1">
         <w:r>
           <w:rPr>
             <w:rStyle w:val="Hyperlink"/>
@@ -44087,7 +44790,7 @@
       <w:r>
         <w:t xml:space="preserve"> </w:t>
       </w:r>
-      <w:hyperlink r:id="rId45" w:history="1">
+      <w:hyperlink r:id="rId46" w:history="1">
         <w:r>
           <w:rPr>
             <w:rStyle w:val="Hyperlink"/>
@@ -44121,7 +44824,7 @@
       <w:r>
         <w:t xml:space="preserve">(Mark Moxon) - </w:t>
       </w:r>
-      <w:hyperlink r:id="rId46" w:history="1">
+      <w:hyperlink r:id="rId47" w:history="1">
         <w:r>
           <w:rPr>
             <w:rStyle w:val="Hyperlink"/>
@@ -44131,9 +44834,9 @@
       </w:hyperlink>
     </w:p>
     <w:sectPr>
-      <w:footerReference w:type="default" r:id="rId47"/>
-      <w:headerReference w:type="first" r:id="rId48"/>
-      <w:footerReference w:type="first" r:id="rId49"/>
+      <w:footerReference w:type="default" r:id="rId48"/>
+      <w:headerReference w:type="first" r:id="rId49"/>
+      <w:footerReference w:type="first" r:id="rId50"/>
       <w:pgSz w:w="12240" w:h="15840"/>
       <w:pgMar w:top="720" w:right="720" w:bottom="720" w:left="720" w:header="288" w:footer="288" w:gutter="0"/>
       <w:cols w:space="720"/>
@@ -44485,28 +45188,28 @@
         <v:path o:extrusionok="f" gradientshapeok="t" o:connecttype="rect"/>
         <o:lock v:ext="edit" aspectratio="t"/>
       </v:shapetype>
-      <v:shape id="_x0000_i1126" type="#_x0000_t75" style="width:30pt;height:22.65pt;visibility:visible;mso-wrap-style:square" o:bullet="t">
+      <v:shape id="_x0000_i1446" type="#_x0000_t75" style="width:30pt;height:22.65pt;visibility:visible;mso-wrap-style:square" o:bullet="t">
         <v:imagedata r:id="rId1" o:title=""/>
       </v:shape>
     </w:pict>
   </w:numPicBullet>
   <w:numPicBullet w:numPicBulletId="1">
     <w:pict>
-      <v:shape id="_x0000_i1127" type="#_x0000_t75" style="width:30pt;height:22.65pt;visibility:visible;mso-wrap-style:square" o:bullet="t">
+      <v:shape id="_x0000_i1447" type="#_x0000_t75" style="width:30pt;height:22.65pt;visibility:visible;mso-wrap-style:square" o:bullet="t">
         <v:imagedata r:id="rId2" o:title=""/>
       </v:shape>
     </w:pict>
   </w:numPicBullet>
   <w:numPicBullet w:numPicBulletId="2">
     <w:pict>
-      <v:shape id="_x0000_i1128" type="#_x0000_t75" style="width:30pt;height:22.65pt;visibility:visible;mso-wrap-style:square" o:bullet="t">
+      <v:shape id="_x0000_i1448" type="#_x0000_t75" style="width:30pt;height:22.65pt;visibility:visible;mso-wrap-style:square" o:bullet="t">
         <v:imagedata r:id="rId3" o:title=""/>
       </v:shape>
     </w:pict>
   </w:numPicBullet>
   <w:numPicBullet w:numPicBulletId="3">
     <w:pict>
-      <v:shape id="_x0000_i1129" type="#_x0000_t75" style="width:28.65pt;height:21.65pt;visibility:visible;mso-wrap-style:square" o:bullet="t">
+      <v:shape id="_x0000_i1449" type="#_x0000_t75" style="width:28.65pt;height:21.65pt;visibility:visible;mso-wrap-style:square" o:bullet="t">
         <v:imagedata r:id="rId4" o:title=""/>
       </v:shape>
     </w:pict>
@@ -49035,7 +49738,6 @@
   <w:style w:type="character" w:default="1" w:styleId="DefaultParagraphFont">
     <w:name w:val="Default Paragraph Font"/>
     <w:uiPriority w:val="1"/>
-    <w:semiHidden/>
     <w:unhideWhenUsed/>
   </w:style>
   <w:style w:type="table" w:default="1" w:styleId="TableNormal">

</xml_diff>

<commit_message>
Changes:  - Improved teleport sound effect, adding new white noise sound effect.  - Removed transition callback which was not needed.  - Optimized drawObject, removing routine call in outer-loop  - Fixed clipping regression in drawObject  - Various code size optimizations  - Update documentation
</commit_message>
<xml_diff>
--- a/docs/Development.docx
+++ b/docs/Development.docx
@@ -2125,6 +2125,7 @@
       <w:r>
         <w:t xml:space="preserve"> and </w:t>
       </w:r>
+      <w:proofErr w:type="spellStart"/>
       <w:r>
         <w:rPr>
           <w:b/>
@@ -2143,6 +2144,7 @@
         </w:rPr>
         <w:t>Animate</w:t>
       </w:r>
+      <w:proofErr w:type="spellEnd"/>
       <w:r>
         <w:t xml:space="preserve"> </w:t>
       </w:r>
@@ -4274,6 +4276,7 @@
           <w:bCs/>
         </w:rPr>
       </w:pPr>
+      <w:proofErr w:type="spellStart"/>
       <w:r>
         <w:rPr>
           <w:b/>
@@ -4281,6 +4284,7 @@
         </w:rPr>
         <w:t>objectXLo</w:t>
       </w:r>
+      <w:proofErr w:type="spellEnd"/>
       <w:r>
         <w:rPr>
           <w:b/>
@@ -4288,6 +4292,7 @@
         </w:rPr>
         <w:t xml:space="preserve"> &amp; </w:t>
       </w:r>
+      <w:proofErr w:type="spellStart"/>
       <w:r>
         <w:rPr>
           <w:b/>
@@ -4295,6 +4300,7 @@
         </w:rPr>
         <w:t>objectXHi</w:t>
       </w:r>
+      <w:proofErr w:type="spellEnd"/>
       <w:r>
         <w:rPr>
           <w:b/>
@@ -4327,27 +4333,38 @@
           <w:bCs/>
         </w:rPr>
       </w:pPr>
+      <w:proofErr w:type="spellStart"/>
       <w:r>
         <w:rPr>
           <w:b/>
           <w:bCs/>
         </w:rPr>
-        <w:t xml:space="preserve">objectYLo </w:t>
-      </w:r>
+        <w:t>objectYLo</w:t>
+      </w:r>
+      <w:proofErr w:type="spellEnd"/>
       <w:r>
         <w:rPr>
           <w:b/>
           <w:bCs/>
         </w:rPr>
-        <w:t xml:space="preserve">&amp; </w:t>
+        <w:t xml:space="preserve"> </w:t>
       </w:r>
       <w:r>
         <w:rPr>
           <w:b/>
           <w:bCs/>
         </w:rPr>
+        <w:t xml:space="preserve">&amp; </w:t>
+      </w:r>
+      <w:proofErr w:type="spellStart"/>
+      <w:r>
+        <w:rPr>
+          <w:b/>
+          <w:bCs/>
+        </w:rPr>
         <w:t>objectYHi</w:t>
       </w:r>
+      <w:proofErr w:type="spellEnd"/>
       <w:r>
         <w:rPr>
           <w:b/>
@@ -4383,13 +4400,31 @@
           <w:bCs/>
         </w:rPr>
       </w:pPr>
+      <w:proofErr w:type="spellStart"/>
       <w:r>
         <w:rPr>
           <w:b/>
           <w:bCs/>
         </w:rPr>
-        <w:t>objectWidth &amp; objectHeight</w:t>
-      </w:r>
+        <w:t>objectWidth</w:t>
+      </w:r>
+      <w:proofErr w:type="spellEnd"/>
+      <w:r>
+        <w:rPr>
+          <w:b/>
+          <w:bCs/>
+        </w:rPr>
+        <w:t xml:space="preserve"> &amp; </w:t>
+      </w:r>
+      <w:proofErr w:type="spellStart"/>
+      <w:r>
+        <w:rPr>
+          <w:b/>
+          <w:bCs/>
+        </w:rPr>
+        <w:t>objectHeight</w:t>
+      </w:r>
+      <w:proofErr w:type="spellEnd"/>
       <w:r>
         <w:rPr>
           <w:b/>
@@ -4416,6 +4451,7 @@
           <w:bCs/>
         </w:rPr>
       </w:pPr>
+      <w:proofErr w:type="spellStart"/>
       <w:r>
         <w:rPr>
           <w:b/>
@@ -4423,6 +4459,7 @@
         </w:rPr>
         <w:t>objectAnimation</w:t>
       </w:r>
+      <w:proofErr w:type="spellEnd"/>
       <w:r>
         <w:rPr>
           <w:b/>
@@ -4455,6 +4492,7 @@
           <w:bCs/>
         </w:rPr>
       </w:pPr>
+      <w:proofErr w:type="spellStart"/>
       <w:r>
         <w:rPr>
           <w:b/>
@@ -4462,6 +4500,7 @@
         </w:rPr>
         <w:t>objectState</w:t>
       </w:r>
+      <w:proofErr w:type="spellEnd"/>
       <w:r>
         <w:rPr>
           <w:b/>
@@ -4559,6 +4598,7 @@
           <w:bCs/>
         </w:rPr>
       </w:pPr>
+      <w:proofErr w:type="spellStart"/>
       <w:r>
         <w:rPr>
           <w:b/>
@@ -4566,6 +4606,7 @@
         </w:rPr>
         <w:t>objectSpriteIndex</w:t>
       </w:r>
+      <w:proofErr w:type="spellEnd"/>
       <w:r>
         <w:rPr>
           <w:b/>
@@ -4600,13 +4641,31 @@
           <w:numId w:val="8"/>
         </w:numPr>
       </w:pPr>
+      <w:proofErr w:type="spellStart"/>
       <w:r>
         <w:rPr>
           <w:b/>
           <w:bCs/>
         </w:rPr>
-        <w:t>objectFrameCallbackLo &amp; objectFrameCallbackHi</w:t>
-      </w:r>
+        <w:t>objectFrameCallbackLo</w:t>
+      </w:r>
+      <w:proofErr w:type="spellEnd"/>
+      <w:r>
+        <w:rPr>
+          <w:b/>
+          <w:bCs/>
+        </w:rPr>
+        <w:t xml:space="preserve"> &amp; </w:t>
+      </w:r>
+      <w:proofErr w:type="spellStart"/>
+      <w:r>
+        <w:rPr>
+          <w:b/>
+          <w:bCs/>
+        </w:rPr>
+        <w:t>objectFrameCallbackHi</w:t>
+      </w:r>
+      <w:proofErr w:type="spellEnd"/>
       <w:r>
         <w:rPr>
           <w:b/>
@@ -4654,6 +4713,7 @@
           <w:bCs/>
         </w:rPr>
       </w:pPr>
+      <w:proofErr w:type="spellStart"/>
       <w:r>
         <w:rPr>
           <w:b/>
@@ -4661,6 +4721,7 @@
         </w:rPr>
         <w:t>objectFrameCounter</w:t>
       </w:r>
+      <w:proofErr w:type="spellEnd"/>
       <w:r>
         <w:rPr>
           <w:b/>
@@ -6262,6 +6323,7 @@
       <w:r>
         <w:t xml:space="preserve">setting </w:t>
       </w:r>
+      <w:proofErr w:type="spellStart"/>
       <w:r>
         <w:rPr>
           <w:i/>
@@ -6283,6 +6345,7 @@
         </w:rPr>
         <w:t>Addr</w:t>
       </w:r>
+      <w:proofErr w:type="spellEnd"/>
       <w:r>
         <w:t xml:space="preserve"> </w:t>
       </w:r>
@@ -6397,6 +6460,7 @@
       <w:r>
         <w:t xml:space="preserve">low nibble of </w:t>
       </w:r>
+      <w:proofErr w:type="spellStart"/>
       <w:r>
         <w:rPr>
           <w:i/>
@@ -6404,6 +6468,7 @@
         </w:rPr>
         <w:t>objectState</w:t>
       </w:r>
+      <w:proofErr w:type="spellEnd"/>
       <w:r>
         <w:t>.</w:t>
       </w:r>
@@ -6675,6 +6740,7 @@
       <w:r>
         <w:t xml:space="preserve"> </w:t>
       </w:r>
+      <w:proofErr w:type="spellStart"/>
       <w:r>
         <w:rPr>
           <w:i/>
@@ -6682,6 +6748,7 @@
         </w:rPr>
         <w:t>clearTile</w:t>
       </w:r>
+      <w:proofErr w:type="spellEnd"/>
       <w:r>
         <w:t xml:space="preserve"> </w:t>
       </w:r>
@@ -6696,6 +6763,7 @@
       <w:r>
         <w:t xml:space="preserve">The </w:t>
       </w:r>
+      <w:proofErr w:type="spellStart"/>
       <w:r>
         <w:rPr>
           <w:i/>
@@ -6703,6 +6771,7 @@
         </w:rPr>
         <w:t>clearTile</w:t>
       </w:r>
+      <w:proofErr w:type="spellEnd"/>
       <w:r>
         <w:t xml:space="preserve"> </w:t>
       </w:r>
@@ -7472,7 +7541,15 @@
         <w:t xml:space="preserve">.  </w:t>
       </w:r>
       <w:r>
-        <w:t>The objectFrameCount is repurposed for this.</w:t>
+        <w:t xml:space="preserve">The </w:t>
+      </w:r>
+      <w:proofErr w:type="spellStart"/>
+      <w:r>
+        <w:t>objectFrameCount</w:t>
+      </w:r>
+      <w:proofErr w:type="spellEnd"/>
+      <w:r>
+        <w:t xml:space="preserve"> is repurposed for this.</w:t>
       </w:r>
     </w:p>
     <w:p>
@@ -7485,7 +7562,15 @@
       </w:pPr>
       <w:r>
         <w:lastRenderedPageBreak/>
-        <w:t xml:space="preserve">Mark K9 and the elevator game objects as both ascending or descending by populating their respective objectState’s </w:t>
+        <w:t xml:space="preserve">Mark K9 and the elevator game objects as both ascending or descending by populating their respective </w:t>
+      </w:r>
+      <w:proofErr w:type="spellStart"/>
+      <w:r>
+        <w:t>objectState’s</w:t>
+      </w:r>
+      <w:proofErr w:type="spellEnd"/>
+      <w:r>
+        <w:t xml:space="preserve"> </w:t>
       </w:r>
       <w:r>
         <w:rPr>
@@ -7904,6 +7989,7 @@
       <w:r>
         <w:t xml:space="preserve">stored in </w:t>
       </w:r>
+      <w:proofErr w:type="spellStart"/>
       <w:r>
         <w:rPr>
           <w:i/>
@@ -7912,6 +7998,7 @@
         </w:rPr>
         <w:t>objectFrameCounter</w:t>
       </w:r>
+      <w:proofErr w:type="spellEnd"/>
       <w:r>
         <w:t xml:space="preserve"> variable</w:t>
       </w:r>
@@ -8124,6 +8211,7 @@
       <w:r>
         <w:t xml:space="preserve">checking the erase-above and erase-below </w:t>
       </w:r>
+      <w:proofErr w:type="spellStart"/>
       <w:r>
         <w:rPr>
           <w:i/>
@@ -8138,6 +8226,7 @@
         </w:rPr>
         <w:t>’s</w:t>
       </w:r>
+      <w:proofErr w:type="spellEnd"/>
       <w:r>
         <w:t xml:space="preserve"> render flags</w:t>
       </w:r>
@@ -9023,6 +9112,7 @@
         <w:lastRenderedPageBreak/>
         <w:t xml:space="preserve">A zero-page </w:t>
       </w:r>
+      <w:proofErr w:type="spellStart"/>
       <w:r>
         <w:rPr>
           <w:i/>
@@ -9030,6 +9120,7 @@
         </w:rPr>
         <w:t>laserFrameCount</w:t>
       </w:r>
+      <w:proofErr w:type="spellEnd"/>
       <w:r>
         <w:t xml:space="preserve"> variable was introduced which controls laser rendering</w:t>
       </w:r>
@@ -9066,6 +9157,7 @@
       <w:r>
         <w:t xml:space="preserve">sets </w:t>
       </w:r>
+      <w:proofErr w:type="spellStart"/>
       <w:r>
         <w:rPr>
           <w:i/>
@@ -9073,6 +9165,7 @@
         </w:rPr>
         <w:t>laserFrameCount</w:t>
       </w:r>
+      <w:proofErr w:type="spellEnd"/>
       <w:r>
         <w:rPr>
           <w:i/>
@@ -9089,6 +9182,7 @@
       <w:r>
         <w:t xml:space="preserve">and </w:t>
       </w:r>
+      <w:proofErr w:type="spellStart"/>
       <w:r>
         <w:rPr>
           <w:i/>
@@ -9096,6 +9190,7 @@
         </w:rPr>
         <w:t>laserFrameCount</w:t>
       </w:r>
+      <w:proofErr w:type="spellEnd"/>
       <w:r>
         <w:rPr>
           <w:i/>
@@ -9146,6 +9241,7 @@
       <w:r>
         <w:t xml:space="preserve">the </w:t>
       </w:r>
+      <w:proofErr w:type="spellStart"/>
       <w:r>
         <w:rPr>
           <w:i/>
@@ -9153,6 +9249,7 @@
         </w:rPr>
         <w:t>objectState</w:t>
       </w:r>
+      <w:proofErr w:type="spellEnd"/>
       <w:r>
         <w:t xml:space="preserve"> variable</w:t>
       </w:r>
@@ -9268,6 +9365,7 @@
       <w:r>
         <w:t xml:space="preserve">This is the fourth render flag in the high nibble of the </w:t>
       </w:r>
+      <w:proofErr w:type="spellStart"/>
       <w:r>
         <w:rPr>
           <w:i/>
@@ -9275,6 +9373,7 @@
         </w:rPr>
         <w:t>objectState</w:t>
       </w:r>
+      <w:proofErr w:type="spellEnd"/>
       <w:r>
         <w:t xml:space="preserve"> variable</w:t>
       </w:r>
@@ -9421,6 +9520,7 @@
       <w:r>
         <w:t xml:space="preserve"> </w:t>
       </w:r>
+      <w:proofErr w:type="spellStart"/>
       <w:r>
         <w:rPr>
           <w:i/>
@@ -9428,6 +9528,7 @@
         </w:rPr>
         <w:t>debugTileGridFlags</w:t>
       </w:r>
+      <w:proofErr w:type="spellEnd"/>
       <w:r>
         <w:t xml:space="preserve"> routine that rendered a little box </w:t>
       </w:r>
@@ -9520,6 +9621,7 @@
       <w:r>
         <w:t xml:space="preserve">to allow </w:t>
       </w:r>
+      <w:proofErr w:type="spellStart"/>
       <w:r>
         <w:rPr>
           <w:i/>
@@ -9527,6 +9629,7 @@
         </w:rPr>
         <w:t>debugTileGridFlags</w:t>
       </w:r>
+      <w:proofErr w:type="spellEnd"/>
       <w:r>
         <w:rPr>
           <w:i/>
@@ -11497,6 +11600,7 @@
       <w:r>
         <w:t xml:space="preserve">replaced </w:t>
       </w:r>
+      <w:proofErr w:type="spellStart"/>
       <w:r>
         <w:rPr>
           <w:i/>
@@ -11504,9 +11608,11 @@
         </w:rPr>
         <w:t>objectWidth</w:t>
       </w:r>
+      <w:proofErr w:type="spellEnd"/>
       <w:r>
         <w:t xml:space="preserve"> and </w:t>
       </w:r>
+      <w:proofErr w:type="spellStart"/>
       <w:r>
         <w:rPr>
           <w:i/>
@@ -11514,6 +11620,7 @@
         </w:rPr>
         <w:t>objectHeight</w:t>
       </w:r>
+      <w:proofErr w:type="spellEnd"/>
       <w:r>
         <w:t xml:space="preserve"> game object arrays with a function</w:t>
       </w:r>
@@ -11558,6 +11665,7 @@
       <w:r>
         <w:t xml:space="preserve">, and </w:t>
       </w:r>
+      <w:proofErr w:type="spellStart"/>
       <w:r>
         <w:rPr>
           <w:i/>
@@ -11565,9 +11673,11 @@
         </w:rPr>
         <w:t>widthMinusOne</w:t>
       </w:r>
+      <w:proofErr w:type="spellEnd"/>
       <w:r>
         <w:t xml:space="preserve"> and </w:t>
       </w:r>
+      <w:proofErr w:type="spellStart"/>
       <w:r>
         <w:rPr>
           <w:i/>
@@ -11589,6 +11699,7 @@
         </w:rPr>
         <w:t>sOne</w:t>
       </w:r>
+      <w:proofErr w:type="spellEnd"/>
       <w:r>
         <w:t xml:space="preserve">.  </w:t>
       </w:r>
@@ -11637,7 +11748,15 @@
         <w:t xml:space="preserve"> I </w:t>
       </w:r>
       <w:r>
-        <w:t xml:space="preserve">stored the object type in the objectAnimation game object array, </w:t>
+        <w:t xml:space="preserve">stored the object type in the </w:t>
+      </w:r>
+      <w:proofErr w:type="spellStart"/>
+      <w:r>
+        <w:t>objectAnimation</w:t>
+      </w:r>
+      <w:proofErr w:type="spellEnd"/>
+      <w:r>
+        <w:t xml:space="preserve"> game object array, </w:t>
       </w:r>
       <w:r>
         <w:t xml:space="preserve">shifting up the other values, and </w:t>
@@ -12458,6 +12577,7 @@
       <w:r>
         <w:t xml:space="preserve">I then wrote a </w:t>
       </w:r>
+      <w:proofErr w:type="spellStart"/>
       <w:r>
         <w:rPr>
           <w:i/>
@@ -12465,6 +12585,7 @@
         </w:rPr>
         <w:t>loadLevel</w:t>
       </w:r>
+      <w:proofErr w:type="spellEnd"/>
       <w:r>
         <w:t xml:space="preserve"> </w:t>
       </w:r>
@@ -12498,6 +12619,7 @@
       <w:r>
         <w:t xml:space="preserve">the loaded </w:t>
       </w:r>
+      <w:proofErr w:type="spellStart"/>
       <w:r>
         <w:rPr>
           <w:i/>
@@ -12505,6 +12627,7 @@
         </w:rPr>
         <w:t>initializeLevel</w:t>
       </w:r>
+      <w:proofErr w:type="spellEnd"/>
       <w:r>
         <w:t xml:space="preserve"> </w:t>
       </w:r>
@@ -12520,6 +12643,7 @@
       <w:r>
         <w:t xml:space="preserve">A </w:t>
       </w:r>
+      <w:proofErr w:type="spellStart"/>
       <w:r>
         <w:rPr>
           <w:i/>
@@ -12527,6 +12651,7 @@
         </w:rPr>
         <w:t>showLevel</w:t>
       </w:r>
+      <w:proofErr w:type="spellEnd"/>
       <w:r>
         <w:t xml:space="preserve"> routine </w:t>
       </w:r>
@@ -12804,6 +12929,7 @@
       <w:r>
         <w:t xml:space="preserve"> a level, and a ‘R’ key handler was implemented to call the </w:t>
       </w:r>
+      <w:proofErr w:type="spellStart"/>
       <w:r>
         <w:rPr>
           <w:i/>
@@ -12811,6 +12937,7 @@
         </w:rPr>
         <w:t>loadLevel</w:t>
       </w:r>
+      <w:proofErr w:type="spellEnd"/>
       <w:r>
         <w:t xml:space="preserve"> </w:t>
       </w:r>
@@ -12981,6 +13108,7 @@
       <w:r>
         <w:t xml:space="preserve">The </w:t>
       </w:r>
+      <w:proofErr w:type="spellStart"/>
       <w:r>
         <w:rPr>
           <w:i/>
@@ -12988,6 +13116,7 @@
         </w:rPr>
         <w:t>loadLevel</w:t>
       </w:r>
+      <w:proofErr w:type="spellEnd"/>
       <w:r>
         <w:t xml:space="preserve"> code was </w:t>
       </w:r>
@@ -13006,6 +13135,7 @@
       <w:r>
         <w:t xml:space="preserve">moved to </w:t>
       </w:r>
+      <w:proofErr w:type="spellStart"/>
       <w:r>
         <w:rPr>
           <w:i/>
@@ -13013,9 +13143,11 @@
         </w:rPr>
         <w:t>selectDFS</w:t>
       </w:r>
+      <w:proofErr w:type="spellEnd"/>
       <w:r>
         <w:t xml:space="preserve"> and </w:t>
       </w:r>
+      <w:proofErr w:type="spellStart"/>
       <w:r>
         <w:rPr>
           <w:i/>
@@ -13023,6 +13155,7 @@
         </w:rPr>
         <w:t>releaseDFS</w:t>
       </w:r>
+      <w:proofErr w:type="spellEnd"/>
       <w:r>
         <w:t xml:space="preserve"> </w:t>
       </w:r>
@@ -13444,6 +13577,7 @@
       <w:r>
         <w:t xml:space="preserve"> action became </w:t>
       </w:r>
+      <w:proofErr w:type="spellStart"/>
       <w:r>
         <w:rPr>
           <w:b/>
@@ -13453,9 +13587,11 @@
         </w:rPr>
         <w:t>PursueLeft</w:t>
       </w:r>
+      <w:proofErr w:type="spellEnd"/>
       <w:r>
         <w:t xml:space="preserve">, </w:t>
       </w:r>
+      <w:proofErr w:type="spellStart"/>
       <w:r>
         <w:rPr>
           <w:b/>
@@ -13465,9 +13601,11 @@
         </w:rPr>
         <w:t>PursueRight</w:t>
       </w:r>
+      <w:proofErr w:type="spellEnd"/>
       <w:r>
         <w:t xml:space="preserve">, </w:t>
       </w:r>
+      <w:proofErr w:type="spellStart"/>
       <w:r>
         <w:rPr>
           <w:b/>
@@ -13477,12 +13615,14 @@
         </w:rPr>
         <w:t>PursueUp</w:t>
       </w:r>
+      <w:proofErr w:type="spellEnd"/>
       <w:r>
         <w:t xml:space="preserve">, </w:t>
       </w:r>
       <w:r>
         <w:t xml:space="preserve">or </w:t>
       </w:r>
+      <w:proofErr w:type="spellStart"/>
       <w:r>
         <w:rPr>
           <w:b/>
@@ -13492,6 +13632,7 @@
         </w:rPr>
         <w:t>PursueDown</w:t>
       </w:r>
+      <w:proofErr w:type="spellEnd"/>
       <w:r>
         <w:t>.</w:t>
       </w:r>
@@ -13544,6 +13685,7 @@
         </w:rPr>
         <w:tab/>
       </w:r>
+      <w:proofErr w:type="spellStart"/>
       <w:r>
         <w:rPr>
           <w:b/>
@@ -13560,11 +13702,9 @@
           <w:i/>
           <w:iCs/>
         </w:rPr>
-        <w:t xml:space="preserve">Left </w:t>
-      </w:r>
-      <w:r>
-        <w:t>and</w:t>
-      </w:r>
+        <w:t>Left</w:t>
+      </w:r>
+      <w:proofErr w:type="spellEnd"/>
       <w:r>
         <w:rPr>
           <w:b/>
@@ -13572,7 +13712,10 @@
           <w:i/>
           <w:iCs/>
         </w:rPr>
-        <w:t xml:space="preserve"> PursueRight</w:t>
+        <w:t xml:space="preserve"> </w:t>
+      </w:r>
+      <w:r>
+        <w:t>and</w:t>
       </w:r>
       <w:r>
         <w:rPr>
@@ -13583,57 +13726,8 @@
         </w:rPr>
         <w:t xml:space="preserve"> </w:t>
       </w:r>
-      <w:r>
-        <w:t xml:space="preserve"> – </w:t>
-      </w:r>
-      <w:r>
-        <w:t xml:space="preserve">Daleks </w:t>
-      </w:r>
-      <w:r>
-        <w:t>move quickly left or right</w:t>
-      </w:r>
-      <w:r>
-        <w:t>, or vice versa</w:t>
-      </w:r>
-      <w:r>
-        <w:t xml:space="preserve">.  </w:t>
-      </w:r>
-      <w:r>
-        <w:t xml:space="preserve">If </w:t>
-      </w:r>
-      <w:r>
-        <w:t>a Dalek</w:t>
-      </w:r>
-      <w:r>
-        <w:t xml:space="preserve"> encounters a wall, the </w:t>
-      </w:r>
-      <w:r>
-        <w:t xml:space="preserve">Dalek </w:t>
-      </w:r>
-      <w:r>
-        <w:t>turns</w:t>
-      </w:r>
-      <w:r>
-        <w:t>,</w:t>
-      </w:r>
-      <w:r>
-        <w:t xml:space="preserve"> and the </w:t>
-      </w:r>
-      <w:r>
-        <w:t xml:space="preserve">action </w:t>
-      </w:r>
-      <w:r>
-        <w:t xml:space="preserve">is </w:t>
-      </w:r>
-      <w:r>
-        <w:t>change</w:t>
-      </w:r>
-      <w:r>
-        <w:t xml:space="preserve">d </w:t>
-      </w:r>
-      <w:r>
-        <w:t xml:space="preserve">to </w:t>
-      </w:r>
+      <w:proofErr w:type="spellStart"/>
+      <w:proofErr w:type="gramStart"/>
       <w:r>
         <w:rPr>
           <w:b/>
@@ -13641,11 +13735,9 @@
           <w:i/>
           <w:iCs/>
         </w:rPr>
-        <w:t>PursueUp</w:t>
-      </w:r>
-      <w:r>
-        <w:t xml:space="preserve"> or </w:t>
-      </w:r>
+        <w:t>PursueRight</w:t>
+      </w:r>
+      <w:proofErr w:type="spellEnd"/>
       <w:r>
         <w:rPr>
           <w:b/>
@@ -13653,16 +13745,64 @@
           <w:i/>
           <w:iCs/>
         </w:rPr>
-        <w:t>PursueDown</w:t>
-      </w:r>
-      <w:r>
-        <w:t>.</w:t>
-      </w:r>
-    </w:p>
-    <w:p>
-      <w:pPr>
-        <w:ind w:left="720"/>
-      </w:pPr>
+        <w:t xml:space="preserve"> </w:t>
+      </w:r>
+      <w:r>
+        <w:t xml:space="preserve"> –</w:t>
+      </w:r>
+      <w:proofErr w:type="gramEnd"/>
+      <w:r>
+        <w:t xml:space="preserve"> </w:t>
+      </w:r>
+      <w:r>
+        <w:t xml:space="preserve">Daleks </w:t>
+      </w:r>
+      <w:r>
+        <w:t>move quickly left or right</w:t>
+      </w:r>
+      <w:r>
+        <w:t>, or vice versa</w:t>
+      </w:r>
+      <w:r>
+        <w:t xml:space="preserve">.  </w:t>
+      </w:r>
+      <w:r>
+        <w:t xml:space="preserve">If </w:t>
+      </w:r>
+      <w:r>
+        <w:t>a Dalek</w:t>
+      </w:r>
+      <w:r>
+        <w:t xml:space="preserve"> encounters a wall, the </w:t>
+      </w:r>
+      <w:r>
+        <w:t xml:space="preserve">Dalek </w:t>
+      </w:r>
+      <w:r>
+        <w:t>turns</w:t>
+      </w:r>
+      <w:r>
+        <w:t>,</w:t>
+      </w:r>
+      <w:r>
+        <w:t xml:space="preserve"> and the </w:t>
+      </w:r>
+      <w:r>
+        <w:t xml:space="preserve">action </w:t>
+      </w:r>
+      <w:r>
+        <w:t xml:space="preserve">is </w:t>
+      </w:r>
+      <w:r>
+        <w:t>change</w:t>
+      </w:r>
+      <w:r>
+        <w:t xml:space="preserve">d </w:t>
+      </w:r>
+      <w:r>
+        <w:t xml:space="preserve">to </w:t>
+      </w:r>
+      <w:proofErr w:type="spellStart"/>
       <w:r>
         <w:rPr>
           <w:b/>
@@ -13670,8 +13810,13 @@
           <w:i/>
           <w:iCs/>
         </w:rPr>
-        <w:t>Pursue</w:t>
-      </w:r>
+        <w:t>PursueUp</w:t>
+      </w:r>
+      <w:proofErr w:type="spellEnd"/>
+      <w:r>
+        <w:t xml:space="preserve"> or </w:t>
+      </w:r>
+      <w:proofErr w:type="spellStart"/>
       <w:r>
         <w:rPr>
           <w:b/>
@@ -13679,11 +13824,18 @@
           <w:i/>
           <w:iCs/>
         </w:rPr>
-        <w:t xml:space="preserve">Up </w:t>
-      </w:r>
-      <w:r>
-        <w:t>and</w:t>
-      </w:r>
+        <w:t>PursueDown</w:t>
+      </w:r>
+      <w:proofErr w:type="spellEnd"/>
+      <w:r>
+        <w:t>.</w:t>
+      </w:r>
+    </w:p>
+    <w:p>
+      <w:pPr>
+        <w:ind w:left="720"/>
+      </w:pPr>
+      <w:proofErr w:type="spellStart"/>
       <w:r>
         <w:rPr>
           <w:b/>
@@ -13691,37 +13843,7 @@
           <w:i/>
           <w:iCs/>
         </w:rPr>
-        <w:t xml:space="preserve"> PursueDown </w:t>
-      </w:r>
-      <w:r>
-        <w:t xml:space="preserve"> – Daleks </w:t>
-      </w:r>
-      <w:r>
-        <w:t>move quickly left or right</w:t>
-      </w:r>
-      <w:r>
-        <w:t>, or vice versa, looking for an elevator to ride up or down</w:t>
-      </w:r>
-      <w:r>
-        <w:t xml:space="preserve">.  </w:t>
-      </w:r>
-      <w:r>
-        <w:t xml:space="preserve">If a Dalek encounters a wall, </w:t>
-      </w:r>
-      <w:r>
-        <w:t xml:space="preserve">the Dalek </w:t>
-      </w:r>
-      <w:r>
-        <w:t>turns,</w:t>
-      </w:r>
-      <w:r>
-        <w:t xml:space="preserve"> and the </w:t>
-      </w:r>
-      <w:r>
-        <w:t xml:space="preserve">action </w:t>
-      </w:r>
-      <w:r>
-        <w:t xml:space="preserve">is toggled between </w:t>
+        <w:t>Pursue</w:t>
       </w:r>
       <w:r>
         <w:rPr>
@@ -13730,17 +13852,9 @@
           <w:i/>
           <w:iCs/>
         </w:rPr>
-        <w:t>PursueUp</w:t>
-      </w:r>
-      <w:r>
-        <w:t xml:space="preserve"> </w:t>
-      </w:r>
-      <w:r>
-        <w:t>and</w:t>
-      </w:r>
-      <w:r>
-        <w:t xml:space="preserve"> </w:t>
-      </w:r>
+        <w:t>Up</w:t>
+      </w:r>
+      <w:proofErr w:type="spellEnd"/>
       <w:r>
         <w:rPr>
           <w:b/>
@@ -13748,8 +13862,106 @@
           <w:i/>
           <w:iCs/>
         </w:rPr>
+        <w:t xml:space="preserve"> </w:t>
+      </w:r>
+      <w:r>
+        <w:t>and</w:t>
+      </w:r>
+      <w:r>
+        <w:rPr>
+          <w:b/>
+          <w:bCs/>
+          <w:i/>
+          <w:iCs/>
+        </w:rPr>
+        <w:t xml:space="preserve"> </w:t>
+      </w:r>
+      <w:proofErr w:type="spellStart"/>
+      <w:proofErr w:type="gramStart"/>
+      <w:r>
+        <w:rPr>
+          <w:b/>
+          <w:bCs/>
+          <w:i/>
+          <w:iCs/>
+        </w:rPr>
         <w:t>PursueDown</w:t>
       </w:r>
+      <w:proofErr w:type="spellEnd"/>
+      <w:r>
+        <w:rPr>
+          <w:b/>
+          <w:bCs/>
+          <w:i/>
+          <w:iCs/>
+        </w:rPr>
+        <w:t xml:space="preserve"> </w:t>
+      </w:r>
+      <w:r>
+        <w:t xml:space="preserve"> –</w:t>
+      </w:r>
+      <w:proofErr w:type="gramEnd"/>
+      <w:r>
+        <w:t xml:space="preserve"> Daleks </w:t>
+      </w:r>
+      <w:r>
+        <w:t>move quickly left or right</w:t>
+      </w:r>
+      <w:r>
+        <w:t>, or vice versa, looking for an elevator to ride up or down</w:t>
+      </w:r>
+      <w:r>
+        <w:t xml:space="preserve">.  </w:t>
+      </w:r>
+      <w:r>
+        <w:t xml:space="preserve">If a Dalek encounters a wall, </w:t>
+      </w:r>
+      <w:r>
+        <w:t xml:space="preserve">the Dalek </w:t>
+      </w:r>
+      <w:r>
+        <w:t>turns,</w:t>
+      </w:r>
+      <w:r>
+        <w:t xml:space="preserve"> and the </w:t>
+      </w:r>
+      <w:r>
+        <w:t xml:space="preserve">action </w:t>
+      </w:r>
+      <w:r>
+        <w:t xml:space="preserve">is toggled between </w:t>
+      </w:r>
+      <w:proofErr w:type="spellStart"/>
+      <w:r>
+        <w:rPr>
+          <w:b/>
+          <w:bCs/>
+          <w:i/>
+          <w:iCs/>
+        </w:rPr>
+        <w:t>PursueUp</w:t>
+      </w:r>
+      <w:proofErr w:type="spellEnd"/>
+      <w:r>
+        <w:t xml:space="preserve"> </w:t>
+      </w:r>
+      <w:r>
+        <w:t>and</w:t>
+      </w:r>
+      <w:r>
+        <w:t xml:space="preserve"> </w:t>
+      </w:r>
+      <w:proofErr w:type="spellStart"/>
+      <w:r>
+        <w:rPr>
+          <w:b/>
+          <w:bCs/>
+          <w:i/>
+          <w:iCs/>
+        </w:rPr>
+        <w:t>PursueDown</w:t>
+      </w:r>
+      <w:proofErr w:type="spellEnd"/>
       <w:r>
         <w:rPr>
           <w:b/>
@@ -13885,6 +14097,7 @@
       <w:r>
         <w:t xml:space="preserve">set to </w:t>
       </w:r>
+      <w:proofErr w:type="spellStart"/>
       <w:r>
         <w:rPr>
           <w:b/>
@@ -13894,9 +14107,11 @@
         </w:rPr>
         <w:t>pursueLeft</w:t>
       </w:r>
+      <w:proofErr w:type="spellEnd"/>
       <w:r>
         <w:t xml:space="preserve"> or </w:t>
       </w:r>
+      <w:proofErr w:type="spellStart"/>
       <w:r>
         <w:rPr>
           <w:b/>
@@ -13915,6 +14130,7 @@
         </w:rPr>
         <w:t>ueRight</w:t>
       </w:r>
+      <w:proofErr w:type="spellEnd"/>
       <w:r>
         <w:t xml:space="preserve">.  </w:t>
       </w:r>
@@ -13924,6 +14140,7 @@
       <w:r>
         <w:t xml:space="preserve">action is set to </w:t>
       </w:r>
+      <w:proofErr w:type="spellStart"/>
       <w:r>
         <w:rPr>
           <w:b/>
@@ -13942,9 +14159,11 @@
         </w:rPr>
         <w:t>Up</w:t>
       </w:r>
+      <w:proofErr w:type="spellEnd"/>
       <w:r>
         <w:t xml:space="preserve"> or </w:t>
       </w:r>
+      <w:proofErr w:type="spellStart"/>
       <w:r>
         <w:rPr>
           <w:b/>
@@ -13963,6 +14182,7 @@
         </w:rPr>
         <w:t>Down</w:t>
       </w:r>
+      <w:proofErr w:type="spellEnd"/>
       <w:r>
         <w:t>.</w:t>
       </w:r>
@@ -14203,6 +14423,7 @@
       <w:r>
         <w:t xml:space="preserve">Daleks whose action is </w:t>
       </w:r>
+      <w:proofErr w:type="gramStart"/>
       <w:r>
         <w:rPr>
           <w:b/>
@@ -14212,6 +14433,7 @@
         </w:rPr>
         <w:t>pursue</w:t>
       </w:r>
+      <w:proofErr w:type="gramEnd"/>
       <w:r>
         <w:t xml:space="preserve"> are downgraded to </w:t>
       </w:r>
@@ -14289,6 +14511,7 @@
       <w:r>
         <w:t xml:space="preserve">, </w:t>
       </w:r>
+      <w:proofErr w:type="spellStart"/>
       <w:r>
         <w:rPr>
           <w:b/>
@@ -14298,6 +14521,7 @@
         </w:rPr>
         <w:t>pursueLeft</w:t>
       </w:r>
+      <w:proofErr w:type="spellEnd"/>
       <w:r>
         <w:rPr>
           <w:b/>
@@ -14319,6 +14543,7 @@
         </w:rPr>
         <w:t xml:space="preserve"> </w:t>
       </w:r>
+      <w:proofErr w:type="spellStart"/>
       <w:r>
         <w:rPr>
           <w:b/>
@@ -14335,11 +14560,9 @@
           <w:i/>
           <w:iCs/>
         </w:rPr>
-        <w:t xml:space="preserve">Right </w:t>
-      </w:r>
-      <w:r>
-        <w:t>related</w:t>
-      </w:r>
+        <w:t>Right</w:t>
+      </w:r>
+      <w:proofErr w:type="spellEnd"/>
       <w:r>
         <w:rPr>
           <w:b/>
@@ -14350,138 +14573,7 @@
         <w:t xml:space="preserve"> </w:t>
       </w:r>
       <w:r>
-        <w:t>rules</w:t>
-      </w:r>
-      <w:r>
-        <w:t>.</w:t>
-      </w:r>
-    </w:p>
-    <w:p>
-      <w:r>
-        <w:t xml:space="preserve">I </w:t>
-      </w:r>
-      <w:r>
-        <w:t xml:space="preserve">first </w:t>
-      </w:r>
-      <w:r>
-        <w:t xml:space="preserve">implemented </w:t>
-      </w:r>
-      <w:r>
-        <w:t xml:space="preserve">a </w:t>
-      </w:r>
-      <w:r>
-        <w:t>D</w:t>
-      </w:r>
-      <w:r>
-        <w:t>alek</w:t>
-      </w:r>
-      <w:r>
-        <w:t xml:space="preserve"> </w:t>
-      </w:r>
-      <w:r>
-        <w:t>AI</w:t>
-      </w:r>
-      <w:r>
-        <w:t xml:space="preserve"> </w:t>
-      </w:r>
-      <w:r>
-        <w:t xml:space="preserve">routine </w:t>
-      </w:r>
-      <w:r>
-        <w:t xml:space="preserve">(named </w:t>
-      </w:r>
-      <w:r>
-        <w:rPr>
-          <w:i/>
-          <w:iCs/>
-        </w:rPr>
-        <w:t>enemyAI</w:t>
-      </w:r>
-      <w:r>
-        <w:t xml:space="preserve">) </w:t>
-      </w:r>
-      <w:r>
-        <w:t xml:space="preserve">that </w:t>
-      </w:r>
-      <w:r>
-        <w:t xml:space="preserve">encapsulated the </w:t>
-      </w:r>
-      <w:r>
-        <w:t xml:space="preserve">common </w:t>
-      </w:r>
-      <w:r>
-        <w:t>behavioral rules</w:t>
-      </w:r>
-      <w:r>
-        <w:t xml:space="preserve">, </w:t>
-      </w:r>
-      <w:r>
-        <w:t xml:space="preserve">running these against </w:t>
-      </w:r>
-      <w:r>
-        <w:t xml:space="preserve">each </w:t>
-      </w:r>
-      <w:r>
-        <w:t xml:space="preserve">Dalek every </w:t>
-      </w:r>
-      <w:r>
-        <w:t>sixteen</w:t>
-      </w:r>
-      <w:r>
-        <w:t xml:space="preserve"> frames</w:t>
-      </w:r>
-      <w:r>
-        <w:t xml:space="preserve">.  </w:t>
-      </w:r>
-      <w:r>
-        <w:t xml:space="preserve">The routine is </w:t>
-      </w:r>
-      <w:r>
-        <w:t>invoked from the game loop</w:t>
-      </w:r>
-      <w:r>
-        <w:t xml:space="preserve">.  </w:t>
-      </w:r>
-    </w:p>
-    <w:p>
-      <w:r>
-        <w:t xml:space="preserve">The </w:t>
-      </w:r>
-      <w:r>
-        <w:t xml:space="preserve">routine checks </w:t>
-      </w:r>
-      <w:r>
-        <w:t xml:space="preserve">to see if K9 </w:t>
-      </w:r>
-      <w:r>
-        <w:t xml:space="preserve">is </w:t>
-      </w:r>
-      <w:r>
-        <w:t>in sight</w:t>
-      </w:r>
-      <w:r>
-        <w:t xml:space="preserve"> (using a helper routine)</w:t>
-      </w:r>
-      <w:r>
-        <w:t>,</w:t>
-      </w:r>
-      <w:r>
-        <w:t xml:space="preserve"> promot</w:t>
-      </w:r>
-      <w:r>
-        <w:t>ing</w:t>
-      </w:r>
-      <w:r>
-        <w:t xml:space="preserve"> </w:t>
-      </w:r>
-      <w:r>
-        <w:t>Dalek’s</w:t>
-      </w:r>
-      <w:r>
-        <w:t xml:space="preserve"> </w:t>
-      </w:r>
-      <w:r>
-        <w:t xml:space="preserve">action to </w:t>
+        <w:t>related</w:t>
       </w:r>
       <w:r>
         <w:rPr>
@@ -14490,8 +14582,145 @@
           <w:i/>
           <w:iCs/>
         </w:rPr>
-        <w:t>PursueLeft</w:t>
-      </w:r>
+        <w:t xml:space="preserve"> </w:t>
+      </w:r>
+      <w:r>
+        <w:t>rules</w:t>
+      </w:r>
+      <w:r>
+        <w:t>.</w:t>
+      </w:r>
+    </w:p>
+    <w:p>
+      <w:r>
+        <w:t xml:space="preserve">I </w:t>
+      </w:r>
+      <w:r>
+        <w:t xml:space="preserve">first </w:t>
+      </w:r>
+      <w:r>
+        <w:t xml:space="preserve">implemented </w:t>
+      </w:r>
+      <w:r>
+        <w:t xml:space="preserve">a </w:t>
+      </w:r>
+      <w:r>
+        <w:t>D</w:t>
+      </w:r>
+      <w:r>
+        <w:t>alek</w:t>
+      </w:r>
+      <w:r>
+        <w:t xml:space="preserve"> </w:t>
+      </w:r>
+      <w:r>
+        <w:t>AI</w:t>
+      </w:r>
+      <w:r>
+        <w:t xml:space="preserve"> </w:t>
+      </w:r>
+      <w:r>
+        <w:t xml:space="preserve">routine </w:t>
+      </w:r>
+      <w:r>
+        <w:t xml:space="preserve">(named </w:t>
+      </w:r>
+      <w:proofErr w:type="spellStart"/>
+      <w:r>
+        <w:rPr>
+          <w:i/>
+          <w:iCs/>
+        </w:rPr>
+        <w:t>enemyAI</w:t>
+      </w:r>
+      <w:proofErr w:type="spellEnd"/>
+      <w:r>
+        <w:t xml:space="preserve">) </w:t>
+      </w:r>
+      <w:r>
+        <w:t xml:space="preserve">that </w:t>
+      </w:r>
+      <w:r>
+        <w:t xml:space="preserve">encapsulated the </w:t>
+      </w:r>
+      <w:r>
+        <w:t xml:space="preserve">common </w:t>
+      </w:r>
+      <w:r>
+        <w:t>behavioral rules</w:t>
+      </w:r>
+      <w:r>
+        <w:t xml:space="preserve">, </w:t>
+      </w:r>
+      <w:r>
+        <w:t xml:space="preserve">running these against </w:t>
+      </w:r>
+      <w:r>
+        <w:t xml:space="preserve">each </w:t>
+      </w:r>
+      <w:r>
+        <w:t xml:space="preserve">Dalek every </w:t>
+      </w:r>
+      <w:r>
+        <w:t>sixteen</w:t>
+      </w:r>
+      <w:r>
+        <w:t xml:space="preserve"> frames</w:t>
+      </w:r>
+      <w:r>
+        <w:t xml:space="preserve">.  </w:t>
+      </w:r>
+      <w:r>
+        <w:t xml:space="preserve">The routine is </w:t>
+      </w:r>
+      <w:r>
+        <w:t>invoked from the game loop</w:t>
+      </w:r>
+      <w:r>
+        <w:t xml:space="preserve">.  </w:t>
+      </w:r>
+    </w:p>
+    <w:p>
+      <w:r>
+        <w:t xml:space="preserve">The </w:t>
+      </w:r>
+      <w:r>
+        <w:t xml:space="preserve">routine checks </w:t>
+      </w:r>
+      <w:r>
+        <w:t xml:space="preserve">to see if K9 </w:t>
+      </w:r>
+      <w:r>
+        <w:t xml:space="preserve">is </w:t>
+      </w:r>
+      <w:r>
+        <w:t>in sight</w:t>
+      </w:r>
+      <w:r>
+        <w:t xml:space="preserve"> (using a helper routine)</w:t>
+      </w:r>
+      <w:r>
+        <w:t>,</w:t>
+      </w:r>
+      <w:r>
+        <w:t xml:space="preserve"> promot</w:t>
+      </w:r>
+      <w:r>
+        <w:t>ing</w:t>
+      </w:r>
+      <w:r>
+        <w:t xml:space="preserve"> </w:t>
+      </w:r>
+      <w:r>
+        <w:t>Dalek’s</w:t>
+      </w:r>
+      <w:r>
+        <w:t xml:space="preserve"> </w:t>
+      </w:r>
+      <w:r>
+        <w:t xml:space="preserve">action to </w:t>
+      </w:r>
+      <w:proofErr w:type="spellStart"/>
       <w:r>
         <w:rPr>
           <w:b/>
@@ -14499,11 +14728,9 @@
           <w:i/>
           <w:iCs/>
         </w:rPr>
-        <w:t xml:space="preserve"> </w:t>
-      </w:r>
-      <w:r>
-        <w:t>or</w:t>
-      </w:r>
+        <w:t>PursueLeft</w:t>
+      </w:r>
+      <w:proofErr w:type="spellEnd"/>
       <w:r>
         <w:rPr>
           <w:b/>
@@ -14511,242 +14738,10 @@
           <w:i/>
           <w:iCs/>
         </w:rPr>
-        <w:t xml:space="preserve"> PursueRight</w:t>
-      </w:r>
-      <w:r>
-        <w:t xml:space="preserve"> if so</w:t>
-      </w:r>
-      <w:r>
-        <w:t xml:space="preserve">.  </w:t>
-      </w:r>
-      <w:r>
-        <w:t xml:space="preserve">The function also </w:t>
-      </w:r>
-      <w:r>
-        <w:t>checks to see if K9 is within weapon’s range</w:t>
-      </w:r>
-      <w:r>
-        <w:t>, firing its weapon if it is.</w:t>
-      </w:r>
-    </w:p>
-    <w:p>
-      <w:r>
-        <w:t xml:space="preserve">I then updated </w:t>
-      </w:r>
-      <w:r>
-        <w:t>enemyAnimate</w:t>
-      </w:r>
-      <w:r>
-        <w:t xml:space="preserve"> and all the </w:t>
-      </w:r>
-      <w:r>
-        <w:t xml:space="preserve">Dalek </w:t>
-      </w:r>
-      <w:r>
-        <w:t xml:space="preserve">frame callback functions </w:t>
-      </w:r>
-      <w:r>
-        <w:t xml:space="preserve">to </w:t>
-      </w:r>
-      <w:r>
-        <w:t xml:space="preserve">amend their </w:t>
-      </w:r>
-      <w:r>
-        <w:t>behaviors</w:t>
-      </w:r>
-      <w:r>
-        <w:t xml:space="preserve"> based on </w:t>
-      </w:r>
-      <w:r>
-        <w:t xml:space="preserve">the </w:t>
-      </w:r>
-      <w:r>
-        <w:t>current action</w:t>
-      </w:r>
-      <w:r>
-        <w:t xml:space="preserve">.  </w:t>
-      </w:r>
-      <w:r>
-        <w:t xml:space="preserve">The challenge was keeping the impact (increased code-size) to a </w:t>
-      </w:r>
-      <w:r>
-        <w:t>minimum</w:t>
-      </w:r>
-      <w:r>
-        <w:t xml:space="preserve">.  </w:t>
-      </w:r>
-      <w:r>
-        <w:t>A lot of time was spent refactoring these functio</w:t>
-      </w:r>
-      <w:r>
-        <w:t>ns to use as few code bytes as possible.</w:t>
-      </w:r>
-    </w:p>
-    <w:p>
-      <w:r>
-        <w:t>On</w:t>
-      </w:r>
-      <w:r>
-        <w:t>e</w:t>
-      </w:r>
-      <w:r>
-        <w:t xml:space="preserve"> notable challenge was how best to </w:t>
-      </w:r>
-      <w:r>
-        <w:t xml:space="preserve">show </w:t>
-      </w:r>
-      <w:r>
-        <w:t>damage being inflicted on K9</w:t>
-      </w:r>
-      <w:r>
-        <w:t xml:space="preserve">.  </w:t>
-      </w:r>
-      <w:r>
-        <w:t xml:space="preserve">After brainstorming many ideas, I ended up implementing a simple </w:t>
-      </w:r>
-      <w:r>
-        <w:t>first-person</w:t>
-      </w:r>
-      <w:r>
         <w:t xml:space="preserve"> </w:t>
       </w:r>
       <w:r>
-        <w:t xml:space="preserve">effect where </w:t>
-      </w:r>
-      <w:r>
-        <w:t xml:space="preserve">the </w:t>
-      </w:r>
-      <w:r>
-        <w:t xml:space="preserve">screen </w:t>
-      </w:r>
-      <w:r>
-        <w:t xml:space="preserve">is flashed </w:t>
-      </w:r>
-      <w:r>
-        <w:t xml:space="preserve">intermittently to </w:t>
-      </w:r>
-      <w:r>
-        <w:t>black</w:t>
-      </w:r>
-      <w:r>
-        <w:t xml:space="preserve"> </w:t>
-      </w:r>
-      <w:r>
-        <w:t>and a</w:t>
-      </w:r>
-      <w:r>
-        <w:t>n obnoxious sound</w:t>
-      </w:r>
-      <w:r>
-        <w:t xml:space="preserve"> is </w:t>
-      </w:r>
-      <w:r>
-        <w:t>played</w:t>
-      </w:r>
-      <w:r>
-        <w:t xml:space="preserve">.  </w:t>
-      </w:r>
-      <w:r>
-        <w:t xml:space="preserve">The </w:t>
-      </w:r>
-      <w:r>
-        <w:t xml:space="preserve">result </w:t>
-      </w:r>
-      <w:r>
-        <w:t xml:space="preserve">is quite </w:t>
-      </w:r>
-      <w:r>
-        <w:t>e</w:t>
-      </w:r>
-      <w:r>
-        <w:t>ffective</w:t>
-      </w:r>
-      <w:r>
-        <w:t>.</w:t>
-      </w:r>
-    </w:p>
-    <w:p>
-      <w:r>
-        <w:t xml:space="preserve">To minimize the risk triggering a seizure, the flash frequency </w:t>
-      </w:r>
-      <w:r>
-        <w:t xml:space="preserve">was set at </w:t>
-      </w:r>
-      <w:r>
-        <w:t xml:space="preserve">1.56Hz, outside of </w:t>
-      </w:r>
-      <w:r>
-        <w:t xml:space="preserve">the </w:t>
-      </w:r>
-      <w:r>
-        <w:t>3-30Hz range that some individuals are sensitive to</w:t>
-      </w:r>
-      <w:r>
-        <w:t xml:space="preserve">.  </w:t>
-      </w:r>
-      <w:r>
-        <w:t xml:space="preserve">A second long pause was added </w:t>
-      </w:r>
-      <w:r>
-        <w:t xml:space="preserve">later </w:t>
-      </w:r>
-      <w:r>
-        <w:t xml:space="preserve">between every pair of flashes to ensure the flashes are </w:t>
-      </w:r>
-      <w:r>
-        <w:t xml:space="preserve">also </w:t>
-      </w:r>
-      <w:r>
-        <w:t>intermittent.</w:t>
-      </w:r>
-    </w:p>
-    <w:p>
-      <w:r>
-        <w:t xml:space="preserve">I also added a Mode 7 </w:t>
-      </w:r>
-      <w:r>
-        <w:t xml:space="preserve">incomplete level </w:t>
-      </w:r>
-      <w:r>
-        <w:t xml:space="preserve">screen, which </w:t>
-      </w:r>
-      <w:r>
-        <w:t>shows</w:t>
-      </w:r>
-      <w:r>
-        <w:t xml:space="preserve"> </w:t>
-      </w:r>
-      <w:r>
-        <w:t xml:space="preserve">if </w:t>
-      </w:r>
-      <w:r>
-        <w:t>K</w:t>
-      </w:r>
-      <w:r>
-        <w:t xml:space="preserve">9’s health </w:t>
-      </w:r>
-      <w:r>
-        <w:t xml:space="preserve">becomes </w:t>
-      </w:r>
-      <w:r>
-        <w:t>zero</w:t>
-      </w:r>
-      <w:r>
-        <w:t xml:space="preserve">.  </w:t>
-      </w:r>
-      <w:r>
-        <w:t>Pressing space restarts the level.</w:t>
-      </w:r>
-    </w:p>
-    <w:p>
-      <w:r>
-        <w:t xml:space="preserve">I then turned to </w:t>
-      </w:r>
-      <w:r>
-        <w:t>implementing</w:t>
-      </w:r>
-      <w:r>
-        <w:t xml:space="preserve"> the </w:t>
+        <w:t>or</w:t>
       </w:r>
       <w:r>
         <w:rPr>
@@ -14755,11 +14750,9 @@
           <w:i/>
           <w:iCs/>
         </w:rPr>
-        <w:t>PursueUp</w:t>
-      </w:r>
-      <w:r>
-        <w:t xml:space="preserve"> and </w:t>
-      </w:r>
+        <w:t xml:space="preserve"> </w:t>
+      </w:r>
+      <w:proofErr w:type="spellStart"/>
       <w:r>
         <w:rPr>
           <w:b/>
@@ -14767,8 +14760,271 @@
           <w:i/>
           <w:iCs/>
         </w:rPr>
+        <w:t>PursueRight</w:t>
+      </w:r>
+      <w:proofErr w:type="spellEnd"/>
+      <w:r>
+        <w:t xml:space="preserve"> if so</w:t>
+      </w:r>
+      <w:r>
+        <w:t xml:space="preserve">.  </w:t>
+      </w:r>
+      <w:r>
+        <w:t xml:space="preserve">The function also </w:t>
+      </w:r>
+      <w:r>
+        <w:t>checks to see if K9 is within weapon’s range</w:t>
+      </w:r>
+      <w:r>
+        <w:t>, firing its weapon if it is.</w:t>
+      </w:r>
+    </w:p>
+    <w:p>
+      <w:r>
+        <w:t xml:space="preserve">I then updated </w:t>
+      </w:r>
+      <w:proofErr w:type="spellStart"/>
+      <w:r>
+        <w:t>enemyAnimate</w:t>
+      </w:r>
+      <w:proofErr w:type="spellEnd"/>
+      <w:r>
+        <w:t xml:space="preserve"> and all the </w:t>
+      </w:r>
+      <w:r>
+        <w:t xml:space="preserve">Dalek </w:t>
+      </w:r>
+      <w:r>
+        <w:t xml:space="preserve">frame callback functions </w:t>
+      </w:r>
+      <w:r>
+        <w:t xml:space="preserve">to </w:t>
+      </w:r>
+      <w:r>
+        <w:t xml:space="preserve">amend their </w:t>
+      </w:r>
+      <w:r>
+        <w:t>behaviors</w:t>
+      </w:r>
+      <w:r>
+        <w:t xml:space="preserve"> based on </w:t>
+      </w:r>
+      <w:r>
+        <w:t xml:space="preserve">the </w:t>
+      </w:r>
+      <w:r>
+        <w:t>current action</w:t>
+      </w:r>
+      <w:r>
+        <w:t xml:space="preserve">.  </w:t>
+      </w:r>
+      <w:r>
+        <w:t xml:space="preserve">The challenge was keeping the impact (increased code-size) to a </w:t>
+      </w:r>
+      <w:r>
+        <w:t>minimum</w:t>
+      </w:r>
+      <w:r>
+        <w:t xml:space="preserve">.  </w:t>
+      </w:r>
+      <w:r>
+        <w:t>A lot of time was spent refactoring these functio</w:t>
+      </w:r>
+      <w:r>
+        <w:t>ns to use as few code bytes as possible.</w:t>
+      </w:r>
+    </w:p>
+    <w:p>
+      <w:r>
+        <w:t>On</w:t>
+      </w:r>
+      <w:r>
+        <w:t>e</w:t>
+      </w:r>
+      <w:r>
+        <w:t xml:space="preserve"> notable challenge was how best to </w:t>
+      </w:r>
+      <w:r>
+        <w:t xml:space="preserve">show </w:t>
+      </w:r>
+      <w:r>
+        <w:t>damage being inflicted on K9</w:t>
+      </w:r>
+      <w:r>
+        <w:t xml:space="preserve">.  </w:t>
+      </w:r>
+      <w:r>
+        <w:t xml:space="preserve">After brainstorming many ideas, I ended up implementing a simple </w:t>
+      </w:r>
+      <w:r>
+        <w:t>first-person</w:t>
+      </w:r>
+      <w:r>
+        <w:t xml:space="preserve"> </w:t>
+      </w:r>
+      <w:r>
+        <w:t xml:space="preserve">effect where </w:t>
+      </w:r>
+      <w:r>
+        <w:t xml:space="preserve">the </w:t>
+      </w:r>
+      <w:r>
+        <w:t xml:space="preserve">screen </w:t>
+      </w:r>
+      <w:r>
+        <w:t xml:space="preserve">is flashed </w:t>
+      </w:r>
+      <w:r>
+        <w:t xml:space="preserve">intermittently to </w:t>
+      </w:r>
+      <w:r>
+        <w:t>black</w:t>
+      </w:r>
+      <w:r>
+        <w:t xml:space="preserve"> </w:t>
+      </w:r>
+      <w:r>
+        <w:t>and a</w:t>
+      </w:r>
+      <w:r>
+        <w:t>n obnoxious sound</w:t>
+      </w:r>
+      <w:r>
+        <w:t xml:space="preserve"> is </w:t>
+      </w:r>
+      <w:r>
+        <w:t>played</w:t>
+      </w:r>
+      <w:r>
+        <w:t xml:space="preserve">.  </w:t>
+      </w:r>
+      <w:r>
+        <w:t xml:space="preserve">The </w:t>
+      </w:r>
+      <w:r>
+        <w:t xml:space="preserve">result </w:t>
+      </w:r>
+      <w:r>
+        <w:t xml:space="preserve">is quite </w:t>
+      </w:r>
+      <w:r>
+        <w:t>e</w:t>
+      </w:r>
+      <w:r>
+        <w:t>ffective</w:t>
+      </w:r>
+      <w:r>
+        <w:t>.</w:t>
+      </w:r>
+    </w:p>
+    <w:p>
+      <w:r>
+        <w:t xml:space="preserve">To minimize the risk triggering a seizure, the flash frequency </w:t>
+      </w:r>
+      <w:r>
+        <w:t xml:space="preserve">was set at </w:t>
+      </w:r>
+      <w:r>
+        <w:t xml:space="preserve">1.56Hz, outside of </w:t>
+      </w:r>
+      <w:r>
+        <w:t xml:space="preserve">the </w:t>
+      </w:r>
+      <w:r>
+        <w:t>3-30Hz range that some individuals are sensitive to</w:t>
+      </w:r>
+      <w:r>
+        <w:t xml:space="preserve">.  </w:t>
+      </w:r>
+      <w:r>
+        <w:t xml:space="preserve">A second long pause was added </w:t>
+      </w:r>
+      <w:r>
+        <w:t xml:space="preserve">later </w:t>
+      </w:r>
+      <w:r>
+        <w:t xml:space="preserve">between every pair of flashes to ensure the flashes are </w:t>
+      </w:r>
+      <w:r>
+        <w:t xml:space="preserve">also </w:t>
+      </w:r>
+      <w:r>
+        <w:t>intermittent.</w:t>
+      </w:r>
+    </w:p>
+    <w:p>
+      <w:r>
+        <w:t xml:space="preserve">I also added a Mode 7 </w:t>
+      </w:r>
+      <w:r>
+        <w:t xml:space="preserve">incomplete level </w:t>
+      </w:r>
+      <w:r>
+        <w:t xml:space="preserve">screen, which </w:t>
+      </w:r>
+      <w:r>
+        <w:t>shows</w:t>
+      </w:r>
+      <w:r>
+        <w:t xml:space="preserve"> </w:t>
+      </w:r>
+      <w:r>
+        <w:t xml:space="preserve">if </w:t>
+      </w:r>
+      <w:r>
+        <w:t>K</w:t>
+      </w:r>
+      <w:r>
+        <w:t xml:space="preserve">9’s health </w:t>
+      </w:r>
+      <w:r>
+        <w:t xml:space="preserve">becomes </w:t>
+      </w:r>
+      <w:r>
+        <w:t>zero</w:t>
+      </w:r>
+      <w:r>
+        <w:t xml:space="preserve">.  </w:t>
+      </w:r>
+      <w:r>
+        <w:t>Pressing space restarts the level.</w:t>
+      </w:r>
+    </w:p>
+    <w:p>
+      <w:r>
+        <w:t xml:space="preserve">I then turned to </w:t>
+      </w:r>
+      <w:r>
+        <w:t>implementing</w:t>
+      </w:r>
+      <w:r>
+        <w:t xml:space="preserve"> the </w:t>
+      </w:r>
+      <w:proofErr w:type="spellStart"/>
+      <w:r>
+        <w:rPr>
+          <w:b/>
+          <w:bCs/>
+          <w:i/>
+          <w:iCs/>
+        </w:rPr>
+        <w:t>PursueUp</w:t>
+      </w:r>
+      <w:proofErr w:type="spellEnd"/>
+      <w:r>
+        <w:t xml:space="preserve"> and </w:t>
+      </w:r>
+      <w:proofErr w:type="spellStart"/>
+      <w:r>
+        <w:rPr>
+          <w:b/>
+          <w:bCs/>
+          <w:i/>
+          <w:iCs/>
+        </w:rPr>
         <w:t>PursueDown</w:t>
       </w:r>
+      <w:proofErr w:type="spellEnd"/>
       <w:r>
         <w:t xml:space="preserve"> behavior</w:t>
       </w:r>
@@ -14808,6 +15064,7 @@
       <w:r>
         <w:t xml:space="preserve">Fortunately, the low nibble of the elevator’s </w:t>
       </w:r>
+      <w:proofErr w:type="spellStart"/>
       <w:r>
         <w:rPr>
           <w:i/>
@@ -14815,6 +15072,7 @@
         </w:rPr>
         <w:t>objectState</w:t>
       </w:r>
+      <w:proofErr w:type="spellEnd"/>
       <w:r>
         <w:t xml:space="preserve"> variable </w:t>
       </w:r>
@@ -15487,6 +15745,7 @@
       <w:r>
         <w:t xml:space="preserve">The game uses a </w:t>
       </w:r>
+      <w:proofErr w:type="spellStart"/>
       <w:r>
         <w:rPr>
           <w:i/>
@@ -15494,6 +15753,7 @@
         </w:rPr>
         <w:t>frameCount</w:t>
       </w:r>
+      <w:proofErr w:type="spellEnd"/>
       <w:r>
         <w:t xml:space="preserve"> based timer to inhibit playing the movement sound effect when the other sound effects are playing.</w:t>
       </w:r>
@@ -15782,9 +16042,11 @@
               <w:widowControl w:val="0"/>
               <w:cnfStyle w:val="000000100000" w:firstRow="0" w:lastRow="0" w:firstColumn="0" w:lastColumn="0" w:oddVBand="0" w:evenVBand="0" w:oddHBand="1" w:evenHBand="0" w:firstRowFirstColumn="0" w:firstRowLastColumn="0" w:lastRowFirstColumn="0" w:lastRowLastColumn="0"/>
             </w:pPr>
+            <w:proofErr w:type="spellStart"/>
             <w:r>
               <w:t>MikeH</w:t>
             </w:r>
+            <w:proofErr w:type="spellEnd"/>
           </w:p>
         </w:tc>
         <w:tc>
@@ -15849,9 +16111,11 @@
               <w:widowControl w:val="0"/>
               <w:cnfStyle w:val="000000000000" w:firstRow="0" w:lastRow="0" w:firstColumn="0" w:lastColumn="0" w:oddVBand="0" w:evenVBand="0" w:oddHBand="0" w:evenHBand="0" w:firstRowFirstColumn="0" w:firstRowLastColumn="0" w:lastRowFirstColumn="0" w:lastRowLastColumn="0"/>
             </w:pPr>
+            <w:proofErr w:type="spellStart"/>
             <w:r>
               <w:t>MikeH</w:t>
             </w:r>
+            <w:proofErr w:type="spellEnd"/>
           </w:p>
         </w:tc>
         <w:tc>
@@ -15921,9 +16185,11 @@
               <w:widowControl w:val="0"/>
               <w:cnfStyle w:val="000000100000" w:firstRow="0" w:lastRow="0" w:firstColumn="0" w:lastColumn="0" w:oddVBand="0" w:evenVBand="0" w:oddHBand="1" w:evenHBand="0" w:firstRowFirstColumn="0" w:firstRowLastColumn="0" w:lastRowFirstColumn="0" w:lastRowLastColumn="0"/>
             </w:pPr>
+            <w:proofErr w:type="spellStart"/>
             <w:r>
               <w:t>MikeH</w:t>
             </w:r>
+            <w:proofErr w:type="spellEnd"/>
           </w:p>
         </w:tc>
         <w:tc>
@@ -15991,9 +16257,11 @@
               <w:widowControl w:val="0"/>
               <w:cnfStyle w:val="000000000000" w:firstRow="0" w:lastRow="0" w:firstColumn="0" w:lastColumn="0" w:oddVBand="0" w:evenVBand="0" w:oddHBand="0" w:evenHBand="0" w:firstRowFirstColumn="0" w:firstRowLastColumn="0" w:lastRowFirstColumn="0" w:lastRowLastColumn="0"/>
             </w:pPr>
+            <w:proofErr w:type="spellStart"/>
             <w:r>
               <w:t>MikeH</w:t>
             </w:r>
+            <w:proofErr w:type="spellEnd"/>
           </w:p>
         </w:tc>
         <w:tc>
@@ -16053,9 +16321,11 @@
               <w:widowControl w:val="0"/>
               <w:cnfStyle w:val="000000100000" w:firstRow="0" w:lastRow="0" w:firstColumn="0" w:lastColumn="0" w:oddVBand="0" w:evenVBand="0" w:oddHBand="1" w:evenHBand="0" w:firstRowFirstColumn="0" w:firstRowLastColumn="0" w:lastRowFirstColumn="0" w:lastRowLastColumn="0"/>
             </w:pPr>
+            <w:proofErr w:type="spellStart"/>
             <w:r>
               <w:t>MikeH</w:t>
             </w:r>
+            <w:proofErr w:type="spellEnd"/>
           </w:p>
         </w:tc>
         <w:tc>
@@ -16121,9 +16391,11 @@
               <w:widowControl w:val="0"/>
               <w:cnfStyle w:val="000000000000" w:firstRow="0" w:lastRow="0" w:firstColumn="0" w:lastColumn="0" w:oddVBand="0" w:evenVBand="0" w:oddHBand="0" w:evenHBand="0" w:firstRowFirstColumn="0" w:firstRowLastColumn="0" w:lastRowFirstColumn="0" w:lastRowLastColumn="0"/>
             </w:pPr>
+            <w:proofErr w:type="spellStart"/>
             <w:r>
               <w:t>MikeH</w:t>
             </w:r>
+            <w:proofErr w:type="spellEnd"/>
           </w:p>
         </w:tc>
         <w:tc>
@@ -16197,9 +16469,11 @@
               <w:widowControl w:val="0"/>
               <w:cnfStyle w:val="000000100000" w:firstRow="0" w:lastRow="0" w:firstColumn="0" w:lastColumn="0" w:oddVBand="0" w:evenVBand="0" w:oddHBand="1" w:evenHBand="0" w:firstRowFirstColumn="0" w:firstRowLastColumn="0" w:lastRowFirstColumn="0" w:lastRowLastColumn="0"/>
             </w:pPr>
+            <w:proofErr w:type="spellStart"/>
             <w:r>
               <w:t>MikeH</w:t>
             </w:r>
+            <w:proofErr w:type="spellEnd"/>
           </w:p>
         </w:tc>
         <w:tc>
@@ -16314,9 +16588,11 @@
               <w:widowControl w:val="0"/>
               <w:cnfStyle w:val="000000000000" w:firstRow="0" w:lastRow="0" w:firstColumn="0" w:lastColumn="0" w:oddVBand="0" w:evenVBand="0" w:oddHBand="0" w:evenHBand="0" w:firstRowFirstColumn="0" w:firstRowLastColumn="0" w:lastRowFirstColumn="0" w:lastRowLastColumn="0"/>
             </w:pPr>
+            <w:proofErr w:type="spellStart"/>
             <w:r>
               <w:t>MikeH</w:t>
             </w:r>
+            <w:proofErr w:type="spellEnd"/>
           </w:p>
         </w:tc>
         <w:tc>
@@ -16423,9 +16699,11 @@
               <w:widowControl w:val="0"/>
               <w:cnfStyle w:val="000000100000" w:firstRow="0" w:lastRow="0" w:firstColumn="0" w:lastColumn="0" w:oddVBand="0" w:evenVBand="0" w:oddHBand="1" w:evenHBand="0" w:firstRowFirstColumn="0" w:firstRowLastColumn="0" w:lastRowFirstColumn="0" w:lastRowLastColumn="0"/>
             </w:pPr>
+            <w:proofErr w:type="spellStart"/>
             <w:r>
               <w:t>JamesB</w:t>
             </w:r>
+            <w:proofErr w:type="spellEnd"/>
           </w:p>
         </w:tc>
         <w:tc>
@@ -16480,9 +16758,11 @@
               <w:widowControl w:val="0"/>
               <w:cnfStyle w:val="000000000000" w:firstRow="0" w:lastRow="0" w:firstColumn="0" w:lastColumn="0" w:oddVBand="0" w:evenVBand="0" w:oddHBand="0" w:evenHBand="0" w:firstRowFirstColumn="0" w:firstRowLastColumn="0" w:lastRowFirstColumn="0" w:lastRowLastColumn="0"/>
             </w:pPr>
+            <w:proofErr w:type="spellStart"/>
             <w:r>
               <w:t>MikeH</w:t>
             </w:r>
+            <w:proofErr w:type="spellEnd"/>
           </w:p>
         </w:tc>
         <w:tc>
@@ -16556,6 +16836,7 @@
               <w:widowControl w:val="0"/>
               <w:cnfStyle w:val="000000100000" w:firstRow="0" w:lastRow="0" w:firstColumn="0" w:lastColumn="0" w:oddVBand="0" w:evenVBand="0" w:oddHBand="1" w:evenHBand="0" w:firstRowFirstColumn="0" w:firstRowLastColumn="0" w:lastRowFirstColumn="0" w:lastRowLastColumn="0"/>
             </w:pPr>
+            <w:proofErr w:type="spellStart"/>
             <w:r>
               <w:t>Q</w:t>
             </w:r>
@@ -16565,6 +16846,7 @@
             <w:r>
               <w:t>ntinM</w:t>
             </w:r>
+            <w:proofErr w:type="spellEnd"/>
           </w:p>
         </w:tc>
         <w:tc>
@@ -16627,6 +16909,7 @@
                 <w:bCs/>
               </w:rPr>
             </w:pPr>
+            <w:proofErr w:type="spellStart"/>
             <w:r>
               <w:t>Q</w:t>
             </w:r>
@@ -16636,6 +16919,7 @@
             <w:r>
               <w:t>ntinM</w:t>
             </w:r>
+            <w:proofErr w:type="spellEnd"/>
           </w:p>
         </w:tc>
         <w:tc>
@@ -16723,9 +17007,11 @@
               <w:widowControl w:val="0"/>
               <w:cnfStyle w:val="000000100000" w:firstRow="0" w:lastRow="0" w:firstColumn="0" w:lastColumn="0" w:oddVBand="0" w:evenVBand="0" w:oddHBand="1" w:evenHBand="0" w:firstRowFirstColumn="0" w:firstRowLastColumn="0" w:lastRowFirstColumn="0" w:lastRowLastColumn="0"/>
             </w:pPr>
+            <w:proofErr w:type="spellStart"/>
             <w:r>
               <w:t>MikeH</w:t>
             </w:r>
+            <w:proofErr w:type="spellEnd"/>
           </w:p>
         </w:tc>
         <w:tc>
@@ -17276,7 +17562,23 @@
                 <w:b w:val="0"/>
                 <w:bCs w:val="0"/>
               </w:rPr>
-              <w:t xml:space="preserve"> work on the Master or Model B Plus</w:t>
+              <w:t xml:space="preserve"> work on </w:t>
+            </w:r>
+            <w:proofErr w:type="gramStart"/>
+            <w:r>
+              <w:rPr>
+                <w:b w:val="0"/>
+                <w:bCs w:val="0"/>
+              </w:rPr>
+              <w:t>the Master</w:t>
+            </w:r>
+            <w:proofErr w:type="gramEnd"/>
+            <w:r>
+              <w:rPr>
+                <w:b w:val="0"/>
+                <w:bCs w:val="0"/>
+              </w:rPr>
+              <w:t xml:space="preserve"> or Model B Plus</w:t>
             </w:r>
           </w:p>
         </w:tc>
@@ -17291,9 +17593,11 @@
               <w:widowControl w:val="0"/>
               <w:cnfStyle w:val="000000100000" w:firstRow="0" w:lastRow="0" w:firstColumn="0" w:lastColumn="0" w:oddVBand="0" w:evenVBand="0" w:oddHBand="1" w:evenHBand="0" w:firstRowFirstColumn="0" w:firstRowLastColumn="0" w:lastRowFirstColumn="0" w:lastRowLastColumn="0"/>
             </w:pPr>
+            <w:proofErr w:type="spellStart"/>
             <w:r>
               <w:t>ChrisB</w:t>
             </w:r>
+            <w:proofErr w:type="spellEnd"/>
           </w:p>
         </w:tc>
         <w:tc>
@@ -17482,9 +17786,11 @@
               <w:cnfStyle w:val="000000100000" w:firstRow="0" w:lastRow="0" w:firstColumn="0" w:lastColumn="0" w:oddVBand="0" w:evenVBand="0" w:oddHBand="1" w:evenHBand="0" w:firstRowFirstColumn="0" w:firstRowLastColumn="0" w:lastRowFirstColumn="0" w:lastRowLastColumn="0"/>
             </w:pPr>
             <w:hyperlink r:id="rId20" w:history="1">
+              <w:proofErr w:type="spellStart"/>
               <w:r>
                 <w:t>alecb</w:t>
               </w:r>
+              <w:proofErr w:type="spellEnd"/>
             </w:hyperlink>
           </w:p>
         </w:tc>
@@ -17545,9 +17851,11 @@
               <w:cnfStyle w:val="000000000000" w:firstRow="0" w:lastRow="0" w:firstColumn="0" w:lastColumn="0" w:oddVBand="0" w:evenVBand="0" w:oddHBand="0" w:evenHBand="0" w:firstRowFirstColumn="0" w:firstRowLastColumn="0" w:lastRowFirstColumn="0" w:lastRowLastColumn="0"/>
             </w:pPr>
             <w:hyperlink r:id="rId21" w:history="1">
+              <w:proofErr w:type="spellStart"/>
               <w:r>
                 <w:t>alecb</w:t>
               </w:r>
+              <w:proofErr w:type="spellEnd"/>
             </w:hyperlink>
           </w:p>
         </w:tc>
@@ -17612,8 +17920,13 @@
               <w:t>j</w:t>
             </w:r>
             <w:r>
-              <w:t>ms2, tricky, TobyLobster</w:t>
-            </w:r>
+              <w:t xml:space="preserve">ms2, tricky, </w:t>
+            </w:r>
+            <w:proofErr w:type="spellStart"/>
+            <w:r>
+              <w:t>TobyLobster</w:t>
+            </w:r>
+            <w:proofErr w:type="spellEnd"/>
           </w:p>
         </w:tc>
         <w:tc>
@@ -17936,6 +18249,7 @@
       <w:r>
         <w:t xml:space="preserve"> into the sprite data and let the </w:t>
       </w:r>
+      <w:proofErr w:type="spellStart"/>
       <w:r>
         <w:rPr>
           <w:i/>
@@ -17943,6 +18257,7 @@
         </w:rPr>
         <w:t>drawSprite</w:t>
       </w:r>
+      <w:proofErr w:type="spellEnd"/>
       <w:r>
         <w:t xml:space="preserve"> routine do all the work of putting the pixels on the screen, however this would result in the ‘</w:t>
       </w:r>
@@ -18454,6 +18769,7 @@
       <w:r>
         <w:t xml:space="preserve">from </w:t>
       </w:r>
+      <w:proofErr w:type="spellStart"/>
       <w:r>
         <w:rPr>
           <w:i/>
@@ -18461,9 +18777,11 @@
         </w:rPr>
         <w:t>drawObject</w:t>
       </w:r>
+      <w:proofErr w:type="spellEnd"/>
       <w:r>
         <w:t xml:space="preserve"> and </w:t>
       </w:r>
+      <w:proofErr w:type="spellStart"/>
       <w:r>
         <w:rPr>
           <w:i/>
@@ -18471,6 +18789,7 @@
         </w:rPr>
         <w:t>drawLaserOn</w:t>
       </w:r>
+      <w:proofErr w:type="spellEnd"/>
       <w:r>
         <w:rPr>
           <w:i/>
@@ -19926,6 +20245,7 @@
       <w:r>
         <w:t xml:space="preserve">The title functionality starts and stops playback by invoking the </w:t>
       </w:r>
+      <w:proofErr w:type="spellStart"/>
       <w:r>
         <w:rPr>
           <w:b/>
@@ -19935,9 +20255,11 @@
         </w:rPr>
         <w:t>playMusic</w:t>
       </w:r>
+      <w:proofErr w:type="spellEnd"/>
       <w:r>
         <w:t xml:space="preserve"> and </w:t>
       </w:r>
+      <w:proofErr w:type="spellStart"/>
       <w:r>
         <w:rPr>
           <w:b/>
@@ -19947,6 +20269,7 @@
         </w:rPr>
         <w:t>stopMusic</w:t>
       </w:r>
+      <w:proofErr w:type="spellEnd"/>
       <w:r>
         <w:t xml:space="preserve"> routines</w:t>
       </w:r>
@@ -21584,76 +21907,167 @@
       <w:r>
         <w:t xml:space="preserve">In the first pass, </w:t>
       </w:r>
+      <w:proofErr w:type="gramStart"/>
       <w:r>
         <w:rPr>
           <w:b/>
           <w:bCs/>
         </w:rPr>
-        <w:t>AND #&amp;0F</w:t>
-      </w:r>
+        <w:t>AND #&amp;</w:t>
+      </w:r>
+      <w:proofErr w:type="gramEnd"/>
       <w:r>
         <w:rPr>
           <w:b/>
           <w:bCs/>
         </w:rPr>
-        <w:t xml:space="preserve"> : </w:t>
-      </w:r>
+        <w:t>0</w:t>
+      </w:r>
+      <w:proofErr w:type="gramStart"/>
       <w:r>
         <w:rPr>
           <w:b/>
           <w:bCs/>
         </w:rPr>
-        <w:t>AND #&amp;0F</w:t>
-      </w:r>
-      <w:r>
-        <w:t xml:space="preserve"> is </w:t>
-      </w:r>
-      <w:r>
-        <w:t>written</w:t>
-      </w:r>
-      <w:r>
-        <w:t xml:space="preserve"> </w:t>
-      </w:r>
-      <w:r>
-        <w:t xml:space="preserve">and used </w:t>
-      </w:r>
-      <w:r>
-        <w:t>to extract the low nibbles</w:t>
-      </w:r>
-      <w:r>
-        <w:t xml:space="preserve">, in the second pass, </w:t>
+        <w:t>F</w:t>
       </w:r>
       <w:r>
         <w:rPr>
           <w:b/>
           <w:bCs/>
         </w:rPr>
-        <w:t>LSR A : LSR A : LSR A : LSR A</w:t>
-      </w:r>
-      <w:r>
-        <w:t xml:space="preserve"> is </w:t>
-      </w:r>
-      <w:r>
-        <w:t>written</w:t>
-      </w:r>
-      <w:r>
-        <w:t xml:space="preserve"> </w:t>
-      </w:r>
-      <w:r>
-        <w:t xml:space="preserve">and used </w:t>
-      </w:r>
-      <w:r>
-        <w:t>to extract the high nibbles</w:t>
-      </w:r>
-      <w:r>
-        <w:t xml:space="preserve">.  </w:t>
-      </w:r>
+        <w:t xml:space="preserve"> :</w:t>
+      </w:r>
+      <w:proofErr w:type="gramEnd"/>
       <w:r>
         <w:rPr>
           <w:b/>
           <w:bCs/>
         </w:rPr>
-        <w:t>AND #&amp;0F</w:t>
+        <w:t xml:space="preserve"> </w:t>
+      </w:r>
+      <w:proofErr w:type="gramStart"/>
+      <w:r>
+        <w:rPr>
+          <w:b/>
+          <w:bCs/>
+        </w:rPr>
+        <w:t>AND #&amp;</w:t>
+      </w:r>
+      <w:proofErr w:type="gramEnd"/>
+      <w:r>
+        <w:rPr>
+          <w:b/>
+          <w:bCs/>
+        </w:rPr>
+        <w:t>0F</w:t>
+      </w:r>
+      <w:r>
+        <w:t xml:space="preserve"> is </w:t>
+      </w:r>
+      <w:r>
+        <w:t>written</w:t>
+      </w:r>
+      <w:r>
+        <w:t xml:space="preserve"> </w:t>
+      </w:r>
+      <w:r>
+        <w:t xml:space="preserve">and used </w:t>
+      </w:r>
+      <w:r>
+        <w:t>to extract the low nibbles</w:t>
+      </w:r>
+      <w:r>
+        <w:t xml:space="preserve">, in the second pass, </w:t>
+      </w:r>
+      <w:r>
+        <w:rPr>
+          <w:b/>
+          <w:bCs/>
+        </w:rPr>
+        <w:t xml:space="preserve">LSR </w:t>
+      </w:r>
+      <w:proofErr w:type="gramStart"/>
+      <w:r>
+        <w:rPr>
+          <w:b/>
+          <w:bCs/>
+        </w:rPr>
+        <w:t>A :</w:t>
+      </w:r>
+      <w:proofErr w:type="gramEnd"/>
+      <w:r>
+        <w:rPr>
+          <w:b/>
+          <w:bCs/>
+        </w:rPr>
+        <w:t xml:space="preserve"> LSR </w:t>
+      </w:r>
+      <w:proofErr w:type="gramStart"/>
+      <w:r>
+        <w:rPr>
+          <w:b/>
+          <w:bCs/>
+        </w:rPr>
+        <w:t>A :</w:t>
+      </w:r>
+      <w:proofErr w:type="gramEnd"/>
+      <w:r>
+        <w:rPr>
+          <w:b/>
+          <w:bCs/>
+        </w:rPr>
+        <w:t xml:space="preserve"> LSR </w:t>
+      </w:r>
+      <w:proofErr w:type="gramStart"/>
+      <w:r>
+        <w:rPr>
+          <w:b/>
+          <w:bCs/>
+        </w:rPr>
+        <w:t>A :</w:t>
+      </w:r>
+      <w:proofErr w:type="gramEnd"/>
+      <w:r>
+        <w:rPr>
+          <w:b/>
+          <w:bCs/>
+        </w:rPr>
+        <w:t xml:space="preserve"> LSR A</w:t>
+      </w:r>
+      <w:r>
+        <w:t xml:space="preserve"> is </w:t>
+      </w:r>
+      <w:r>
+        <w:t>written</w:t>
+      </w:r>
+      <w:r>
+        <w:t xml:space="preserve"> </w:t>
+      </w:r>
+      <w:r>
+        <w:t xml:space="preserve">and used </w:t>
+      </w:r>
+      <w:r>
+        <w:t>to extract the high nibbles</w:t>
+      </w:r>
+      <w:r>
+        <w:t xml:space="preserve">.  </w:t>
+      </w:r>
+      <w:proofErr w:type="gramStart"/>
+      <w:r>
+        <w:rPr>
+          <w:b/>
+          <w:bCs/>
+        </w:rPr>
+        <w:t>AND #&amp;</w:t>
+      </w:r>
+      <w:proofErr w:type="gramEnd"/>
+      <w:r>
+        <w:rPr>
+          <w:b/>
+          <w:bCs/>
+        </w:rPr>
+        <w:t>0F</w:t>
       </w:r>
       <w:r>
         <w:t xml:space="preserve"> is repeated</w:t>
@@ -22211,9 +22625,11 @@
               <w:keepLines/>
               <w:widowControl w:val="0"/>
             </w:pPr>
+            <w:proofErr w:type="spellStart"/>
             <w:r>
               <w:t>soundVector_beginPursuit</w:t>
             </w:r>
+            <w:proofErr w:type="spellEnd"/>
           </w:p>
         </w:tc>
         <w:tc>
@@ -22227,6 +22643,7 @@
               <w:widowControl w:val="0"/>
               <w:cnfStyle w:val="000000100000" w:firstRow="0" w:lastRow="0" w:firstColumn="0" w:lastColumn="0" w:oddVBand="0" w:evenVBand="0" w:oddHBand="1" w:evenHBand="0" w:firstRowFirstColumn="0" w:firstRowLastColumn="0" w:lastRowFirstColumn="0" w:lastRowLastColumn="0"/>
             </w:pPr>
+            <w:proofErr w:type="spellStart"/>
             <w:r>
               <w:t>soundEffect_</w:t>
             </w:r>
@@ -22239,6 +22656,7 @@
             <w:r>
               <w:t>t</w:t>
             </w:r>
+            <w:proofErr w:type="spellEnd"/>
           </w:p>
         </w:tc>
         <w:tc>
@@ -22252,12 +22670,14 @@
               <w:widowControl w:val="0"/>
               <w:cnfStyle w:val="000000100000" w:firstRow="0" w:lastRow="0" w:firstColumn="0" w:lastColumn="0" w:oddVBand="0" w:evenVBand="0" w:oddHBand="1" w:evenHBand="0" w:firstRowFirstColumn="0" w:firstRowLastColumn="0" w:lastRowFirstColumn="0" w:lastRowLastColumn="0"/>
             </w:pPr>
+            <w:proofErr w:type="spellStart"/>
             <w:r>
               <w:t>sample_</w:t>
             </w:r>
             <w:r>
               <w:t>beginPursuit</w:t>
             </w:r>
+            <w:proofErr w:type="spellEnd"/>
           </w:p>
         </w:tc>
       </w:tr>
@@ -22273,9 +22693,11 @@
               <w:keepLines/>
               <w:widowControl w:val="0"/>
             </w:pPr>
+            <w:proofErr w:type="spellStart"/>
             <w:r>
               <w:t>soundVector_updatePursuit</w:t>
             </w:r>
+            <w:proofErr w:type="spellEnd"/>
           </w:p>
         </w:tc>
         <w:tc>
@@ -22289,9 +22711,11 @@
               <w:widowControl w:val="0"/>
               <w:cnfStyle w:val="000000000000" w:firstRow="0" w:lastRow="0" w:firstColumn="0" w:lastColumn="0" w:oddVBand="0" w:evenVBand="0" w:oddHBand="0" w:evenHBand="0" w:firstRowFirstColumn="0" w:firstRowLastColumn="0" w:lastRowFirstColumn="0" w:lastRowLastColumn="0"/>
             </w:pPr>
+            <w:proofErr w:type="spellStart"/>
             <w:r>
               <w:t>soundEffect_updatePursuit</w:t>
             </w:r>
+            <w:proofErr w:type="spellEnd"/>
           </w:p>
         </w:tc>
         <w:tc>
@@ -22305,9 +22729,11 @@
               <w:widowControl w:val="0"/>
               <w:cnfStyle w:val="000000000000" w:firstRow="0" w:lastRow="0" w:firstColumn="0" w:lastColumn="0" w:oddVBand="0" w:evenVBand="0" w:oddHBand="0" w:evenHBand="0" w:firstRowFirstColumn="0" w:firstRowLastColumn="0" w:lastRowFirstColumn="0" w:lastRowLastColumn="0"/>
             </w:pPr>
+            <w:proofErr w:type="spellStart"/>
             <w:r>
               <w:t>sample_updatePursuit</w:t>
             </w:r>
+            <w:proofErr w:type="spellEnd"/>
           </w:p>
         </w:tc>
       </w:tr>
@@ -22326,9 +22752,11 @@
               <w:keepLines/>
               <w:widowControl w:val="0"/>
             </w:pPr>
+            <w:proofErr w:type="spellStart"/>
             <w:r>
               <w:t>soundVector_endPursuit</w:t>
             </w:r>
+            <w:proofErr w:type="spellEnd"/>
           </w:p>
         </w:tc>
         <w:tc>
@@ -22342,9 +22770,11 @@
               <w:widowControl w:val="0"/>
               <w:cnfStyle w:val="000000100000" w:firstRow="0" w:lastRow="0" w:firstColumn="0" w:lastColumn="0" w:oddVBand="0" w:evenVBand="0" w:oddHBand="1" w:evenHBand="0" w:firstRowFirstColumn="0" w:firstRowLastColumn="0" w:lastRowFirstColumn="0" w:lastRowLastColumn="0"/>
             </w:pPr>
+            <w:proofErr w:type="spellStart"/>
             <w:r>
               <w:t>soundEffect_endPursuit</w:t>
             </w:r>
+            <w:proofErr w:type="spellEnd"/>
           </w:p>
         </w:tc>
         <w:tc>
@@ -22358,12 +22788,14 @@
               <w:widowControl w:val="0"/>
               <w:cnfStyle w:val="000000100000" w:firstRow="0" w:lastRow="0" w:firstColumn="0" w:lastColumn="0" w:oddVBand="0" w:evenVBand="0" w:oddHBand="1" w:evenHBand="0" w:firstRowFirstColumn="0" w:firstRowLastColumn="0" w:lastRowFirstColumn="0" w:lastRowLastColumn="0"/>
             </w:pPr>
+            <w:proofErr w:type="spellStart"/>
             <w:r>
               <w:t>sample_</w:t>
             </w:r>
             <w:r>
               <w:t>endPursuit</w:t>
             </w:r>
+            <w:proofErr w:type="spellEnd"/>
           </w:p>
         </w:tc>
       </w:tr>
@@ -22379,9 +22811,11 @@
               <w:keepLines/>
               <w:widowControl w:val="0"/>
             </w:pPr>
+            <w:proofErr w:type="spellStart"/>
             <w:r>
               <w:t>soundVector_enemyLasered</w:t>
             </w:r>
+            <w:proofErr w:type="spellEnd"/>
           </w:p>
         </w:tc>
         <w:tc>
@@ -22395,9 +22829,11 @@
               <w:widowControl w:val="0"/>
               <w:cnfStyle w:val="000000000000" w:firstRow="0" w:lastRow="0" w:firstColumn="0" w:lastColumn="0" w:oddVBand="0" w:evenVBand="0" w:oddHBand="0" w:evenHBand="0" w:firstRowFirstColumn="0" w:firstRowLastColumn="0" w:lastRowFirstColumn="0" w:lastRowLastColumn="0"/>
             </w:pPr>
+            <w:proofErr w:type="spellStart"/>
             <w:r>
               <w:t>soundEffect_enemyLasered</w:t>
             </w:r>
+            <w:proofErr w:type="spellEnd"/>
           </w:p>
         </w:tc>
         <w:tc>
@@ -22411,6 +22847,7 @@
               <w:widowControl w:val="0"/>
               <w:cnfStyle w:val="000000000000" w:firstRow="0" w:lastRow="0" w:firstColumn="0" w:lastColumn="0" w:oddVBand="0" w:evenVBand="0" w:oddHBand="0" w:evenHBand="0" w:firstRowFirstColumn="0" w:firstRowLastColumn="0" w:lastRowFirstColumn="0" w:lastRowLastColumn="0"/>
             </w:pPr>
+            <w:proofErr w:type="spellStart"/>
             <w:r>
               <w:t>sample_</w:t>
             </w:r>
@@ -22420,6 +22857,7 @@
             <w:r>
               <w:t>nemyLasered</w:t>
             </w:r>
+            <w:proofErr w:type="spellEnd"/>
           </w:p>
         </w:tc>
       </w:tr>
@@ -22438,9 +22876,11 @@
               <w:keepLines/>
               <w:widowControl w:val="0"/>
             </w:pPr>
+            <w:proofErr w:type="spellStart"/>
             <w:r>
               <w:t>soundVector_weaponFired</w:t>
             </w:r>
+            <w:proofErr w:type="spellEnd"/>
           </w:p>
         </w:tc>
         <w:tc>
@@ -22454,12 +22894,14 @@
               <w:widowControl w:val="0"/>
               <w:cnfStyle w:val="000000100000" w:firstRow="0" w:lastRow="0" w:firstColumn="0" w:lastColumn="0" w:oddVBand="0" w:evenVBand="0" w:oddHBand="1" w:evenHBand="0" w:firstRowFirstColumn="0" w:firstRowLastColumn="0" w:lastRowFirstColumn="0" w:lastRowLastColumn="0"/>
             </w:pPr>
+            <w:proofErr w:type="spellStart"/>
             <w:r>
               <w:t>soundEffect_</w:t>
             </w:r>
             <w:r>
               <w:t>weaponFired</w:t>
             </w:r>
+            <w:proofErr w:type="spellEnd"/>
           </w:p>
         </w:tc>
         <w:tc>
@@ -22473,12 +22915,14 @@
               <w:widowControl w:val="0"/>
               <w:cnfStyle w:val="000000100000" w:firstRow="0" w:lastRow="0" w:firstColumn="0" w:lastColumn="0" w:oddVBand="0" w:evenVBand="0" w:oddHBand="1" w:evenHBand="0" w:firstRowFirstColumn="0" w:firstRowLastColumn="0" w:lastRowFirstColumn="0" w:lastRowLastColumn="0"/>
             </w:pPr>
+            <w:proofErr w:type="spellStart"/>
             <w:r>
               <w:t>sample_</w:t>
             </w:r>
             <w:r>
               <w:t>soundWeapon</w:t>
             </w:r>
+            <w:proofErr w:type="spellEnd"/>
           </w:p>
         </w:tc>
       </w:tr>
@@ -23123,12 +23567,14 @@
               <w:keepLines/>
               <w:widowControl w:val="0"/>
             </w:pPr>
+            <w:proofErr w:type="spellStart"/>
             <w:r>
               <w:t>soundVector_</w:t>
             </w:r>
             <w:r>
               <w:t>enemyDestroyed</w:t>
             </w:r>
+            <w:proofErr w:type="spellEnd"/>
           </w:p>
         </w:tc>
         <w:tc>
@@ -23142,9 +23588,11 @@
               <w:widowControl w:val="0"/>
               <w:cnfStyle w:val="000000100000" w:firstRow="0" w:lastRow="0" w:firstColumn="0" w:lastColumn="0" w:oddVBand="0" w:evenVBand="0" w:oddHBand="1" w:evenHBand="0" w:firstRowFirstColumn="0" w:firstRowLastColumn="0" w:lastRowFirstColumn="0" w:lastRowLastColumn="0"/>
             </w:pPr>
+            <w:proofErr w:type="spellStart"/>
             <w:r>
               <w:t>soundEffect_enemyDestroyed</w:t>
             </w:r>
+            <w:proofErr w:type="spellEnd"/>
           </w:p>
         </w:tc>
         <w:tc>
@@ -23158,12 +23606,14 @@
               <w:widowControl w:val="0"/>
               <w:cnfStyle w:val="000000100000" w:firstRow="0" w:lastRow="0" w:firstColumn="0" w:lastColumn="0" w:oddVBand="0" w:evenVBand="0" w:oddHBand="1" w:evenHBand="0" w:firstRowFirstColumn="0" w:firstRowLastColumn="0" w:lastRowFirstColumn="0" w:lastRowLastColumn="0"/>
             </w:pPr>
+            <w:proofErr w:type="spellStart"/>
             <w:r>
               <w:t>sample_</w:t>
             </w:r>
             <w:r>
               <w:t>enemyDestroyed</w:t>
             </w:r>
+            <w:proofErr w:type="spellEnd"/>
           </w:p>
         </w:tc>
       </w:tr>
@@ -23179,9 +23629,11 @@
               <w:keepLines/>
               <w:widowControl w:val="0"/>
             </w:pPr>
+            <w:proofErr w:type="spellStart"/>
             <w:r>
               <w:t>soundVector_beginLevel</w:t>
             </w:r>
+            <w:proofErr w:type="spellEnd"/>
           </w:p>
         </w:tc>
         <w:tc>
@@ -23195,9 +23647,11 @@
               <w:widowControl w:val="0"/>
               <w:cnfStyle w:val="000000000000" w:firstRow="0" w:lastRow="0" w:firstColumn="0" w:lastColumn="0" w:oddVBand="0" w:evenVBand="0" w:oddHBand="0" w:evenHBand="0" w:firstRowFirstColumn="0" w:firstRowLastColumn="0" w:lastRowFirstColumn="0" w:lastRowLastColumn="0"/>
             </w:pPr>
+            <w:proofErr w:type="spellStart"/>
             <w:r>
               <w:t>soundEffect_beginLevel</w:t>
             </w:r>
+            <w:proofErr w:type="spellEnd"/>
           </w:p>
         </w:tc>
         <w:tc>
@@ -23211,12 +23665,14 @@
               <w:widowControl w:val="0"/>
               <w:cnfStyle w:val="000000000000" w:firstRow="0" w:lastRow="0" w:firstColumn="0" w:lastColumn="0" w:oddVBand="0" w:evenVBand="0" w:oddHBand="0" w:evenHBand="0" w:firstRowFirstColumn="0" w:firstRowLastColumn="0" w:lastRowFirstColumn="0" w:lastRowLastColumn="0"/>
             </w:pPr>
+            <w:proofErr w:type="spellStart"/>
             <w:r>
               <w:t>sample_</w:t>
             </w:r>
             <w:r>
               <w:t>beginLevel</w:t>
             </w:r>
+            <w:proofErr w:type="spellEnd"/>
           </w:p>
         </w:tc>
       </w:tr>
@@ -23235,6 +23691,7 @@
               <w:keepLines/>
               <w:widowControl w:val="0"/>
             </w:pPr>
+            <w:proofErr w:type="spellStart"/>
             <w:r>
               <w:t>soundVector_l</w:t>
             </w:r>
@@ -23244,6 +23701,7 @@
             <w:r>
               <w:t>Complete</w:t>
             </w:r>
+            <w:proofErr w:type="spellEnd"/>
           </w:p>
         </w:tc>
         <w:tc>
@@ -23257,9 +23715,11 @@
               <w:widowControl w:val="0"/>
               <w:cnfStyle w:val="000000100000" w:firstRow="0" w:lastRow="0" w:firstColumn="0" w:lastColumn="0" w:oddVBand="0" w:evenVBand="0" w:oddHBand="1" w:evenHBand="0" w:firstRowFirstColumn="0" w:firstRowLastColumn="0" w:lastRowFirstColumn="0" w:lastRowLastColumn="0"/>
             </w:pPr>
+            <w:proofErr w:type="spellStart"/>
             <w:r>
               <w:t>soundEffect_levelComplete</w:t>
             </w:r>
+            <w:proofErr w:type="spellEnd"/>
           </w:p>
         </w:tc>
         <w:tc>
@@ -23273,12 +23733,14 @@
               <w:widowControl w:val="0"/>
               <w:cnfStyle w:val="000000100000" w:firstRow="0" w:lastRow="0" w:firstColumn="0" w:lastColumn="0" w:oddVBand="0" w:evenVBand="0" w:oddHBand="1" w:evenHBand="0" w:firstRowFirstColumn="0" w:firstRowLastColumn="0" w:lastRowFirstColumn="0" w:lastRowLastColumn="0"/>
             </w:pPr>
+            <w:proofErr w:type="spellStart"/>
             <w:r>
               <w:t>sample_</w:t>
             </w:r>
             <w:r>
               <w:t>levelComplete</w:t>
             </w:r>
+            <w:proofErr w:type="spellEnd"/>
           </w:p>
         </w:tc>
       </w:tr>
@@ -24448,6 +24910,7 @@
       <w:r>
         <w:t xml:space="preserve">require </w:t>
       </w:r>
+      <w:proofErr w:type="spellStart"/>
       <w:r>
         <w:rPr>
           <w:b/>
@@ -24455,6 +24918,7 @@
         </w:rPr>
         <w:t>objectState</w:t>
       </w:r>
+      <w:proofErr w:type="spellEnd"/>
       <w:r>
         <w:t xml:space="preserve"> </w:t>
       </w:r>
@@ -24482,6 +24946,7 @@
       <w:r>
         <w:t xml:space="preserve">elevator, using </w:t>
       </w:r>
+      <w:proofErr w:type="spellStart"/>
       <w:r>
         <w:rPr>
           <w:b/>
@@ -24489,6 +24954,7 @@
         </w:rPr>
         <w:t>objectFrameCounter</w:t>
       </w:r>
+      <w:proofErr w:type="spellEnd"/>
       <w:r>
         <w:t xml:space="preserve"> </w:t>
       </w:r>
@@ -24498,6 +24964,7 @@
       <w:r>
         <w:t xml:space="preserve">distinguish teleports from regular elevators, where </w:t>
       </w:r>
+      <w:proofErr w:type="spellStart"/>
       <w:r>
         <w:rPr>
           <w:b/>
@@ -24505,6 +24972,7 @@
         </w:rPr>
         <w:t>objectFrameCounter</w:t>
       </w:r>
+      <w:proofErr w:type="spellEnd"/>
       <w:r>
         <w:t xml:space="preserve"> </w:t>
       </w:r>
@@ -24592,6 +25060,7 @@
       <w:r>
         <w:t xml:space="preserve">in </w:t>
       </w:r>
+      <w:proofErr w:type="spellStart"/>
       <w:r>
         <w:rPr>
           <w:b/>
@@ -24601,6 +25070,7 @@
         </w:rPr>
         <w:t>objectFrameCounter</w:t>
       </w:r>
+      <w:proofErr w:type="spellEnd"/>
       <w:r>
         <w:rPr>
           <w:b/>
@@ -24710,6 +25180,7 @@
       <w:r>
         <w:t xml:space="preserve">files were created in the level asset folders, with the </w:t>
       </w:r>
+      <w:proofErr w:type="spellStart"/>
       <w:r>
         <w:rPr>
           <w:b/>
@@ -24717,6 +25188,7 @@
         </w:rPr>
         <w:t>BMPConverter</w:t>
       </w:r>
+      <w:proofErr w:type="spellEnd"/>
       <w:r>
         <w:t xml:space="preserve"> console app updated to convert and include these in the generated level atlas data files</w:t>
       </w:r>
@@ -24780,6 +25252,7 @@
       <w:r>
         <w:t xml:space="preserve">A new </w:t>
       </w:r>
+      <w:proofErr w:type="spellStart"/>
       <w:r>
         <w:rPr>
           <w:b/>
@@ -24787,6 +25260,7 @@
         </w:rPr>
         <w:t>rideTeleport</w:t>
       </w:r>
+      <w:proofErr w:type="spellEnd"/>
       <w:r>
         <w:t xml:space="preserve"> routine was introduced</w:t>
       </w:r>
@@ -24854,6 +25328,7 @@
       <w:r>
         <w:t xml:space="preserve">Find the destination teleport object (elevator), held in </w:t>
       </w:r>
+      <w:proofErr w:type="spellStart"/>
       <w:r>
         <w:rPr>
           <w:b/>
@@ -24863,6 +25338,7 @@
         </w:rPr>
         <w:t>objectFrameCounter</w:t>
       </w:r>
+      <w:proofErr w:type="spellEnd"/>
       <w:r>
         <w:t>.</w:t>
       </w:r>
@@ -25576,6 +26052,7 @@
       <w:r>
         <w:t xml:space="preserve">A new </w:t>
       </w:r>
+      <w:proofErr w:type="spellStart"/>
       <w:r>
         <w:rPr>
           <w:b/>
@@ -25585,6 +26062,7 @@
         </w:rPr>
         <w:t>drawTile</w:t>
       </w:r>
+      <w:proofErr w:type="spellEnd"/>
       <w:r>
         <w:t xml:space="preserve"> routine was </w:t>
       </w:r>
@@ -27310,6 +27788,7 @@
       <w:r>
         <w:t xml:space="preserve">The </w:t>
       </w:r>
+      <w:proofErr w:type="spellStart"/>
       <w:r>
         <w:rPr>
           <w:b/>
@@ -27324,6 +27803,7 @@
         </w:rPr>
         <w:t>Converter</w:t>
       </w:r>
+      <w:proofErr w:type="spellEnd"/>
       <w:r>
         <w:t xml:space="preserve"> console app and game were updated to incorporate these</w:t>
       </w:r>
@@ -27565,6 +28045,7 @@
       <w:r>
         <w:t xml:space="preserve">The </w:t>
       </w:r>
+      <w:proofErr w:type="spellStart"/>
       <w:r>
         <w:rPr>
           <w:i/>
@@ -27572,9 +28053,11 @@
         </w:rPr>
         <w:t>drawLaser</w:t>
       </w:r>
+      <w:proofErr w:type="spellEnd"/>
       <w:r>
         <w:t xml:space="preserve"> and </w:t>
       </w:r>
+      <w:proofErr w:type="spellStart"/>
       <w:r>
         <w:rPr>
           <w:i/>
@@ -27582,6 +28065,7 @@
         </w:rPr>
         <w:t>loadLevelFile</w:t>
       </w:r>
+      <w:proofErr w:type="spellEnd"/>
       <w:r>
         <w:rPr>
           <w:i/>
@@ -27624,7 +28108,21 @@
         <w:rPr>
           <w:rFonts w:ascii="Aptos" w:hAnsi="Aptos"/>
         </w:rPr>
-        <w:t xml:space="preserve">With help from ChrisB </w:t>
+        <w:t xml:space="preserve">With help from </w:t>
+      </w:r>
+      <w:proofErr w:type="spellStart"/>
+      <w:r>
+        <w:rPr>
+          <w:rFonts w:ascii="Aptos" w:hAnsi="Aptos"/>
+        </w:rPr>
+        <w:t>ChrisB</w:t>
+      </w:r>
+      <w:proofErr w:type="spellEnd"/>
+      <w:r>
+        <w:rPr>
+          <w:rFonts w:ascii="Aptos" w:hAnsi="Aptos"/>
+        </w:rPr>
+        <w:t xml:space="preserve"> </w:t>
       </w:r>
       <w:r>
         <w:rPr>
@@ -28233,6 +28731,7 @@
       <w:r>
         <w:t xml:space="preserve">I started by creating a </w:t>
       </w:r>
+      <w:proofErr w:type="spellStart"/>
       <w:r>
         <w:rPr>
           <w:b/>
@@ -28240,6 +28739,7 @@
         </w:rPr>
         <w:t>weeping_angels</w:t>
       </w:r>
+      <w:proofErr w:type="spellEnd"/>
       <w:r>
         <w:t xml:space="preserve"> feature branch</w:t>
       </w:r>
@@ -28318,6 +28818,7 @@
       <w:r>
         <w:t xml:space="preserve"> </w:t>
       </w:r>
+      <w:proofErr w:type="spellStart"/>
       <w:r>
         <w:rPr>
           <w:i/>
@@ -28332,6 +28833,7 @@
         </w:rPr>
         <w:t>’s</w:t>
       </w:r>
+      <w:proofErr w:type="spellEnd"/>
       <w:r>
         <w:t xml:space="preserve"> </w:t>
       </w:r>
@@ -28518,35 +29020,46 @@
       <w:r>
         <w:t xml:space="preserve"> </w:t>
       </w:r>
+      <w:proofErr w:type="spellStart"/>
       <w:r>
         <w:rPr>
           <w:i/>
           <w:iCs/>
         </w:rPr>
-        <w:t xml:space="preserve">enemyType </w:t>
-      </w:r>
-      <w:r>
-        <w:t>zero</w:t>
-      </w:r>
-      <w:r>
-        <w:t>-</w:t>
-      </w:r>
-      <w:r>
-        <w:t>page variable</w:t>
-      </w:r>
-      <w:r>
-        <w:t xml:space="preserve">, </w:t>
-      </w:r>
-      <w:r>
-        <w:t xml:space="preserve">initialized in the </w:t>
-      </w:r>
+        <w:t>enemyType</w:t>
+      </w:r>
+      <w:proofErr w:type="spellEnd"/>
       <w:r>
         <w:rPr>
           <w:i/>
           <w:iCs/>
         </w:rPr>
+        <w:t xml:space="preserve"> </w:t>
+      </w:r>
+      <w:r>
+        <w:t>zero</w:t>
+      </w:r>
+      <w:r>
+        <w:t>-</w:t>
+      </w:r>
+      <w:r>
+        <w:t>page variable</w:t>
+      </w:r>
+      <w:r>
+        <w:t xml:space="preserve">, </w:t>
+      </w:r>
+      <w:r>
+        <w:t xml:space="preserve">initialized in the </w:t>
+      </w:r>
+      <w:proofErr w:type="spellStart"/>
+      <w:r>
+        <w:rPr>
+          <w:i/>
+          <w:iCs/>
+        </w:rPr>
         <w:t>initializeLevel</w:t>
       </w:r>
+      <w:proofErr w:type="spellEnd"/>
       <w:r>
         <w:t xml:space="preserve"> routine</w:t>
       </w:r>
@@ -28622,6 +29135,7 @@
       <w:r>
         <w:t xml:space="preserve">the </w:t>
       </w:r>
+      <w:proofErr w:type="spellStart"/>
       <w:r>
         <w:rPr>
           <w:i/>
@@ -28629,6 +29143,7 @@
         </w:rPr>
         <w:t>enemyAI</w:t>
       </w:r>
+      <w:proofErr w:type="spellEnd"/>
       <w:r>
         <w:t xml:space="preserve"> routine </w:t>
       </w:r>
@@ -28786,6 +29301,7 @@
         </w:rPr>
         <w:t xml:space="preserve"> </w:t>
       </w:r>
+      <w:proofErr w:type="spellStart"/>
       <w:r>
         <w:rPr>
           <w:i/>
@@ -28793,9 +29309,11 @@
         </w:rPr>
         <w:t>sizeLo</w:t>
       </w:r>
+      <w:proofErr w:type="spellEnd"/>
       <w:r>
         <w:t xml:space="preserve"> and </w:t>
       </w:r>
+      <w:proofErr w:type="spellStart"/>
       <w:r>
         <w:rPr>
           <w:i/>
@@ -28803,9 +29321,11 @@
         </w:rPr>
         <w:t>sizeHi</w:t>
       </w:r>
+      <w:proofErr w:type="spellEnd"/>
       <w:r>
         <w:t xml:space="preserve"> zero-page variables which were used by the </w:t>
       </w:r>
+      <w:proofErr w:type="spellStart"/>
       <w:r>
         <w:rPr>
           <w:i/>
@@ -28813,6 +29333,7 @@
         </w:rPr>
         <w:t>memcpy</w:t>
       </w:r>
+      <w:proofErr w:type="spellEnd"/>
       <w:r>
         <w:t xml:space="preserve"> routine (level.6502)</w:t>
       </w:r>
@@ -28848,6 +29369,7 @@
         </w:rPr>
         <w:t xml:space="preserve">updated the </w:t>
       </w:r>
+      <w:proofErr w:type="spellStart"/>
       <w:r>
         <w:rPr>
           <w:rFonts w:ascii="Aptos" w:hAnsi="Aptos"/>
@@ -28855,6 +29377,7 @@
         </w:rPr>
         <w:t>enemyAI</w:t>
       </w:r>
+      <w:proofErr w:type="spellEnd"/>
       <w:r>
         <w:rPr>
           <w:rFonts w:ascii="Aptos" w:hAnsi="Aptos"/>
@@ -29239,6 +29762,7 @@
       <w:r>
         <w:t xml:space="preserve">refactoring the </w:t>
       </w:r>
+      <w:proofErr w:type="spellStart"/>
       <w:r>
         <w:rPr>
           <w:i/>
@@ -29251,7 +29775,15 @@
           <w:i/>
           <w:iCs/>
         </w:rPr>
-        <w:t>Lo/Hi</w:t>
+        <w:t>Lo</w:t>
+      </w:r>
+      <w:proofErr w:type="spellEnd"/>
+      <w:r>
+        <w:rPr>
+          <w:i/>
+          <w:iCs/>
+        </w:rPr>
+        <w:t>/Hi</w:t>
       </w:r>
       <w:r>
         <w:t xml:space="preserve"> code to be index-based, rather than address-based.</w:t>
@@ -29500,6 +30032,7 @@
         </w:rPr>
         <w:t xml:space="preserve">, or using flashing colors.  The palette inversion idea was supported by </w:t>
       </w:r>
+      <w:proofErr w:type="spellStart"/>
       <w:r>
         <w:rPr>
           <w:rFonts w:ascii="Aptos" w:hAnsi="Aptos"/>
@@ -29509,6 +30042,7 @@
         </w:rPr>
         <w:t>TodyLobster</w:t>
       </w:r>
+      <w:proofErr w:type="spellEnd"/>
       <w:r>
         <w:rPr>
           <w:rFonts w:ascii="Aptos" w:hAnsi="Aptos"/>
@@ -29741,6 +30275,7 @@
         </w:rPr>
         <w:t xml:space="preserve">by introducing a new </w:t>
       </w:r>
+      <w:proofErr w:type="spellStart"/>
       <w:r>
         <w:rPr>
           <w:rFonts w:ascii="Aptos" w:hAnsi="Aptos"/>
@@ -29751,6 +30286,7 @@
         </w:rPr>
         <w:t>setInvertedLevelPalette</w:t>
       </w:r>
+      <w:proofErr w:type="spellEnd"/>
       <w:r>
         <w:rPr>
           <w:rFonts w:ascii="Aptos" w:hAnsi="Aptos"/>
@@ -29758,6 +30294,7 @@
         </w:rPr>
         <w:t xml:space="preserve"> routine, which takes the place of </w:t>
       </w:r>
+      <w:proofErr w:type="spellStart"/>
       <w:r>
         <w:rPr>
           <w:rFonts w:ascii="Aptos" w:hAnsi="Aptos"/>
@@ -29768,6 +30305,7 @@
         </w:rPr>
         <w:t>setBlackPalette</w:t>
       </w:r>
+      <w:proofErr w:type="spellEnd"/>
       <w:r>
         <w:rPr>
           <w:rFonts w:ascii="Aptos" w:hAnsi="Aptos"/>
@@ -29880,6 +30418,7 @@
         </w:rPr>
         <w:t xml:space="preserve">As part of the change, I was able to remove the existing 16-byte </w:t>
       </w:r>
+      <w:proofErr w:type="spellStart"/>
       <w:r>
         <w:rPr>
           <w:rFonts w:ascii="Aptos" w:hAnsi="Aptos"/>
@@ -29891,6 +30430,7 @@
         </w:rPr>
         <w:t>blackPalette</w:t>
       </w:r>
+      <w:proofErr w:type="spellEnd"/>
       <w:r>
         <w:rPr>
           <w:rFonts w:ascii="Aptos" w:hAnsi="Aptos"/>
@@ -29898,6 +30438,7 @@
         </w:rPr>
         <w:t xml:space="preserve"> data structure, reusing the memory to hold the level’s palette instead.  This free up sufficient code space to implement the </w:t>
       </w:r>
+      <w:proofErr w:type="spellStart"/>
       <w:r>
         <w:rPr>
           <w:rFonts w:ascii="Aptos" w:hAnsi="Aptos"/>
@@ -29909,6 +30450,7 @@
         </w:rPr>
         <w:t>setInvertedLevelPalette</w:t>
       </w:r>
+      <w:proofErr w:type="spellEnd"/>
       <w:r>
         <w:rPr>
           <w:rFonts w:ascii="Aptos" w:hAnsi="Aptos"/>
@@ -31900,7 +32442,7 @@
               <w:cnfStyle w:val="000000000000" w:firstRow="0" w:lastRow="0" w:firstColumn="0" w:lastColumn="0" w:oddVBand="0" w:evenVBand="0" w:oddHBand="0" w:evenHBand="0" w:firstRowFirstColumn="0" w:firstRowLastColumn="0" w:lastRowFirstColumn="0" w:lastRowLastColumn="0"/>
             </w:pPr>
             <w:r>
-              <w:t>1728</w:t>
+              <w:t>1727</w:t>
             </w:r>
           </w:p>
         </w:tc>
@@ -32477,7 +33019,7 @@
               <w:cnfStyle w:val="000000100000" w:firstRow="0" w:lastRow="0" w:firstColumn="0" w:lastColumn="0" w:oddVBand="0" w:evenVBand="0" w:oddHBand="1" w:evenHBand="0" w:firstRowFirstColumn="0" w:firstRowLastColumn="0" w:lastRowFirstColumn="0" w:lastRowLastColumn="0"/>
             </w:pPr>
             <w:r>
-              <w:t>1728</w:t>
+              <w:t>1727</w:t>
             </w:r>
           </w:p>
         </w:tc>
@@ -33003,7 +33545,7 @@
               <w:cnfStyle w:val="000000000000" w:firstRow="0" w:lastRow="0" w:firstColumn="0" w:lastColumn="0" w:oddVBand="0" w:evenVBand="0" w:oddHBand="0" w:evenHBand="0" w:firstRowFirstColumn="0" w:firstRowLastColumn="0" w:lastRowFirstColumn="0" w:lastRowLastColumn="0"/>
             </w:pPr>
             <w:r>
-              <w:t>1757</w:t>
+              <w:t>1727</w:t>
             </w:r>
           </w:p>
         </w:tc>
@@ -33027,7 +33569,7 @@
               <w:jc w:val="center"/>
             </w:pPr>
             <w:r>
-              <w:t>5680</w:t>
+              <w:t>5662</w:t>
             </w:r>
           </w:p>
         </w:tc>
@@ -33085,7 +33627,7 @@
               <w:jc w:val="center"/>
             </w:pPr>
             <w:r>
-              <w:t>56CC</w:t>
+              <w:t>56AE</w:t>
             </w:r>
           </w:p>
         </w:tc>
@@ -33138,7 +33680,7 @@
               <w:jc w:val="center"/>
             </w:pPr>
             <w:r>
-              <w:t>60F4</w:t>
+              <w:t>60D6</w:t>
             </w:r>
           </w:p>
         </w:tc>
@@ -33553,6 +34095,7 @@
         </w:rPr>
         <w:t xml:space="preserve"> </w:t>
       </w:r>
+      <w:proofErr w:type="spellStart"/>
       <w:r>
         <w:rPr>
           <w:i/>
@@ -33560,6 +34103,7 @@
         </w:rPr>
         <w:t>selectDFS</w:t>
       </w:r>
+      <w:proofErr w:type="spellEnd"/>
       <w:r>
         <w:rPr>
           <w:b/>
@@ -33581,6 +34125,7 @@
         </w:rPr>
         <w:t xml:space="preserve"> </w:t>
       </w:r>
+      <w:proofErr w:type="spellStart"/>
       <w:r>
         <w:rPr>
           <w:i/>
@@ -33588,6 +34133,7 @@
         </w:rPr>
         <w:t>releaseDFS</w:t>
       </w:r>
+      <w:proofErr w:type="spellEnd"/>
       <w:r>
         <w:t xml:space="preserve">, to </w:t>
       </w:r>
@@ -33615,7 +34161,10 @@
         <w:t>2</w:t>
       </w:r>
       <w:r>
-        <w:t>37</w:t>
+        <w:t>6</w:t>
+      </w:r>
+      <w:r>
+        <w:t>7</w:t>
       </w:r>
       <w:r>
         <w:t xml:space="preserve"> bytes of unused memory, between </w:t>
@@ -33905,7 +34454,7 @@
               <w:cnfStyle w:val="000000100000" w:firstRow="0" w:lastRow="0" w:firstColumn="0" w:lastColumn="0" w:oddVBand="0" w:evenVBand="0" w:oddHBand="1" w:evenHBand="0" w:firstRowFirstColumn="0" w:firstRowLastColumn="0" w:lastRowFirstColumn="0" w:lastRowLastColumn="0"/>
             </w:pPr>
             <w:r>
-              <w:t>1728</w:t>
+              <w:t>1727</w:t>
             </w:r>
           </w:p>
         </w:tc>
@@ -34449,10 +34998,7 @@
               <w:cnfStyle w:val="000000000000" w:firstRow="0" w:lastRow="0" w:firstColumn="0" w:lastColumn="0" w:oddVBand="0" w:evenVBand="0" w:oddHBand="0" w:evenHBand="0" w:firstRowFirstColumn="0" w:firstRowLastColumn="0" w:lastRowFirstColumn="0" w:lastRowLastColumn="0"/>
             </w:pPr>
             <w:r>
-              <w:t>17</w:t>
-            </w:r>
-            <w:r>
-              <w:t>57</w:t>
+              <w:t>1727</w:t>
             </w:r>
           </w:p>
         </w:tc>
@@ -34476,10 +35022,7 @@
               <w:jc w:val="center"/>
             </w:pPr>
             <w:r>
-              <w:t>56</w:t>
-            </w:r>
-            <w:r>
-              <w:t>80</w:t>
+              <w:t>5662</w:t>
             </w:r>
           </w:p>
         </w:tc>
@@ -34537,10 +35080,7 @@
               <w:jc w:val="center"/>
             </w:pPr>
             <w:r>
-              <w:t>56</w:t>
-            </w:r>
-            <w:r>
-              <w:t>CC</w:t>
+              <w:t>56AE</w:t>
             </w:r>
           </w:p>
         </w:tc>
@@ -34864,6 +35404,7 @@
         </w:rPr>
         <w:t xml:space="preserve"> </w:t>
       </w:r>
+      <w:proofErr w:type="spellStart"/>
       <w:r>
         <w:rPr>
           <w:i/>
@@ -34871,6 +35412,7 @@
         </w:rPr>
         <w:t>selectDFS</w:t>
       </w:r>
+      <w:proofErr w:type="spellEnd"/>
       <w:r>
         <w:rPr>
           <w:b/>
@@ -34892,6 +35434,7 @@
         </w:rPr>
         <w:t xml:space="preserve"> </w:t>
       </w:r>
+      <w:proofErr w:type="spellStart"/>
       <w:r>
         <w:rPr>
           <w:i/>
@@ -34899,6 +35442,7 @@
         </w:rPr>
         <w:t>releaseDFS</w:t>
       </w:r>
+      <w:proofErr w:type="spellEnd"/>
       <w:r>
         <w:t xml:space="preserve">, to </w:t>
       </w:r>
@@ -34908,6 +35452,7 @@
       <w:r>
         <w:t xml:space="preserve"> when </w:t>
       </w:r>
+      <w:proofErr w:type="spellStart"/>
       <w:r>
         <w:rPr>
           <w:i/>
@@ -34915,6 +35460,7 @@
         </w:rPr>
         <w:t>loadLevelFile</w:t>
       </w:r>
+      <w:proofErr w:type="spellEnd"/>
       <w:r>
         <w:t xml:space="preserve"> is invoked.</w:t>
       </w:r>
@@ -35086,7 +35632,7 @@
               <w:jc w:val="center"/>
             </w:pPr>
             <w:r>
-              <w:t>5680</w:t>
+              <w:t>5662</w:t>
             </w:r>
           </w:p>
         </w:tc>
@@ -35144,7 +35690,7 @@
               <w:jc w:val="center"/>
             </w:pPr>
             <w:r>
-              <w:t>56CC</w:t>
+              <w:t>56AE</w:t>
             </w:r>
           </w:p>
         </w:tc>
@@ -35202,7 +35748,7 @@
               <w:jc w:val="center"/>
             </w:pPr>
             <w:r>
-              <w:t>60F4</w:t>
+              <w:t>60D6</w:t>
             </w:r>
           </w:p>
         </w:tc>
@@ -35442,7 +35988,11 @@
         <w:t xml:space="preserve"> is loaded at address &amp;</w:t>
       </w:r>
       <w:r>
-        <w:t>5680</w:t>
+        <w:rPr>
+          <w:b/>
+          <w:bCs/>
+        </w:rPr>
+        <w:t>5662</w:t>
       </w:r>
       <w:r>
         <w:t xml:space="preserve">, </w:t>
@@ -35476,6 +36026,7 @@
         </w:rPr>
         <w:t xml:space="preserve"> </w:t>
       </w:r>
+      <w:proofErr w:type="spellStart"/>
       <w:r>
         <w:rPr>
           <w:i/>
@@ -35483,6 +36034,7 @@
         </w:rPr>
         <w:t>selectDFS</w:t>
       </w:r>
+      <w:proofErr w:type="spellEnd"/>
       <w:r>
         <w:rPr>
           <w:b/>
@@ -35504,6 +36056,7 @@
         </w:rPr>
         <w:t xml:space="preserve"> </w:t>
       </w:r>
+      <w:proofErr w:type="spellStart"/>
       <w:r>
         <w:rPr>
           <w:i/>
@@ -35511,12 +36064,14 @@
         </w:rPr>
         <w:t>releaseDFS</w:t>
       </w:r>
+      <w:proofErr w:type="spellEnd"/>
       <w:r>
         <w:t xml:space="preserve">, to </w:t>
       </w:r>
       <w:r>
         <w:t xml:space="preserve">save and restore code located in page &amp;17 (Model B &amp; Master) or &amp;1C (Model B Plus), that DFS modifies when </w:t>
       </w:r>
+      <w:proofErr w:type="spellStart"/>
       <w:r>
         <w:rPr>
           <w:i/>
@@ -35524,6 +36079,7 @@
         </w:rPr>
         <w:t>loadLevelFile</w:t>
       </w:r>
+      <w:proofErr w:type="spellEnd"/>
       <w:r>
         <w:t xml:space="preserve"> is invoked to load the finale experience</w:t>
       </w:r>
@@ -36096,6 +36652,7 @@
       <w:r>
         <w:t xml:space="preserve">Removed </w:t>
       </w:r>
+      <w:proofErr w:type="spellStart"/>
       <w:r>
         <w:rPr>
           <w:i/>
@@ -36103,9 +36660,11 @@
         </w:rPr>
         <w:t>objectWidth</w:t>
       </w:r>
+      <w:proofErr w:type="spellEnd"/>
       <w:r>
         <w:t xml:space="preserve"> &amp; </w:t>
       </w:r>
+      <w:proofErr w:type="spellStart"/>
       <w:r>
         <w:rPr>
           <w:i/>
@@ -36113,6 +36672,7 @@
         </w:rPr>
         <w:t>objectHeight</w:t>
       </w:r>
+      <w:proofErr w:type="spellEnd"/>
       <w:r>
         <w:t xml:space="preserve"> arrays</w:t>
       </w:r>
@@ -36142,6 +36702,7 @@
       <w:r>
         <w:t xml:space="preserve">, </w:t>
       </w:r>
+      <w:proofErr w:type="spellStart"/>
       <w:r>
         <w:rPr>
           <w:i/>
@@ -36149,12 +36710,14 @@
         </w:rPr>
         <w:t>widthMinusOne</w:t>
       </w:r>
+      <w:proofErr w:type="spellEnd"/>
       <w:r>
         <w:t xml:space="preserve">, </w:t>
       </w:r>
       <w:r>
         <w:t xml:space="preserve">and </w:t>
       </w:r>
+      <w:proofErr w:type="spellStart"/>
       <w:r>
         <w:rPr>
           <w:i/>
@@ -36162,6 +36725,7 @@
         </w:rPr>
         <w:t>heightMinusOne</w:t>
       </w:r>
+      <w:proofErr w:type="spellEnd"/>
       <w:r>
         <w:t xml:space="preserve">.  </w:t>
       </w:r>
@@ -36183,6 +36747,7 @@
       <w:r>
         <w:t xml:space="preserve"> which were previously subtracting one from </w:t>
       </w:r>
+      <w:proofErr w:type="spellStart"/>
       <w:r>
         <w:rPr>
           <w:i/>
@@ -36190,9 +36755,11 @@
         </w:rPr>
         <w:t>objectWidth</w:t>
       </w:r>
+      <w:proofErr w:type="spellEnd"/>
       <w:r>
         <w:t xml:space="preserve"> &amp; </w:t>
       </w:r>
+      <w:proofErr w:type="spellStart"/>
       <w:r>
         <w:rPr>
           <w:i/>
@@ -36214,6 +36781,7 @@
         </w:rPr>
         <w:t>ght</w:t>
       </w:r>
+      <w:proofErr w:type="spellEnd"/>
       <w:r>
         <w:t xml:space="preserve">.  </w:t>
       </w:r>
@@ -36239,6 +36807,7 @@
       <w:r>
         <w:t xml:space="preserve"> and </w:t>
       </w:r>
+      <w:proofErr w:type="spellStart"/>
       <w:r>
         <w:rPr>
           <w:i/>
@@ -36246,6 +36815,7 @@
         </w:rPr>
         <w:t>objectState</w:t>
       </w:r>
+      <w:proofErr w:type="spellEnd"/>
       <w:r>
         <w:t xml:space="preserve"> array</w:t>
       </w:r>
@@ -36363,6 +36933,7 @@
       <w:r>
         <w:t xml:space="preserve">As part of this change the </w:t>
       </w:r>
+      <w:proofErr w:type="spellStart"/>
       <w:r>
         <w:rPr>
           <w:i/>
@@ -36370,9 +36941,11 @@
         </w:rPr>
         <w:t>objectFrameCallbackLo</w:t>
       </w:r>
+      <w:proofErr w:type="spellEnd"/>
       <w:r>
         <w:t xml:space="preserve"> and </w:t>
       </w:r>
+      <w:proofErr w:type="spellStart"/>
       <w:r>
         <w:rPr>
           <w:i/>
@@ -36380,9 +36953,11 @@
         </w:rPr>
         <w:t>objectFrameCallbackHi</w:t>
       </w:r>
+      <w:proofErr w:type="spellEnd"/>
       <w:r>
         <w:t xml:space="preserve"> arrays were merged into a single </w:t>
       </w:r>
+      <w:proofErr w:type="spellStart"/>
       <w:r>
         <w:rPr>
           <w:i/>
@@ -36390,6 +36965,7 @@
         </w:rPr>
         <w:t>objectFrameCallback</w:t>
       </w:r>
+      <w:proofErr w:type="spellEnd"/>
       <w:r>
         <w:t xml:space="preserve"> array.</w:t>
       </w:r>
@@ -36593,6 +37169,7 @@
       <w:r>
         <w:t xml:space="preserve">JMP </w:t>
       </w:r>
+      <w:proofErr w:type="spellStart"/>
       <w:r>
         <w:rPr>
           <w:i/>
@@ -36601,8 +37178,13 @@
         <w:t>xxx</w:t>
       </w:r>
       <w:r>
-        <w:t xml:space="preserve">x instead of JSR </w:t>
-      </w:r>
+        <w:t>x</w:t>
+      </w:r>
+      <w:proofErr w:type="spellEnd"/>
+      <w:r>
+        <w:t xml:space="preserve"> instead of JSR </w:t>
+      </w:r>
+      <w:proofErr w:type="spellStart"/>
       <w:r>
         <w:rPr>
           <w:i/>
@@ -36610,6 +37192,7 @@
         </w:rPr>
         <w:t>xxxx</w:t>
       </w:r>
+      <w:proofErr w:type="spellEnd"/>
       <w:r>
         <w:t xml:space="preserve">, </w:t>
       </w:r>
@@ -36821,7 +37404,15 @@
         <w:t>‘</w:t>
       </w:r>
       <w:r>
-        <w:t>CMP #1 : BNE</w:t>
+        <w:t>CMP #</w:t>
+      </w:r>
+      <w:proofErr w:type="gramStart"/>
+      <w:r>
+        <w:t>1 :</w:t>
+      </w:r>
+      <w:proofErr w:type="gramEnd"/>
+      <w:r>
+        <w:t xml:space="preserve"> BNE</w:t>
       </w:r>
       <w:r>
         <w:t xml:space="preserve"> </w:t>
@@ -36843,7 +37434,15 @@
         <w:t>instructions with ‘</w:t>
       </w:r>
       <w:r>
-        <w:t>LSR A : BCS</w:t>
+        <w:t xml:space="preserve">LSR </w:t>
+      </w:r>
+      <w:proofErr w:type="gramStart"/>
+      <w:r>
+        <w:t>A :</w:t>
+      </w:r>
+      <w:proofErr w:type="gramEnd"/>
+      <w:r>
+        <w:t xml:space="preserve"> BCS</w:t>
       </w:r>
       <w:r>
         <w:t xml:space="preserve"> </w:t>
@@ -36942,8 +37541,9 @@
           <w:sz w:val="18"/>
           <w:szCs w:val="18"/>
         </w:rPr>
-        <w:t xml:space="preserve"> A</w:t>
-      </w:r>
+        <w:t xml:space="preserve"> </w:t>
+      </w:r>
+      <w:proofErr w:type="gramStart"/>
       <w:r>
         <w:rPr>
           <w:rFonts w:ascii="Cascadia Code" w:hAnsi="Cascadia Code"/>
@@ -36952,7 +37552,7 @@
           <w:sz w:val="18"/>
           <w:szCs w:val="18"/>
         </w:rPr>
-        <w:t>l</w:t>
+        <w:t>A</w:t>
       </w:r>
       <w:r>
         <w:rPr>
@@ -36962,7 +37562,7 @@
           <w:sz w:val="18"/>
           <w:szCs w:val="18"/>
         </w:rPr>
-        <w:t xml:space="preserve"> </w:t>
+        <w:t>l</w:t>
       </w:r>
       <w:r>
         <w:rPr>
@@ -36972,7 +37572,7 @@
           <w:sz w:val="18"/>
           <w:szCs w:val="18"/>
         </w:rPr>
-        <w:t xml:space="preserve">: </w:t>
+        <w:t xml:space="preserve"> </w:t>
       </w:r>
       <w:r>
         <w:rPr>
@@ -36982,8 +37582,9 @@
           <w:sz w:val="18"/>
           <w:szCs w:val="18"/>
         </w:rPr>
-        <w:t>CMP</w:t>
-      </w:r>
+        <w:t>:</w:t>
+      </w:r>
+      <w:proofErr w:type="gramEnd"/>
       <w:r>
         <w:rPr>
           <w:rFonts w:ascii="Cascadia Code" w:hAnsi="Cascadia Code"/>
@@ -36992,7 +37593,7 @@
           <w:sz w:val="18"/>
           <w:szCs w:val="18"/>
         </w:rPr>
-        <w:t xml:space="preserve"> Bl</w:t>
+        <w:t xml:space="preserve"> </w:t>
       </w:r>
       <w:r>
         <w:rPr>
@@ -37002,7 +37603,7 @@
           <w:sz w:val="18"/>
           <w:szCs w:val="18"/>
         </w:rPr>
-        <w:t xml:space="preserve"> : </w:t>
+        <w:t>CMP</w:t>
       </w:r>
       <w:r>
         <w:rPr>
@@ -37012,8 +37613,9 @@
           <w:sz w:val="18"/>
           <w:szCs w:val="18"/>
         </w:rPr>
-        <w:t>LDA</w:t>
-      </w:r>
+        <w:t xml:space="preserve"> </w:t>
+      </w:r>
+      <w:proofErr w:type="gramStart"/>
       <w:r>
         <w:rPr>
           <w:rFonts w:ascii="Cascadia Code" w:hAnsi="Cascadia Code"/>
@@ -37022,7 +37624,7 @@
           <w:sz w:val="18"/>
           <w:szCs w:val="18"/>
         </w:rPr>
-        <w:t xml:space="preserve"> Ah</w:t>
+        <w:t>Bl</w:t>
       </w:r>
       <w:r>
         <w:rPr>
@@ -37032,8 +37634,9 @@
           <w:sz w:val="18"/>
           <w:szCs w:val="18"/>
         </w:rPr>
-        <w:t xml:space="preserve"> : </w:t>
-      </w:r>
+        <w:t xml:space="preserve"> :</w:t>
+      </w:r>
+      <w:proofErr w:type="gramEnd"/>
       <w:r>
         <w:rPr>
           <w:rFonts w:ascii="Cascadia Code" w:hAnsi="Cascadia Code"/>
@@ -37042,7 +37645,7 @@
           <w:sz w:val="18"/>
           <w:szCs w:val="18"/>
         </w:rPr>
-        <w:t>SBC</w:t>
+        <w:t xml:space="preserve"> </w:t>
       </w:r>
       <w:r>
         <w:rPr>
@@ -37052,7 +37655,7 @@
           <w:sz w:val="18"/>
           <w:szCs w:val="18"/>
         </w:rPr>
-        <w:t xml:space="preserve"> Bh</w:t>
+        <w:t>LDA</w:t>
       </w:r>
       <w:r>
         <w:rPr>
@@ -37062,7 +37665,93 @@
           <w:sz w:val="18"/>
           <w:szCs w:val="18"/>
         </w:rPr>
-        <w:t xml:space="preserve"> : </w:t>
+        <w:t xml:space="preserve"> </w:t>
+      </w:r>
+      <w:proofErr w:type="gramStart"/>
+      <w:r>
+        <w:rPr>
+          <w:rFonts w:ascii="Cascadia Code" w:hAnsi="Cascadia Code"/>
+          <w:b/>
+          <w:bCs/>
+          <w:sz w:val="18"/>
+          <w:szCs w:val="18"/>
+        </w:rPr>
+        <w:t>Ah</w:t>
+      </w:r>
+      <w:r>
+        <w:rPr>
+          <w:rFonts w:ascii="Cascadia Code" w:hAnsi="Cascadia Code"/>
+          <w:b/>
+          <w:bCs/>
+          <w:sz w:val="18"/>
+          <w:szCs w:val="18"/>
+        </w:rPr>
+        <w:t xml:space="preserve"> :</w:t>
+      </w:r>
+      <w:proofErr w:type="gramEnd"/>
+      <w:r>
+        <w:rPr>
+          <w:rFonts w:ascii="Cascadia Code" w:hAnsi="Cascadia Code"/>
+          <w:b/>
+          <w:bCs/>
+          <w:sz w:val="18"/>
+          <w:szCs w:val="18"/>
+        </w:rPr>
+        <w:t xml:space="preserve"> </w:t>
+      </w:r>
+      <w:r>
+        <w:rPr>
+          <w:rFonts w:ascii="Cascadia Code" w:hAnsi="Cascadia Code"/>
+          <w:b/>
+          <w:bCs/>
+          <w:sz w:val="18"/>
+          <w:szCs w:val="18"/>
+        </w:rPr>
+        <w:t>SBC</w:t>
+      </w:r>
+      <w:r>
+        <w:rPr>
+          <w:rFonts w:ascii="Cascadia Code" w:hAnsi="Cascadia Code"/>
+          <w:b/>
+          <w:bCs/>
+          <w:sz w:val="18"/>
+          <w:szCs w:val="18"/>
+        </w:rPr>
+        <w:t xml:space="preserve"> </w:t>
+      </w:r>
+      <w:proofErr w:type="spellStart"/>
+      <w:proofErr w:type="gramStart"/>
+      <w:r>
+        <w:rPr>
+          <w:rFonts w:ascii="Cascadia Code" w:hAnsi="Cascadia Code"/>
+          <w:b/>
+          <w:bCs/>
+          <w:sz w:val="18"/>
+          <w:szCs w:val="18"/>
+        </w:rPr>
+        <w:t>Bh</w:t>
+      </w:r>
+      <w:proofErr w:type="spellEnd"/>
+      <w:r>
+        <w:rPr>
+          <w:rFonts w:ascii="Cascadia Code" w:hAnsi="Cascadia Code"/>
+          <w:b/>
+          <w:bCs/>
+          <w:sz w:val="18"/>
+          <w:szCs w:val="18"/>
+        </w:rPr>
+        <w:t xml:space="preserve"> :</w:t>
+      </w:r>
+      <w:proofErr w:type="gramEnd"/>
+      <w:r>
+        <w:rPr>
+          <w:rFonts w:ascii="Cascadia Code" w:hAnsi="Cascadia Code"/>
+          <w:b/>
+          <w:bCs/>
+          <w:sz w:val="18"/>
+          <w:szCs w:val="18"/>
+        </w:rPr>
+        <w:t xml:space="preserve"> </w:t>
       </w:r>
       <w:r>
         <w:rPr>
@@ -38036,7 +38725,15 @@
         <w:t xml:space="preserve"> unable to see the </w:t>
       </w:r>
       <w:r>
-        <w:t xml:space="preserve">full ramifications of every decision </w:t>
+        <w:t xml:space="preserve">full </w:t>
+      </w:r>
+      <w:proofErr w:type="spellStart"/>
+      <w:r>
+        <w:t>ramifications</w:t>
+      </w:r>
+      <w:proofErr w:type="spellEnd"/>
+      <w:r>
+        <w:t xml:space="preserve"> of every decision </w:t>
       </w:r>
       <w:r>
         <w:t xml:space="preserve">so occasionally I need to </w:t>
@@ -38198,6 +38895,7 @@
       <w:r>
         <w:t xml:space="preserve">To do this I needed to write custom </w:t>
       </w:r>
+      <w:proofErr w:type="spellStart"/>
       <w:r>
         <w:rPr>
           <w:i/>
@@ -38205,6 +38903,7 @@
         </w:rPr>
         <w:t>drawText</w:t>
       </w:r>
+      <w:proofErr w:type="spellEnd"/>
       <w:r>
         <w:t xml:space="preserve"> routines that used the MOS’s character definitions stored at &amp;8000</w:t>
       </w:r>
@@ -38456,14 +39155,24 @@
       <w:r>
         <w:t>#</w:t>
       </w:r>
-      <w:r>
-        <w:t xml:space="preserve">HI(…) or </w:t>
+      <w:proofErr w:type="gramStart"/>
+      <w:r>
+        <w:t>HI(</w:t>
+      </w:r>
+      <w:proofErr w:type="gramEnd"/>
+      <w:r>
+        <w:t xml:space="preserve">…) or </w:t>
       </w:r>
       <w:r>
         <w:t>#</w:t>
       </w:r>
-      <w:r>
-        <w:t>LO(…).</w:t>
+      <w:proofErr w:type="gramStart"/>
+      <w:r>
+        <w:t>LO(</w:t>
+      </w:r>
+      <w:proofErr w:type="gramEnd"/>
+      <w:r>
+        <w:t>…).</w:t>
       </w:r>
     </w:p>
     <w:p>
@@ -42370,7 +43079,23 @@
                 <w:sz w:val="20"/>
                 <w:szCs w:val="20"/>
               </w:rPr>
-              <w:t xml:space="preserve"> Enemy pursuit sound</w:t>
+              <w:t xml:space="preserve"> </w:t>
+            </w:r>
+            <w:proofErr w:type="spellStart"/>
+            <w:r>
+              <w:rPr>
+                <w:sz w:val="20"/>
+                <w:szCs w:val="20"/>
+              </w:rPr>
+              <w:t>Enemy</w:t>
+            </w:r>
+            <w:proofErr w:type="spellEnd"/>
+            <w:r>
+              <w:rPr>
+                <w:sz w:val="20"/>
+                <w:szCs w:val="20"/>
+              </w:rPr>
+              <w:t xml:space="preserve"> pursuit sound</w:t>
             </w:r>
           </w:p>
         </w:tc>
@@ -44295,19 +45020,7 @@
           <w:rPr>
             <w:rStyle w:val="Hyperlink"/>
           </w:rPr>
-          <w:t>Security: Sampled sound 1980</w:t>
-        </w:r>
-        <w:r>
-          <w:rPr>
-            <w:rStyle w:val="Hyperlink"/>
-          </w:rPr>
-          <w:t>s</w:t>
-        </w:r>
-        <w:r>
-          <w:rPr>
-            <w:rStyle w:val="Hyperlink"/>
-          </w:rPr>
-          <w:t xml:space="preserve"> style: from SN76489 square waves to samples</w:t>
+          <w:t>Security: Sampled sound 1980s style: from SN76489 square waves to samples</w:t>
         </w:r>
         <w:bookmarkEnd w:id="2"/>
         <w:r>
@@ -44331,8 +45044,16 @@
           <w:rPr>
             <w:rStyle w:val="Hyperlink"/>
           </w:rPr>
-          <w:t>mdfs.net/Docs/Comp/BBC/AllMem</w:t>
+          <w:t>mdfs.net/Docs/Comp/BBC/</w:t>
         </w:r>
+        <w:proofErr w:type="spellStart"/>
+        <w:r>
+          <w:rPr>
+            <w:rStyle w:val="Hyperlink"/>
+          </w:rPr>
+          <w:t>AllMem</w:t>
+        </w:r>
+        <w:proofErr w:type="spellEnd"/>
       </w:hyperlink>
     </w:p>
     <w:p>
@@ -44357,8 +45078,16 @@
           <w:rPr>
             <w:rStyle w:val="Hyperlink"/>
           </w:rPr>
-          <w:t>mdfs.net/Docs/Comp/BBC/Disk/DFSMem</w:t>
+          <w:t>mdfs.net/Docs/Comp/BBC/Disk/</w:t>
         </w:r>
+        <w:proofErr w:type="spellStart"/>
+        <w:r>
+          <w:rPr>
+            <w:rStyle w:val="Hyperlink"/>
+          </w:rPr>
+          <w:t>DFSMem</w:t>
+        </w:r>
+        <w:proofErr w:type="spellEnd"/>
       </w:hyperlink>
     </w:p>
     <w:p>
@@ -44758,28 +45487,28 @@
         <v:path o:extrusionok="f" gradientshapeok="t" o:connecttype="rect"/>
         <o:lock v:ext="edit" aspectratio="t"/>
       </v:shapetype>
-      <v:shape id="_x0000_i1558" type="#_x0000_t75" style="width:29.95pt;height:22.45pt;visibility:visible;mso-wrap-style:square" o:bullet="t">
+      <v:shape id="_x0000_i1086" type="#_x0000_t75" style="width:29.95pt;height:22.45pt;visibility:visible;mso-wrap-style:square" o:bullet="t">
         <v:imagedata r:id="rId1" o:title=""/>
       </v:shape>
     </w:pict>
   </w:numPicBullet>
   <w:numPicBullet w:numPicBulletId="1">
     <w:pict>
-      <v:shape id="_x0000_i1559" type="#_x0000_t75" style="width:29.95pt;height:22.45pt;visibility:visible;mso-wrap-style:square" o:bullet="t">
+      <v:shape id="_x0000_i1087" type="#_x0000_t75" style="width:29.95pt;height:22.45pt;visibility:visible;mso-wrap-style:square" o:bullet="t">
         <v:imagedata r:id="rId2" o:title=""/>
       </v:shape>
     </w:pict>
   </w:numPicBullet>
   <w:numPicBullet w:numPicBulletId="2">
     <w:pict>
-      <v:shape id="_x0000_i1560" type="#_x0000_t75" style="width:29.95pt;height:22.45pt;visibility:visible;mso-wrap-style:square" o:bullet="t">
+      <v:shape id="_x0000_i1088" type="#_x0000_t75" style="width:29.95pt;height:22.45pt;visibility:visible;mso-wrap-style:square" o:bullet="t">
         <v:imagedata r:id="rId3" o:title=""/>
       </v:shape>
     </w:pict>
   </w:numPicBullet>
   <w:numPicBullet w:numPicBulletId="3">
     <w:pict>
-      <v:shape id="_x0000_i1561" type="#_x0000_t75" style="width:28.5pt;height:21.75pt;visibility:visible;mso-wrap-style:square" o:bullet="t">
+      <v:shape id="_x0000_i1089" type="#_x0000_t75" style="width:28.5pt;height:21.75pt;visibility:visible;mso-wrap-style:square" o:bullet="t">
         <v:imagedata r:id="rId4" o:title=""/>
       </v:shape>
     </w:pict>

</xml_diff>

<commit_message>
drawObject common case optimizations. Plus code size optimizations.
</commit_message>
<xml_diff>
--- a/docs/Development.docx
+++ b/docs/Development.docx
@@ -2125,7 +2125,6 @@
       <w:r>
         <w:t xml:space="preserve"> and </w:t>
       </w:r>
-      <w:proofErr w:type="spellStart"/>
       <w:r>
         <w:rPr>
           <w:b/>
@@ -2144,7 +2143,6 @@
         </w:rPr>
         <w:t>Animate</w:t>
       </w:r>
-      <w:proofErr w:type="spellEnd"/>
       <w:r>
         <w:t xml:space="preserve"> </w:t>
       </w:r>
@@ -4284,7 +4282,6 @@
           <w:bCs/>
         </w:rPr>
       </w:pPr>
-      <w:proofErr w:type="spellStart"/>
       <w:r>
         <w:rPr>
           <w:b/>
@@ -4292,7 +4289,6 @@
         </w:rPr>
         <w:t>objectXLo</w:t>
       </w:r>
-      <w:proofErr w:type="spellEnd"/>
       <w:r>
         <w:rPr>
           <w:b/>
@@ -4300,7 +4296,6 @@
         </w:rPr>
         <w:t xml:space="preserve"> &amp; </w:t>
       </w:r>
-      <w:proofErr w:type="spellStart"/>
       <w:r>
         <w:rPr>
           <w:b/>
@@ -4308,7 +4303,6 @@
         </w:rPr>
         <w:t>objectXHi</w:t>
       </w:r>
-      <w:proofErr w:type="spellEnd"/>
       <w:r>
         <w:rPr>
           <w:b/>
@@ -4341,38 +4335,27 @@
           <w:bCs/>
         </w:rPr>
       </w:pPr>
-      <w:proofErr w:type="spellStart"/>
       <w:r>
         <w:rPr>
           <w:b/>
           <w:bCs/>
         </w:rPr>
-        <w:t>objectYLo</w:t>
-      </w:r>
-      <w:proofErr w:type="spellEnd"/>
+        <w:t xml:space="preserve">objectYLo </w:t>
+      </w:r>
       <w:r>
         <w:rPr>
           <w:b/>
           <w:bCs/>
         </w:rPr>
-        <w:t xml:space="preserve"> </w:t>
+        <w:t xml:space="preserve">&amp; </w:t>
       </w:r>
       <w:r>
         <w:rPr>
           <w:b/>
           <w:bCs/>
         </w:rPr>
-        <w:t xml:space="preserve">&amp; </w:t>
-      </w:r>
-      <w:proofErr w:type="spellStart"/>
-      <w:r>
-        <w:rPr>
-          <w:b/>
-          <w:bCs/>
-        </w:rPr>
         <w:t>objectYHi</w:t>
       </w:r>
-      <w:proofErr w:type="spellEnd"/>
       <w:r>
         <w:rPr>
           <w:b/>
@@ -4408,31 +4391,13 @@
           <w:bCs/>
         </w:rPr>
       </w:pPr>
-      <w:proofErr w:type="spellStart"/>
       <w:r>
         <w:rPr>
           <w:b/>
           <w:bCs/>
         </w:rPr>
-        <w:t>objectWidth</w:t>
-      </w:r>
-      <w:proofErr w:type="spellEnd"/>
-      <w:r>
-        <w:rPr>
-          <w:b/>
-          <w:bCs/>
-        </w:rPr>
-        <w:t xml:space="preserve"> &amp; </w:t>
-      </w:r>
-      <w:proofErr w:type="spellStart"/>
-      <w:r>
-        <w:rPr>
-          <w:b/>
-          <w:bCs/>
-        </w:rPr>
-        <w:t>objectHeight</w:t>
-      </w:r>
-      <w:proofErr w:type="spellEnd"/>
+        <w:t>objectWidth &amp; objectHeight</w:t>
+      </w:r>
       <w:r>
         <w:rPr>
           <w:b/>
@@ -4459,7 +4424,6 @@
           <w:bCs/>
         </w:rPr>
       </w:pPr>
-      <w:proofErr w:type="spellStart"/>
       <w:r>
         <w:rPr>
           <w:b/>
@@ -4467,7 +4431,6 @@
         </w:rPr>
         <w:t>objectAnimation</w:t>
       </w:r>
-      <w:proofErr w:type="spellEnd"/>
       <w:r>
         <w:rPr>
           <w:b/>
@@ -4500,7 +4463,6 @@
           <w:bCs/>
         </w:rPr>
       </w:pPr>
-      <w:proofErr w:type="spellStart"/>
       <w:r>
         <w:rPr>
           <w:b/>
@@ -4508,7 +4470,6 @@
         </w:rPr>
         <w:t>objectState</w:t>
       </w:r>
-      <w:proofErr w:type="spellEnd"/>
       <w:r>
         <w:rPr>
           <w:b/>
@@ -4606,7 +4567,6 @@
           <w:bCs/>
         </w:rPr>
       </w:pPr>
-      <w:proofErr w:type="spellStart"/>
       <w:r>
         <w:rPr>
           <w:b/>
@@ -4614,7 +4574,6 @@
         </w:rPr>
         <w:t>objectSpriteIndex</w:t>
       </w:r>
-      <w:proofErr w:type="spellEnd"/>
       <w:r>
         <w:rPr>
           <w:b/>
@@ -4649,31 +4608,13 @@
           <w:numId w:val="8"/>
         </w:numPr>
       </w:pPr>
-      <w:proofErr w:type="spellStart"/>
       <w:r>
         <w:rPr>
           <w:b/>
           <w:bCs/>
         </w:rPr>
-        <w:t>objectFrameCallbackLo</w:t>
-      </w:r>
-      <w:proofErr w:type="spellEnd"/>
-      <w:r>
-        <w:rPr>
-          <w:b/>
-          <w:bCs/>
-        </w:rPr>
-        <w:t xml:space="preserve"> &amp; </w:t>
-      </w:r>
-      <w:proofErr w:type="spellStart"/>
-      <w:r>
-        <w:rPr>
-          <w:b/>
-          <w:bCs/>
-        </w:rPr>
-        <w:t>objectFrameCallbackHi</w:t>
-      </w:r>
-      <w:proofErr w:type="spellEnd"/>
+        <w:t>objectFrameCallbackLo &amp; objectFrameCallbackHi</w:t>
+      </w:r>
       <w:r>
         <w:rPr>
           <w:b/>
@@ -4721,7 +4662,6 @@
           <w:bCs/>
         </w:rPr>
       </w:pPr>
-      <w:proofErr w:type="spellStart"/>
       <w:r>
         <w:rPr>
           <w:b/>
@@ -4729,7 +4669,6 @@
         </w:rPr>
         <w:t>objectFrameCounter</w:t>
       </w:r>
-      <w:proofErr w:type="spellEnd"/>
       <w:r>
         <w:rPr>
           <w:b/>
@@ -6331,7 +6270,6 @@
       <w:r>
         <w:t xml:space="preserve">setting </w:t>
       </w:r>
-      <w:proofErr w:type="spellStart"/>
       <w:r>
         <w:rPr>
           <w:i/>
@@ -6353,7 +6291,6 @@
         </w:rPr>
         <w:t>Addr</w:t>
       </w:r>
-      <w:proofErr w:type="spellEnd"/>
       <w:r>
         <w:t xml:space="preserve"> </w:t>
       </w:r>
@@ -6468,7 +6405,6 @@
       <w:r>
         <w:t xml:space="preserve">low nibble of </w:t>
       </w:r>
-      <w:proofErr w:type="spellStart"/>
       <w:r>
         <w:rPr>
           <w:i/>
@@ -6476,7 +6412,6 @@
         </w:rPr>
         <w:t>objectState</w:t>
       </w:r>
-      <w:proofErr w:type="spellEnd"/>
       <w:r>
         <w:t>.</w:t>
       </w:r>
@@ -6748,7 +6683,6 @@
       <w:r>
         <w:t xml:space="preserve"> </w:t>
       </w:r>
-      <w:proofErr w:type="spellStart"/>
       <w:r>
         <w:rPr>
           <w:i/>
@@ -6756,7 +6690,6 @@
         </w:rPr>
         <w:t>clearTile</w:t>
       </w:r>
-      <w:proofErr w:type="spellEnd"/>
       <w:r>
         <w:t xml:space="preserve"> </w:t>
       </w:r>
@@ -6771,7 +6704,6 @@
       <w:r>
         <w:t xml:space="preserve">The </w:t>
       </w:r>
-      <w:proofErr w:type="spellStart"/>
       <w:r>
         <w:rPr>
           <w:i/>
@@ -6779,7 +6711,6 @@
         </w:rPr>
         <w:t>clearTile</w:t>
       </w:r>
-      <w:proofErr w:type="spellEnd"/>
       <w:r>
         <w:t xml:space="preserve"> </w:t>
       </w:r>
@@ -7549,15 +7480,7 @@
         <w:t xml:space="preserve">.  </w:t>
       </w:r>
       <w:r>
-        <w:t xml:space="preserve">The </w:t>
-      </w:r>
-      <w:proofErr w:type="spellStart"/>
-      <w:r>
-        <w:t>objectFrameCount</w:t>
-      </w:r>
-      <w:proofErr w:type="spellEnd"/>
-      <w:r>
-        <w:t xml:space="preserve"> is repurposed for this.</w:t>
+        <w:t>The objectFrameCount is repurposed for this.</w:t>
       </w:r>
     </w:p>
     <w:p>
@@ -7570,15 +7493,7 @@
       </w:pPr>
       <w:r>
         <w:lastRenderedPageBreak/>
-        <w:t xml:space="preserve">Mark K9 and the elevator game objects as both ascending or descending by populating their respective </w:t>
-      </w:r>
-      <w:proofErr w:type="spellStart"/>
-      <w:r>
-        <w:t>objectState’s</w:t>
-      </w:r>
-      <w:proofErr w:type="spellEnd"/>
-      <w:r>
-        <w:t xml:space="preserve"> </w:t>
+        <w:t xml:space="preserve">Mark K9 and the elevator game objects as both ascending or descending by populating their respective objectState’s </w:t>
       </w:r>
       <w:r>
         <w:rPr>
@@ -7997,7 +7912,6 @@
       <w:r>
         <w:t xml:space="preserve">stored in </w:t>
       </w:r>
-      <w:proofErr w:type="spellStart"/>
       <w:r>
         <w:rPr>
           <w:i/>
@@ -8006,7 +7920,6 @@
         </w:rPr>
         <w:t>objectFrameCounter</w:t>
       </w:r>
-      <w:proofErr w:type="spellEnd"/>
       <w:r>
         <w:t xml:space="preserve"> variable</w:t>
       </w:r>
@@ -8219,7 +8132,6 @@
       <w:r>
         <w:t xml:space="preserve">checking the erase-above and erase-below </w:t>
       </w:r>
-      <w:proofErr w:type="spellStart"/>
       <w:r>
         <w:rPr>
           <w:i/>
@@ -8234,7 +8146,6 @@
         </w:rPr>
         <w:t>’s</w:t>
       </w:r>
-      <w:proofErr w:type="spellEnd"/>
       <w:r>
         <w:t xml:space="preserve"> render flags</w:t>
       </w:r>
@@ -9120,7 +9031,6 @@
         <w:lastRenderedPageBreak/>
         <w:t xml:space="preserve">A zero-page </w:t>
       </w:r>
-      <w:proofErr w:type="spellStart"/>
       <w:r>
         <w:rPr>
           <w:i/>
@@ -9128,7 +9038,6 @@
         </w:rPr>
         <w:t>laserFrameCount</w:t>
       </w:r>
-      <w:proofErr w:type="spellEnd"/>
       <w:r>
         <w:t xml:space="preserve"> variable was introduced which controls laser rendering</w:t>
       </w:r>
@@ -9165,7 +9074,6 @@
       <w:r>
         <w:t xml:space="preserve">sets </w:t>
       </w:r>
-      <w:proofErr w:type="spellStart"/>
       <w:r>
         <w:rPr>
           <w:i/>
@@ -9173,7 +9081,6 @@
         </w:rPr>
         <w:t>laserFrameCount</w:t>
       </w:r>
-      <w:proofErr w:type="spellEnd"/>
       <w:r>
         <w:rPr>
           <w:i/>
@@ -9190,7 +9097,6 @@
       <w:r>
         <w:t xml:space="preserve">and </w:t>
       </w:r>
-      <w:proofErr w:type="spellStart"/>
       <w:r>
         <w:rPr>
           <w:i/>
@@ -9198,7 +9104,6 @@
         </w:rPr>
         <w:t>laserFrameCount</w:t>
       </w:r>
-      <w:proofErr w:type="spellEnd"/>
       <w:r>
         <w:rPr>
           <w:i/>
@@ -9249,7 +9154,6 @@
       <w:r>
         <w:t xml:space="preserve">the </w:t>
       </w:r>
-      <w:proofErr w:type="spellStart"/>
       <w:r>
         <w:rPr>
           <w:i/>
@@ -9257,7 +9161,6 @@
         </w:rPr>
         <w:t>objectState</w:t>
       </w:r>
-      <w:proofErr w:type="spellEnd"/>
       <w:r>
         <w:t xml:space="preserve"> variable</w:t>
       </w:r>
@@ -9373,7 +9276,6 @@
       <w:r>
         <w:t xml:space="preserve">This is the fourth render flag in the high nibble of the </w:t>
       </w:r>
-      <w:proofErr w:type="spellStart"/>
       <w:r>
         <w:rPr>
           <w:i/>
@@ -9381,7 +9283,6 @@
         </w:rPr>
         <w:t>objectState</w:t>
       </w:r>
-      <w:proofErr w:type="spellEnd"/>
       <w:r>
         <w:t xml:space="preserve"> variable</w:t>
       </w:r>
@@ -9528,7 +9429,6 @@
       <w:r>
         <w:t xml:space="preserve"> </w:t>
       </w:r>
-      <w:proofErr w:type="spellStart"/>
       <w:r>
         <w:rPr>
           <w:i/>
@@ -9536,7 +9436,6 @@
         </w:rPr>
         <w:t>debugTileGridFlags</w:t>
       </w:r>
-      <w:proofErr w:type="spellEnd"/>
       <w:r>
         <w:t xml:space="preserve"> routine that rendered a little box </w:t>
       </w:r>
@@ -9629,7 +9528,6 @@
       <w:r>
         <w:t xml:space="preserve">to allow </w:t>
       </w:r>
-      <w:proofErr w:type="spellStart"/>
       <w:r>
         <w:rPr>
           <w:i/>
@@ -9637,7 +9535,6 @@
         </w:rPr>
         <w:t>debugTileGridFlags</w:t>
       </w:r>
-      <w:proofErr w:type="spellEnd"/>
       <w:r>
         <w:rPr>
           <w:i/>
@@ -11613,7 +11510,6 @@
       <w:r>
         <w:t xml:space="preserve">replaced </w:t>
       </w:r>
-      <w:proofErr w:type="spellStart"/>
       <w:r>
         <w:rPr>
           <w:i/>
@@ -11621,11 +11517,9 @@
         </w:rPr>
         <w:t>objectWidth</w:t>
       </w:r>
-      <w:proofErr w:type="spellEnd"/>
       <w:r>
         <w:t xml:space="preserve"> and </w:t>
       </w:r>
-      <w:proofErr w:type="spellStart"/>
       <w:r>
         <w:rPr>
           <w:i/>
@@ -11633,7 +11527,6 @@
         </w:rPr>
         <w:t>objectHeight</w:t>
       </w:r>
-      <w:proofErr w:type="spellEnd"/>
       <w:r>
         <w:t xml:space="preserve"> game object arrays with a function</w:t>
       </w:r>
@@ -11678,7 +11571,6 @@
       <w:r>
         <w:t xml:space="preserve">, and </w:t>
       </w:r>
-      <w:proofErr w:type="spellStart"/>
       <w:r>
         <w:rPr>
           <w:i/>
@@ -11686,11 +11578,9 @@
         </w:rPr>
         <w:t>widthMinusOne</w:t>
       </w:r>
-      <w:proofErr w:type="spellEnd"/>
       <w:r>
         <w:t xml:space="preserve"> and </w:t>
       </w:r>
-      <w:proofErr w:type="spellStart"/>
       <w:r>
         <w:rPr>
           <w:i/>
@@ -11712,7 +11602,6 @@
         </w:rPr>
         <w:t>sOne</w:t>
       </w:r>
-      <w:proofErr w:type="spellEnd"/>
       <w:r>
         <w:t xml:space="preserve">.  </w:t>
       </w:r>
@@ -11761,15 +11650,7 @@
         <w:t xml:space="preserve"> I </w:t>
       </w:r>
       <w:r>
-        <w:t xml:space="preserve">stored the object type in the </w:t>
-      </w:r>
-      <w:proofErr w:type="spellStart"/>
-      <w:r>
-        <w:t>objectAnimation</w:t>
-      </w:r>
-      <w:proofErr w:type="spellEnd"/>
-      <w:r>
-        <w:t xml:space="preserve"> game object array, </w:t>
+        <w:t xml:space="preserve">stored the object type in the objectAnimation game object array, </w:t>
       </w:r>
       <w:r>
         <w:t xml:space="preserve">shifting up the other values, and </w:t>
@@ -12592,7 +12473,6 @@
       <w:r>
         <w:t xml:space="preserve">I then wrote a </w:t>
       </w:r>
-      <w:proofErr w:type="spellStart"/>
       <w:r>
         <w:rPr>
           <w:i/>
@@ -12600,7 +12480,6 @@
         </w:rPr>
         <w:t>loadLevel</w:t>
       </w:r>
-      <w:proofErr w:type="spellEnd"/>
       <w:r>
         <w:t xml:space="preserve"> </w:t>
       </w:r>
@@ -12634,7 +12513,6 @@
       <w:r>
         <w:t xml:space="preserve">the loaded </w:t>
       </w:r>
-      <w:proofErr w:type="spellStart"/>
       <w:r>
         <w:rPr>
           <w:i/>
@@ -12642,7 +12520,6 @@
         </w:rPr>
         <w:t>initializeLevel</w:t>
       </w:r>
-      <w:proofErr w:type="spellEnd"/>
       <w:r>
         <w:t xml:space="preserve"> </w:t>
       </w:r>
@@ -12658,7 +12535,6 @@
       <w:r>
         <w:t xml:space="preserve">A </w:t>
       </w:r>
-      <w:proofErr w:type="spellStart"/>
       <w:r>
         <w:rPr>
           <w:i/>
@@ -12666,7 +12542,6 @@
         </w:rPr>
         <w:t>showLevel</w:t>
       </w:r>
-      <w:proofErr w:type="spellEnd"/>
       <w:r>
         <w:t xml:space="preserve"> routine </w:t>
       </w:r>
@@ -12944,7 +12819,6 @@
       <w:r>
         <w:t xml:space="preserve"> a level, and a ‘R’ key handler was implemented to call the </w:t>
       </w:r>
-      <w:proofErr w:type="spellStart"/>
       <w:r>
         <w:rPr>
           <w:i/>
@@ -12952,7 +12826,6 @@
         </w:rPr>
         <w:t>loadLevel</w:t>
       </w:r>
-      <w:proofErr w:type="spellEnd"/>
       <w:r>
         <w:t xml:space="preserve"> </w:t>
       </w:r>
@@ -13123,7 +12996,6 @@
       <w:r>
         <w:t xml:space="preserve">The </w:t>
       </w:r>
-      <w:proofErr w:type="spellStart"/>
       <w:r>
         <w:rPr>
           <w:i/>
@@ -13131,7 +13003,6 @@
         </w:rPr>
         <w:t>loadLevel</w:t>
       </w:r>
-      <w:proofErr w:type="spellEnd"/>
       <w:r>
         <w:t xml:space="preserve"> code was </w:t>
       </w:r>
@@ -13150,7 +13021,6 @@
       <w:r>
         <w:t xml:space="preserve">moved to </w:t>
       </w:r>
-      <w:proofErr w:type="spellStart"/>
       <w:r>
         <w:rPr>
           <w:i/>
@@ -13158,11 +13028,9 @@
         </w:rPr>
         <w:t>selectDFS</w:t>
       </w:r>
-      <w:proofErr w:type="spellEnd"/>
       <w:r>
         <w:t xml:space="preserve"> and </w:t>
       </w:r>
-      <w:proofErr w:type="spellStart"/>
       <w:r>
         <w:rPr>
           <w:i/>
@@ -13170,7 +13038,6 @@
         </w:rPr>
         <w:t>releaseDFS</w:t>
       </w:r>
-      <w:proofErr w:type="spellEnd"/>
       <w:r>
         <w:t xml:space="preserve"> </w:t>
       </w:r>
@@ -13592,7 +13459,6 @@
       <w:r>
         <w:t xml:space="preserve"> action became </w:t>
       </w:r>
-      <w:proofErr w:type="spellStart"/>
       <w:r>
         <w:rPr>
           <w:b/>
@@ -13602,11 +13468,9 @@
         </w:rPr>
         <w:t>PursueLeft</w:t>
       </w:r>
-      <w:proofErr w:type="spellEnd"/>
       <w:r>
         <w:t xml:space="preserve">, </w:t>
       </w:r>
-      <w:proofErr w:type="spellStart"/>
       <w:r>
         <w:rPr>
           <w:b/>
@@ -13616,11 +13480,9 @@
         </w:rPr>
         <w:t>PursueRight</w:t>
       </w:r>
-      <w:proofErr w:type="spellEnd"/>
       <w:r>
         <w:t xml:space="preserve">, </w:t>
       </w:r>
-      <w:proofErr w:type="spellStart"/>
       <w:r>
         <w:rPr>
           <w:b/>
@@ -13630,14 +13492,12 @@
         </w:rPr>
         <w:t>PursueUp</w:t>
       </w:r>
-      <w:proofErr w:type="spellEnd"/>
       <w:r>
         <w:t xml:space="preserve">, </w:t>
       </w:r>
       <w:r>
         <w:t xml:space="preserve">or </w:t>
       </w:r>
-      <w:proofErr w:type="spellStart"/>
       <w:r>
         <w:rPr>
           <w:b/>
@@ -13647,7 +13507,6 @@
         </w:rPr>
         <w:t>PursueDown</w:t>
       </w:r>
-      <w:proofErr w:type="spellEnd"/>
       <w:r>
         <w:t>.</w:t>
       </w:r>
@@ -13700,7 +13559,6 @@
         </w:rPr>
         <w:tab/>
       </w:r>
-      <w:proofErr w:type="spellStart"/>
       <w:r>
         <w:rPr>
           <w:b/>
@@ -13717,9 +13575,11 @@
           <w:i/>
           <w:iCs/>
         </w:rPr>
-        <w:t>Left</w:t>
-      </w:r>
-      <w:proofErr w:type="spellEnd"/>
+        <w:t xml:space="preserve">Left </w:t>
+      </w:r>
+      <w:r>
+        <w:t>and</w:t>
+      </w:r>
       <w:r>
         <w:rPr>
           <w:b/>
@@ -13729,9 +13589,7 @@
         </w:rPr>
         <w:t xml:space="preserve"> </w:t>
       </w:r>
-      <w:r>
-        <w:t>and</w:t>
-      </w:r>
+      <w:proofErr w:type="gramStart"/>
       <w:r>
         <w:rPr>
           <w:b/>
@@ -13739,10 +13597,8 @@
           <w:i/>
           <w:iCs/>
         </w:rPr>
-        <w:t xml:space="preserve"> </w:t>
-      </w:r>
-      <w:proofErr w:type="spellStart"/>
-      <w:proofErr w:type="gramStart"/>
+        <w:t>PursueRight</w:t>
+      </w:r>
       <w:r>
         <w:rPr>
           <w:b/>
@@ -13750,9 +13606,63 @@
           <w:i/>
           <w:iCs/>
         </w:rPr>
-        <w:t>PursueRight</w:t>
-      </w:r>
-      <w:proofErr w:type="spellEnd"/>
+        <w:t xml:space="preserve"> </w:t>
+      </w:r>
+      <w:r>
+        <w:t xml:space="preserve"> –</w:t>
+      </w:r>
+      <w:proofErr w:type="gramEnd"/>
+      <w:r>
+        <w:t xml:space="preserve"> </w:t>
+      </w:r>
+      <w:r>
+        <w:t xml:space="preserve">Daleks </w:t>
+      </w:r>
+      <w:r>
+        <w:t>move quickly left or right</w:t>
+      </w:r>
+      <w:r>
+        <w:t>, or vice versa</w:t>
+      </w:r>
+      <w:r>
+        <w:t xml:space="preserve">.  </w:t>
+      </w:r>
+      <w:r>
+        <w:t xml:space="preserve">If </w:t>
+      </w:r>
+      <w:r>
+        <w:t>a Dalek</w:t>
+      </w:r>
+      <w:r>
+        <w:t xml:space="preserve"> encounters a wall, the </w:t>
+      </w:r>
+      <w:r>
+        <w:t xml:space="preserve">Dalek </w:t>
+      </w:r>
+      <w:r>
+        <w:t>turns</w:t>
+      </w:r>
+      <w:r>
+        <w:t>,</w:t>
+      </w:r>
+      <w:r>
+        <w:t xml:space="preserve"> and the </w:t>
+      </w:r>
+      <w:r>
+        <w:t xml:space="preserve">action </w:t>
+      </w:r>
+      <w:r>
+        <w:t xml:space="preserve">is </w:t>
+      </w:r>
+      <w:r>
+        <w:t>change</w:t>
+      </w:r>
+      <w:r>
+        <w:t xml:space="preserve">d </w:t>
+      </w:r>
+      <w:r>
+        <w:t xml:space="preserve">to </w:t>
+      </w:r>
       <w:r>
         <w:rPr>
           <w:b/>
@@ -13760,64 +13670,11 @@
           <w:i/>
           <w:iCs/>
         </w:rPr>
-        <w:t xml:space="preserve"> </w:t>
-      </w:r>
-      <w:r>
-        <w:t xml:space="preserve"> –</w:t>
-      </w:r>
-      <w:proofErr w:type="gramEnd"/>
-      <w:r>
-        <w:t xml:space="preserve"> </w:t>
-      </w:r>
-      <w:r>
-        <w:t xml:space="preserve">Daleks </w:t>
-      </w:r>
-      <w:r>
-        <w:t>move quickly left or right</w:t>
-      </w:r>
-      <w:r>
-        <w:t>, or vice versa</w:t>
-      </w:r>
-      <w:r>
-        <w:t xml:space="preserve">.  </w:t>
-      </w:r>
-      <w:r>
-        <w:t xml:space="preserve">If </w:t>
-      </w:r>
-      <w:r>
-        <w:t>a Dalek</w:t>
-      </w:r>
-      <w:r>
-        <w:t xml:space="preserve"> encounters a wall, the </w:t>
-      </w:r>
-      <w:r>
-        <w:t xml:space="preserve">Dalek </w:t>
-      </w:r>
-      <w:r>
-        <w:t>turns</w:t>
-      </w:r>
-      <w:r>
-        <w:t>,</w:t>
-      </w:r>
-      <w:r>
-        <w:t xml:space="preserve"> and the </w:t>
-      </w:r>
-      <w:r>
-        <w:t xml:space="preserve">action </w:t>
-      </w:r>
-      <w:r>
-        <w:t xml:space="preserve">is </w:t>
-      </w:r>
-      <w:r>
-        <w:t>change</w:t>
-      </w:r>
-      <w:r>
-        <w:t xml:space="preserve">d </w:t>
-      </w:r>
-      <w:r>
-        <w:t xml:space="preserve">to </w:t>
-      </w:r>
-      <w:proofErr w:type="spellStart"/>
+        <w:t>PursueUp</w:t>
+      </w:r>
+      <w:r>
+        <w:t xml:space="preserve"> or </w:t>
+      </w:r>
       <w:r>
         <w:rPr>
           <w:b/>
@@ -13825,13 +13682,16 @@
           <w:i/>
           <w:iCs/>
         </w:rPr>
-        <w:t>PursueUp</w:t>
-      </w:r>
-      <w:proofErr w:type="spellEnd"/>
-      <w:r>
-        <w:t xml:space="preserve"> or </w:t>
-      </w:r>
-      <w:proofErr w:type="spellStart"/>
+        <w:t>PursueDown</w:t>
+      </w:r>
+      <w:r>
+        <w:t>.</w:t>
+      </w:r>
+    </w:p>
+    <w:p>
+      <w:pPr>
+        <w:ind w:left="720"/>
+      </w:pPr>
       <w:r>
         <w:rPr>
           <w:b/>
@@ -13839,18 +13699,8 @@
           <w:i/>
           <w:iCs/>
         </w:rPr>
-        <w:t>PursueDown</w:t>
-      </w:r>
-      <w:proofErr w:type="spellEnd"/>
-      <w:r>
-        <w:t>.</w:t>
-      </w:r>
-    </w:p>
-    <w:p>
-      <w:pPr>
-        <w:ind w:left="720"/>
-      </w:pPr>
-      <w:proofErr w:type="spellStart"/>
+        <w:t>Pursue</w:t>
+      </w:r>
       <w:r>
         <w:rPr>
           <w:b/>
@@ -13858,7 +13708,10 @@
           <w:i/>
           <w:iCs/>
         </w:rPr>
-        <w:t>Pursue</w:t>
+        <w:t xml:space="preserve">Up </w:t>
+      </w:r>
+      <w:r>
+        <w:t>and</w:t>
       </w:r>
       <w:r>
         <w:rPr>
@@ -13867,9 +13720,9 @@
           <w:i/>
           <w:iCs/>
         </w:rPr>
-        <w:t>Up</w:t>
-      </w:r>
-      <w:proofErr w:type="spellEnd"/>
+        <w:t xml:space="preserve"> </w:t>
+      </w:r>
+      <w:proofErr w:type="gramStart"/>
       <w:r>
         <w:rPr>
           <w:b/>
@@ -13877,10 +13730,41 @@
           <w:i/>
           <w:iCs/>
         </w:rPr>
-        <w:t xml:space="preserve"> </w:t>
-      </w:r>
-      <w:r>
-        <w:t>and</w:t>
+        <w:t xml:space="preserve">PursueDown </w:t>
+      </w:r>
+      <w:r>
+        <w:t xml:space="preserve"> –</w:t>
+      </w:r>
+      <w:proofErr w:type="gramEnd"/>
+      <w:r>
+        <w:t xml:space="preserve"> Daleks </w:t>
+      </w:r>
+      <w:r>
+        <w:t>move quickly left or right</w:t>
+      </w:r>
+      <w:r>
+        <w:t>, or vice versa, looking for an elevator to ride up or down</w:t>
+      </w:r>
+      <w:r>
+        <w:t xml:space="preserve">.  </w:t>
+      </w:r>
+      <w:r>
+        <w:t xml:space="preserve">If a Dalek encounters a wall, </w:t>
+      </w:r>
+      <w:r>
+        <w:t xml:space="preserve">the Dalek </w:t>
+      </w:r>
+      <w:r>
+        <w:t>turns,</w:t>
+      </w:r>
+      <w:r>
+        <w:t xml:space="preserve"> and the </w:t>
+      </w:r>
+      <w:r>
+        <w:t xml:space="preserve">action </w:t>
+      </w:r>
+      <w:r>
+        <w:t xml:space="preserve">is toggled between </w:t>
       </w:r>
       <w:r>
         <w:rPr>
@@ -13889,10 +13773,17 @@
           <w:i/>
           <w:iCs/>
         </w:rPr>
+        <w:t>PursueUp</w:t>
+      </w:r>
+      <w:r>
         <w:t xml:space="preserve"> </w:t>
       </w:r>
-      <w:proofErr w:type="spellStart"/>
-      <w:proofErr w:type="gramStart"/>
+      <w:r>
+        <w:t>and</w:t>
+      </w:r>
+      <w:r>
+        <w:t xml:space="preserve"> </w:t>
+      </w:r>
       <w:r>
         <w:rPr>
           <w:b/>
@@ -13902,81 +13793,6 @@
         </w:rPr>
         <w:t>PursueDown</w:t>
       </w:r>
-      <w:proofErr w:type="spellEnd"/>
-      <w:r>
-        <w:rPr>
-          <w:b/>
-          <w:bCs/>
-          <w:i/>
-          <w:iCs/>
-        </w:rPr>
-        <w:t xml:space="preserve"> </w:t>
-      </w:r>
-      <w:r>
-        <w:t xml:space="preserve"> –</w:t>
-      </w:r>
-      <w:proofErr w:type="gramEnd"/>
-      <w:r>
-        <w:t xml:space="preserve"> Daleks </w:t>
-      </w:r>
-      <w:r>
-        <w:t>move quickly left or right</w:t>
-      </w:r>
-      <w:r>
-        <w:t>, or vice versa, looking for an elevator to ride up or down</w:t>
-      </w:r>
-      <w:r>
-        <w:t xml:space="preserve">.  </w:t>
-      </w:r>
-      <w:r>
-        <w:t xml:space="preserve">If a Dalek encounters a wall, </w:t>
-      </w:r>
-      <w:r>
-        <w:t xml:space="preserve">the Dalek </w:t>
-      </w:r>
-      <w:r>
-        <w:t>turns,</w:t>
-      </w:r>
-      <w:r>
-        <w:t xml:space="preserve"> and the </w:t>
-      </w:r>
-      <w:r>
-        <w:t xml:space="preserve">action </w:t>
-      </w:r>
-      <w:r>
-        <w:t xml:space="preserve">is toggled between </w:t>
-      </w:r>
-      <w:proofErr w:type="spellStart"/>
-      <w:r>
-        <w:rPr>
-          <w:b/>
-          <w:bCs/>
-          <w:i/>
-          <w:iCs/>
-        </w:rPr>
-        <w:t>PursueUp</w:t>
-      </w:r>
-      <w:proofErr w:type="spellEnd"/>
-      <w:r>
-        <w:t xml:space="preserve"> </w:t>
-      </w:r>
-      <w:r>
-        <w:t>and</w:t>
-      </w:r>
-      <w:r>
-        <w:t xml:space="preserve"> </w:t>
-      </w:r>
-      <w:proofErr w:type="spellStart"/>
-      <w:r>
-        <w:rPr>
-          <w:b/>
-          <w:bCs/>
-          <w:i/>
-          <w:iCs/>
-        </w:rPr>
-        <w:t>PursueDown</w:t>
-      </w:r>
-      <w:proofErr w:type="spellEnd"/>
       <w:r>
         <w:rPr>
           <w:b/>
@@ -14112,7 +13928,6 @@
       <w:r>
         <w:t xml:space="preserve">set to </w:t>
       </w:r>
-      <w:proofErr w:type="spellStart"/>
       <w:r>
         <w:rPr>
           <w:b/>
@@ -14122,11 +13937,9 @@
         </w:rPr>
         <w:t>pursueLeft</w:t>
       </w:r>
-      <w:proofErr w:type="spellEnd"/>
       <w:r>
         <w:t xml:space="preserve"> or </w:t>
       </w:r>
-      <w:proofErr w:type="spellStart"/>
       <w:r>
         <w:rPr>
           <w:b/>
@@ -14145,7 +13958,6 @@
         </w:rPr>
         <w:t>ueRight</w:t>
       </w:r>
-      <w:proofErr w:type="spellEnd"/>
       <w:r>
         <w:t xml:space="preserve">.  </w:t>
       </w:r>
@@ -14155,7 +13967,6 @@
       <w:r>
         <w:t xml:space="preserve">action is set to </w:t>
       </w:r>
-      <w:proofErr w:type="spellStart"/>
       <w:r>
         <w:rPr>
           <w:b/>
@@ -14174,11 +13985,9 @@
         </w:rPr>
         <w:t>Up</w:t>
       </w:r>
-      <w:proofErr w:type="spellEnd"/>
       <w:r>
         <w:t xml:space="preserve"> or </w:t>
       </w:r>
-      <w:proofErr w:type="spellStart"/>
       <w:r>
         <w:rPr>
           <w:b/>
@@ -14197,7 +14006,6 @@
         </w:rPr>
         <w:t>Down</w:t>
       </w:r>
-      <w:proofErr w:type="spellEnd"/>
       <w:r>
         <w:t>.</w:t>
       </w:r>
@@ -14526,7 +14334,6 @@
       <w:r>
         <w:t xml:space="preserve">, </w:t>
       </w:r>
-      <w:proofErr w:type="spellStart"/>
       <w:r>
         <w:rPr>
           <w:b/>
@@ -14536,7 +14343,6 @@
         </w:rPr>
         <w:t>pursueLeft</w:t>
       </w:r>
-      <w:proofErr w:type="spellEnd"/>
       <w:r>
         <w:rPr>
           <w:b/>
@@ -14558,7 +14364,6 @@
         </w:rPr>
         <w:t xml:space="preserve"> </w:t>
       </w:r>
-      <w:proofErr w:type="spellStart"/>
       <w:r>
         <w:rPr>
           <w:b/>
@@ -14575,9 +14380,11 @@
           <w:i/>
           <w:iCs/>
         </w:rPr>
-        <w:t>Right</w:t>
-      </w:r>
-      <w:proofErr w:type="spellEnd"/>
+        <w:t xml:space="preserve">Right </w:t>
+      </w:r>
+      <w:r>
+        <w:t>related</w:t>
+      </w:r>
       <w:r>
         <w:rPr>
           <w:b/>
@@ -14588,7 +14395,138 @@
         <w:t xml:space="preserve"> </w:t>
       </w:r>
       <w:r>
-        <w:t>related</w:t>
+        <w:t>rules</w:t>
+      </w:r>
+      <w:r>
+        <w:t>.</w:t>
+      </w:r>
+    </w:p>
+    <w:p>
+      <w:r>
+        <w:t xml:space="preserve">I </w:t>
+      </w:r>
+      <w:r>
+        <w:t xml:space="preserve">first </w:t>
+      </w:r>
+      <w:r>
+        <w:t xml:space="preserve">implemented </w:t>
+      </w:r>
+      <w:r>
+        <w:t xml:space="preserve">a </w:t>
+      </w:r>
+      <w:r>
+        <w:t>D</w:t>
+      </w:r>
+      <w:r>
+        <w:t>alek</w:t>
+      </w:r>
+      <w:r>
+        <w:t xml:space="preserve"> </w:t>
+      </w:r>
+      <w:r>
+        <w:t>AI</w:t>
+      </w:r>
+      <w:r>
+        <w:t xml:space="preserve"> </w:t>
+      </w:r>
+      <w:r>
+        <w:t xml:space="preserve">routine </w:t>
+      </w:r>
+      <w:r>
+        <w:t xml:space="preserve">(named </w:t>
+      </w:r>
+      <w:r>
+        <w:rPr>
+          <w:i/>
+          <w:iCs/>
+        </w:rPr>
+        <w:t>enemyAI</w:t>
+      </w:r>
+      <w:r>
+        <w:t xml:space="preserve">) </w:t>
+      </w:r>
+      <w:r>
+        <w:t xml:space="preserve">that </w:t>
+      </w:r>
+      <w:r>
+        <w:t xml:space="preserve">encapsulated the </w:t>
+      </w:r>
+      <w:r>
+        <w:t xml:space="preserve">common </w:t>
+      </w:r>
+      <w:r>
+        <w:t>behavioral rules</w:t>
+      </w:r>
+      <w:r>
+        <w:t xml:space="preserve">, </w:t>
+      </w:r>
+      <w:r>
+        <w:t xml:space="preserve">running these against </w:t>
+      </w:r>
+      <w:r>
+        <w:t xml:space="preserve">each </w:t>
+      </w:r>
+      <w:r>
+        <w:t xml:space="preserve">Dalek every </w:t>
+      </w:r>
+      <w:r>
+        <w:t>sixteen</w:t>
+      </w:r>
+      <w:r>
+        <w:t xml:space="preserve"> frames</w:t>
+      </w:r>
+      <w:r>
+        <w:t xml:space="preserve">.  </w:t>
+      </w:r>
+      <w:r>
+        <w:t xml:space="preserve">The routine is </w:t>
+      </w:r>
+      <w:r>
+        <w:t>invoked from the game loop</w:t>
+      </w:r>
+      <w:r>
+        <w:t xml:space="preserve">.  </w:t>
+      </w:r>
+    </w:p>
+    <w:p>
+      <w:r>
+        <w:t xml:space="preserve">The </w:t>
+      </w:r>
+      <w:r>
+        <w:t xml:space="preserve">routine checks </w:t>
+      </w:r>
+      <w:r>
+        <w:t xml:space="preserve">to see if K9 </w:t>
+      </w:r>
+      <w:r>
+        <w:t xml:space="preserve">is </w:t>
+      </w:r>
+      <w:r>
+        <w:t>in sight</w:t>
+      </w:r>
+      <w:r>
+        <w:t xml:space="preserve"> (using a helper routine)</w:t>
+      </w:r>
+      <w:r>
+        <w:t>,</w:t>
+      </w:r>
+      <w:r>
+        <w:t xml:space="preserve"> promot</w:t>
+      </w:r>
+      <w:r>
+        <w:t>ing</w:t>
+      </w:r>
+      <w:r>
+        <w:t xml:space="preserve"> </w:t>
+      </w:r>
+      <w:r>
+        <w:t>Dalek’s</w:t>
+      </w:r>
+      <w:r>
+        <w:t xml:space="preserve"> </w:t>
+      </w:r>
+      <w:r>
+        <w:t xml:space="preserve">action to </w:t>
       </w:r>
       <w:r>
         <w:rPr>
@@ -14597,145 +14535,8 @@
           <w:i/>
           <w:iCs/>
         </w:rPr>
-        <w:t xml:space="preserve"> </w:t>
-      </w:r>
-      <w:r>
-        <w:t>rules</w:t>
-      </w:r>
-      <w:r>
-        <w:t>.</w:t>
-      </w:r>
-    </w:p>
-    <w:p>
-      <w:r>
-        <w:t xml:space="preserve">I </w:t>
-      </w:r>
-      <w:r>
-        <w:t xml:space="preserve">first </w:t>
-      </w:r>
-      <w:r>
-        <w:t xml:space="preserve">implemented </w:t>
-      </w:r>
-      <w:r>
-        <w:t xml:space="preserve">a </w:t>
-      </w:r>
-      <w:r>
-        <w:t>D</w:t>
-      </w:r>
-      <w:r>
-        <w:t>alek</w:t>
-      </w:r>
-      <w:r>
-        <w:t xml:space="preserve"> </w:t>
-      </w:r>
-      <w:r>
-        <w:t>AI</w:t>
-      </w:r>
-      <w:r>
-        <w:t xml:space="preserve"> </w:t>
-      </w:r>
-      <w:r>
-        <w:t xml:space="preserve">routine </w:t>
-      </w:r>
-      <w:r>
-        <w:t xml:space="preserve">(named </w:t>
-      </w:r>
-      <w:proofErr w:type="spellStart"/>
-      <w:r>
-        <w:rPr>
-          <w:i/>
-          <w:iCs/>
-        </w:rPr>
-        <w:t>enemyAI</w:t>
-      </w:r>
-      <w:proofErr w:type="spellEnd"/>
-      <w:r>
-        <w:t xml:space="preserve">) </w:t>
-      </w:r>
-      <w:r>
-        <w:t xml:space="preserve">that </w:t>
-      </w:r>
-      <w:r>
-        <w:t xml:space="preserve">encapsulated the </w:t>
-      </w:r>
-      <w:r>
-        <w:t xml:space="preserve">common </w:t>
-      </w:r>
-      <w:r>
-        <w:t>behavioral rules</w:t>
-      </w:r>
-      <w:r>
-        <w:t xml:space="preserve">, </w:t>
-      </w:r>
-      <w:r>
-        <w:t xml:space="preserve">running these against </w:t>
-      </w:r>
-      <w:r>
-        <w:t xml:space="preserve">each </w:t>
-      </w:r>
-      <w:r>
-        <w:t xml:space="preserve">Dalek every </w:t>
-      </w:r>
-      <w:r>
-        <w:t>sixteen</w:t>
-      </w:r>
-      <w:r>
-        <w:t xml:space="preserve"> frames</w:t>
-      </w:r>
-      <w:r>
-        <w:t xml:space="preserve">.  </w:t>
-      </w:r>
-      <w:r>
-        <w:t xml:space="preserve">The routine is </w:t>
-      </w:r>
-      <w:r>
-        <w:t>invoked from the game loop</w:t>
-      </w:r>
-      <w:r>
-        <w:t xml:space="preserve">.  </w:t>
-      </w:r>
-    </w:p>
-    <w:p>
-      <w:r>
-        <w:t xml:space="preserve">The </w:t>
-      </w:r>
-      <w:r>
-        <w:t xml:space="preserve">routine checks </w:t>
-      </w:r>
-      <w:r>
-        <w:t xml:space="preserve">to see if K9 </w:t>
-      </w:r>
-      <w:r>
-        <w:t xml:space="preserve">is </w:t>
-      </w:r>
-      <w:r>
-        <w:t>in sight</w:t>
-      </w:r>
-      <w:r>
-        <w:t xml:space="preserve"> (using a helper routine)</w:t>
-      </w:r>
-      <w:r>
-        <w:t>,</w:t>
-      </w:r>
-      <w:r>
-        <w:t xml:space="preserve"> promot</w:t>
-      </w:r>
-      <w:r>
-        <w:t>ing</w:t>
-      </w:r>
-      <w:r>
-        <w:t xml:space="preserve"> </w:t>
-      </w:r>
-      <w:r>
-        <w:t>Dalek’s</w:t>
-      </w:r>
-      <w:r>
-        <w:t xml:space="preserve"> </w:t>
-      </w:r>
-      <w:r>
-        <w:t xml:space="preserve">action to </w:t>
-      </w:r>
-      <w:proofErr w:type="spellStart"/>
+        <w:t>PursueLeft</w:t>
+      </w:r>
       <w:r>
         <w:rPr>
           <w:b/>
@@ -14743,9 +14544,11 @@
           <w:i/>
           <w:iCs/>
         </w:rPr>
-        <w:t>PursueLeft</w:t>
-      </w:r>
-      <w:proofErr w:type="spellEnd"/>
+        <w:t xml:space="preserve"> </w:t>
+      </w:r>
+      <w:r>
+        <w:t>or</w:t>
+      </w:r>
       <w:r>
         <w:rPr>
           <w:b/>
@@ -14753,10 +14556,242 @@
           <w:i/>
           <w:iCs/>
         </w:rPr>
+        <w:t xml:space="preserve"> PursueRight</w:t>
+      </w:r>
+      <w:r>
+        <w:t xml:space="preserve"> if so</w:t>
+      </w:r>
+      <w:r>
+        <w:t xml:space="preserve">.  </w:t>
+      </w:r>
+      <w:r>
+        <w:t xml:space="preserve">The function also </w:t>
+      </w:r>
+      <w:r>
+        <w:t>checks to see if K9 is within weapon’s range</w:t>
+      </w:r>
+      <w:r>
+        <w:t>, firing its weapon if it is.</w:t>
+      </w:r>
+    </w:p>
+    <w:p>
+      <w:r>
+        <w:t xml:space="preserve">I then updated </w:t>
+      </w:r>
+      <w:r>
+        <w:t>enemyAnimate</w:t>
+      </w:r>
+      <w:r>
+        <w:t xml:space="preserve"> and all the </w:t>
+      </w:r>
+      <w:r>
+        <w:t xml:space="preserve">Dalek </w:t>
+      </w:r>
+      <w:r>
+        <w:t xml:space="preserve">frame callback functions </w:t>
+      </w:r>
+      <w:r>
+        <w:t xml:space="preserve">to </w:t>
+      </w:r>
+      <w:r>
+        <w:t xml:space="preserve">amend their </w:t>
+      </w:r>
+      <w:r>
+        <w:t>behaviors</w:t>
+      </w:r>
+      <w:r>
+        <w:t xml:space="preserve"> based on </w:t>
+      </w:r>
+      <w:r>
+        <w:t xml:space="preserve">the </w:t>
+      </w:r>
+      <w:r>
+        <w:t>current action</w:t>
+      </w:r>
+      <w:r>
+        <w:t xml:space="preserve">.  </w:t>
+      </w:r>
+      <w:r>
+        <w:t xml:space="preserve">The challenge was keeping the impact (increased code-size) to a </w:t>
+      </w:r>
+      <w:r>
+        <w:t>minimum</w:t>
+      </w:r>
+      <w:r>
+        <w:t xml:space="preserve">.  </w:t>
+      </w:r>
+      <w:r>
+        <w:t>A lot of time was spent refactoring these functio</w:t>
+      </w:r>
+      <w:r>
+        <w:t>ns to use as few code bytes as possible.</w:t>
+      </w:r>
+    </w:p>
+    <w:p>
+      <w:r>
+        <w:t>On</w:t>
+      </w:r>
+      <w:r>
+        <w:t>e</w:t>
+      </w:r>
+      <w:r>
+        <w:t xml:space="preserve"> notable challenge was how best to </w:t>
+      </w:r>
+      <w:r>
+        <w:t xml:space="preserve">show </w:t>
+      </w:r>
+      <w:r>
+        <w:t>damage being inflicted on K9</w:t>
+      </w:r>
+      <w:r>
+        <w:t xml:space="preserve">.  </w:t>
+      </w:r>
+      <w:r>
+        <w:t xml:space="preserve">After brainstorming many ideas, I ended up implementing a simple </w:t>
+      </w:r>
+      <w:r>
+        <w:t>first-person</w:t>
+      </w:r>
+      <w:r>
         <w:t xml:space="preserve"> </w:t>
       </w:r>
       <w:r>
-        <w:t>or</w:t>
+        <w:t xml:space="preserve">effect where </w:t>
+      </w:r>
+      <w:r>
+        <w:t xml:space="preserve">the </w:t>
+      </w:r>
+      <w:r>
+        <w:t xml:space="preserve">screen </w:t>
+      </w:r>
+      <w:r>
+        <w:t xml:space="preserve">is flashed </w:t>
+      </w:r>
+      <w:r>
+        <w:t xml:space="preserve">intermittently to </w:t>
+      </w:r>
+      <w:r>
+        <w:t>black</w:t>
+      </w:r>
+      <w:r>
+        <w:t xml:space="preserve"> </w:t>
+      </w:r>
+      <w:r>
+        <w:t>and a</w:t>
+      </w:r>
+      <w:r>
+        <w:t>n obnoxious sound</w:t>
+      </w:r>
+      <w:r>
+        <w:t xml:space="preserve"> is </w:t>
+      </w:r>
+      <w:r>
+        <w:t>played</w:t>
+      </w:r>
+      <w:r>
+        <w:t xml:space="preserve">.  </w:t>
+      </w:r>
+      <w:r>
+        <w:t xml:space="preserve">The </w:t>
+      </w:r>
+      <w:r>
+        <w:t xml:space="preserve">result </w:t>
+      </w:r>
+      <w:r>
+        <w:t xml:space="preserve">is quite </w:t>
+      </w:r>
+      <w:r>
+        <w:t>e</w:t>
+      </w:r>
+      <w:r>
+        <w:t>ffective</w:t>
+      </w:r>
+      <w:r>
+        <w:t>.</w:t>
+      </w:r>
+    </w:p>
+    <w:p>
+      <w:r>
+        <w:t xml:space="preserve">To minimize the risk triggering a seizure, the flash frequency </w:t>
+      </w:r>
+      <w:r>
+        <w:t xml:space="preserve">was set at </w:t>
+      </w:r>
+      <w:r>
+        <w:t xml:space="preserve">1.56Hz, outside of </w:t>
+      </w:r>
+      <w:r>
+        <w:t xml:space="preserve">the </w:t>
+      </w:r>
+      <w:r>
+        <w:t>3-30Hz range that some individuals are sensitive to</w:t>
+      </w:r>
+      <w:r>
+        <w:t xml:space="preserve">.  </w:t>
+      </w:r>
+      <w:r>
+        <w:t xml:space="preserve">A second long pause was added </w:t>
+      </w:r>
+      <w:r>
+        <w:t xml:space="preserve">later </w:t>
+      </w:r>
+      <w:r>
+        <w:t xml:space="preserve">between every pair of flashes to ensure the flashes are </w:t>
+      </w:r>
+      <w:r>
+        <w:t xml:space="preserve">also </w:t>
+      </w:r>
+      <w:r>
+        <w:t>intermittent.</w:t>
+      </w:r>
+    </w:p>
+    <w:p>
+      <w:r>
+        <w:t xml:space="preserve">I also added a Mode 7 </w:t>
+      </w:r>
+      <w:r>
+        <w:t xml:space="preserve">incomplete level </w:t>
+      </w:r>
+      <w:r>
+        <w:t xml:space="preserve">screen, which </w:t>
+      </w:r>
+      <w:r>
+        <w:t>shows</w:t>
+      </w:r>
+      <w:r>
+        <w:t xml:space="preserve"> </w:t>
+      </w:r>
+      <w:r>
+        <w:t xml:space="preserve">if </w:t>
+      </w:r>
+      <w:r>
+        <w:t>K</w:t>
+      </w:r>
+      <w:r>
+        <w:t xml:space="preserve">9’s health </w:t>
+      </w:r>
+      <w:r>
+        <w:t xml:space="preserve">becomes </w:t>
+      </w:r>
+      <w:r>
+        <w:t>zero</w:t>
+      </w:r>
+      <w:r>
+        <w:t xml:space="preserve">.  </w:t>
+      </w:r>
+      <w:r>
+        <w:t>Pressing space restarts the level.</w:t>
+      </w:r>
+    </w:p>
+    <w:p>
+      <w:r>
+        <w:t xml:space="preserve">I then turned to </w:t>
+      </w:r>
+      <w:r>
+        <w:t>implementing</w:t>
+      </w:r>
+      <w:r>
+        <w:t xml:space="preserve"> the </w:t>
       </w:r>
       <w:r>
         <w:rPr>
@@ -14765,9 +14800,11 @@
           <w:i/>
           <w:iCs/>
         </w:rPr>
-        <w:t xml:space="preserve"> </w:t>
-      </w:r>
-      <w:proofErr w:type="spellStart"/>
+        <w:t>PursueUp</w:t>
+      </w:r>
+      <w:r>
+        <w:t xml:space="preserve"> and </w:t>
+      </w:r>
       <w:r>
         <w:rPr>
           <w:b/>
@@ -14775,319 +14812,54 @@
           <w:i/>
           <w:iCs/>
         </w:rPr>
-        <w:t>PursueRight</w:t>
-      </w:r>
-      <w:proofErr w:type="spellEnd"/>
-      <w:r>
-        <w:t xml:space="preserve"> if so</w:t>
+        <w:t>PursueDown</w:t>
+      </w:r>
+      <w:r>
+        <w:t xml:space="preserve"> behavior</w:t>
+      </w:r>
+      <w:r>
+        <w:t>al rule</w:t>
+      </w:r>
+      <w:r>
+        <w:t>s</w:t>
+      </w:r>
+      <w:r>
+        <w:t>.</w:t>
+      </w:r>
+    </w:p>
+    <w:p>
+      <w:r>
+        <w:lastRenderedPageBreak/>
+        <w:t xml:space="preserve">Of course, </w:t>
+      </w:r>
+      <w:r>
+        <w:t>Dalek</w:t>
+      </w:r>
+      <w:r>
+        <w:t xml:space="preserve">s needed to be able to ride elevators, so I </w:t>
+      </w:r>
+      <w:r>
+        <w:t xml:space="preserve">had to </w:t>
+      </w:r>
+      <w:r>
+        <w:t>generalize the elevator cod</w:t>
+      </w:r>
+      <w:r>
+        <w:t>e to support this</w:t>
       </w:r>
       <w:r>
         <w:t xml:space="preserve">.  </w:t>
       </w:r>
       <w:r>
-        <w:t xml:space="preserve">The function also </w:t>
-      </w:r>
-      <w:r>
-        <w:t>checks to see if K9 is within weapon’s range</w:t>
-      </w:r>
-      <w:r>
-        <w:t>, firing its weapon if it is.</w:t>
-      </w:r>
-    </w:p>
-    <w:p>
-      <w:r>
-        <w:t xml:space="preserve">I then updated </w:t>
-      </w:r>
-      <w:proofErr w:type="spellStart"/>
-      <w:r>
-        <w:t>enemyAnimate</w:t>
-      </w:r>
-      <w:proofErr w:type="spellEnd"/>
-      <w:r>
-        <w:t xml:space="preserve"> and all the </w:t>
-      </w:r>
-      <w:r>
-        <w:t xml:space="preserve">Dalek </w:t>
-      </w:r>
-      <w:r>
-        <w:t xml:space="preserve">frame callback functions </w:t>
-      </w:r>
-      <w:r>
-        <w:t xml:space="preserve">to </w:t>
-      </w:r>
-      <w:r>
-        <w:t xml:space="preserve">amend their </w:t>
-      </w:r>
-      <w:r>
-        <w:t>behaviors</w:t>
-      </w:r>
-      <w:r>
-        <w:t xml:space="preserve"> based on </w:t>
-      </w:r>
-      <w:r>
-        <w:t xml:space="preserve">the </w:t>
-      </w:r>
-      <w:r>
-        <w:t>current action</w:t>
-      </w:r>
-      <w:r>
-        <w:t xml:space="preserve">.  </w:t>
-      </w:r>
-      <w:r>
-        <w:t xml:space="preserve">The challenge was keeping the impact (increased code-size) to a </w:t>
-      </w:r>
-      <w:r>
-        <w:t>minimum</w:t>
-      </w:r>
-      <w:r>
-        <w:t xml:space="preserve">.  </w:t>
-      </w:r>
-      <w:r>
-        <w:t>A lot of time was spent refactoring these functio</w:t>
-      </w:r>
-      <w:r>
-        <w:t>ns to use as few code bytes as possible.</w:t>
-      </w:r>
-    </w:p>
-    <w:p>
-      <w:r>
-        <w:t>On</w:t>
-      </w:r>
-      <w:r>
-        <w:t>e</w:t>
-      </w:r>
-      <w:r>
-        <w:t xml:space="preserve"> notable challenge was how best to </w:t>
-      </w:r>
-      <w:r>
-        <w:t xml:space="preserve">show </w:t>
-      </w:r>
-      <w:r>
-        <w:t>damage being inflicted on K9</w:t>
-      </w:r>
-      <w:r>
-        <w:t xml:space="preserve">.  </w:t>
-      </w:r>
-      <w:r>
-        <w:t xml:space="preserve">After brainstorming many ideas, I ended up implementing a simple </w:t>
-      </w:r>
-      <w:r>
-        <w:t>first-person</w:t>
-      </w:r>
-      <w:r>
-        <w:t xml:space="preserve"> </w:t>
-      </w:r>
-      <w:r>
-        <w:t xml:space="preserve">effect where </w:t>
-      </w:r>
-      <w:r>
-        <w:t xml:space="preserve">the </w:t>
-      </w:r>
-      <w:r>
-        <w:t xml:space="preserve">screen </w:t>
-      </w:r>
-      <w:r>
-        <w:t xml:space="preserve">is flashed </w:t>
-      </w:r>
-      <w:r>
-        <w:t xml:space="preserve">intermittently to </w:t>
-      </w:r>
-      <w:r>
-        <w:t>black</w:t>
-      </w:r>
-      <w:r>
-        <w:t xml:space="preserve"> </w:t>
-      </w:r>
-      <w:r>
-        <w:t>and a</w:t>
-      </w:r>
-      <w:r>
-        <w:t>n obnoxious sound</w:t>
-      </w:r>
-      <w:r>
-        <w:t xml:space="preserve"> is </w:t>
-      </w:r>
-      <w:r>
-        <w:t>played</w:t>
-      </w:r>
-      <w:r>
-        <w:t xml:space="preserve">.  </w:t>
-      </w:r>
-      <w:r>
-        <w:t xml:space="preserve">The </w:t>
-      </w:r>
-      <w:r>
-        <w:t xml:space="preserve">result </w:t>
-      </w:r>
-      <w:r>
-        <w:t xml:space="preserve">is quite </w:t>
-      </w:r>
-      <w:r>
-        <w:t>e</w:t>
-      </w:r>
-      <w:r>
-        <w:t>ffective</w:t>
-      </w:r>
-      <w:r>
-        <w:t>.</w:t>
-      </w:r>
-    </w:p>
-    <w:p>
-      <w:r>
-        <w:t xml:space="preserve">To minimize the risk triggering a seizure, the flash frequency </w:t>
-      </w:r>
-      <w:r>
-        <w:t xml:space="preserve">was set at </w:t>
-      </w:r>
-      <w:r>
-        <w:t xml:space="preserve">1.56Hz, outside of </w:t>
-      </w:r>
-      <w:r>
-        <w:t xml:space="preserve">the </w:t>
-      </w:r>
-      <w:r>
-        <w:t>3-30Hz range that some individuals are sensitive to</w:t>
-      </w:r>
-      <w:r>
-        <w:t xml:space="preserve">.  </w:t>
-      </w:r>
-      <w:r>
-        <w:t xml:space="preserve">A second long pause was added </w:t>
-      </w:r>
-      <w:r>
-        <w:t xml:space="preserve">later </w:t>
-      </w:r>
-      <w:r>
-        <w:t xml:space="preserve">between every pair of flashes to ensure the flashes are </w:t>
-      </w:r>
-      <w:r>
-        <w:t xml:space="preserve">also </w:t>
-      </w:r>
-      <w:r>
-        <w:t>intermittent.</w:t>
-      </w:r>
-    </w:p>
-    <w:p>
-      <w:r>
-        <w:t xml:space="preserve">I also added a Mode 7 </w:t>
-      </w:r>
-      <w:r>
-        <w:t xml:space="preserve">incomplete level </w:t>
-      </w:r>
-      <w:r>
-        <w:t xml:space="preserve">screen, which </w:t>
-      </w:r>
-      <w:r>
-        <w:t>shows</w:t>
-      </w:r>
-      <w:r>
-        <w:t xml:space="preserve"> </w:t>
-      </w:r>
-      <w:r>
-        <w:t xml:space="preserve">if </w:t>
-      </w:r>
-      <w:r>
-        <w:t>K</w:t>
-      </w:r>
-      <w:r>
-        <w:t xml:space="preserve">9’s health </w:t>
-      </w:r>
-      <w:r>
-        <w:t xml:space="preserve">becomes </w:t>
-      </w:r>
-      <w:r>
-        <w:t>zero</w:t>
-      </w:r>
-      <w:r>
-        <w:t xml:space="preserve">.  </w:t>
-      </w:r>
-      <w:r>
-        <w:t>Pressing space restarts the level.</w:t>
-      </w:r>
-    </w:p>
-    <w:p>
-      <w:r>
-        <w:t xml:space="preserve">I then turned to </w:t>
-      </w:r>
-      <w:r>
-        <w:t>implementing</w:t>
-      </w:r>
-      <w:r>
-        <w:t xml:space="preserve"> the </w:t>
-      </w:r>
-      <w:proofErr w:type="spellStart"/>
-      <w:r>
-        <w:rPr>
-          <w:b/>
-          <w:bCs/>
+        <w:t xml:space="preserve">Fortunately, the low nibble of the elevator’s </w:t>
+      </w:r>
+      <w:r>
+        <w:rPr>
           <w:i/>
           <w:iCs/>
         </w:rPr>
-        <w:t>PursueUp</w:t>
-      </w:r>
-      <w:proofErr w:type="spellEnd"/>
-      <w:r>
-        <w:t xml:space="preserve"> and </w:t>
-      </w:r>
-      <w:proofErr w:type="spellStart"/>
-      <w:r>
-        <w:rPr>
-          <w:b/>
-          <w:bCs/>
-          <w:i/>
-          <w:iCs/>
-        </w:rPr>
-        <w:t>PursueDown</w:t>
-      </w:r>
-      <w:proofErr w:type="spellEnd"/>
-      <w:r>
-        <w:t xml:space="preserve"> behavior</w:t>
-      </w:r>
-      <w:r>
-        <w:t>al rule</w:t>
-      </w:r>
-      <w:r>
-        <w:t>s</w:t>
-      </w:r>
-      <w:r>
-        <w:t>.</w:t>
-      </w:r>
-    </w:p>
-    <w:p>
-      <w:r>
-        <w:lastRenderedPageBreak/>
-        <w:t xml:space="preserve">Of course, </w:t>
-      </w:r>
-      <w:r>
-        <w:t>Dalek</w:t>
-      </w:r>
-      <w:r>
-        <w:t xml:space="preserve">s needed to be able to ride elevators, so I </w:t>
-      </w:r>
-      <w:r>
-        <w:t xml:space="preserve">had to </w:t>
-      </w:r>
-      <w:r>
-        <w:t>generalize the elevator cod</w:t>
-      </w:r>
-      <w:r>
-        <w:t>e to support this</w:t>
-      </w:r>
-      <w:r>
-        <w:t xml:space="preserve">.  </w:t>
-      </w:r>
-      <w:r>
-        <w:t xml:space="preserve">Fortunately, the low nibble of the elevator’s </w:t>
-      </w:r>
-      <w:proofErr w:type="spellStart"/>
-      <w:r>
-        <w:rPr>
-          <w:i/>
-          <w:iCs/>
-        </w:rPr>
         <w:t>objectState</w:t>
       </w:r>
-      <w:proofErr w:type="spellEnd"/>
       <w:r>
         <w:t xml:space="preserve"> variable </w:t>
       </w:r>
@@ -15776,7 +15548,6 @@
       <w:r>
         <w:t xml:space="preserve">The game uses a </w:t>
       </w:r>
-      <w:proofErr w:type="spellStart"/>
       <w:r>
         <w:rPr>
           <w:i/>
@@ -15784,7 +15555,6 @@
         </w:rPr>
         <w:t>frameCount</w:t>
       </w:r>
-      <w:proofErr w:type="spellEnd"/>
       <w:r>
         <w:t xml:space="preserve"> based timer to inhibit playing the movement sound effect when the other sound effects are playing.</w:t>
       </w:r>
@@ -16073,11 +15843,9 @@
               <w:widowControl w:val="0"/>
               <w:cnfStyle w:val="000000100000" w:firstRow="0" w:lastRow="0" w:firstColumn="0" w:lastColumn="0" w:oddVBand="0" w:evenVBand="0" w:oddHBand="1" w:evenHBand="0" w:firstRowFirstColumn="0" w:firstRowLastColumn="0" w:lastRowFirstColumn="0" w:lastRowLastColumn="0"/>
             </w:pPr>
-            <w:proofErr w:type="spellStart"/>
             <w:r>
               <w:t>MikeH</w:t>
             </w:r>
-            <w:proofErr w:type="spellEnd"/>
           </w:p>
         </w:tc>
         <w:tc>
@@ -16142,11 +15910,9 @@
               <w:widowControl w:val="0"/>
               <w:cnfStyle w:val="000000000000" w:firstRow="0" w:lastRow="0" w:firstColumn="0" w:lastColumn="0" w:oddVBand="0" w:evenVBand="0" w:oddHBand="0" w:evenHBand="0" w:firstRowFirstColumn="0" w:firstRowLastColumn="0" w:lastRowFirstColumn="0" w:lastRowLastColumn="0"/>
             </w:pPr>
-            <w:proofErr w:type="spellStart"/>
             <w:r>
               <w:t>MikeH</w:t>
             </w:r>
-            <w:proofErr w:type="spellEnd"/>
           </w:p>
         </w:tc>
         <w:tc>
@@ -16216,11 +15982,9 @@
               <w:widowControl w:val="0"/>
               <w:cnfStyle w:val="000000100000" w:firstRow="0" w:lastRow="0" w:firstColumn="0" w:lastColumn="0" w:oddVBand="0" w:evenVBand="0" w:oddHBand="1" w:evenHBand="0" w:firstRowFirstColumn="0" w:firstRowLastColumn="0" w:lastRowFirstColumn="0" w:lastRowLastColumn="0"/>
             </w:pPr>
-            <w:proofErr w:type="spellStart"/>
             <w:r>
               <w:t>MikeH</w:t>
             </w:r>
-            <w:proofErr w:type="spellEnd"/>
           </w:p>
         </w:tc>
         <w:tc>
@@ -16288,11 +16052,9 @@
               <w:widowControl w:val="0"/>
               <w:cnfStyle w:val="000000000000" w:firstRow="0" w:lastRow="0" w:firstColumn="0" w:lastColumn="0" w:oddVBand="0" w:evenVBand="0" w:oddHBand="0" w:evenHBand="0" w:firstRowFirstColumn="0" w:firstRowLastColumn="0" w:lastRowFirstColumn="0" w:lastRowLastColumn="0"/>
             </w:pPr>
-            <w:proofErr w:type="spellStart"/>
             <w:r>
               <w:t>MikeH</w:t>
             </w:r>
-            <w:proofErr w:type="spellEnd"/>
           </w:p>
         </w:tc>
         <w:tc>
@@ -16352,11 +16114,9 @@
               <w:widowControl w:val="0"/>
               <w:cnfStyle w:val="000000100000" w:firstRow="0" w:lastRow="0" w:firstColumn="0" w:lastColumn="0" w:oddVBand="0" w:evenVBand="0" w:oddHBand="1" w:evenHBand="0" w:firstRowFirstColumn="0" w:firstRowLastColumn="0" w:lastRowFirstColumn="0" w:lastRowLastColumn="0"/>
             </w:pPr>
-            <w:proofErr w:type="spellStart"/>
             <w:r>
               <w:t>MikeH</w:t>
             </w:r>
-            <w:proofErr w:type="spellEnd"/>
           </w:p>
         </w:tc>
         <w:tc>
@@ -16422,11 +16182,9 @@
               <w:widowControl w:val="0"/>
               <w:cnfStyle w:val="000000000000" w:firstRow="0" w:lastRow="0" w:firstColumn="0" w:lastColumn="0" w:oddVBand="0" w:evenVBand="0" w:oddHBand="0" w:evenHBand="0" w:firstRowFirstColumn="0" w:firstRowLastColumn="0" w:lastRowFirstColumn="0" w:lastRowLastColumn="0"/>
             </w:pPr>
-            <w:proofErr w:type="spellStart"/>
             <w:r>
               <w:t>MikeH</w:t>
             </w:r>
-            <w:proofErr w:type="spellEnd"/>
           </w:p>
         </w:tc>
         <w:tc>
@@ -16500,11 +16258,9 @@
               <w:widowControl w:val="0"/>
               <w:cnfStyle w:val="000000100000" w:firstRow="0" w:lastRow="0" w:firstColumn="0" w:lastColumn="0" w:oddVBand="0" w:evenVBand="0" w:oddHBand="1" w:evenHBand="0" w:firstRowFirstColumn="0" w:firstRowLastColumn="0" w:lastRowFirstColumn="0" w:lastRowLastColumn="0"/>
             </w:pPr>
-            <w:proofErr w:type="spellStart"/>
             <w:r>
               <w:t>MikeH</w:t>
             </w:r>
-            <w:proofErr w:type="spellEnd"/>
           </w:p>
         </w:tc>
         <w:tc>
@@ -16619,11 +16375,9 @@
               <w:widowControl w:val="0"/>
               <w:cnfStyle w:val="000000000000" w:firstRow="0" w:lastRow="0" w:firstColumn="0" w:lastColumn="0" w:oddVBand="0" w:evenVBand="0" w:oddHBand="0" w:evenHBand="0" w:firstRowFirstColumn="0" w:firstRowLastColumn="0" w:lastRowFirstColumn="0" w:lastRowLastColumn="0"/>
             </w:pPr>
-            <w:proofErr w:type="spellStart"/>
             <w:r>
               <w:t>MikeH</w:t>
             </w:r>
-            <w:proofErr w:type="spellEnd"/>
           </w:p>
         </w:tc>
         <w:tc>
@@ -16730,11 +16484,9 @@
               <w:widowControl w:val="0"/>
               <w:cnfStyle w:val="000000100000" w:firstRow="0" w:lastRow="0" w:firstColumn="0" w:lastColumn="0" w:oddVBand="0" w:evenVBand="0" w:oddHBand="1" w:evenHBand="0" w:firstRowFirstColumn="0" w:firstRowLastColumn="0" w:lastRowFirstColumn="0" w:lastRowLastColumn="0"/>
             </w:pPr>
-            <w:proofErr w:type="spellStart"/>
             <w:r>
               <w:t>JamesB</w:t>
             </w:r>
-            <w:proofErr w:type="spellEnd"/>
           </w:p>
         </w:tc>
         <w:tc>
@@ -16789,11 +16541,9 @@
               <w:widowControl w:val="0"/>
               <w:cnfStyle w:val="000000000000" w:firstRow="0" w:lastRow="0" w:firstColumn="0" w:lastColumn="0" w:oddVBand="0" w:evenVBand="0" w:oddHBand="0" w:evenHBand="0" w:firstRowFirstColumn="0" w:firstRowLastColumn="0" w:lastRowFirstColumn="0" w:lastRowLastColumn="0"/>
             </w:pPr>
-            <w:proofErr w:type="spellStart"/>
             <w:r>
               <w:t>MikeH</w:t>
             </w:r>
-            <w:proofErr w:type="spellEnd"/>
           </w:p>
         </w:tc>
         <w:tc>
@@ -16867,7 +16617,6 @@
               <w:widowControl w:val="0"/>
               <w:cnfStyle w:val="000000100000" w:firstRow="0" w:lastRow="0" w:firstColumn="0" w:lastColumn="0" w:oddVBand="0" w:evenVBand="0" w:oddHBand="1" w:evenHBand="0" w:firstRowFirstColumn="0" w:firstRowLastColumn="0" w:lastRowFirstColumn="0" w:lastRowLastColumn="0"/>
             </w:pPr>
-            <w:proofErr w:type="spellStart"/>
             <w:r>
               <w:t>Q</w:t>
             </w:r>
@@ -16877,7 +16626,6 @@
             <w:r>
               <w:t>ntinM</w:t>
             </w:r>
-            <w:proofErr w:type="spellEnd"/>
           </w:p>
         </w:tc>
         <w:tc>
@@ -16940,7 +16688,6 @@
                 <w:bCs/>
               </w:rPr>
             </w:pPr>
-            <w:proofErr w:type="spellStart"/>
             <w:r>
               <w:t>Q</w:t>
             </w:r>
@@ -16950,7 +16697,6 @@
             <w:r>
               <w:t>ntinM</w:t>
             </w:r>
-            <w:proofErr w:type="spellEnd"/>
           </w:p>
         </w:tc>
         <w:tc>
@@ -17038,11 +16784,9 @@
               <w:widowControl w:val="0"/>
               <w:cnfStyle w:val="000000100000" w:firstRow="0" w:lastRow="0" w:firstColumn="0" w:lastColumn="0" w:oddVBand="0" w:evenVBand="0" w:oddHBand="1" w:evenHBand="0" w:firstRowFirstColumn="0" w:firstRowLastColumn="0" w:lastRowFirstColumn="0" w:lastRowLastColumn="0"/>
             </w:pPr>
-            <w:proofErr w:type="spellStart"/>
             <w:r>
               <w:t>MikeH</w:t>
             </w:r>
-            <w:proofErr w:type="spellEnd"/>
           </w:p>
         </w:tc>
         <w:tc>
@@ -17624,11 +17368,9 @@
               <w:widowControl w:val="0"/>
               <w:cnfStyle w:val="000000100000" w:firstRow="0" w:lastRow="0" w:firstColumn="0" w:lastColumn="0" w:oddVBand="0" w:evenVBand="0" w:oddHBand="1" w:evenHBand="0" w:firstRowFirstColumn="0" w:firstRowLastColumn="0" w:lastRowFirstColumn="0" w:lastRowLastColumn="0"/>
             </w:pPr>
-            <w:proofErr w:type="spellStart"/>
             <w:r>
               <w:t>ChrisB</w:t>
             </w:r>
-            <w:proofErr w:type="spellEnd"/>
           </w:p>
         </w:tc>
         <w:tc>
@@ -17817,11 +17559,9 @@
               <w:cnfStyle w:val="000000100000" w:firstRow="0" w:lastRow="0" w:firstColumn="0" w:lastColumn="0" w:oddVBand="0" w:evenVBand="0" w:oddHBand="1" w:evenHBand="0" w:firstRowFirstColumn="0" w:firstRowLastColumn="0" w:lastRowFirstColumn="0" w:lastRowLastColumn="0"/>
             </w:pPr>
             <w:hyperlink r:id="rId20" w:history="1">
-              <w:proofErr w:type="spellStart"/>
               <w:r>
                 <w:t>alecb</w:t>
               </w:r>
-              <w:proofErr w:type="spellEnd"/>
             </w:hyperlink>
           </w:p>
         </w:tc>
@@ -17882,11 +17622,9 @@
               <w:cnfStyle w:val="000000000000" w:firstRow="0" w:lastRow="0" w:firstColumn="0" w:lastColumn="0" w:oddVBand="0" w:evenVBand="0" w:oddHBand="0" w:evenHBand="0" w:firstRowFirstColumn="0" w:firstRowLastColumn="0" w:lastRowFirstColumn="0" w:lastRowLastColumn="0"/>
             </w:pPr>
             <w:hyperlink r:id="rId21" w:history="1">
-              <w:proofErr w:type="spellStart"/>
               <w:r>
                 <w:t>alecb</w:t>
               </w:r>
-              <w:proofErr w:type="spellEnd"/>
             </w:hyperlink>
           </w:p>
         </w:tc>
@@ -17951,13 +17689,8 @@
               <w:t>j</w:t>
             </w:r>
             <w:r>
-              <w:t xml:space="preserve">ms2, tricky, </w:t>
-            </w:r>
-            <w:proofErr w:type="spellStart"/>
-            <w:r>
-              <w:t>TobyLobster</w:t>
-            </w:r>
-            <w:proofErr w:type="spellEnd"/>
+              <w:t>ms2, tricky, TobyLobster</w:t>
+            </w:r>
           </w:p>
         </w:tc>
         <w:tc>
@@ -18288,7 +18021,6 @@
       <w:r>
         <w:t xml:space="preserve"> into the sprite data and let the </w:t>
       </w:r>
-      <w:proofErr w:type="spellStart"/>
       <w:r>
         <w:rPr>
           <w:i/>
@@ -18296,7 +18028,6 @@
         </w:rPr>
         <w:t>drawSprite</w:t>
       </w:r>
-      <w:proofErr w:type="spellEnd"/>
       <w:r>
         <w:t xml:space="preserve"> routine do all the work of putting the pixels on the screen, however this would result in the ‘</w:t>
       </w:r>
@@ -18808,7 +18539,6 @@
       <w:r>
         <w:t xml:space="preserve">from </w:t>
       </w:r>
-      <w:proofErr w:type="spellStart"/>
       <w:r>
         <w:rPr>
           <w:i/>
@@ -18816,11 +18546,9 @@
         </w:rPr>
         <w:t>drawObject</w:t>
       </w:r>
-      <w:proofErr w:type="spellEnd"/>
       <w:r>
         <w:t xml:space="preserve"> and </w:t>
       </w:r>
-      <w:proofErr w:type="spellStart"/>
       <w:r>
         <w:rPr>
           <w:i/>
@@ -18828,7 +18556,6 @@
         </w:rPr>
         <w:t>drawLaserOn</w:t>
       </w:r>
-      <w:proofErr w:type="spellEnd"/>
       <w:r>
         <w:rPr>
           <w:i/>
@@ -20292,7 +20019,6 @@
       <w:r>
         <w:t xml:space="preserve">The title functionality starts and stops playback by invoking the </w:t>
       </w:r>
-      <w:proofErr w:type="spellStart"/>
       <w:r>
         <w:rPr>
           <w:b/>
@@ -20302,11 +20028,9 @@
         </w:rPr>
         <w:t>playMusic</w:t>
       </w:r>
-      <w:proofErr w:type="spellEnd"/>
       <w:r>
         <w:t xml:space="preserve"> and </w:t>
       </w:r>
-      <w:proofErr w:type="spellStart"/>
       <w:r>
         <w:rPr>
           <w:b/>
@@ -20316,7 +20040,6 @@
         </w:rPr>
         <w:t>stopMusic</w:t>
       </w:r>
-      <w:proofErr w:type="spellEnd"/>
       <w:r>
         <w:t xml:space="preserve"> routines</w:t>
       </w:r>
@@ -22688,11 +22411,9 @@
               <w:keepLines/>
               <w:widowControl w:val="0"/>
             </w:pPr>
-            <w:proofErr w:type="spellStart"/>
             <w:r>
               <w:t>soundVector_beginPursuit</w:t>
             </w:r>
-            <w:proofErr w:type="spellEnd"/>
           </w:p>
         </w:tc>
         <w:tc>
@@ -22706,7 +22427,6 @@
               <w:widowControl w:val="0"/>
               <w:cnfStyle w:val="000000100000" w:firstRow="0" w:lastRow="0" w:firstColumn="0" w:lastColumn="0" w:oddVBand="0" w:evenVBand="0" w:oddHBand="1" w:evenHBand="0" w:firstRowFirstColumn="0" w:firstRowLastColumn="0" w:lastRowFirstColumn="0" w:lastRowLastColumn="0"/>
             </w:pPr>
-            <w:proofErr w:type="spellStart"/>
             <w:r>
               <w:t>soundEffect_</w:t>
             </w:r>
@@ -22719,7 +22439,6 @@
             <w:r>
               <w:t>t</w:t>
             </w:r>
-            <w:proofErr w:type="spellEnd"/>
           </w:p>
         </w:tc>
         <w:tc>
@@ -22733,14 +22452,12 @@
               <w:widowControl w:val="0"/>
               <w:cnfStyle w:val="000000100000" w:firstRow="0" w:lastRow="0" w:firstColumn="0" w:lastColumn="0" w:oddVBand="0" w:evenVBand="0" w:oddHBand="1" w:evenHBand="0" w:firstRowFirstColumn="0" w:firstRowLastColumn="0" w:lastRowFirstColumn="0" w:lastRowLastColumn="0"/>
             </w:pPr>
-            <w:proofErr w:type="spellStart"/>
             <w:r>
               <w:t>sample_</w:t>
             </w:r>
             <w:r>
               <w:t>beginPursuit</w:t>
             </w:r>
-            <w:proofErr w:type="spellEnd"/>
           </w:p>
         </w:tc>
       </w:tr>
@@ -22756,11 +22473,9 @@
               <w:keepLines/>
               <w:widowControl w:val="0"/>
             </w:pPr>
-            <w:proofErr w:type="spellStart"/>
             <w:r>
               <w:t>soundVector_updatePursuit</w:t>
             </w:r>
-            <w:proofErr w:type="spellEnd"/>
           </w:p>
         </w:tc>
         <w:tc>
@@ -22774,11 +22489,9 @@
               <w:widowControl w:val="0"/>
               <w:cnfStyle w:val="000000000000" w:firstRow="0" w:lastRow="0" w:firstColumn="0" w:lastColumn="0" w:oddVBand="0" w:evenVBand="0" w:oddHBand="0" w:evenHBand="0" w:firstRowFirstColumn="0" w:firstRowLastColumn="0" w:lastRowFirstColumn="0" w:lastRowLastColumn="0"/>
             </w:pPr>
-            <w:proofErr w:type="spellStart"/>
             <w:r>
               <w:t>soundEffect_updatePursuit</w:t>
             </w:r>
-            <w:proofErr w:type="spellEnd"/>
           </w:p>
         </w:tc>
         <w:tc>
@@ -22792,11 +22505,9 @@
               <w:widowControl w:val="0"/>
               <w:cnfStyle w:val="000000000000" w:firstRow="0" w:lastRow="0" w:firstColumn="0" w:lastColumn="0" w:oddVBand="0" w:evenVBand="0" w:oddHBand="0" w:evenHBand="0" w:firstRowFirstColumn="0" w:firstRowLastColumn="0" w:lastRowFirstColumn="0" w:lastRowLastColumn="0"/>
             </w:pPr>
-            <w:proofErr w:type="spellStart"/>
             <w:r>
               <w:t>sample_updatePursuit</w:t>
             </w:r>
-            <w:proofErr w:type="spellEnd"/>
           </w:p>
         </w:tc>
       </w:tr>
@@ -22815,11 +22526,9 @@
               <w:keepLines/>
               <w:widowControl w:val="0"/>
             </w:pPr>
-            <w:proofErr w:type="spellStart"/>
             <w:r>
               <w:t>soundVector_endPursuit</w:t>
             </w:r>
-            <w:proofErr w:type="spellEnd"/>
           </w:p>
         </w:tc>
         <w:tc>
@@ -22833,11 +22542,9 @@
               <w:widowControl w:val="0"/>
               <w:cnfStyle w:val="000000100000" w:firstRow="0" w:lastRow="0" w:firstColumn="0" w:lastColumn="0" w:oddVBand="0" w:evenVBand="0" w:oddHBand="1" w:evenHBand="0" w:firstRowFirstColumn="0" w:firstRowLastColumn="0" w:lastRowFirstColumn="0" w:lastRowLastColumn="0"/>
             </w:pPr>
-            <w:proofErr w:type="spellStart"/>
             <w:r>
               <w:t>soundEffect_endPursuit</w:t>
             </w:r>
-            <w:proofErr w:type="spellEnd"/>
           </w:p>
         </w:tc>
         <w:tc>
@@ -22851,14 +22558,12 @@
               <w:widowControl w:val="0"/>
               <w:cnfStyle w:val="000000100000" w:firstRow="0" w:lastRow="0" w:firstColumn="0" w:lastColumn="0" w:oddVBand="0" w:evenVBand="0" w:oddHBand="1" w:evenHBand="0" w:firstRowFirstColumn="0" w:firstRowLastColumn="0" w:lastRowFirstColumn="0" w:lastRowLastColumn="0"/>
             </w:pPr>
-            <w:proofErr w:type="spellStart"/>
             <w:r>
               <w:t>sample_</w:t>
             </w:r>
             <w:r>
               <w:t>endPursuit</w:t>
             </w:r>
-            <w:proofErr w:type="spellEnd"/>
           </w:p>
         </w:tc>
       </w:tr>
@@ -22874,11 +22579,9 @@
               <w:keepLines/>
               <w:widowControl w:val="0"/>
             </w:pPr>
-            <w:proofErr w:type="spellStart"/>
             <w:r>
               <w:t>soundVector_enemyLasered</w:t>
             </w:r>
-            <w:proofErr w:type="spellEnd"/>
           </w:p>
         </w:tc>
         <w:tc>
@@ -22892,11 +22595,9 @@
               <w:widowControl w:val="0"/>
               <w:cnfStyle w:val="000000000000" w:firstRow="0" w:lastRow="0" w:firstColumn="0" w:lastColumn="0" w:oddVBand="0" w:evenVBand="0" w:oddHBand="0" w:evenHBand="0" w:firstRowFirstColumn="0" w:firstRowLastColumn="0" w:lastRowFirstColumn="0" w:lastRowLastColumn="0"/>
             </w:pPr>
-            <w:proofErr w:type="spellStart"/>
             <w:r>
               <w:t>soundEffect_enemyLasered</w:t>
             </w:r>
-            <w:proofErr w:type="spellEnd"/>
           </w:p>
         </w:tc>
         <w:tc>
@@ -22910,7 +22611,6 @@
               <w:widowControl w:val="0"/>
               <w:cnfStyle w:val="000000000000" w:firstRow="0" w:lastRow="0" w:firstColumn="0" w:lastColumn="0" w:oddVBand="0" w:evenVBand="0" w:oddHBand="0" w:evenHBand="0" w:firstRowFirstColumn="0" w:firstRowLastColumn="0" w:lastRowFirstColumn="0" w:lastRowLastColumn="0"/>
             </w:pPr>
-            <w:proofErr w:type="spellStart"/>
             <w:r>
               <w:t>sample_</w:t>
             </w:r>
@@ -22920,7 +22620,6 @@
             <w:r>
               <w:t>nemyLasered</w:t>
             </w:r>
-            <w:proofErr w:type="spellEnd"/>
           </w:p>
         </w:tc>
       </w:tr>
@@ -22939,11 +22638,9 @@
               <w:keepLines/>
               <w:widowControl w:val="0"/>
             </w:pPr>
-            <w:proofErr w:type="spellStart"/>
             <w:r>
               <w:t>soundVector_weaponFired</w:t>
             </w:r>
-            <w:proofErr w:type="spellEnd"/>
           </w:p>
         </w:tc>
         <w:tc>
@@ -22957,14 +22654,12 @@
               <w:widowControl w:val="0"/>
               <w:cnfStyle w:val="000000100000" w:firstRow="0" w:lastRow="0" w:firstColumn="0" w:lastColumn="0" w:oddVBand="0" w:evenVBand="0" w:oddHBand="1" w:evenHBand="0" w:firstRowFirstColumn="0" w:firstRowLastColumn="0" w:lastRowFirstColumn="0" w:lastRowLastColumn="0"/>
             </w:pPr>
-            <w:proofErr w:type="spellStart"/>
             <w:r>
               <w:t>soundEffect_</w:t>
             </w:r>
             <w:r>
               <w:t>weaponFired</w:t>
             </w:r>
-            <w:proofErr w:type="spellEnd"/>
           </w:p>
         </w:tc>
         <w:tc>
@@ -22978,14 +22673,12 @@
               <w:widowControl w:val="0"/>
               <w:cnfStyle w:val="000000100000" w:firstRow="0" w:lastRow="0" w:firstColumn="0" w:lastColumn="0" w:oddVBand="0" w:evenVBand="0" w:oddHBand="1" w:evenHBand="0" w:firstRowFirstColumn="0" w:firstRowLastColumn="0" w:lastRowFirstColumn="0" w:lastRowLastColumn="0"/>
             </w:pPr>
-            <w:proofErr w:type="spellStart"/>
             <w:r>
               <w:t>sample_</w:t>
             </w:r>
             <w:r>
               <w:t>soundWeapon</w:t>
             </w:r>
-            <w:proofErr w:type="spellEnd"/>
           </w:p>
         </w:tc>
       </w:tr>
@@ -23643,14 +23336,12 @@
               <w:keepLines/>
               <w:widowControl w:val="0"/>
             </w:pPr>
-            <w:proofErr w:type="spellStart"/>
             <w:r>
               <w:t>soundVector_</w:t>
             </w:r>
             <w:r>
               <w:t>enemyDestroyed</w:t>
             </w:r>
-            <w:proofErr w:type="spellEnd"/>
           </w:p>
         </w:tc>
         <w:tc>
@@ -23664,11 +23355,9 @@
               <w:widowControl w:val="0"/>
               <w:cnfStyle w:val="000000100000" w:firstRow="0" w:lastRow="0" w:firstColumn="0" w:lastColumn="0" w:oddVBand="0" w:evenVBand="0" w:oddHBand="1" w:evenHBand="0" w:firstRowFirstColumn="0" w:firstRowLastColumn="0" w:lastRowFirstColumn="0" w:lastRowLastColumn="0"/>
             </w:pPr>
-            <w:proofErr w:type="spellStart"/>
             <w:r>
               <w:t>soundEffect_enemyDestroyed</w:t>
             </w:r>
-            <w:proofErr w:type="spellEnd"/>
           </w:p>
         </w:tc>
         <w:tc>
@@ -23682,14 +23371,12 @@
               <w:widowControl w:val="0"/>
               <w:cnfStyle w:val="000000100000" w:firstRow="0" w:lastRow="0" w:firstColumn="0" w:lastColumn="0" w:oddVBand="0" w:evenVBand="0" w:oddHBand="1" w:evenHBand="0" w:firstRowFirstColumn="0" w:firstRowLastColumn="0" w:lastRowFirstColumn="0" w:lastRowLastColumn="0"/>
             </w:pPr>
-            <w:proofErr w:type="spellStart"/>
             <w:r>
               <w:t>sample_</w:t>
             </w:r>
             <w:r>
               <w:t>enemyDestroyed</w:t>
             </w:r>
-            <w:proofErr w:type="spellEnd"/>
           </w:p>
         </w:tc>
       </w:tr>
@@ -23705,11 +23392,9 @@
               <w:keepLines/>
               <w:widowControl w:val="0"/>
             </w:pPr>
-            <w:proofErr w:type="spellStart"/>
             <w:r>
               <w:t>soundVector_beginLevel</w:t>
             </w:r>
-            <w:proofErr w:type="spellEnd"/>
           </w:p>
         </w:tc>
         <w:tc>
@@ -23723,11 +23408,9 @@
               <w:widowControl w:val="0"/>
               <w:cnfStyle w:val="000000000000" w:firstRow="0" w:lastRow="0" w:firstColumn="0" w:lastColumn="0" w:oddVBand="0" w:evenVBand="0" w:oddHBand="0" w:evenHBand="0" w:firstRowFirstColumn="0" w:firstRowLastColumn="0" w:lastRowFirstColumn="0" w:lastRowLastColumn="0"/>
             </w:pPr>
-            <w:proofErr w:type="spellStart"/>
             <w:r>
               <w:t>soundEffect_beginLevel</w:t>
             </w:r>
-            <w:proofErr w:type="spellEnd"/>
           </w:p>
         </w:tc>
         <w:tc>
@@ -23741,14 +23424,12 @@
               <w:widowControl w:val="0"/>
               <w:cnfStyle w:val="000000000000" w:firstRow="0" w:lastRow="0" w:firstColumn="0" w:lastColumn="0" w:oddVBand="0" w:evenVBand="0" w:oddHBand="0" w:evenHBand="0" w:firstRowFirstColumn="0" w:firstRowLastColumn="0" w:lastRowFirstColumn="0" w:lastRowLastColumn="0"/>
             </w:pPr>
-            <w:proofErr w:type="spellStart"/>
             <w:r>
               <w:t>sample_</w:t>
             </w:r>
             <w:r>
               <w:t>beginLevel</w:t>
             </w:r>
-            <w:proofErr w:type="spellEnd"/>
           </w:p>
         </w:tc>
       </w:tr>
@@ -23767,7 +23448,6 @@
               <w:keepLines/>
               <w:widowControl w:val="0"/>
             </w:pPr>
-            <w:proofErr w:type="spellStart"/>
             <w:r>
               <w:t>soundVector_l</w:t>
             </w:r>
@@ -23777,7 +23457,6 @@
             <w:r>
               <w:t>Complete</w:t>
             </w:r>
-            <w:proofErr w:type="spellEnd"/>
           </w:p>
         </w:tc>
         <w:tc>
@@ -23791,11 +23470,9 @@
               <w:widowControl w:val="0"/>
               <w:cnfStyle w:val="000000100000" w:firstRow="0" w:lastRow="0" w:firstColumn="0" w:lastColumn="0" w:oddVBand="0" w:evenVBand="0" w:oddHBand="1" w:evenHBand="0" w:firstRowFirstColumn="0" w:firstRowLastColumn="0" w:lastRowFirstColumn="0" w:lastRowLastColumn="0"/>
             </w:pPr>
-            <w:proofErr w:type="spellStart"/>
             <w:r>
               <w:t>soundEffect_levelComplete</w:t>
             </w:r>
-            <w:proofErr w:type="spellEnd"/>
           </w:p>
         </w:tc>
         <w:tc>
@@ -23809,14 +23486,12 @@
               <w:widowControl w:val="0"/>
               <w:cnfStyle w:val="000000100000" w:firstRow="0" w:lastRow="0" w:firstColumn="0" w:lastColumn="0" w:oddVBand="0" w:evenVBand="0" w:oddHBand="1" w:evenHBand="0" w:firstRowFirstColumn="0" w:firstRowLastColumn="0" w:lastRowFirstColumn="0" w:lastRowLastColumn="0"/>
             </w:pPr>
-            <w:proofErr w:type="spellStart"/>
             <w:r>
               <w:t>sample_</w:t>
             </w:r>
             <w:r>
               <w:t>levelComplete</w:t>
             </w:r>
-            <w:proofErr w:type="spellEnd"/>
           </w:p>
         </w:tc>
       </w:tr>
@@ -25023,7 +24698,6 @@
       <w:r>
         <w:t xml:space="preserve">require </w:t>
       </w:r>
-      <w:proofErr w:type="spellStart"/>
       <w:r>
         <w:rPr>
           <w:b/>
@@ -25031,7 +24705,6 @@
         </w:rPr>
         <w:t>objectState</w:t>
       </w:r>
-      <w:proofErr w:type="spellEnd"/>
       <w:r>
         <w:t xml:space="preserve"> </w:t>
       </w:r>
@@ -25059,7 +24732,6 @@
       <w:r>
         <w:t xml:space="preserve">elevator, using </w:t>
       </w:r>
-      <w:proofErr w:type="spellStart"/>
       <w:r>
         <w:rPr>
           <w:b/>
@@ -25067,7 +24739,6 @@
         </w:rPr>
         <w:t>objectFrameCounter</w:t>
       </w:r>
-      <w:proofErr w:type="spellEnd"/>
       <w:r>
         <w:t xml:space="preserve"> </w:t>
       </w:r>
@@ -25077,7 +24748,6 @@
       <w:r>
         <w:t xml:space="preserve">distinguish teleports from regular elevators, where </w:t>
       </w:r>
-      <w:proofErr w:type="spellStart"/>
       <w:r>
         <w:rPr>
           <w:b/>
@@ -25085,7 +24755,6 @@
         </w:rPr>
         <w:t>objectFrameCounter</w:t>
       </w:r>
-      <w:proofErr w:type="spellEnd"/>
       <w:r>
         <w:t xml:space="preserve"> </w:t>
       </w:r>
@@ -25181,7 +24850,6 @@
       <w:r>
         <w:t xml:space="preserve">in </w:t>
       </w:r>
-      <w:proofErr w:type="spellStart"/>
       <w:r>
         <w:rPr>
           <w:b/>
@@ -25191,7 +24859,6 @@
         </w:rPr>
         <w:t>objectFrameCounter</w:t>
       </w:r>
-      <w:proofErr w:type="spellEnd"/>
       <w:r>
         <w:rPr>
           <w:b/>
@@ -25301,7 +24968,6 @@
       <w:r>
         <w:t xml:space="preserve">files were created in the level asset folders, with the </w:t>
       </w:r>
-      <w:proofErr w:type="spellStart"/>
       <w:r>
         <w:rPr>
           <w:b/>
@@ -25309,7 +24975,6 @@
         </w:rPr>
         <w:t>BMPConverter</w:t>
       </w:r>
-      <w:proofErr w:type="spellEnd"/>
       <w:r>
         <w:t xml:space="preserve"> console app updated to convert and include these in the generated level atlas data files</w:t>
       </w:r>
@@ -25373,7 +25038,6 @@
       <w:r>
         <w:t xml:space="preserve">A new </w:t>
       </w:r>
-      <w:proofErr w:type="spellStart"/>
       <w:r>
         <w:rPr>
           <w:b/>
@@ -25381,7 +25045,6 @@
         </w:rPr>
         <w:t>rideTeleport</w:t>
       </w:r>
-      <w:proofErr w:type="spellEnd"/>
       <w:r>
         <w:t xml:space="preserve"> routine was introduced</w:t>
       </w:r>
@@ -25449,7 +25112,6 @@
       <w:r>
         <w:t xml:space="preserve">Find the destination teleport object (elevator), held in </w:t>
       </w:r>
-      <w:proofErr w:type="spellStart"/>
       <w:r>
         <w:rPr>
           <w:b/>
@@ -25459,7 +25121,6 @@
         </w:rPr>
         <w:t>objectFrameCounter</w:t>
       </w:r>
-      <w:proofErr w:type="spellEnd"/>
       <w:r>
         <w:t>.</w:t>
       </w:r>
@@ -26173,7 +25834,6 @@
       <w:r>
         <w:t xml:space="preserve">A new </w:t>
       </w:r>
-      <w:proofErr w:type="spellStart"/>
       <w:r>
         <w:rPr>
           <w:b/>
@@ -26183,7 +25843,6 @@
         </w:rPr>
         <w:t>drawTile</w:t>
       </w:r>
-      <w:proofErr w:type="spellEnd"/>
       <w:r>
         <w:t xml:space="preserve"> routine was </w:t>
       </w:r>
@@ -27917,7 +27576,6 @@
       <w:r>
         <w:t xml:space="preserve">The </w:t>
       </w:r>
-      <w:proofErr w:type="spellStart"/>
       <w:r>
         <w:rPr>
           <w:b/>
@@ -27932,7 +27590,6 @@
         </w:rPr>
         <w:t>Converter</w:t>
       </w:r>
-      <w:proofErr w:type="spellEnd"/>
       <w:r>
         <w:t xml:space="preserve"> console app and game were updated to incorporate these</w:t>
       </w:r>
@@ -28174,7 +27831,6 @@
       <w:r>
         <w:t xml:space="preserve">The </w:t>
       </w:r>
-      <w:proofErr w:type="spellStart"/>
       <w:r>
         <w:rPr>
           <w:i/>
@@ -28182,11 +27838,9 @@
         </w:rPr>
         <w:t>drawLaser</w:t>
       </w:r>
-      <w:proofErr w:type="spellEnd"/>
       <w:r>
         <w:t xml:space="preserve"> and </w:t>
       </w:r>
-      <w:proofErr w:type="spellStart"/>
       <w:r>
         <w:rPr>
           <w:i/>
@@ -28194,7 +27848,6 @@
         </w:rPr>
         <w:t>loadLevelFile</w:t>
       </w:r>
-      <w:proofErr w:type="spellEnd"/>
       <w:r>
         <w:rPr>
           <w:i/>
@@ -28237,21 +27890,7 @@
         <w:rPr>
           <w:rFonts w:ascii="Aptos" w:hAnsi="Aptos"/>
         </w:rPr>
-        <w:t xml:space="preserve">With help from </w:t>
-      </w:r>
-      <w:proofErr w:type="spellStart"/>
-      <w:r>
-        <w:rPr>
-          <w:rFonts w:ascii="Aptos" w:hAnsi="Aptos"/>
-        </w:rPr>
-        <w:t>ChrisB</w:t>
-      </w:r>
-      <w:proofErr w:type="spellEnd"/>
-      <w:r>
-        <w:rPr>
-          <w:rFonts w:ascii="Aptos" w:hAnsi="Aptos"/>
-        </w:rPr>
-        <w:t xml:space="preserve"> </w:t>
+        <w:t xml:space="preserve">With help from ChrisB </w:t>
       </w:r>
       <w:r>
         <w:rPr>
@@ -28874,7 +28513,6 @@
       <w:r>
         <w:t xml:space="preserve">I started by creating a </w:t>
       </w:r>
-      <w:proofErr w:type="spellStart"/>
       <w:r>
         <w:rPr>
           <w:b/>
@@ -28882,7 +28520,6 @@
         </w:rPr>
         <w:t>weeping_angels</w:t>
       </w:r>
-      <w:proofErr w:type="spellEnd"/>
       <w:r>
         <w:t xml:space="preserve"> feature branch</w:t>
       </w:r>
@@ -28961,7 +28598,6 @@
       <w:r>
         <w:t xml:space="preserve"> </w:t>
       </w:r>
-      <w:proofErr w:type="spellStart"/>
       <w:r>
         <w:rPr>
           <w:i/>
@@ -28976,7 +28612,6 @@
         </w:rPr>
         <w:t>’s</w:t>
       </w:r>
-      <w:proofErr w:type="spellEnd"/>
       <w:r>
         <w:t xml:space="preserve"> </w:t>
       </w:r>
@@ -29163,46 +28798,35 @@
       <w:r>
         <w:t xml:space="preserve"> </w:t>
       </w:r>
-      <w:proofErr w:type="spellStart"/>
       <w:r>
         <w:rPr>
           <w:i/>
           <w:iCs/>
         </w:rPr>
-        <w:t>enemyType</w:t>
-      </w:r>
-      <w:proofErr w:type="spellEnd"/>
+        <w:t xml:space="preserve">enemyType </w:t>
+      </w:r>
+      <w:r>
+        <w:t>zero</w:t>
+      </w:r>
+      <w:r>
+        <w:t>-</w:t>
+      </w:r>
+      <w:r>
+        <w:t>page variable</w:t>
+      </w:r>
+      <w:r>
+        <w:t xml:space="preserve">, </w:t>
+      </w:r>
+      <w:r>
+        <w:t xml:space="preserve">initialized in the </w:t>
+      </w:r>
       <w:r>
         <w:rPr>
           <w:i/>
           <w:iCs/>
         </w:rPr>
-        <w:t xml:space="preserve"> </w:t>
-      </w:r>
-      <w:r>
-        <w:t>zero</w:t>
-      </w:r>
-      <w:r>
-        <w:t>-</w:t>
-      </w:r>
-      <w:r>
-        <w:t>page variable</w:t>
-      </w:r>
-      <w:r>
-        <w:t xml:space="preserve">, </w:t>
-      </w:r>
-      <w:r>
-        <w:t xml:space="preserve">initialized in the </w:t>
-      </w:r>
-      <w:proofErr w:type="spellStart"/>
-      <w:r>
-        <w:rPr>
-          <w:i/>
-          <w:iCs/>
-        </w:rPr>
         <w:t>initializeLevel</w:t>
       </w:r>
-      <w:proofErr w:type="spellEnd"/>
       <w:r>
         <w:t xml:space="preserve"> routine</w:t>
       </w:r>
@@ -29278,7 +28902,6 @@
       <w:r>
         <w:t xml:space="preserve">the </w:t>
       </w:r>
-      <w:proofErr w:type="spellStart"/>
       <w:r>
         <w:rPr>
           <w:i/>
@@ -29286,7 +28909,6 @@
         </w:rPr>
         <w:t>enemyAI</w:t>
       </w:r>
-      <w:proofErr w:type="spellEnd"/>
       <w:r>
         <w:t xml:space="preserve"> routine </w:t>
       </w:r>
@@ -29444,7 +29066,6 @@
         </w:rPr>
         <w:t xml:space="preserve"> </w:t>
       </w:r>
-      <w:proofErr w:type="spellStart"/>
       <w:r>
         <w:rPr>
           <w:i/>
@@ -29452,11 +29073,9 @@
         </w:rPr>
         <w:t>sizeLo</w:t>
       </w:r>
-      <w:proofErr w:type="spellEnd"/>
       <w:r>
         <w:t xml:space="preserve"> and </w:t>
       </w:r>
-      <w:proofErr w:type="spellStart"/>
       <w:r>
         <w:rPr>
           <w:i/>
@@ -29464,11 +29083,9 @@
         </w:rPr>
         <w:t>sizeHi</w:t>
       </w:r>
-      <w:proofErr w:type="spellEnd"/>
       <w:r>
         <w:t xml:space="preserve"> zero-page variables which were used by the </w:t>
       </w:r>
-      <w:proofErr w:type="spellStart"/>
       <w:r>
         <w:rPr>
           <w:i/>
@@ -29476,7 +29093,6 @@
         </w:rPr>
         <w:t>memcpy</w:t>
       </w:r>
-      <w:proofErr w:type="spellEnd"/>
       <w:r>
         <w:t xml:space="preserve"> routine (level.6502)</w:t>
       </w:r>
@@ -29512,7 +29128,6 @@
         </w:rPr>
         <w:t xml:space="preserve">updated the </w:t>
       </w:r>
-      <w:proofErr w:type="spellStart"/>
       <w:r>
         <w:rPr>
           <w:rFonts w:ascii="Aptos" w:hAnsi="Aptos"/>
@@ -29520,7 +29135,6 @@
         </w:rPr>
         <w:t>enemyAI</w:t>
       </w:r>
-      <w:proofErr w:type="spellEnd"/>
       <w:r>
         <w:rPr>
           <w:rFonts w:ascii="Aptos" w:hAnsi="Aptos"/>
@@ -29915,7 +29529,6 @@
       <w:r>
         <w:t xml:space="preserve">refactoring the </w:t>
       </w:r>
-      <w:proofErr w:type="spellStart"/>
       <w:r>
         <w:rPr>
           <w:i/>
@@ -29928,15 +29541,7 @@
           <w:i/>
           <w:iCs/>
         </w:rPr>
-        <w:t>Lo</w:t>
-      </w:r>
-      <w:proofErr w:type="spellEnd"/>
-      <w:r>
-        <w:rPr>
-          <w:i/>
-          <w:iCs/>
-        </w:rPr>
-        <w:t>/Hi</w:t>
+        <w:t>Lo/Hi</w:t>
       </w:r>
       <w:r>
         <w:t xml:space="preserve"> code to be index-based, rather than address-based.</w:t>
@@ -30185,7 +29790,6 @@
         </w:rPr>
         <w:t xml:space="preserve">, or using flashing colors.  The palette inversion idea was supported by </w:t>
       </w:r>
-      <w:proofErr w:type="spellStart"/>
       <w:r>
         <w:rPr>
           <w:rFonts w:ascii="Aptos" w:hAnsi="Aptos"/>
@@ -30195,7 +29799,6 @@
         </w:rPr>
         <w:t>TodyLobster</w:t>
       </w:r>
-      <w:proofErr w:type="spellEnd"/>
       <w:r>
         <w:rPr>
           <w:rFonts w:ascii="Aptos" w:hAnsi="Aptos"/>
@@ -30437,7 +30040,6 @@
         </w:rPr>
         <w:t xml:space="preserve">by introducing a new </w:t>
       </w:r>
-      <w:proofErr w:type="spellStart"/>
       <w:r>
         <w:rPr>
           <w:rFonts w:ascii="Aptos" w:hAnsi="Aptos"/>
@@ -30448,7 +30050,6 @@
         </w:rPr>
         <w:t>setInvertedLevelPalette</w:t>
       </w:r>
-      <w:proofErr w:type="spellEnd"/>
       <w:r>
         <w:rPr>
           <w:rFonts w:ascii="Aptos" w:hAnsi="Aptos"/>
@@ -30456,7 +30057,6 @@
         </w:rPr>
         <w:t xml:space="preserve"> routine, which takes the place of </w:t>
       </w:r>
-      <w:proofErr w:type="spellStart"/>
       <w:r>
         <w:rPr>
           <w:rFonts w:ascii="Aptos" w:hAnsi="Aptos"/>
@@ -30467,7 +30067,6 @@
         </w:rPr>
         <w:t>setBlackPalette</w:t>
       </w:r>
-      <w:proofErr w:type="spellEnd"/>
       <w:r>
         <w:rPr>
           <w:rFonts w:ascii="Aptos" w:hAnsi="Aptos"/>
@@ -30580,7 +30179,6 @@
         </w:rPr>
         <w:t xml:space="preserve">As part of the change, I was able to remove the existing 16-byte </w:t>
       </w:r>
-      <w:proofErr w:type="spellStart"/>
       <w:r>
         <w:rPr>
           <w:rFonts w:ascii="Aptos" w:hAnsi="Aptos"/>
@@ -30592,7 +30190,6 @@
         </w:rPr>
         <w:t>blackPalette</w:t>
       </w:r>
-      <w:proofErr w:type="spellEnd"/>
       <w:r>
         <w:rPr>
           <w:rFonts w:ascii="Aptos" w:hAnsi="Aptos"/>
@@ -30600,7 +30197,6 @@
         </w:rPr>
         <w:t xml:space="preserve"> data structure, reusing the memory to hold the level’s palette instead.  This free up sufficient code space to implement the </w:t>
       </w:r>
-      <w:proofErr w:type="spellStart"/>
       <w:r>
         <w:rPr>
           <w:rFonts w:ascii="Aptos" w:hAnsi="Aptos"/>
@@ -30612,7 +30208,6 @@
         </w:rPr>
         <w:t>setInvertedLevelPalette</w:t>
       </w:r>
-      <w:proofErr w:type="spellEnd"/>
       <w:r>
         <w:rPr>
           <w:rFonts w:ascii="Aptos" w:hAnsi="Aptos"/>
@@ -30942,23 +30537,7 @@
     </w:p>
     <w:p>
       <w:r>
-        <w:t xml:space="preserve">After completing the game, I thought it would be interesting to write a profiler for the BBC Micro.  See the </w:t>
-      </w:r>
-      <w:proofErr w:type="spellStart"/>
-      <w:r>
-        <w:t>BeebPerf</w:t>
-      </w:r>
-      <w:proofErr w:type="spellEnd"/>
-      <w:r>
-        <w:t xml:space="preserve"> </w:t>
-      </w:r>
-      <w:proofErr w:type="spellStart"/>
-      <w:r>
-        <w:t>github</w:t>
-      </w:r>
-      <w:proofErr w:type="spellEnd"/>
-      <w:r>
-        <w:t xml:space="preserve"> project.</w:t>
+        <w:t>After completing the game, I thought it would be interesting to write a profiler for the BBC Micro.  See the BeebPerf github project.</w:t>
       </w:r>
     </w:p>
     <w:p>
@@ -31012,41 +30591,24 @@
           <w:rFonts w:ascii="Aptos" w:hAnsi="Aptos"/>
           <w:color w:val="000000"/>
         </w:rPr>
-        <w:t>’ menu items to record instruction logs in .Perf files, and created ‘</w:t>
-      </w:r>
-      <w:proofErr w:type="spellStart"/>
+        <w:t>’ menu items to record instruction logs in .Perf files, and created ‘BeebPerf’, a Windows app that analyzes these logs and provides profiler views like those in Visual Studio.</w:t>
+      </w:r>
+    </w:p>
+    <w:p>
       <w:r>
         <w:rPr>
           <w:rFonts w:ascii="Aptos" w:hAnsi="Aptos"/>
           <w:color w:val="000000"/>
         </w:rPr>
-        <w:t>BeebPerf</w:t>
-      </w:r>
-      <w:proofErr w:type="spellEnd"/>
+        <w:t>I recorded the first 23 seconds of level 1</w:t>
+      </w:r>
       <w:r>
         <w:rPr>
           <w:rFonts w:ascii="Aptos" w:hAnsi="Aptos"/>
           <w:color w:val="000000"/>
         </w:rPr>
-        <w:t>’, a Windows app that analyzes these logs and provides profiler views like those in Visual Studio.</w:t>
-      </w:r>
-    </w:p>
-    <w:p>
-      <w:r>
-        <w:rPr>
-          <w:rFonts w:ascii="Aptos" w:hAnsi="Aptos"/>
-          <w:color w:val="000000"/>
-        </w:rPr>
-        <w:t>I recorded the first 23 seconds of level 1</w:t>
-      </w:r>
-      <w:r>
-        <w:rPr>
-          <w:rFonts w:ascii="Aptos" w:hAnsi="Aptos"/>
-          <w:color w:val="000000"/>
-        </w:rPr>
         <w:t xml:space="preserve"> (</w:t>
       </w:r>
-      <w:proofErr w:type="spellStart"/>
       <w:r>
         <w:rPr>
           <w:rFonts w:ascii="Aptos" w:hAnsi="Aptos"/>
@@ -31081,9 +30643,8 @@
           <w:iCs/>
           <w:color w:val="000000"/>
         </w:rPr>
-        <w:t>erf</w:t>
-      </w:r>
-      <w:proofErr w:type="spellEnd"/>
+        <w:t>erf/</w:t>
+      </w:r>
       <w:r>
         <w:rPr>
           <w:rFonts w:ascii="Aptos" w:hAnsi="Aptos"/>
@@ -31091,15 +30652,6 @@
           <w:iCs/>
           <w:color w:val="000000"/>
         </w:rPr>
-        <w:t>/</w:t>
-      </w:r>
-      <w:r>
-        <w:rPr>
-          <w:rFonts w:ascii="Aptos" w:hAnsi="Aptos"/>
-          <w:i/>
-          <w:iCs/>
-          <w:color w:val="000000"/>
-        </w:rPr>
         <w:t>samples/drwho_level1.perf</w:t>
       </w:r>
       <w:r>
@@ -31289,15 +30841,7 @@
         <w:t xml:space="preserve">The following flame graph </w:t>
       </w:r>
       <w:r>
-        <w:t xml:space="preserve">(taken from </w:t>
-      </w:r>
-      <w:proofErr w:type="spellStart"/>
-      <w:r>
-        <w:t>BeebPerf</w:t>
-      </w:r>
-      <w:proofErr w:type="spellEnd"/>
-      <w:r>
-        <w:t xml:space="preserve">) </w:t>
+        <w:t xml:space="preserve">(taken from BeebPerf) </w:t>
       </w:r>
       <w:r>
         <w:t>shows a good representation of where the game is spending its time on average:</w:t>
@@ -31820,7 +31364,6 @@
       <w:r>
         <w:t xml:space="preserve">In comparison, the average game loop iteration takes 14.1ms, excluding time in </w:t>
       </w:r>
-      <w:proofErr w:type="spellStart"/>
       <w:r>
         <w:rPr>
           <w:b/>
@@ -31828,7 +31371,6 @@
         </w:rPr>
         <w:t>waitOnVSync</w:t>
       </w:r>
-      <w:proofErr w:type="spellEnd"/>
       <w:r>
         <w:t>.</w:t>
       </w:r>
@@ -31840,7 +31382,6 @@
       <w:r>
         <w:t xml:space="preserve">in </w:t>
       </w:r>
-      <w:proofErr w:type="spellStart"/>
       <w:r>
         <w:rPr>
           <w:b/>
@@ -31848,14 +31389,12 @@
         </w:rPr>
         <w:t>ingame_sample_irs</w:t>
       </w:r>
-      <w:proofErr w:type="spellEnd"/>
       <w:r>
         <w:t xml:space="preserve"> and</w:t>
       </w:r>
       <w:r>
         <w:t xml:space="preserve"> </w:t>
       </w:r>
-      <w:proofErr w:type="spellStart"/>
       <w:r>
         <w:rPr>
           <w:b/>
@@ -31863,11 +31402,9 @@
         </w:rPr>
         <w:t>drawObject</w:t>
       </w:r>
-      <w:proofErr w:type="spellEnd"/>
       <w:r>
         <w:t xml:space="preserve">.  When sample sounds are played, </w:t>
       </w:r>
-      <w:proofErr w:type="spellStart"/>
       <w:r>
         <w:rPr>
           <w:b/>
@@ -31875,7 +31412,6 @@
         </w:rPr>
         <w:t>ingame_sample_irs</w:t>
       </w:r>
-      <w:proofErr w:type="spellEnd"/>
       <w:r>
         <w:t xml:space="preserve"> uses 48.6% of all cycle</w:t>
       </w:r>
@@ -31894,7 +31430,6 @@
       <w:r>
         <w:t xml:space="preserve">  The increase in </w:t>
       </w:r>
-      <w:proofErr w:type="spellStart"/>
       <w:r>
         <w:rPr>
           <w:b/>
@@ -31902,7 +31437,6 @@
         </w:rPr>
         <w:t>drawObject</w:t>
       </w:r>
-      <w:proofErr w:type="spellEnd"/>
       <w:r>
         <w:t xml:space="preserve"> is due to two things.  Firstly, </w:t>
       </w:r>
@@ -32032,7 +31566,6 @@
       <w:r>
         <w:t xml:space="preserve">The routines to optimize are clearly: </w:t>
       </w:r>
-      <w:proofErr w:type="spellStart"/>
       <w:r>
         <w:rPr>
           <w:b/>
@@ -32040,11 +31573,9 @@
         </w:rPr>
         <w:t>ingame_sample_isr</w:t>
       </w:r>
-      <w:proofErr w:type="spellEnd"/>
       <w:r>
         <w:t xml:space="preserve">, </w:t>
       </w:r>
-      <w:proofErr w:type="spellStart"/>
       <w:r>
         <w:rPr>
           <w:b/>
@@ -32066,7 +31597,6 @@
         </w:rPr>
         <w:t>bject</w:t>
       </w:r>
-      <w:proofErr w:type="spellEnd"/>
       <w:r>
         <w:t>,</w:t>
       </w:r>
@@ -32075,97 +31605,264 @@
           <w:b/>
           <w:bCs/>
         </w:rPr>
-        <w:t xml:space="preserve"> </w:t>
-      </w:r>
-      <w:proofErr w:type="spellStart"/>
+        <w:t xml:space="preserve"> updateObjects</w:t>
+      </w:r>
       <w:r>
         <w:rPr>
           <w:b/>
           <w:bCs/>
         </w:rPr>
-        <w:t>updateObjects</w:t>
-      </w:r>
-      <w:proofErr w:type="spellEnd"/>
+        <w:t xml:space="preserve">, </w:t>
+      </w:r>
       <w:r>
         <w:rPr>
           <w:b/>
           <w:bCs/>
         </w:rPr>
-        <w:t xml:space="preserve">, </w:t>
-      </w:r>
-      <w:proofErr w:type="spellStart"/>
+        <w:t>draw</w:t>
+      </w:r>
       <w:r>
         <w:rPr>
           <w:b/>
           <w:bCs/>
         </w:rPr>
-        <w:t>draw</w:t>
+        <w:t>O</w:t>
       </w:r>
       <w:r>
         <w:rPr>
           <w:b/>
           <w:bCs/>
         </w:rPr>
-        <w:t>O</w:t>
+        <w:t>bject</w:t>
       </w:r>
       <w:r>
         <w:rPr>
           <w:b/>
           <w:bCs/>
         </w:rPr>
-        <w:t>bject</w:t>
+        <w:t>s</w:t>
+      </w:r>
+      <w:r>
+        <w:t xml:space="preserve">, </w:t>
       </w:r>
       <w:r>
         <w:rPr>
           <w:b/>
           <w:bCs/>
         </w:rPr>
-        <w:t>s</w:t>
-      </w:r>
-      <w:proofErr w:type="spellEnd"/>
-      <w:r>
-        <w:t xml:space="preserve">, </w:t>
-      </w:r>
-      <w:proofErr w:type="spellStart"/>
+        <w:t>cacheObjectExtents</w:t>
+      </w:r>
+      <w:r>
+        <w:t>,</w:t>
+      </w:r>
+      <w:r>
+        <w:t xml:space="preserve"> and potentially </w:t>
+      </w:r>
       <w:r>
         <w:rPr>
           <w:b/>
           <w:bCs/>
         </w:rPr>
-        <w:t>cacheObjectExtents</w:t>
-      </w:r>
-      <w:proofErr w:type="spellEnd"/>
-      <w:r>
-        <w:t>,</w:t>
-      </w:r>
-      <w:r>
-        <w:t xml:space="preserve"> and potentially </w:t>
-      </w:r>
-      <w:proofErr w:type="spellStart"/>
+        <w:t>scan</w:t>
+      </w:r>
       <w:r>
         <w:rPr>
           <w:b/>
           <w:bCs/>
         </w:rPr>
-        <w:t>scan</w:t>
+        <w:t>K</w:t>
       </w:r>
       <w:r>
         <w:rPr>
           <w:b/>
           <w:bCs/>
         </w:rPr>
-        <w:t>K</w:t>
+        <w:t>eys</w:t>
+      </w:r>
+      <w:r>
+        <w:t>.</w:t>
+      </w:r>
+      <w:r>
+        <w:t xml:space="preserve"> </w:t>
       </w:r>
       <w:r>
         <w:rPr>
           <w:b/>
           <w:bCs/>
         </w:rPr>
-        <w:t>eys</w:t>
-      </w:r>
-      <w:proofErr w:type="spellEnd"/>
-      <w:r>
+        <w:t>IRQ/BRK</w:t>
+      </w:r>
+      <w:r>
+        <w:t xml:space="preserve"> is MOS’s ROM interrupt routine and can’t be changed.</w:t>
+      </w:r>
+    </w:p>
+    <w:p>
+      <w:pPr>
+        <w:pStyle w:val="Heading2"/>
+      </w:pPr>
+      <w:r>
+        <w:t xml:space="preserve">Optimizing </w:t>
+      </w:r>
+      <w:r>
+        <w:rPr>
+          <w:rStyle w:val="Heading2Char"/>
+        </w:rPr>
+        <w:t>ingame_sample_is</w:t>
+      </w:r>
+      <w:r>
+        <w:rPr>
+          <w:rStyle w:val="Heading2Char"/>
+        </w:rPr>
+        <w:t>r</w:t>
+      </w:r>
+    </w:p>
+    <w:p>
+      <w:pPr>
+        <w:rPr>
+          <w:rFonts w:ascii="Aptos" w:hAnsi="Aptos"/>
+          <w:color w:val="000000"/>
+        </w:rPr>
+      </w:pPr>
+      <w:r>
+        <w:rPr>
+          <w:rFonts w:ascii="Aptos" w:hAnsi="Aptos"/>
+          <w:color w:val="000000"/>
+        </w:rPr>
+        <w:t xml:space="preserve">This routine has undergone several optimizations already, so further improvements are limited. Still, I decided to try removing </w:t>
+      </w:r>
+      <w:r>
+        <w:rPr>
+          <w:rFonts w:ascii="Aptos" w:hAnsi="Aptos"/>
+          <w:color w:val="000000"/>
+        </w:rPr>
+        <w:t xml:space="preserve">use of the </w:t>
+      </w:r>
+      <w:r>
+        <w:rPr>
+          <w:rFonts w:ascii="Aptos" w:hAnsi="Aptos"/>
+          <w:color w:val="000000"/>
+        </w:rPr>
+        <w:t xml:space="preserve">Y register, hoping it would save cycles by eliminating the need to push and pop its value. </w:t>
+      </w:r>
+      <w:r>
+        <w:rPr>
+          <w:rFonts w:ascii="Aptos" w:hAnsi="Aptos"/>
+          <w:color w:val="000000"/>
+        </w:rPr>
+        <w:t xml:space="preserve">The routine is called 8000 times a second. </w:t>
+      </w:r>
+      <w:r>
+        <w:rPr>
+          <w:rFonts w:ascii="Aptos" w:hAnsi="Aptos"/>
+          <w:color w:val="000000"/>
+        </w:rPr>
+        <w:t xml:space="preserve">Making these changes was simple, and I managed to reduce the time spent servicing interrupts during sample playback from </w:t>
+      </w:r>
+      <w:r>
+        <w:rPr>
+          <w:rFonts w:ascii="Aptos" w:hAnsi="Aptos"/>
+          <w:color w:val="000000"/>
+        </w:rPr>
+        <w:t>48</w:t>
+      </w:r>
+      <w:r>
+        <w:rPr>
+          <w:rFonts w:ascii="Aptos" w:hAnsi="Aptos"/>
+          <w:color w:val="000000"/>
+        </w:rPr>
+        <w:t>% down to 4</w:t>
+      </w:r>
+      <w:r>
+        <w:rPr>
+          <w:rFonts w:ascii="Aptos" w:hAnsi="Aptos"/>
+          <w:color w:val="000000"/>
+        </w:rPr>
+        <w:t>4</w:t>
+      </w:r>
+      <w:r>
+        <w:rPr>
+          <w:rFonts w:ascii="Aptos" w:hAnsi="Aptos"/>
+          <w:color w:val="000000"/>
+        </w:rPr>
+        <w:t>%.</w:t>
+      </w:r>
+      <w:r>
+        <w:rPr>
+          <w:rFonts w:ascii="Aptos" w:hAnsi="Aptos"/>
+          <w:color w:val="000000"/>
+        </w:rPr>
+        <w:t xml:space="preserve">  No further optimizations were </w:t>
+      </w:r>
+      <w:r>
+        <w:rPr>
+          <w:rFonts w:ascii="Aptos" w:hAnsi="Aptos"/>
+          <w:color w:val="000000"/>
+        </w:rPr>
+        <w:t>identified</w:t>
+      </w:r>
+      <w:r>
+        <w:rPr>
+          <w:rFonts w:ascii="Aptos" w:hAnsi="Aptos"/>
+          <w:color w:val="000000"/>
+        </w:rPr>
         <w:t>.</w:t>
+      </w:r>
+    </w:p>
+    <w:p>
+      <w:pPr>
+        <w:rPr>
+          <w:rFonts w:ascii="Aptos" w:hAnsi="Aptos"/>
+          <w:color w:val="000000"/>
+        </w:rPr>
+      </w:pPr>
+      <w:r>
+        <w:rPr>
+          <w:rFonts w:ascii="Aptos" w:hAnsi="Aptos"/>
+          <w:color w:val="000000"/>
+        </w:rPr>
+        <w:t>The downside of this approach is that the profiler code panel sees all the PCM data reads as code modifications.</w:t>
+      </w:r>
+    </w:p>
+    <w:p>
+      <w:pPr>
+        <w:rPr>
+          <w:rFonts w:ascii="Aptos" w:hAnsi="Aptos"/>
+          <w:color w:val="000000"/>
+        </w:rPr>
+      </w:pPr>
+      <w:r>
+        <w:rPr>
+          <w:rFonts w:ascii="Aptos" w:hAnsi="Aptos"/>
+          <w:color w:val="000000"/>
+        </w:rPr>
+        <w:t>I decided to hold off reducing the 8KHz sample frequency, which is the simplest way to reduce the cycle times, as sound quality would be degraded, and the sample sounds add significantly to the game play experience.</w:t>
+      </w:r>
+    </w:p>
+    <w:p>
+      <w:pPr>
+        <w:pStyle w:val="Heading2"/>
+      </w:pPr>
+      <w:r>
+        <w:lastRenderedPageBreak/>
+        <w:t xml:space="preserve">Optimizing </w:t>
+      </w:r>
+      <w:r>
+        <w:t>drawObject</w:t>
+      </w:r>
+    </w:p>
+    <w:p>
+      <w:r>
+        <w:t>This routine has been optimized numerous times so further optimizations are limited. A regular non-clipped Dalek renders in 2ms.</w:t>
+      </w:r>
+    </w:p>
+    <w:p>
+      <w:r>
+        <w:t>That said, the performance of drawing lasered Daleks is not as good.  A non-clipped lasered Dalek takes 4ms to render.  Twice as long as a non-lasered one.</w:t>
+      </w:r>
+    </w:p>
+    <w:p>
+      <w:r>
+        <w:t>With the</w:t>
       </w:r>
       <w:r>
         <w:t xml:space="preserve"> </w:t>
@@ -32175,211 +31872,21 @@
           <w:b/>
           <w:bCs/>
         </w:rPr>
-        <w:t>IRQ/BRK</w:t>
-      </w:r>
-      <w:r>
-        <w:t xml:space="preserve"> is MOS’s ROM interrupt routine and can’t be changed.</w:t>
-      </w:r>
-    </w:p>
-    <w:p>
-      <w:pPr>
-        <w:pStyle w:val="Heading2"/>
-      </w:pPr>
-      <w:r>
-        <w:t xml:space="preserve">Optimizing </w:t>
-      </w:r>
-      <w:proofErr w:type="spellStart"/>
-      <w:r>
-        <w:rPr>
-          <w:rStyle w:val="Heading2Char"/>
-        </w:rPr>
-        <w:t>ingame_sample_is</w:t>
-      </w:r>
-      <w:r>
-        <w:rPr>
-          <w:rStyle w:val="Heading2Char"/>
-        </w:rPr>
-        <w:t>r</w:t>
-      </w:r>
-      <w:proofErr w:type="spellEnd"/>
-    </w:p>
-    <w:p>
-      <w:pPr>
-        <w:rPr>
-          <w:rFonts w:ascii="Aptos" w:hAnsi="Aptos"/>
-          <w:color w:val="000000"/>
-        </w:rPr>
-      </w:pPr>
-      <w:r>
-        <w:rPr>
-          <w:rFonts w:ascii="Aptos" w:hAnsi="Aptos"/>
-          <w:color w:val="000000"/>
-        </w:rPr>
-        <w:t xml:space="preserve">This routine has undergone several optimizations already, so further improvements are limited. Still, I decided to try removing </w:t>
-      </w:r>
-      <w:r>
-        <w:rPr>
-          <w:rFonts w:ascii="Aptos" w:hAnsi="Aptos"/>
-          <w:color w:val="000000"/>
-        </w:rPr>
-        <w:t xml:space="preserve">use of the </w:t>
-      </w:r>
-      <w:r>
-        <w:rPr>
-          <w:rFonts w:ascii="Aptos" w:hAnsi="Aptos"/>
-          <w:color w:val="000000"/>
-        </w:rPr>
-        <w:t xml:space="preserve">Y register, hoping it would save cycles by eliminating the need to push and pop its value. </w:t>
-      </w:r>
-      <w:r>
-        <w:rPr>
-          <w:rFonts w:ascii="Aptos" w:hAnsi="Aptos"/>
-          <w:color w:val="000000"/>
-        </w:rPr>
-        <w:t xml:space="preserve">The routine is called 8000 times a second. </w:t>
-      </w:r>
-      <w:r>
-        <w:rPr>
-          <w:rFonts w:ascii="Aptos" w:hAnsi="Aptos"/>
-          <w:color w:val="000000"/>
-        </w:rPr>
-        <w:t xml:space="preserve">Making these changes was simple, and I managed to reduce the time spent servicing interrupts during sample playback from </w:t>
-      </w:r>
-      <w:r>
-        <w:rPr>
-          <w:rFonts w:ascii="Aptos" w:hAnsi="Aptos"/>
-          <w:color w:val="000000"/>
-        </w:rPr>
-        <w:t>48</w:t>
-      </w:r>
-      <w:r>
-        <w:rPr>
-          <w:rFonts w:ascii="Aptos" w:hAnsi="Aptos"/>
-          <w:color w:val="000000"/>
-        </w:rPr>
-        <w:t>% down to 4</w:t>
-      </w:r>
-      <w:r>
-        <w:rPr>
-          <w:rFonts w:ascii="Aptos" w:hAnsi="Aptos"/>
-          <w:color w:val="000000"/>
-        </w:rPr>
-        <w:t>4</w:t>
-      </w:r>
-      <w:r>
-        <w:rPr>
-          <w:rFonts w:ascii="Aptos" w:hAnsi="Aptos"/>
-          <w:color w:val="000000"/>
-        </w:rPr>
-        <w:t>%.</w:t>
-      </w:r>
-      <w:r>
-        <w:rPr>
-          <w:rFonts w:ascii="Aptos" w:hAnsi="Aptos"/>
-          <w:color w:val="000000"/>
-        </w:rPr>
-        <w:t xml:space="preserve">  No further optimizations were </w:t>
-      </w:r>
-      <w:r>
-        <w:rPr>
-          <w:rFonts w:ascii="Aptos" w:hAnsi="Aptos"/>
-          <w:color w:val="000000"/>
-        </w:rPr>
-        <w:t>identified</w:t>
-      </w:r>
-      <w:r>
-        <w:rPr>
-          <w:rFonts w:ascii="Aptos" w:hAnsi="Aptos"/>
-          <w:color w:val="000000"/>
-        </w:rPr>
-        <w:t>.</w:t>
-      </w:r>
-    </w:p>
-    <w:p>
-      <w:pPr>
-        <w:rPr>
-          <w:rFonts w:ascii="Aptos" w:hAnsi="Aptos"/>
-          <w:color w:val="000000"/>
-        </w:rPr>
-      </w:pPr>
-      <w:r>
-        <w:rPr>
-          <w:rFonts w:ascii="Aptos" w:hAnsi="Aptos"/>
-          <w:color w:val="000000"/>
-        </w:rPr>
-        <w:t>The downside of this approach is that the profiler code panel sees all the PCM data reads as code modifications.</w:t>
-      </w:r>
-    </w:p>
-    <w:p>
-      <w:pPr>
-        <w:rPr>
-          <w:rFonts w:ascii="Aptos" w:hAnsi="Aptos"/>
-          <w:color w:val="000000"/>
-        </w:rPr>
-      </w:pPr>
-      <w:r>
-        <w:rPr>
-          <w:rFonts w:ascii="Aptos" w:hAnsi="Aptos"/>
-          <w:color w:val="000000"/>
-        </w:rPr>
-        <w:t>I decided to hold off reducing the 8KHz sample frequency, which is the simplest way to reduce the cycle times, as sound quality would be degraded, and the sample sounds add significantly to the game play experience.</w:t>
-      </w:r>
-    </w:p>
-    <w:p>
-      <w:pPr>
-        <w:pStyle w:val="Heading2"/>
-      </w:pPr>
-      <w:r>
-        <w:lastRenderedPageBreak/>
-        <w:t xml:space="preserve">Optimizing </w:t>
-      </w:r>
-      <w:proofErr w:type="spellStart"/>
-      <w:r>
-        <w:t>drawObject</w:t>
-      </w:r>
-      <w:proofErr w:type="spellEnd"/>
-    </w:p>
-    <w:p>
-      <w:r>
-        <w:t>This routine has been optimized numerous times so further optimizations are limited. A regular non-clipped Dalek renders in 2ms.</w:t>
-      </w:r>
-    </w:p>
-    <w:p>
-      <w:r>
-        <w:t>That said, the performance of drawing lasered Daleks is not as good.  A non-clipped lasered Dalek takes 4ms to render.  Twice as long as a non-lasered one.</w:t>
-      </w:r>
-    </w:p>
-    <w:p>
-      <w:r>
-        <w:t>With the</w:t>
+        <w:t>ingame_sample_isr</w:t>
       </w:r>
       <w:r>
         <w:t xml:space="preserve"> </w:t>
       </w:r>
-      <w:proofErr w:type="spellStart"/>
+      <w:r>
+        <w:t xml:space="preserve">and </w:t>
+      </w:r>
       <w:r>
         <w:rPr>
           <w:b/>
           <w:bCs/>
         </w:rPr>
-        <w:t>ingame_sample_isr</w:t>
-      </w:r>
-      <w:proofErr w:type="spellEnd"/>
-      <w:r>
-        <w:t xml:space="preserve"> </w:t>
-      </w:r>
-      <w:r>
-        <w:t xml:space="preserve">and </w:t>
-      </w:r>
-      <w:proofErr w:type="spellStart"/>
-      <w:r>
-        <w:rPr>
-          <w:b/>
-          <w:bCs/>
-        </w:rPr>
         <w:t>scanKeys</w:t>
       </w:r>
-      <w:proofErr w:type="spellEnd"/>
       <w:r>
         <w:t xml:space="preserve"> (see below) optimizations in place, and samples playing, the game loop has just enough time (20ms) to draw the laser beam, two regular Dalek sprites, and complete the remaining work.  If the Dalek is rendered lasered, the frame’s processing takes 2ms longer than what’s available.</w:t>
       </w:r>
@@ -32604,7 +32111,6 @@
         <w:lastRenderedPageBreak/>
         <w:t xml:space="preserve">Created new BMP files for the lasered enemies and updated the </w:t>
       </w:r>
-      <w:proofErr w:type="spellStart"/>
       <w:r>
         <w:rPr>
           <w:rFonts w:ascii="Aptos" w:hAnsi="Aptos"/>
@@ -32614,7 +32120,6 @@
         </w:rPr>
         <w:t>BMPConverter</w:t>
       </w:r>
-      <w:proofErr w:type="spellEnd"/>
       <w:r>
         <w:rPr>
           <w:rFonts w:ascii="Aptos" w:hAnsi="Aptos"/>
@@ -32642,7 +32147,6 @@
         </w:rPr>
         <w:t xml:space="preserve">Used Audacity to shorten the 8KHz WAV files per the table above and updated the </w:t>
       </w:r>
-      <w:proofErr w:type="spellStart"/>
       <w:r>
         <w:rPr>
           <w:rFonts w:ascii="Aptos" w:hAnsi="Aptos"/>
@@ -32652,7 +32156,6 @@
         </w:rPr>
         <w:t>WAVConverter</w:t>
       </w:r>
-      <w:proofErr w:type="spellEnd"/>
       <w:r>
         <w:rPr>
           <w:rFonts w:ascii="Aptos" w:hAnsi="Aptos"/>
@@ -32804,7 +32307,6 @@
         </w:rPr>
         <w:t xml:space="preserve">Updated the </w:t>
       </w:r>
-      <w:proofErr w:type="spellStart"/>
       <w:r>
         <w:rPr>
           <w:rFonts w:ascii="Aptos" w:hAnsi="Aptos"/>
@@ -32814,7 +32316,6 @@
         </w:rPr>
         <w:t>drawObject</w:t>
       </w:r>
-      <w:proofErr w:type="spellEnd"/>
       <w:r>
         <w:rPr>
           <w:rFonts w:ascii="Aptos" w:hAnsi="Aptos"/>
@@ -32912,7 +32413,6 @@
       <w:r>
         <w:t xml:space="preserve">Optimizing </w:t>
       </w:r>
-      <w:proofErr w:type="spellStart"/>
       <w:r>
         <w:t>draw</w:t>
       </w:r>
@@ -32922,10 +32422,8 @@
         </w:rPr>
         <w:t>Objects</w:t>
       </w:r>
-      <w:proofErr w:type="spellEnd"/>
-    </w:p>
-    <w:p>
-      <w:proofErr w:type="spellStart"/>
+    </w:p>
+    <w:p>
       <w:r>
         <w:rPr>
           <w:b/>
@@ -32933,11 +32431,9 @@
         </w:rPr>
         <w:t>drawObjects</w:t>
       </w:r>
-      <w:proofErr w:type="spellEnd"/>
       <w:r>
         <w:t xml:space="preserve"> iterates over all the game objects, checking if their render flag is set, and if so invokes </w:t>
       </w:r>
-      <w:proofErr w:type="spellStart"/>
       <w:r>
         <w:rPr>
           <w:b/>
@@ -32945,7 +32441,6 @@
         </w:rPr>
         <w:t>drawObject</w:t>
       </w:r>
-      <w:proofErr w:type="spellEnd"/>
       <w:r>
         <w:t xml:space="preserve"> (see above).</w:t>
       </w:r>
@@ -32954,7 +32449,6 @@
       <w:r>
         <w:t xml:space="preserve">The routine also contains logic to deal with descending elevators, to ensure the passenger is drawn before the elevator.  The routine also invokes </w:t>
       </w:r>
-      <w:proofErr w:type="spellStart"/>
       <w:r>
         <w:rPr>
           <w:b/>
@@ -32962,7 +32456,6 @@
         </w:rPr>
         <w:t>drawEnemyHealthBar</w:t>
       </w:r>
-      <w:proofErr w:type="spellEnd"/>
       <w:r>
         <w:t xml:space="preserve"> for enemies.</w:t>
       </w:r>
@@ -33011,7 +32504,6 @@
         </w:rPr>
         <w:t xml:space="preserve">reversed the sort order in </w:t>
       </w:r>
-      <w:proofErr w:type="spellStart"/>
       <w:r>
         <w:rPr>
           <w:rFonts w:ascii="Aptos" w:hAnsi="Aptos"/>
@@ -33020,7 +32512,6 @@
         </w:rPr>
         <w:t>sortObjectDrawOrder</w:t>
       </w:r>
-      <w:proofErr w:type="spellEnd"/>
       <w:r>
         <w:rPr>
           <w:rFonts w:ascii="Aptos" w:hAnsi="Aptos"/>
@@ -33070,7 +32561,6 @@
         </w:rPr>
         <w:t xml:space="preserve"> from top to bottom. Now, the </w:t>
       </w:r>
-      <w:proofErr w:type="spellStart"/>
       <w:r>
         <w:rPr>
           <w:rFonts w:ascii="Aptos" w:hAnsi="Aptos"/>
@@ -33079,7 +32569,6 @@
         </w:rPr>
         <w:t>outerIndex</w:t>
       </w:r>
-      <w:proofErr w:type="spellEnd"/>
       <w:r>
         <w:rPr>
           <w:rFonts w:ascii="Aptos" w:hAnsi="Aptos"/>
@@ -33117,7 +32606,6 @@
         </w:rPr>
         <w:t xml:space="preserve">I also pulled in some code from </w:t>
       </w:r>
-      <w:proofErr w:type="spellStart"/>
       <w:r>
         <w:rPr>
           <w:b/>
@@ -33125,7 +32613,6 @@
         </w:rPr>
         <w:t>drawEnemyHealthBar</w:t>
       </w:r>
-      <w:proofErr w:type="spellEnd"/>
       <w:r>
         <w:rPr>
           <w:b/>
@@ -33146,7 +32633,6 @@
         </w:rPr>
         <w:t xml:space="preserve"> </w:t>
       </w:r>
-      <w:proofErr w:type="spellStart"/>
       <w:r>
         <w:rPr>
           <w:b/>
@@ -33154,7 +32640,6 @@
         </w:rPr>
         <w:t>drawEnemyHealthBar</w:t>
       </w:r>
-      <w:proofErr w:type="spellEnd"/>
       <w:r>
         <w:rPr>
           <w:b/>
@@ -33191,20 +32676,17 @@
       <w:r>
         <w:t xml:space="preserve">Optimizing </w:t>
       </w:r>
-      <w:proofErr w:type="spellStart"/>
       <w:r>
         <w:rPr>
           <w:rStyle w:val="Heading2Char"/>
         </w:rPr>
         <w:t>updateObjects</w:t>
       </w:r>
-      <w:proofErr w:type="spellEnd"/>
     </w:p>
     <w:p>
       <w:r>
         <w:t xml:space="preserve">The routine iterates over forty-eight game objects invoking their respective update callbacks, after calling </w:t>
       </w:r>
-      <w:proofErr w:type="spellStart"/>
       <w:r>
         <w:rPr>
           <w:b/>
@@ -33212,11 +32694,9 @@
         </w:rPr>
         <w:t>cacheObjectExtents</w:t>
       </w:r>
-      <w:proofErr w:type="spellEnd"/>
       <w:r>
         <w:t xml:space="preserve">.  </w:t>
       </w:r>
-      <w:proofErr w:type="spellStart"/>
       <w:r>
         <w:rPr>
           <w:b/>
@@ -33224,7 +32704,6 @@
         </w:rPr>
         <w:t>cacheObjectExtents</w:t>
       </w:r>
-      <w:proofErr w:type="spellEnd"/>
       <w:r>
         <w:t xml:space="preserve"> is always called, irrespective of whether the callback uses the extents, and in many cases the callbacks don’t.  </w:t>
       </w:r>
@@ -33245,7 +32724,6 @@
       <w:r>
         <w:t xml:space="preserve">Another option, and a more promising one, is to call </w:t>
       </w:r>
-      <w:proofErr w:type="spellStart"/>
       <w:r>
         <w:rPr>
           <w:b/>
@@ -33253,11 +32731,9 @@
         </w:rPr>
         <w:t>cacheObjectExtents</w:t>
       </w:r>
-      <w:proofErr w:type="spellEnd"/>
       <w:r>
         <w:t xml:space="preserve"> when object type changes between loop iterations.  The game objects are ordered by type, so the number of calls to </w:t>
       </w:r>
-      <w:proofErr w:type="spellStart"/>
       <w:r>
         <w:rPr>
           <w:b/>
@@ -33265,7 +32741,6 @@
         </w:rPr>
         <w:t>cacheObjectExtents</w:t>
       </w:r>
-      <w:proofErr w:type="spellEnd"/>
       <w:r>
         <w:t xml:space="preserve"> would reduce from forty-eight to four.</w:t>
       </w:r>
@@ -33297,7 +32772,6 @@
       <w:r>
         <w:t xml:space="preserve">As an aside, this change cannot be applied to </w:t>
       </w:r>
-      <w:proofErr w:type="spellStart"/>
       <w:r>
         <w:rPr>
           <w:b/>
@@ -33305,11 +32779,9 @@
         </w:rPr>
         <w:t>drawObjects</w:t>
       </w:r>
-      <w:proofErr w:type="spellEnd"/>
       <w:r>
         <w:t xml:space="preserve"> because </w:t>
       </w:r>
-      <w:proofErr w:type="spellStart"/>
       <w:r>
         <w:rPr>
           <w:b/>
@@ -33317,11 +32789,9 @@
         </w:rPr>
         <w:t>drawObject</w:t>
       </w:r>
-      <w:proofErr w:type="spellEnd"/>
       <w:r>
         <w:t xml:space="preserve"> modifies the cached values.  And besides, the objects are sorted by their Y coordinates so there would be many more type changes within the </w:t>
       </w:r>
-      <w:proofErr w:type="spellStart"/>
       <w:r>
         <w:rPr>
           <w:b/>
@@ -33329,7 +32799,6 @@
         </w:rPr>
         <w:t>drawObjects</w:t>
       </w:r>
-      <w:proofErr w:type="spellEnd"/>
       <w:r>
         <w:t xml:space="preserve"> loop.</w:t>
       </w:r>
@@ -33373,7 +32842,6 @@
         </w:rPr>
         <w:t xml:space="preserve">Now, the </w:t>
       </w:r>
-      <w:proofErr w:type="spellStart"/>
       <w:proofErr w:type="gramStart"/>
       <w:r>
         <w:rPr>
@@ -33383,7 +32851,6 @@
         </w:rPr>
         <w:t>outerIndex</w:t>
       </w:r>
-      <w:proofErr w:type="spellEnd"/>
       <w:r>
         <w:rPr>
           <w:rFonts w:ascii="Aptos" w:hAnsi="Aptos"/>
@@ -33442,11 +32909,9 @@
       <w:r>
         <w:t xml:space="preserve">Optimizing </w:t>
       </w:r>
-      <w:proofErr w:type="spellStart"/>
       <w:r>
         <w:t>cacheObjectExtents</w:t>
       </w:r>
-      <w:proofErr w:type="spellEnd"/>
     </w:p>
     <w:p>
       <w:r>
@@ -33457,7 +32922,6 @@
       <w:r>
         <w:t xml:space="preserve">Note that I split the routine to allow </w:t>
       </w:r>
-      <w:proofErr w:type="spellStart"/>
       <w:r>
         <w:rPr>
           <w:b/>
@@ -33467,7 +32931,6 @@
         </w:rPr>
         <w:t>updateObjects</w:t>
       </w:r>
-      <w:proofErr w:type="spellEnd"/>
       <w:r>
         <w:rPr>
           <w:b/>
@@ -33486,11 +32949,9 @@
       <w:r>
         <w:t xml:space="preserve">Optimizing </w:t>
       </w:r>
-      <w:proofErr w:type="spellStart"/>
       <w:r>
         <w:t>scanKeys</w:t>
       </w:r>
-      <w:proofErr w:type="spellEnd"/>
     </w:p>
     <w:p>
       <w:r>
@@ -33500,7 +32961,6 @@
         </w:rPr>
         <w:t xml:space="preserve">The </w:t>
       </w:r>
-      <w:proofErr w:type="spellStart"/>
       <w:r>
         <w:rPr>
           <w:rFonts w:ascii="Aptos" w:hAnsi="Aptos"/>
@@ -33509,7 +32969,6 @@
         </w:rPr>
         <w:t>scanKeys</w:t>
       </w:r>
-      <w:proofErr w:type="spellEnd"/>
       <w:r>
         <w:rPr>
           <w:rFonts w:ascii="Aptos" w:hAnsi="Aptos"/>
@@ -33531,7 +32990,6 @@
         </w:rPr>
         <w:t xml:space="preserve"> is executed during each cycle of the game loop, individually scanning twenty-six keys via the </w:t>
       </w:r>
-      <w:proofErr w:type="spellStart"/>
       <w:r>
         <w:rPr>
           <w:rFonts w:ascii="Aptos" w:hAnsi="Aptos"/>
@@ -33540,7 +32998,6 @@
         </w:rPr>
         <w:t>scanKey</w:t>
       </w:r>
-      <w:proofErr w:type="spellEnd"/>
       <w:r>
         <w:rPr>
           <w:rFonts w:ascii="Aptos" w:hAnsi="Aptos"/>
@@ -33630,7 +33087,6 @@
       <w:r>
         <w:t xml:space="preserve">9 plus the arrow keys.  I then modified </w:t>
       </w:r>
-      <w:proofErr w:type="spellStart"/>
       <w:r>
         <w:rPr>
           <w:b/>
@@ -33638,11 +33094,9 @@
         </w:rPr>
         <w:t>scanKeys</w:t>
       </w:r>
-      <w:proofErr w:type="spellEnd"/>
       <w:r>
         <w:t xml:space="preserve"> to take an argument specifying which keys to scan.  I modified the game loop to pass core keys to </w:t>
       </w:r>
-      <w:proofErr w:type="spellStart"/>
       <w:r>
         <w:rPr>
           <w:b/>
@@ -33650,7 +33104,6 @@
         </w:rPr>
         <w:t>scanKeys</w:t>
       </w:r>
-      <w:proofErr w:type="spellEnd"/>
       <w:r>
         <w:t xml:space="preserve"> every frame, and the full set, minus the God mode keys, every fourth frame.  If God mode is enabled all 26 keys are scanned every fourth frame.  I experimented with doing this every eight frames, but key presses were sometimes missed.</w:t>
       </w:r>
@@ -33660,7 +33113,6 @@
         <w:lastRenderedPageBreak/>
         <w:t xml:space="preserve">As part of the change I retired the </w:t>
       </w:r>
-      <w:proofErr w:type="spellStart"/>
       <w:r>
         <w:rPr>
           <w:b/>
@@ -33668,11 +33120,9 @@
         </w:rPr>
         <w:t>scanKey</w:t>
       </w:r>
-      <w:proofErr w:type="spellEnd"/>
       <w:r>
         <w:t xml:space="preserve"> routine, inlining its code within </w:t>
       </w:r>
-      <w:proofErr w:type="spellStart"/>
       <w:r>
         <w:rPr>
           <w:b/>
@@ -33680,11 +33130,9 @@
         </w:rPr>
         <w:t>scanKeys</w:t>
       </w:r>
-      <w:proofErr w:type="spellEnd"/>
       <w:r>
         <w:t xml:space="preserve">.  I then modified all the </w:t>
       </w:r>
-      <w:proofErr w:type="spellStart"/>
       <w:r>
         <w:rPr>
           <w:b/>
@@ -33692,11 +33140,9 @@
         </w:rPr>
         <w:t>scanKey</w:t>
       </w:r>
-      <w:proofErr w:type="spellEnd"/>
       <w:r>
         <w:t xml:space="preserve"> call sites to call </w:t>
       </w:r>
-      <w:proofErr w:type="spellStart"/>
       <w:r>
         <w:rPr>
           <w:b/>
@@ -33704,7 +33150,6 @@
         </w:rPr>
         <w:t>scanKeys</w:t>
       </w:r>
-      <w:proofErr w:type="spellEnd"/>
       <w:r>
         <w:t xml:space="preserve"> instead.</w:t>
       </w:r>
@@ -33773,7 +33218,6 @@
       <w:r>
         <w:t xml:space="preserve">and much less time scanning keys.  The result is that the </w:t>
       </w:r>
-      <w:proofErr w:type="spellStart"/>
       <w:r>
         <w:rPr>
           <w:b/>
@@ -33781,7 +33225,6 @@
         </w:rPr>
         <w:t>waitOnVSync</w:t>
       </w:r>
-      <w:proofErr w:type="spellEnd"/>
       <w:r>
         <w:t xml:space="preserve"> function is now </w:t>
       </w:r>
@@ -36004,7 +35447,14 @@
                 <w:b/>
                 <w:bCs/>
               </w:rPr>
-              <w:t>7072</w:t>
+              <w:t>70</w:t>
+            </w:r>
+            <w:r>
+              <w:rPr>
+                <w:b/>
+                <w:bCs/>
+              </w:rPr>
+              <w:t>96</w:t>
             </w:r>
           </w:p>
         </w:tc>
@@ -36034,7 +35484,7 @@
               <w:t>C</w:t>
             </w:r>
             <w:r>
-              <w:t>A0</w:t>
+              <w:t>B8</w:t>
             </w:r>
           </w:p>
         </w:tc>
@@ -36281,10 +35731,19 @@
         <w:t xml:space="preserve">The stack (page 1) is reduced to just </w:t>
       </w:r>
       <w:r>
-        <w:t>sixty-four</w:t>
-      </w:r>
-      <w:r>
-        <w:t xml:space="preserve"> bytes, allowing 192 bytes to be repurposed.</w:t>
+        <w:t>fo</w:t>
+      </w:r>
+      <w:r>
+        <w:t>rty</w:t>
+      </w:r>
+      <w:r>
+        <w:t xml:space="preserve"> bytes, allowing </w:t>
+      </w:r>
+      <w:r>
+        <w:t xml:space="preserve">216 </w:t>
+      </w:r>
+      <w:r>
+        <w:t>bytes to be repurposed.</w:t>
       </w:r>
     </w:p>
     <w:p>
@@ -36396,10 +35855,17 @@
           <w:b/>
           <w:bCs/>
         </w:rPr>
-        <w:t>7072</w:t>
-      </w:r>
-      <w:r>
-        <w:t xml:space="preserve"> bytes</w:t>
+        <w:t>7096</w:t>
+      </w:r>
+      <w:r>
+        <w:rPr>
+          <w:b/>
+          <w:bCs/>
+        </w:rPr>
+        <w:t xml:space="preserve"> </w:t>
+      </w:r>
+      <w:r>
+        <w:t>bytes</w:t>
       </w:r>
       <w:r>
         <w:t xml:space="preserve"> </w:t>
@@ -37781,7 +37247,6 @@
         </w:rPr>
         <w:t xml:space="preserve"> </w:t>
       </w:r>
-      <w:proofErr w:type="spellStart"/>
       <w:r>
         <w:rPr>
           <w:i/>
@@ -37789,7 +37254,6 @@
         </w:rPr>
         <w:t>selectDFS</w:t>
       </w:r>
-      <w:proofErr w:type="spellEnd"/>
       <w:r>
         <w:rPr>
           <w:b/>
@@ -37811,7 +37275,6 @@
         </w:rPr>
         <w:t xml:space="preserve"> </w:t>
       </w:r>
-      <w:proofErr w:type="spellStart"/>
       <w:r>
         <w:rPr>
           <w:i/>
@@ -37819,7 +37282,6 @@
         </w:rPr>
         <w:t>releaseDFS</w:t>
       </w:r>
-      <w:proofErr w:type="spellEnd"/>
       <w:r>
         <w:t xml:space="preserve">, to </w:t>
       </w:r>
@@ -38841,10 +38303,7 @@
               <w:cnfStyle w:val="000000100000" w:firstRow="0" w:lastRow="0" w:firstColumn="0" w:lastColumn="0" w:oddVBand="0" w:evenVBand="0" w:oddHBand="1" w:evenHBand="0" w:firstRowFirstColumn="0" w:firstRowLastColumn="0" w:lastRowFirstColumn="0" w:lastRowLastColumn="0"/>
             </w:pPr>
             <w:r>
-              <w:t>Interstitial</w:t>
-            </w:r>
-            <w:r>
-              <w:t xml:space="preserve"> experiences</w:t>
+              <w:t>Interstitial experiences</w:t>
             </w:r>
           </w:p>
         </w:tc>
@@ -39141,7 +38600,6 @@
         </w:rPr>
         <w:t xml:space="preserve"> </w:t>
       </w:r>
-      <w:proofErr w:type="spellStart"/>
       <w:r>
         <w:rPr>
           <w:i/>
@@ -39149,7 +38607,6 @@
         </w:rPr>
         <w:t>selectDFS</w:t>
       </w:r>
-      <w:proofErr w:type="spellEnd"/>
       <w:r>
         <w:rPr>
           <w:b/>
@@ -39171,7 +38628,6 @@
         </w:rPr>
         <w:t xml:space="preserve"> </w:t>
       </w:r>
-      <w:proofErr w:type="spellStart"/>
       <w:r>
         <w:rPr>
           <w:i/>
@@ -39179,7 +38635,6 @@
         </w:rPr>
         <w:t>releaseDFS</w:t>
       </w:r>
-      <w:proofErr w:type="spellEnd"/>
       <w:r>
         <w:t xml:space="preserve">, to </w:t>
       </w:r>
@@ -39189,7 +38644,6 @@
       <w:r>
         <w:t xml:space="preserve"> when </w:t>
       </w:r>
-      <w:proofErr w:type="spellStart"/>
       <w:r>
         <w:rPr>
           <w:i/>
@@ -39197,7 +38651,6 @@
         </w:rPr>
         <w:t>loadLevelFile</w:t>
       </w:r>
-      <w:proofErr w:type="spellEnd"/>
       <w:r>
         <w:t xml:space="preserve"> is invoked.</w:t>
       </w:r>
@@ -39444,13 +38897,7 @@
               <w:cnfStyle w:val="000000100000" w:firstRow="0" w:lastRow="0" w:firstColumn="0" w:lastColumn="0" w:oddVBand="0" w:evenVBand="0" w:oddHBand="1" w:evenHBand="0" w:firstRowFirstColumn="0" w:firstRowLastColumn="0" w:lastRowFirstColumn="0" w:lastRowLastColumn="0"/>
             </w:pPr>
             <w:r>
-              <w:t>Finale</w:t>
-            </w:r>
-            <w:r>
-              <w:t xml:space="preserve"> experience</w:t>
-            </w:r>
-            <w:r>
-              <w:t>s</w:t>
+              <w:t>Finale experiences</w:t>
             </w:r>
           </w:p>
         </w:tc>
@@ -39741,14 +39188,7 @@
           <w:b/>
           <w:bCs/>
         </w:rPr>
-        <w:t>&amp;</w:t>
-      </w:r>
-      <w:r>
-        <w:rPr>
-          <w:b/>
-          <w:bCs/>
-        </w:rPr>
-        <w:t>606E</w:t>
+        <w:t>&amp;606E</w:t>
       </w:r>
       <w:r>
         <w:t xml:space="preserve">, </w:t>
@@ -39782,7 +39222,6 @@
         </w:rPr>
         <w:t xml:space="preserve"> </w:t>
       </w:r>
-      <w:proofErr w:type="spellStart"/>
       <w:r>
         <w:rPr>
           <w:i/>
@@ -39790,7 +39229,6 @@
         </w:rPr>
         <w:t>selectDFS</w:t>
       </w:r>
-      <w:proofErr w:type="spellEnd"/>
       <w:r>
         <w:rPr>
           <w:b/>
@@ -39812,7 +39250,6 @@
         </w:rPr>
         <w:t xml:space="preserve"> </w:t>
       </w:r>
-      <w:proofErr w:type="spellStart"/>
       <w:r>
         <w:rPr>
           <w:i/>
@@ -39820,14 +39257,12 @@
         </w:rPr>
         <w:t>releaseDFS</w:t>
       </w:r>
-      <w:proofErr w:type="spellEnd"/>
       <w:r>
         <w:t xml:space="preserve">, to </w:t>
       </w:r>
       <w:r>
         <w:t xml:space="preserve">save and restore code located in page &amp;17 (Model B &amp; Master) or &amp;1C (Model B Plus), that DFS modifies when </w:t>
       </w:r>
-      <w:proofErr w:type="spellStart"/>
       <w:r>
         <w:rPr>
           <w:i/>
@@ -39835,7 +39270,6 @@
         </w:rPr>
         <w:t>loadLevelFile</w:t>
       </w:r>
-      <w:proofErr w:type="spellEnd"/>
       <w:r>
         <w:t xml:space="preserve"> is invoked to load the finale experience</w:t>
       </w:r>
@@ -40428,7 +39862,6 @@
       <w:r>
         <w:t xml:space="preserve">Removed </w:t>
       </w:r>
-      <w:proofErr w:type="spellStart"/>
       <w:r>
         <w:rPr>
           <w:i/>
@@ -40436,11 +39869,9 @@
         </w:rPr>
         <w:t>objectWidth</w:t>
       </w:r>
-      <w:proofErr w:type="spellEnd"/>
       <w:r>
         <w:t xml:space="preserve"> &amp; </w:t>
       </w:r>
-      <w:proofErr w:type="spellStart"/>
       <w:r>
         <w:rPr>
           <w:i/>
@@ -40448,7 +39879,6 @@
         </w:rPr>
         <w:t>objectHeight</w:t>
       </w:r>
-      <w:proofErr w:type="spellEnd"/>
       <w:r>
         <w:t xml:space="preserve"> arrays</w:t>
       </w:r>
@@ -40478,7 +39908,6 @@
       <w:r>
         <w:t xml:space="preserve">, </w:t>
       </w:r>
-      <w:proofErr w:type="spellStart"/>
       <w:r>
         <w:rPr>
           <w:i/>
@@ -40486,14 +39915,12 @@
         </w:rPr>
         <w:t>widthMinusOne</w:t>
       </w:r>
-      <w:proofErr w:type="spellEnd"/>
       <w:r>
         <w:t xml:space="preserve">, </w:t>
       </w:r>
       <w:r>
         <w:t xml:space="preserve">and </w:t>
       </w:r>
-      <w:proofErr w:type="spellStart"/>
       <w:r>
         <w:rPr>
           <w:i/>
@@ -40501,7 +39928,6 @@
         </w:rPr>
         <w:t>heightMinusOne</w:t>
       </w:r>
-      <w:proofErr w:type="spellEnd"/>
       <w:r>
         <w:t xml:space="preserve">.  </w:t>
       </w:r>
@@ -40523,7 +39949,6 @@
       <w:r>
         <w:t xml:space="preserve"> which were previously subtracting one from </w:t>
       </w:r>
-      <w:proofErr w:type="spellStart"/>
       <w:r>
         <w:rPr>
           <w:i/>
@@ -40531,11 +39956,9 @@
         </w:rPr>
         <w:t>objectWidth</w:t>
       </w:r>
-      <w:proofErr w:type="spellEnd"/>
       <w:r>
         <w:t xml:space="preserve"> &amp; </w:t>
       </w:r>
-      <w:proofErr w:type="spellStart"/>
       <w:r>
         <w:rPr>
           <w:i/>
@@ -40557,7 +39980,6 @@
         </w:rPr>
         <w:t>ght</w:t>
       </w:r>
-      <w:proofErr w:type="spellEnd"/>
       <w:r>
         <w:t xml:space="preserve">.  </w:t>
       </w:r>
@@ -40583,7 +40005,6 @@
       <w:r>
         <w:t xml:space="preserve"> and </w:t>
       </w:r>
-      <w:proofErr w:type="spellStart"/>
       <w:r>
         <w:rPr>
           <w:i/>
@@ -40591,7 +40012,6 @@
         </w:rPr>
         <w:t>objectState</w:t>
       </w:r>
-      <w:proofErr w:type="spellEnd"/>
       <w:r>
         <w:t xml:space="preserve"> array</w:t>
       </w:r>
@@ -40709,7 +40129,6 @@
       <w:r>
         <w:t xml:space="preserve">As part of this change the </w:t>
       </w:r>
-      <w:proofErr w:type="spellStart"/>
       <w:r>
         <w:rPr>
           <w:i/>
@@ -40717,11 +40136,9 @@
         </w:rPr>
         <w:t>objectFrameCallbackLo</w:t>
       </w:r>
-      <w:proofErr w:type="spellEnd"/>
       <w:r>
         <w:t xml:space="preserve"> and </w:t>
       </w:r>
-      <w:proofErr w:type="spellStart"/>
       <w:r>
         <w:rPr>
           <w:i/>
@@ -40729,11 +40146,9 @@
         </w:rPr>
         <w:t>objectFrameCallbackHi</w:t>
       </w:r>
-      <w:proofErr w:type="spellEnd"/>
       <w:r>
         <w:t xml:space="preserve"> arrays were merged into a single </w:t>
       </w:r>
-      <w:proofErr w:type="spellStart"/>
       <w:r>
         <w:rPr>
           <w:i/>
@@ -40741,7 +40156,6 @@
         </w:rPr>
         <w:t>objectFrameCallback</w:t>
       </w:r>
-      <w:proofErr w:type="spellEnd"/>
       <w:r>
         <w:t xml:space="preserve"> array.</w:t>
       </w:r>
@@ -40945,7 +40359,6 @@
       <w:r>
         <w:t xml:space="preserve">JMP </w:t>
       </w:r>
-      <w:proofErr w:type="spellStart"/>
       <w:r>
         <w:rPr>
           <w:i/>
@@ -40954,13 +40367,8 @@
         <w:t>xxx</w:t>
       </w:r>
       <w:r>
-        <w:t>x</w:t>
-      </w:r>
-      <w:proofErr w:type="spellEnd"/>
-      <w:r>
-        <w:t xml:space="preserve"> instead of JSR </w:t>
-      </w:r>
-      <w:proofErr w:type="spellStart"/>
+        <w:t xml:space="preserve">x instead of JSR </w:t>
+      </w:r>
       <w:r>
         <w:rPr>
           <w:i/>
@@ -40968,7 +40376,6 @@
         </w:rPr>
         <w:t>xxxx</w:t>
       </w:r>
-      <w:proofErr w:type="spellEnd"/>
       <w:r>
         <w:t xml:space="preserve">, </w:t>
       </w:r>
@@ -41496,7 +40903,6 @@
         </w:rPr>
         <w:t xml:space="preserve"> </w:t>
       </w:r>
-      <w:proofErr w:type="spellStart"/>
       <w:proofErr w:type="gramStart"/>
       <w:r>
         <w:rPr>
@@ -41508,7 +40914,6 @@
         </w:rPr>
         <w:t>Bh</w:t>
       </w:r>
-      <w:proofErr w:type="spellEnd"/>
       <w:r>
         <w:rPr>
           <w:rFonts w:ascii="Cascadia Code" w:hAnsi="Cascadia Code"/>
@@ -42677,7 +42082,6 @@
       <w:r>
         <w:t xml:space="preserve">To do this I needed to write custom </w:t>
       </w:r>
-      <w:proofErr w:type="spellStart"/>
       <w:r>
         <w:rPr>
           <w:i/>
@@ -42685,7 +42089,6 @@
         </w:rPr>
         <w:t>drawText</w:t>
       </w:r>
-      <w:proofErr w:type="spellEnd"/>
       <w:r>
         <w:t xml:space="preserve"> routines that used the MOS’s character definitions stored at &amp;8000</w:t>
       </w:r>
@@ -46861,23 +46264,7 @@
                 <w:sz w:val="20"/>
                 <w:szCs w:val="20"/>
               </w:rPr>
-              <w:t xml:space="preserve"> </w:t>
-            </w:r>
-            <w:proofErr w:type="spellStart"/>
-            <w:r>
-              <w:rPr>
-                <w:sz w:val="20"/>
-                <w:szCs w:val="20"/>
-              </w:rPr>
-              <w:t>Enemy</w:t>
-            </w:r>
-            <w:proofErr w:type="spellEnd"/>
-            <w:r>
-              <w:rPr>
-                <w:sz w:val="20"/>
-                <w:szCs w:val="20"/>
-              </w:rPr>
-              <w:t xml:space="preserve"> pursuit sound</w:t>
+              <w:t xml:space="preserve"> Enemy pursuit sound</w:t>
             </w:r>
           </w:p>
         </w:tc>
@@ -48827,16 +48214,32 @@
           <w:rPr>
             <w:rStyle w:val="Hyperlink"/>
           </w:rPr>
-          <w:t>mdfs.net/Docs/Comp/BBC/</w:t>
+          <w:t>mdfs.net/Docs</w:t>
         </w:r>
-        <w:proofErr w:type="spellStart"/>
+        <w:r>
+          <w:rPr>
+            <w:rStyle w:val="Hyperlink"/>
+          </w:rPr>
+          <w:t>/</w:t>
+        </w:r>
+        <w:r>
+          <w:rPr>
+            <w:rStyle w:val="Hyperlink"/>
+          </w:rPr>
+          <w:t>Comp/BBC</w:t>
+        </w:r>
+        <w:r>
+          <w:rPr>
+            <w:rStyle w:val="Hyperlink"/>
+          </w:rPr>
+          <w:t>/</w:t>
+        </w:r>
         <w:r>
           <w:rPr>
             <w:rStyle w:val="Hyperlink"/>
           </w:rPr>
           <w:t>AllMem</w:t>
         </w:r>
-        <w:proofErr w:type="spellEnd"/>
       </w:hyperlink>
     </w:p>
     <w:p>
@@ -48861,16 +48264,20 @@
           <w:rPr>
             <w:rStyle w:val="Hyperlink"/>
           </w:rPr>
-          <w:t>mdfs.net/Docs/Comp/BBC/Disk/</w:t>
+          <w:t>mdfs.net/Docs/Co</w:t>
         </w:r>
-        <w:proofErr w:type="spellStart"/>
         <w:r>
           <w:rPr>
             <w:rStyle w:val="Hyperlink"/>
           </w:rPr>
-          <w:t>DFSMem</w:t>
+          <w:t>m</w:t>
         </w:r>
-        <w:proofErr w:type="spellEnd"/>
+        <w:r>
+          <w:rPr>
+            <w:rStyle w:val="Hyperlink"/>
+          </w:rPr>
+          <w:t>p/BBC/Disk/DFSMem</w:t>
+        </w:r>
       </w:hyperlink>
     </w:p>
     <w:p>

</xml_diff>

<commit_message>
Fixed regression where space key scan which did not work on Master in the battery flat screen.
</commit_message>
<xml_diff>
--- a/docs/Development.docx
+++ b/docs/Development.docx
@@ -44473,20 +44473,34 @@
                 <w:szCs w:val="20"/>
               </w:rPr>
             </w:pPr>
-          </w:p>
-        </w:tc>
-        <w:tc>
-          <w:tcPr>
-            <w:tcW w:w="1424" w:type="dxa"/>
-          </w:tcPr>
-          <w:p>
-            <w:pPr>
-              <w:jc w:val="center"/>
+            <w:r>
               <w:rPr>
                 <w:sz w:val="20"/>
                 <w:szCs w:val="20"/>
               </w:rPr>
-            </w:pPr>
+              <w:t>X</w:t>
+            </w:r>
+          </w:p>
+        </w:tc>
+        <w:tc>
+          <w:tcPr>
+            <w:tcW w:w="1424" w:type="dxa"/>
+          </w:tcPr>
+          <w:p>
+            <w:pPr>
+              <w:jc w:val="center"/>
+              <w:rPr>
+                <w:sz w:val="20"/>
+                <w:szCs w:val="20"/>
+              </w:rPr>
+            </w:pPr>
+            <w:r>
+              <w:rPr>
+                <w:sz w:val="20"/>
+                <w:szCs w:val="20"/>
+              </w:rPr>
+              <w:t>X</w:t>
+            </w:r>
           </w:p>
         </w:tc>
         <w:tc>
@@ -44569,20 +44583,34 @@
                 <w:szCs w:val="20"/>
               </w:rPr>
             </w:pPr>
-          </w:p>
-        </w:tc>
-        <w:tc>
-          <w:tcPr>
-            <w:tcW w:w="1424" w:type="dxa"/>
-          </w:tcPr>
-          <w:p>
-            <w:pPr>
-              <w:jc w:val="center"/>
+            <w:r>
               <w:rPr>
                 <w:sz w:val="20"/>
                 <w:szCs w:val="20"/>
               </w:rPr>
-            </w:pPr>
+              <w:t>X</w:t>
+            </w:r>
+          </w:p>
+        </w:tc>
+        <w:tc>
+          <w:tcPr>
+            <w:tcW w:w="1424" w:type="dxa"/>
+          </w:tcPr>
+          <w:p>
+            <w:pPr>
+              <w:jc w:val="center"/>
+              <w:rPr>
+                <w:sz w:val="20"/>
+                <w:szCs w:val="20"/>
+              </w:rPr>
+            </w:pPr>
+            <w:r>
+              <w:rPr>
+                <w:sz w:val="20"/>
+                <w:szCs w:val="20"/>
+              </w:rPr>
+              <w:t>X</w:t>
+            </w:r>
           </w:p>
         </w:tc>
         <w:tc>
@@ -44652,20 +44680,13 @@
                 <w:szCs w:val="20"/>
               </w:rPr>
             </w:pPr>
-          </w:p>
-        </w:tc>
-        <w:tc>
-          <w:tcPr>
-            <w:tcW w:w="1424" w:type="dxa"/>
-          </w:tcPr>
-          <w:p>
-            <w:pPr>
-              <w:jc w:val="center"/>
+            <w:r>
               <w:rPr>
                 <w:sz w:val="20"/>
                 <w:szCs w:val="20"/>
               </w:rPr>
-            </w:pPr>
+              <w:t>X</w:t>
+            </w:r>
           </w:p>
         </w:tc>
         <w:tc>
@@ -44680,6 +44701,34 @@
                 <w:szCs w:val="20"/>
               </w:rPr>
             </w:pPr>
+            <w:r>
+              <w:rPr>
+                <w:sz w:val="20"/>
+                <w:szCs w:val="20"/>
+              </w:rPr>
+              <w:t>X</w:t>
+            </w:r>
+          </w:p>
+        </w:tc>
+        <w:tc>
+          <w:tcPr>
+            <w:tcW w:w="1424" w:type="dxa"/>
+          </w:tcPr>
+          <w:p>
+            <w:pPr>
+              <w:jc w:val="center"/>
+              <w:rPr>
+                <w:sz w:val="20"/>
+                <w:szCs w:val="20"/>
+              </w:rPr>
+            </w:pPr>
+            <w:r>
+              <w:rPr>
+                <w:sz w:val="20"/>
+                <w:szCs w:val="20"/>
+              </w:rPr>
+              <w:t>X</w:t>
+            </w:r>
           </w:p>
         </w:tc>
         <w:tc>
@@ -44755,20 +44804,13 @@
                 <w:szCs w:val="20"/>
               </w:rPr>
             </w:pPr>
-          </w:p>
-        </w:tc>
-        <w:tc>
-          <w:tcPr>
-            <w:tcW w:w="1424" w:type="dxa"/>
-          </w:tcPr>
-          <w:p>
-            <w:pPr>
-              <w:jc w:val="center"/>
+            <w:r>
               <w:rPr>
                 <w:sz w:val="20"/>
                 <w:szCs w:val="20"/>
               </w:rPr>
-            </w:pPr>
+              <w:t>X</w:t>
+            </w:r>
           </w:p>
         </w:tc>
         <w:tc>
@@ -44783,6 +44825,34 @@
                 <w:szCs w:val="20"/>
               </w:rPr>
             </w:pPr>
+            <w:r>
+              <w:rPr>
+                <w:sz w:val="20"/>
+                <w:szCs w:val="20"/>
+              </w:rPr>
+              <w:t>X</w:t>
+            </w:r>
+          </w:p>
+        </w:tc>
+        <w:tc>
+          <w:tcPr>
+            <w:tcW w:w="1424" w:type="dxa"/>
+          </w:tcPr>
+          <w:p>
+            <w:pPr>
+              <w:jc w:val="center"/>
+              <w:rPr>
+                <w:sz w:val="20"/>
+                <w:szCs w:val="20"/>
+              </w:rPr>
+            </w:pPr>
+            <w:r>
+              <w:rPr>
+                <w:sz w:val="20"/>
+                <w:szCs w:val="20"/>
+              </w:rPr>
+              <w:t>X</w:t>
+            </w:r>
           </w:p>
         </w:tc>
         <w:tc>
@@ -44881,20 +44951,34 @@
                 <w:szCs w:val="20"/>
               </w:rPr>
             </w:pPr>
-          </w:p>
-        </w:tc>
-        <w:tc>
-          <w:tcPr>
-            <w:tcW w:w="1424" w:type="dxa"/>
-          </w:tcPr>
-          <w:p>
-            <w:pPr>
-              <w:jc w:val="center"/>
+            <w:r>
               <w:rPr>
                 <w:sz w:val="20"/>
                 <w:szCs w:val="20"/>
               </w:rPr>
-            </w:pPr>
+              <w:t>X</w:t>
+            </w:r>
+          </w:p>
+        </w:tc>
+        <w:tc>
+          <w:tcPr>
+            <w:tcW w:w="1424" w:type="dxa"/>
+          </w:tcPr>
+          <w:p>
+            <w:pPr>
+              <w:jc w:val="center"/>
+              <w:rPr>
+                <w:sz w:val="20"/>
+                <w:szCs w:val="20"/>
+              </w:rPr>
+            </w:pPr>
+            <w:r>
+              <w:rPr>
+                <w:sz w:val="20"/>
+                <w:szCs w:val="20"/>
+              </w:rPr>
+              <w:t>X</w:t>
+            </w:r>
           </w:p>
         </w:tc>
         <w:tc>
@@ -44963,20 +45047,13 @@
                 <w:szCs w:val="20"/>
               </w:rPr>
             </w:pPr>
-          </w:p>
-        </w:tc>
-        <w:tc>
-          <w:tcPr>
-            <w:tcW w:w="1424" w:type="dxa"/>
-          </w:tcPr>
-          <w:p>
-            <w:pPr>
-              <w:jc w:val="center"/>
+            <w:r>
               <w:rPr>
                 <w:sz w:val="20"/>
                 <w:szCs w:val="20"/>
               </w:rPr>
-            </w:pPr>
+              <w:t>X</w:t>
+            </w:r>
           </w:p>
         </w:tc>
         <w:tc>
@@ -44991,6 +45068,34 @@
                 <w:szCs w:val="20"/>
               </w:rPr>
             </w:pPr>
+            <w:r>
+              <w:rPr>
+                <w:sz w:val="20"/>
+                <w:szCs w:val="20"/>
+              </w:rPr>
+              <w:t>X</w:t>
+            </w:r>
+          </w:p>
+        </w:tc>
+        <w:tc>
+          <w:tcPr>
+            <w:tcW w:w="1424" w:type="dxa"/>
+          </w:tcPr>
+          <w:p>
+            <w:pPr>
+              <w:jc w:val="center"/>
+              <w:rPr>
+                <w:sz w:val="20"/>
+                <w:szCs w:val="20"/>
+              </w:rPr>
+            </w:pPr>
+            <w:r>
+              <w:rPr>
+                <w:sz w:val="20"/>
+                <w:szCs w:val="20"/>
+              </w:rPr>
+              <w:t>X</w:t>
+            </w:r>
           </w:p>
         </w:tc>
         <w:tc>
@@ -45089,6 +45194,13 @@
                 <w:szCs w:val="20"/>
               </w:rPr>
             </w:pPr>
+            <w:r>
+              <w:rPr>
+                <w:sz w:val="20"/>
+                <w:szCs w:val="20"/>
+              </w:rPr>
+              <w:t>X</w:t>
+            </w:r>
           </w:p>
         </w:tc>
         <w:tc>
@@ -45171,6 +45283,13 @@
                 <w:szCs w:val="20"/>
               </w:rPr>
             </w:pPr>
+            <w:r>
+              <w:rPr>
+                <w:sz w:val="20"/>
+                <w:szCs w:val="20"/>
+              </w:rPr>
+              <w:t>X</w:t>
+            </w:r>
           </w:p>
         </w:tc>
         <w:tc>
@@ -45253,6 +45372,13 @@
                 <w:szCs w:val="20"/>
               </w:rPr>
             </w:pPr>
+            <w:r>
+              <w:rPr>
+                <w:sz w:val="20"/>
+                <w:szCs w:val="20"/>
+              </w:rPr>
+              <w:t>X</w:t>
+            </w:r>
           </w:p>
         </w:tc>
         <w:tc>
@@ -45335,6 +45461,13 @@
                 <w:szCs w:val="20"/>
               </w:rPr>
             </w:pPr>
+            <w:r>
+              <w:rPr>
+                <w:sz w:val="20"/>
+                <w:szCs w:val="20"/>
+              </w:rPr>
+              <w:t>X</w:t>
+            </w:r>
           </w:p>
         </w:tc>
         <w:tc>
@@ -45417,6 +45550,13 @@
                 <w:szCs w:val="20"/>
               </w:rPr>
             </w:pPr>
+            <w:r>
+              <w:rPr>
+                <w:sz w:val="20"/>
+                <w:szCs w:val="20"/>
+              </w:rPr>
+              <w:t>X</w:t>
+            </w:r>
           </w:p>
         </w:tc>
         <w:tc>
@@ -45527,6 +45667,13 @@
                 <w:szCs w:val="20"/>
               </w:rPr>
             </w:pPr>
+            <w:r>
+              <w:rPr>
+                <w:sz w:val="20"/>
+                <w:szCs w:val="20"/>
+              </w:rPr>
+              <w:t>X</w:t>
+            </w:r>
           </w:p>
         </w:tc>
         <w:tc>
@@ -45630,6 +45777,13 @@
                 <w:szCs w:val="20"/>
               </w:rPr>
             </w:pPr>
+            <w:r>
+              <w:rPr>
+                <w:sz w:val="20"/>
+                <w:szCs w:val="20"/>
+              </w:rPr>
+              <w:t>X</w:t>
+            </w:r>
           </w:p>
         </w:tc>
         <w:tc>
@@ -45726,6 +45880,13 @@
                 <w:szCs w:val="20"/>
               </w:rPr>
             </w:pPr>
+            <w:r>
+              <w:rPr>
+                <w:sz w:val="20"/>
+                <w:szCs w:val="20"/>
+              </w:rPr>
+              <w:t>X</w:t>
+            </w:r>
           </w:p>
         </w:tc>
         <w:tc>
@@ -45822,6 +45983,13 @@
                 <w:szCs w:val="20"/>
               </w:rPr>
             </w:pPr>
+            <w:r>
+              <w:rPr>
+                <w:sz w:val="20"/>
+                <w:szCs w:val="20"/>
+              </w:rPr>
+              <w:t>X</w:t>
+            </w:r>
           </w:p>
         </w:tc>
         <w:tc>
@@ -45946,20 +46114,34 @@
                 <w:szCs w:val="20"/>
               </w:rPr>
             </w:pPr>
-          </w:p>
-        </w:tc>
-        <w:tc>
-          <w:tcPr>
-            <w:tcW w:w="1424" w:type="dxa"/>
-          </w:tcPr>
-          <w:p>
-            <w:pPr>
-              <w:jc w:val="center"/>
+            <w:r>
               <w:rPr>
                 <w:sz w:val="20"/>
                 <w:szCs w:val="20"/>
               </w:rPr>
-            </w:pPr>
+              <w:t>X</w:t>
+            </w:r>
+          </w:p>
+        </w:tc>
+        <w:tc>
+          <w:tcPr>
+            <w:tcW w:w="1424" w:type="dxa"/>
+          </w:tcPr>
+          <w:p>
+            <w:pPr>
+              <w:jc w:val="center"/>
+              <w:rPr>
+                <w:sz w:val="20"/>
+                <w:szCs w:val="20"/>
+              </w:rPr>
+            </w:pPr>
+            <w:r>
+              <w:rPr>
+                <w:sz w:val="20"/>
+                <w:szCs w:val="20"/>
+              </w:rPr>
+              <w:t>X</w:t>
+            </w:r>
           </w:p>
         </w:tc>
         <w:tc>
@@ -46049,20 +46231,34 @@
                 <w:szCs w:val="20"/>
               </w:rPr>
             </w:pPr>
-          </w:p>
-        </w:tc>
-        <w:tc>
-          <w:tcPr>
-            <w:tcW w:w="1424" w:type="dxa"/>
-          </w:tcPr>
-          <w:p>
-            <w:pPr>
-              <w:jc w:val="center"/>
+            <w:r>
               <w:rPr>
                 <w:sz w:val="20"/>
                 <w:szCs w:val="20"/>
               </w:rPr>
-            </w:pPr>
+              <w:t>X</w:t>
+            </w:r>
+          </w:p>
+        </w:tc>
+        <w:tc>
+          <w:tcPr>
+            <w:tcW w:w="1424" w:type="dxa"/>
+          </w:tcPr>
+          <w:p>
+            <w:pPr>
+              <w:jc w:val="center"/>
+              <w:rPr>
+                <w:sz w:val="20"/>
+                <w:szCs w:val="20"/>
+              </w:rPr>
+            </w:pPr>
+            <w:r>
+              <w:rPr>
+                <w:sz w:val="20"/>
+                <w:szCs w:val="20"/>
+              </w:rPr>
+              <w:t>X</w:t>
+            </w:r>
           </w:p>
         </w:tc>
         <w:tc>
@@ -46152,20 +46348,34 @@
                 <w:szCs w:val="20"/>
               </w:rPr>
             </w:pPr>
-          </w:p>
-        </w:tc>
-        <w:tc>
-          <w:tcPr>
-            <w:tcW w:w="1424" w:type="dxa"/>
-          </w:tcPr>
-          <w:p>
-            <w:pPr>
-              <w:jc w:val="center"/>
+            <w:r>
               <w:rPr>
                 <w:sz w:val="20"/>
                 <w:szCs w:val="20"/>
               </w:rPr>
-            </w:pPr>
+              <w:t>X</w:t>
+            </w:r>
+          </w:p>
+        </w:tc>
+        <w:tc>
+          <w:tcPr>
+            <w:tcW w:w="1424" w:type="dxa"/>
+          </w:tcPr>
+          <w:p>
+            <w:pPr>
+              <w:jc w:val="center"/>
+              <w:rPr>
+                <w:sz w:val="20"/>
+                <w:szCs w:val="20"/>
+              </w:rPr>
+            </w:pPr>
+            <w:r>
+              <w:rPr>
+                <w:sz w:val="20"/>
+                <w:szCs w:val="20"/>
+              </w:rPr>
+              <w:t>X</w:t>
+            </w:r>
           </w:p>
         </w:tc>
         <w:tc>
@@ -46255,20 +46465,34 @@
                 <w:szCs w:val="20"/>
               </w:rPr>
             </w:pPr>
-          </w:p>
-        </w:tc>
-        <w:tc>
-          <w:tcPr>
-            <w:tcW w:w="1424" w:type="dxa"/>
-          </w:tcPr>
-          <w:p>
-            <w:pPr>
-              <w:jc w:val="center"/>
+            <w:r>
               <w:rPr>
                 <w:sz w:val="20"/>
                 <w:szCs w:val="20"/>
               </w:rPr>
-            </w:pPr>
+              <w:t>X</w:t>
+            </w:r>
+          </w:p>
+        </w:tc>
+        <w:tc>
+          <w:tcPr>
+            <w:tcW w:w="1424" w:type="dxa"/>
+          </w:tcPr>
+          <w:p>
+            <w:pPr>
+              <w:jc w:val="center"/>
+              <w:rPr>
+                <w:sz w:val="20"/>
+                <w:szCs w:val="20"/>
+              </w:rPr>
+            </w:pPr>
+            <w:r>
+              <w:rPr>
+                <w:sz w:val="20"/>
+                <w:szCs w:val="20"/>
+              </w:rPr>
+              <w:t>X</w:t>
+            </w:r>
           </w:p>
         </w:tc>
         <w:tc>
@@ -46358,20 +46582,34 @@
                 <w:szCs w:val="20"/>
               </w:rPr>
             </w:pPr>
-          </w:p>
-        </w:tc>
-        <w:tc>
-          <w:tcPr>
-            <w:tcW w:w="1424" w:type="dxa"/>
-          </w:tcPr>
-          <w:p>
-            <w:pPr>
-              <w:jc w:val="center"/>
+            <w:r>
               <w:rPr>
                 <w:sz w:val="20"/>
                 <w:szCs w:val="20"/>
               </w:rPr>
-            </w:pPr>
+              <w:t>X</w:t>
+            </w:r>
+          </w:p>
+        </w:tc>
+        <w:tc>
+          <w:tcPr>
+            <w:tcW w:w="1424" w:type="dxa"/>
+          </w:tcPr>
+          <w:p>
+            <w:pPr>
+              <w:jc w:val="center"/>
+              <w:rPr>
+                <w:sz w:val="20"/>
+                <w:szCs w:val="20"/>
+              </w:rPr>
+            </w:pPr>
+            <w:r>
+              <w:rPr>
+                <w:sz w:val="20"/>
+                <w:szCs w:val="20"/>
+              </w:rPr>
+              <w:t>X</w:t>
+            </w:r>
           </w:p>
         </w:tc>
         <w:tc>
@@ -46475,6 +46713,13 @@
                 <w:szCs w:val="20"/>
               </w:rPr>
             </w:pPr>
+            <w:r>
+              <w:rPr>
+                <w:sz w:val="20"/>
+                <w:szCs w:val="20"/>
+              </w:rPr>
+              <w:t>X</w:t>
+            </w:r>
           </w:p>
         </w:tc>
         <w:tc>
@@ -46578,6 +46823,13 @@
                 <w:szCs w:val="20"/>
               </w:rPr>
             </w:pPr>
+            <w:r>
+              <w:rPr>
+                <w:sz w:val="20"/>
+                <w:szCs w:val="20"/>
+              </w:rPr>
+              <w:t>X</w:t>
+            </w:r>
           </w:p>
         </w:tc>
         <w:tc>
@@ -46709,6 +46961,13 @@
                 <w:szCs w:val="20"/>
               </w:rPr>
             </w:pPr>
+            <w:r>
+              <w:rPr>
+                <w:sz w:val="20"/>
+                <w:szCs w:val="20"/>
+              </w:rPr>
+              <w:t>X</w:t>
+            </w:r>
           </w:p>
         </w:tc>
         <w:tc>
@@ -46812,6 +47071,13 @@
                 <w:szCs w:val="20"/>
               </w:rPr>
             </w:pPr>
+            <w:r>
+              <w:rPr>
+                <w:sz w:val="20"/>
+                <w:szCs w:val="20"/>
+              </w:rPr>
+              <w:t>X</w:t>
+            </w:r>
           </w:p>
         </w:tc>
         <w:tc>
@@ -46915,6 +47181,13 @@
                 <w:szCs w:val="20"/>
               </w:rPr>
             </w:pPr>
+            <w:r>
+              <w:rPr>
+                <w:sz w:val="20"/>
+                <w:szCs w:val="20"/>
+              </w:rPr>
+              <w:t>X</w:t>
+            </w:r>
           </w:p>
         </w:tc>
         <w:tc>
@@ -47018,6 +47291,13 @@
                 <w:szCs w:val="20"/>
               </w:rPr>
             </w:pPr>
+            <w:r>
+              <w:rPr>
+                <w:sz w:val="20"/>
+                <w:szCs w:val="20"/>
+              </w:rPr>
+              <w:t>X</w:t>
+            </w:r>
           </w:p>
         </w:tc>
         <w:tc>
@@ -48091,6 +48371,13 @@
                 <w:szCs w:val="20"/>
               </w:rPr>
             </w:pPr>
+            <w:r>
+              <w:rPr>
+                <w:sz w:val="20"/>
+                <w:szCs w:val="20"/>
+              </w:rPr>
+              <w:t>X</w:t>
+            </w:r>
           </w:p>
         </w:tc>
         <w:tc>
@@ -48187,6 +48474,13 @@
                 <w:szCs w:val="20"/>
               </w:rPr>
             </w:pPr>
+            <w:r>
+              <w:rPr>
+                <w:sz w:val="20"/>
+                <w:szCs w:val="20"/>
+              </w:rPr>
+              <w:t>X</w:t>
+            </w:r>
           </w:p>
         </w:tc>
         <w:tc>
@@ -48297,6 +48591,13 @@
                 <w:szCs w:val="20"/>
               </w:rPr>
             </w:pPr>
+            <w:r>
+              <w:rPr>
+                <w:sz w:val="20"/>
+                <w:szCs w:val="20"/>
+              </w:rPr>
+              <w:t>X</w:t>
+            </w:r>
           </w:p>
         </w:tc>
         <w:tc>
@@ -48393,6 +48694,13 @@
                 <w:szCs w:val="20"/>
               </w:rPr>
             </w:pPr>
+            <w:r>
+              <w:rPr>
+                <w:sz w:val="20"/>
+                <w:szCs w:val="20"/>
+              </w:rPr>
+              <w:t>X</w:t>
+            </w:r>
           </w:p>
         </w:tc>
         <w:tc>
@@ -48489,6 +48797,13 @@
                 <w:szCs w:val="20"/>
               </w:rPr>
             </w:pPr>
+            <w:r>
+              <w:rPr>
+                <w:sz w:val="20"/>
+                <w:szCs w:val="20"/>
+              </w:rPr>
+              <w:t>X</w:t>
+            </w:r>
           </w:p>
         </w:tc>
         <w:tc>
@@ -48585,6 +48900,13 @@
                 <w:szCs w:val="20"/>
               </w:rPr>
             </w:pPr>
+            <w:r>
+              <w:rPr>
+                <w:sz w:val="20"/>
+                <w:szCs w:val="20"/>
+              </w:rPr>
+              <w:t>X</w:t>
+            </w:r>
           </w:p>
         </w:tc>
         <w:tc>

</xml_diff>

<commit_message>
Smoke tested build in BeebEm on Model B. Model B+, and Master 128.  Also reverted edits to level1 and level6 which were inadvertently submitted in a regression fix found in testing
</commit_message>
<xml_diff>
--- a/docs/Development.docx
+++ b/docs/Development.docx
@@ -44459,6 +44459,13 @@
                 <w:szCs w:val="20"/>
               </w:rPr>
             </w:pPr>
+            <w:r>
+              <w:rPr>
+                <w:sz w:val="20"/>
+                <w:szCs w:val="20"/>
+              </w:rPr>
+              <w:t>X</w:t>
+            </w:r>
           </w:p>
         </w:tc>
         <w:tc>
@@ -44569,6 +44576,13 @@
                 <w:szCs w:val="20"/>
               </w:rPr>
             </w:pPr>
+            <w:r>
+              <w:rPr>
+                <w:sz w:val="20"/>
+                <w:szCs w:val="20"/>
+              </w:rPr>
+              <w:t>X</w:t>
+            </w:r>
           </w:p>
         </w:tc>
         <w:tc>
@@ -44937,6 +44951,13 @@
                 <w:szCs w:val="20"/>
               </w:rPr>
             </w:pPr>
+            <w:r>
+              <w:rPr>
+                <w:sz w:val="20"/>
+                <w:szCs w:val="20"/>
+              </w:rPr>
+              <w:t>X</w:t>
+            </w:r>
           </w:p>
         </w:tc>
         <w:tc>
@@ -45180,41 +45201,55 @@
                 <w:szCs w:val="20"/>
               </w:rPr>
             </w:pPr>
-          </w:p>
-        </w:tc>
-        <w:tc>
-          <w:tcPr>
-            <w:tcW w:w="1424" w:type="dxa"/>
-          </w:tcPr>
-          <w:p>
-            <w:pPr>
-              <w:jc w:val="center"/>
+            <w:r>
               <w:rPr>
                 <w:sz w:val="20"/>
                 <w:szCs w:val="20"/>
               </w:rPr>
-            </w:pPr>
-            <w:r>
+              <w:t>X</w:t>
+            </w:r>
+          </w:p>
+        </w:tc>
+        <w:tc>
+          <w:tcPr>
+            <w:tcW w:w="1424" w:type="dxa"/>
+          </w:tcPr>
+          <w:p>
+            <w:pPr>
+              <w:jc w:val="center"/>
               <w:rPr>
                 <w:sz w:val="20"/>
                 <w:szCs w:val="20"/>
               </w:rPr>
-              <w:t>X</w:t>
-            </w:r>
-          </w:p>
-        </w:tc>
-        <w:tc>
-          <w:tcPr>
-            <w:tcW w:w="1424" w:type="dxa"/>
-          </w:tcPr>
-          <w:p>
-            <w:pPr>
-              <w:jc w:val="center"/>
+            </w:pPr>
+            <w:r>
               <w:rPr>
                 <w:sz w:val="20"/>
                 <w:szCs w:val="20"/>
               </w:rPr>
-            </w:pPr>
+              <w:t>X</w:t>
+            </w:r>
+          </w:p>
+        </w:tc>
+        <w:tc>
+          <w:tcPr>
+            <w:tcW w:w="1424" w:type="dxa"/>
+          </w:tcPr>
+          <w:p>
+            <w:pPr>
+              <w:jc w:val="center"/>
+              <w:rPr>
+                <w:sz w:val="20"/>
+                <w:szCs w:val="20"/>
+              </w:rPr>
+            </w:pPr>
+            <w:r>
+              <w:rPr>
+                <w:sz w:val="20"/>
+                <w:szCs w:val="20"/>
+              </w:rPr>
+              <w:t>X</w:t>
+            </w:r>
           </w:p>
         </w:tc>
         <w:tc>
@@ -45269,41 +45304,55 @@
                 <w:szCs w:val="20"/>
               </w:rPr>
             </w:pPr>
-          </w:p>
-        </w:tc>
-        <w:tc>
-          <w:tcPr>
-            <w:tcW w:w="1424" w:type="dxa"/>
-          </w:tcPr>
-          <w:p>
-            <w:pPr>
-              <w:jc w:val="center"/>
+            <w:r>
               <w:rPr>
                 <w:sz w:val="20"/>
                 <w:szCs w:val="20"/>
               </w:rPr>
-            </w:pPr>
-            <w:r>
+              <w:t>X</w:t>
+            </w:r>
+          </w:p>
+        </w:tc>
+        <w:tc>
+          <w:tcPr>
+            <w:tcW w:w="1424" w:type="dxa"/>
+          </w:tcPr>
+          <w:p>
+            <w:pPr>
+              <w:jc w:val="center"/>
               <w:rPr>
                 <w:sz w:val="20"/>
                 <w:szCs w:val="20"/>
               </w:rPr>
-              <w:t>X</w:t>
-            </w:r>
-          </w:p>
-        </w:tc>
-        <w:tc>
-          <w:tcPr>
-            <w:tcW w:w="1424" w:type="dxa"/>
-          </w:tcPr>
-          <w:p>
-            <w:pPr>
-              <w:jc w:val="center"/>
+            </w:pPr>
+            <w:r>
               <w:rPr>
                 <w:sz w:val="20"/>
                 <w:szCs w:val="20"/>
               </w:rPr>
-            </w:pPr>
+              <w:t>X</w:t>
+            </w:r>
+          </w:p>
+        </w:tc>
+        <w:tc>
+          <w:tcPr>
+            <w:tcW w:w="1424" w:type="dxa"/>
+          </w:tcPr>
+          <w:p>
+            <w:pPr>
+              <w:jc w:val="center"/>
+              <w:rPr>
+                <w:sz w:val="20"/>
+                <w:szCs w:val="20"/>
+              </w:rPr>
+            </w:pPr>
+            <w:r>
+              <w:rPr>
+                <w:sz w:val="20"/>
+                <w:szCs w:val="20"/>
+              </w:rPr>
+              <w:t>X</w:t>
+            </w:r>
           </w:p>
         </w:tc>
         <w:tc>
@@ -45358,41 +45407,55 @@
                 <w:szCs w:val="20"/>
               </w:rPr>
             </w:pPr>
-          </w:p>
-        </w:tc>
-        <w:tc>
-          <w:tcPr>
-            <w:tcW w:w="1424" w:type="dxa"/>
-          </w:tcPr>
-          <w:p>
-            <w:pPr>
-              <w:jc w:val="center"/>
+            <w:r>
               <w:rPr>
                 <w:sz w:val="20"/>
                 <w:szCs w:val="20"/>
               </w:rPr>
-            </w:pPr>
-            <w:r>
+              <w:t>X</w:t>
+            </w:r>
+          </w:p>
+        </w:tc>
+        <w:tc>
+          <w:tcPr>
+            <w:tcW w:w="1424" w:type="dxa"/>
+          </w:tcPr>
+          <w:p>
+            <w:pPr>
+              <w:jc w:val="center"/>
               <w:rPr>
                 <w:sz w:val="20"/>
                 <w:szCs w:val="20"/>
               </w:rPr>
-              <w:t>X</w:t>
-            </w:r>
-          </w:p>
-        </w:tc>
-        <w:tc>
-          <w:tcPr>
-            <w:tcW w:w="1424" w:type="dxa"/>
-          </w:tcPr>
-          <w:p>
-            <w:pPr>
-              <w:jc w:val="center"/>
+            </w:pPr>
+            <w:r>
               <w:rPr>
                 <w:sz w:val="20"/>
                 <w:szCs w:val="20"/>
               </w:rPr>
-            </w:pPr>
+              <w:t>X</w:t>
+            </w:r>
+          </w:p>
+        </w:tc>
+        <w:tc>
+          <w:tcPr>
+            <w:tcW w:w="1424" w:type="dxa"/>
+          </w:tcPr>
+          <w:p>
+            <w:pPr>
+              <w:jc w:val="center"/>
+              <w:rPr>
+                <w:sz w:val="20"/>
+                <w:szCs w:val="20"/>
+              </w:rPr>
+            </w:pPr>
+            <w:r>
+              <w:rPr>
+                <w:sz w:val="20"/>
+                <w:szCs w:val="20"/>
+              </w:rPr>
+              <w:t>X</w:t>
+            </w:r>
           </w:p>
         </w:tc>
         <w:tc>
@@ -45447,41 +45510,55 @@
                 <w:szCs w:val="20"/>
               </w:rPr>
             </w:pPr>
-          </w:p>
-        </w:tc>
-        <w:tc>
-          <w:tcPr>
-            <w:tcW w:w="1424" w:type="dxa"/>
-          </w:tcPr>
-          <w:p>
-            <w:pPr>
-              <w:jc w:val="center"/>
+            <w:r>
               <w:rPr>
                 <w:sz w:val="20"/>
                 <w:szCs w:val="20"/>
               </w:rPr>
-            </w:pPr>
-            <w:r>
+              <w:t>X</w:t>
+            </w:r>
+          </w:p>
+        </w:tc>
+        <w:tc>
+          <w:tcPr>
+            <w:tcW w:w="1424" w:type="dxa"/>
+          </w:tcPr>
+          <w:p>
+            <w:pPr>
+              <w:jc w:val="center"/>
               <w:rPr>
                 <w:sz w:val="20"/>
                 <w:szCs w:val="20"/>
               </w:rPr>
-              <w:t>X</w:t>
-            </w:r>
-          </w:p>
-        </w:tc>
-        <w:tc>
-          <w:tcPr>
-            <w:tcW w:w="1424" w:type="dxa"/>
-          </w:tcPr>
-          <w:p>
-            <w:pPr>
-              <w:jc w:val="center"/>
+            </w:pPr>
+            <w:r>
               <w:rPr>
                 <w:sz w:val="20"/>
                 <w:szCs w:val="20"/>
               </w:rPr>
-            </w:pPr>
+              <w:t>X</w:t>
+            </w:r>
+          </w:p>
+        </w:tc>
+        <w:tc>
+          <w:tcPr>
+            <w:tcW w:w="1424" w:type="dxa"/>
+          </w:tcPr>
+          <w:p>
+            <w:pPr>
+              <w:jc w:val="center"/>
+              <w:rPr>
+                <w:sz w:val="20"/>
+                <w:szCs w:val="20"/>
+              </w:rPr>
+            </w:pPr>
+            <w:r>
+              <w:rPr>
+                <w:sz w:val="20"/>
+                <w:szCs w:val="20"/>
+              </w:rPr>
+              <w:t>X</w:t>
+            </w:r>
           </w:p>
         </w:tc>
         <w:tc>
@@ -45536,41 +45613,55 @@
                 <w:szCs w:val="20"/>
               </w:rPr>
             </w:pPr>
-          </w:p>
-        </w:tc>
-        <w:tc>
-          <w:tcPr>
-            <w:tcW w:w="1424" w:type="dxa"/>
-          </w:tcPr>
-          <w:p>
-            <w:pPr>
-              <w:jc w:val="center"/>
+            <w:r>
               <w:rPr>
                 <w:sz w:val="20"/>
                 <w:szCs w:val="20"/>
               </w:rPr>
-            </w:pPr>
-            <w:r>
+              <w:t>X</w:t>
+            </w:r>
+          </w:p>
+        </w:tc>
+        <w:tc>
+          <w:tcPr>
+            <w:tcW w:w="1424" w:type="dxa"/>
+          </w:tcPr>
+          <w:p>
+            <w:pPr>
+              <w:jc w:val="center"/>
               <w:rPr>
                 <w:sz w:val="20"/>
                 <w:szCs w:val="20"/>
               </w:rPr>
-              <w:t>X</w:t>
-            </w:r>
-          </w:p>
-        </w:tc>
-        <w:tc>
-          <w:tcPr>
-            <w:tcW w:w="1424" w:type="dxa"/>
-          </w:tcPr>
-          <w:p>
-            <w:pPr>
-              <w:jc w:val="center"/>
+            </w:pPr>
+            <w:r>
               <w:rPr>
                 <w:sz w:val="20"/>
                 <w:szCs w:val="20"/>
               </w:rPr>
-            </w:pPr>
+              <w:t>X</w:t>
+            </w:r>
+          </w:p>
+        </w:tc>
+        <w:tc>
+          <w:tcPr>
+            <w:tcW w:w="1424" w:type="dxa"/>
+          </w:tcPr>
+          <w:p>
+            <w:pPr>
+              <w:jc w:val="center"/>
+              <w:rPr>
+                <w:sz w:val="20"/>
+                <w:szCs w:val="20"/>
+              </w:rPr>
+            </w:pPr>
+            <w:r>
+              <w:rPr>
+                <w:sz w:val="20"/>
+                <w:szCs w:val="20"/>
+              </w:rPr>
+              <w:t>X</w:t>
+            </w:r>
           </w:p>
         </w:tc>
         <w:tc>
@@ -45653,41 +45744,55 @@
                 <w:szCs w:val="20"/>
               </w:rPr>
             </w:pPr>
-          </w:p>
-        </w:tc>
-        <w:tc>
-          <w:tcPr>
-            <w:tcW w:w="1424" w:type="dxa"/>
-          </w:tcPr>
-          <w:p>
-            <w:pPr>
-              <w:jc w:val="center"/>
+            <w:r>
               <w:rPr>
                 <w:sz w:val="20"/>
                 <w:szCs w:val="20"/>
               </w:rPr>
-            </w:pPr>
-            <w:r>
+              <w:t>X</w:t>
+            </w:r>
+          </w:p>
+        </w:tc>
+        <w:tc>
+          <w:tcPr>
+            <w:tcW w:w="1424" w:type="dxa"/>
+          </w:tcPr>
+          <w:p>
+            <w:pPr>
+              <w:jc w:val="center"/>
               <w:rPr>
                 <w:sz w:val="20"/>
                 <w:szCs w:val="20"/>
               </w:rPr>
-              <w:t>X</w:t>
-            </w:r>
-          </w:p>
-        </w:tc>
-        <w:tc>
-          <w:tcPr>
-            <w:tcW w:w="1424" w:type="dxa"/>
-          </w:tcPr>
-          <w:p>
-            <w:pPr>
-              <w:jc w:val="center"/>
+            </w:pPr>
+            <w:r>
               <w:rPr>
                 <w:sz w:val="20"/>
                 <w:szCs w:val="20"/>
               </w:rPr>
-            </w:pPr>
+              <w:t>X</w:t>
+            </w:r>
+          </w:p>
+        </w:tc>
+        <w:tc>
+          <w:tcPr>
+            <w:tcW w:w="1424" w:type="dxa"/>
+          </w:tcPr>
+          <w:p>
+            <w:pPr>
+              <w:jc w:val="center"/>
+              <w:rPr>
+                <w:sz w:val="20"/>
+                <w:szCs w:val="20"/>
+              </w:rPr>
+            </w:pPr>
+            <w:r>
+              <w:rPr>
+                <w:sz w:val="20"/>
+                <w:szCs w:val="20"/>
+              </w:rPr>
+              <w:t>X</w:t>
+            </w:r>
           </w:p>
         </w:tc>
         <w:tc>
@@ -45763,41 +45868,55 @@
                 <w:szCs w:val="20"/>
               </w:rPr>
             </w:pPr>
-          </w:p>
-        </w:tc>
-        <w:tc>
-          <w:tcPr>
-            <w:tcW w:w="1424" w:type="dxa"/>
-          </w:tcPr>
-          <w:p>
-            <w:pPr>
-              <w:jc w:val="center"/>
+            <w:r>
               <w:rPr>
                 <w:sz w:val="20"/>
                 <w:szCs w:val="20"/>
               </w:rPr>
-            </w:pPr>
-            <w:r>
+              <w:t>X</w:t>
+            </w:r>
+          </w:p>
+        </w:tc>
+        <w:tc>
+          <w:tcPr>
+            <w:tcW w:w="1424" w:type="dxa"/>
+          </w:tcPr>
+          <w:p>
+            <w:pPr>
+              <w:jc w:val="center"/>
               <w:rPr>
                 <w:sz w:val="20"/>
                 <w:szCs w:val="20"/>
               </w:rPr>
-              <w:t>X</w:t>
-            </w:r>
-          </w:p>
-        </w:tc>
-        <w:tc>
-          <w:tcPr>
-            <w:tcW w:w="1424" w:type="dxa"/>
-          </w:tcPr>
-          <w:p>
-            <w:pPr>
-              <w:jc w:val="center"/>
+            </w:pPr>
+            <w:r>
               <w:rPr>
                 <w:sz w:val="20"/>
                 <w:szCs w:val="20"/>
               </w:rPr>
-            </w:pPr>
+              <w:t>X</w:t>
+            </w:r>
+          </w:p>
+        </w:tc>
+        <w:tc>
+          <w:tcPr>
+            <w:tcW w:w="1424" w:type="dxa"/>
+          </w:tcPr>
+          <w:p>
+            <w:pPr>
+              <w:jc w:val="center"/>
+              <w:rPr>
+                <w:sz w:val="20"/>
+                <w:szCs w:val="20"/>
+              </w:rPr>
+            </w:pPr>
+            <w:r>
+              <w:rPr>
+                <w:sz w:val="20"/>
+                <w:szCs w:val="20"/>
+              </w:rPr>
+              <w:t>X</w:t>
+            </w:r>
           </w:p>
         </w:tc>
         <w:tc>
@@ -45866,41 +45985,55 @@
                 <w:szCs w:val="20"/>
               </w:rPr>
             </w:pPr>
-          </w:p>
-        </w:tc>
-        <w:tc>
-          <w:tcPr>
-            <w:tcW w:w="1424" w:type="dxa"/>
-          </w:tcPr>
-          <w:p>
-            <w:pPr>
-              <w:jc w:val="center"/>
+            <w:r>
               <w:rPr>
                 <w:sz w:val="20"/>
                 <w:szCs w:val="20"/>
               </w:rPr>
-            </w:pPr>
-            <w:r>
+              <w:t>X</w:t>
+            </w:r>
+          </w:p>
+        </w:tc>
+        <w:tc>
+          <w:tcPr>
+            <w:tcW w:w="1424" w:type="dxa"/>
+          </w:tcPr>
+          <w:p>
+            <w:pPr>
+              <w:jc w:val="center"/>
               <w:rPr>
                 <w:sz w:val="20"/>
                 <w:szCs w:val="20"/>
               </w:rPr>
-              <w:t>X</w:t>
-            </w:r>
-          </w:p>
-        </w:tc>
-        <w:tc>
-          <w:tcPr>
-            <w:tcW w:w="1424" w:type="dxa"/>
-          </w:tcPr>
-          <w:p>
-            <w:pPr>
-              <w:jc w:val="center"/>
+            </w:pPr>
+            <w:r>
               <w:rPr>
                 <w:sz w:val="20"/>
                 <w:szCs w:val="20"/>
               </w:rPr>
-            </w:pPr>
+              <w:t>X</w:t>
+            </w:r>
+          </w:p>
+        </w:tc>
+        <w:tc>
+          <w:tcPr>
+            <w:tcW w:w="1424" w:type="dxa"/>
+          </w:tcPr>
+          <w:p>
+            <w:pPr>
+              <w:jc w:val="center"/>
+              <w:rPr>
+                <w:sz w:val="20"/>
+                <w:szCs w:val="20"/>
+              </w:rPr>
+            </w:pPr>
+            <w:r>
+              <w:rPr>
+                <w:sz w:val="20"/>
+                <w:szCs w:val="20"/>
+              </w:rPr>
+              <w:t>X</w:t>
+            </w:r>
           </w:p>
         </w:tc>
         <w:tc>
@@ -45969,41 +46102,55 @@
                 <w:szCs w:val="20"/>
               </w:rPr>
             </w:pPr>
-          </w:p>
-        </w:tc>
-        <w:tc>
-          <w:tcPr>
-            <w:tcW w:w="1424" w:type="dxa"/>
-          </w:tcPr>
-          <w:p>
-            <w:pPr>
-              <w:jc w:val="center"/>
+            <w:r>
               <w:rPr>
                 <w:sz w:val="20"/>
                 <w:szCs w:val="20"/>
               </w:rPr>
-            </w:pPr>
-            <w:r>
+              <w:t>X</w:t>
+            </w:r>
+          </w:p>
+        </w:tc>
+        <w:tc>
+          <w:tcPr>
+            <w:tcW w:w="1424" w:type="dxa"/>
+          </w:tcPr>
+          <w:p>
+            <w:pPr>
+              <w:jc w:val="center"/>
               <w:rPr>
                 <w:sz w:val="20"/>
                 <w:szCs w:val="20"/>
               </w:rPr>
-              <w:t>X</w:t>
-            </w:r>
-          </w:p>
-        </w:tc>
-        <w:tc>
-          <w:tcPr>
-            <w:tcW w:w="1424" w:type="dxa"/>
-          </w:tcPr>
-          <w:p>
-            <w:pPr>
-              <w:jc w:val="center"/>
+            </w:pPr>
+            <w:r>
               <w:rPr>
                 <w:sz w:val="20"/>
                 <w:szCs w:val="20"/>
               </w:rPr>
-            </w:pPr>
+              <w:t>X</w:t>
+            </w:r>
+          </w:p>
+        </w:tc>
+        <w:tc>
+          <w:tcPr>
+            <w:tcW w:w="1424" w:type="dxa"/>
+          </w:tcPr>
+          <w:p>
+            <w:pPr>
+              <w:jc w:val="center"/>
+              <w:rPr>
+                <w:sz w:val="20"/>
+                <w:szCs w:val="20"/>
+              </w:rPr>
+            </w:pPr>
+            <w:r>
+              <w:rPr>
+                <w:sz w:val="20"/>
+                <w:szCs w:val="20"/>
+              </w:rPr>
+              <w:t>X</w:t>
+            </w:r>
           </w:p>
         </w:tc>
         <w:tc>
@@ -46100,6 +46247,13 @@
                 <w:szCs w:val="20"/>
               </w:rPr>
             </w:pPr>
+            <w:r>
+              <w:rPr>
+                <w:sz w:val="20"/>
+                <w:szCs w:val="20"/>
+              </w:rPr>
+              <w:t>X</w:t>
+            </w:r>
           </w:p>
         </w:tc>
         <w:tc>
@@ -46217,6 +46371,13 @@
                 <w:szCs w:val="20"/>
               </w:rPr>
             </w:pPr>
+            <w:r>
+              <w:rPr>
+                <w:sz w:val="20"/>
+                <w:szCs w:val="20"/>
+              </w:rPr>
+              <w:t>X</w:t>
+            </w:r>
           </w:p>
         </w:tc>
         <w:tc>
@@ -46334,6 +46495,13 @@
                 <w:szCs w:val="20"/>
               </w:rPr>
             </w:pPr>
+            <w:r>
+              <w:rPr>
+                <w:sz w:val="20"/>
+                <w:szCs w:val="20"/>
+              </w:rPr>
+              <w:t>X</w:t>
+            </w:r>
           </w:p>
         </w:tc>
         <w:tc>
@@ -46507,6 +46675,13 @@
                 <w:szCs w:val="20"/>
               </w:rPr>
             </w:pPr>
+            <w:r>
+              <w:rPr>
+                <w:sz w:val="20"/>
+                <w:szCs w:val="20"/>
+              </w:rPr>
+              <w:t>X</w:t>
+            </w:r>
           </w:p>
         </w:tc>
         <w:tc>
@@ -46624,6 +46799,13 @@
                 <w:szCs w:val="20"/>
               </w:rPr>
             </w:pPr>
+            <w:r>
+              <w:rPr>
+                <w:sz w:val="20"/>
+                <w:szCs w:val="20"/>
+              </w:rPr>
+              <w:t>X</w:t>
+            </w:r>
           </w:p>
         </w:tc>
         <w:tc>
@@ -46699,41 +46881,55 @@
                 <w:szCs w:val="20"/>
               </w:rPr>
             </w:pPr>
-          </w:p>
-        </w:tc>
-        <w:tc>
-          <w:tcPr>
-            <w:tcW w:w="1424" w:type="dxa"/>
-          </w:tcPr>
-          <w:p>
-            <w:pPr>
-              <w:jc w:val="center"/>
+            <w:r>
               <w:rPr>
                 <w:sz w:val="20"/>
                 <w:szCs w:val="20"/>
               </w:rPr>
-            </w:pPr>
-            <w:r>
+              <w:t>X</w:t>
+            </w:r>
+          </w:p>
+        </w:tc>
+        <w:tc>
+          <w:tcPr>
+            <w:tcW w:w="1424" w:type="dxa"/>
+          </w:tcPr>
+          <w:p>
+            <w:pPr>
+              <w:jc w:val="center"/>
               <w:rPr>
                 <w:sz w:val="20"/>
                 <w:szCs w:val="20"/>
               </w:rPr>
-              <w:t>X</w:t>
-            </w:r>
-          </w:p>
-        </w:tc>
-        <w:tc>
-          <w:tcPr>
-            <w:tcW w:w="1424" w:type="dxa"/>
-          </w:tcPr>
-          <w:p>
-            <w:pPr>
-              <w:jc w:val="center"/>
+            </w:pPr>
+            <w:r>
               <w:rPr>
                 <w:sz w:val="20"/>
                 <w:szCs w:val="20"/>
               </w:rPr>
-            </w:pPr>
+              <w:t>X</w:t>
+            </w:r>
+          </w:p>
+        </w:tc>
+        <w:tc>
+          <w:tcPr>
+            <w:tcW w:w="1424" w:type="dxa"/>
+          </w:tcPr>
+          <w:p>
+            <w:pPr>
+              <w:jc w:val="center"/>
+              <w:rPr>
+                <w:sz w:val="20"/>
+                <w:szCs w:val="20"/>
+              </w:rPr>
+            </w:pPr>
+            <w:r>
+              <w:rPr>
+                <w:sz w:val="20"/>
+                <w:szCs w:val="20"/>
+              </w:rPr>
+              <w:t>X</w:t>
+            </w:r>
           </w:p>
         </w:tc>
         <w:tc>
@@ -46809,41 +47005,55 @@
                 <w:szCs w:val="20"/>
               </w:rPr>
             </w:pPr>
-          </w:p>
-        </w:tc>
-        <w:tc>
-          <w:tcPr>
-            <w:tcW w:w="1424" w:type="dxa"/>
-          </w:tcPr>
-          <w:p>
-            <w:pPr>
-              <w:jc w:val="center"/>
+            <w:r>
               <w:rPr>
                 <w:sz w:val="20"/>
                 <w:szCs w:val="20"/>
               </w:rPr>
-            </w:pPr>
-            <w:r>
+              <w:t>X</w:t>
+            </w:r>
+          </w:p>
+        </w:tc>
+        <w:tc>
+          <w:tcPr>
+            <w:tcW w:w="1424" w:type="dxa"/>
+          </w:tcPr>
+          <w:p>
+            <w:pPr>
+              <w:jc w:val="center"/>
               <w:rPr>
                 <w:sz w:val="20"/>
                 <w:szCs w:val="20"/>
               </w:rPr>
-              <w:t>X</w:t>
-            </w:r>
-          </w:p>
-        </w:tc>
-        <w:tc>
-          <w:tcPr>
-            <w:tcW w:w="1424" w:type="dxa"/>
-          </w:tcPr>
-          <w:p>
-            <w:pPr>
-              <w:jc w:val="center"/>
+            </w:pPr>
+            <w:r>
               <w:rPr>
                 <w:sz w:val="20"/>
                 <w:szCs w:val="20"/>
               </w:rPr>
-            </w:pPr>
+              <w:t>X</w:t>
+            </w:r>
+          </w:p>
+        </w:tc>
+        <w:tc>
+          <w:tcPr>
+            <w:tcW w:w="1424" w:type="dxa"/>
+          </w:tcPr>
+          <w:p>
+            <w:pPr>
+              <w:jc w:val="center"/>
+              <w:rPr>
+                <w:sz w:val="20"/>
+                <w:szCs w:val="20"/>
+              </w:rPr>
+            </w:pPr>
+            <w:r>
+              <w:rPr>
+                <w:sz w:val="20"/>
+                <w:szCs w:val="20"/>
+              </w:rPr>
+              <w:t>X</w:t>
+            </w:r>
           </w:p>
         </w:tc>
         <w:tc>
@@ -46947,41 +47157,55 @@
                 <w:szCs w:val="20"/>
               </w:rPr>
             </w:pPr>
-          </w:p>
-        </w:tc>
-        <w:tc>
-          <w:tcPr>
-            <w:tcW w:w="1424" w:type="dxa"/>
-          </w:tcPr>
-          <w:p>
-            <w:pPr>
-              <w:jc w:val="center"/>
+            <w:r>
               <w:rPr>
                 <w:sz w:val="20"/>
                 <w:szCs w:val="20"/>
               </w:rPr>
-            </w:pPr>
-            <w:r>
+              <w:t>X</w:t>
+            </w:r>
+          </w:p>
+        </w:tc>
+        <w:tc>
+          <w:tcPr>
+            <w:tcW w:w="1424" w:type="dxa"/>
+          </w:tcPr>
+          <w:p>
+            <w:pPr>
+              <w:jc w:val="center"/>
               <w:rPr>
                 <w:sz w:val="20"/>
                 <w:szCs w:val="20"/>
               </w:rPr>
-              <w:t>X</w:t>
-            </w:r>
-          </w:p>
-        </w:tc>
-        <w:tc>
-          <w:tcPr>
-            <w:tcW w:w="1424" w:type="dxa"/>
-          </w:tcPr>
-          <w:p>
-            <w:pPr>
-              <w:jc w:val="center"/>
+            </w:pPr>
+            <w:r>
               <w:rPr>
                 <w:sz w:val="20"/>
                 <w:szCs w:val="20"/>
               </w:rPr>
-            </w:pPr>
+              <w:t>X</w:t>
+            </w:r>
+          </w:p>
+        </w:tc>
+        <w:tc>
+          <w:tcPr>
+            <w:tcW w:w="1424" w:type="dxa"/>
+          </w:tcPr>
+          <w:p>
+            <w:pPr>
+              <w:jc w:val="center"/>
+              <w:rPr>
+                <w:sz w:val="20"/>
+                <w:szCs w:val="20"/>
+              </w:rPr>
+            </w:pPr>
+            <w:r>
+              <w:rPr>
+                <w:sz w:val="20"/>
+                <w:szCs w:val="20"/>
+              </w:rPr>
+              <w:t>X</w:t>
+            </w:r>
           </w:p>
         </w:tc>
         <w:tc>
@@ -47057,41 +47281,55 @@
                 <w:szCs w:val="20"/>
               </w:rPr>
             </w:pPr>
-          </w:p>
-        </w:tc>
-        <w:tc>
-          <w:tcPr>
-            <w:tcW w:w="1424" w:type="dxa"/>
-          </w:tcPr>
-          <w:p>
-            <w:pPr>
-              <w:jc w:val="center"/>
+            <w:r>
               <w:rPr>
                 <w:sz w:val="20"/>
                 <w:szCs w:val="20"/>
               </w:rPr>
-            </w:pPr>
-            <w:r>
+              <w:t>X</w:t>
+            </w:r>
+          </w:p>
+        </w:tc>
+        <w:tc>
+          <w:tcPr>
+            <w:tcW w:w="1424" w:type="dxa"/>
+          </w:tcPr>
+          <w:p>
+            <w:pPr>
+              <w:jc w:val="center"/>
               <w:rPr>
                 <w:sz w:val="20"/>
                 <w:szCs w:val="20"/>
               </w:rPr>
-              <w:t>X</w:t>
-            </w:r>
-          </w:p>
-        </w:tc>
-        <w:tc>
-          <w:tcPr>
-            <w:tcW w:w="1424" w:type="dxa"/>
-          </w:tcPr>
-          <w:p>
-            <w:pPr>
-              <w:jc w:val="center"/>
+            </w:pPr>
+            <w:r>
               <w:rPr>
                 <w:sz w:val="20"/>
                 <w:szCs w:val="20"/>
               </w:rPr>
-            </w:pPr>
+              <w:t>X</w:t>
+            </w:r>
+          </w:p>
+        </w:tc>
+        <w:tc>
+          <w:tcPr>
+            <w:tcW w:w="1424" w:type="dxa"/>
+          </w:tcPr>
+          <w:p>
+            <w:pPr>
+              <w:jc w:val="center"/>
+              <w:rPr>
+                <w:sz w:val="20"/>
+                <w:szCs w:val="20"/>
+              </w:rPr>
+            </w:pPr>
+            <w:r>
+              <w:rPr>
+                <w:sz w:val="20"/>
+                <w:szCs w:val="20"/>
+              </w:rPr>
+              <w:t>X</w:t>
+            </w:r>
           </w:p>
         </w:tc>
         <w:tc>
@@ -47167,41 +47405,55 @@
                 <w:szCs w:val="20"/>
               </w:rPr>
             </w:pPr>
-          </w:p>
-        </w:tc>
-        <w:tc>
-          <w:tcPr>
-            <w:tcW w:w="1424" w:type="dxa"/>
-          </w:tcPr>
-          <w:p>
-            <w:pPr>
-              <w:jc w:val="center"/>
+            <w:r>
               <w:rPr>
                 <w:sz w:val="20"/>
                 <w:szCs w:val="20"/>
               </w:rPr>
-            </w:pPr>
-            <w:r>
+              <w:t>X</w:t>
+            </w:r>
+          </w:p>
+        </w:tc>
+        <w:tc>
+          <w:tcPr>
+            <w:tcW w:w="1424" w:type="dxa"/>
+          </w:tcPr>
+          <w:p>
+            <w:pPr>
+              <w:jc w:val="center"/>
               <w:rPr>
                 <w:sz w:val="20"/>
                 <w:szCs w:val="20"/>
               </w:rPr>
-              <w:t>X</w:t>
-            </w:r>
-          </w:p>
-        </w:tc>
-        <w:tc>
-          <w:tcPr>
-            <w:tcW w:w="1424" w:type="dxa"/>
-          </w:tcPr>
-          <w:p>
-            <w:pPr>
-              <w:jc w:val="center"/>
+            </w:pPr>
+            <w:r>
               <w:rPr>
                 <w:sz w:val="20"/>
                 <w:szCs w:val="20"/>
               </w:rPr>
-            </w:pPr>
+              <w:t>X</w:t>
+            </w:r>
+          </w:p>
+        </w:tc>
+        <w:tc>
+          <w:tcPr>
+            <w:tcW w:w="1424" w:type="dxa"/>
+          </w:tcPr>
+          <w:p>
+            <w:pPr>
+              <w:jc w:val="center"/>
+              <w:rPr>
+                <w:sz w:val="20"/>
+                <w:szCs w:val="20"/>
+              </w:rPr>
+            </w:pPr>
+            <w:r>
+              <w:rPr>
+                <w:sz w:val="20"/>
+                <w:szCs w:val="20"/>
+              </w:rPr>
+              <w:t>X</w:t>
+            </w:r>
           </w:p>
         </w:tc>
         <w:tc>
@@ -47277,41 +47529,55 @@
                 <w:szCs w:val="20"/>
               </w:rPr>
             </w:pPr>
-          </w:p>
-        </w:tc>
-        <w:tc>
-          <w:tcPr>
-            <w:tcW w:w="1424" w:type="dxa"/>
-          </w:tcPr>
-          <w:p>
-            <w:pPr>
-              <w:jc w:val="center"/>
+            <w:r>
               <w:rPr>
                 <w:sz w:val="20"/>
                 <w:szCs w:val="20"/>
               </w:rPr>
-            </w:pPr>
-            <w:r>
+              <w:t>X</w:t>
+            </w:r>
+          </w:p>
+        </w:tc>
+        <w:tc>
+          <w:tcPr>
+            <w:tcW w:w="1424" w:type="dxa"/>
+          </w:tcPr>
+          <w:p>
+            <w:pPr>
+              <w:jc w:val="center"/>
               <w:rPr>
                 <w:sz w:val="20"/>
                 <w:szCs w:val="20"/>
               </w:rPr>
-              <w:t>X</w:t>
-            </w:r>
-          </w:p>
-        </w:tc>
-        <w:tc>
-          <w:tcPr>
-            <w:tcW w:w="1424" w:type="dxa"/>
-          </w:tcPr>
-          <w:p>
-            <w:pPr>
-              <w:jc w:val="center"/>
+            </w:pPr>
+            <w:r>
               <w:rPr>
                 <w:sz w:val="20"/>
                 <w:szCs w:val="20"/>
               </w:rPr>
-            </w:pPr>
+              <w:t>X</w:t>
+            </w:r>
+          </w:p>
+        </w:tc>
+        <w:tc>
+          <w:tcPr>
+            <w:tcW w:w="1424" w:type="dxa"/>
+          </w:tcPr>
+          <w:p>
+            <w:pPr>
+              <w:jc w:val="center"/>
+              <w:rPr>
+                <w:sz w:val="20"/>
+                <w:szCs w:val="20"/>
+              </w:rPr>
+            </w:pPr>
+            <w:r>
+              <w:rPr>
+                <w:sz w:val="20"/>
+                <w:szCs w:val="20"/>
+              </w:rPr>
+              <w:t>X</w:t>
+            </w:r>
           </w:p>
         </w:tc>
         <w:tc>
@@ -47451,20 +47717,13 @@
                 <w:szCs w:val="20"/>
               </w:rPr>
             </w:pPr>
-          </w:p>
-        </w:tc>
-        <w:tc>
-          <w:tcPr>
-            <w:tcW w:w="1424" w:type="dxa"/>
-          </w:tcPr>
-          <w:p>
-            <w:pPr>
-              <w:jc w:val="center"/>
+            <w:r>
               <w:rPr>
                 <w:sz w:val="20"/>
                 <w:szCs w:val="20"/>
               </w:rPr>
-            </w:pPr>
+              <w:t>X</w:t>
+            </w:r>
           </w:p>
         </w:tc>
         <w:tc>
@@ -47479,6 +47738,34 @@
                 <w:szCs w:val="20"/>
               </w:rPr>
             </w:pPr>
+            <w:r>
+              <w:rPr>
+                <w:sz w:val="20"/>
+                <w:szCs w:val="20"/>
+              </w:rPr>
+              <w:t>X</w:t>
+            </w:r>
+          </w:p>
+        </w:tc>
+        <w:tc>
+          <w:tcPr>
+            <w:tcW w:w="1424" w:type="dxa"/>
+          </w:tcPr>
+          <w:p>
+            <w:pPr>
+              <w:jc w:val="center"/>
+              <w:rPr>
+                <w:sz w:val="20"/>
+                <w:szCs w:val="20"/>
+              </w:rPr>
+            </w:pPr>
+            <w:r>
+              <w:rPr>
+                <w:sz w:val="20"/>
+                <w:szCs w:val="20"/>
+              </w:rPr>
+              <w:t>X</w:t>
+            </w:r>
           </w:p>
         </w:tc>
         <w:tc>
@@ -47547,20 +47834,13 @@
                 <w:szCs w:val="20"/>
               </w:rPr>
             </w:pPr>
-          </w:p>
-        </w:tc>
-        <w:tc>
-          <w:tcPr>
-            <w:tcW w:w="1424" w:type="dxa"/>
-          </w:tcPr>
-          <w:p>
-            <w:pPr>
-              <w:jc w:val="center"/>
+            <w:r>
               <w:rPr>
                 <w:sz w:val="20"/>
                 <w:szCs w:val="20"/>
               </w:rPr>
-            </w:pPr>
+              <w:t>X</w:t>
+            </w:r>
           </w:p>
         </w:tc>
         <w:tc>
@@ -47575,6 +47855,34 @@
                 <w:szCs w:val="20"/>
               </w:rPr>
             </w:pPr>
+            <w:r>
+              <w:rPr>
+                <w:sz w:val="20"/>
+                <w:szCs w:val="20"/>
+              </w:rPr>
+              <w:t>X</w:t>
+            </w:r>
+          </w:p>
+        </w:tc>
+        <w:tc>
+          <w:tcPr>
+            <w:tcW w:w="1424" w:type="dxa"/>
+          </w:tcPr>
+          <w:p>
+            <w:pPr>
+              <w:jc w:val="center"/>
+              <w:rPr>
+                <w:sz w:val="20"/>
+                <w:szCs w:val="20"/>
+              </w:rPr>
+            </w:pPr>
+            <w:r>
+              <w:rPr>
+                <w:sz w:val="20"/>
+                <w:szCs w:val="20"/>
+              </w:rPr>
+              <w:t>X</w:t>
+            </w:r>
           </w:p>
         </w:tc>
         <w:tc>
@@ -47643,20 +47951,13 @@
                 <w:szCs w:val="20"/>
               </w:rPr>
             </w:pPr>
-          </w:p>
-        </w:tc>
-        <w:tc>
-          <w:tcPr>
-            <w:tcW w:w="1424" w:type="dxa"/>
-          </w:tcPr>
-          <w:p>
-            <w:pPr>
-              <w:jc w:val="center"/>
+            <w:r>
               <w:rPr>
                 <w:sz w:val="20"/>
                 <w:szCs w:val="20"/>
               </w:rPr>
-            </w:pPr>
+              <w:t>X</w:t>
+            </w:r>
           </w:p>
         </w:tc>
         <w:tc>
@@ -47671,6 +47972,34 @@
                 <w:szCs w:val="20"/>
               </w:rPr>
             </w:pPr>
+            <w:r>
+              <w:rPr>
+                <w:sz w:val="20"/>
+                <w:szCs w:val="20"/>
+              </w:rPr>
+              <w:t>X</w:t>
+            </w:r>
+          </w:p>
+        </w:tc>
+        <w:tc>
+          <w:tcPr>
+            <w:tcW w:w="1424" w:type="dxa"/>
+          </w:tcPr>
+          <w:p>
+            <w:pPr>
+              <w:jc w:val="center"/>
+              <w:rPr>
+                <w:sz w:val="20"/>
+                <w:szCs w:val="20"/>
+              </w:rPr>
+            </w:pPr>
+            <w:r>
+              <w:rPr>
+                <w:sz w:val="20"/>
+                <w:szCs w:val="20"/>
+              </w:rPr>
+              <w:t>X</w:t>
+            </w:r>
           </w:p>
         </w:tc>
         <w:tc>
@@ -47739,20 +48068,13 @@
                 <w:szCs w:val="20"/>
               </w:rPr>
             </w:pPr>
-          </w:p>
-        </w:tc>
-        <w:tc>
-          <w:tcPr>
-            <w:tcW w:w="1424" w:type="dxa"/>
-          </w:tcPr>
-          <w:p>
-            <w:pPr>
-              <w:jc w:val="center"/>
+            <w:r>
               <w:rPr>
                 <w:sz w:val="20"/>
                 <w:szCs w:val="20"/>
               </w:rPr>
-            </w:pPr>
+              <w:t>X</w:t>
+            </w:r>
           </w:p>
         </w:tc>
         <w:tc>
@@ -47767,6 +48089,34 @@
                 <w:szCs w:val="20"/>
               </w:rPr>
             </w:pPr>
+            <w:r>
+              <w:rPr>
+                <w:sz w:val="20"/>
+                <w:szCs w:val="20"/>
+              </w:rPr>
+              <w:t>X</w:t>
+            </w:r>
+          </w:p>
+        </w:tc>
+        <w:tc>
+          <w:tcPr>
+            <w:tcW w:w="1424" w:type="dxa"/>
+          </w:tcPr>
+          <w:p>
+            <w:pPr>
+              <w:jc w:val="center"/>
+              <w:rPr>
+                <w:sz w:val="20"/>
+                <w:szCs w:val="20"/>
+              </w:rPr>
+            </w:pPr>
+            <w:r>
+              <w:rPr>
+                <w:sz w:val="20"/>
+                <w:szCs w:val="20"/>
+              </w:rPr>
+              <w:t>X</w:t>
+            </w:r>
           </w:p>
         </w:tc>
         <w:tc>
@@ -47911,20 +48261,13 @@
                 <w:szCs w:val="20"/>
               </w:rPr>
             </w:pPr>
-          </w:p>
-        </w:tc>
-        <w:tc>
-          <w:tcPr>
-            <w:tcW w:w="1424" w:type="dxa"/>
-          </w:tcPr>
-          <w:p>
-            <w:pPr>
-              <w:jc w:val="center"/>
+            <w:r>
               <w:rPr>
                 <w:sz w:val="20"/>
                 <w:szCs w:val="20"/>
               </w:rPr>
-            </w:pPr>
+              <w:t>X</w:t>
+            </w:r>
           </w:p>
         </w:tc>
         <w:tc>
@@ -47939,6 +48282,34 @@
                 <w:szCs w:val="20"/>
               </w:rPr>
             </w:pPr>
+            <w:r>
+              <w:rPr>
+                <w:sz w:val="20"/>
+                <w:szCs w:val="20"/>
+              </w:rPr>
+              <w:t>X</w:t>
+            </w:r>
+          </w:p>
+        </w:tc>
+        <w:tc>
+          <w:tcPr>
+            <w:tcW w:w="1424" w:type="dxa"/>
+          </w:tcPr>
+          <w:p>
+            <w:pPr>
+              <w:jc w:val="center"/>
+              <w:rPr>
+                <w:sz w:val="20"/>
+                <w:szCs w:val="20"/>
+              </w:rPr>
+            </w:pPr>
+            <w:r>
+              <w:rPr>
+                <w:sz w:val="20"/>
+                <w:szCs w:val="20"/>
+              </w:rPr>
+              <w:t>X</w:t>
+            </w:r>
           </w:p>
         </w:tc>
         <w:tc>
@@ -48007,20 +48378,13 @@
                 <w:szCs w:val="20"/>
               </w:rPr>
             </w:pPr>
-          </w:p>
-        </w:tc>
-        <w:tc>
-          <w:tcPr>
-            <w:tcW w:w="1424" w:type="dxa"/>
-          </w:tcPr>
-          <w:p>
-            <w:pPr>
-              <w:jc w:val="center"/>
+            <w:r>
               <w:rPr>
                 <w:sz w:val="20"/>
                 <w:szCs w:val="20"/>
               </w:rPr>
-            </w:pPr>
+              <w:t>X</w:t>
+            </w:r>
           </w:p>
         </w:tc>
         <w:tc>
@@ -48035,6 +48399,34 @@
                 <w:szCs w:val="20"/>
               </w:rPr>
             </w:pPr>
+            <w:r>
+              <w:rPr>
+                <w:sz w:val="20"/>
+                <w:szCs w:val="20"/>
+              </w:rPr>
+              <w:t>X</w:t>
+            </w:r>
+          </w:p>
+        </w:tc>
+        <w:tc>
+          <w:tcPr>
+            <w:tcW w:w="1424" w:type="dxa"/>
+          </w:tcPr>
+          <w:p>
+            <w:pPr>
+              <w:jc w:val="center"/>
+              <w:rPr>
+                <w:sz w:val="20"/>
+                <w:szCs w:val="20"/>
+              </w:rPr>
+            </w:pPr>
+            <w:r>
+              <w:rPr>
+                <w:sz w:val="20"/>
+                <w:szCs w:val="20"/>
+              </w:rPr>
+              <w:t>X</w:t>
+            </w:r>
           </w:p>
         </w:tc>
         <w:tc>
@@ -48103,20 +48495,13 @@
                 <w:szCs w:val="20"/>
               </w:rPr>
             </w:pPr>
-          </w:p>
-        </w:tc>
-        <w:tc>
-          <w:tcPr>
-            <w:tcW w:w="1424" w:type="dxa"/>
-          </w:tcPr>
-          <w:p>
-            <w:pPr>
-              <w:jc w:val="center"/>
+            <w:r>
               <w:rPr>
                 <w:sz w:val="20"/>
                 <w:szCs w:val="20"/>
               </w:rPr>
-            </w:pPr>
+              <w:t>X</w:t>
+            </w:r>
           </w:p>
         </w:tc>
         <w:tc>
@@ -48131,6 +48516,34 @@
                 <w:szCs w:val="20"/>
               </w:rPr>
             </w:pPr>
+            <w:r>
+              <w:rPr>
+                <w:sz w:val="20"/>
+                <w:szCs w:val="20"/>
+              </w:rPr>
+              <w:t>X</w:t>
+            </w:r>
+          </w:p>
+        </w:tc>
+        <w:tc>
+          <w:tcPr>
+            <w:tcW w:w="1424" w:type="dxa"/>
+          </w:tcPr>
+          <w:p>
+            <w:pPr>
+              <w:jc w:val="center"/>
+              <w:rPr>
+                <w:sz w:val="20"/>
+                <w:szCs w:val="20"/>
+              </w:rPr>
+            </w:pPr>
+            <w:r>
+              <w:rPr>
+                <w:sz w:val="20"/>
+                <w:szCs w:val="20"/>
+              </w:rPr>
+              <w:t>X</w:t>
+            </w:r>
           </w:p>
         </w:tc>
         <w:tc>
@@ -48199,20 +48612,13 @@
                 <w:szCs w:val="20"/>
               </w:rPr>
             </w:pPr>
-          </w:p>
-        </w:tc>
-        <w:tc>
-          <w:tcPr>
-            <w:tcW w:w="1424" w:type="dxa"/>
-          </w:tcPr>
-          <w:p>
-            <w:pPr>
-              <w:jc w:val="center"/>
+            <w:r>
               <w:rPr>
                 <w:sz w:val="20"/>
                 <w:szCs w:val="20"/>
               </w:rPr>
-            </w:pPr>
+              <w:t>X</w:t>
+            </w:r>
           </w:p>
         </w:tc>
         <w:tc>
@@ -48227,6 +48633,34 @@
                 <w:szCs w:val="20"/>
               </w:rPr>
             </w:pPr>
+            <w:r>
+              <w:rPr>
+                <w:sz w:val="20"/>
+                <w:szCs w:val="20"/>
+              </w:rPr>
+              <w:t>X</w:t>
+            </w:r>
+          </w:p>
+        </w:tc>
+        <w:tc>
+          <w:tcPr>
+            <w:tcW w:w="1424" w:type="dxa"/>
+          </w:tcPr>
+          <w:p>
+            <w:pPr>
+              <w:jc w:val="center"/>
+              <w:rPr>
+                <w:sz w:val="20"/>
+                <w:szCs w:val="20"/>
+              </w:rPr>
+            </w:pPr>
+            <w:r>
+              <w:rPr>
+                <w:sz w:val="20"/>
+                <w:szCs w:val="20"/>
+              </w:rPr>
+              <w:t>X</w:t>
+            </w:r>
           </w:p>
         </w:tc>
         <w:tc>
@@ -48357,41 +48791,55 @@
                 <w:szCs w:val="20"/>
               </w:rPr>
             </w:pPr>
-          </w:p>
-        </w:tc>
-        <w:tc>
-          <w:tcPr>
-            <w:tcW w:w="1424" w:type="dxa"/>
-          </w:tcPr>
-          <w:p>
-            <w:pPr>
-              <w:jc w:val="center"/>
+            <w:r>
               <w:rPr>
                 <w:sz w:val="20"/>
                 <w:szCs w:val="20"/>
               </w:rPr>
-            </w:pPr>
-            <w:r>
+              <w:t>X</w:t>
+            </w:r>
+          </w:p>
+        </w:tc>
+        <w:tc>
+          <w:tcPr>
+            <w:tcW w:w="1424" w:type="dxa"/>
+          </w:tcPr>
+          <w:p>
+            <w:pPr>
+              <w:jc w:val="center"/>
               <w:rPr>
                 <w:sz w:val="20"/>
                 <w:szCs w:val="20"/>
               </w:rPr>
-              <w:t>X</w:t>
-            </w:r>
-          </w:p>
-        </w:tc>
-        <w:tc>
-          <w:tcPr>
-            <w:tcW w:w="1424" w:type="dxa"/>
-          </w:tcPr>
-          <w:p>
-            <w:pPr>
-              <w:jc w:val="center"/>
+            </w:pPr>
+            <w:r>
               <w:rPr>
                 <w:sz w:val="20"/>
                 <w:szCs w:val="20"/>
               </w:rPr>
-            </w:pPr>
+              <w:t>X</w:t>
+            </w:r>
+          </w:p>
+        </w:tc>
+        <w:tc>
+          <w:tcPr>
+            <w:tcW w:w="1424" w:type="dxa"/>
+          </w:tcPr>
+          <w:p>
+            <w:pPr>
+              <w:jc w:val="center"/>
+              <w:rPr>
+                <w:sz w:val="20"/>
+                <w:szCs w:val="20"/>
+              </w:rPr>
+            </w:pPr>
+            <w:r>
+              <w:rPr>
+                <w:sz w:val="20"/>
+                <w:szCs w:val="20"/>
+              </w:rPr>
+              <w:t>X</w:t>
+            </w:r>
           </w:p>
         </w:tc>
         <w:tc>
@@ -48460,41 +48908,55 @@
                 <w:szCs w:val="20"/>
               </w:rPr>
             </w:pPr>
-          </w:p>
-        </w:tc>
-        <w:tc>
-          <w:tcPr>
-            <w:tcW w:w="1424" w:type="dxa"/>
-          </w:tcPr>
-          <w:p>
-            <w:pPr>
-              <w:jc w:val="center"/>
+            <w:r>
               <w:rPr>
                 <w:sz w:val="20"/>
                 <w:szCs w:val="20"/>
               </w:rPr>
-            </w:pPr>
-            <w:r>
+              <w:t>X</w:t>
+            </w:r>
+          </w:p>
+        </w:tc>
+        <w:tc>
+          <w:tcPr>
+            <w:tcW w:w="1424" w:type="dxa"/>
+          </w:tcPr>
+          <w:p>
+            <w:pPr>
+              <w:jc w:val="center"/>
               <w:rPr>
                 <w:sz w:val="20"/>
                 <w:szCs w:val="20"/>
               </w:rPr>
-              <w:t>X</w:t>
-            </w:r>
-          </w:p>
-        </w:tc>
-        <w:tc>
-          <w:tcPr>
-            <w:tcW w:w="1424" w:type="dxa"/>
-          </w:tcPr>
-          <w:p>
-            <w:pPr>
-              <w:jc w:val="center"/>
+            </w:pPr>
+            <w:r>
               <w:rPr>
                 <w:sz w:val="20"/>
                 <w:szCs w:val="20"/>
               </w:rPr>
-            </w:pPr>
+              <w:t>X</w:t>
+            </w:r>
+          </w:p>
+        </w:tc>
+        <w:tc>
+          <w:tcPr>
+            <w:tcW w:w="1424" w:type="dxa"/>
+          </w:tcPr>
+          <w:p>
+            <w:pPr>
+              <w:jc w:val="center"/>
+              <w:rPr>
+                <w:sz w:val="20"/>
+                <w:szCs w:val="20"/>
+              </w:rPr>
+            </w:pPr>
+            <w:r>
+              <w:rPr>
+                <w:sz w:val="20"/>
+                <w:szCs w:val="20"/>
+              </w:rPr>
+              <w:t>X</w:t>
+            </w:r>
           </w:p>
         </w:tc>
         <w:tc>
@@ -48577,41 +49039,55 @@
                 <w:szCs w:val="20"/>
               </w:rPr>
             </w:pPr>
-          </w:p>
-        </w:tc>
-        <w:tc>
-          <w:tcPr>
-            <w:tcW w:w="1424" w:type="dxa"/>
-          </w:tcPr>
-          <w:p>
-            <w:pPr>
-              <w:jc w:val="center"/>
+            <w:r>
               <w:rPr>
                 <w:sz w:val="20"/>
                 <w:szCs w:val="20"/>
               </w:rPr>
-            </w:pPr>
-            <w:r>
+              <w:t>X</w:t>
+            </w:r>
+          </w:p>
+        </w:tc>
+        <w:tc>
+          <w:tcPr>
+            <w:tcW w:w="1424" w:type="dxa"/>
+          </w:tcPr>
+          <w:p>
+            <w:pPr>
+              <w:jc w:val="center"/>
               <w:rPr>
                 <w:sz w:val="20"/>
                 <w:szCs w:val="20"/>
               </w:rPr>
-              <w:t>X</w:t>
-            </w:r>
-          </w:p>
-        </w:tc>
-        <w:tc>
-          <w:tcPr>
-            <w:tcW w:w="1424" w:type="dxa"/>
-          </w:tcPr>
-          <w:p>
-            <w:pPr>
-              <w:jc w:val="center"/>
+            </w:pPr>
+            <w:r>
               <w:rPr>
                 <w:sz w:val="20"/>
                 <w:szCs w:val="20"/>
               </w:rPr>
-            </w:pPr>
+              <w:t>X</w:t>
+            </w:r>
+          </w:p>
+        </w:tc>
+        <w:tc>
+          <w:tcPr>
+            <w:tcW w:w="1424" w:type="dxa"/>
+          </w:tcPr>
+          <w:p>
+            <w:pPr>
+              <w:jc w:val="center"/>
+              <w:rPr>
+                <w:sz w:val="20"/>
+                <w:szCs w:val="20"/>
+              </w:rPr>
+            </w:pPr>
+            <w:r>
+              <w:rPr>
+                <w:sz w:val="20"/>
+                <w:szCs w:val="20"/>
+              </w:rPr>
+              <w:t>X</w:t>
+            </w:r>
           </w:p>
         </w:tc>
         <w:tc>
@@ -48680,41 +49156,55 @@
                 <w:szCs w:val="20"/>
               </w:rPr>
             </w:pPr>
-          </w:p>
-        </w:tc>
-        <w:tc>
-          <w:tcPr>
-            <w:tcW w:w="1424" w:type="dxa"/>
-          </w:tcPr>
-          <w:p>
-            <w:pPr>
-              <w:jc w:val="center"/>
+            <w:r>
               <w:rPr>
                 <w:sz w:val="20"/>
                 <w:szCs w:val="20"/>
               </w:rPr>
-            </w:pPr>
-            <w:r>
+              <w:t>X</w:t>
+            </w:r>
+          </w:p>
+        </w:tc>
+        <w:tc>
+          <w:tcPr>
+            <w:tcW w:w="1424" w:type="dxa"/>
+          </w:tcPr>
+          <w:p>
+            <w:pPr>
+              <w:jc w:val="center"/>
               <w:rPr>
                 <w:sz w:val="20"/>
                 <w:szCs w:val="20"/>
               </w:rPr>
-              <w:t>X</w:t>
-            </w:r>
-          </w:p>
-        </w:tc>
-        <w:tc>
-          <w:tcPr>
-            <w:tcW w:w="1424" w:type="dxa"/>
-          </w:tcPr>
-          <w:p>
-            <w:pPr>
-              <w:jc w:val="center"/>
+            </w:pPr>
+            <w:r>
               <w:rPr>
                 <w:sz w:val="20"/>
                 <w:szCs w:val="20"/>
               </w:rPr>
-            </w:pPr>
+              <w:t>X</w:t>
+            </w:r>
+          </w:p>
+        </w:tc>
+        <w:tc>
+          <w:tcPr>
+            <w:tcW w:w="1424" w:type="dxa"/>
+          </w:tcPr>
+          <w:p>
+            <w:pPr>
+              <w:jc w:val="center"/>
+              <w:rPr>
+                <w:sz w:val="20"/>
+                <w:szCs w:val="20"/>
+              </w:rPr>
+            </w:pPr>
+            <w:r>
+              <w:rPr>
+                <w:sz w:val="20"/>
+                <w:szCs w:val="20"/>
+              </w:rPr>
+              <w:t>X</w:t>
+            </w:r>
           </w:p>
         </w:tc>
         <w:tc>
@@ -48783,41 +49273,55 @@
                 <w:szCs w:val="20"/>
               </w:rPr>
             </w:pPr>
-          </w:p>
-        </w:tc>
-        <w:tc>
-          <w:tcPr>
-            <w:tcW w:w="1424" w:type="dxa"/>
-          </w:tcPr>
-          <w:p>
-            <w:pPr>
-              <w:jc w:val="center"/>
+            <w:r>
               <w:rPr>
                 <w:sz w:val="20"/>
                 <w:szCs w:val="20"/>
               </w:rPr>
-            </w:pPr>
-            <w:r>
+              <w:t>X</w:t>
+            </w:r>
+          </w:p>
+        </w:tc>
+        <w:tc>
+          <w:tcPr>
+            <w:tcW w:w="1424" w:type="dxa"/>
+          </w:tcPr>
+          <w:p>
+            <w:pPr>
+              <w:jc w:val="center"/>
               <w:rPr>
                 <w:sz w:val="20"/>
                 <w:szCs w:val="20"/>
               </w:rPr>
-              <w:t>X</w:t>
-            </w:r>
-          </w:p>
-        </w:tc>
-        <w:tc>
-          <w:tcPr>
-            <w:tcW w:w="1424" w:type="dxa"/>
-          </w:tcPr>
-          <w:p>
-            <w:pPr>
-              <w:jc w:val="center"/>
+            </w:pPr>
+            <w:r>
               <w:rPr>
                 <w:sz w:val="20"/>
                 <w:szCs w:val="20"/>
               </w:rPr>
-            </w:pPr>
+              <w:t>X</w:t>
+            </w:r>
+          </w:p>
+        </w:tc>
+        <w:tc>
+          <w:tcPr>
+            <w:tcW w:w="1424" w:type="dxa"/>
+          </w:tcPr>
+          <w:p>
+            <w:pPr>
+              <w:jc w:val="center"/>
+              <w:rPr>
+                <w:sz w:val="20"/>
+                <w:szCs w:val="20"/>
+              </w:rPr>
+            </w:pPr>
+            <w:r>
+              <w:rPr>
+                <w:sz w:val="20"/>
+                <w:szCs w:val="20"/>
+              </w:rPr>
+              <w:t>X</w:t>
+            </w:r>
           </w:p>
         </w:tc>
         <w:tc>
@@ -48886,41 +49390,55 @@
                 <w:szCs w:val="20"/>
               </w:rPr>
             </w:pPr>
-          </w:p>
-        </w:tc>
-        <w:tc>
-          <w:tcPr>
-            <w:tcW w:w="1424" w:type="dxa"/>
-          </w:tcPr>
-          <w:p>
-            <w:pPr>
-              <w:jc w:val="center"/>
+            <w:r>
               <w:rPr>
                 <w:sz w:val="20"/>
                 <w:szCs w:val="20"/>
               </w:rPr>
-            </w:pPr>
-            <w:r>
+              <w:t>X</w:t>
+            </w:r>
+          </w:p>
+        </w:tc>
+        <w:tc>
+          <w:tcPr>
+            <w:tcW w:w="1424" w:type="dxa"/>
+          </w:tcPr>
+          <w:p>
+            <w:pPr>
+              <w:jc w:val="center"/>
               <w:rPr>
                 <w:sz w:val="20"/>
                 <w:szCs w:val="20"/>
               </w:rPr>
-              <w:t>X</w:t>
-            </w:r>
-          </w:p>
-        </w:tc>
-        <w:tc>
-          <w:tcPr>
-            <w:tcW w:w="1424" w:type="dxa"/>
-          </w:tcPr>
-          <w:p>
-            <w:pPr>
-              <w:jc w:val="center"/>
+            </w:pPr>
+            <w:r>
               <w:rPr>
                 <w:sz w:val="20"/>
                 <w:szCs w:val="20"/>
               </w:rPr>
-            </w:pPr>
+              <w:t>X</w:t>
+            </w:r>
+          </w:p>
+        </w:tc>
+        <w:tc>
+          <w:tcPr>
+            <w:tcW w:w="1424" w:type="dxa"/>
+          </w:tcPr>
+          <w:p>
+            <w:pPr>
+              <w:jc w:val="center"/>
+              <w:rPr>
+                <w:sz w:val="20"/>
+                <w:szCs w:val="20"/>
+              </w:rPr>
+            </w:pPr>
+            <w:r>
+              <w:rPr>
+                <w:sz w:val="20"/>
+                <w:szCs w:val="20"/>
+              </w:rPr>
+              <w:t>X</w:t>
+            </w:r>
           </w:p>
         </w:tc>
         <w:tc>

</xml_diff>

<commit_message>
Updated documentation and MMB
</commit_message>
<xml_diff>
--- a/docs/Development.docx
+++ b/docs/Development.docx
@@ -31438,6 +31438,9 @@
         <w:keepNext/>
       </w:pPr>
       <w:r>
+        <w:rPr>
+          <w:noProof/>
+        </w:rPr>
         <w:drawing>
           <wp:inline distT="0" distB="0" distL="0" distR="0" wp14:anchorId="3D99D5F6" wp14:editId="682F073D">
             <wp:extent cx="6858000" cy="1635125"/>
@@ -32008,6 +32011,9 @@
         <w:keepNext/>
       </w:pPr>
       <w:r>
+        <w:rPr>
+          <w:noProof/>
+        </w:rPr>
         <w:drawing>
           <wp:inline distT="0" distB="0" distL="0" distR="0" wp14:anchorId="7D924ED5" wp14:editId="5814803C">
             <wp:extent cx="6858000" cy="1457960"/>
@@ -34254,7 +34260,25 @@
     </w:p>
     <w:p>
       <w:r>
-        <w:t>The changes reduced the self-CPU percentage from 4.05% to 2.82% of overall cycles.</w:t>
+        <w:t xml:space="preserve">The changes reduced the self-CPU percentage from </w:t>
+      </w:r>
+      <w:r>
+        <w:t>3</w:t>
+      </w:r>
+      <w:r>
+        <w:t>.</w:t>
+      </w:r>
+      <w:r>
+        <w:t>84</w:t>
+      </w:r>
+      <w:r>
+        <w:t>% to 2.</w:t>
+      </w:r>
+      <w:r>
+        <w:t>77</w:t>
+      </w:r>
+      <w:r>
+        <w:t>% of overall cycles.</w:t>
       </w:r>
     </w:p>
     <w:p>
@@ -34338,27 +34362,6 @@
     <w:p>
       <w:r>
         <w:lastRenderedPageBreak/>
-        <w:t>The changes were straightforward and the total CPU cycles reduced from 17.77</w:t>
-      </w:r>
-      <w:r>
-        <w:rPr>
-          <w:rFonts w:ascii="Aptos" w:hAnsi="Aptos"/>
-          <w:color w:val="000000"/>
-        </w:rPr>
-        <w:t xml:space="preserve">% </w:t>
-      </w:r>
-      <w:r>
-        <w:t>to 14.23%.  Updating objects now takes 80% of the time tha</w:t>
-      </w:r>
-      <w:r>
-        <w:t>n</w:t>
-      </w:r>
-      <w:r>
-        <w:t xml:space="preserve"> previously.</w:t>
-      </w:r>
-    </w:p>
-    <w:p>
-      <w:r>
         <w:t xml:space="preserve">As an aside, this change cannot be applied to </w:t>
       </w:r>
       <w:r>
@@ -34393,6 +34396,12 @@
       </w:r>
     </w:p>
     <w:p>
+      <w:pPr>
+        <w:rPr>
+          <w:rFonts w:ascii="Aptos" w:hAnsi="Aptos"/>
+          <w:color w:val="000000"/>
+        </w:rPr>
+      </w:pPr>
       <w:r>
         <w:t xml:space="preserve">I also looked at optimizing the loop.  </w:t>
       </w:r>
@@ -34479,7 +34488,22 @@
           <w:rFonts w:ascii="Aptos" w:hAnsi="Aptos"/>
           <w:color w:val="000000"/>
         </w:rPr>
-        <w:t xml:space="preserve">around the loop body.  This small change reduced the self-CPU cycles by 0.2%. </w:t>
+        <w:t>around the loop body.</w:t>
+      </w:r>
+    </w:p>
+    <w:p>
+      <w:r>
+        <w:t>The changes were straightforward and the total CPU cycles reduced from 16.88</w:t>
+      </w:r>
+      <w:r>
+        <w:rPr>
+          <w:rFonts w:ascii="Aptos" w:hAnsi="Aptos"/>
+          <w:color w:val="000000"/>
+        </w:rPr>
+        <w:t xml:space="preserve">% </w:t>
+      </w:r>
+      <w:r>
+        <w:t>to 13.58%.  Updating objects now takes 80% of the time than previously.</w:t>
       </w:r>
     </w:p>
     <w:p>
@@ -34603,13 +34627,41 @@
           <w:rFonts w:ascii="Aptos" w:hAnsi="Aptos"/>
           <w:color w:val="000000"/>
         </w:rPr>
-        <w:t>Presently, this process consumes 4.18% of the available processing cycles</w:t>
+        <w:t xml:space="preserve">Presently, this process consumes </w:t>
       </w:r>
       <w:r>
         <w:rPr>
           <w:rFonts w:ascii="Aptos" w:hAnsi="Aptos"/>
           <w:color w:val="000000"/>
         </w:rPr>
+        <w:t>4</w:t>
+      </w:r>
+      <w:r>
+        <w:rPr>
+          <w:rFonts w:ascii="Aptos" w:hAnsi="Aptos"/>
+          <w:color w:val="000000"/>
+        </w:rPr>
+        <w:t>.</w:t>
+      </w:r>
+      <w:r>
+        <w:rPr>
+          <w:rFonts w:ascii="Aptos" w:hAnsi="Aptos"/>
+          <w:color w:val="000000"/>
+        </w:rPr>
+        <w:t>5</w:t>
+      </w:r>
+      <w:r>
+        <w:rPr>
+          <w:rFonts w:ascii="Aptos" w:hAnsi="Aptos"/>
+          <w:color w:val="000000"/>
+        </w:rPr>
+        <w:t>% of the available processing cycles</w:t>
+      </w:r>
+      <w:r>
+        <w:rPr>
+          <w:rFonts w:ascii="Aptos" w:hAnsi="Aptos"/>
+          <w:color w:val="000000"/>
+        </w:rPr>
         <w:t xml:space="preserve"> </w:t>
       </w:r>
       <w:r>
@@ -34653,7 +34705,13 @@
         <w:t xml:space="preserve"> CB1 </w:t>
       </w:r>
       <w:r>
-        <w:t>which indicates if one or more keys are pressed. Unfortunately, during game play, one of the movement keys is typically pressed most of the time so I decided not to pursue this option.</w:t>
+        <w:t xml:space="preserve">which indicates if one or more keys are pressed. </w:t>
+      </w:r>
+      <w:r>
+        <w:t xml:space="preserve"> </w:t>
+      </w:r>
+      <w:r>
+        <w:t>Unfortunately, during game play, one of the movement keys is typically pressed most of the time so I decided not to pursue this option.</w:t>
       </w:r>
     </w:p>
     <w:p>
@@ -34740,10 +34798,36 @@
           <w:rFonts w:ascii="Aptos" w:hAnsi="Aptos"/>
           <w:color w:val="000000"/>
         </w:rPr>
-        <w:t xml:space="preserve">4.18% </w:t>
-      </w:r>
-      <w:r>
-        <w:t>to 0.75%.  Scanning keys now take 18% of the time that it previously took</w:t>
+        <w:t>4.</w:t>
+      </w:r>
+      <w:r>
+        <w:rPr>
+          <w:rFonts w:ascii="Aptos" w:hAnsi="Aptos"/>
+          <w:color w:val="000000"/>
+        </w:rPr>
+        <w:t>5</w:t>
+      </w:r>
+      <w:r>
+        <w:rPr>
+          <w:rFonts w:ascii="Aptos" w:hAnsi="Aptos"/>
+          <w:color w:val="000000"/>
+        </w:rPr>
+        <w:t xml:space="preserve">% </w:t>
+      </w:r>
+      <w:r>
+        <w:t>to 0.7</w:t>
+      </w:r>
+      <w:r>
+        <w:t>8</w:t>
+      </w:r>
+      <w:r>
+        <w:t>%.  Scanning keys now take 1</w:t>
+      </w:r>
+      <w:r>
+        <w:t>7.3</w:t>
+      </w:r>
+      <w:r>
+        <w:t>% of the time that it previously took</w:t>
       </w:r>
       <w:r>
         <w:t>, when GOD mode is not enabled.</w:t>
@@ -35172,7 +35256,10 @@
         <w:t>reduced</w:t>
       </w:r>
       <w:r>
-        <w:t xml:space="preserve"> slowdown.</w:t>
+        <w:t xml:space="preserve"> slowdown</w:t>
+      </w:r>
+      <w:r>
+        <w:t xml:space="preserve"> when samples play.</w:t>
       </w:r>
     </w:p>
     <w:p>
@@ -35694,7 +35781,13 @@
         <w:t>64</w:t>
       </w:r>
       <w:r>
-        <w:t xml:space="preserve">% of the screen memory writes are </w:t>
+        <w:t xml:space="preserve">% of the screen memory writes </w:t>
+      </w:r>
+      <w:r>
+        <w:t xml:space="preserve">(that matter) </w:t>
+      </w:r>
+      <w:r>
+        <w:t xml:space="preserve">are </w:t>
       </w:r>
       <w:r>
         <w:t>mistimed</w:t>
@@ -54954,6 +55047,7 @@
   <w:style w:type="character" w:default="1" w:styleId="DefaultParagraphFont">
     <w:name w:val="Default Paragraph Font"/>
     <w:uiPriority w:val="1"/>
+    <w:semiHidden/>
     <w:unhideWhenUsed/>
   </w:style>
   <w:style w:type="table" w:default="1" w:styleId="TableNormal">

</xml_diff>